<commit_message>
docs: finalize report pagination and contents
</commit_message>
<xml_diff>
--- a/output/docx/StudySpace-BaoCao-DanhGia-KiemDinh.docx
+++ b/output/docx/StudySpace-BaoCao-DanhGia-KiemDinh.docx
@@ -130,25 +130,27 @@
     </w:p>
     <w:p>
       <w:r>
-        <w:t>1. Tóm tắt dự án</w:t>
+        <w:t>1. Tóm tắt dự án ........................................................ 2</w:t>
         <w:br/>
-        <w:t>2. Phạm vi và đặc tả yêu cầu</w:t>
+        <w:t>2. Phạm vi và đặc tả yêu cầu ............................................. 3</w:t>
         <w:br/>
-        <w:t>3. Phân tích và thiết kế hệ thống</w:t>
+        <w:t>3. Phân tích và thiết kế hệ thống ........................................ 4</w:t>
         <w:br/>
-        <w:t>4. Kế hoạch kiểm thử</w:t>
+        <w:t>4. Kế hoạch kiểm thử ...................................................... 5</w:t>
         <w:br/>
-        <w:t>5. Môi trường và dữ liệu kiểm thử</w:t>
+        <w:t>5. Môi trường và dữ liệu kiểm thử ....................................... 6</w:t>
         <w:br/>
-        <w:t>6. Thực thi kiểm thử và bằng chứng</w:t>
+        <w:t>6. Thực thi kiểm thử và bằng chứng ...................................... 7</w:t>
         <w:br/>
-        <w:t>7. Kết quả, truy vết và lỗi</w:t>
+        <w:t>7. Kết quả, truy vết và lỗi ............................................... 7</w:t>
         <w:br/>
-        <w:t>8. Đánh giá theo ISO/IEC 25010</w:t>
+        <w:t>8. Đánh giá theo ISO/IEC 25010 ........................................... 8</w:t>
         <w:br/>
-        <w:t>9. Giới hạn và kết luận</w:t>
+        <w:t>9. Giới hạn và kết luận ................................................... 8</w:t>
         <w:br/>
-        <w:t>10. Tài liệu tham khảo</w:t>
+        <w:t>10. Tài liệu tham khảo ..................................................... 9</w:t>
+        <w:br/>
+        <w:t>Phụ lục A-I ............................................................... 10-36</w:t>
       </w:r>
     </w:p>
     <w:p>
@@ -17324,8 +17326,9 @@
       <w:rPr>
         <w:sz w:val="20"/>
       </w:rPr>
-      <w:t>StudySpace - Báo cáo đánh giá và kiểm định chất lượng phần mềm</w:t>
+      <w:t xml:space="preserve">StudySpace - Báo cáo đánh giá và kiểm định chất lượng phần mềm - Trang </w:t>
     </w:r>
+    <w:fldSimple w:instr="PAGE"/>
   </w:p>
 </w:ftr>
 </file>

</xml_diff>

<commit_message>
docs: keep submission report focused on academic content
</commit_message>
<xml_diff>
--- a/output/docx/StudySpace-BaoCao-DanhGia-KiemDinh.docx
+++ b/output/docx/StudySpace-BaoCao-DanhGia-KiemDinh.docx
@@ -166,7 +166,7 @@
       <w:pPr>
         <w:pStyle w:val="u1"/>
       </w:pPr>
-      <w:bookmarkStart w:id="0" w:name="_Toc241970171"/>
+      <w:bookmarkStart w:id="0" w:name="_Toc241970526"/>
       <w:r>
         <w:lastRenderedPageBreak/>
         <w:t>L</w:t>
@@ -192,14 +192,14 @@
     </w:p>
     <w:p>
       <w:r>
-        <w:t>Bản hiện tại giữ nhãn BẢN NHÁP vì thông tin trường, khoa, giảng viên, nhóm và thành viên chưa được cung cấp. Trước khi nộp, nhóm phải điền dữ liệu thật, rà soát quyền truy cập GitHub Actions artifact và cập nhật mục lục trong Microsoft Word. Nội dung được biên soạn độc lập; danh mục tham khảo chỉ gồm tiêu chuẩn và tài liệu kỹ thuật chính thức thực sự được sử dụng trong đề tài.</w:t>
+        <w:t>Bản hiện tại giữ nhãn BẢN NHÁP vì thông tin trường, khoa, giảng viên, nhóm và thành viên chưa được cung cấp. Nội dung được biên soạn độc lập; danh mục tham khảo chỉ gồm tiêu chuẩn và tài liệu kỹ thuật chính thức thực sự được sử dụng trong đề tài.</w:t>
       </w:r>
     </w:p>
     <w:p>
       <w:pPr>
         <w:pStyle w:val="u1"/>
       </w:pPr>
-      <w:bookmarkStart w:id="1" w:name="_Toc241970172"/>
+      <w:bookmarkStart w:id="1" w:name="_Toc241970527"/>
       <w:r>
         <w:lastRenderedPageBreak/>
         <w:t>TÓM T</w:t>
@@ -250,7 +250,7 @@
       <w:pPr>
         <w:pStyle w:val="u1"/>
       </w:pPr>
-      <w:bookmarkStart w:id="2" w:name="_Toc241970173"/>
+      <w:bookmarkStart w:id="2" w:name="_Toc241970528"/>
       <w:r>
         <w:lastRenderedPageBreak/>
         <w:t>M</w:t>
@@ -295,7 +295,7 @@
       <w:r>
         <w:fldChar w:fldCharType="separate"/>
       </w:r>
-      <w:hyperlink w:anchor="_Toc241970171" w:history="1">
+      <w:hyperlink w:anchor="_Toc241970526" w:history="1">
         <w:r>
           <w:rPr>
             <w:rStyle w:val="Siuktni"/>
@@ -322,7 +322,7 @@
             <w:noProof/>
             <w:webHidden/>
           </w:rPr>
-          <w:instrText xml:space="preserve"> PAGEREF _Toc241970171 \h </w:instrText>
+          <w:instrText xml:space="preserve"> PAGEREF _Toc241970526 \h </w:instrText>
         </w:r>
         <w:r>
           <w:rPr>
@@ -370,7 +370,7 @@
           <w14:ligatures w14:val="standardContextual"/>
         </w:rPr>
       </w:pPr>
-      <w:hyperlink w:anchor="_Toc241970172" w:history="1">
+      <w:hyperlink w:anchor="_Toc241970527" w:history="1">
         <w:r>
           <w:rPr>
             <w:rStyle w:val="Siuktni"/>
@@ -397,7 +397,7 @@
             <w:noProof/>
             <w:webHidden/>
           </w:rPr>
-          <w:instrText xml:space="preserve"> PAGEREF _Toc241970172 \h </w:instrText>
+          <w:instrText xml:space="preserve"> PAGEREF _Toc241970527 \h </w:instrText>
         </w:r>
         <w:r>
           <w:rPr>
@@ -445,7 +445,7 @@
           <w14:ligatures w14:val="standardContextual"/>
         </w:rPr>
       </w:pPr>
-      <w:hyperlink w:anchor="_Toc241970173" w:history="1">
+      <w:hyperlink w:anchor="_Toc241970528" w:history="1">
         <w:r>
           <w:rPr>
             <w:rStyle w:val="Siuktni"/>
@@ -472,7 +472,7 @@
             <w:noProof/>
             <w:webHidden/>
           </w:rPr>
-          <w:instrText xml:space="preserve"> PAGEREF _Toc241970173 \h </w:instrText>
+          <w:instrText xml:space="preserve"> PAGEREF _Toc241970528 \h </w:instrText>
         </w:r>
         <w:r>
           <w:rPr>
@@ -520,7 +520,7 @@
           <w14:ligatures w14:val="standardContextual"/>
         </w:rPr>
       </w:pPr>
-      <w:hyperlink w:anchor="_Toc241970174" w:history="1">
+      <w:hyperlink w:anchor="_Toc241970529" w:history="1">
         <w:r>
           <w:rPr>
             <w:rStyle w:val="Siuktni"/>
@@ -547,7 +547,7 @@
             <w:noProof/>
             <w:webHidden/>
           </w:rPr>
-          <w:instrText xml:space="preserve"> PAGEREF _Toc241970174 \h </w:instrText>
+          <w:instrText xml:space="preserve"> PAGEREF _Toc241970529 \h </w:instrText>
         </w:r>
         <w:r>
           <w:rPr>
@@ -595,7 +595,7 @@
           <w14:ligatures w14:val="standardContextual"/>
         </w:rPr>
       </w:pPr>
-      <w:hyperlink w:anchor="_Toc241970175" w:history="1">
+      <w:hyperlink w:anchor="_Toc241970530" w:history="1">
         <w:r>
           <w:rPr>
             <w:rStyle w:val="Siuktni"/>
@@ -622,7 +622,7 @@
             <w:noProof/>
             <w:webHidden/>
           </w:rPr>
-          <w:instrText xml:space="preserve"> PAGEREF _Toc241970175 \h </w:instrText>
+          <w:instrText xml:space="preserve"> PAGEREF _Toc241970530 \h </w:instrText>
         </w:r>
         <w:r>
           <w:rPr>
@@ -670,7 +670,7 @@
           <w14:ligatures w14:val="standardContextual"/>
         </w:rPr>
       </w:pPr>
-      <w:hyperlink w:anchor="_Toc241970176" w:history="1">
+      <w:hyperlink w:anchor="_Toc241970531" w:history="1">
         <w:r>
           <w:rPr>
             <w:rStyle w:val="Siuktni"/>
@@ -697,7 +697,7 @@
             <w:noProof/>
             <w:webHidden/>
           </w:rPr>
-          <w:instrText xml:space="preserve"> PAGEREF _Toc241970176 \h </w:instrText>
+          <w:instrText xml:space="preserve"> PAGEREF _Toc241970531 \h </w:instrText>
         </w:r>
         <w:r>
           <w:rPr>
@@ -745,7 +745,7 @@
           <w14:ligatures w14:val="standardContextual"/>
         </w:rPr>
       </w:pPr>
-      <w:hyperlink w:anchor="_Toc241970177" w:history="1">
+      <w:hyperlink w:anchor="_Toc241970532" w:history="1">
         <w:r>
           <w:rPr>
             <w:rStyle w:val="Siuktni"/>
@@ -772,7 +772,7 @@
             <w:noProof/>
             <w:webHidden/>
           </w:rPr>
-          <w:instrText xml:space="preserve"> PAGEREF _Toc241970177 \h </w:instrText>
+          <w:instrText xml:space="preserve"> PAGEREF _Toc241970532 \h </w:instrText>
         </w:r>
         <w:r>
           <w:rPr>
@@ -820,7 +820,7 @@
           <w14:ligatures w14:val="standardContextual"/>
         </w:rPr>
       </w:pPr>
-      <w:hyperlink w:anchor="_Toc241970178" w:history="1">
+      <w:hyperlink w:anchor="_Toc241970533" w:history="1">
         <w:r>
           <w:rPr>
             <w:rStyle w:val="Siuktni"/>
@@ -847,7 +847,7 @@
             <w:noProof/>
             <w:webHidden/>
           </w:rPr>
-          <w:instrText xml:space="preserve"> PAGEREF _Toc241970178 \h </w:instrText>
+          <w:instrText xml:space="preserve"> PAGEREF _Toc241970533 \h </w:instrText>
         </w:r>
         <w:r>
           <w:rPr>
@@ -895,7 +895,7 @@
           <w14:ligatures w14:val="standardContextual"/>
         </w:rPr>
       </w:pPr>
-      <w:hyperlink w:anchor="_Toc241970179" w:history="1">
+      <w:hyperlink w:anchor="_Toc241970534" w:history="1">
         <w:r>
           <w:rPr>
             <w:rStyle w:val="Siuktni"/>
@@ -922,7 +922,7 @@
             <w:noProof/>
             <w:webHidden/>
           </w:rPr>
-          <w:instrText xml:space="preserve"> PAGEREF _Toc241970179 \h </w:instrText>
+          <w:instrText xml:space="preserve"> PAGEREF _Toc241970534 \h </w:instrText>
         </w:r>
         <w:r>
           <w:rPr>
@@ -970,7 +970,7 @@
           <w14:ligatures w14:val="standardContextual"/>
         </w:rPr>
       </w:pPr>
-      <w:hyperlink w:anchor="_Toc241970180" w:history="1">
+      <w:hyperlink w:anchor="_Toc241970535" w:history="1">
         <w:r>
           <w:rPr>
             <w:rStyle w:val="Siuktni"/>
@@ -997,7 +997,7 @@
             <w:noProof/>
             <w:webHidden/>
           </w:rPr>
-          <w:instrText xml:space="preserve"> PAGEREF _Toc241970180 \h </w:instrText>
+          <w:instrText xml:space="preserve"> PAGEREF _Toc241970535 \h </w:instrText>
         </w:r>
         <w:r>
           <w:rPr>
@@ -1045,7 +1045,7 @@
           <w14:ligatures w14:val="standardContextual"/>
         </w:rPr>
       </w:pPr>
-      <w:hyperlink w:anchor="_Toc241970181" w:history="1">
+      <w:hyperlink w:anchor="_Toc241970536" w:history="1">
         <w:r>
           <w:rPr>
             <w:rStyle w:val="Siuktni"/>
@@ -1072,7 +1072,7 @@
             <w:noProof/>
             <w:webHidden/>
           </w:rPr>
-          <w:instrText xml:space="preserve"> PAGEREF _Toc241970181 \h </w:instrText>
+          <w:instrText xml:space="preserve"> PAGEREF _Toc241970536 \h </w:instrText>
         </w:r>
         <w:r>
           <w:rPr>
@@ -1120,7 +1120,7 @@
           <w14:ligatures w14:val="standardContextual"/>
         </w:rPr>
       </w:pPr>
-      <w:hyperlink w:anchor="_Toc241970182" w:history="1">
+      <w:hyperlink w:anchor="_Toc241970537" w:history="1">
         <w:r>
           <w:rPr>
             <w:rStyle w:val="Siuktni"/>
@@ -1147,7 +1147,7 @@
             <w:noProof/>
             <w:webHidden/>
           </w:rPr>
-          <w:instrText xml:space="preserve"> PAGEREF _Toc241970182 \h </w:instrText>
+          <w:instrText xml:space="preserve"> PAGEREF _Toc241970537 \h </w:instrText>
         </w:r>
         <w:r>
           <w:rPr>
@@ -1195,7 +1195,7 @@
           <w14:ligatures w14:val="standardContextual"/>
         </w:rPr>
       </w:pPr>
-      <w:hyperlink w:anchor="_Toc241970183" w:history="1">
+      <w:hyperlink w:anchor="_Toc241970538" w:history="1">
         <w:r>
           <w:rPr>
             <w:rStyle w:val="Siuktni"/>
@@ -1222,7 +1222,7 @@
             <w:noProof/>
             <w:webHidden/>
           </w:rPr>
-          <w:instrText xml:space="preserve"> PAGEREF _Toc241970183 \h </w:instrText>
+          <w:instrText xml:space="preserve"> PAGEREF _Toc241970538 \h </w:instrText>
         </w:r>
         <w:r>
           <w:rPr>
@@ -1270,7 +1270,7 @@
           <w14:ligatures w14:val="standardContextual"/>
         </w:rPr>
       </w:pPr>
-      <w:hyperlink w:anchor="_Toc241970184" w:history="1">
+      <w:hyperlink w:anchor="_Toc241970539" w:history="1">
         <w:r>
           <w:rPr>
             <w:rStyle w:val="Siuktni"/>
@@ -1297,7 +1297,7 @@
             <w:noProof/>
             <w:webHidden/>
           </w:rPr>
-          <w:instrText xml:space="preserve"> PAGEREF _Toc241970184 \h </w:instrText>
+          <w:instrText xml:space="preserve"> PAGEREF _Toc241970539 \h </w:instrText>
         </w:r>
         <w:r>
           <w:rPr>
@@ -1345,7 +1345,7 @@
           <w14:ligatures w14:val="standardContextual"/>
         </w:rPr>
       </w:pPr>
-      <w:hyperlink w:anchor="_Toc241970185" w:history="1">
+      <w:hyperlink w:anchor="_Toc241970540" w:history="1">
         <w:r>
           <w:rPr>
             <w:rStyle w:val="Siuktni"/>
@@ -1372,7 +1372,7 @@
             <w:noProof/>
             <w:webHidden/>
           </w:rPr>
-          <w:instrText xml:space="preserve"> PAGEREF _Toc241970185 \h </w:instrText>
+          <w:instrText xml:space="preserve"> PAGEREF _Toc241970540 \h </w:instrText>
         </w:r>
         <w:r>
           <w:rPr>
@@ -1420,7 +1420,7 @@
           <w14:ligatures w14:val="standardContextual"/>
         </w:rPr>
       </w:pPr>
-      <w:hyperlink w:anchor="_Toc241970186" w:history="1">
+      <w:hyperlink w:anchor="_Toc241970541" w:history="1">
         <w:r>
           <w:rPr>
             <w:rStyle w:val="Siuktni"/>
@@ -1447,7 +1447,7 @@
             <w:noProof/>
             <w:webHidden/>
           </w:rPr>
-          <w:instrText xml:space="preserve"> PAGEREF _Toc241970186 \h </w:instrText>
+          <w:instrText xml:space="preserve"> PAGEREF _Toc241970541 \h </w:instrText>
         </w:r>
         <w:r>
           <w:rPr>
@@ -1495,7 +1495,7 @@
           <w14:ligatures w14:val="standardContextual"/>
         </w:rPr>
       </w:pPr>
-      <w:hyperlink w:anchor="_Toc241970187" w:history="1">
+      <w:hyperlink w:anchor="_Toc241970542" w:history="1">
         <w:r>
           <w:rPr>
             <w:rStyle w:val="Siuktni"/>
@@ -1522,7 +1522,7 @@
             <w:noProof/>
             <w:webHidden/>
           </w:rPr>
-          <w:instrText xml:space="preserve"> PAGEREF _Toc241970187 \h </w:instrText>
+          <w:instrText xml:space="preserve"> PAGEREF _Toc241970542 \h </w:instrText>
         </w:r>
         <w:r>
           <w:rPr>
@@ -1570,7 +1570,7 @@
           <w14:ligatures w14:val="standardContextual"/>
         </w:rPr>
       </w:pPr>
-      <w:hyperlink w:anchor="_Toc241970188" w:history="1">
+      <w:hyperlink w:anchor="_Toc241970543" w:history="1">
         <w:r>
           <w:rPr>
             <w:rStyle w:val="Siuktni"/>
@@ -1597,7 +1597,7 @@
             <w:noProof/>
             <w:webHidden/>
           </w:rPr>
-          <w:instrText xml:space="preserve"> PAGEREF _Toc241970188 \h </w:instrText>
+          <w:instrText xml:space="preserve"> PAGEREF _Toc241970543 \h </w:instrText>
         </w:r>
         <w:r>
           <w:rPr>
@@ -1645,7 +1645,7 @@
           <w14:ligatures w14:val="standardContextual"/>
         </w:rPr>
       </w:pPr>
-      <w:hyperlink w:anchor="_Toc241970189" w:history="1">
+      <w:hyperlink w:anchor="_Toc241970544" w:history="1">
         <w:r>
           <w:rPr>
             <w:rStyle w:val="Siuktni"/>
@@ -1672,7 +1672,7 @@
             <w:noProof/>
             <w:webHidden/>
           </w:rPr>
-          <w:instrText xml:space="preserve"> PAGEREF _Toc241970189 \h </w:instrText>
+          <w:instrText xml:space="preserve"> PAGEREF _Toc241970544 \h </w:instrText>
         </w:r>
         <w:r>
           <w:rPr>
@@ -1720,7 +1720,7 @@
           <w14:ligatures w14:val="standardContextual"/>
         </w:rPr>
       </w:pPr>
-      <w:hyperlink w:anchor="_Toc241970190" w:history="1">
+      <w:hyperlink w:anchor="_Toc241970545" w:history="1">
         <w:r>
           <w:rPr>
             <w:rStyle w:val="Siuktni"/>
@@ -1747,7 +1747,7 @@
             <w:noProof/>
             <w:webHidden/>
           </w:rPr>
-          <w:instrText xml:space="preserve"> PAGEREF _Toc241970190 \h </w:instrText>
+          <w:instrText xml:space="preserve"> PAGEREF _Toc241970545 \h </w:instrText>
         </w:r>
         <w:r>
           <w:rPr>
@@ -1795,7 +1795,7 @@
           <w14:ligatures w14:val="standardContextual"/>
         </w:rPr>
       </w:pPr>
-      <w:hyperlink w:anchor="_Toc241970191" w:history="1">
+      <w:hyperlink w:anchor="_Toc241970546" w:history="1">
         <w:r>
           <w:rPr>
             <w:rStyle w:val="Siuktni"/>
@@ -1822,7 +1822,7 @@
             <w:noProof/>
             <w:webHidden/>
           </w:rPr>
-          <w:instrText xml:space="preserve"> PAGEREF _Toc241970191 \h </w:instrText>
+          <w:instrText xml:space="preserve"> PAGEREF _Toc241970546 \h </w:instrText>
         </w:r>
         <w:r>
           <w:rPr>
@@ -1870,7 +1870,7 @@
           <w14:ligatures w14:val="standardContextual"/>
         </w:rPr>
       </w:pPr>
-      <w:hyperlink w:anchor="_Toc241970192" w:history="1">
+      <w:hyperlink w:anchor="_Toc241970547" w:history="1">
         <w:r>
           <w:rPr>
             <w:rStyle w:val="Siuktni"/>
@@ -1897,7 +1897,7 @@
             <w:noProof/>
             <w:webHidden/>
           </w:rPr>
-          <w:instrText xml:space="preserve"> PAGEREF _Toc241970192 \h </w:instrText>
+          <w:instrText xml:space="preserve"> PAGEREF _Toc241970547 \h </w:instrText>
         </w:r>
         <w:r>
           <w:rPr>
@@ -1945,7 +1945,7 @@
           <w14:ligatures w14:val="standardContextual"/>
         </w:rPr>
       </w:pPr>
-      <w:hyperlink w:anchor="_Toc241970193" w:history="1">
+      <w:hyperlink w:anchor="_Toc241970548" w:history="1">
         <w:r>
           <w:rPr>
             <w:rStyle w:val="Siuktni"/>
@@ -1972,7 +1972,7 @@
             <w:noProof/>
             <w:webHidden/>
           </w:rPr>
-          <w:instrText xml:space="preserve"> PAGEREF _Toc241970193 \h </w:instrText>
+          <w:instrText xml:space="preserve"> PAGEREF _Toc241970548 \h </w:instrText>
         </w:r>
         <w:r>
           <w:rPr>
@@ -2020,7 +2020,7 @@
           <w14:ligatures w14:val="standardContextual"/>
         </w:rPr>
       </w:pPr>
-      <w:hyperlink w:anchor="_Toc241970194" w:history="1">
+      <w:hyperlink w:anchor="_Toc241970549" w:history="1">
         <w:r>
           <w:rPr>
             <w:rStyle w:val="Siuktni"/>
@@ -2047,7 +2047,7 @@
             <w:noProof/>
             <w:webHidden/>
           </w:rPr>
-          <w:instrText xml:space="preserve"> PAGEREF _Toc241970194 \h </w:instrText>
+          <w:instrText xml:space="preserve"> PAGEREF _Toc241970549 \h </w:instrText>
         </w:r>
         <w:r>
           <w:rPr>
@@ -2095,7 +2095,7 @@
           <w14:ligatures w14:val="standardContextual"/>
         </w:rPr>
       </w:pPr>
-      <w:hyperlink w:anchor="_Toc241970195" w:history="1">
+      <w:hyperlink w:anchor="_Toc241970550" w:history="1">
         <w:r>
           <w:rPr>
             <w:rStyle w:val="Siuktni"/>
@@ -2122,7 +2122,7 @@
             <w:noProof/>
             <w:webHidden/>
           </w:rPr>
-          <w:instrText xml:space="preserve"> PAGEREF _Toc241970195 \h </w:instrText>
+          <w:instrText xml:space="preserve"> PAGEREF _Toc241970550 \h </w:instrText>
         </w:r>
         <w:r>
           <w:rPr>
@@ -2170,7 +2170,7 @@
           <w14:ligatures w14:val="standardContextual"/>
         </w:rPr>
       </w:pPr>
-      <w:hyperlink w:anchor="_Toc241970196" w:history="1">
+      <w:hyperlink w:anchor="_Toc241970551" w:history="1">
         <w:r>
           <w:rPr>
             <w:rStyle w:val="Siuktni"/>
@@ -2197,7 +2197,7 @@
             <w:noProof/>
             <w:webHidden/>
           </w:rPr>
-          <w:instrText xml:space="preserve"> PAGEREF _Toc241970196 \h </w:instrText>
+          <w:instrText xml:space="preserve"> PAGEREF _Toc241970551 \h </w:instrText>
         </w:r>
         <w:r>
           <w:rPr>
@@ -2245,7 +2245,7 @@
           <w14:ligatures w14:val="standardContextual"/>
         </w:rPr>
       </w:pPr>
-      <w:hyperlink w:anchor="_Toc241970197" w:history="1">
+      <w:hyperlink w:anchor="_Toc241970552" w:history="1">
         <w:r>
           <w:rPr>
             <w:rStyle w:val="Siuktni"/>
@@ -2272,7 +2272,7 @@
             <w:noProof/>
             <w:webHidden/>
           </w:rPr>
-          <w:instrText xml:space="preserve"> PAGEREF _Toc241970197 \h </w:instrText>
+          <w:instrText xml:space="preserve"> PAGEREF _Toc241970552 \h </w:instrText>
         </w:r>
         <w:r>
           <w:rPr>
@@ -2320,7 +2320,7 @@
           <w14:ligatures w14:val="standardContextual"/>
         </w:rPr>
       </w:pPr>
-      <w:hyperlink w:anchor="_Toc241970198" w:history="1">
+      <w:hyperlink w:anchor="_Toc241970553" w:history="1">
         <w:r>
           <w:rPr>
             <w:rStyle w:val="Siuktni"/>
@@ -2347,7 +2347,7 @@
             <w:noProof/>
             <w:webHidden/>
           </w:rPr>
-          <w:instrText xml:space="preserve"> PAGEREF _Toc241970198 \h </w:instrText>
+          <w:instrText xml:space="preserve"> PAGEREF _Toc241970553 \h </w:instrText>
         </w:r>
         <w:r>
           <w:rPr>
@@ -2395,7 +2395,7 @@
           <w14:ligatures w14:val="standardContextual"/>
         </w:rPr>
       </w:pPr>
-      <w:hyperlink w:anchor="_Toc241970199" w:history="1">
+      <w:hyperlink w:anchor="_Toc241970554" w:history="1">
         <w:r>
           <w:rPr>
             <w:rStyle w:val="Siuktni"/>
@@ -2422,7 +2422,7 @@
             <w:noProof/>
             <w:webHidden/>
           </w:rPr>
-          <w:instrText xml:space="preserve"> PAGEREF _Toc241970199 \h </w:instrText>
+          <w:instrText xml:space="preserve"> PAGEREF _Toc241970554 \h </w:instrText>
         </w:r>
         <w:r>
           <w:rPr>
@@ -2470,7 +2470,7 @@
           <w14:ligatures w14:val="standardContextual"/>
         </w:rPr>
       </w:pPr>
-      <w:hyperlink w:anchor="_Toc241970200" w:history="1">
+      <w:hyperlink w:anchor="_Toc241970555" w:history="1">
         <w:r>
           <w:rPr>
             <w:rStyle w:val="Siuktni"/>
@@ -2497,7 +2497,7 @@
             <w:noProof/>
             <w:webHidden/>
           </w:rPr>
-          <w:instrText xml:space="preserve"> PAGEREF _Toc241970200 \h </w:instrText>
+          <w:instrText xml:space="preserve"> PAGEREF _Toc241970555 \h </w:instrText>
         </w:r>
         <w:r>
           <w:rPr>
@@ -2545,7 +2545,7 @@
           <w14:ligatures w14:val="standardContextual"/>
         </w:rPr>
       </w:pPr>
-      <w:hyperlink w:anchor="_Toc241970201" w:history="1">
+      <w:hyperlink w:anchor="_Toc241970556" w:history="1">
         <w:r>
           <w:rPr>
             <w:rStyle w:val="Siuktni"/>
@@ -2572,7 +2572,7 @@
             <w:noProof/>
             <w:webHidden/>
           </w:rPr>
-          <w:instrText xml:space="preserve"> PAGEREF _Toc241970201 \h </w:instrText>
+          <w:instrText xml:space="preserve"> PAGEREF _Toc241970556 \h </w:instrText>
         </w:r>
         <w:r>
           <w:rPr>
@@ -2620,7 +2620,7 @@
           <w14:ligatures w14:val="standardContextual"/>
         </w:rPr>
       </w:pPr>
-      <w:hyperlink w:anchor="_Toc241970202" w:history="1">
+      <w:hyperlink w:anchor="_Toc241970557" w:history="1">
         <w:r>
           <w:rPr>
             <w:rStyle w:val="Siuktni"/>
@@ -2647,7 +2647,7 @@
             <w:noProof/>
             <w:webHidden/>
           </w:rPr>
-          <w:instrText xml:space="preserve"> PAGEREF _Toc241970202 \h </w:instrText>
+          <w:instrText xml:space="preserve"> PAGEREF _Toc241970557 \h </w:instrText>
         </w:r>
         <w:r>
           <w:rPr>
@@ -2695,7 +2695,7 @@
           <w14:ligatures w14:val="standardContextual"/>
         </w:rPr>
       </w:pPr>
-      <w:hyperlink w:anchor="_Toc241970203" w:history="1">
+      <w:hyperlink w:anchor="_Toc241970558" w:history="1">
         <w:r>
           <w:rPr>
             <w:rStyle w:val="Siuktni"/>
@@ -2722,7 +2722,7 @@
             <w:noProof/>
             <w:webHidden/>
           </w:rPr>
-          <w:instrText xml:space="preserve"> PAGEREF _Toc241970203 \h </w:instrText>
+          <w:instrText xml:space="preserve"> PAGEREF _Toc241970558 \h </w:instrText>
         </w:r>
         <w:r>
           <w:rPr>
@@ -2770,7 +2770,7 @@
           <w14:ligatures w14:val="standardContextual"/>
         </w:rPr>
       </w:pPr>
-      <w:hyperlink w:anchor="_Toc241970204" w:history="1">
+      <w:hyperlink w:anchor="_Toc241970559" w:history="1">
         <w:r>
           <w:rPr>
             <w:rStyle w:val="Siuktni"/>
@@ -2797,7 +2797,7 @@
             <w:noProof/>
             <w:webHidden/>
           </w:rPr>
-          <w:instrText xml:space="preserve"> PAGEREF _Toc241970204 \h </w:instrText>
+          <w:instrText xml:space="preserve"> PAGEREF _Toc241970559 \h </w:instrText>
         </w:r>
         <w:r>
           <w:rPr>
@@ -2845,7 +2845,7 @@
           <w14:ligatures w14:val="standardContextual"/>
         </w:rPr>
       </w:pPr>
-      <w:hyperlink w:anchor="_Toc241970205" w:history="1">
+      <w:hyperlink w:anchor="_Toc241970560" w:history="1">
         <w:r>
           <w:rPr>
             <w:rStyle w:val="Siuktni"/>
@@ -2872,7 +2872,7 @@
             <w:noProof/>
             <w:webHidden/>
           </w:rPr>
-          <w:instrText xml:space="preserve"> PAGEREF _Toc241970205 \h </w:instrText>
+          <w:instrText xml:space="preserve"> PAGEREF _Toc241970560 \h </w:instrText>
         </w:r>
         <w:r>
           <w:rPr>
@@ -2920,7 +2920,7 @@
           <w14:ligatures w14:val="standardContextual"/>
         </w:rPr>
       </w:pPr>
-      <w:hyperlink w:anchor="_Toc241970206" w:history="1">
+      <w:hyperlink w:anchor="_Toc241970561" w:history="1">
         <w:r>
           <w:rPr>
             <w:rStyle w:val="Siuktni"/>
@@ -2947,7 +2947,7 @@
             <w:noProof/>
             <w:webHidden/>
           </w:rPr>
-          <w:instrText xml:space="preserve"> PAGEREF _Toc241970206 \h </w:instrText>
+          <w:instrText xml:space="preserve"> PAGEREF _Toc241970561 \h </w:instrText>
         </w:r>
         <w:r>
           <w:rPr>
@@ -2995,7 +2995,7 @@
           <w14:ligatures w14:val="standardContextual"/>
         </w:rPr>
       </w:pPr>
-      <w:hyperlink w:anchor="_Toc241970207" w:history="1">
+      <w:hyperlink w:anchor="_Toc241970562" w:history="1">
         <w:r>
           <w:rPr>
             <w:rStyle w:val="Siuktni"/>
@@ -3022,7 +3022,7 @@
             <w:noProof/>
             <w:webHidden/>
           </w:rPr>
-          <w:instrText xml:space="preserve"> PAGEREF _Toc241970207 \h </w:instrText>
+          <w:instrText xml:space="preserve"> PAGEREF _Toc241970562 \h </w:instrText>
         </w:r>
         <w:r>
           <w:rPr>
@@ -3070,7 +3070,7 @@
           <w14:ligatures w14:val="standardContextual"/>
         </w:rPr>
       </w:pPr>
-      <w:hyperlink w:anchor="_Toc241970208" w:history="1">
+      <w:hyperlink w:anchor="_Toc241970563" w:history="1">
         <w:r>
           <w:rPr>
             <w:rStyle w:val="Siuktni"/>
@@ -3097,7 +3097,7 @@
             <w:noProof/>
             <w:webHidden/>
           </w:rPr>
-          <w:instrText xml:space="preserve"> PAGEREF _Toc241970208 \h </w:instrText>
+          <w:instrText xml:space="preserve"> PAGEREF _Toc241970563 \h </w:instrText>
         </w:r>
         <w:r>
           <w:rPr>
@@ -3145,7 +3145,7 @@
           <w14:ligatures w14:val="standardContextual"/>
         </w:rPr>
       </w:pPr>
-      <w:hyperlink w:anchor="_Toc241970209" w:history="1">
+      <w:hyperlink w:anchor="_Toc241970564" w:history="1">
         <w:r>
           <w:rPr>
             <w:rStyle w:val="Siuktni"/>
@@ -3172,7 +3172,7 @@
             <w:noProof/>
             <w:webHidden/>
           </w:rPr>
-          <w:instrText xml:space="preserve"> PAGEREF _Toc241970209 \h </w:instrText>
+          <w:instrText xml:space="preserve"> PAGEREF _Toc241970564 \h </w:instrText>
         </w:r>
         <w:r>
           <w:rPr>
@@ -3220,7 +3220,7 @@
           <w14:ligatures w14:val="standardContextual"/>
         </w:rPr>
       </w:pPr>
-      <w:hyperlink w:anchor="_Toc241970210" w:history="1">
+      <w:hyperlink w:anchor="_Toc241970565" w:history="1">
         <w:r>
           <w:rPr>
             <w:rStyle w:val="Siuktni"/>
@@ -3247,7 +3247,7 @@
             <w:noProof/>
             <w:webHidden/>
           </w:rPr>
-          <w:instrText xml:space="preserve"> PAGEREF _Toc241970210 \h </w:instrText>
+          <w:instrText xml:space="preserve"> PAGEREF _Toc241970565 \h </w:instrText>
         </w:r>
         <w:r>
           <w:rPr>
@@ -3295,7 +3295,7 @@
           <w14:ligatures w14:val="standardContextual"/>
         </w:rPr>
       </w:pPr>
-      <w:hyperlink w:anchor="_Toc241970211" w:history="1">
+      <w:hyperlink w:anchor="_Toc241970566" w:history="1">
         <w:r>
           <w:rPr>
             <w:rStyle w:val="Siuktni"/>
@@ -3322,7 +3322,7 @@
             <w:noProof/>
             <w:webHidden/>
           </w:rPr>
-          <w:instrText xml:space="preserve"> PAGEREF _Toc241970211 \h </w:instrText>
+          <w:instrText xml:space="preserve"> PAGEREF _Toc241970566 \h </w:instrText>
         </w:r>
         <w:r>
           <w:rPr>
@@ -3370,7 +3370,7 @@
           <w14:ligatures w14:val="standardContextual"/>
         </w:rPr>
       </w:pPr>
-      <w:hyperlink w:anchor="_Toc241970212" w:history="1">
+      <w:hyperlink w:anchor="_Toc241970567" w:history="1">
         <w:r>
           <w:rPr>
             <w:rStyle w:val="Siuktni"/>
@@ -3397,7 +3397,7 @@
             <w:noProof/>
             <w:webHidden/>
           </w:rPr>
-          <w:instrText xml:space="preserve"> PAGEREF _Toc241970212 \h </w:instrText>
+          <w:instrText xml:space="preserve"> PAGEREF _Toc241970567 \h </w:instrText>
         </w:r>
         <w:r>
           <w:rPr>
@@ -3445,13 +3445,13 @@
           <w14:ligatures w14:val="standardContextual"/>
         </w:rPr>
       </w:pPr>
-      <w:hyperlink w:anchor="_Toc241970213" w:history="1">
+      <w:hyperlink w:anchor="_Toc241970568" w:history="1">
         <w:r>
           <w:rPr>
             <w:rStyle w:val="Siuktni"/>
             <w:noProof/>
           </w:rPr>
-          <w:t>6.4. Đe dọa đến độ giá trị của kết quả</w:t>
+          <w:t>6.4. Giới hạn của kết quả và cách giảm sai lệch</w:t>
         </w:r>
         <w:r>
           <w:rPr>
@@ -3472,7 +3472,7 @@
             <w:noProof/>
             <w:webHidden/>
           </w:rPr>
-          <w:instrText xml:space="preserve"> PAGEREF _Toc241970213 \h </w:instrText>
+          <w:instrText xml:space="preserve"> PAGEREF _Toc241970568 \h </w:instrText>
         </w:r>
         <w:r>
           <w:rPr>
@@ -3520,7 +3520,7 @@
           <w14:ligatures w14:val="standardContextual"/>
         </w:rPr>
       </w:pPr>
-      <w:hyperlink w:anchor="_Toc241970214" w:history="1">
+      <w:hyperlink w:anchor="_Toc241970569" w:history="1">
         <w:r>
           <w:rPr>
             <w:rStyle w:val="Siuktni"/>
@@ -3547,7 +3547,7 @@
             <w:noProof/>
             <w:webHidden/>
           </w:rPr>
-          <w:instrText xml:space="preserve"> PAGEREF _Toc241970214 \h </w:instrText>
+          <w:instrText xml:space="preserve"> PAGEREF _Toc241970569 \h </w:instrText>
         </w:r>
         <w:r>
           <w:rPr>
@@ -3595,7 +3595,7 @@
           <w14:ligatures w14:val="standardContextual"/>
         </w:rPr>
       </w:pPr>
-      <w:hyperlink w:anchor="_Toc241970215" w:history="1">
+      <w:hyperlink w:anchor="_Toc241970570" w:history="1">
         <w:r>
           <w:rPr>
             <w:rStyle w:val="Siuktni"/>
@@ -3622,7 +3622,7 @@
             <w:noProof/>
             <w:webHidden/>
           </w:rPr>
-          <w:instrText xml:space="preserve"> PAGEREF _Toc241970215 \h </w:instrText>
+          <w:instrText xml:space="preserve"> PAGEREF _Toc241970570 \h </w:instrText>
         </w:r>
         <w:r>
           <w:rPr>
@@ -3670,7 +3670,7 @@
           <w14:ligatures w14:val="standardContextual"/>
         </w:rPr>
       </w:pPr>
-      <w:hyperlink w:anchor="_Toc241970216" w:history="1">
+      <w:hyperlink w:anchor="_Toc241970571" w:history="1">
         <w:r>
           <w:rPr>
             <w:rStyle w:val="Siuktni"/>
@@ -3697,7 +3697,7 @@
             <w:noProof/>
             <w:webHidden/>
           </w:rPr>
-          <w:instrText xml:space="preserve"> PAGEREF _Toc241970216 \h </w:instrText>
+          <w:instrText xml:space="preserve"> PAGEREF _Toc241970571 \h </w:instrText>
         </w:r>
         <w:r>
           <w:rPr>
@@ -3745,13 +3745,13 @@
           <w14:ligatures w14:val="standardContextual"/>
         </w:rPr>
       </w:pPr>
-      <w:hyperlink w:anchor="_Toc241970217" w:history="1">
+      <w:hyperlink w:anchor="_Toc241970572" w:history="1">
         <w:r>
           <w:rPr>
             <w:rStyle w:val="Siuktni"/>
             <w:noProof/>
           </w:rPr>
-          <w:t>7.3. Kiến nghị trước khi nộp và hướng mở rộng</w:t>
+          <w:t>7.3. Hướng phát triển</w:t>
         </w:r>
         <w:r>
           <w:rPr>
@@ -3772,7 +3772,7 @@
             <w:noProof/>
             <w:webHidden/>
           </w:rPr>
-          <w:instrText xml:space="preserve"> PAGEREF _Toc241970217 \h </w:instrText>
+          <w:instrText xml:space="preserve"> PAGEREF _Toc241970572 \h </w:instrText>
         </w:r>
         <w:r>
           <w:rPr>
@@ -3820,7 +3820,7 @@
           <w14:ligatures w14:val="standardContextual"/>
         </w:rPr>
       </w:pPr>
-      <w:hyperlink w:anchor="_Toc241970218" w:history="1">
+      <w:hyperlink w:anchor="_Toc241970573" w:history="1">
         <w:r>
           <w:rPr>
             <w:rStyle w:val="Siuktni"/>
@@ -3847,7 +3847,7 @@
             <w:noProof/>
             <w:webHidden/>
           </w:rPr>
-          <w:instrText xml:space="preserve"> PAGEREF _Toc241970218 \h </w:instrText>
+          <w:instrText xml:space="preserve"> PAGEREF _Toc241970573 \h </w:instrText>
         </w:r>
         <w:r>
           <w:rPr>
@@ -3895,7 +3895,7 @@
           <w14:ligatures w14:val="standardContextual"/>
         </w:rPr>
       </w:pPr>
-      <w:hyperlink w:anchor="_Toc241970219" w:history="1">
+      <w:hyperlink w:anchor="_Toc241970574" w:history="1">
         <w:r>
           <w:rPr>
             <w:rStyle w:val="Siuktni"/>
@@ -3922,7 +3922,7 @@
             <w:noProof/>
             <w:webHidden/>
           </w:rPr>
-          <w:instrText xml:space="preserve"> PAGEREF _Toc241970219 \h </w:instrText>
+          <w:instrText xml:space="preserve"> PAGEREF _Toc241970574 \h </w:instrText>
         </w:r>
         <w:r>
           <w:rPr>
@@ -3970,7 +3970,7 @@
           <w14:ligatures w14:val="standardContextual"/>
         </w:rPr>
       </w:pPr>
-      <w:hyperlink w:anchor="_Toc241970220" w:history="1">
+      <w:hyperlink w:anchor="_Toc241970575" w:history="1">
         <w:r>
           <w:rPr>
             <w:rStyle w:val="Siuktni"/>
@@ -3997,7 +3997,7 @@
             <w:noProof/>
             <w:webHidden/>
           </w:rPr>
-          <w:instrText xml:space="preserve"> PAGEREF _Toc241970220 \h </w:instrText>
+          <w:instrText xml:space="preserve"> PAGEREF _Toc241970575 \h </w:instrText>
         </w:r>
         <w:r>
           <w:rPr>
@@ -4045,7 +4045,7 @@
           <w14:ligatures w14:val="standardContextual"/>
         </w:rPr>
       </w:pPr>
-      <w:hyperlink w:anchor="_Toc241970221" w:history="1">
+      <w:hyperlink w:anchor="_Toc241970576" w:history="1">
         <w:r>
           <w:rPr>
             <w:rStyle w:val="Siuktni"/>
@@ -4072,7 +4072,7 @@
             <w:noProof/>
             <w:webHidden/>
           </w:rPr>
-          <w:instrText xml:space="preserve"> PAGEREF _Toc241970221 \h </w:instrText>
+          <w:instrText xml:space="preserve"> PAGEREF _Toc241970576 \h </w:instrText>
         </w:r>
         <w:r>
           <w:rPr>
@@ -4120,7 +4120,7 @@
           <w14:ligatures w14:val="standardContextual"/>
         </w:rPr>
       </w:pPr>
-      <w:hyperlink w:anchor="_Toc241970222" w:history="1">
+      <w:hyperlink w:anchor="_Toc241970577" w:history="1">
         <w:r>
           <w:rPr>
             <w:rStyle w:val="Siuktni"/>
@@ -4147,7 +4147,7 @@
             <w:noProof/>
             <w:webHidden/>
           </w:rPr>
-          <w:instrText xml:space="preserve"> PAGEREF _Toc241970222 \h </w:instrText>
+          <w:instrText xml:space="preserve"> PAGEREF _Toc241970577 \h </w:instrText>
         </w:r>
         <w:r>
           <w:rPr>
@@ -4195,7 +4195,7 @@
           <w14:ligatures w14:val="standardContextual"/>
         </w:rPr>
       </w:pPr>
-      <w:hyperlink w:anchor="_Toc241970223" w:history="1">
+      <w:hyperlink w:anchor="_Toc241970578" w:history="1">
         <w:r>
           <w:rPr>
             <w:rStyle w:val="Siuktni"/>
@@ -4222,7 +4222,7 @@
             <w:noProof/>
             <w:webHidden/>
           </w:rPr>
-          <w:instrText xml:space="preserve"> PAGEREF _Toc241970223 \h </w:instrText>
+          <w:instrText xml:space="preserve"> PAGEREF _Toc241970578 \h </w:instrText>
         </w:r>
         <w:r>
           <w:rPr>
@@ -4270,7 +4270,7 @@
           <w14:ligatures w14:val="standardContextual"/>
         </w:rPr>
       </w:pPr>
-      <w:hyperlink w:anchor="_Toc241970224" w:history="1">
+      <w:hyperlink w:anchor="_Toc241970579" w:history="1">
         <w:r>
           <w:rPr>
             <w:rStyle w:val="Siuktni"/>
@@ -4297,7 +4297,7 @@
             <w:noProof/>
             <w:webHidden/>
           </w:rPr>
-          <w:instrText xml:space="preserve"> PAGEREF _Toc241970224 \h </w:instrText>
+          <w:instrText xml:space="preserve"> PAGEREF _Toc241970579 \h </w:instrText>
         </w:r>
         <w:r>
           <w:rPr>
@@ -4345,7 +4345,7 @@
           <w14:ligatures w14:val="standardContextual"/>
         </w:rPr>
       </w:pPr>
-      <w:hyperlink w:anchor="_Toc241970225" w:history="1">
+      <w:hyperlink w:anchor="_Toc241970580" w:history="1">
         <w:r>
           <w:rPr>
             <w:rStyle w:val="Siuktni"/>
@@ -4372,7 +4372,7 @@
             <w:noProof/>
             <w:webHidden/>
           </w:rPr>
-          <w:instrText xml:space="preserve"> PAGEREF _Toc241970225 \h </w:instrText>
+          <w:instrText xml:space="preserve"> PAGEREF _Toc241970580 \h </w:instrText>
         </w:r>
         <w:r>
           <w:rPr>
@@ -4420,7 +4420,7 @@
           <w14:ligatures w14:val="standardContextual"/>
         </w:rPr>
       </w:pPr>
-      <w:hyperlink w:anchor="_Toc241970226" w:history="1">
+      <w:hyperlink w:anchor="_Toc241970581" w:history="1">
         <w:r>
           <w:rPr>
             <w:rStyle w:val="Siuktni"/>
@@ -4447,7 +4447,7 @@
             <w:noProof/>
             <w:webHidden/>
           </w:rPr>
-          <w:instrText xml:space="preserve"> PAGEREF _Toc241970226 \h </w:instrText>
+          <w:instrText xml:space="preserve"> PAGEREF _Toc241970581 \h </w:instrText>
         </w:r>
         <w:r>
           <w:rPr>
@@ -4495,7 +4495,7 @@
           <w14:ligatures w14:val="standardContextual"/>
         </w:rPr>
       </w:pPr>
-      <w:hyperlink w:anchor="_Toc241970227" w:history="1">
+      <w:hyperlink w:anchor="_Toc241970582" w:history="1">
         <w:r>
           <w:rPr>
             <w:rStyle w:val="Siuktni"/>
@@ -4522,7 +4522,7 @@
             <w:noProof/>
             <w:webHidden/>
           </w:rPr>
-          <w:instrText xml:space="preserve"> PAGEREF _Toc241970227 \h </w:instrText>
+          <w:instrText xml:space="preserve"> PAGEREF _Toc241970582 \h </w:instrText>
         </w:r>
         <w:r>
           <w:rPr>
@@ -4570,7 +4570,7 @@
           <w14:ligatures w14:val="standardContextual"/>
         </w:rPr>
       </w:pPr>
-      <w:hyperlink w:anchor="_Toc241970228" w:history="1">
+      <w:hyperlink w:anchor="_Toc241970583" w:history="1">
         <w:r>
           <w:rPr>
             <w:rStyle w:val="Siuktni"/>
@@ -4597,7 +4597,7 @@
             <w:noProof/>
             <w:webHidden/>
           </w:rPr>
-          <w:instrText xml:space="preserve"> PAGEREF _Toc241970228 \h </w:instrText>
+          <w:instrText xml:space="preserve"> PAGEREF _Toc241970583 \h </w:instrText>
         </w:r>
         <w:r>
           <w:rPr>
@@ -4618,81 +4618,6 @@
             <w:webHidden/>
           </w:rPr>
           <w:t>39</w:t>
-        </w:r>
-        <w:r>
-          <w:rPr>
-            <w:noProof/>
-            <w:webHidden/>
-          </w:rPr>
-          <w:fldChar w:fldCharType="end"/>
-        </w:r>
-      </w:hyperlink>
-    </w:p>
-    <w:p>
-      <w:pPr>
-        <w:pStyle w:val="Mucluc1"/>
-        <w:tabs>
-          <w:tab w:val="right" w:leader="dot" w:pos="9537"/>
-        </w:tabs>
-        <w:rPr>
-          <w:rFonts w:asciiTheme="minorHAnsi" w:eastAsiaTheme="minorEastAsia" w:hAnsiTheme="minorHAnsi"/>
-          <w:noProof/>
-          <w:color w:val="auto"/>
-          <w:kern w:val="2"/>
-          <w:sz w:val="24"/>
-          <w:szCs w:val="24"/>
-          <w:lang w:val="vi-VN" w:eastAsia="vi-VN"/>
-          <w14:ligatures w14:val="standardContextual"/>
-        </w:rPr>
-      </w:pPr>
-      <w:hyperlink w:anchor="_Toc241970229" w:history="1">
-        <w:r>
-          <w:rPr>
-            <w:rStyle w:val="Siuktni"/>
-            <w:noProof/>
-          </w:rPr>
-          <w:t>PHỤ LỤC F. CHECKLIST TRƯỚC KHI NỘP</w:t>
-        </w:r>
-        <w:r>
-          <w:rPr>
-            <w:noProof/>
-            <w:webHidden/>
-          </w:rPr>
-          <w:tab/>
-        </w:r>
-        <w:r>
-          <w:rPr>
-            <w:noProof/>
-            <w:webHidden/>
-          </w:rPr>
-          <w:fldChar w:fldCharType="begin"/>
-        </w:r>
-        <w:r>
-          <w:rPr>
-            <w:noProof/>
-            <w:webHidden/>
-          </w:rPr>
-          <w:instrText xml:space="preserve"> PAGEREF _Toc241970229 \h </w:instrText>
-        </w:r>
-        <w:r>
-          <w:rPr>
-            <w:noProof/>
-            <w:webHidden/>
-          </w:rPr>
-        </w:r>
-        <w:r>
-          <w:rPr>
-            <w:noProof/>
-            <w:webHidden/>
-          </w:rPr>
-          <w:fldChar w:fldCharType="separate"/>
-        </w:r>
-        <w:r>
-          <w:rPr>
-            <w:noProof/>
-            <w:webHidden/>
-          </w:rPr>
-          <w:t>40</w:t>
         </w:r>
         <w:r>
           <w:rPr>
@@ -4720,7 +4645,7 @@
       <w:pPr>
         <w:pStyle w:val="u1"/>
       </w:pPr>
-      <w:bookmarkStart w:id="3" w:name="_Toc241970174"/>
+      <w:bookmarkStart w:id="3" w:name="_Toc241970529"/>
       <w:r>
         <w:lastRenderedPageBreak/>
         <w:t>DANH M</w:t>
@@ -5306,7 +5231,7 @@
       <w:pPr>
         <w:pStyle w:val="u1"/>
       </w:pPr>
-      <w:bookmarkStart w:id="4" w:name="_Toc241970175"/>
+      <w:bookmarkStart w:id="4" w:name="_Toc241970530"/>
       <w:r>
         <w:lastRenderedPageBreak/>
         <w:t>CHƯƠNG 1. GI</w:t>
@@ -5329,7 +5254,7 @@
       <w:pPr>
         <w:pStyle w:val="u2"/>
       </w:pPr>
-      <w:bookmarkStart w:id="5" w:name="_Toc241970176"/>
+      <w:bookmarkStart w:id="5" w:name="_Toc241970531"/>
       <w:r>
         <w:t>1.1. B</w:t>
       </w:r>
@@ -5373,7 +5298,7 @@
       <w:pPr>
         <w:pStyle w:val="u2"/>
       </w:pPr>
-      <w:bookmarkStart w:id="6" w:name="_Toc241970177"/>
+      <w:bookmarkStart w:id="6" w:name="_Toc241970532"/>
       <w:r>
         <w:t>1.2. M</w:t>
       </w:r>
@@ -5774,7 +5699,7 @@
       <w:pPr>
         <w:pStyle w:val="u2"/>
       </w:pPr>
-      <w:bookmarkStart w:id="7" w:name="_Toc241970178"/>
+      <w:bookmarkStart w:id="7" w:name="_Toc241970533"/>
       <w:r>
         <w:t>1.3. Đ</w:t>
       </w:r>
@@ -5857,7 +5782,7 @@
       <w:pPr>
         <w:pStyle w:val="u2"/>
       </w:pPr>
-      <w:bookmarkStart w:id="8" w:name="_Toc241970179"/>
+      <w:bookmarkStart w:id="8" w:name="_Toc241970534"/>
       <w:r>
         <w:t>1.4. Phương pháp và c</w:t>
       </w:r>
@@ -5871,7 +5796,7 @@
     </w:p>
     <w:p>
       <w:r>
-        <w:t>Đề tài được thực hiện như một nghiên cứu tình huống kỹ thuật trên một SUT. Quy trình gồm sáu bước: đặc tả yêu cầu; phân tích rủi ro; thiết kế ca kiểm thử; thực thi tự động; ghi nhận–sửa–retest defect; tổng hợp và diễn giải bằng chứng. Hồ sơ tuân theo tinh thần của ISO/IEC/IEEE 29119-3:2021 về tài liệu kiểm thử có thể dùng cho nhiều mô hình vòng đời [3], nhưng không tuyên bố tuân thủ hoặc chứng nhận tiêu chuẩn.</w:t>
+        <w:t>Nhóm thực hiện bài theo sáu bước: đặc tả yêu cầu; phân tích rủi ro; thiết kế ca kiểm thử; thực thi tự động; ghi nhận–sửa–kiểm thử lại lỗi; tổng hợp và giải thích bằng chứng. Cách tổ chức hồ sơ tham khảo nội dung tài liệu kiểm thử trong ISO/IEC/IEEE 29119-3:2021 [3], nhưng nhóm không tuyên bố dự án đã tuân thủ hoặc được chứng nhận theo tiêu chuẩn này.</w:t>
       </w:r>
     </w:p>
     <w:p>
@@ -5884,7 +5809,7 @@
       <w:pPr>
         <w:pStyle w:val="u1"/>
       </w:pPr>
-      <w:bookmarkStart w:id="9" w:name="_Toc241970180"/>
+      <w:bookmarkStart w:id="9" w:name="_Toc241970535"/>
       <w:r>
         <w:lastRenderedPageBreak/>
         <w:t>CHƯƠNG 2. CƠ S</w:t>
@@ -5913,7 +5838,7 @@
       <w:pPr>
         <w:pStyle w:val="u2"/>
       </w:pPr>
-      <w:bookmarkStart w:id="10" w:name="_Toc241970181"/>
+      <w:bookmarkStart w:id="10" w:name="_Toc241970536"/>
       <w:r>
         <w:t>2.1. Ch</w:t>
       </w:r>
@@ -5969,7 +5894,7 @@
       <w:pPr>
         <w:pStyle w:val="u2"/>
       </w:pPr>
-      <w:bookmarkStart w:id="11" w:name="_Toc241970182"/>
+      <w:bookmarkStart w:id="11" w:name="_Toc241970537"/>
       <w:r>
         <w:t>2.2. Các t</w:t>
       </w:r>
@@ -6552,7 +6477,7 @@
       <w:pPr>
         <w:pStyle w:val="u2"/>
       </w:pPr>
-      <w:bookmarkStart w:id="12" w:name="_Toc241970183"/>
+      <w:bookmarkStart w:id="12" w:name="_Toc241970538"/>
       <w:r>
         <w:lastRenderedPageBreak/>
         <w:t>2.3. K</w:t>
@@ -7094,7 +7019,7 @@
       <w:pPr>
         <w:pStyle w:val="u2"/>
       </w:pPr>
-      <w:bookmarkStart w:id="13" w:name="_Toc241970184"/>
+      <w:bookmarkStart w:id="13" w:name="_Toc241970539"/>
       <w:r>
         <w:t>2.4. Coverage và mutation testing</w:t>
       </w:r>
@@ -7114,7 +7039,7 @@
       <w:pPr>
         <w:pStyle w:val="u2"/>
       </w:pPr>
-      <w:bookmarkStart w:id="14" w:name="_Toc241970185"/>
+      <w:bookmarkStart w:id="14" w:name="_Toc241970540"/>
       <w:r>
         <w:lastRenderedPageBreak/>
         <w:t>2.5. Security, performance và accessibility</w:t>
@@ -7135,7 +7060,7 @@
       <w:pPr>
         <w:pStyle w:val="u1"/>
       </w:pPr>
-      <w:bookmarkStart w:id="15" w:name="_Toc241970186"/>
+      <w:bookmarkStart w:id="15" w:name="_Toc241970541"/>
       <w:r>
         <w:lastRenderedPageBreak/>
         <w:t>CHƯƠNG 3. PHÂN TÍCH VÀ THI</w:t>
@@ -7158,7 +7083,7 @@
       <w:pPr>
         <w:pStyle w:val="u2"/>
       </w:pPr>
-      <w:bookmarkStart w:id="16" w:name="_Toc241970187"/>
+      <w:bookmarkStart w:id="16" w:name="_Toc241970542"/>
       <w:r>
         <w:t>3.1. Actor và use case</w:t>
       </w:r>
@@ -7178,7 +7103,7 @@
           <w:noProof/>
         </w:rPr>
         <w:drawing>
-          <wp:inline distT="0" distB="0" distL="0" distR="0" wp14:anchorId="153FF55A" wp14:editId="51B4488C">
+          <wp:inline distT="0" distB="0" distL="0" distR="0" wp14:anchorId="2E7E0E73" wp14:editId="34FD2A92">
             <wp:extent cx="5943600" cy="3467100"/>
             <wp:effectExtent l="0" t="0" r="0" b="0"/>
             <wp:docPr id="1" name="Picture 1"/>
@@ -7789,7 +7714,7 @@
       <w:pPr>
         <w:pStyle w:val="u2"/>
       </w:pPr>
-      <w:bookmarkStart w:id="17" w:name="_Toc241970188"/>
+      <w:bookmarkStart w:id="17" w:name="_Toc241970543"/>
       <w:r>
         <w:t>3.2. Yêu c</w:t>
       </w:r>
@@ -8290,7 +8215,7 @@
       <w:pPr>
         <w:pStyle w:val="u2"/>
       </w:pPr>
-      <w:bookmarkStart w:id="18" w:name="_Toc241970189"/>
+      <w:bookmarkStart w:id="18" w:name="_Toc241970544"/>
       <w:r>
         <w:t>3.3. Quy t</w:t>
       </w:r>
@@ -8797,7 +8722,7 @@
       <w:pPr>
         <w:pStyle w:val="u2"/>
       </w:pPr>
-      <w:bookmarkStart w:id="19" w:name="_Toc241970190"/>
+      <w:bookmarkStart w:id="19" w:name="_Toc241970545"/>
       <w:r>
         <w:t>3.4. Ki</w:t>
       </w:r>
@@ -8841,7 +8766,7 @@
           <w:noProof/>
         </w:rPr>
         <w:drawing>
-          <wp:inline distT="0" distB="0" distL="0" distR="0" wp14:anchorId="0C500E4F" wp14:editId="7641B24E">
+          <wp:inline distT="0" distB="0" distL="0" distR="0" wp14:anchorId="6F56DFE1" wp14:editId="72D7A775">
             <wp:extent cx="5943600" cy="3467100"/>
             <wp:effectExtent l="0" t="0" r="0" b="0"/>
             <wp:docPr id="2" name="Picture 2"/>
@@ -8901,7 +8826,7 @@
       <w:pPr>
         <w:pStyle w:val="u2"/>
       </w:pPr>
-      <w:bookmarkStart w:id="20" w:name="_Toc241970191"/>
+      <w:bookmarkStart w:id="20" w:name="_Toc241970546"/>
       <w:r>
         <w:lastRenderedPageBreak/>
         <w:t>3.5. Mô hình d</w:t>
@@ -8934,7 +8859,7 @@
           <w:noProof/>
         </w:rPr>
         <w:drawing>
-          <wp:inline distT="0" distB="0" distL="0" distR="0" wp14:anchorId="516250B9" wp14:editId="43BFA2BF">
+          <wp:inline distT="0" distB="0" distL="0" distR="0" wp14:anchorId="564022EC" wp14:editId="75889577">
             <wp:extent cx="5943600" cy="3797300"/>
             <wp:effectExtent l="0" t="0" r="0" b="0"/>
             <wp:docPr id="3" name="Picture 3"/>
@@ -8994,7 +8919,7 @@
       <w:pPr>
         <w:pStyle w:val="u2"/>
       </w:pPr>
-      <w:bookmarkStart w:id="21" w:name="_Toc241970192"/>
+      <w:bookmarkStart w:id="21" w:name="_Toc241970547"/>
       <w:r>
         <w:t>3.6. Công th</w:t>
       </w:r>
@@ -9036,7 +8961,7 @@
       <w:pPr>
         <w:pStyle w:val="u1"/>
       </w:pPr>
-      <w:bookmarkStart w:id="22" w:name="_Toc241970193"/>
+      <w:bookmarkStart w:id="22" w:name="_Toc241970548"/>
       <w:r>
         <w:lastRenderedPageBreak/>
         <w:t>CHƯƠNG 4. PHƯƠNG PHÁP VÀ K</w:t>
@@ -9068,7 +8993,7 @@
       <w:pPr>
         <w:pStyle w:val="u2"/>
       </w:pPr>
-      <w:bookmarkStart w:id="23" w:name="_Toc241970194"/>
+      <w:bookmarkStart w:id="23" w:name="_Toc241970549"/>
       <w:r>
         <w:t>4.1. Chi</w:t>
       </w:r>
@@ -9748,7 +9673,7 @@
       <w:pPr>
         <w:pStyle w:val="u2"/>
       </w:pPr>
-      <w:bookmarkStart w:id="24" w:name="_Toc241970195"/>
+      <w:bookmarkStart w:id="24" w:name="_Toc241970550"/>
       <w:r>
         <w:t>4.2. Thi</w:t>
       </w:r>
@@ -10340,7 +10265,7 @@
       <w:pPr>
         <w:pStyle w:val="u2"/>
       </w:pPr>
-      <w:bookmarkStart w:id="25" w:name="_Toc241970196"/>
+      <w:bookmarkStart w:id="25" w:name="_Toc241970551"/>
       <w:r>
         <w:t>4.3. Môi trư</w:t>
       </w:r>
@@ -10736,7 +10661,7 @@
       <w:pPr>
         <w:pStyle w:val="u2"/>
       </w:pPr>
-      <w:bookmarkStart w:id="26" w:name="_Toc241970197"/>
+      <w:bookmarkStart w:id="26" w:name="_Toc241970552"/>
       <w:r>
         <w:lastRenderedPageBreak/>
         <w:t>4.4. Entry, exit và workflow</w:t>
@@ -11110,7 +11035,7 @@
       <w:pPr>
         <w:pStyle w:val="u2"/>
       </w:pPr>
-      <w:bookmarkStart w:id="27" w:name="_Toc241970198"/>
+      <w:bookmarkStart w:id="27" w:name="_Toc241970553"/>
       <w:r>
         <w:t>4.5. Truy v</w:t>
       </w:r>
@@ -11148,7 +11073,7 @@
       <w:pPr>
         <w:pStyle w:val="u1"/>
       </w:pPr>
-      <w:bookmarkStart w:id="28" w:name="_Toc241970199"/>
+      <w:bookmarkStart w:id="28" w:name="_Toc241970554"/>
       <w:r>
         <w:lastRenderedPageBreak/>
         <w:t>CHƯƠNG 5. TH</w:t>
@@ -11189,7 +11114,7 @@
       <w:pPr>
         <w:pStyle w:val="u2"/>
       </w:pPr>
-      <w:bookmarkStart w:id="29" w:name="_Toc241970200"/>
+      <w:bookmarkStart w:id="29" w:name="_Toc241970555"/>
       <w:r>
         <w:t>5.1. T</w:t>
       </w:r>
@@ -12111,7 +12036,7 @@
         </w:rPr>
         <w:lastRenderedPageBreak/>
         <w:drawing>
-          <wp:inline distT="0" distB="0" distL="0" distR="0" wp14:anchorId="29D3558D" wp14:editId="2B85C5BC">
+          <wp:inline distT="0" distB="0" distL="0" distR="0" wp14:anchorId="13DAFF5A" wp14:editId="5382E2C1">
             <wp:extent cx="5943600" cy="3235960"/>
             <wp:effectExtent l="0" t="0" r="0" b="0"/>
             <wp:docPr id="4" name="Picture 4"/>
@@ -12166,7 +12091,7 @@
       <w:pPr>
         <w:pStyle w:val="u2"/>
       </w:pPr>
-      <w:bookmarkStart w:id="30" w:name="_Toc241970201"/>
+      <w:bookmarkStart w:id="30" w:name="_Toc241970556"/>
       <w:r>
         <w:t>5.2. Unit, BVA và property-based testing</w:t>
       </w:r>
@@ -12186,7 +12111,7 @@
       <w:pPr>
         <w:pStyle w:val="u2"/>
       </w:pPr>
-      <w:bookmarkStart w:id="31" w:name="_Toc241970202"/>
+      <w:bookmarkStart w:id="31" w:name="_Toc241970557"/>
       <w:r>
         <w:t>5.3. API, database và transaction</w:t>
       </w:r>
@@ -12207,7 +12132,7 @@
       <w:pPr>
         <w:pStyle w:val="u2"/>
       </w:pPr>
-      <w:bookmarkStart w:id="32" w:name="_Toc241970203"/>
+      <w:bookmarkStart w:id="32" w:name="_Toc241970558"/>
       <w:r>
         <w:t>5.4. E2E, responsive và accessibility</w:t>
       </w:r>
@@ -12232,7 +12157,7 @@
           <w:noProof/>
         </w:rPr>
         <w:drawing>
-          <wp:inline distT="0" distB="0" distL="0" distR="0" wp14:anchorId="45FF8A06" wp14:editId="775EE204">
+          <wp:inline distT="0" distB="0" distL="0" distR="0" wp14:anchorId="5F41F5C1" wp14:editId="007DDFAF">
             <wp:extent cx="5029200" cy="4306252"/>
             <wp:effectExtent l="0" t="0" r="0" b="0"/>
             <wp:docPr id="5" name="Picture 5"/>
@@ -12293,7 +12218,7 @@
           <w:noProof/>
         </w:rPr>
         <w:drawing>
-          <wp:inline distT="0" distB="0" distL="0" distR="0" wp14:anchorId="0E11AB7E" wp14:editId="56ECB3F3">
+          <wp:inline distT="0" distB="0" distL="0" distR="0" wp14:anchorId="77FAE5A2" wp14:editId="6F48665F">
             <wp:extent cx="5029200" cy="5930265"/>
             <wp:effectExtent l="0" t="0" r="0" b="0"/>
             <wp:docPr id="6" name="Picture 6"/>
@@ -12348,7 +12273,7 @@
       <w:pPr>
         <w:pStyle w:val="u2"/>
       </w:pPr>
-      <w:bookmarkStart w:id="33" w:name="_Toc241970204"/>
+      <w:bookmarkStart w:id="33" w:name="_Toc241970559"/>
       <w:r>
         <w:t>5.5. Coverage và mutation</w:t>
       </w:r>
@@ -12745,7 +12670,7 @@
       <w:pPr>
         <w:pStyle w:val="u2"/>
       </w:pPr>
-      <w:bookmarkStart w:id="34" w:name="_Toc241970205"/>
+      <w:bookmarkStart w:id="34" w:name="_Toc241970560"/>
       <w:r>
         <w:t>5.6. Hi</w:t>
       </w:r>
@@ -12771,7 +12696,7 @@
       <w:pPr>
         <w:pStyle w:val="u2"/>
       </w:pPr>
-      <w:bookmarkStart w:id="35" w:name="_Toc241970206"/>
+      <w:bookmarkStart w:id="35" w:name="_Toc241970561"/>
       <w:r>
         <w:t>5.7. Security testing</w:t>
       </w:r>
@@ -13223,7 +13148,7 @@
       <w:pPr>
         <w:pStyle w:val="u2"/>
       </w:pPr>
-      <w:bookmarkStart w:id="36" w:name="_Toc241970207"/>
+      <w:bookmarkStart w:id="36" w:name="_Toc241970562"/>
       <w:r>
         <w:t>5.8. Lighthouse, axe và tr</w:t>
       </w:r>
@@ -13255,7 +13180,7 @@
       <w:pPr>
         <w:pStyle w:val="u2"/>
       </w:pPr>
-      <w:bookmarkStart w:id="37" w:name="_Toc241970208"/>
+      <w:bookmarkStart w:id="37" w:name="_Toc241970563"/>
       <w:r>
         <w:t>5.9. Tính tái l</w:t>
       </w:r>
@@ -13296,14 +13221,14 @@
     </w:p>
     <w:p>
       <w:r>
-        <w:t>Cơ chế này cho phép người chấm tải artifact, tính lại hash và đối chiếu commit. Một báo cáo cũ hoặc run khác SHA không được dùng để thay thế. Mặt hạn chế là artifact GitHub Actions có chính sách lưu giữ; trước khi nộp cần xác minh link còn truy cập hoặc đính kèm artifact vào release theo quy định lớp.</w:t>
+        <w:t>Cơ chế này cho phép người đọc tải artifact, tính lại hash và đối chiếu commit. Một báo cáo cũ hoặc run khác SHA không được dùng để thay thế. Mặt hạn chế là artifact GitHub Actions có chính sách lưu giữ; vì vậy evidence cần được lưu ở nơi có thời hạn phù hợp với mục đích đối chiếu.</w:t>
       </w:r>
     </w:p>
     <w:p>
       <w:pPr>
         <w:pStyle w:val="u1"/>
       </w:pPr>
-      <w:bookmarkStart w:id="38" w:name="_Toc241970209"/>
+      <w:bookmarkStart w:id="38" w:name="_Toc241970564"/>
       <w:r>
         <w:lastRenderedPageBreak/>
         <w:t>CHƯƠNG 6. DEFECT, RETEST VÀ ĐÁNH GIÁ CH</w:t>
@@ -13326,7 +13251,7 @@
       <w:pPr>
         <w:pStyle w:val="u2"/>
       </w:pPr>
-      <w:bookmarkStart w:id="39" w:name="_Toc241970210"/>
+      <w:bookmarkStart w:id="39" w:name="_Toc241970565"/>
       <w:r>
         <w:t>6.1. Defect lifecycle</w:t>
       </w:r>
@@ -14064,7 +13989,7 @@
       <w:pPr>
         <w:pStyle w:val="u2"/>
       </w:pPr>
-      <w:bookmarkStart w:id="40" w:name="_Toc241970211"/>
+      <w:bookmarkStart w:id="40" w:name="_Toc241970566"/>
       <w:r>
         <w:t>6.2. Tr</w:t>
       </w:r>
@@ -14113,7 +14038,7 @@
       <w:pPr>
         <w:pStyle w:val="u2"/>
       </w:pPr>
-      <w:bookmarkStart w:id="41" w:name="_Toc241970212"/>
+      <w:bookmarkStart w:id="41" w:name="_Toc241970567"/>
       <w:r>
         <w:t>6.3. Đánh giá theo ISO/IEC 25010:2023</w:t>
       </w:r>
@@ -14817,48 +14742,51 @@
       <w:pPr>
         <w:pStyle w:val="u2"/>
       </w:pPr>
-      <w:bookmarkStart w:id="42" w:name="_Toc241970213"/>
-      <w:r>
-        <w:t>6.4. Đe d</w:t>
-      </w:r>
-      <w:r>
-        <w:t>ọ</w:t>
-      </w:r>
-      <w:r>
-        <w:t>a đ</w:t>
+      <w:bookmarkStart w:id="42" w:name="_Toc241970568"/>
+      <w:r>
+        <w:t>6.4. Gi</w:t>
+      </w:r>
+      <w:r>
+        <w:t>ớ</w:t>
+      </w:r>
+      <w:r>
+        <w:t>i h</w:t>
+      </w:r>
+      <w:r>
+        <w:t>ạ</w:t>
+      </w:r>
+      <w:r>
+        <w:t>n c</w:t>
+      </w:r>
+      <w:r>
+        <w:t>ủ</w:t>
+      </w:r>
+      <w:r>
+        <w:t>a k</w:t>
       </w:r>
       <w:r>
         <w:t>ế</w:t>
       </w:r>
       <w:r>
-        <w:t>n đ</w:t>
-      </w:r>
-      <w:r>
-        <w:t>ộ</w:t>
-      </w:r>
-      <w:r>
-        <w:t xml:space="preserve"> giá tr</w:t>
-      </w:r>
-      <w:r>
-        <w:t>ị</w:t>
-      </w:r>
-      <w:r>
-        <w:t xml:space="preserve"> c</w:t>
-      </w:r>
-      <w:r>
-        <w:t>ủ</w:t>
-      </w:r>
-      <w:r>
-        <w:t>a k</w:t>
-      </w:r>
-      <w:r>
-        <w:t>ế</w:t>
-      </w:r>
-      <w:r>
         <w:t>t qu</w:t>
       </w:r>
       <w:r>
         <w:t>ả</w:t>
+      </w:r>
+      <w:r>
+        <w:t xml:space="preserve"> và cách gi</w:t>
+      </w:r>
+      <w:r>
+        <w:t>ả</w:t>
+      </w:r>
+      <w:r>
+        <w:t>m sai l</w:t>
+      </w:r>
+      <w:r>
+        <w:t>ệ</w:t>
+      </w:r>
+      <w:r>
+        <w:t>ch</w:t>
       </w:r>
       <w:bookmarkEnd w:id="42"/>
     </w:p>
@@ -14874,7 +14802,7 @@
           <w:i/>
           <w:sz w:val="22"/>
         </w:rPr>
-        <w:t>Bảng 17. Threats to validity và biện pháp giảm thiểu</w:t>
+        <w:t>Bảng 17. Các yếu tố có thể làm sai lệch kết quả</w:t>
       </w:r>
     </w:p>
     <w:tbl>
@@ -14920,7 +14848,7 @@
                 <w:sz w:val="21"/>
               </w:rPr>
               <w:lastRenderedPageBreak/>
-              <w:t>Loại</w:t>
+              <w:t>Yếu tố</w:t>
             </w:r>
           </w:p>
         </w:tc>
@@ -14941,7 +14869,7 @@
                 <w:b/>
                 <w:sz w:val="21"/>
               </w:rPr>
-              <w:t>Đe dọa</w:t>
+              <w:t>Ảnh hưởng</w:t>
             </w:r>
           </w:p>
         </w:tc>
@@ -14962,7 +14890,7 @@
                 <w:b/>
                 <w:sz w:val="21"/>
               </w:rPr>
-              <w:t>Giảm thiểu</w:t>
+              <w:t>Cách nhóm xử lý</w:t>
             </w:r>
           </w:p>
         </w:tc>
@@ -14987,7 +14915,7 @@
               <w:rPr>
                 <w:sz w:val="21"/>
               </w:rPr>
-              <w:t>Construct</w:t>
+              <w:t>Chỉ số đo</w:t>
             </w:r>
           </w:p>
         </w:tc>
@@ -15006,7 +14934,7 @@
               <w:rPr>
                 <w:sz w:val="21"/>
               </w:rPr>
-              <w:t>Metric không phản ánh đầy đủ chất lượng</w:t>
+              <w:t>Một metric không phản ánh đầy đủ chất lượng</w:t>
             </w:r>
           </w:p>
         </w:tc>
@@ -15025,7 +14953,7 @@
               <w:rPr>
                 <w:sz w:val="21"/>
               </w:rPr>
-              <w:t>Dùng nhiều metric; nêu rõ ý nghĩa/giới hạn</w:t>
+              <w:t>Dùng nhiều nguồn bằng chứng và nêu rõ giới hạn</w:t>
             </w:r>
           </w:p>
         </w:tc>
@@ -15051,7 +14979,7 @@
               <w:rPr>
                 <w:sz w:val="21"/>
               </w:rPr>
-              <w:t>Internal</w:t>
+              <w:t>Thời gian/dữ liệu</w:t>
             </w:r>
           </w:p>
         </w:tc>
@@ -15071,7 +14999,7 @@
               <w:rPr>
                 <w:sz w:val="21"/>
               </w:rPr>
-              <w:t>Test phụ thuộc thời gian/dữ liệu</w:t>
+              <w:t>Test có thể không ổn định</w:t>
             </w:r>
           </w:p>
         </w:tc>
@@ -15091,7 +15019,7 @@
               <w:rPr>
                 <w:sz w:val="21"/>
               </w:rPr>
-              <w:t>Fixed clock; isolated DB; deterministic seed</w:t>
+              <w:t>Cố định đồng hồ, database tách biệt và seed xác định</w:t>
             </w:r>
           </w:p>
         </w:tc>
@@ -15116,7 +15044,7 @@
               <w:rPr>
                 <w:sz w:val="21"/>
               </w:rPr>
-              <w:t>External</w:t>
+              <w:t>Môi trường</w:t>
             </w:r>
           </w:p>
         </w:tc>
@@ -15135,7 +15063,7 @@
               <w:rPr>
                 <w:sz w:val="21"/>
               </w:rPr>
-              <w:t>Local Linux/Chromium không đại diện production</w:t>
+              <w:t>Linux/Chromium cục bộ không đại diện production</w:t>
             </w:r>
           </w:p>
         </w:tc>
@@ -15154,7 +15082,7 @@
               <w:rPr>
                 <w:sz w:val="21"/>
               </w:rPr>
-              <w:t>Không suy rộng; đề xuất chạy trên hạ tầng đích</w:t>
+              <w:t>Không suy rộng kết quả; đề xuất chạy lại trên môi trường đích</w:t>
             </w:r>
           </w:p>
         </w:tc>
@@ -15180,7 +15108,7 @@
               <w:rPr>
                 <w:sz w:val="21"/>
               </w:rPr>
-              <w:t>Conclusion</w:t>
+              <w:t>Cách kết luận</w:t>
             </w:r>
           </w:p>
         </w:tc>
@@ -15200,7 +15128,7 @@
               <w:rPr>
                 <w:sz w:val="21"/>
               </w:rPr>
-              <w:t>Nhầm Pass với không còn lỗi</w:t>
+              <w:t>Có thể nhầm Pass với không còn lỗi</w:t>
             </w:r>
           </w:p>
         </w:tc>
@@ -15220,7 +15148,7 @@
               <w:rPr>
                 <w:sz w:val="21"/>
               </w:rPr>
-              <w:t>Ngưỡng định trước; raw artifact; giữ Low/limitations</w:t>
+              <w:t>Đặt ngưỡng trước, giữ raw artifact và công khai cảnh báo còn lại</w:t>
             </w:r>
           </w:p>
         </w:tc>
@@ -15245,7 +15173,7 @@
               <w:rPr>
                 <w:sz w:val="21"/>
               </w:rPr>
-              <w:t>Reproducibility</w:t>
+              <w:t>Khả năng tái lập</w:t>
             </w:r>
           </w:p>
         </w:tc>
@@ -15264,7 +15192,7 @@
               <w:rPr>
                 <w:sz w:val="21"/>
               </w:rPr>
-              <w:t>Artifact hết hạn hoặc phiên bản thay đổi</w:t>
+              <w:t>Artifact có thể hết hạn hoặc công cụ đổi phiên bản</w:t>
             </w:r>
           </w:p>
         </w:tc>
@@ -15283,7 +15211,7 @@
               <w:rPr>
                 <w:sz w:val="21"/>
               </w:rPr>
-              <w:t>SHA-256, tool version, release artifact trước nộp</w:t>
+              <w:t>Ghi SHA-256, phiên bản và lưu evidence trong thời hạn phù hợp</w:t>
             </w:r>
           </w:p>
         </w:tc>
@@ -15296,14 +15224,14 @@
     </w:p>
     <w:p>
       <w:r>
-        <w:t>Các mối đe dọa này giải thích vì sao báo cáo dùng ngôn ngữ “có bằng chứng trong phạm vi” thay vì “hoàn hảo” hoặc “100% an toàn”. Đó không làm giảm giá trị kết quả; ngược lại giúp người đọc hiểu chính xác điều đã và chưa được chứng minh.</w:t>
+        <w:t>Các giới hạn trên giải thích vì sao nhóm chỉ kết luận trong phạm vi đã kiểm tra, thay vì dùng các cụm từ như “hoàn hảo” hoặc “100% an toàn”. Cách trình bày này giúp người đọc phân biệt rõ phần đã có bằng chứng và phần cần kiểm tra thêm.</w:t>
       </w:r>
     </w:p>
     <w:p>
       <w:pPr>
         <w:pStyle w:val="u1"/>
       </w:pPr>
-      <w:bookmarkStart w:id="43" w:name="_Toc241970214"/>
+      <w:bookmarkStart w:id="43" w:name="_Toc241970569"/>
       <w:r>
         <w:lastRenderedPageBreak/>
         <w:t>CHƯƠNG 7. K</w:t>
@@ -15335,7 +15263,7 @@
       <w:pPr>
         <w:pStyle w:val="u2"/>
       </w:pPr>
-      <w:bookmarkStart w:id="44" w:name="_Toc241970215"/>
+      <w:bookmarkStart w:id="44" w:name="_Toc241970570"/>
       <w:r>
         <w:t>7.1. K</w:t>
       </w:r>
@@ -15372,14 +15300,14 @@
     </w:p>
     <w:p>
       <w:r>
-        <w:t>Đóng góp quan trọng nhất không phải số lượng test mà là chuỗi bằng chứng khép kín. Ví dụ, risk race dẫn đến unique key và transaction; test API/k6 tạo đúng phân bố 201/409; artifact được hash trong manifest; kết luận reliability chỉ giới hạn trong SQLite single-instance. Cách lập luận tương tự được áp dụng cho timezone, audit, report và security.</w:t>
+        <w:t>Điểm chính của bài không nằm ở số lượng test mà ở khả năng nối yêu cầu với kết quả kiểm thử. Ví dụ, rủi ro race dẫn đến unique key và transaction; test API/k6 tạo đúng phân bố 201/409; artifact được ghi hash trong manifest; và kết luận về độ tin cậy chỉ giới hạn trong SQLite single-instance. Nhóm áp dụng cách đối chiếu tương tự cho timezone, audit, report và security.</w:t>
       </w:r>
     </w:p>
     <w:p>
       <w:pPr>
         <w:pStyle w:val="u2"/>
       </w:pPr>
-      <w:bookmarkStart w:id="45" w:name="_Toc241970216"/>
+      <w:bookmarkStart w:id="45" w:name="_Toc241970571"/>
       <w:r>
         <w:t>7.2. H</w:t>
       </w:r>
@@ -15403,93 +15331,37 @@
       <w:pPr>
         <w:pStyle w:val="u2"/>
       </w:pPr>
-      <w:bookmarkStart w:id="46" w:name="_Toc241970217"/>
-      <w:r>
-        <w:t>7.3. Ki</w:t>
-      </w:r>
-      <w:r>
-        <w:t>ế</w:t>
-      </w:r>
-      <w:r>
-        <w:t>n ngh</w:t>
-      </w:r>
-      <w:r>
-        <w:t>ị</w:t>
-      </w:r>
-      <w:r>
-        <w:t xml:space="preserve"> trư</w:t>
+      <w:bookmarkStart w:id="46" w:name="_Toc241970572"/>
+      <w:r>
+        <w:t>7.3. Hư</w:t>
       </w:r>
       <w:r>
         <w:t>ớ</w:t>
       </w:r>
       <w:r>
-        <w:t>c khi n</w:t>
-      </w:r>
-      <w:r>
-        <w:t>ộ</w:t>
-      </w:r>
-      <w:r>
-        <w:t>p và hư</w:t>
-      </w:r>
-      <w:r>
-        <w:t>ớ</w:t>
-      </w:r>
-      <w:r>
-        <w:t>ng m</w:t>
-      </w:r>
-      <w:r>
-        <w:t>ở</w:t>
-      </w:r>
-      <w:r>
-        <w:t xml:space="preserve"> r</w:t>
-      </w:r>
-      <w:r>
-        <w:t>ộ</w:t>
-      </w:r>
-      <w:r>
-        <w:t>ng</w:t>
+        <w:t>ng phát tri</w:t>
+      </w:r>
+      <w:r>
+        <w:t>ể</w:t>
+      </w:r>
+      <w:r>
+        <w:t>n</w:t>
       </w:r>
       <w:bookmarkEnd w:id="46"/>
     </w:p>
     <w:p>
-      <w:pPr>
-        <w:pStyle w:val="Duudong"/>
-        <w:ind w:left="504" w:firstLine="0"/>
-      </w:pPr>
-      <w:r>
-        <w:t>Điền thông tin bìa và phân công thật; cập nhật mục lục; kiểm tra toàn bộ 35–40 trang sau thay đổi.</w:t>
+      <w:r>
+        <w:t>Hướng phát triển nên tập trung vào những khoảng trống đã xuất hiện trong kết quả, thay vì mở rộng thêm chức năng sản phẩm. Trước hết, 20 mutant survived và hai mutant no-coverage cần được phân loại để xác định đâu là assertion còn thiếu và đâu là mutant tương đương. Sau đó, có thể mở rộng kiểm thử tương thích sang Firefox và WebKit, đồng thời lặp lại kịch bản race trên cấu hình nhiều instance hoặc DBMS dùng trong triển khai thực tế.</w:t>
       </w:r>
     </w:p>
     <w:p>
-      <w:pPr>
-        <w:pStyle w:val="Duudong"/>
-        <w:ind w:left="504" w:firstLine="0"/>
-      </w:pPr>
-      <w:r>
-        <w:t>Xác minh hai workflow và artifact còn truy cập; nếu cần, đính kèm artifact vào GitHub Release gắn commit kiểm thử.</w:t>
+      <w:r>
+        <w:lastRenderedPageBreak/>
+        <w:t>Đối với bảo mật và khả năng tương tác, bước tiếp theo phù hợp là kiểm tra sau đăng nhập theo phạm vi được cho phép và thực hiện đánh giá usability với người dùng thật. Các hoạt động này cần có kế hoạch, dữ liệu và evidence riêng; khi chưa thực hiện, kết quả vẫn được giữ ở trạng thái chưa đánh giá.</w:t>
       </w:r>
     </w:p>
     <w:p>
-      <w:pPr>
-        <w:pStyle w:val="Duudong"/>
-        <w:ind w:left="504" w:firstLine="0"/>
-      </w:pPr>
-      <w:r>
-        <w:t>Không thêm tính năng ngoài SRS. Nếu còn thời gian, ưu tiên xem 20 mutant survived và hai no-coverage.</w:t>
-      </w:r>
-    </w:p>
-    <w:p>
-      <w:pPr>
-        <w:pStyle w:val="Duudong"/>
-        <w:ind w:left="504" w:firstLine="0"/>
-      </w:pPr>
-      <w:r>
-        <w:t>Nếu giảng viên yêu cầu, chạy thêm Firefox/WebKit, authenticated security assessment và usability study với kế hoạch/consent rõ ràng.</w:t>
-      </w:r>
-    </w:p>
-    <w:p>
-      <w:r>
-        <w:lastRenderedPageBreak/>
+      <w:r>
         <w:t>Với bằng chứng hiện có, kết luận thận trọng là StudySpace đạt các tiêu chí exit đã định nghĩa trong phạm vi SRS và môi trường ghi nhận. Tài liệu không khẳng định phần mềm không còn lỗi, không tuyên bố chứng nhận ISO và không thay thế đánh giá trên hạ tầng triển khai thực tế.</w:t>
       </w:r>
     </w:p>
@@ -15497,7 +15369,7 @@
       <w:pPr>
         <w:pStyle w:val="u1"/>
       </w:pPr>
-      <w:bookmarkStart w:id="47" w:name="_Toc241970218"/>
+      <w:bookmarkStart w:id="47" w:name="_Toc241970573"/>
       <w:r>
         <w:lastRenderedPageBreak/>
         <w:t>TÀI LI</w:t>
@@ -15608,7 +15480,7 @@
       <w:pPr>
         <w:pStyle w:val="u1"/>
       </w:pPr>
-      <w:bookmarkStart w:id="48" w:name="_Toc241970219"/>
+      <w:bookmarkStart w:id="48" w:name="_Toc241970574"/>
       <w:r>
         <w:lastRenderedPageBreak/>
         <w:t>PH</w:t>
@@ -16636,7 +16508,7 @@
       <w:pPr>
         <w:pStyle w:val="u1"/>
       </w:pPr>
-      <w:bookmarkStart w:id="49" w:name="_Toc241970220"/>
+      <w:bookmarkStart w:id="49" w:name="_Toc241970575"/>
       <w:r>
         <w:lastRenderedPageBreak/>
         <w:t>PH</w:t>
@@ -17309,7 +17181,7 @@
       <w:pPr>
         <w:pStyle w:val="u1"/>
       </w:pPr>
-      <w:bookmarkStart w:id="50" w:name="_Toc241970221"/>
+      <w:bookmarkStart w:id="50" w:name="_Toc241970576"/>
       <w:r>
         <w:lastRenderedPageBreak/>
         <w:t>PH</w:t>
@@ -18039,7 +17911,7 @@
       <w:pPr>
         <w:pStyle w:val="u1"/>
       </w:pPr>
-      <w:bookmarkStart w:id="51" w:name="_Toc241970222"/>
+      <w:bookmarkStart w:id="51" w:name="_Toc241970577"/>
       <w:r>
         <w:lastRenderedPageBreak/>
         <w:t>PH</w:t>
@@ -18708,7 +18580,7 @@
       <w:pPr>
         <w:pStyle w:val="u1"/>
       </w:pPr>
-      <w:bookmarkStart w:id="52" w:name="_Toc241970223"/>
+      <w:bookmarkStart w:id="52" w:name="_Toc241970578"/>
       <w:r>
         <w:lastRenderedPageBreak/>
         <w:t>PH</w:t>
@@ -18737,7 +18609,7 @@
       <w:pPr>
         <w:pStyle w:val="u2"/>
       </w:pPr>
-      <w:bookmarkStart w:id="53" w:name="_Toc241970224"/>
+      <w:bookmarkStart w:id="53" w:name="_Toc241970579"/>
       <w:r>
         <w:t>E.1. Chu</w:t>
       </w:r>
@@ -18761,7 +18633,7 @@
       <w:pPr>
         <w:pStyle w:val="u2"/>
       </w:pPr>
-      <w:bookmarkStart w:id="54" w:name="_Toc241970225"/>
+      <w:bookmarkStart w:id="54" w:name="_Toc241970580"/>
       <w:r>
         <w:t>E.2. Database</w:t>
       </w:r>
@@ -18776,7 +18648,7 @@
       <w:pPr>
         <w:pStyle w:val="u2"/>
       </w:pPr>
-      <w:bookmarkStart w:id="55" w:name="_Toc241970226"/>
+      <w:bookmarkStart w:id="55" w:name="_Toc241970581"/>
       <w:r>
         <w:t>E.3. Core quality</w:t>
       </w:r>
@@ -18791,7 +18663,7 @@
       <w:pPr>
         <w:pStyle w:val="u2"/>
       </w:pPr>
-      <w:bookmarkStart w:id="56" w:name="_Toc241970227"/>
+      <w:bookmarkStart w:id="56" w:name="_Toc241970582"/>
       <w:r>
         <w:t>E.4. Quality evidence</w:t>
       </w:r>
@@ -18806,7 +18678,7 @@
       <w:pPr>
         <w:pStyle w:val="u2"/>
       </w:pPr>
-      <w:bookmarkStart w:id="57" w:name="_Toc241970228"/>
+      <w:bookmarkStart w:id="57" w:name="_Toc241970583"/>
       <w:r>
         <w:t>E.5. Khi có l</w:t>
       </w:r>
@@ -18821,448 +18693,6 @@
     <w:p>
       <w:r>
         <w:t>Giữ trạng thái Fail/Blocked, tạo issue với reproduce/expected/actual, sửa bằng commit riêng, retest và chỉ đóng khi có artifact mới.</w:t>
-      </w:r>
-    </w:p>
-    <w:p>
-      <w:pPr>
-        <w:pStyle w:val="u1"/>
-      </w:pPr>
-      <w:bookmarkStart w:id="58" w:name="_Toc241970229"/>
-      <w:r>
-        <w:lastRenderedPageBreak/>
-        <w:t>PH</w:t>
-      </w:r>
-      <w:r>
-        <w:t>Ụ</w:t>
-      </w:r>
-      <w:r>
-        <w:t xml:space="preserve"> L</w:t>
-      </w:r>
-      <w:r>
-        <w:t>Ụ</w:t>
-      </w:r>
-      <w:r>
-        <w:t>C F. CHECKLIST TRƯ</w:t>
-      </w:r>
-      <w:r>
-        <w:t>Ớ</w:t>
-      </w:r>
-      <w:r>
-        <w:t>C KHI N</w:t>
-      </w:r>
-      <w:r>
-        <w:t>Ộ</w:t>
-      </w:r>
-      <w:r>
-        <w:t>P</w:t>
-      </w:r>
-      <w:bookmarkEnd w:id="58"/>
-    </w:p>
-    <w:p>
-      <w:pPr>
-        <w:spacing w:after="80"/>
-        <w:ind w:firstLine="0"/>
-        <w:jc w:val="center"/>
-      </w:pPr>
-      <w:r>
-        <w:rPr>
-          <w:b/>
-          <w:i/>
-          <w:sz w:val="22"/>
-        </w:rPr>
-        <w:t>Bảng 22. Kiểm tra thủ công cuối</w:t>
-      </w:r>
-    </w:p>
-    <w:tbl>
-      <w:tblPr>
-        <w:tblW w:w="0" w:type="auto"/>
-        <w:jc w:val="center"/>
-        <w:tblBorders>
-          <w:top w:val="single" w:sz="4" w:space="0" w:color="B7B7B7"/>
-          <w:left w:val="single" w:sz="4" w:space="0" w:color="B7B7B7"/>
-          <w:bottom w:val="single" w:sz="4" w:space="0" w:color="B7B7B7"/>
-          <w:right w:val="single" w:sz="4" w:space="0" w:color="B7B7B7"/>
-          <w:insideH w:val="single" w:sz="4" w:space="0" w:color="B7B7B7"/>
-          <w:insideV w:val="single" w:sz="4" w:space="0" w:color="B7B7B7"/>
-        </w:tblBorders>
-        <w:tblLook w:val="04A0" w:firstRow="1" w:lastRow="0" w:firstColumn="1" w:lastColumn="0" w:noHBand="0" w:noVBand="1"/>
-      </w:tblPr>
-      <w:tblGrid>
-        <w:gridCol w:w="4773"/>
-        <w:gridCol w:w="4773"/>
-      </w:tblGrid>
-      <w:tr>
-        <w:trPr>
-          <w:cantSplit/>
-          <w:tblHeader/>
-          <w:jc w:val="center"/>
-        </w:trPr>
-        <w:tc>
-          <w:tcPr>
-            <w:tcW w:w="4773" w:type="dxa"/>
-            <w:shd w:val="clear" w:color="auto" w:fill="D9E2F3"/>
-            <w:vAlign w:val="center"/>
-          </w:tcPr>
-          <w:p>
-            <w:pPr>
-              <w:spacing w:after="0" w:line="252" w:lineRule="auto"/>
-              <w:ind w:firstLine="0"/>
-              <w:jc w:val="center"/>
-            </w:pPr>
-            <w:r>
-              <w:rPr>
-                <w:b/>
-                <w:sz w:val="21"/>
-              </w:rPr>
-              <w:t>Hạng mục</w:t>
-            </w:r>
-          </w:p>
-        </w:tc>
-        <w:tc>
-          <w:tcPr>
-            <w:tcW w:w="4773" w:type="dxa"/>
-            <w:shd w:val="clear" w:color="auto" w:fill="D9E2F3"/>
-            <w:vAlign w:val="center"/>
-          </w:tcPr>
-          <w:p>
-            <w:pPr>
-              <w:spacing w:after="0" w:line="252" w:lineRule="auto"/>
-              <w:ind w:firstLine="0"/>
-              <w:jc w:val="center"/>
-            </w:pPr>
-            <w:r>
-              <w:rPr>
-                <w:b/>
-                <w:sz w:val="21"/>
-              </w:rPr>
-              <w:t>Trạng thái</w:t>
-            </w:r>
-          </w:p>
-        </w:tc>
-      </w:tr>
-      <w:tr>
-        <w:trPr>
-          <w:cantSplit/>
-          <w:jc w:val="center"/>
-        </w:trPr>
-        <w:tc>
-          <w:tcPr>
-            <w:tcW w:w="4773" w:type="dxa"/>
-            <w:vAlign w:val="center"/>
-          </w:tcPr>
-          <w:p>
-            <w:pPr>
-              <w:spacing w:after="0" w:line="252" w:lineRule="auto"/>
-              <w:ind w:firstLine="0"/>
-              <w:jc w:val="left"/>
-            </w:pPr>
-            <w:r>
-              <w:rPr>
-                <w:sz w:val="21"/>
-              </w:rPr>
-              <w:t>Thay [TRƯỜNG], [KHOA], [GIẢNG VIÊN], [NHÓM], [HỌ TÊN–MSSV]</w:t>
-            </w:r>
-          </w:p>
-        </w:tc>
-        <w:tc>
-          <w:tcPr>
-            <w:tcW w:w="4773" w:type="dxa"/>
-            <w:vAlign w:val="center"/>
-          </w:tcPr>
-          <w:p>
-            <w:pPr>
-              <w:spacing w:after="0" w:line="252" w:lineRule="auto"/>
-              <w:ind w:firstLine="0"/>
-              <w:jc w:val="left"/>
-            </w:pPr>
-            <w:r>
-              <w:rPr>
-                <w:sz w:val="21"/>
-              </w:rPr>
-              <w:t>Chưa — tài liệu vẫn là BẢN NHÁP</w:t>
-            </w:r>
-          </w:p>
-        </w:tc>
-      </w:tr>
-      <w:tr>
-        <w:trPr>
-          <w:cantSplit/>
-          <w:jc w:val="center"/>
-        </w:trPr>
-        <w:tc>
-          <w:tcPr>
-            <w:tcW w:w="4773" w:type="dxa"/>
-            <w:shd w:val="clear" w:color="auto" w:fill="F7F9FC"/>
-            <w:vAlign w:val="center"/>
-          </w:tcPr>
-          <w:p>
-            <w:pPr>
-              <w:spacing w:after="0" w:line="252" w:lineRule="auto"/>
-              <w:ind w:firstLine="0"/>
-              <w:jc w:val="left"/>
-            </w:pPr>
-            <w:r>
-              <w:rPr>
-                <w:sz w:val="21"/>
-              </w:rPr>
-              <w:t>Điền bảng phân công đúng đóng góp</w:t>
-            </w:r>
-          </w:p>
-        </w:tc>
-        <w:tc>
-          <w:tcPr>
-            <w:tcW w:w="4773" w:type="dxa"/>
-            <w:shd w:val="clear" w:color="auto" w:fill="F7F9FC"/>
-            <w:vAlign w:val="center"/>
-          </w:tcPr>
-          <w:p>
-            <w:pPr>
-              <w:spacing w:after="0" w:line="252" w:lineRule="auto"/>
-              <w:ind w:firstLine="0"/>
-              <w:jc w:val="left"/>
-            </w:pPr>
-            <w:r>
-              <w:rPr>
-                <w:sz w:val="21"/>
-              </w:rPr>
-              <w:t>Chưa — cần dữ liệu thật</w:t>
-            </w:r>
-          </w:p>
-        </w:tc>
-      </w:tr>
-      <w:tr>
-        <w:trPr>
-          <w:cantSplit/>
-          <w:jc w:val="center"/>
-        </w:trPr>
-        <w:tc>
-          <w:tcPr>
-            <w:tcW w:w="4773" w:type="dxa"/>
-            <w:vAlign w:val="center"/>
-          </w:tcPr>
-          <w:p>
-            <w:pPr>
-              <w:spacing w:after="0" w:line="252" w:lineRule="auto"/>
-              <w:ind w:firstLine="0"/>
-              <w:jc w:val="left"/>
-            </w:pPr>
-            <w:r>
-              <w:rPr>
-                <w:sz w:val="21"/>
-              </w:rPr>
-              <w:t>Cập nhật mục lục và số trang trong Word</w:t>
-            </w:r>
-          </w:p>
-        </w:tc>
-        <w:tc>
-          <w:tcPr>
-            <w:tcW w:w="4773" w:type="dxa"/>
-            <w:vAlign w:val="center"/>
-          </w:tcPr>
-          <w:p>
-            <w:pPr>
-              <w:spacing w:after="0" w:line="252" w:lineRule="auto"/>
-              <w:ind w:firstLine="0"/>
-              <w:jc w:val="left"/>
-            </w:pPr>
-            <w:r>
-              <w:rPr>
-                <w:sz w:val="21"/>
-              </w:rPr>
-              <w:t>Thực hiện sau khi điền bìa</w:t>
-            </w:r>
-          </w:p>
-        </w:tc>
-      </w:tr>
-      <w:tr>
-        <w:trPr>
-          <w:cantSplit/>
-          <w:jc w:val="center"/>
-        </w:trPr>
-        <w:tc>
-          <w:tcPr>
-            <w:tcW w:w="4773" w:type="dxa"/>
-            <w:shd w:val="clear" w:color="auto" w:fill="F7F9FC"/>
-            <w:vAlign w:val="center"/>
-          </w:tcPr>
-          <w:p>
-            <w:pPr>
-              <w:spacing w:after="0" w:line="252" w:lineRule="auto"/>
-              <w:ind w:firstLine="0"/>
-              <w:jc w:val="left"/>
-            </w:pPr>
-            <w:r>
-              <w:rPr>
-                <w:sz w:val="21"/>
-              </w:rPr>
-              <w:t>Xác minh workflow/artifact còn truy cập</w:t>
-            </w:r>
-          </w:p>
-        </w:tc>
-        <w:tc>
-          <w:tcPr>
-            <w:tcW w:w="4773" w:type="dxa"/>
-            <w:shd w:val="clear" w:color="auto" w:fill="F7F9FC"/>
-            <w:vAlign w:val="center"/>
-          </w:tcPr>
-          <w:p>
-            <w:pPr>
-              <w:spacing w:after="0" w:line="252" w:lineRule="auto"/>
-              <w:ind w:firstLine="0"/>
-              <w:jc w:val="left"/>
-            </w:pPr>
-            <w:r>
-              <w:rPr>
-                <w:sz w:val="21"/>
-              </w:rPr>
-              <w:t>Cần kiểm tra trước ngày nộp</w:t>
-            </w:r>
-          </w:p>
-        </w:tc>
-      </w:tr>
-      <w:tr>
-        <w:trPr>
-          <w:cantSplit/>
-          <w:jc w:val="center"/>
-        </w:trPr>
-        <w:tc>
-          <w:tcPr>
-            <w:tcW w:w="4773" w:type="dxa"/>
-            <w:vAlign w:val="center"/>
-          </w:tcPr>
-          <w:p>
-            <w:pPr>
-              <w:spacing w:after="0" w:line="252" w:lineRule="auto"/>
-              <w:ind w:firstLine="0"/>
-              <w:jc w:val="left"/>
-            </w:pPr>
-            <w:r>
-              <w:rPr>
-                <w:sz w:val="21"/>
-              </w:rPr>
-              <w:t>Chạy qa:trace và Core CI trên source cuối</w:t>
-            </w:r>
-          </w:p>
-        </w:tc>
-        <w:tc>
-          <w:tcPr>
-            <w:tcW w:w="4773" w:type="dxa"/>
-            <w:vAlign w:val="center"/>
-          </w:tcPr>
-          <w:p>
-            <w:pPr>
-              <w:spacing w:after="0" w:line="252" w:lineRule="auto"/>
-              <w:ind w:firstLine="0"/>
-              <w:jc w:val="left"/>
-            </w:pPr>
-            <w:r>
-              <w:rPr>
-                <w:sz w:val="21"/>
-              </w:rPr>
-              <w:t>Bắt buộc</w:t>
-            </w:r>
-          </w:p>
-        </w:tc>
-      </w:tr>
-      <w:tr>
-        <w:trPr>
-          <w:cantSplit/>
-          <w:jc w:val="center"/>
-        </w:trPr>
-        <w:tc>
-          <w:tcPr>
-            <w:tcW w:w="4773" w:type="dxa"/>
-            <w:shd w:val="clear" w:color="auto" w:fill="F7F9FC"/>
-            <w:vAlign w:val="center"/>
-          </w:tcPr>
-          <w:p>
-            <w:pPr>
-              <w:spacing w:after="0" w:line="252" w:lineRule="auto"/>
-              <w:ind w:firstLine="0"/>
-              <w:jc w:val="left"/>
-            </w:pPr>
-            <w:r>
-              <w:rPr>
-                <w:sz w:val="21"/>
-              </w:rPr>
-              <w:t>Quét staged diff: secret, database, file tạm và nội dung không thuộc bài</w:t>
-            </w:r>
-          </w:p>
-        </w:tc>
-        <w:tc>
-          <w:tcPr>
-            <w:tcW w:w="4773" w:type="dxa"/>
-            <w:shd w:val="clear" w:color="auto" w:fill="F7F9FC"/>
-            <w:vAlign w:val="center"/>
-          </w:tcPr>
-          <w:p>
-            <w:pPr>
-              <w:spacing w:after="0" w:line="252" w:lineRule="auto"/>
-              <w:ind w:firstLine="0"/>
-              <w:jc w:val="left"/>
-            </w:pPr>
-            <w:r>
-              <w:rPr>
-                <w:sz w:val="21"/>
-              </w:rPr>
-              <w:t>Bắt buộc</w:t>
-            </w:r>
-          </w:p>
-        </w:tc>
-      </w:tr>
-      <w:tr>
-        <w:trPr>
-          <w:cantSplit/>
-          <w:jc w:val="center"/>
-        </w:trPr>
-        <w:tc>
-          <w:tcPr>
-            <w:tcW w:w="4773" w:type="dxa"/>
-            <w:vAlign w:val="center"/>
-          </w:tcPr>
-          <w:p>
-            <w:pPr>
-              <w:spacing w:after="0" w:line="252" w:lineRule="auto"/>
-              <w:ind w:firstLine="0"/>
-              <w:jc w:val="left"/>
-            </w:pPr>
-            <w:r>
-              <w:rPr>
-                <w:sz w:val="21"/>
-              </w:rPr>
-              <w:t>Đọc trực quan toàn bộ 35–40 trang</w:t>
-            </w:r>
-          </w:p>
-        </w:tc>
-        <w:tc>
-          <w:tcPr>
-            <w:tcW w:w="4773" w:type="dxa"/>
-            <w:vAlign w:val="center"/>
-          </w:tcPr>
-          <w:p>
-            <w:pPr>
-              <w:spacing w:after="0" w:line="252" w:lineRule="auto"/>
-              <w:ind w:firstLine="0"/>
-              <w:jc w:val="left"/>
-            </w:pPr>
-            <w:r>
-              <w:rPr>
-                <w:sz w:val="21"/>
-              </w:rPr>
-              <w:t>Bắt buộc sau lần chỉnh cuối</w:t>
-            </w:r>
-          </w:p>
-        </w:tc>
-      </w:tr>
-    </w:tbl>
-    <w:p>
-      <w:pPr>
-        <w:spacing w:after="0"/>
-      </w:pPr>
-    </w:p>
-    <w:p>
-      <w:r>
-        <w:t>Chỉ bỏ nhãn BẢN NHÁP khi toàn bộ thông tin nhận diện và checklist đã hoàn tất. Nếu run mới thay đổi số liệu, phải cập nhật đồng thời manifest, chương 5, chương 6 và phụ lục D.</w:t>
       </w:r>
     </w:p>
     <w:sectPr>
@@ -19534,31 +18964,31 @@
       </w:rPr>
     </w:lvl>
   </w:abstractNum>
-  <w:num w:numId="1" w16cid:durableId="528690615">
+  <w:num w:numId="1" w16cid:durableId="854921778">
     <w:abstractNumId w:val="8"/>
   </w:num>
-  <w:num w:numId="2" w16cid:durableId="1742212137">
+  <w:num w:numId="2" w16cid:durableId="1284775791">
     <w:abstractNumId w:val="6"/>
   </w:num>
-  <w:num w:numId="3" w16cid:durableId="1108620549">
+  <w:num w:numId="3" w16cid:durableId="1792284306">
     <w:abstractNumId w:val="5"/>
   </w:num>
-  <w:num w:numId="4" w16cid:durableId="659112996">
+  <w:num w:numId="4" w16cid:durableId="829369862">
     <w:abstractNumId w:val="4"/>
   </w:num>
-  <w:num w:numId="5" w16cid:durableId="1517766889">
+  <w:num w:numId="5" w16cid:durableId="551042600">
     <w:abstractNumId w:val="7"/>
   </w:num>
-  <w:num w:numId="6" w16cid:durableId="1165585490">
+  <w:num w:numId="6" w16cid:durableId="1168518346">
     <w:abstractNumId w:val="3"/>
   </w:num>
-  <w:num w:numId="7" w16cid:durableId="348456288">
+  <w:num w:numId="7" w16cid:durableId="1517621763">
     <w:abstractNumId w:val="2"/>
   </w:num>
-  <w:num w:numId="8" w16cid:durableId="601499841">
+  <w:num w:numId="8" w16cid:durableId="1185441564">
     <w:abstractNumId w:val="1"/>
   </w:num>
-  <w:num w:numId="9" w16cid:durableId="1268924714">
+  <w:num w:numId="9" w16cid:durableId="888537300">
     <w:abstractNumId w:val="0"/>
   </w:num>
 </w:numbering>
@@ -30953,7 +30383,7 @@
     <w:autoRedefine/>
     <w:uiPriority w:val="39"/>
     <w:unhideWhenUsed/>
-    <w:rsid w:val="00D7181B"/>
+    <w:rsid w:val="0093666B"/>
     <w:pPr>
       <w:spacing w:after="100"/>
     </w:pPr>
@@ -30965,7 +30395,7 @@
     <w:autoRedefine/>
     <w:uiPriority w:val="39"/>
     <w:unhideWhenUsed/>
-    <w:rsid w:val="00D7181B"/>
+    <w:rsid w:val="0093666B"/>
     <w:pPr>
       <w:spacing w:after="100"/>
       <w:ind w:left="260"/>
@@ -30976,7 +30406,7 @@
     <w:basedOn w:val="Phngmcinhcuaoanvn"/>
     <w:uiPriority w:val="99"/>
     <w:unhideWhenUsed/>
-    <w:rsid w:val="00D7181B"/>
+    <w:rsid w:val="0093666B"/>
     <w:rPr>
       <w:color w:val="0000FF" w:themeColor="hyperlink"/>
       <w:u w:val="single"/>

</xml_diff>

<commit_message>
docs: use real test artifacts in submission report
</commit_message>
<xml_diff>
--- a/output/docx/StudySpace-BaoCao-DanhGia-KiemDinh.docx
+++ b/output/docx/StudySpace-BaoCao-DanhGia-KiemDinh.docx
@@ -166,7 +166,7 @@
       <w:pPr>
         <w:pStyle w:val="u1"/>
       </w:pPr>
-      <w:bookmarkStart w:id="0" w:name="_Toc241970526"/>
+      <w:bookmarkStart w:id="0" w:name="_Toc241972012"/>
       <w:r>
         <w:lastRenderedPageBreak/>
         <w:t>L</w:t>
@@ -199,7 +199,7 @@
       <w:pPr>
         <w:pStyle w:val="u1"/>
       </w:pPr>
-      <w:bookmarkStart w:id="1" w:name="_Toc241970527"/>
+      <w:bookmarkStart w:id="1" w:name="_Toc241972013"/>
       <w:r>
         <w:lastRenderedPageBreak/>
         <w:t>TÓM T</w:t>
@@ -250,7 +250,7 @@
       <w:pPr>
         <w:pStyle w:val="u1"/>
       </w:pPr>
-      <w:bookmarkStart w:id="2" w:name="_Toc241970528"/>
+      <w:bookmarkStart w:id="2" w:name="_Toc241972014"/>
       <w:r>
         <w:lastRenderedPageBreak/>
         <w:t>M</w:t>
@@ -295,7 +295,7 @@
       <w:r>
         <w:fldChar w:fldCharType="separate"/>
       </w:r>
-      <w:hyperlink w:anchor="_Toc241970526" w:history="1">
+      <w:hyperlink w:anchor="_Toc241972012" w:history="1">
         <w:r>
           <w:rPr>
             <w:rStyle w:val="Siuktni"/>
@@ -322,7 +322,7 @@
             <w:noProof/>
             <w:webHidden/>
           </w:rPr>
-          <w:instrText xml:space="preserve"> PAGEREF _Toc241970526 \h </w:instrText>
+          <w:instrText xml:space="preserve"> PAGEREF _Toc241972012 \h </w:instrText>
         </w:r>
         <w:r>
           <w:rPr>
@@ -370,7 +370,7 @@
           <w14:ligatures w14:val="standardContextual"/>
         </w:rPr>
       </w:pPr>
-      <w:hyperlink w:anchor="_Toc241970527" w:history="1">
+      <w:hyperlink w:anchor="_Toc241972013" w:history="1">
         <w:r>
           <w:rPr>
             <w:rStyle w:val="Siuktni"/>
@@ -397,7 +397,7 @@
             <w:noProof/>
             <w:webHidden/>
           </w:rPr>
-          <w:instrText xml:space="preserve"> PAGEREF _Toc241970527 \h </w:instrText>
+          <w:instrText xml:space="preserve"> PAGEREF _Toc241972013 \h </w:instrText>
         </w:r>
         <w:r>
           <w:rPr>
@@ -445,7 +445,7 @@
           <w14:ligatures w14:val="standardContextual"/>
         </w:rPr>
       </w:pPr>
-      <w:hyperlink w:anchor="_Toc241970528" w:history="1">
+      <w:hyperlink w:anchor="_Toc241972014" w:history="1">
         <w:r>
           <w:rPr>
             <w:rStyle w:val="Siuktni"/>
@@ -472,7 +472,7 @@
             <w:noProof/>
             <w:webHidden/>
           </w:rPr>
-          <w:instrText xml:space="preserve"> PAGEREF _Toc241970528 \h </w:instrText>
+          <w:instrText xml:space="preserve"> PAGEREF _Toc241972014 \h </w:instrText>
         </w:r>
         <w:r>
           <w:rPr>
@@ -520,7 +520,7 @@
           <w14:ligatures w14:val="standardContextual"/>
         </w:rPr>
       </w:pPr>
-      <w:hyperlink w:anchor="_Toc241970529" w:history="1">
+      <w:hyperlink w:anchor="_Toc241972015" w:history="1">
         <w:r>
           <w:rPr>
             <w:rStyle w:val="Siuktni"/>
@@ -547,7 +547,7 @@
             <w:noProof/>
             <w:webHidden/>
           </w:rPr>
-          <w:instrText xml:space="preserve"> PAGEREF _Toc241970529 \h </w:instrText>
+          <w:instrText xml:space="preserve"> PAGEREF _Toc241972015 \h </w:instrText>
         </w:r>
         <w:r>
           <w:rPr>
@@ -595,7 +595,7 @@
           <w14:ligatures w14:val="standardContextual"/>
         </w:rPr>
       </w:pPr>
-      <w:hyperlink w:anchor="_Toc241970530" w:history="1">
+      <w:hyperlink w:anchor="_Toc241972016" w:history="1">
         <w:r>
           <w:rPr>
             <w:rStyle w:val="Siuktni"/>
@@ -622,7 +622,7 @@
             <w:noProof/>
             <w:webHidden/>
           </w:rPr>
-          <w:instrText xml:space="preserve"> PAGEREF _Toc241970530 \h </w:instrText>
+          <w:instrText xml:space="preserve"> PAGEREF _Toc241972016 \h </w:instrText>
         </w:r>
         <w:r>
           <w:rPr>
@@ -670,7 +670,7 @@
           <w14:ligatures w14:val="standardContextual"/>
         </w:rPr>
       </w:pPr>
-      <w:hyperlink w:anchor="_Toc241970531" w:history="1">
+      <w:hyperlink w:anchor="_Toc241972017" w:history="1">
         <w:r>
           <w:rPr>
             <w:rStyle w:val="Siuktni"/>
@@ -697,7 +697,7 @@
             <w:noProof/>
             <w:webHidden/>
           </w:rPr>
-          <w:instrText xml:space="preserve"> PAGEREF _Toc241970531 \h </w:instrText>
+          <w:instrText xml:space="preserve"> PAGEREF _Toc241972017 \h </w:instrText>
         </w:r>
         <w:r>
           <w:rPr>
@@ -745,7 +745,7 @@
           <w14:ligatures w14:val="standardContextual"/>
         </w:rPr>
       </w:pPr>
-      <w:hyperlink w:anchor="_Toc241970532" w:history="1">
+      <w:hyperlink w:anchor="_Toc241972018" w:history="1">
         <w:r>
           <w:rPr>
             <w:rStyle w:val="Siuktni"/>
@@ -772,7 +772,7 @@
             <w:noProof/>
             <w:webHidden/>
           </w:rPr>
-          <w:instrText xml:space="preserve"> PAGEREF _Toc241970532 \h </w:instrText>
+          <w:instrText xml:space="preserve"> PAGEREF _Toc241972018 \h </w:instrText>
         </w:r>
         <w:r>
           <w:rPr>
@@ -820,7 +820,7 @@
           <w14:ligatures w14:val="standardContextual"/>
         </w:rPr>
       </w:pPr>
-      <w:hyperlink w:anchor="_Toc241970533" w:history="1">
+      <w:hyperlink w:anchor="_Toc241972019" w:history="1">
         <w:r>
           <w:rPr>
             <w:rStyle w:val="Siuktni"/>
@@ -847,7 +847,7 @@
             <w:noProof/>
             <w:webHidden/>
           </w:rPr>
-          <w:instrText xml:space="preserve"> PAGEREF _Toc241970533 \h </w:instrText>
+          <w:instrText xml:space="preserve"> PAGEREF _Toc241972019 \h </w:instrText>
         </w:r>
         <w:r>
           <w:rPr>
@@ -895,7 +895,7 @@
           <w14:ligatures w14:val="standardContextual"/>
         </w:rPr>
       </w:pPr>
-      <w:hyperlink w:anchor="_Toc241970534" w:history="1">
+      <w:hyperlink w:anchor="_Toc241972020" w:history="1">
         <w:r>
           <w:rPr>
             <w:rStyle w:val="Siuktni"/>
@@ -922,7 +922,7 @@
             <w:noProof/>
             <w:webHidden/>
           </w:rPr>
-          <w:instrText xml:space="preserve"> PAGEREF _Toc241970534 \h </w:instrText>
+          <w:instrText xml:space="preserve"> PAGEREF _Toc241972020 \h </w:instrText>
         </w:r>
         <w:r>
           <w:rPr>
@@ -970,7 +970,7 @@
           <w14:ligatures w14:val="standardContextual"/>
         </w:rPr>
       </w:pPr>
-      <w:hyperlink w:anchor="_Toc241970535" w:history="1">
+      <w:hyperlink w:anchor="_Toc241972021" w:history="1">
         <w:r>
           <w:rPr>
             <w:rStyle w:val="Siuktni"/>
@@ -997,7 +997,7 @@
             <w:noProof/>
             <w:webHidden/>
           </w:rPr>
-          <w:instrText xml:space="preserve"> PAGEREF _Toc241970535 \h </w:instrText>
+          <w:instrText xml:space="preserve"> PAGEREF _Toc241972021 \h </w:instrText>
         </w:r>
         <w:r>
           <w:rPr>
@@ -1045,7 +1045,7 @@
           <w14:ligatures w14:val="standardContextual"/>
         </w:rPr>
       </w:pPr>
-      <w:hyperlink w:anchor="_Toc241970536" w:history="1">
+      <w:hyperlink w:anchor="_Toc241972022" w:history="1">
         <w:r>
           <w:rPr>
             <w:rStyle w:val="Siuktni"/>
@@ -1072,7 +1072,7 @@
             <w:noProof/>
             <w:webHidden/>
           </w:rPr>
-          <w:instrText xml:space="preserve"> PAGEREF _Toc241970536 \h </w:instrText>
+          <w:instrText xml:space="preserve"> PAGEREF _Toc241972022 \h </w:instrText>
         </w:r>
         <w:r>
           <w:rPr>
@@ -1120,7 +1120,7 @@
           <w14:ligatures w14:val="standardContextual"/>
         </w:rPr>
       </w:pPr>
-      <w:hyperlink w:anchor="_Toc241970537" w:history="1">
+      <w:hyperlink w:anchor="_Toc241972023" w:history="1">
         <w:r>
           <w:rPr>
             <w:rStyle w:val="Siuktni"/>
@@ -1147,7 +1147,7 @@
             <w:noProof/>
             <w:webHidden/>
           </w:rPr>
-          <w:instrText xml:space="preserve"> PAGEREF _Toc241970537 \h </w:instrText>
+          <w:instrText xml:space="preserve"> PAGEREF _Toc241972023 \h </w:instrText>
         </w:r>
         <w:r>
           <w:rPr>
@@ -1195,7 +1195,7 @@
           <w14:ligatures w14:val="standardContextual"/>
         </w:rPr>
       </w:pPr>
-      <w:hyperlink w:anchor="_Toc241970538" w:history="1">
+      <w:hyperlink w:anchor="_Toc241972024" w:history="1">
         <w:r>
           <w:rPr>
             <w:rStyle w:val="Siuktni"/>
@@ -1222,7 +1222,7 @@
             <w:noProof/>
             <w:webHidden/>
           </w:rPr>
-          <w:instrText xml:space="preserve"> PAGEREF _Toc241970538 \h </w:instrText>
+          <w:instrText xml:space="preserve"> PAGEREF _Toc241972024 \h </w:instrText>
         </w:r>
         <w:r>
           <w:rPr>
@@ -1270,7 +1270,7 @@
           <w14:ligatures w14:val="standardContextual"/>
         </w:rPr>
       </w:pPr>
-      <w:hyperlink w:anchor="_Toc241970539" w:history="1">
+      <w:hyperlink w:anchor="_Toc241972025" w:history="1">
         <w:r>
           <w:rPr>
             <w:rStyle w:val="Siuktni"/>
@@ -1297,7 +1297,7 @@
             <w:noProof/>
             <w:webHidden/>
           </w:rPr>
-          <w:instrText xml:space="preserve"> PAGEREF _Toc241970539 \h </w:instrText>
+          <w:instrText xml:space="preserve"> PAGEREF _Toc241972025 \h </w:instrText>
         </w:r>
         <w:r>
           <w:rPr>
@@ -1345,7 +1345,7 @@
           <w14:ligatures w14:val="standardContextual"/>
         </w:rPr>
       </w:pPr>
-      <w:hyperlink w:anchor="_Toc241970540" w:history="1">
+      <w:hyperlink w:anchor="_Toc241972026" w:history="1">
         <w:r>
           <w:rPr>
             <w:rStyle w:val="Siuktni"/>
@@ -1372,7 +1372,7 @@
             <w:noProof/>
             <w:webHidden/>
           </w:rPr>
-          <w:instrText xml:space="preserve"> PAGEREF _Toc241970540 \h </w:instrText>
+          <w:instrText xml:space="preserve"> PAGEREF _Toc241972026 \h </w:instrText>
         </w:r>
         <w:r>
           <w:rPr>
@@ -1420,7 +1420,7 @@
           <w14:ligatures w14:val="standardContextual"/>
         </w:rPr>
       </w:pPr>
-      <w:hyperlink w:anchor="_Toc241970541" w:history="1">
+      <w:hyperlink w:anchor="_Toc241972027" w:history="1">
         <w:r>
           <w:rPr>
             <w:rStyle w:val="Siuktni"/>
@@ -1447,7 +1447,7 @@
             <w:noProof/>
             <w:webHidden/>
           </w:rPr>
-          <w:instrText xml:space="preserve"> PAGEREF _Toc241970541 \h </w:instrText>
+          <w:instrText xml:space="preserve"> PAGEREF _Toc241972027 \h </w:instrText>
         </w:r>
         <w:r>
           <w:rPr>
@@ -1495,7 +1495,7 @@
           <w14:ligatures w14:val="standardContextual"/>
         </w:rPr>
       </w:pPr>
-      <w:hyperlink w:anchor="_Toc241970542" w:history="1">
+      <w:hyperlink w:anchor="_Toc241972028" w:history="1">
         <w:r>
           <w:rPr>
             <w:rStyle w:val="Siuktni"/>
@@ -1522,7 +1522,7 @@
             <w:noProof/>
             <w:webHidden/>
           </w:rPr>
-          <w:instrText xml:space="preserve"> PAGEREF _Toc241970542 \h </w:instrText>
+          <w:instrText xml:space="preserve"> PAGEREF _Toc241972028 \h </w:instrText>
         </w:r>
         <w:r>
           <w:rPr>
@@ -1570,7 +1570,7 @@
           <w14:ligatures w14:val="standardContextual"/>
         </w:rPr>
       </w:pPr>
-      <w:hyperlink w:anchor="_Toc241970543" w:history="1">
+      <w:hyperlink w:anchor="_Toc241972029" w:history="1">
         <w:r>
           <w:rPr>
             <w:rStyle w:val="Siuktni"/>
@@ -1597,7 +1597,7 @@
             <w:noProof/>
             <w:webHidden/>
           </w:rPr>
-          <w:instrText xml:space="preserve"> PAGEREF _Toc241970543 \h </w:instrText>
+          <w:instrText xml:space="preserve"> PAGEREF _Toc241972029 \h </w:instrText>
         </w:r>
         <w:r>
           <w:rPr>
@@ -1645,7 +1645,7 @@
           <w14:ligatures w14:val="standardContextual"/>
         </w:rPr>
       </w:pPr>
-      <w:hyperlink w:anchor="_Toc241970544" w:history="1">
+      <w:hyperlink w:anchor="_Toc241972030" w:history="1">
         <w:r>
           <w:rPr>
             <w:rStyle w:val="Siuktni"/>
@@ -1672,7 +1672,7 @@
             <w:noProof/>
             <w:webHidden/>
           </w:rPr>
-          <w:instrText xml:space="preserve"> PAGEREF _Toc241970544 \h </w:instrText>
+          <w:instrText xml:space="preserve"> PAGEREF _Toc241972030 \h </w:instrText>
         </w:r>
         <w:r>
           <w:rPr>
@@ -1720,7 +1720,7 @@
           <w14:ligatures w14:val="standardContextual"/>
         </w:rPr>
       </w:pPr>
-      <w:hyperlink w:anchor="_Toc241970545" w:history="1">
+      <w:hyperlink w:anchor="_Toc241972031" w:history="1">
         <w:r>
           <w:rPr>
             <w:rStyle w:val="Siuktni"/>
@@ -1747,7 +1747,7 @@
             <w:noProof/>
             <w:webHidden/>
           </w:rPr>
-          <w:instrText xml:space="preserve"> PAGEREF _Toc241970545 \h </w:instrText>
+          <w:instrText xml:space="preserve"> PAGEREF _Toc241972031 \h </w:instrText>
         </w:r>
         <w:r>
           <w:rPr>
@@ -1795,7 +1795,7 @@
           <w14:ligatures w14:val="standardContextual"/>
         </w:rPr>
       </w:pPr>
-      <w:hyperlink w:anchor="_Toc241970546" w:history="1">
+      <w:hyperlink w:anchor="_Toc241972032" w:history="1">
         <w:r>
           <w:rPr>
             <w:rStyle w:val="Siuktni"/>
@@ -1822,7 +1822,7 @@
             <w:noProof/>
             <w:webHidden/>
           </w:rPr>
-          <w:instrText xml:space="preserve"> PAGEREF _Toc241970546 \h </w:instrText>
+          <w:instrText xml:space="preserve"> PAGEREF _Toc241972032 \h </w:instrText>
         </w:r>
         <w:r>
           <w:rPr>
@@ -1842,7 +1842,7 @@
             <w:noProof/>
             <w:webHidden/>
           </w:rPr>
-          <w:t>17</w:t>
+          <w:t>16</w:t>
         </w:r>
         <w:r>
           <w:rPr>
@@ -1870,7 +1870,7 @@
           <w14:ligatures w14:val="standardContextual"/>
         </w:rPr>
       </w:pPr>
-      <w:hyperlink w:anchor="_Toc241970547" w:history="1">
+      <w:hyperlink w:anchor="_Toc241972033" w:history="1">
         <w:r>
           <w:rPr>
             <w:rStyle w:val="Siuktni"/>
@@ -1897,7 +1897,7 @@
             <w:noProof/>
             <w:webHidden/>
           </w:rPr>
-          <w:instrText xml:space="preserve"> PAGEREF _Toc241970547 \h </w:instrText>
+          <w:instrText xml:space="preserve"> PAGEREF _Toc241972033 \h </w:instrText>
         </w:r>
         <w:r>
           <w:rPr>
@@ -1945,7 +1945,7 @@
           <w14:ligatures w14:val="standardContextual"/>
         </w:rPr>
       </w:pPr>
-      <w:hyperlink w:anchor="_Toc241970548" w:history="1">
+      <w:hyperlink w:anchor="_Toc241972034" w:history="1">
         <w:r>
           <w:rPr>
             <w:rStyle w:val="Siuktni"/>
@@ -1972,7 +1972,7 @@
             <w:noProof/>
             <w:webHidden/>
           </w:rPr>
-          <w:instrText xml:space="preserve"> PAGEREF _Toc241970548 \h </w:instrText>
+          <w:instrText xml:space="preserve"> PAGEREF _Toc241972034 \h </w:instrText>
         </w:r>
         <w:r>
           <w:rPr>
@@ -2020,7 +2020,7 @@
           <w14:ligatures w14:val="standardContextual"/>
         </w:rPr>
       </w:pPr>
-      <w:hyperlink w:anchor="_Toc241970549" w:history="1">
+      <w:hyperlink w:anchor="_Toc241972035" w:history="1">
         <w:r>
           <w:rPr>
             <w:rStyle w:val="Siuktni"/>
@@ -2047,7 +2047,7 @@
             <w:noProof/>
             <w:webHidden/>
           </w:rPr>
-          <w:instrText xml:space="preserve"> PAGEREF _Toc241970549 \h </w:instrText>
+          <w:instrText xml:space="preserve"> PAGEREF _Toc241972035 \h </w:instrText>
         </w:r>
         <w:r>
           <w:rPr>
@@ -2095,7 +2095,7 @@
           <w14:ligatures w14:val="standardContextual"/>
         </w:rPr>
       </w:pPr>
-      <w:hyperlink w:anchor="_Toc241970550" w:history="1">
+      <w:hyperlink w:anchor="_Toc241972036" w:history="1">
         <w:r>
           <w:rPr>
             <w:rStyle w:val="Siuktni"/>
@@ -2122,7 +2122,7 @@
             <w:noProof/>
             <w:webHidden/>
           </w:rPr>
-          <w:instrText xml:space="preserve"> PAGEREF _Toc241970550 \h </w:instrText>
+          <w:instrText xml:space="preserve"> PAGEREF _Toc241972036 \h </w:instrText>
         </w:r>
         <w:r>
           <w:rPr>
@@ -2170,7 +2170,7 @@
           <w14:ligatures w14:val="standardContextual"/>
         </w:rPr>
       </w:pPr>
-      <w:hyperlink w:anchor="_Toc241970551" w:history="1">
+      <w:hyperlink w:anchor="_Toc241972037" w:history="1">
         <w:r>
           <w:rPr>
             <w:rStyle w:val="Siuktni"/>
@@ -2197,7 +2197,7 @@
             <w:noProof/>
             <w:webHidden/>
           </w:rPr>
-          <w:instrText xml:space="preserve"> PAGEREF _Toc241970551 \h </w:instrText>
+          <w:instrText xml:space="preserve"> PAGEREF _Toc241972037 \h </w:instrText>
         </w:r>
         <w:r>
           <w:rPr>
@@ -2245,7 +2245,7 @@
           <w14:ligatures w14:val="standardContextual"/>
         </w:rPr>
       </w:pPr>
-      <w:hyperlink w:anchor="_Toc241970552" w:history="1">
+      <w:hyperlink w:anchor="_Toc241972038" w:history="1">
         <w:r>
           <w:rPr>
             <w:rStyle w:val="Siuktni"/>
@@ -2272,7 +2272,7 @@
             <w:noProof/>
             <w:webHidden/>
           </w:rPr>
-          <w:instrText xml:space="preserve"> PAGEREF _Toc241970552 \h </w:instrText>
+          <w:instrText xml:space="preserve"> PAGEREF _Toc241972038 \h </w:instrText>
         </w:r>
         <w:r>
           <w:rPr>
@@ -2292,7 +2292,7 @@
             <w:noProof/>
             <w:webHidden/>
           </w:rPr>
-          <w:t>21</w:t>
+          <w:t>20</w:t>
         </w:r>
         <w:r>
           <w:rPr>
@@ -2320,7 +2320,7 @@
           <w14:ligatures w14:val="standardContextual"/>
         </w:rPr>
       </w:pPr>
-      <w:hyperlink w:anchor="_Toc241970553" w:history="1">
+      <w:hyperlink w:anchor="_Toc241972039" w:history="1">
         <w:r>
           <w:rPr>
             <w:rStyle w:val="Siuktni"/>
@@ -2347,7 +2347,7 @@
             <w:noProof/>
             <w:webHidden/>
           </w:rPr>
-          <w:instrText xml:space="preserve"> PAGEREF _Toc241970553 \h </w:instrText>
+          <w:instrText xml:space="preserve"> PAGEREF _Toc241972039 \h </w:instrText>
         </w:r>
         <w:r>
           <w:rPr>
@@ -2395,7 +2395,7 @@
           <w14:ligatures w14:val="standardContextual"/>
         </w:rPr>
       </w:pPr>
-      <w:hyperlink w:anchor="_Toc241970554" w:history="1">
+      <w:hyperlink w:anchor="_Toc241972040" w:history="1">
         <w:r>
           <w:rPr>
             <w:rStyle w:val="Siuktni"/>
@@ -2422,7 +2422,7 @@
             <w:noProof/>
             <w:webHidden/>
           </w:rPr>
-          <w:instrText xml:space="preserve"> PAGEREF _Toc241970554 \h </w:instrText>
+          <w:instrText xml:space="preserve"> PAGEREF _Toc241972040 \h </w:instrText>
         </w:r>
         <w:r>
           <w:rPr>
@@ -2470,7 +2470,7 @@
           <w14:ligatures w14:val="standardContextual"/>
         </w:rPr>
       </w:pPr>
-      <w:hyperlink w:anchor="_Toc241970555" w:history="1">
+      <w:hyperlink w:anchor="_Toc241972041" w:history="1">
         <w:r>
           <w:rPr>
             <w:rStyle w:val="Siuktni"/>
@@ -2497,7 +2497,7 @@
             <w:noProof/>
             <w:webHidden/>
           </w:rPr>
-          <w:instrText xml:space="preserve"> PAGEREF _Toc241970555 \h </w:instrText>
+          <w:instrText xml:space="preserve"> PAGEREF _Toc241972041 \h </w:instrText>
         </w:r>
         <w:r>
           <w:rPr>
@@ -2545,7 +2545,7 @@
           <w14:ligatures w14:val="standardContextual"/>
         </w:rPr>
       </w:pPr>
-      <w:hyperlink w:anchor="_Toc241970556" w:history="1">
+      <w:hyperlink w:anchor="_Toc241972042" w:history="1">
         <w:r>
           <w:rPr>
             <w:rStyle w:val="Siuktni"/>
@@ -2572,7 +2572,7 @@
             <w:noProof/>
             <w:webHidden/>
           </w:rPr>
-          <w:instrText xml:space="preserve"> PAGEREF _Toc241970556 \h </w:instrText>
+          <w:instrText xml:space="preserve"> PAGEREF _Toc241972042 \h </w:instrText>
         </w:r>
         <w:r>
           <w:rPr>
@@ -2592,7 +2592,7 @@
             <w:noProof/>
             <w:webHidden/>
           </w:rPr>
-          <w:t>23</w:t>
+          <w:t>22</w:t>
         </w:r>
         <w:r>
           <w:rPr>
@@ -2620,7 +2620,7 @@
           <w14:ligatures w14:val="standardContextual"/>
         </w:rPr>
       </w:pPr>
-      <w:hyperlink w:anchor="_Toc241970557" w:history="1">
+      <w:hyperlink w:anchor="_Toc241972043" w:history="1">
         <w:r>
           <w:rPr>
             <w:rStyle w:val="Siuktni"/>
@@ -2647,7 +2647,7 @@
             <w:noProof/>
             <w:webHidden/>
           </w:rPr>
-          <w:instrText xml:space="preserve"> PAGEREF _Toc241970557 \h </w:instrText>
+          <w:instrText xml:space="preserve"> PAGEREF _Toc241972043 \h </w:instrText>
         </w:r>
         <w:r>
           <w:rPr>
@@ -2695,7 +2695,7 @@
           <w14:ligatures w14:val="standardContextual"/>
         </w:rPr>
       </w:pPr>
-      <w:hyperlink w:anchor="_Toc241970558" w:history="1">
+      <w:hyperlink w:anchor="_Toc241972044" w:history="1">
         <w:r>
           <w:rPr>
             <w:rStyle w:val="Siuktni"/>
@@ -2722,7 +2722,7 @@
             <w:noProof/>
             <w:webHidden/>
           </w:rPr>
-          <w:instrText xml:space="preserve"> PAGEREF _Toc241970558 \h </w:instrText>
+          <w:instrText xml:space="preserve"> PAGEREF _Toc241972044 \h </w:instrText>
         </w:r>
         <w:r>
           <w:rPr>
@@ -2742,7 +2742,7 @@
             <w:noProof/>
             <w:webHidden/>
           </w:rPr>
-          <w:t>24</w:t>
+          <w:t>23</w:t>
         </w:r>
         <w:r>
           <w:rPr>
@@ -2770,7 +2770,7 @@
           <w14:ligatures w14:val="standardContextual"/>
         </w:rPr>
       </w:pPr>
-      <w:hyperlink w:anchor="_Toc241970559" w:history="1">
+      <w:hyperlink w:anchor="_Toc241972045" w:history="1">
         <w:r>
           <w:rPr>
             <w:rStyle w:val="Siuktni"/>
@@ -2797,7 +2797,7 @@
             <w:noProof/>
             <w:webHidden/>
           </w:rPr>
-          <w:instrText xml:space="preserve"> PAGEREF _Toc241970559 \h </w:instrText>
+          <w:instrText xml:space="preserve"> PAGEREF _Toc241972045 \h </w:instrText>
         </w:r>
         <w:r>
           <w:rPr>
@@ -2845,7 +2845,7 @@
           <w14:ligatures w14:val="standardContextual"/>
         </w:rPr>
       </w:pPr>
-      <w:hyperlink w:anchor="_Toc241970560" w:history="1">
+      <w:hyperlink w:anchor="_Toc241972046" w:history="1">
         <w:r>
           <w:rPr>
             <w:rStyle w:val="Siuktni"/>
@@ -2872,7 +2872,7 @@
             <w:noProof/>
             <w:webHidden/>
           </w:rPr>
-          <w:instrText xml:space="preserve"> PAGEREF _Toc241970560 \h </w:instrText>
+          <w:instrText xml:space="preserve"> PAGEREF _Toc241972046 \h </w:instrText>
         </w:r>
         <w:r>
           <w:rPr>
@@ -2892,7 +2892,7 @@
             <w:noProof/>
             <w:webHidden/>
           </w:rPr>
-          <w:t>26</w:t>
+          <w:t>27</w:t>
         </w:r>
         <w:r>
           <w:rPr>
@@ -2920,7 +2920,7 @@
           <w14:ligatures w14:val="standardContextual"/>
         </w:rPr>
       </w:pPr>
-      <w:hyperlink w:anchor="_Toc241970561" w:history="1">
+      <w:hyperlink w:anchor="_Toc241972047" w:history="1">
         <w:r>
           <w:rPr>
             <w:rStyle w:val="Siuktni"/>
@@ -2947,7 +2947,7 @@
             <w:noProof/>
             <w:webHidden/>
           </w:rPr>
-          <w:instrText xml:space="preserve"> PAGEREF _Toc241970561 \h </w:instrText>
+          <w:instrText xml:space="preserve"> PAGEREF _Toc241972047 \h </w:instrText>
         </w:r>
         <w:r>
           <w:rPr>
@@ -2967,7 +2967,7 @@
             <w:noProof/>
             <w:webHidden/>
           </w:rPr>
-          <w:t>26</w:t>
+          <w:t>27</w:t>
         </w:r>
         <w:r>
           <w:rPr>
@@ -2995,7 +2995,7 @@
           <w14:ligatures w14:val="standardContextual"/>
         </w:rPr>
       </w:pPr>
-      <w:hyperlink w:anchor="_Toc241970562" w:history="1">
+      <w:hyperlink w:anchor="_Toc241972048" w:history="1">
         <w:r>
           <w:rPr>
             <w:rStyle w:val="Siuktni"/>
@@ -3022,7 +3022,7 @@
             <w:noProof/>
             <w:webHidden/>
           </w:rPr>
-          <w:instrText xml:space="preserve"> PAGEREF _Toc241970562 \h </w:instrText>
+          <w:instrText xml:space="preserve"> PAGEREF _Toc241972048 \h </w:instrText>
         </w:r>
         <w:r>
           <w:rPr>
@@ -3042,7 +3042,7 @@
             <w:noProof/>
             <w:webHidden/>
           </w:rPr>
-          <w:t>27</w:t>
+          <w:t>28</w:t>
         </w:r>
         <w:r>
           <w:rPr>
@@ -3070,7 +3070,7 @@
           <w14:ligatures w14:val="standardContextual"/>
         </w:rPr>
       </w:pPr>
-      <w:hyperlink w:anchor="_Toc241970563" w:history="1">
+      <w:hyperlink w:anchor="_Toc241972049" w:history="1">
         <w:r>
           <w:rPr>
             <w:rStyle w:val="Siuktni"/>
@@ -3097,7 +3097,7 @@
             <w:noProof/>
             <w:webHidden/>
           </w:rPr>
-          <w:instrText xml:space="preserve"> PAGEREF _Toc241970563 \h </w:instrText>
+          <w:instrText xml:space="preserve"> PAGEREF _Toc241972049 \h </w:instrText>
         </w:r>
         <w:r>
           <w:rPr>
@@ -3117,7 +3117,7 @@
             <w:noProof/>
             <w:webHidden/>
           </w:rPr>
-          <w:t>27</w:t>
+          <w:t>28</w:t>
         </w:r>
         <w:r>
           <w:rPr>
@@ -3145,7 +3145,7 @@
           <w14:ligatures w14:val="standardContextual"/>
         </w:rPr>
       </w:pPr>
-      <w:hyperlink w:anchor="_Toc241970564" w:history="1">
+      <w:hyperlink w:anchor="_Toc241972050" w:history="1">
         <w:r>
           <w:rPr>
             <w:rStyle w:val="Siuktni"/>
@@ -3172,7 +3172,7 @@
             <w:noProof/>
             <w:webHidden/>
           </w:rPr>
-          <w:instrText xml:space="preserve"> PAGEREF _Toc241970564 \h </w:instrText>
+          <w:instrText xml:space="preserve"> PAGEREF _Toc241972050 \h </w:instrText>
         </w:r>
         <w:r>
           <w:rPr>
@@ -3220,7 +3220,7 @@
           <w14:ligatures w14:val="standardContextual"/>
         </w:rPr>
       </w:pPr>
-      <w:hyperlink w:anchor="_Toc241970565" w:history="1">
+      <w:hyperlink w:anchor="_Toc241972051" w:history="1">
         <w:r>
           <w:rPr>
             <w:rStyle w:val="Siuktni"/>
@@ -3247,7 +3247,7 @@
             <w:noProof/>
             <w:webHidden/>
           </w:rPr>
-          <w:instrText xml:space="preserve"> PAGEREF _Toc241970565 \h </w:instrText>
+          <w:instrText xml:space="preserve"> PAGEREF _Toc241972051 \h </w:instrText>
         </w:r>
         <w:r>
           <w:rPr>
@@ -3295,7 +3295,7 @@
           <w14:ligatures w14:val="standardContextual"/>
         </w:rPr>
       </w:pPr>
-      <w:hyperlink w:anchor="_Toc241970566" w:history="1">
+      <w:hyperlink w:anchor="_Toc241972052" w:history="1">
         <w:r>
           <w:rPr>
             <w:rStyle w:val="Siuktni"/>
@@ -3322,7 +3322,7 @@
             <w:noProof/>
             <w:webHidden/>
           </w:rPr>
-          <w:instrText xml:space="preserve"> PAGEREF _Toc241970566 \h </w:instrText>
+          <w:instrText xml:space="preserve"> PAGEREF _Toc241972052 \h </w:instrText>
         </w:r>
         <w:r>
           <w:rPr>
@@ -3370,7 +3370,7 @@
           <w14:ligatures w14:val="standardContextual"/>
         </w:rPr>
       </w:pPr>
-      <w:hyperlink w:anchor="_Toc241970567" w:history="1">
+      <w:hyperlink w:anchor="_Toc241972053" w:history="1">
         <w:r>
           <w:rPr>
             <w:rStyle w:val="Siuktni"/>
@@ -3397,7 +3397,7 @@
             <w:noProof/>
             <w:webHidden/>
           </w:rPr>
-          <w:instrText xml:space="preserve"> PAGEREF _Toc241970567 \h </w:instrText>
+          <w:instrText xml:space="preserve"> PAGEREF _Toc241972053 \h </w:instrText>
         </w:r>
         <w:r>
           <w:rPr>
@@ -3445,7 +3445,7 @@
           <w14:ligatures w14:val="standardContextual"/>
         </w:rPr>
       </w:pPr>
-      <w:hyperlink w:anchor="_Toc241970568" w:history="1">
+      <w:hyperlink w:anchor="_Toc241972054" w:history="1">
         <w:r>
           <w:rPr>
             <w:rStyle w:val="Siuktni"/>
@@ -3472,7 +3472,7 @@
             <w:noProof/>
             <w:webHidden/>
           </w:rPr>
-          <w:instrText xml:space="preserve"> PAGEREF _Toc241970568 \h </w:instrText>
+          <w:instrText xml:space="preserve"> PAGEREF _Toc241972054 \h </w:instrText>
         </w:r>
         <w:r>
           <w:rPr>
@@ -3520,7 +3520,7 @@
           <w14:ligatures w14:val="standardContextual"/>
         </w:rPr>
       </w:pPr>
-      <w:hyperlink w:anchor="_Toc241970569" w:history="1">
+      <w:hyperlink w:anchor="_Toc241972055" w:history="1">
         <w:r>
           <w:rPr>
             <w:rStyle w:val="Siuktni"/>
@@ -3547,7 +3547,7 @@
             <w:noProof/>
             <w:webHidden/>
           </w:rPr>
-          <w:instrText xml:space="preserve"> PAGEREF _Toc241970569 \h </w:instrText>
+          <w:instrText xml:space="preserve"> PAGEREF _Toc241972055 \h </w:instrText>
         </w:r>
         <w:r>
           <w:rPr>
@@ -3595,7 +3595,7 @@
           <w14:ligatures w14:val="standardContextual"/>
         </w:rPr>
       </w:pPr>
-      <w:hyperlink w:anchor="_Toc241970570" w:history="1">
+      <w:hyperlink w:anchor="_Toc241972056" w:history="1">
         <w:r>
           <w:rPr>
             <w:rStyle w:val="Siuktni"/>
@@ -3622,7 +3622,7 @@
             <w:noProof/>
             <w:webHidden/>
           </w:rPr>
-          <w:instrText xml:space="preserve"> PAGEREF _Toc241970570 \h </w:instrText>
+          <w:instrText xml:space="preserve"> PAGEREF _Toc241972056 \h </w:instrText>
         </w:r>
         <w:r>
           <w:rPr>
@@ -3670,7 +3670,7 @@
           <w14:ligatures w14:val="standardContextual"/>
         </w:rPr>
       </w:pPr>
-      <w:hyperlink w:anchor="_Toc241970571" w:history="1">
+      <w:hyperlink w:anchor="_Toc241972057" w:history="1">
         <w:r>
           <w:rPr>
             <w:rStyle w:val="Siuktni"/>
@@ -3697,7 +3697,7 @@
             <w:noProof/>
             <w:webHidden/>
           </w:rPr>
-          <w:instrText xml:space="preserve"> PAGEREF _Toc241970571 \h </w:instrText>
+          <w:instrText xml:space="preserve"> PAGEREF _Toc241972057 \h </w:instrText>
         </w:r>
         <w:r>
           <w:rPr>
@@ -3745,7 +3745,7 @@
           <w14:ligatures w14:val="standardContextual"/>
         </w:rPr>
       </w:pPr>
-      <w:hyperlink w:anchor="_Toc241970572" w:history="1">
+      <w:hyperlink w:anchor="_Toc241972058" w:history="1">
         <w:r>
           <w:rPr>
             <w:rStyle w:val="Siuktni"/>
@@ -3772,7 +3772,7 @@
             <w:noProof/>
             <w:webHidden/>
           </w:rPr>
-          <w:instrText xml:space="preserve"> PAGEREF _Toc241970572 \h </w:instrText>
+          <w:instrText xml:space="preserve"> PAGEREF _Toc241972058 \h </w:instrText>
         </w:r>
         <w:r>
           <w:rPr>
@@ -3820,7 +3820,7 @@
           <w14:ligatures w14:val="standardContextual"/>
         </w:rPr>
       </w:pPr>
-      <w:hyperlink w:anchor="_Toc241970573" w:history="1">
+      <w:hyperlink w:anchor="_Toc241972059" w:history="1">
         <w:r>
           <w:rPr>
             <w:rStyle w:val="Siuktni"/>
@@ -3847,7 +3847,7 @@
             <w:noProof/>
             <w:webHidden/>
           </w:rPr>
-          <w:instrText xml:space="preserve"> PAGEREF _Toc241970573 \h </w:instrText>
+          <w:instrText xml:space="preserve"> PAGEREF _Toc241972059 \h </w:instrText>
         </w:r>
         <w:r>
           <w:rPr>
@@ -3895,7 +3895,7 @@
           <w14:ligatures w14:val="standardContextual"/>
         </w:rPr>
       </w:pPr>
-      <w:hyperlink w:anchor="_Toc241970574" w:history="1">
+      <w:hyperlink w:anchor="_Toc241972060" w:history="1">
         <w:r>
           <w:rPr>
             <w:rStyle w:val="Siuktni"/>
@@ -3922,7 +3922,7 @@
             <w:noProof/>
             <w:webHidden/>
           </w:rPr>
-          <w:instrText xml:space="preserve"> PAGEREF _Toc241970574 \h </w:instrText>
+          <w:instrText xml:space="preserve"> PAGEREF _Toc241972060 \h </w:instrText>
         </w:r>
         <w:r>
           <w:rPr>
@@ -3970,7 +3970,7 @@
           <w14:ligatures w14:val="standardContextual"/>
         </w:rPr>
       </w:pPr>
-      <w:hyperlink w:anchor="_Toc241970575" w:history="1">
+      <w:hyperlink w:anchor="_Toc241972061" w:history="1">
         <w:r>
           <w:rPr>
             <w:rStyle w:val="Siuktni"/>
@@ -3997,7 +3997,7 @@
             <w:noProof/>
             <w:webHidden/>
           </w:rPr>
-          <w:instrText xml:space="preserve"> PAGEREF _Toc241970575 \h </w:instrText>
+          <w:instrText xml:space="preserve"> PAGEREF _Toc241972061 \h </w:instrText>
         </w:r>
         <w:r>
           <w:rPr>
@@ -4045,7 +4045,7 @@
           <w14:ligatures w14:val="standardContextual"/>
         </w:rPr>
       </w:pPr>
-      <w:hyperlink w:anchor="_Toc241970576" w:history="1">
+      <w:hyperlink w:anchor="_Toc241972062" w:history="1">
         <w:r>
           <w:rPr>
             <w:rStyle w:val="Siuktni"/>
@@ -4072,7 +4072,7 @@
             <w:noProof/>
             <w:webHidden/>
           </w:rPr>
-          <w:instrText xml:space="preserve"> PAGEREF _Toc241970576 \h </w:instrText>
+          <w:instrText xml:space="preserve"> PAGEREF _Toc241972062 \h </w:instrText>
         </w:r>
         <w:r>
           <w:rPr>
@@ -4120,7 +4120,7 @@
           <w14:ligatures w14:val="standardContextual"/>
         </w:rPr>
       </w:pPr>
-      <w:hyperlink w:anchor="_Toc241970577" w:history="1">
+      <w:hyperlink w:anchor="_Toc241972063" w:history="1">
         <w:r>
           <w:rPr>
             <w:rStyle w:val="Siuktni"/>
@@ -4147,7 +4147,7 @@
             <w:noProof/>
             <w:webHidden/>
           </w:rPr>
-          <w:instrText xml:space="preserve"> PAGEREF _Toc241970577 \h </w:instrText>
+          <w:instrText xml:space="preserve"> PAGEREF _Toc241972063 \h </w:instrText>
         </w:r>
         <w:r>
           <w:rPr>
@@ -4195,7 +4195,7 @@
           <w14:ligatures w14:val="standardContextual"/>
         </w:rPr>
       </w:pPr>
-      <w:hyperlink w:anchor="_Toc241970578" w:history="1">
+      <w:hyperlink w:anchor="_Toc241972064" w:history="1">
         <w:r>
           <w:rPr>
             <w:rStyle w:val="Siuktni"/>
@@ -4222,7 +4222,7 @@
             <w:noProof/>
             <w:webHidden/>
           </w:rPr>
-          <w:instrText xml:space="preserve"> PAGEREF _Toc241970578 \h </w:instrText>
+          <w:instrText xml:space="preserve"> PAGEREF _Toc241972064 \h </w:instrText>
         </w:r>
         <w:r>
           <w:rPr>
@@ -4270,7 +4270,7 @@
           <w14:ligatures w14:val="standardContextual"/>
         </w:rPr>
       </w:pPr>
-      <w:hyperlink w:anchor="_Toc241970579" w:history="1">
+      <w:hyperlink w:anchor="_Toc241972065" w:history="1">
         <w:r>
           <w:rPr>
             <w:rStyle w:val="Siuktni"/>
@@ -4297,7 +4297,7 @@
             <w:noProof/>
             <w:webHidden/>
           </w:rPr>
-          <w:instrText xml:space="preserve"> PAGEREF _Toc241970579 \h </w:instrText>
+          <w:instrText xml:space="preserve"> PAGEREF _Toc241972065 \h </w:instrText>
         </w:r>
         <w:r>
           <w:rPr>
@@ -4345,7 +4345,7 @@
           <w14:ligatures w14:val="standardContextual"/>
         </w:rPr>
       </w:pPr>
-      <w:hyperlink w:anchor="_Toc241970580" w:history="1">
+      <w:hyperlink w:anchor="_Toc241972066" w:history="1">
         <w:r>
           <w:rPr>
             <w:rStyle w:val="Siuktni"/>
@@ -4372,7 +4372,7 @@
             <w:noProof/>
             <w:webHidden/>
           </w:rPr>
-          <w:instrText xml:space="preserve"> PAGEREF _Toc241970580 \h </w:instrText>
+          <w:instrText xml:space="preserve"> PAGEREF _Toc241972066 \h </w:instrText>
         </w:r>
         <w:r>
           <w:rPr>
@@ -4420,7 +4420,7 @@
           <w14:ligatures w14:val="standardContextual"/>
         </w:rPr>
       </w:pPr>
-      <w:hyperlink w:anchor="_Toc241970581" w:history="1">
+      <w:hyperlink w:anchor="_Toc241972067" w:history="1">
         <w:r>
           <w:rPr>
             <w:rStyle w:val="Siuktni"/>
@@ -4447,7 +4447,7 @@
             <w:noProof/>
             <w:webHidden/>
           </w:rPr>
-          <w:instrText xml:space="preserve"> PAGEREF _Toc241970581 \h </w:instrText>
+          <w:instrText xml:space="preserve"> PAGEREF _Toc241972067 \h </w:instrText>
         </w:r>
         <w:r>
           <w:rPr>
@@ -4495,7 +4495,7 @@
           <w14:ligatures w14:val="standardContextual"/>
         </w:rPr>
       </w:pPr>
-      <w:hyperlink w:anchor="_Toc241970582" w:history="1">
+      <w:hyperlink w:anchor="_Toc241972068" w:history="1">
         <w:r>
           <w:rPr>
             <w:rStyle w:val="Siuktni"/>
@@ -4522,7 +4522,7 @@
             <w:noProof/>
             <w:webHidden/>
           </w:rPr>
-          <w:instrText xml:space="preserve"> PAGEREF _Toc241970582 \h </w:instrText>
+          <w:instrText xml:space="preserve"> PAGEREF _Toc241972068 \h </w:instrText>
         </w:r>
         <w:r>
           <w:rPr>
@@ -4570,7 +4570,7 @@
           <w14:ligatures w14:val="standardContextual"/>
         </w:rPr>
       </w:pPr>
-      <w:hyperlink w:anchor="_Toc241970583" w:history="1">
+      <w:hyperlink w:anchor="_Toc241972069" w:history="1">
         <w:r>
           <w:rPr>
             <w:rStyle w:val="Siuktni"/>
@@ -4597,7 +4597,7 @@
             <w:noProof/>
             <w:webHidden/>
           </w:rPr>
-          <w:instrText xml:space="preserve"> PAGEREF _Toc241970583 \h </w:instrText>
+          <w:instrText xml:space="preserve"> PAGEREF _Toc241972069 \h </w:instrText>
         </w:r>
         <w:r>
           <w:rPr>
@@ -4645,7 +4645,7 @@
       <w:pPr>
         <w:pStyle w:val="u1"/>
       </w:pPr>
-      <w:bookmarkStart w:id="3" w:name="_Toc241970529"/>
+      <w:bookmarkStart w:id="3" w:name="_Toc241972015"/>
       <w:r>
         <w:lastRenderedPageBreak/>
         <w:t>DANH M</w:t>
@@ -5219,7 +5219,7 @@
         <w:ind w:firstLine="0"/>
       </w:pPr>
       <w:r>
-        <w:t>Danh mục hình: Hình 1 phạm vi chức năng; Hình 2 kiến trúc ba tầng; Hình 3 mô hình dữ liệu; Hình 4 kết quả quality gate; Hình 5 giao diện Student; Hình 6 giao diện Admin.</w:t>
+        <w:t>Danh mục hình: Hình 1 use case; Hình 2 kiến trúc ba tầng; Hình 3 mô hình dữ liệu; Hình 4 giao diện Student; Hình 5 giao diện Admin; Hình 6 báo cáo coverage; Hình 7 báo cáo mutation.</w:t>
       </w:r>
     </w:p>
     <w:p>
@@ -5231,7 +5231,7 @@
       <w:pPr>
         <w:pStyle w:val="u1"/>
       </w:pPr>
-      <w:bookmarkStart w:id="4" w:name="_Toc241970530"/>
+      <w:bookmarkStart w:id="4" w:name="_Toc241972016"/>
       <w:r>
         <w:lastRenderedPageBreak/>
         <w:t>CHƯƠNG 1. GI</w:t>
@@ -5254,7 +5254,7 @@
       <w:pPr>
         <w:pStyle w:val="u2"/>
       </w:pPr>
-      <w:bookmarkStart w:id="5" w:name="_Toc241970531"/>
+      <w:bookmarkStart w:id="5" w:name="_Toc241972017"/>
       <w:r>
         <w:t>1.1. B</w:t>
       </w:r>
@@ -5298,7 +5298,7 @@
       <w:pPr>
         <w:pStyle w:val="u2"/>
       </w:pPr>
-      <w:bookmarkStart w:id="6" w:name="_Toc241970532"/>
+      <w:bookmarkStart w:id="6" w:name="_Toc241972018"/>
       <w:r>
         <w:t>1.2. M</w:t>
       </w:r>
@@ -5699,7 +5699,7 @@
       <w:pPr>
         <w:pStyle w:val="u2"/>
       </w:pPr>
-      <w:bookmarkStart w:id="7" w:name="_Toc241970533"/>
+      <w:bookmarkStart w:id="7" w:name="_Toc241972019"/>
       <w:r>
         <w:t>1.3. Đ</w:t>
       </w:r>
@@ -5782,7 +5782,7 @@
       <w:pPr>
         <w:pStyle w:val="u2"/>
       </w:pPr>
-      <w:bookmarkStart w:id="8" w:name="_Toc241970534"/>
+      <w:bookmarkStart w:id="8" w:name="_Toc241972020"/>
       <w:r>
         <w:t>1.4. Phương pháp và c</w:t>
       </w:r>
@@ -5809,7 +5809,7 @@
       <w:pPr>
         <w:pStyle w:val="u1"/>
       </w:pPr>
-      <w:bookmarkStart w:id="9" w:name="_Toc241970535"/>
+      <w:bookmarkStart w:id="9" w:name="_Toc241972021"/>
       <w:r>
         <w:lastRenderedPageBreak/>
         <w:t>CHƯƠNG 2. CƠ S</w:t>
@@ -5838,7 +5838,7 @@
       <w:pPr>
         <w:pStyle w:val="u2"/>
       </w:pPr>
-      <w:bookmarkStart w:id="10" w:name="_Toc241970536"/>
+      <w:bookmarkStart w:id="10" w:name="_Toc241972022"/>
       <w:r>
         <w:t>2.1. Ch</w:t>
       </w:r>
@@ -5894,7 +5894,7 @@
       <w:pPr>
         <w:pStyle w:val="u2"/>
       </w:pPr>
-      <w:bookmarkStart w:id="11" w:name="_Toc241970537"/>
+      <w:bookmarkStart w:id="11" w:name="_Toc241972023"/>
       <w:r>
         <w:t>2.2. Các t</w:t>
       </w:r>
@@ -6477,7 +6477,7 @@
       <w:pPr>
         <w:pStyle w:val="u2"/>
       </w:pPr>
-      <w:bookmarkStart w:id="12" w:name="_Toc241970538"/>
+      <w:bookmarkStart w:id="12" w:name="_Toc241972024"/>
       <w:r>
         <w:lastRenderedPageBreak/>
         <w:t>2.3. K</w:t>
@@ -7019,7 +7019,7 @@
       <w:pPr>
         <w:pStyle w:val="u2"/>
       </w:pPr>
-      <w:bookmarkStart w:id="13" w:name="_Toc241970539"/>
+      <w:bookmarkStart w:id="13" w:name="_Toc241972025"/>
       <w:r>
         <w:t>2.4. Coverage và mutation testing</w:t>
       </w:r>
@@ -7039,7 +7039,7 @@
       <w:pPr>
         <w:pStyle w:val="u2"/>
       </w:pPr>
-      <w:bookmarkStart w:id="14" w:name="_Toc241970540"/>
+      <w:bookmarkStart w:id="14" w:name="_Toc241972026"/>
       <w:r>
         <w:lastRenderedPageBreak/>
         <w:t>2.5. Security, performance và accessibility</w:t>
@@ -7060,7 +7060,7 @@
       <w:pPr>
         <w:pStyle w:val="u1"/>
       </w:pPr>
-      <w:bookmarkStart w:id="15" w:name="_Toc241970541"/>
+      <w:bookmarkStart w:id="15" w:name="_Toc241972027"/>
       <w:r>
         <w:lastRenderedPageBreak/>
         <w:t>CHƯƠNG 3. PHÂN TÍCH VÀ THI</w:t>
@@ -7083,7 +7083,7 @@
       <w:pPr>
         <w:pStyle w:val="u2"/>
       </w:pPr>
-      <w:bookmarkStart w:id="16" w:name="_Toc241970542"/>
+      <w:bookmarkStart w:id="16" w:name="_Toc241972028"/>
       <w:r>
         <w:t>3.1. Actor và use case</w:t>
       </w:r>
@@ -7103,8 +7103,8 @@
           <w:noProof/>
         </w:rPr>
         <w:drawing>
-          <wp:inline distT="0" distB="0" distL="0" distR="0" wp14:anchorId="2E7E0E73" wp14:editId="34FD2A92">
-            <wp:extent cx="5943600" cy="3467100"/>
+          <wp:inline distT="0" distB="0" distL="0" distR="0" wp14:anchorId="388EAAD0" wp14:editId="543BD2CA">
+            <wp:extent cx="5943600" cy="4233164"/>
             <wp:effectExtent l="0" t="0" r="0" b="0"/>
             <wp:docPr id="1" name="Picture 1"/>
             <wp:cNvGraphicFramePr>
@@ -7126,7 +7126,7 @@
                   <pic:spPr>
                     <a:xfrm>
                       <a:off x="0" y="0"/>
-                      <a:ext cx="5943600" cy="3467100"/>
+                      <a:ext cx="5943600" cy="4233164"/>
                     </a:xfrm>
                     <a:prstGeom prst="rect">
                       <a:avLst/>
@@ -7151,7 +7151,7 @@
           <w:i/>
           <w:sz w:val="22"/>
         </w:rPr>
-        <w:t>Hình 1. Phạm vi chức năng và quy tắc bảo vệ của StudySpace</w:t>
+        <w:t>Hình 1. Sơ đồ use case do nhóm tổng hợp từ SRS hiện tại</w:t>
       </w:r>
     </w:p>
     <w:p>
@@ -7551,6 +7551,7 @@
               <w:rPr>
                 <w:sz w:val="21"/>
               </w:rPr>
+              <w:lastRenderedPageBreak/>
               <w:t>UC-BOOK-03 Check-in</w:t>
             </w:r>
           </w:p>
@@ -7706,7 +7707,6 @@
     </w:p>
     <w:p>
       <w:r>
-        <w:lastRenderedPageBreak/>
         <w:t>Đặc tả chi tiết trong docs/01-srs.md có precondition, postcondition, main, alternate và exception flow. Báo cáo giữ bảng tóm tắt để tập trung vào quyết định thiết kế và test; phụ lục cung cấp liên kết truy vết.</w:t>
       </w:r>
     </w:p>
@@ -7714,7 +7714,7 @@
       <w:pPr>
         <w:pStyle w:val="u2"/>
       </w:pPr>
-      <w:bookmarkStart w:id="17" w:name="_Toc241970543"/>
+      <w:bookmarkStart w:id="17" w:name="_Toc241972029"/>
       <w:r>
         <w:t>3.2. Yêu c</w:t>
       </w:r>
@@ -8215,7 +8215,7 @@
       <w:pPr>
         <w:pStyle w:val="u2"/>
       </w:pPr>
-      <w:bookmarkStart w:id="18" w:name="_Toc241970544"/>
+      <w:bookmarkStart w:id="18" w:name="_Toc241972030"/>
       <w:r>
         <w:t>3.3. Quy t</w:t>
       </w:r>
@@ -8261,6 +8261,7 @@
           <w:i/>
           <w:sz w:val="22"/>
         </w:rPr>
+        <w:lastRenderedPageBreak/>
         <w:t>Bảng 7. Bảng chuyển trạng thái booking</w:t>
       </w:r>
     </w:p>
@@ -8478,7 +8479,6 @@
               <w:rPr>
                 <w:sz w:val="21"/>
               </w:rPr>
-              <w:lastRenderedPageBreak/>
               <w:t>BOOKED</w:t>
             </w:r>
           </w:p>
@@ -8722,7 +8722,7 @@
       <w:pPr>
         <w:pStyle w:val="u2"/>
       </w:pPr>
-      <w:bookmarkStart w:id="19" w:name="_Toc241970545"/>
+      <w:bookmarkStart w:id="19" w:name="_Toc241972031"/>
       <w:r>
         <w:t>3.4. Ki</w:t>
       </w:r>
@@ -8766,8 +8766,8 @@
           <w:noProof/>
         </w:rPr>
         <w:drawing>
-          <wp:inline distT="0" distB="0" distL="0" distR="0" wp14:anchorId="6F56DFE1" wp14:editId="72D7A775">
-            <wp:extent cx="5943600" cy="3467100"/>
+          <wp:inline distT="0" distB="0" distL="0" distR="0" wp14:anchorId="1612786F" wp14:editId="5DA30720">
+            <wp:extent cx="5943600" cy="1403350"/>
             <wp:effectExtent l="0" t="0" r="0" b="0"/>
             <wp:docPr id="2" name="Picture 2"/>
             <wp:cNvGraphicFramePr>
@@ -8789,7 +8789,7 @@
                   <pic:spPr>
                     <a:xfrm>
                       <a:off x="0" y="0"/>
-                      <a:ext cx="5943600" cy="3467100"/>
+                      <a:ext cx="5943600" cy="1403350"/>
                     </a:xfrm>
                     <a:prstGeom prst="rect">
                       <a:avLst/>
@@ -8814,7 +8814,7 @@
           <w:i/>
           <w:sz w:val="22"/>
         </w:rPr>
-        <w:t>Hình 2. Kiến trúc ba tầng và vị trí các hoạt động kiểm định</w:t>
+        <w:t>Hình 2. Sơ đồ kiến trúc do nhóm tổng hợp từ mã nguồn hiện tại</w:t>
       </w:r>
     </w:p>
     <w:p>
@@ -8826,9 +8826,8 @@
       <w:pPr>
         <w:pStyle w:val="u2"/>
       </w:pPr>
-      <w:bookmarkStart w:id="20" w:name="_Toc241970546"/>
-      <w:r>
-        <w:lastRenderedPageBreak/>
+      <w:bookmarkStart w:id="20" w:name="_Toc241972032"/>
+      <w:r>
         <w:t>3.5. Mô hình d</w:t>
       </w:r>
       <w:r>
@@ -8847,7 +8846,11 @@
     </w:p>
     <w:p>
       <w:r>
-        <w:t>Hình 3 cho thấy Booking là thực thể trung tâm nối User và Room. Hai active key chỉ có giá trị khi booking đang giữ slot; khi chuyển trạng thái cuối, khóa được giải phóng nhưng bản ghi lịch sử vẫn tồn tại. Room có booking lịch sử chuyển INACTIVE thay vì xóa cứng. RoomClosure có ràng buộc unique theo room và date để chặn lịch đóng trùng.</w:t>
+        <w:t xml:space="preserve">Hình 3 cho thấy Booking là thực thể trung tâm nối User và Room. Hai active key chỉ có giá trị khi booking đang giữ slot; khi chuyển trạng thái cuối, khóa được giải phóng </w:t>
+      </w:r>
+      <w:r>
+        <w:lastRenderedPageBreak/>
+        <w:t>nhưng bản ghi lịch sử vẫn tồn tại. Room có booking lịch sử chuyển INACTIVE thay vì xóa cứng. RoomClosure có ràng buộc unique theo room và date để chặn lịch đóng trùng.</w:t>
       </w:r>
     </w:p>
     <w:p>
@@ -8859,8 +8862,8 @@
           <w:noProof/>
         </w:rPr>
         <w:drawing>
-          <wp:inline distT="0" distB="0" distL="0" distR="0" wp14:anchorId="564022EC" wp14:editId="75889577">
-            <wp:extent cx="5943600" cy="3797300"/>
+          <wp:inline distT="0" distB="0" distL="0" distR="0" wp14:anchorId="5255376E" wp14:editId="2A3C6AE0">
+            <wp:extent cx="5943600" cy="3516630"/>
             <wp:effectExtent l="0" t="0" r="0" b="0"/>
             <wp:docPr id="3" name="Picture 3"/>
             <wp:cNvGraphicFramePr>
@@ -8882,7 +8885,7 @@
                   <pic:spPr>
                     <a:xfrm>
                       <a:off x="0" y="0"/>
-                      <a:ext cx="5943600" cy="3797300"/>
+                      <a:ext cx="5943600" cy="3516630"/>
                     </a:xfrm>
                     <a:prstGeom prst="rect">
                       <a:avLst/>
@@ -8907,7 +8910,7 @@
           <w:i/>
           <w:sz w:val="22"/>
         </w:rPr>
-        <w:t>Hình 3. ERD rút gọn và các ràng buộc toàn vẹn chính</w:t>
+        <w:t>Hình 3. ERD rút gọn từ Prisma schema hiện tại</w:t>
       </w:r>
     </w:p>
     <w:p>
@@ -8919,7 +8922,7 @@
       <w:pPr>
         <w:pStyle w:val="u2"/>
       </w:pPr>
-      <w:bookmarkStart w:id="21" w:name="_Toc241970547"/>
+      <w:bookmarkStart w:id="21" w:name="_Toc241972033"/>
       <w:r>
         <w:t>3.6. Công th</w:t>
       </w:r>
@@ -8945,23 +8948,23 @@
     </w:p>
     <w:p>
       <w:r>
-        <w:t xml:space="preserve">Báo cáo tách mức độ được đặt và mức độ sử dụng thực tế. reservationRate = (BOOKED + CHECKED_IN + NO_SHOW) / tổng slot khả dụng. utilizationRate = CHECKED_IN / tổng slot khả dụng. CANCELLED không nằm trong tử số. Trường </w:t>
-      </w:r>
-      <w:r>
-        <w:lastRenderedPageBreak/>
-        <w:t>occupancyRate được giữ tạm làm alias của reservationRate để tương thích, nhưng được đánh dấu deprecated trong tài liệu và không dùng làm nhãn UI.</w:t>
+        <w:t>Báo cáo tách mức độ được đặt và mức độ sử dụng thực tế. reservationRate = (BOOKED + CHECKED_IN + NO_SHOW) / tổng slot khả dụng. utilizationRate = CHECKED_IN / tổng slot khả dụng. CANCELLED không nằm trong tử số. Trường occupancyRate được giữ tạm làm alias của reservationRate để tương thích, nhưng được đánh dấu deprecated trong tài liệu và không dùng làm nhãn UI.</w:t>
       </w:r>
     </w:p>
     <w:p>
       <w:r>
-        <w:t>Mẫu số là số slot khả dụng sau khi loại phòng INACTIVE và lịch đóng trong khoảng báo cáo. Khi mẫu số bằng 0, API trả 0 thay vì NaN hoặc phép chia lỗi. Decision table kiểm tra riêng BOOKED, CHECKED_IN, NO_SHOW, CANCELLED và zero denominator để tránh một test gộp che khuất lỗi công thức.</w:t>
+        <w:t xml:space="preserve">Mẫu số là số slot khả dụng sau khi loại phòng INACTIVE và lịch đóng trong khoảng báo cáo. Khi mẫu số bằng 0, API trả 0 thay vì NaN hoặc phép chia lỗi. Decision table kiểm </w:t>
+      </w:r>
+      <w:r>
+        <w:lastRenderedPageBreak/>
+        <w:t>tra riêng BOOKED, CHECKED_IN, NO_SHOW, CANCELLED và zero denominator để tránh một test gộp che khuất lỗi công thức.</w:t>
       </w:r>
     </w:p>
     <w:p>
       <w:pPr>
         <w:pStyle w:val="u1"/>
       </w:pPr>
-      <w:bookmarkStart w:id="22" w:name="_Toc241970548"/>
+      <w:bookmarkStart w:id="22" w:name="_Toc241972034"/>
       <w:r>
         <w:lastRenderedPageBreak/>
         <w:t>CHƯƠNG 4. PHƯƠNG PHÁP VÀ K</w:t>
@@ -8993,7 +8996,7 @@
       <w:pPr>
         <w:pStyle w:val="u2"/>
       </w:pPr>
-      <w:bookmarkStart w:id="23" w:name="_Toc241970549"/>
+      <w:bookmarkStart w:id="23" w:name="_Toc241972035"/>
       <w:r>
         <w:t>4.1. Chi</w:t>
       </w:r>
@@ -9673,7 +9676,7 @@
       <w:pPr>
         <w:pStyle w:val="u2"/>
       </w:pPr>
-      <w:bookmarkStart w:id="24" w:name="_Toc241970550"/>
+      <w:bookmarkStart w:id="24" w:name="_Toc241972036"/>
       <w:r>
         <w:t>4.2. Thi</w:t>
       </w:r>
@@ -10265,7 +10268,7 @@
       <w:pPr>
         <w:pStyle w:val="u2"/>
       </w:pPr>
-      <w:bookmarkStart w:id="25" w:name="_Toc241970551"/>
+      <w:bookmarkStart w:id="25" w:name="_Toc241972037"/>
       <w:r>
         <w:t>4.3. Môi trư</w:t>
       </w:r>
@@ -10302,385 +10305,6 @@
           <w:sz w:val="22"/>
         </w:rPr>
         <w:t>Bảng 10. Môi trường được ghi trong evidence manifest</w:t>
-      </w:r>
-    </w:p>
-    <w:tbl>
-      <w:tblPr>
-        <w:tblW w:w="0" w:type="auto"/>
-        <w:jc w:val="center"/>
-        <w:tblBorders>
-          <w:top w:val="single" w:sz="4" w:space="0" w:color="B7B7B7"/>
-          <w:left w:val="single" w:sz="4" w:space="0" w:color="B7B7B7"/>
-          <w:bottom w:val="single" w:sz="4" w:space="0" w:color="B7B7B7"/>
-          <w:right w:val="single" w:sz="4" w:space="0" w:color="B7B7B7"/>
-          <w:insideH w:val="single" w:sz="4" w:space="0" w:color="B7B7B7"/>
-          <w:insideV w:val="single" w:sz="4" w:space="0" w:color="B7B7B7"/>
-        </w:tblBorders>
-        <w:tblLook w:val="04A0" w:firstRow="1" w:lastRow="0" w:firstColumn="1" w:lastColumn="0" w:noHBand="0" w:noVBand="1"/>
-      </w:tblPr>
-      <w:tblGrid>
-        <w:gridCol w:w="1075"/>
-        <w:gridCol w:w="8688"/>
-      </w:tblGrid>
-      <w:tr>
-        <w:trPr>
-          <w:cantSplit/>
-          <w:tblHeader/>
-          <w:jc w:val="center"/>
-        </w:trPr>
-        <w:tc>
-          <w:tcPr>
-            <w:tcW w:w="4773" w:type="dxa"/>
-            <w:shd w:val="clear" w:color="auto" w:fill="D9E2F3"/>
-            <w:vAlign w:val="center"/>
-          </w:tcPr>
-          <w:p>
-            <w:pPr>
-              <w:spacing w:after="0" w:line="252" w:lineRule="auto"/>
-              <w:ind w:firstLine="0"/>
-              <w:jc w:val="center"/>
-            </w:pPr>
-            <w:r>
-              <w:rPr>
-                <w:b/>
-                <w:sz w:val="21"/>
-              </w:rPr>
-              <w:t>Thành phần</w:t>
-            </w:r>
-          </w:p>
-        </w:tc>
-        <w:tc>
-          <w:tcPr>
-            <w:tcW w:w="4773" w:type="dxa"/>
-            <w:shd w:val="clear" w:color="auto" w:fill="D9E2F3"/>
-            <w:vAlign w:val="center"/>
-          </w:tcPr>
-          <w:p>
-            <w:pPr>
-              <w:spacing w:after="0" w:line="252" w:lineRule="auto"/>
-              <w:ind w:firstLine="0"/>
-              <w:jc w:val="center"/>
-            </w:pPr>
-            <w:r>
-              <w:rPr>
-                <w:b/>
-                <w:sz w:val="21"/>
-              </w:rPr>
-              <w:t>Phiên bản/phạm vi</w:t>
-            </w:r>
-          </w:p>
-        </w:tc>
-      </w:tr>
-      <w:tr>
-        <w:trPr>
-          <w:cantSplit/>
-          <w:jc w:val="center"/>
-        </w:trPr>
-        <w:tc>
-          <w:tcPr>
-            <w:tcW w:w="4773" w:type="dxa"/>
-            <w:vAlign w:val="center"/>
-          </w:tcPr>
-          <w:p>
-            <w:pPr>
-              <w:spacing w:after="0" w:line="252" w:lineRule="auto"/>
-              <w:ind w:firstLine="0"/>
-              <w:jc w:val="left"/>
-            </w:pPr>
-            <w:r>
-              <w:rPr>
-                <w:sz w:val="21"/>
-              </w:rPr>
-              <w:t>Commit kiểm thử</w:t>
-            </w:r>
-          </w:p>
-        </w:tc>
-        <w:tc>
-          <w:tcPr>
-            <w:tcW w:w="4773" w:type="dxa"/>
-            <w:vAlign w:val="center"/>
-          </w:tcPr>
-          <w:p>
-            <w:pPr>
-              <w:spacing w:after="0" w:line="252" w:lineRule="auto"/>
-              <w:ind w:firstLine="0"/>
-              <w:jc w:val="left"/>
-            </w:pPr>
-            <w:r>
-              <w:rPr>
-                <w:sz w:val="21"/>
-              </w:rPr>
-              <w:t>14cd9a346ae88dd9fc68e9a2fa74f30a06614777</w:t>
-            </w:r>
-          </w:p>
-        </w:tc>
-      </w:tr>
-      <w:tr>
-        <w:trPr>
-          <w:cantSplit/>
-          <w:jc w:val="center"/>
-        </w:trPr>
-        <w:tc>
-          <w:tcPr>
-            <w:tcW w:w="4773" w:type="dxa"/>
-            <w:shd w:val="clear" w:color="auto" w:fill="F7F9FC"/>
-            <w:vAlign w:val="center"/>
-          </w:tcPr>
-          <w:p>
-            <w:pPr>
-              <w:spacing w:after="0" w:line="252" w:lineRule="auto"/>
-              <w:ind w:firstLine="0"/>
-              <w:jc w:val="left"/>
-            </w:pPr>
-            <w:r>
-              <w:rPr>
-                <w:sz w:val="21"/>
-              </w:rPr>
-              <w:t>Node / npm</w:t>
-            </w:r>
-          </w:p>
-        </w:tc>
-        <w:tc>
-          <w:tcPr>
-            <w:tcW w:w="4773" w:type="dxa"/>
-            <w:shd w:val="clear" w:color="auto" w:fill="F7F9FC"/>
-            <w:vAlign w:val="center"/>
-          </w:tcPr>
-          <w:p>
-            <w:pPr>
-              <w:spacing w:after="0" w:line="252" w:lineRule="auto"/>
-              <w:ind w:firstLine="0"/>
-              <w:jc w:val="left"/>
-            </w:pPr>
-            <w:r>
-              <w:rPr>
-                <w:sz w:val="21"/>
-              </w:rPr>
-              <w:t>v22.23.3 / 10.9.9</w:t>
-            </w:r>
-          </w:p>
-        </w:tc>
-      </w:tr>
-      <w:tr>
-        <w:trPr>
-          <w:cantSplit/>
-          <w:jc w:val="center"/>
-        </w:trPr>
-        <w:tc>
-          <w:tcPr>
-            <w:tcW w:w="4773" w:type="dxa"/>
-            <w:vAlign w:val="center"/>
-          </w:tcPr>
-          <w:p>
-            <w:pPr>
-              <w:spacing w:after="0" w:line="252" w:lineRule="auto"/>
-              <w:ind w:firstLine="0"/>
-              <w:jc w:val="left"/>
-            </w:pPr>
-            <w:r>
-              <w:rPr>
-                <w:sz w:val="21"/>
-              </w:rPr>
-              <w:t>Nền tảng</w:t>
-            </w:r>
-          </w:p>
-        </w:tc>
-        <w:tc>
-          <w:tcPr>
-            <w:tcW w:w="4773" w:type="dxa"/>
-            <w:vAlign w:val="center"/>
-          </w:tcPr>
-          <w:p>
-            <w:pPr>
-              <w:spacing w:after="0" w:line="252" w:lineRule="auto"/>
-              <w:ind w:firstLine="0"/>
-              <w:jc w:val="left"/>
-            </w:pPr>
-            <w:r>
-              <w:rPr>
-                <w:sz w:val="21"/>
-              </w:rPr>
-              <w:t>linux-x64</w:t>
-            </w:r>
-          </w:p>
-        </w:tc>
-      </w:tr>
-      <w:tr>
-        <w:trPr>
-          <w:cantSplit/>
-          <w:jc w:val="center"/>
-        </w:trPr>
-        <w:tc>
-          <w:tcPr>
-            <w:tcW w:w="4773" w:type="dxa"/>
-            <w:shd w:val="clear" w:color="auto" w:fill="F7F9FC"/>
-            <w:vAlign w:val="center"/>
-          </w:tcPr>
-          <w:p>
-            <w:pPr>
-              <w:spacing w:after="0" w:line="252" w:lineRule="auto"/>
-              <w:ind w:firstLine="0"/>
-              <w:jc w:val="left"/>
-            </w:pPr>
-            <w:r>
-              <w:rPr>
-                <w:sz w:val="21"/>
-              </w:rPr>
-              <w:t>k6</w:t>
-            </w:r>
-          </w:p>
-        </w:tc>
-        <w:tc>
-          <w:tcPr>
-            <w:tcW w:w="4773" w:type="dxa"/>
-            <w:shd w:val="clear" w:color="auto" w:fill="F7F9FC"/>
-            <w:vAlign w:val="center"/>
-          </w:tcPr>
-          <w:p>
-            <w:pPr>
-              <w:spacing w:after="0" w:line="252" w:lineRule="auto"/>
-              <w:ind w:firstLine="0"/>
-              <w:jc w:val="left"/>
-            </w:pPr>
-            <w:r>
-              <w:rPr>
-                <w:sz w:val="21"/>
-              </w:rPr>
-              <w:t>v2.3.0</w:t>
-            </w:r>
-          </w:p>
-        </w:tc>
-      </w:tr>
-      <w:tr>
-        <w:trPr>
-          <w:cantSplit/>
-          <w:jc w:val="center"/>
-        </w:trPr>
-        <w:tc>
-          <w:tcPr>
-            <w:tcW w:w="4773" w:type="dxa"/>
-            <w:vAlign w:val="center"/>
-          </w:tcPr>
-          <w:p>
-            <w:pPr>
-              <w:spacing w:after="0" w:line="252" w:lineRule="auto"/>
-              <w:ind w:firstLine="0"/>
-              <w:jc w:val="left"/>
-            </w:pPr>
-            <w:r>
-              <w:rPr>
-                <w:sz w:val="21"/>
-              </w:rPr>
-              <w:t>Lighthouse</w:t>
-            </w:r>
-          </w:p>
-        </w:tc>
-        <w:tc>
-          <w:tcPr>
-            <w:tcW w:w="4773" w:type="dxa"/>
-            <w:vAlign w:val="center"/>
-          </w:tcPr>
-          <w:p>
-            <w:pPr>
-              <w:spacing w:after="0" w:line="252" w:lineRule="auto"/>
-              <w:ind w:firstLine="0"/>
-              <w:jc w:val="left"/>
-            </w:pPr>
-            <w:r>
-              <w:rPr>
-                <w:sz w:val="21"/>
-              </w:rPr>
-              <w:t>13.5.0</w:t>
-            </w:r>
-          </w:p>
-        </w:tc>
-      </w:tr>
-      <w:tr>
-        <w:trPr>
-          <w:cantSplit/>
-          <w:jc w:val="center"/>
-        </w:trPr>
-        <w:tc>
-          <w:tcPr>
-            <w:tcW w:w="4773" w:type="dxa"/>
-            <w:shd w:val="clear" w:color="auto" w:fill="F7F9FC"/>
-            <w:vAlign w:val="center"/>
-          </w:tcPr>
-          <w:p>
-            <w:pPr>
-              <w:spacing w:after="0" w:line="252" w:lineRule="auto"/>
-              <w:ind w:firstLine="0"/>
-              <w:jc w:val="left"/>
-            </w:pPr>
-            <w:r>
-              <w:rPr>
-                <w:sz w:val="21"/>
-              </w:rPr>
-              <w:t>ZAP image</w:t>
-            </w:r>
-          </w:p>
-        </w:tc>
-        <w:tc>
-          <w:tcPr>
-            <w:tcW w:w="4773" w:type="dxa"/>
-            <w:shd w:val="clear" w:color="auto" w:fill="F7F9FC"/>
-            <w:vAlign w:val="center"/>
-          </w:tcPr>
-          <w:p>
-            <w:pPr>
-              <w:spacing w:after="0" w:line="252" w:lineRule="auto"/>
-              <w:ind w:firstLine="0"/>
-              <w:jc w:val="left"/>
-            </w:pPr>
-            <w:r>
-              <w:rPr>
-                <w:sz w:val="21"/>
-              </w:rPr>
-              <w:t>ghcr.io/zaproxy/zaproxy@sha256:781a2bdaea47324e7bab583e2263f21d257b0aee61ed51521a5be45f5f5081ef</w:t>
-            </w:r>
-          </w:p>
-        </w:tc>
-      </w:tr>
-    </w:tbl>
-    <w:p>
-      <w:pPr>
-        <w:spacing w:after="0"/>
-      </w:pPr>
-    </w:p>
-    <w:p>
-      <w:r>
-        <w:t>Database test dùng SQLite riêng và seed xác định. npm run db:setup chỉ chạy migration versioned rồi seed trên database mới; npm run db:reset là thao tác tường minh để xóa database demo/test đã chọn. Quy trình không dùng prisma db push làm hướng dẫn nộp vì cách đó không cung cấp lịch sử migration versioned.</w:t>
-      </w:r>
-    </w:p>
-    <w:p>
-      <w:r>
-        <w:t>Test data gồm ADMIN, nhiều STUDENT, room ACTIVE/INACTIVE, room ở capacity biên, equipment, closure và booking đủ bốn trạng thái. Thời gian được cố định trong unit/PBT. E2E dùng seed riêng để giảm phụ thuộc thứ tự. Secret không nằm trong repository; token nhạy cảm không được đưa vào summary artifact.</w:t>
-      </w:r>
-    </w:p>
-    <w:p>
-      <w:pPr>
-        <w:pStyle w:val="u2"/>
-      </w:pPr>
-      <w:bookmarkStart w:id="26" w:name="_Toc241970552"/>
-      <w:r>
-        <w:lastRenderedPageBreak/>
-        <w:t>4.4. Entry, exit và workflow</w:t>
-      </w:r>
-      <w:bookmarkEnd w:id="26"/>
-    </w:p>
-    <w:p>
-      <w:pPr>
-        <w:spacing w:after="80"/>
-        <w:ind w:firstLine="0"/>
-        <w:jc w:val="center"/>
-      </w:pPr>
-      <w:r>
-        <w:rPr>
-          <w:b/>
-          <w:i/>
-          <w:sz w:val="22"/>
-        </w:rPr>
-        <w:t>Bảng 11. Điều kiện bắt đầu và kết thúc</w:t>
       </w:r>
     </w:p>
     <w:tbl>
@@ -10724,7 +10348,7 @@
                 <w:b/>
                 <w:sz w:val="21"/>
               </w:rPr>
-              <w:t>Loại</w:t>
+              <w:t>Thành phần</w:t>
             </w:r>
           </w:p>
         </w:tc>
@@ -10745,7 +10369,7 @@
                 <w:b/>
                 <w:sz w:val="21"/>
               </w:rPr>
-              <w:t>Điều kiện</w:t>
+              <w:t>Phiên bản/phạm vi</w:t>
             </w:r>
           </w:p>
         </w:tc>
@@ -10770,7 +10394,7 @@
               <w:rPr>
                 <w:sz w:val="21"/>
               </w:rPr>
-              <w:t>Entry</w:t>
+              <w:t>Commit kiểm thử</w:t>
             </w:r>
           </w:p>
         </w:tc>
@@ -10789,7 +10413,7 @@
               <w:rPr>
                 <w:sz w:val="21"/>
               </w:rPr>
-              <w:t>npm ci, Prisma generate/migrate/seed thành công; cấu hình test và browser sẵn sàng</w:t>
+              <w:t>14cd9a346ae88dd9fc68e9a2fa74f30a06614777</w:t>
             </w:r>
           </w:p>
         </w:tc>
@@ -10815,7 +10439,7 @@
               <w:rPr>
                 <w:sz w:val="21"/>
               </w:rPr>
-              <w:t>Exit chức năng</w:t>
+              <w:t>Node / npm</w:t>
             </w:r>
           </w:p>
         </w:tc>
@@ -10835,7 +10459,7 @@
               <w:rPr>
                 <w:sz w:val="21"/>
               </w:rPr>
-              <w:t>Unit/API/database/PBT và 24 E2E pass; qa:trace không lỗi</w:t>
+              <w:t>v22.23.3 / 10.9.9</w:t>
             </w:r>
           </w:p>
         </w:tc>
@@ -10860,7 +10484,7 @@
               <w:rPr>
                 <w:sz w:val="21"/>
               </w:rPr>
-              <w:t>Exit coverage</w:t>
+              <w:t>Nền tảng</w:t>
             </w:r>
           </w:p>
         </w:tc>
@@ -10879,7 +10503,7 @@
               <w:rPr>
                 <w:sz w:val="21"/>
               </w:rPr>
-              <w:t>Line ≥85%; branch ≥70%; function ≥85% trong scope</w:t>
+              <w:t>linux-x64</w:t>
             </w:r>
           </w:p>
         </w:tc>
@@ -10905,7 +10529,7 @@
               <w:rPr>
                 <w:sz w:val="21"/>
               </w:rPr>
-              <w:t>Exit mutation</w:t>
+              <w:t>k6</w:t>
             </w:r>
           </w:p>
         </w:tc>
@@ -10925,7 +10549,7 @@
               <w:rPr>
                 <w:sz w:val="21"/>
               </w:rPr>
-              <w:t>Booking policy ≥60% theo killed/(killed+survived)</w:t>
+              <w:t>v2.3.0</w:t>
             </w:r>
           </w:p>
         </w:tc>
@@ -10950,7 +10574,7 @@
               <w:rPr>
                 <w:sz w:val="21"/>
               </w:rPr>
-              <w:t>Exit performance</w:t>
+              <w:t>Lighthouse</w:t>
             </w:r>
           </w:p>
         </w:tc>
@@ -10969,7 +10593,7 @@
               <w:rPr>
                 <w:sz w:val="21"/>
               </w:rPr>
-              <w:t>Checks 100%; request failure ≤1%; availability p95 ≤500 ms; race đúng 1×201</w:t>
+              <w:t>13.5.0</w:t>
             </w:r>
           </w:p>
         </w:tc>
@@ -10995,7 +10619,7 @@
               <w:rPr>
                 <w:sz w:val="21"/>
               </w:rPr>
-              <w:t>Exit security/UI</w:t>
+              <w:t>ZAP</w:t>
             </w:r>
           </w:p>
         </w:tc>
@@ -11015,7 +10639,7 @@
               <w:rPr>
                 <w:sz w:val="21"/>
               </w:rPr>
-              <w:t>ZAP High = 0; Lighthouse P/A/BP ≥80/90/90; axe không serious trong trang kiểm tra</w:t>
+              <w:t>2.17.0; container được ghim bằng SHA-256 (digest đầy đủ trong manifest)</w:t>
             </w:r>
           </w:p>
         </w:tc>
@@ -11028,14 +10652,393 @@
     </w:p>
     <w:p>
       <w:r>
-        <w:t>Core CI chạy audit dependency runtime, migration, qa:trace, test/coverage, mutation, build và Playwright. Quality-evidence tạo database sạch, chạy k6, Lighthouse, ZAP và xuất JSON. Nếu threshold fail, workflow fail và issue được tạo; báo cáo không được sửa từ Fail thành Pass bằng tay. Artifact đặt theo commit SHA và manifest giữ URL, thời gian, môi trường, kết quả và SHA-256.</w:t>
+        <w:t>Database test dùng SQLite riêng và seed xác định. npm run db:setup chỉ chạy migration versioned rồi seed trên database mới; npm run db:reset là thao tác tường minh để xóa database demo/test đã chọn. Quy trình không dùng prisma db push làm hướng dẫn nộp vì cách đó không cung cấp lịch sử migration versioned.</w:t>
+      </w:r>
+    </w:p>
+    <w:p>
+      <w:r>
+        <w:t>Test data gồm ADMIN, nhiều STUDENT, room ACTIVE/INACTIVE, room ở capacity biên, equipment, closure và booking đủ bốn trạng thái. Thời gian được cố định trong unit/PBT. E2E dùng seed riêng để giảm phụ thuộc thứ tự. Secret không nằm trong repository; token nhạy cảm không được đưa vào summary artifact.</w:t>
       </w:r>
     </w:p>
     <w:p>
       <w:pPr>
         <w:pStyle w:val="u2"/>
       </w:pPr>
-      <w:bookmarkStart w:id="27" w:name="_Toc241970553"/>
+      <w:bookmarkStart w:id="26" w:name="_Toc241972038"/>
+      <w:r>
+        <w:t>4.4. Entry, exit và workflow</w:t>
+      </w:r>
+      <w:bookmarkEnd w:id="26"/>
+    </w:p>
+    <w:p>
+      <w:pPr>
+        <w:spacing w:after="80"/>
+        <w:ind w:firstLine="0"/>
+        <w:jc w:val="center"/>
+      </w:pPr>
+      <w:r>
+        <w:rPr>
+          <w:b/>
+          <w:i/>
+          <w:sz w:val="22"/>
+        </w:rPr>
+        <w:t>Bảng 11. Điều kiện bắt đầu và kết thúc</w:t>
+      </w:r>
+    </w:p>
+    <w:tbl>
+      <w:tblPr>
+        <w:tblW w:w="0" w:type="auto"/>
+        <w:jc w:val="center"/>
+        <w:tblBorders>
+          <w:top w:val="single" w:sz="4" w:space="0" w:color="B7B7B7"/>
+          <w:left w:val="single" w:sz="4" w:space="0" w:color="B7B7B7"/>
+          <w:bottom w:val="single" w:sz="4" w:space="0" w:color="B7B7B7"/>
+          <w:right w:val="single" w:sz="4" w:space="0" w:color="B7B7B7"/>
+          <w:insideH w:val="single" w:sz="4" w:space="0" w:color="B7B7B7"/>
+          <w:insideV w:val="single" w:sz="4" w:space="0" w:color="B7B7B7"/>
+        </w:tblBorders>
+        <w:tblLook w:val="04A0" w:firstRow="1" w:lastRow="0" w:firstColumn="1" w:lastColumn="0" w:noHBand="0" w:noVBand="1"/>
+      </w:tblPr>
+      <w:tblGrid>
+        <w:gridCol w:w="4773"/>
+        <w:gridCol w:w="4773"/>
+      </w:tblGrid>
+      <w:tr>
+        <w:trPr>
+          <w:cantSplit/>
+          <w:tblHeader/>
+          <w:jc w:val="center"/>
+        </w:trPr>
+        <w:tc>
+          <w:tcPr>
+            <w:tcW w:w="4773" w:type="dxa"/>
+            <w:shd w:val="clear" w:color="auto" w:fill="D9E2F3"/>
+            <w:vAlign w:val="center"/>
+          </w:tcPr>
+          <w:p>
+            <w:pPr>
+              <w:spacing w:after="0" w:line="252" w:lineRule="auto"/>
+              <w:ind w:firstLine="0"/>
+              <w:jc w:val="center"/>
+            </w:pPr>
+            <w:r>
+              <w:rPr>
+                <w:b/>
+                <w:sz w:val="21"/>
+              </w:rPr>
+              <w:t>Loại</w:t>
+            </w:r>
+          </w:p>
+        </w:tc>
+        <w:tc>
+          <w:tcPr>
+            <w:tcW w:w="4773" w:type="dxa"/>
+            <w:shd w:val="clear" w:color="auto" w:fill="D9E2F3"/>
+            <w:vAlign w:val="center"/>
+          </w:tcPr>
+          <w:p>
+            <w:pPr>
+              <w:spacing w:after="0" w:line="252" w:lineRule="auto"/>
+              <w:ind w:firstLine="0"/>
+              <w:jc w:val="center"/>
+            </w:pPr>
+            <w:r>
+              <w:rPr>
+                <w:b/>
+                <w:sz w:val="21"/>
+              </w:rPr>
+              <w:t>Điều kiện</w:t>
+            </w:r>
+          </w:p>
+        </w:tc>
+      </w:tr>
+      <w:tr>
+        <w:trPr>
+          <w:cantSplit/>
+          <w:jc w:val="center"/>
+        </w:trPr>
+        <w:tc>
+          <w:tcPr>
+            <w:tcW w:w="4773" w:type="dxa"/>
+            <w:vAlign w:val="center"/>
+          </w:tcPr>
+          <w:p>
+            <w:pPr>
+              <w:spacing w:after="0" w:line="252" w:lineRule="auto"/>
+              <w:ind w:firstLine="0"/>
+              <w:jc w:val="left"/>
+            </w:pPr>
+            <w:r>
+              <w:rPr>
+                <w:sz w:val="21"/>
+              </w:rPr>
+              <w:lastRenderedPageBreak/>
+              <w:t>Entry</w:t>
+            </w:r>
+          </w:p>
+        </w:tc>
+        <w:tc>
+          <w:tcPr>
+            <w:tcW w:w="4773" w:type="dxa"/>
+            <w:vAlign w:val="center"/>
+          </w:tcPr>
+          <w:p>
+            <w:pPr>
+              <w:spacing w:after="0" w:line="252" w:lineRule="auto"/>
+              <w:ind w:firstLine="0"/>
+              <w:jc w:val="left"/>
+            </w:pPr>
+            <w:r>
+              <w:rPr>
+                <w:sz w:val="21"/>
+              </w:rPr>
+              <w:t>npm ci, Prisma generate/migrate/seed thành công; cấu hình test và browser sẵn sàng</w:t>
+            </w:r>
+          </w:p>
+        </w:tc>
+      </w:tr>
+      <w:tr>
+        <w:trPr>
+          <w:cantSplit/>
+          <w:jc w:val="center"/>
+        </w:trPr>
+        <w:tc>
+          <w:tcPr>
+            <w:tcW w:w="4773" w:type="dxa"/>
+            <w:shd w:val="clear" w:color="auto" w:fill="F7F9FC"/>
+            <w:vAlign w:val="center"/>
+          </w:tcPr>
+          <w:p>
+            <w:pPr>
+              <w:spacing w:after="0" w:line="252" w:lineRule="auto"/>
+              <w:ind w:firstLine="0"/>
+              <w:jc w:val="left"/>
+            </w:pPr>
+            <w:r>
+              <w:rPr>
+                <w:sz w:val="21"/>
+              </w:rPr>
+              <w:t>Exit chức năng</w:t>
+            </w:r>
+          </w:p>
+        </w:tc>
+        <w:tc>
+          <w:tcPr>
+            <w:tcW w:w="4773" w:type="dxa"/>
+            <w:shd w:val="clear" w:color="auto" w:fill="F7F9FC"/>
+            <w:vAlign w:val="center"/>
+          </w:tcPr>
+          <w:p>
+            <w:pPr>
+              <w:spacing w:after="0" w:line="252" w:lineRule="auto"/>
+              <w:ind w:firstLine="0"/>
+              <w:jc w:val="left"/>
+            </w:pPr>
+            <w:r>
+              <w:rPr>
+                <w:sz w:val="21"/>
+              </w:rPr>
+              <w:t>Unit/API/database/PBT và 24 E2E pass; qa:trace không lỗi</w:t>
+            </w:r>
+          </w:p>
+        </w:tc>
+      </w:tr>
+      <w:tr>
+        <w:trPr>
+          <w:cantSplit/>
+          <w:jc w:val="center"/>
+        </w:trPr>
+        <w:tc>
+          <w:tcPr>
+            <w:tcW w:w="4773" w:type="dxa"/>
+            <w:vAlign w:val="center"/>
+          </w:tcPr>
+          <w:p>
+            <w:pPr>
+              <w:spacing w:after="0" w:line="252" w:lineRule="auto"/>
+              <w:ind w:firstLine="0"/>
+              <w:jc w:val="left"/>
+            </w:pPr>
+            <w:r>
+              <w:rPr>
+                <w:sz w:val="21"/>
+              </w:rPr>
+              <w:t>Exit coverage</w:t>
+            </w:r>
+          </w:p>
+        </w:tc>
+        <w:tc>
+          <w:tcPr>
+            <w:tcW w:w="4773" w:type="dxa"/>
+            <w:vAlign w:val="center"/>
+          </w:tcPr>
+          <w:p>
+            <w:pPr>
+              <w:spacing w:after="0" w:line="252" w:lineRule="auto"/>
+              <w:ind w:firstLine="0"/>
+              <w:jc w:val="left"/>
+            </w:pPr>
+            <w:r>
+              <w:rPr>
+                <w:sz w:val="21"/>
+              </w:rPr>
+              <w:t>Line ≥85%; branch ≥70%; function ≥85% trong scope</w:t>
+            </w:r>
+          </w:p>
+        </w:tc>
+      </w:tr>
+      <w:tr>
+        <w:trPr>
+          <w:cantSplit/>
+          <w:jc w:val="center"/>
+        </w:trPr>
+        <w:tc>
+          <w:tcPr>
+            <w:tcW w:w="4773" w:type="dxa"/>
+            <w:shd w:val="clear" w:color="auto" w:fill="F7F9FC"/>
+            <w:vAlign w:val="center"/>
+          </w:tcPr>
+          <w:p>
+            <w:pPr>
+              <w:spacing w:after="0" w:line="252" w:lineRule="auto"/>
+              <w:ind w:firstLine="0"/>
+              <w:jc w:val="left"/>
+            </w:pPr>
+            <w:r>
+              <w:rPr>
+                <w:sz w:val="21"/>
+              </w:rPr>
+              <w:t>Exit mutation</w:t>
+            </w:r>
+          </w:p>
+        </w:tc>
+        <w:tc>
+          <w:tcPr>
+            <w:tcW w:w="4773" w:type="dxa"/>
+            <w:shd w:val="clear" w:color="auto" w:fill="F7F9FC"/>
+            <w:vAlign w:val="center"/>
+          </w:tcPr>
+          <w:p>
+            <w:pPr>
+              <w:spacing w:after="0" w:line="252" w:lineRule="auto"/>
+              <w:ind w:firstLine="0"/>
+              <w:jc w:val="left"/>
+            </w:pPr>
+            <w:r>
+              <w:rPr>
+                <w:sz w:val="21"/>
+              </w:rPr>
+              <w:t>Booking policy ≥60% theo killed/(killed+survived)</w:t>
+            </w:r>
+          </w:p>
+        </w:tc>
+      </w:tr>
+      <w:tr>
+        <w:trPr>
+          <w:cantSplit/>
+          <w:jc w:val="center"/>
+        </w:trPr>
+        <w:tc>
+          <w:tcPr>
+            <w:tcW w:w="4773" w:type="dxa"/>
+            <w:vAlign w:val="center"/>
+          </w:tcPr>
+          <w:p>
+            <w:pPr>
+              <w:spacing w:after="0" w:line="252" w:lineRule="auto"/>
+              <w:ind w:firstLine="0"/>
+              <w:jc w:val="left"/>
+            </w:pPr>
+            <w:r>
+              <w:rPr>
+                <w:sz w:val="21"/>
+              </w:rPr>
+              <w:t>Exit performance</w:t>
+            </w:r>
+          </w:p>
+        </w:tc>
+        <w:tc>
+          <w:tcPr>
+            <w:tcW w:w="4773" w:type="dxa"/>
+            <w:vAlign w:val="center"/>
+          </w:tcPr>
+          <w:p>
+            <w:pPr>
+              <w:spacing w:after="0" w:line="252" w:lineRule="auto"/>
+              <w:ind w:firstLine="0"/>
+              <w:jc w:val="left"/>
+            </w:pPr>
+            <w:r>
+              <w:rPr>
+                <w:sz w:val="21"/>
+              </w:rPr>
+              <w:t>Checks 100%; request failure ≤1%; availability p95 ≤500 ms; race đúng 1×201</w:t>
+            </w:r>
+          </w:p>
+        </w:tc>
+      </w:tr>
+      <w:tr>
+        <w:trPr>
+          <w:cantSplit/>
+          <w:jc w:val="center"/>
+        </w:trPr>
+        <w:tc>
+          <w:tcPr>
+            <w:tcW w:w="4773" w:type="dxa"/>
+            <w:shd w:val="clear" w:color="auto" w:fill="F7F9FC"/>
+            <w:vAlign w:val="center"/>
+          </w:tcPr>
+          <w:p>
+            <w:pPr>
+              <w:spacing w:after="0" w:line="252" w:lineRule="auto"/>
+              <w:ind w:firstLine="0"/>
+              <w:jc w:val="left"/>
+            </w:pPr>
+            <w:r>
+              <w:rPr>
+                <w:sz w:val="21"/>
+              </w:rPr>
+              <w:t>Exit security/UI</w:t>
+            </w:r>
+          </w:p>
+        </w:tc>
+        <w:tc>
+          <w:tcPr>
+            <w:tcW w:w="4773" w:type="dxa"/>
+            <w:shd w:val="clear" w:color="auto" w:fill="F7F9FC"/>
+            <w:vAlign w:val="center"/>
+          </w:tcPr>
+          <w:p>
+            <w:pPr>
+              <w:spacing w:after="0" w:line="252" w:lineRule="auto"/>
+              <w:ind w:firstLine="0"/>
+              <w:jc w:val="left"/>
+            </w:pPr>
+            <w:r>
+              <w:rPr>
+                <w:sz w:val="21"/>
+              </w:rPr>
+              <w:t>ZAP High = 0; Lighthouse P/A/BP ≥80/90/90; axe không serious trong trang kiểm tra</w:t>
+            </w:r>
+          </w:p>
+        </w:tc>
+      </w:tr>
+    </w:tbl>
+    <w:p>
+      <w:pPr>
+        <w:spacing w:after="0"/>
+      </w:pPr>
+    </w:p>
+    <w:p>
+      <w:r>
+        <w:t>Core CI chạy audit dependency runtime, migration, qa:trace, test/coverage, mutation, build và Playwright. Quality-evidence tạo database sạch, chạy k6, Lighthouse, ZAP và xuất JSON. Nếu threshold fail, workflow fail và issue được tạo; báo cáo không được sửa từ Fail thành Pass bằng tay. Artifact đặt theo commit SHA và manifest giữ URL, thời gian, môi trường, kết quả và SHA-256.</w:t>
+      </w:r>
+    </w:p>
+    <w:p>
+      <w:pPr>
+        <w:pStyle w:val="u2"/>
+      </w:pPr>
+      <w:bookmarkStart w:id="27" w:name="_Toc241972039"/>
       <w:r>
         <w:t>4.5. Truy v</w:t>
       </w:r>
@@ -11073,7 +11076,7 @@
       <w:pPr>
         <w:pStyle w:val="u1"/>
       </w:pPr>
-      <w:bookmarkStart w:id="28" w:name="_Toc241970554"/>
+      <w:bookmarkStart w:id="28" w:name="_Toc241972040"/>
       <w:r>
         <w:lastRenderedPageBreak/>
         <w:t>CHƯƠNG 5. TH</w:t>
@@ -11114,7 +11117,7 @@
       <w:pPr>
         <w:pStyle w:val="u2"/>
       </w:pPr>
-      <w:bookmarkStart w:id="29" w:name="_Toc241970555"/>
+      <w:bookmarkStart w:id="29" w:name="_Toc241972041"/>
       <w:r>
         <w:t>5.1. T</w:t>
       </w:r>
@@ -12028,6 +12031,67 @@
     </w:p>
     <w:p>
       <w:pPr>
+        <w:pStyle w:val="u2"/>
+      </w:pPr>
+      <w:bookmarkStart w:id="30" w:name="_Toc241972042"/>
+      <w:r>
+        <w:t>5.2. Unit, BVA và property-based testing</w:t>
+      </w:r>
+      <w:bookmarkEnd w:id="30"/>
+    </w:p>
+    <w:p>
+      <w:r>
+        <w:t>Các hàm booking policy được kiểm tra với clock cố định. Bộ test từ chối ngày không tồn tại, phân biệt năm nhuận và năm không nhuận, chấp nhận ngày 14 và từ chối ngày 15. Các biên hủy 60/59 phút và check-in -15/+15/-16/+16 phút được tách rõ. PBT sinh nhiều giá trị trong miền để kiểm tra duration 60 phút, phạm vi ngày và cửa sổ check-in.</w:t>
+      </w:r>
+    </w:p>
+    <w:p>
+      <w:r>
+        <w:t>Kết quả 47/47 bao gồm unit, PBT và API vì Vitest chạy chung suite backend. Con số này phải được đọc cùng catalog thay vì xem là 47 kiểm tra cùng loại. Lợi ích chính của PBT là kiểm tra bất biến trên nhiều input; hạn chế là generator và property do nhóm định nghĩa, nên vẫn có thể bỏ sót loại lỗi ngoài mô hình.</w:t>
+      </w:r>
+    </w:p>
+    <w:p>
+      <w:pPr>
+        <w:pStyle w:val="u2"/>
+      </w:pPr>
+      <w:bookmarkStart w:id="31" w:name="_Toc241972043"/>
+      <w:r>
+        <w:lastRenderedPageBreak/>
+        <w:t>5.3. API, database và transaction</w:t>
+      </w:r>
+      <w:bookmarkEnd w:id="31"/>
+    </w:p>
+    <w:p>
+      <w:r>
+        <w:t>Supertest kiểm tra đăng ký/login, hồ sơ, room filter, availability, booking, cancel/check-in, admin CRUD, closure, report và các ca âm tương ứng. Duplicate email, room not found, capacity boundary, duplicate closure, occupiedSlots, RBAC và state transition đều có test riêng. Error contract dùng 401 cho xác thực, 403 cho thiếu quyền, 404 cho tài nguyên không tồn tại, 409 cho conflict và 422 cho dữ liệu/rule không hợp lệ.</w:t>
+      </w:r>
+    </w:p>
+    <w:p>
+      <w:r>
+        <w:t>Hai unique key bảo vệ conflict room-slot và user-slot. Test cạnh tranh khẳng định một insert thành công và request sau nhận 409. Test rollback làm audit thất bại rồi đọc lại dữ liệu để xác nhận mutation không commit. Đây là phần bằng chứng quan trọng hơn việc chỉ mock repository, vì nó quan sát ràng buộc và transaction trên database test thật.</w:t>
+      </w:r>
+    </w:p>
+    <w:p>
+      <w:pPr>
+        <w:pStyle w:val="u2"/>
+      </w:pPr>
+      <w:bookmarkStart w:id="32" w:name="_Toc241972044"/>
+      <w:r>
+        <w:t>5.4. E2E, responsive và accessibility</w:t>
+      </w:r>
+      <w:bookmarkEnd w:id="32"/>
+    </w:p>
+    <w:p>
+      <w:r>
+        <w:t>Playwright thực thi 12 scenario trên hai profile desktop/mobile Chromium, tạo 24 kết quả. Các luồng đại diện gồm đăng ký/login, student tìm và đặt phòng, validation conflict/closure, cancel/check-in, admin quản lý room/closure/booking/report và kiểm tra accessibility cho login, student portal và admin console. Kết quả 24/24 pass, không skipped, unexpected hoặc flaky trong run được ghi.</w:t>
+      </w:r>
+    </w:p>
+    <w:p>
+      <w:r>
+        <w:t>Ảnh giao diện dưới đây minh họa hai actor sau seed. Ảnh chỉ xác nhận bố cục tại thời điểm chụp; assertion E2E và report mới là evidence máy đọc được. Việc chỉ dùng Chromium là giới hạn compatibility, vì rendering và accessibility tree có thể khác trên Firefox hoặc WebKit.</w:t>
+      </w:r>
+    </w:p>
+    <w:p>
+      <w:pPr>
         <w:jc w:val="center"/>
       </w:pPr>
       <w:r>
@@ -12036,131 +12100,10 @@
         </w:rPr>
         <w:lastRenderedPageBreak/>
         <w:drawing>
-          <wp:inline distT="0" distB="0" distL="0" distR="0" wp14:anchorId="13DAFF5A" wp14:editId="5382E2C1">
-            <wp:extent cx="5943600" cy="3235960"/>
+          <wp:inline distT="0" distB="0" distL="0" distR="0" wp14:anchorId="6ADCED23" wp14:editId="388248C8">
+            <wp:extent cx="5029200" cy="4306252"/>
             <wp:effectExtent l="0" t="0" r="0" b="0"/>
             <wp:docPr id="4" name="Picture 4"/>
-            <wp:cNvGraphicFramePr>
-              <a:graphicFrameLocks xmlns:a="http://schemas.openxmlformats.org/drawingml/2006/main" noChangeAspect="1"/>
-            </wp:cNvGraphicFramePr>
-            <a:graphic xmlns:a="http://schemas.openxmlformats.org/drawingml/2006/main">
-              <a:graphicData uri="http://schemas.openxmlformats.org/drawingml/2006/picture">
-                <pic:pic xmlns:pic="http://schemas.openxmlformats.org/drawingml/2006/picture">
-                  <pic:nvPicPr>
-                    <pic:cNvPr id="0" name="quality-results.png"/>
-                    <pic:cNvPicPr/>
-                  </pic:nvPicPr>
-                  <pic:blipFill>
-                    <a:blip r:embed="rId11"/>
-                    <a:stretch>
-                      <a:fillRect/>
-                    </a:stretch>
-                  </pic:blipFill>
-                  <pic:spPr>
-                    <a:xfrm>
-                      <a:off x="0" y="0"/>
-                      <a:ext cx="5943600" cy="3235960"/>
-                    </a:xfrm>
-                    <a:prstGeom prst="rect">
-                      <a:avLst/>
-                    </a:prstGeom>
-                  </pic:spPr>
-                </pic:pic>
-              </a:graphicData>
-            </a:graphic>
-          </wp:inline>
-        </w:drawing>
-      </w:r>
-    </w:p>
-    <w:p>
-      <w:pPr>
-        <w:spacing w:after="80"/>
-        <w:ind w:firstLine="0"/>
-        <w:jc w:val="center"/>
-      </w:pPr>
-      <w:r>
-        <w:rPr>
-          <w:b/>
-          <w:i/>
-          <w:sz w:val="22"/>
-        </w:rPr>
-        <w:t>Hình 4. So sánh một số chỉ số thực tế với ngưỡng chấp nhận</w:t>
-      </w:r>
-    </w:p>
-    <w:p>
-      <w:pPr>
-        <w:pStyle w:val="u2"/>
-      </w:pPr>
-      <w:bookmarkStart w:id="30" w:name="_Toc241970556"/>
-      <w:r>
-        <w:t>5.2. Unit, BVA và property-based testing</w:t>
-      </w:r>
-      <w:bookmarkEnd w:id="30"/>
-    </w:p>
-    <w:p>
-      <w:r>
-        <w:t>Các hàm booking policy được kiểm tra với clock cố định. Bộ test từ chối ngày không tồn tại, phân biệt năm nhuận và năm không nhuận, chấp nhận ngày 14 và từ chối ngày 15. Các biên hủy 60/59 phút và check-in -15/+15/-16/+16 phút được tách rõ. PBT sinh nhiều giá trị trong miền để kiểm tra duration 60 phút, phạm vi ngày và cửa sổ check-in.</w:t>
-      </w:r>
-    </w:p>
-    <w:p>
-      <w:r>
-        <w:t>Kết quả 47/47 bao gồm unit, PBT và API vì Vitest chạy chung suite backend. Con số này phải được đọc cùng catalog thay vì xem là 47 kiểm tra cùng loại. Lợi ích chính của PBT là kiểm tra bất biến trên nhiều input; hạn chế là generator và property do nhóm định nghĩa, nên vẫn có thể bỏ sót loại lỗi ngoài mô hình.</w:t>
-      </w:r>
-    </w:p>
-    <w:p>
-      <w:pPr>
-        <w:pStyle w:val="u2"/>
-      </w:pPr>
-      <w:bookmarkStart w:id="31" w:name="_Toc241970557"/>
-      <w:r>
-        <w:t>5.3. API, database và transaction</w:t>
-      </w:r>
-      <w:bookmarkEnd w:id="31"/>
-    </w:p>
-    <w:p>
-      <w:r>
-        <w:t>Supertest kiểm tra đăng ký/login, hồ sơ, room filter, availability, booking, cancel/check-in, admin CRUD, closure, report và các ca âm tương ứng. Duplicate email, room not found, capacity boundary, duplicate closure, occupiedSlots, RBAC và state transition đều có test riêng. Error contract dùng 401 cho xác thực, 403 cho thiếu quyền, 404 cho tài nguyên không tồn tại, 409 cho conflict và 422 cho dữ liệu/rule không hợp lệ.</w:t>
-      </w:r>
-    </w:p>
-    <w:p>
-      <w:r>
-        <w:lastRenderedPageBreak/>
-        <w:t>Hai unique key bảo vệ conflict room-slot và user-slot. Test cạnh tranh khẳng định một insert thành công và request sau nhận 409. Test rollback làm audit thất bại rồi đọc lại dữ liệu để xác nhận mutation không commit. Đây là phần bằng chứng quan trọng hơn việc chỉ mock repository, vì nó quan sát ràng buộc và transaction trên database test thật.</w:t>
-      </w:r>
-    </w:p>
-    <w:p>
-      <w:pPr>
-        <w:pStyle w:val="u2"/>
-      </w:pPr>
-      <w:bookmarkStart w:id="32" w:name="_Toc241970558"/>
-      <w:r>
-        <w:t>5.4. E2E, responsive và accessibility</w:t>
-      </w:r>
-      <w:bookmarkEnd w:id="32"/>
-    </w:p>
-    <w:p>
-      <w:r>
-        <w:t>Playwright thực thi 12 scenario trên hai profile desktop/mobile Chromium, tạo 24 kết quả. Các luồng đại diện gồm đăng ký/login, student tìm và đặt phòng, validation conflict/closure, cancel/check-in, admin quản lý room/closure/booking/report và kiểm tra accessibility cho login, student portal và admin console. Kết quả 24/24 pass, không skipped, unexpected hoặc flaky trong run được ghi.</w:t>
-      </w:r>
-    </w:p>
-    <w:p>
-      <w:r>
-        <w:t>Ảnh giao diện dưới đây minh họa hai actor sau seed. Ảnh chỉ xác nhận bố cục tại thời điểm chụp; assertion E2E và report mới là evidence máy đọc được. Việc chỉ dùng Chromium là giới hạn compatibility, vì rendering và accessibility tree có thể khác trên Firefox hoặc WebKit.</w:t>
-      </w:r>
-    </w:p>
-    <w:p>
-      <w:pPr>
-        <w:jc w:val="center"/>
-      </w:pPr>
-      <w:r>
-        <w:rPr>
-          <w:noProof/>
-        </w:rPr>
-        <w:drawing>
-          <wp:inline distT="0" distB="0" distL="0" distR="0" wp14:anchorId="5F41F5C1" wp14:editId="007DDFAF">
-            <wp:extent cx="5029200" cy="4306252"/>
-            <wp:effectExtent l="0" t="0" r="0" b="0"/>
-            <wp:docPr id="5" name="Picture 5"/>
             <wp:cNvGraphicFramePr>
               <a:graphicFrameLocks xmlns:a="http://schemas.openxmlformats.org/drawingml/2006/main" noChangeAspect="1"/>
             </wp:cNvGraphicFramePr>
@@ -12172,7 +12115,7 @@
                     <pic:cNvPicPr/>
                   </pic:nvPicPr>
                   <pic:blipFill>
-                    <a:blip r:embed="rId12"/>
+                    <a:blip r:embed="rId11"/>
                     <a:stretch>
                       <a:fillRect/>
                     </a:stretch>
@@ -12205,8 +12148,7 @@
           <w:i/>
           <w:sz w:val="22"/>
         </w:rPr>
-        <w:lastRenderedPageBreak/>
-        <w:t>Hình 5. Giao diện Student sau khi đăng nhập</w:t>
+        <w:t>Hình 4. Giao diện Student sau khi đăng nhập</w:t>
       </w:r>
     </w:p>
     <w:p>
@@ -12217,11 +12159,12 @@
         <w:rPr>
           <w:noProof/>
         </w:rPr>
+        <w:lastRenderedPageBreak/>
         <w:drawing>
-          <wp:inline distT="0" distB="0" distL="0" distR="0" wp14:anchorId="77FAE5A2" wp14:editId="6F48665F">
+          <wp:inline distT="0" distB="0" distL="0" distR="0" wp14:anchorId="792EFE3D" wp14:editId="1ADC6558">
             <wp:extent cx="5029200" cy="5930265"/>
             <wp:effectExtent l="0" t="0" r="0" b="0"/>
-            <wp:docPr id="6" name="Picture 6"/>
+            <wp:docPr id="5" name="Picture 5"/>
             <wp:cNvGraphicFramePr>
               <a:graphicFrameLocks xmlns:a="http://schemas.openxmlformats.org/drawingml/2006/main" noChangeAspect="1"/>
             </wp:cNvGraphicFramePr>
@@ -12233,7 +12176,7 @@
                     <pic:cNvPicPr/>
                   </pic:nvPicPr>
                   <pic:blipFill>
-                    <a:blip r:embed="rId13"/>
+                    <a:blip r:embed="rId12"/>
                     <a:stretch>
                       <a:fillRect/>
                     </a:stretch>
@@ -12266,14 +12209,14 @@
           <w:i/>
           <w:sz w:val="22"/>
         </w:rPr>
-        <w:t>Hình 6. Giao diện Admin và dữ liệu vận hành</w:t>
+        <w:t>Hình 5. Giao diện Admin và dữ liệu vận hành</w:t>
       </w:r>
     </w:p>
     <w:p>
       <w:pPr>
         <w:pStyle w:val="u2"/>
       </w:pPr>
-      <w:bookmarkStart w:id="33" w:name="_Toc241970559"/>
+      <w:bookmarkStart w:id="33" w:name="_Toc241972045"/>
       <w:r>
         <w:t>5.5. Coverage và mutation</w:t>
       </w:r>
@@ -12286,11 +12229,138 @@
     </w:p>
     <w:p>
       <w:r>
-        <w:t xml:space="preserve">Stryker tạo 135 mutant trong scope booking-policy.ts: 86 killed, 20 survived, 2 no-coverage và 27 compile-error. Mutation score theo công thức đã công bố là </w:t>
-      </w:r>
-      <w:r>
+        <w:t>Hình 6 là ảnh chụp trực tiếp file coverage/index.html trong Core CI artifact của commit kiểm thử, không phải số liệu được dựng lại trong báo cáo.</w:t>
+      </w:r>
+    </w:p>
+    <w:p>
+      <w:pPr>
+        <w:jc w:val="center"/>
+      </w:pPr>
+      <w:r>
+        <w:rPr>
+          <w:noProof/>
+        </w:rPr>
         <w:lastRenderedPageBreak/>
-        <w:t>86/(86+20)=81,13%. Hai no-coverage cho thấy còn điểm chưa chạm; 20 survived là tín hiệu cần xem xét assertion hoặc mutant tương đương. Hai mươi bảy compile-error được báo riêng, không bị dùng để nâng hoặc hạ điểm.</w:t>
+        <w:drawing>
+          <wp:inline distT="0" distB="0" distL="0" distR="0" wp14:anchorId="1428AC20" wp14:editId="77600237">
+            <wp:extent cx="5669280" cy="1653540"/>
+            <wp:effectExtent l="0" t="0" r="0" b="0"/>
+            <wp:docPr id="6" name="Picture 6"/>
+            <wp:cNvGraphicFramePr>
+              <a:graphicFrameLocks xmlns:a="http://schemas.openxmlformats.org/drawingml/2006/main" noChangeAspect="1"/>
+            </wp:cNvGraphicFramePr>
+            <a:graphic xmlns:a="http://schemas.openxmlformats.org/drawingml/2006/main">
+              <a:graphicData uri="http://schemas.openxmlformats.org/drawingml/2006/picture">
+                <pic:pic xmlns:pic="http://schemas.openxmlformats.org/drawingml/2006/picture">
+                  <pic:nvPicPr>
+                    <pic:cNvPr id="0" name="coverage-real.png"/>
+                    <pic:cNvPicPr/>
+                  </pic:nvPicPr>
+                  <pic:blipFill>
+                    <a:blip r:embed="rId13"/>
+                    <a:stretch>
+                      <a:fillRect/>
+                    </a:stretch>
+                  </pic:blipFill>
+                  <pic:spPr>
+                    <a:xfrm>
+                      <a:off x="0" y="0"/>
+                      <a:ext cx="5669280" cy="1653540"/>
+                    </a:xfrm>
+                    <a:prstGeom prst="rect">
+                      <a:avLst/>
+                    </a:prstGeom>
+                  </pic:spPr>
+                </pic:pic>
+              </a:graphicData>
+            </a:graphic>
+          </wp:inline>
+        </w:drawing>
+      </w:r>
+    </w:p>
+    <w:p>
+      <w:pPr>
+        <w:spacing w:after="80"/>
+        <w:ind w:firstLine="0"/>
+        <w:jc w:val="center"/>
+      </w:pPr>
+      <w:r>
+        <w:rPr>
+          <w:b/>
+          <w:i/>
+          <w:sz w:val="22"/>
+        </w:rPr>
+        <w:t>Hình 6. Báo cáo coverage thực tế từ Core CI artifact</w:t>
+      </w:r>
+    </w:p>
+    <w:p>
+      <w:r>
+        <w:t>Stryker tạo 135 mutant trong scope booking-policy.ts: 86 killed, 20 survived, 2 no-coverage và 27 compile-error. Mutation score theo công thức đã công bố là 86/(86+20)=81,13%. Hai no-coverage cho thấy còn điểm chưa chạm; 20 survived là tín hiệu cần xem xét assertion hoặc mutant tương đương. Hai mươi bảy compile-error được báo riêng, không bị dùng để nâng hoặc hạ điểm.</w:t>
+      </w:r>
+    </w:p>
+    <w:p>
+      <w:r>
+        <w:t>Hình 7 là ảnh chụp trực tiếp report HTML của Stryker trong cùng Core CI artifact. Report hiển thị đồng thời số killed, survived, no-coverage và compile-error, cho phép đối chiếu với bảng thống kê.</w:t>
+      </w:r>
+    </w:p>
+    <w:p>
+      <w:pPr>
+        <w:jc w:val="center"/>
+      </w:pPr>
+      <w:r>
+        <w:rPr>
+          <w:noProof/>
+        </w:rPr>
+        <w:drawing>
+          <wp:inline distT="0" distB="0" distL="0" distR="0" wp14:anchorId="3941F9D5" wp14:editId="331A31FA">
+            <wp:extent cx="5669280" cy="2440940"/>
+            <wp:effectExtent l="0" t="0" r="0" b="0"/>
+            <wp:docPr id="7" name="Picture 7"/>
+            <wp:cNvGraphicFramePr>
+              <a:graphicFrameLocks xmlns:a="http://schemas.openxmlformats.org/drawingml/2006/main" noChangeAspect="1"/>
+            </wp:cNvGraphicFramePr>
+            <a:graphic xmlns:a="http://schemas.openxmlformats.org/drawingml/2006/main">
+              <a:graphicData uri="http://schemas.openxmlformats.org/drawingml/2006/picture">
+                <pic:pic xmlns:pic="http://schemas.openxmlformats.org/drawingml/2006/picture">
+                  <pic:nvPicPr>
+                    <pic:cNvPr id="0" name="mutation-real.png"/>
+                    <pic:cNvPicPr/>
+                  </pic:nvPicPr>
+                  <pic:blipFill>
+                    <a:blip r:embed="rId14"/>
+                    <a:stretch>
+                      <a:fillRect/>
+                    </a:stretch>
+                  </pic:blipFill>
+                  <pic:spPr>
+                    <a:xfrm>
+                      <a:off x="0" y="0"/>
+                      <a:ext cx="5669280" cy="2440940"/>
+                    </a:xfrm>
+                    <a:prstGeom prst="rect">
+                      <a:avLst/>
+                    </a:prstGeom>
+                  </pic:spPr>
+                </pic:pic>
+              </a:graphicData>
+            </a:graphic>
+          </wp:inline>
+        </w:drawing>
+      </w:r>
+    </w:p>
+    <w:p>
+      <w:pPr>
+        <w:spacing w:after="80"/>
+        <w:ind w:firstLine="0"/>
+        <w:jc w:val="center"/>
+      </w:pPr>
+      <w:r>
+        <w:rPr>
+          <w:b/>
+          <w:i/>
+          <w:sz w:val="22"/>
+        </w:rPr>
+        <w:t>Hình 7. Báo cáo mutation thực tế từ Core CI artifact</w:t>
       </w:r>
     </w:p>
     <w:p>
@@ -12546,6 +12616,7 @@
               <w:rPr>
                 <w:sz w:val="21"/>
               </w:rPr>
+              <w:lastRenderedPageBreak/>
               <w:t>No coverage</w:t>
             </w:r>
           </w:p>
@@ -12670,7 +12741,7 @@
       <w:pPr>
         <w:pStyle w:val="u2"/>
       </w:pPr>
-      <w:bookmarkStart w:id="34" w:name="_Toc241970560"/>
+      <w:bookmarkStart w:id="34" w:name="_Toc241972046"/>
       <w:r>
         <w:t>5.6. Hi</w:t>
       </w:r>
@@ -12696,7 +12767,7 @@
       <w:pPr>
         <w:pStyle w:val="u2"/>
       </w:pPr>
-      <w:bookmarkStart w:id="35" w:name="_Toc241970561"/>
+      <w:bookmarkStart w:id="35" w:name="_Toc241972047"/>
       <w:r>
         <w:t>5.7. Security testing</w:t>
       </w:r>
@@ -12709,7 +12780,6 @@
     </w:p>
     <w:p>
       <w:r>
-        <w:lastRenderedPageBreak/>
         <w:t>ZAP baseline frontend ghi 0 High, 0 Medium, 9 Low và 7 Informational; API ghi 0 High, 0 Medium, 0 Low và 3 Informational. Chín Low frontend liên quan COEP/COOP/CORP cần được đánh giá khi có mô hình triển khai thực; không bị xóa khỏi báo cáo. Phạm vi là unauthenticated frontend preview và public API baseline. Do đó, kết quả không phải pentest, không bao phủ tấn công sau đăng nhập và không chứng minh hệ thống “an toàn tuyệt đối”.</w:t>
       </w:r>
     </w:p>
@@ -12770,6 +12840,7 @@
                 <w:b/>
                 <w:sz w:val="21"/>
               </w:rPr>
+              <w:lastRenderedPageBreak/>
               <w:t>Nhóm</w:t>
             </w:r>
           </w:p>
@@ -13148,7 +13219,7 @@
       <w:pPr>
         <w:pStyle w:val="u2"/>
       </w:pPr>
-      <w:bookmarkStart w:id="36" w:name="_Toc241970562"/>
+      <w:bookmarkStart w:id="36" w:name="_Toc241972048"/>
       <w:r>
         <w:t>5.8. Lighthouse, axe và tr</w:t>
       </w:r>
@@ -13180,7 +13251,7 @@
       <w:pPr>
         <w:pStyle w:val="u2"/>
       </w:pPr>
-      <w:bookmarkStart w:id="37" w:name="_Toc241970563"/>
+      <w:bookmarkStart w:id="37" w:name="_Toc241972049"/>
       <w:r>
         <w:t>5.9. Tính tái l</w:t>
       </w:r>
@@ -13212,11 +13283,7 @@
     </w:p>
     <w:p>
       <w:r>
-        <w:t xml:space="preserve">Core workflow URL là https://github.com/bachiep/studyspace-quality-assurance/actions/runs/37140913623; quality-evidence là https://github.com/bachiep/studyspace-quality-assurance/actions/runs/37140920740. Manifest verifiedAt 2026-10-03T17:37:40Z ghi phiên bản công cụ, threshold, đường dẫn </w:t>
-      </w:r>
-      <w:r>
-        <w:lastRenderedPageBreak/>
-        <w:t>artifact và SHA-256 của tám file cốt lõi. Các file report sinh tự động không được đưa toàn bộ vào Git để tránh phình repository.</w:t>
+        <w:t>Core workflow URL là https://github.com/bachiep/studyspace-quality-assurance/actions/runs/37140913623; quality-evidence là https://github.com/bachiep/studyspace-quality-assurance/actions/runs/37140920740. Manifest verifiedAt 2026-10-03T17:37:40Z ghi phiên bản công cụ, threshold, đường dẫn artifact và SHA-256 của tám file cốt lõi. Các file report sinh tự động không được đưa toàn bộ vào Git để tránh phình repository.</w:t>
       </w:r>
     </w:p>
     <w:p>
@@ -13228,7 +13295,7 @@
       <w:pPr>
         <w:pStyle w:val="u1"/>
       </w:pPr>
-      <w:bookmarkStart w:id="38" w:name="_Toc241970564"/>
+      <w:bookmarkStart w:id="38" w:name="_Toc241972050"/>
       <w:r>
         <w:lastRenderedPageBreak/>
         <w:t>CHƯƠNG 6. DEFECT, RETEST VÀ ĐÁNH GIÁ CH</w:t>
@@ -13251,7 +13318,7 @@
       <w:pPr>
         <w:pStyle w:val="u2"/>
       </w:pPr>
-      <w:bookmarkStart w:id="39" w:name="_Toc241970565"/>
+      <w:bookmarkStart w:id="39" w:name="_Toc241972051"/>
       <w:r>
         <w:t>6.1. Defect lifecycle</w:t>
       </w:r>
@@ -13989,7 +14056,7 @@
       <w:pPr>
         <w:pStyle w:val="u2"/>
       </w:pPr>
-      <w:bookmarkStart w:id="40" w:name="_Toc241970566"/>
+      <w:bookmarkStart w:id="40" w:name="_Toc241972052"/>
       <w:r>
         <w:t>6.2. Tr</w:t>
       </w:r>
@@ -14038,7 +14105,7 @@
       <w:pPr>
         <w:pStyle w:val="u2"/>
       </w:pPr>
-      <w:bookmarkStart w:id="41" w:name="_Toc241970567"/>
+      <w:bookmarkStart w:id="41" w:name="_Toc241972053"/>
       <w:r>
         <w:t>6.3. Đánh giá theo ISO/IEC 25010:2023</w:t>
       </w:r>
@@ -14742,7 +14809,7 @@
       <w:pPr>
         <w:pStyle w:val="u2"/>
       </w:pPr>
-      <w:bookmarkStart w:id="42" w:name="_Toc241970568"/>
+      <w:bookmarkStart w:id="42" w:name="_Toc241972054"/>
       <w:r>
         <w:t>6.4. Gi</w:t>
       </w:r>
@@ -15231,7 +15298,7 @@
       <w:pPr>
         <w:pStyle w:val="u1"/>
       </w:pPr>
-      <w:bookmarkStart w:id="43" w:name="_Toc241970569"/>
+      <w:bookmarkStart w:id="43" w:name="_Toc241972055"/>
       <w:r>
         <w:lastRenderedPageBreak/>
         <w:t>CHƯƠNG 7. K</w:t>
@@ -15263,7 +15330,7 @@
       <w:pPr>
         <w:pStyle w:val="u2"/>
       </w:pPr>
-      <w:bookmarkStart w:id="44" w:name="_Toc241970570"/>
+      <w:bookmarkStart w:id="44" w:name="_Toc241972056"/>
       <w:r>
         <w:t>7.1. K</w:t>
       </w:r>
@@ -15307,7 +15374,7 @@
       <w:pPr>
         <w:pStyle w:val="u2"/>
       </w:pPr>
-      <w:bookmarkStart w:id="45" w:name="_Toc241970571"/>
+      <w:bookmarkStart w:id="45" w:name="_Toc241972057"/>
       <w:r>
         <w:t>7.2. H</w:t>
       </w:r>
@@ -15331,7 +15398,7 @@
       <w:pPr>
         <w:pStyle w:val="u2"/>
       </w:pPr>
-      <w:bookmarkStart w:id="46" w:name="_Toc241970572"/>
+      <w:bookmarkStart w:id="46" w:name="_Toc241972058"/>
       <w:r>
         <w:t>7.3. Hư</w:t>
       </w:r>
@@ -15369,7 +15436,7 @@
       <w:pPr>
         <w:pStyle w:val="u1"/>
       </w:pPr>
-      <w:bookmarkStart w:id="47" w:name="_Toc241970573"/>
+      <w:bookmarkStart w:id="47" w:name="_Toc241972059"/>
       <w:r>
         <w:lastRenderedPageBreak/>
         <w:t>TÀI LI</w:t>
@@ -15480,7 +15547,7 @@
       <w:pPr>
         <w:pStyle w:val="u1"/>
       </w:pPr>
-      <w:bookmarkStart w:id="48" w:name="_Toc241970574"/>
+      <w:bookmarkStart w:id="48" w:name="_Toc241972060"/>
       <w:r>
         <w:lastRenderedPageBreak/>
         <w:t>PH</w:t>
@@ -16508,7 +16575,7 @@
       <w:pPr>
         <w:pStyle w:val="u1"/>
       </w:pPr>
-      <w:bookmarkStart w:id="49" w:name="_Toc241970575"/>
+      <w:bookmarkStart w:id="49" w:name="_Toc241972061"/>
       <w:r>
         <w:lastRenderedPageBreak/>
         <w:t>PH</w:t>
@@ -17181,7 +17248,7 @@
       <w:pPr>
         <w:pStyle w:val="u1"/>
       </w:pPr>
-      <w:bookmarkStart w:id="50" w:name="_Toc241970576"/>
+      <w:bookmarkStart w:id="50" w:name="_Toc241972062"/>
       <w:r>
         <w:lastRenderedPageBreak/>
         <w:t>PH</w:t>
@@ -17911,7 +17978,7 @@
       <w:pPr>
         <w:pStyle w:val="u1"/>
       </w:pPr>
-      <w:bookmarkStart w:id="51" w:name="_Toc241970577"/>
+      <w:bookmarkStart w:id="51" w:name="_Toc241972063"/>
       <w:r>
         <w:lastRenderedPageBreak/>
         <w:t>PH</w:t>
@@ -18580,7 +18647,7 @@
       <w:pPr>
         <w:pStyle w:val="u1"/>
       </w:pPr>
-      <w:bookmarkStart w:id="52" w:name="_Toc241970578"/>
+      <w:bookmarkStart w:id="52" w:name="_Toc241972064"/>
       <w:r>
         <w:lastRenderedPageBreak/>
         <w:t>PH</w:t>
@@ -18609,7 +18676,7 @@
       <w:pPr>
         <w:pStyle w:val="u2"/>
       </w:pPr>
-      <w:bookmarkStart w:id="53" w:name="_Toc241970579"/>
+      <w:bookmarkStart w:id="53" w:name="_Toc241972065"/>
       <w:r>
         <w:t>E.1. Chu</w:t>
       </w:r>
@@ -18633,7 +18700,7 @@
       <w:pPr>
         <w:pStyle w:val="u2"/>
       </w:pPr>
-      <w:bookmarkStart w:id="54" w:name="_Toc241970580"/>
+      <w:bookmarkStart w:id="54" w:name="_Toc241972066"/>
       <w:r>
         <w:t>E.2. Database</w:t>
       </w:r>
@@ -18648,7 +18715,7 @@
       <w:pPr>
         <w:pStyle w:val="u2"/>
       </w:pPr>
-      <w:bookmarkStart w:id="55" w:name="_Toc241970581"/>
+      <w:bookmarkStart w:id="55" w:name="_Toc241972067"/>
       <w:r>
         <w:t>E.3. Core quality</w:t>
       </w:r>
@@ -18663,7 +18730,7 @@
       <w:pPr>
         <w:pStyle w:val="u2"/>
       </w:pPr>
-      <w:bookmarkStart w:id="56" w:name="_Toc241970582"/>
+      <w:bookmarkStart w:id="56" w:name="_Toc241972068"/>
       <w:r>
         <w:t>E.4. Quality evidence</w:t>
       </w:r>
@@ -18678,7 +18745,7 @@
       <w:pPr>
         <w:pStyle w:val="u2"/>
       </w:pPr>
-      <w:bookmarkStart w:id="57" w:name="_Toc241970583"/>
+      <w:bookmarkStart w:id="57" w:name="_Toc241972069"/>
       <w:r>
         <w:t>E.5. Khi có l</w:t>
       </w:r>
@@ -18696,7 +18763,7 @@
       </w:r>
     </w:p>
     <w:sectPr>
-      <w:footerReference w:type="default" r:id="rId14"/>
+      <w:footerReference w:type="default" r:id="rId15"/>
       <w:pgSz w:w="12240" w:h="15840"/>
       <w:pgMar w:top="1037" w:right="1037" w:bottom="1008" w:left="1656" w:header="720" w:footer="720" w:gutter="0"/>
       <w:cols w:space="720"/>
@@ -18964,31 +19031,31 @@
       </w:rPr>
     </w:lvl>
   </w:abstractNum>
-  <w:num w:numId="1" w16cid:durableId="854921778">
+  <w:num w:numId="1" w16cid:durableId="1710448682">
     <w:abstractNumId w:val="8"/>
   </w:num>
-  <w:num w:numId="2" w16cid:durableId="1284775791">
+  <w:num w:numId="2" w16cid:durableId="341200327">
     <w:abstractNumId w:val="6"/>
   </w:num>
-  <w:num w:numId="3" w16cid:durableId="1792284306">
+  <w:num w:numId="3" w16cid:durableId="1851337483">
     <w:abstractNumId w:val="5"/>
   </w:num>
-  <w:num w:numId="4" w16cid:durableId="829369862">
+  <w:num w:numId="4" w16cid:durableId="921066501">
     <w:abstractNumId w:val="4"/>
   </w:num>
-  <w:num w:numId="5" w16cid:durableId="551042600">
+  <w:num w:numId="5" w16cid:durableId="1560558350">
     <w:abstractNumId w:val="7"/>
   </w:num>
-  <w:num w:numId="6" w16cid:durableId="1168518346">
+  <w:num w:numId="6" w16cid:durableId="1976133296">
     <w:abstractNumId w:val="3"/>
   </w:num>
-  <w:num w:numId="7" w16cid:durableId="1517621763">
+  <w:num w:numId="7" w16cid:durableId="890001637">
     <w:abstractNumId w:val="2"/>
   </w:num>
-  <w:num w:numId="8" w16cid:durableId="1185441564">
+  <w:num w:numId="8" w16cid:durableId="1333992314">
     <w:abstractNumId w:val="1"/>
   </w:num>
-  <w:num w:numId="9" w16cid:durableId="888537300">
+  <w:num w:numId="9" w16cid:durableId="1975523955">
     <w:abstractNumId w:val="0"/>
   </w:num>
 </w:numbering>
@@ -30383,7 +30450,7 @@
     <w:autoRedefine/>
     <w:uiPriority w:val="39"/>
     <w:unhideWhenUsed/>
-    <w:rsid w:val="0093666B"/>
+    <w:rsid w:val="002058BB"/>
     <w:pPr>
       <w:spacing w:after="100"/>
     </w:pPr>
@@ -30395,7 +30462,7 @@
     <w:autoRedefine/>
     <w:uiPriority w:val="39"/>
     <w:unhideWhenUsed/>
-    <w:rsid w:val="0093666B"/>
+    <w:rsid w:val="002058BB"/>
     <w:pPr>
       <w:spacing w:after="100"/>
       <w:ind w:left="260"/>
@@ -30406,7 +30473,7 @@
     <w:basedOn w:val="Phngmcinhcuaoanvn"/>
     <w:uiPriority w:val="99"/>
     <w:unhideWhenUsed/>
-    <w:rsid w:val="0093666B"/>
+    <w:rsid w:val="002058BB"/>
     <w:rPr>
       <w:color w:val="0000FF" w:themeColor="hyperlink"/>
       <w:u w:val="single"/>

</xml_diff>

<commit_message>
docs: refine report diagrams and evidence appendix
</commit_message>
<xml_diff>
--- a/output/docx/StudySpace-BaoCao-DanhGia-KiemDinh.docx
+++ b/output/docx/StudySpace-BaoCao-DanhGia-KiemDinh.docx
@@ -166,7 +166,7 @@
       <w:pPr>
         <w:pStyle w:val="u1"/>
       </w:pPr>
-      <w:bookmarkStart w:id="0" w:name="_Toc242000189"/>
+      <w:bookmarkStart w:id="0" w:name="_Toc242000958"/>
       <w:r>
         <w:lastRenderedPageBreak/>
         <w:t>L</w:t>
@@ -199,7 +199,7 @@
       <w:pPr>
         <w:pStyle w:val="u1"/>
       </w:pPr>
-      <w:bookmarkStart w:id="1" w:name="_Toc242000190"/>
+      <w:bookmarkStart w:id="1" w:name="_Toc242000959"/>
       <w:r>
         <w:lastRenderedPageBreak/>
         <w:t>TÓM T</w:t>
@@ -250,7 +250,7 @@
       <w:pPr>
         <w:pStyle w:val="u1"/>
       </w:pPr>
-      <w:bookmarkStart w:id="2" w:name="_Toc242000191"/>
+      <w:bookmarkStart w:id="2" w:name="_Toc242000960"/>
       <w:r>
         <w:lastRenderedPageBreak/>
         <w:t>M</w:t>
@@ -295,7 +295,7 @@
       <w:r>
         <w:fldChar w:fldCharType="separate"/>
       </w:r>
-      <w:hyperlink w:anchor="_Toc242000189" w:history="1">
+      <w:hyperlink w:anchor="_Toc242000958" w:history="1">
         <w:r>
           <w:rPr>
             <w:rStyle w:val="Siuktni"/>
@@ -322,7 +322,7 @@
             <w:noProof/>
             <w:webHidden/>
           </w:rPr>
-          <w:instrText xml:space="preserve"> PAGEREF _Toc242000189 \h </w:instrText>
+          <w:instrText xml:space="preserve"> PAGEREF _Toc242000958 \h </w:instrText>
         </w:r>
         <w:r>
           <w:rPr>
@@ -370,7 +370,7 @@
           <w14:ligatures w14:val="standardContextual"/>
         </w:rPr>
       </w:pPr>
-      <w:hyperlink w:anchor="_Toc242000190" w:history="1">
+      <w:hyperlink w:anchor="_Toc242000959" w:history="1">
         <w:r>
           <w:rPr>
             <w:rStyle w:val="Siuktni"/>
@@ -397,7 +397,7 @@
             <w:noProof/>
             <w:webHidden/>
           </w:rPr>
-          <w:instrText xml:space="preserve"> PAGEREF _Toc242000190 \h </w:instrText>
+          <w:instrText xml:space="preserve"> PAGEREF _Toc242000959 \h </w:instrText>
         </w:r>
         <w:r>
           <w:rPr>
@@ -445,7 +445,7 @@
           <w14:ligatures w14:val="standardContextual"/>
         </w:rPr>
       </w:pPr>
-      <w:hyperlink w:anchor="_Toc242000191" w:history="1">
+      <w:hyperlink w:anchor="_Toc242000960" w:history="1">
         <w:r>
           <w:rPr>
             <w:rStyle w:val="Siuktni"/>
@@ -472,7 +472,7 @@
             <w:noProof/>
             <w:webHidden/>
           </w:rPr>
-          <w:instrText xml:space="preserve"> PAGEREF _Toc242000191 \h </w:instrText>
+          <w:instrText xml:space="preserve"> PAGEREF _Toc242000960 \h </w:instrText>
         </w:r>
         <w:r>
           <w:rPr>
@@ -520,7 +520,7 @@
           <w14:ligatures w14:val="standardContextual"/>
         </w:rPr>
       </w:pPr>
-      <w:hyperlink w:anchor="_Toc242000192" w:history="1">
+      <w:hyperlink w:anchor="_Toc242000961" w:history="1">
         <w:r>
           <w:rPr>
             <w:rStyle w:val="Siuktni"/>
@@ -547,7 +547,7 @@
             <w:noProof/>
             <w:webHidden/>
           </w:rPr>
-          <w:instrText xml:space="preserve"> PAGEREF _Toc242000192 \h </w:instrText>
+          <w:instrText xml:space="preserve"> PAGEREF _Toc242000961 \h </w:instrText>
         </w:r>
         <w:r>
           <w:rPr>
@@ -595,7 +595,7 @@
           <w14:ligatures w14:val="standardContextual"/>
         </w:rPr>
       </w:pPr>
-      <w:hyperlink w:anchor="_Toc242000193" w:history="1">
+      <w:hyperlink w:anchor="_Toc242000962" w:history="1">
         <w:r>
           <w:rPr>
             <w:rStyle w:val="Siuktni"/>
@@ -622,7 +622,7 @@
             <w:noProof/>
             <w:webHidden/>
           </w:rPr>
-          <w:instrText xml:space="preserve"> PAGEREF _Toc242000193 \h </w:instrText>
+          <w:instrText xml:space="preserve"> PAGEREF _Toc242000962 \h </w:instrText>
         </w:r>
         <w:r>
           <w:rPr>
@@ -670,7 +670,7 @@
           <w14:ligatures w14:val="standardContextual"/>
         </w:rPr>
       </w:pPr>
-      <w:hyperlink w:anchor="_Toc242000194" w:history="1">
+      <w:hyperlink w:anchor="_Toc242000963" w:history="1">
         <w:r>
           <w:rPr>
             <w:rStyle w:val="Siuktni"/>
@@ -697,7 +697,7 @@
             <w:noProof/>
             <w:webHidden/>
           </w:rPr>
-          <w:instrText xml:space="preserve"> PAGEREF _Toc242000194 \h </w:instrText>
+          <w:instrText xml:space="preserve"> PAGEREF _Toc242000963 \h </w:instrText>
         </w:r>
         <w:r>
           <w:rPr>
@@ -745,7 +745,7 @@
           <w14:ligatures w14:val="standardContextual"/>
         </w:rPr>
       </w:pPr>
-      <w:hyperlink w:anchor="_Toc242000195" w:history="1">
+      <w:hyperlink w:anchor="_Toc242000964" w:history="1">
         <w:r>
           <w:rPr>
             <w:rStyle w:val="Siuktni"/>
@@ -772,7 +772,7 @@
             <w:noProof/>
             <w:webHidden/>
           </w:rPr>
-          <w:instrText xml:space="preserve"> PAGEREF _Toc242000195 \h </w:instrText>
+          <w:instrText xml:space="preserve"> PAGEREF _Toc242000964 \h </w:instrText>
         </w:r>
         <w:r>
           <w:rPr>
@@ -820,7 +820,7 @@
           <w14:ligatures w14:val="standardContextual"/>
         </w:rPr>
       </w:pPr>
-      <w:hyperlink w:anchor="_Toc242000196" w:history="1">
+      <w:hyperlink w:anchor="_Toc242000965" w:history="1">
         <w:r>
           <w:rPr>
             <w:rStyle w:val="Siuktni"/>
@@ -847,7 +847,7 @@
             <w:noProof/>
             <w:webHidden/>
           </w:rPr>
-          <w:instrText xml:space="preserve"> PAGEREF _Toc242000196 \h </w:instrText>
+          <w:instrText xml:space="preserve"> PAGEREF _Toc242000965 \h </w:instrText>
         </w:r>
         <w:r>
           <w:rPr>
@@ -895,7 +895,7 @@
           <w14:ligatures w14:val="standardContextual"/>
         </w:rPr>
       </w:pPr>
-      <w:hyperlink w:anchor="_Toc242000197" w:history="1">
+      <w:hyperlink w:anchor="_Toc242000966" w:history="1">
         <w:r>
           <w:rPr>
             <w:rStyle w:val="Siuktni"/>
@@ -922,7 +922,7 @@
             <w:noProof/>
             <w:webHidden/>
           </w:rPr>
-          <w:instrText xml:space="preserve"> PAGEREF _Toc242000197 \h </w:instrText>
+          <w:instrText xml:space="preserve"> PAGEREF _Toc242000966 \h </w:instrText>
         </w:r>
         <w:r>
           <w:rPr>
@@ -970,7 +970,7 @@
           <w14:ligatures w14:val="standardContextual"/>
         </w:rPr>
       </w:pPr>
-      <w:hyperlink w:anchor="_Toc242000198" w:history="1">
+      <w:hyperlink w:anchor="_Toc242000967" w:history="1">
         <w:r>
           <w:rPr>
             <w:rStyle w:val="Siuktni"/>
@@ -997,7 +997,7 @@
             <w:noProof/>
             <w:webHidden/>
           </w:rPr>
-          <w:instrText xml:space="preserve"> PAGEREF _Toc242000198 \h </w:instrText>
+          <w:instrText xml:space="preserve"> PAGEREF _Toc242000967 \h </w:instrText>
         </w:r>
         <w:r>
           <w:rPr>
@@ -1045,7 +1045,7 @@
           <w14:ligatures w14:val="standardContextual"/>
         </w:rPr>
       </w:pPr>
-      <w:hyperlink w:anchor="_Toc242000199" w:history="1">
+      <w:hyperlink w:anchor="_Toc242000968" w:history="1">
         <w:r>
           <w:rPr>
             <w:rStyle w:val="Siuktni"/>
@@ -1072,7 +1072,7 @@
             <w:noProof/>
             <w:webHidden/>
           </w:rPr>
-          <w:instrText xml:space="preserve"> PAGEREF _Toc242000199 \h </w:instrText>
+          <w:instrText xml:space="preserve"> PAGEREF _Toc242000968 \h </w:instrText>
         </w:r>
         <w:r>
           <w:rPr>
@@ -1120,7 +1120,7 @@
           <w14:ligatures w14:val="standardContextual"/>
         </w:rPr>
       </w:pPr>
-      <w:hyperlink w:anchor="_Toc242000200" w:history="1">
+      <w:hyperlink w:anchor="_Toc242000969" w:history="1">
         <w:r>
           <w:rPr>
             <w:rStyle w:val="Siuktni"/>
@@ -1147,7 +1147,7 @@
             <w:noProof/>
             <w:webHidden/>
           </w:rPr>
-          <w:instrText xml:space="preserve"> PAGEREF _Toc242000200 \h </w:instrText>
+          <w:instrText xml:space="preserve"> PAGEREF _Toc242000969 \h </w:instrText>
         </w:r>
         <w:r>
           <w:rPr>
@@ -1195,7 +1195,7 @@
           <w14:ligatures w14:val="standardContextual"/>
         </w:rPr>
       </w:pPr>
-      <w:hyperlink w:anchor="_Toc242000201" w:history="1">
+      <w:hyperlink w:anchor="_Toc242000970" w:history="1">
         <w:r>
           <w:rPr>
             <w:rStyle w:val="Siuktni"/>
@@ -1222,7 +1222,7 @@
             <w:noProof/>
             <w:webHidden/>
           </w:rPr>
-          <w:instrText xml:space="preserve"> PAGEREF _Toc242000201 \h </w:instrText>
+          <w:instrText xml:space="preserve"> PAGEREF _Toc242000970 \h </w:instrText>
         </w:r>
         <w:r>
           <w:rPr>
@@ -1270,7 +1270,7 @@
           <w14:ligatures w14:val="standardContextual"/>
         </w:rPr>
       </w:pPr>
-      <w:hyperlink w:anchor="_Toc242000202" w:history="1">
+      <w:hyperlink w:anchor="_Toc242000971" w:history="1">
         <w:r>
           <w:rPr>
             <w:rStyle w:val="Siuktni"/>
@@ -1297,7 +1297,7 @@
             <w:noProof/>
             <w:webHidden/>
           </w:rPr>
-          <w:instrText xml:space="preserve"> PAGEREF _Toc242000202 \h </w:instrText>
+          <w:instrText xml:space="preserve"> PAGEREF _Toc242000971 \h </w:instrText>
         </w:r>
         <w:r>
           <w:rPr>
@@ -1345,7 +1345,7 @@
           <w14:ligatures w14:val="standardContextual"/>
         </w:rPr>
       </w:pPr>
-      <w:hyperlink w:anchor="_Toc242000203" w:history="1">
+      <w:hyperlink w:anchor="_Toc242000972" w:history="1">
         <w:r>
           <w:rPr>
             <w:rStyle w:val="Siuktni"/>
@@ -1372,7 +1372,7 @@
             <w:noProof/>
             <w:webHidden/>
           </w:rPr>
-          <w:instrText xml:space="preserve"> PAGEREF _Toc242000203 \h </w:instrText>
+          <w:instrText xml:space="preserve"> PAGEREF _Toc242000972 \h </w:instrText>
         </w:r>
         <w:r>
           <w:rPr>
@@ -1420,7 +1420,7 @@
           <w14:ligatures w14:val="standardContextual"/>
         </w:rPr>
       </w:pPr>
-      <w:hyperlink w:anchor="_Toc242000204" w:history="1">
+      <w:hyperlink w:anchor="_Toc242000973" w:history="1">
         <w:r>
           <w:rPr>
             <w:rStyle w:val="Siuktni"/>
@@ -1447,7 +1447,7 @@
             <w:noProof/>
             <w:webHidden/>
           </w:rPr>
-          <w:instrText xml:space="preserve"> PAGEREF _Toc242000204 \h </w:instrText>
+          <w:instrText xml:space="preserve"> PAGEREF _Toc242000973 \h </w:instrText>
         </w:r>
         <w:r>
           <w:rPr>
@@ -1495,7 +1495,7 @@
           <w14:ligatures w14:val="standardContextual"/>
         </w:rPr>
       </w:pPr>
-      <w:hyperlink w:anchor="_Toc242000205" w:history="1">
+      <w:hyperlink w:anchor="_Toc242000974" w:history="1">
         <w:r>
           <w:rPr>
             <w:rStyle w:val="Siuktni"/>
@@ -1522,7 +1522,7 @@
             <w:noProof/>
             <w:webHidden/>
           </w:rPr>
-          <w:instrText xml:space="preserve"> PAGEREF _Toc242000205 \h </w:instrText>
+          <w:instrText xml:space="preserve"> PAGEREF _Toc242000974 \h </w:instrText>
         </w:r>
         <w:r>
           <w:rPr>
@@ -1570,7 +1570,7 @@
           <w14:ligatures w14:val="standardContextual"/>
         </w:rPr>
       </w:pPr>
-      <w:hyperlink w:anchor="_Toc242000206" w:history="1">
+      <w:hyperlink w:anchor="_Toc242000975" w:history="1">
         <w:r>
           <w:rPr>
             <w:rStyle w:val="Siuktni"/>
@@ -1597,7 +1597,7 @@
             <w:noProof/>
             <w:webHidden/>
           </w:rPr>
-          <w:instrText xml:space="preserve"> PAGEREF _Toc242000206 \h </w:instrText>
+          <w:instrText xml:space="preserve"> PAGEREF _Toc242000975 \h </w:instrText>
         </w:r>
         <w:r>
           <w:rPr>
@@ -1645,7 +1645,7 @@
           <w14:ligatures w14:val="standardContextual"/>
         </w:rPr>
       </w:pPr>
-      <w:hyperlink w:anchor="_Toc242000207" w:history="1">
+      <w:hyperlink w:anchor="_Toc242000976" w:history="1">
         <w:r>
           <w:rPr>
             <w:rStyle w:val="Siuktni"/>
@@ -1672,7 +1672,7 @@
             <w:noProof/>
             <w:webHidden/>
           </w:rPr>
-          <w:instrText xml:space="preserve"> PAGEREF _Toc242000207 \h </w:instrText>
+          <w:instrText xml:space="preserve"> PAGEREF _Toc242000976 \h </w:instrText>
         </w:r>
         <w:r>
           <w:rPr>
@@ -1720,7 +1720,7 @@
           <w14:ligatures w14:val="standardContextual"/>
         </w:rPr>
       </w:pPr>
-      <w:hyperlink w:anchor="_Toc242000208" w:history="1">
+      <w:hyperlink w:anchor="_Toc242000977" w:history="1">
         <w:r>
           <w:rPr>
             <w:rStyle w:val="Siuktni"/>
@@ -1747,7 +1747,7 @@
             <w:noProof/>
             <w:webHidden/>
           </w:rPr>
-          <w:instrText xml:space="preserve"> PAGEREF _Toc242000208 \h </w:instrText>
+          <w:instrText xml:space="preserve"> PAGEREF _Toc242000977 \h </w:instrText>
         </w:r>
         <w:r>
           <w:rPr>
@@ -1795,7 +1795,7 @@
           <w14:ligatures w14:val="standardContextual"/>
         </w:rPr>
       </w:pPr>
-      <w:hyperlink w:anchor="_Toc242000209" w:history="1">
+      <w:hyperlink w:anchor="_Toc242000978" w:history="1">
         <w:r>
           <w:rPr>
             <w:rStyle w:val="Siuktni"/>
@@ -1822,7 +1822,7 @@
             <w:noProof/>
             <w:webHidden/>
           </w:rPr>
-          <w:instrText xml:space="preserve"> PAGEREF _Toc242000209 \h </w:instrText>
+          <w:instrText xml:space="preserve"> PAGEREF _Toc242000978 \h </w:instrText>
         </w:r>
         <w:r>
           <w:rPr>
@@ -1842,7 +1842,7 @@
             <w:noProof/>
             <w:webHidden/>
           </w:rPr>
-          <w:t>16</w:t>
+          <w:t>17</w:t>
         </w:r>
         <w:r>
           <w:rPr>
@@ -1870,7 +1870,7 @@
           <w14:ligatures w14:val="standardContextual"/>
         </w:rPr>
       </w:pPr>
-      <w:hyperlink w:anchor="_Toc242000210" w:history="1">
+      <w:hyperlink w:anchor="_Toc242000979" w:history="1">
         <w:r>
           <w:rPr>
             <w:rStyle w:val="Siuktni"/>
@@ -1897,7 +1897,7 @@
             <w:noProof/>
             <w:webHidden/>
           </w:rPr>
-          <w:instrText xml:space="preserve"> PAGEREF _Toc242000210 \h </w:instrText>
+          <w:instrText xml:space="preserve"> PAGEREF _Toc242000979 \h </w:instrText>
         </w:r>
         <w:r>
           <w:rPr>
@@ -1945,7 +1945,7 @@
           <w14:ligatures w14:val="standardContextual"/>
         </w:rPr>
       </w:pPr>
-      <w:hyperlink w:anchor="_Toc242000211" w:history="1">
+      <w:hyperlink w:anchor="_Toc242000980" w:history="1">
         <w:r>
           <w:rPr>
             <w:rStyle w:val="Siuktni"/>
@@ -1972,7 +1972,7 @@
             <w:noProof/>
             <w:webHidden/>
           </w:rPr>
-          <w:instrText xml:space="preserve"> PAGEREF _Toc242000211 \h </w:instrText>
+          <w:instrText xml:space="preserve"> PAGEREF _Toc242000980 \h </w:instrText>
         </w:r>
         <w:r>
           <w:rPr>
@@ -2020,7 +2020,7 @@
           <w14:ligatures w14:val="standardContextual"/>
         </w:rPr>
       </w:pPr>
-      <w:hyperlink w:anchor="_Toc242000212" w:history="1">
+      <w:hyperlink w:anchor="_Toc242000981" w:history="1">
         <w:r>
           <w:rPr>
             <w:rStyle w:val="Siuktni"/>
@@ -2047,7 +2047,7 @@
             <w:noProof/>
             <w:webHidden/>
           </w:rPr>
-          <w:instrText xml:space="preserve"> PAGEREF _Toc242000212 \h </w:instrText>
+          <w:instrText xml:space="preserve"> PAGEREF _Toc242000981 \h </w:instrText>
         </w:r>
         <w:r>
           <w:rPr>
@@ -2095,7 +2095,7 @@
           <w14:ligatures w14:val="standardContextual"/>
         </w:rPr>
       </w:pPr>
-      <w:hyperlink w:anchor="_Toc242000213" w:history="1">
+      <w:hyperlink w:anchor="_Toc242000982" w:history="1">
         <w:r>
           <w:rPr>
             <w:rStyle w:val="Siuktni"/>
@@ -2122,7 +2122,7 @@
             <w:noProof/>
             <w:webHidden/>
           </w:rPr>
-          <w:instrText xml:space="preserve"> PAGEREF _Toc242000213 \h </w:instrText>
+          <w:instrText xml:space="preserve"> PAGEREF _Toc242000982 \h </w:instrText>
         </w:r>
         <w:r>
           <w:rPr>
@@ -2170,7 +2170,7 @@
           <w14:ligatures w14:val="standardContextual"/>
         </w:rPr>
       </w:pPr>
-      <w:hyperlink w:anchor="_Toc242000214" w:history="1">
+      <w:hyperlink w:anchor="_Toc242000983" w:history="1">
         <w:r>
           <w:rPr>
             <w:rStyle w:val="Siuktni"/>
@@ -2197,7 +2197,7 @@
             <w:noProof/>
             <w:webHidden/>
           </w:rPr>
-          <w:instrText xml:space="preserve"> PAGEREF _Toc242000214 \h </w:instrText>
+          <w:instrText xml:space="preserve"> PAGEREF _Toc242000983 \h </w:instrText>
         </w:r>
         <w:r>
           <w:rPr>
@@ -2245,7 +2245,7 @@
           <w14:ligatures w14:val="standardContextual"/>
         </w:rPr>
       </w:pPr>
-      <w:hyperlink w:anchor="_Toc242000215" w:history="1">
+      <w:hyperlink w:anchor="_Toc242000984" w:history="1">
         <w:r>
           <w:rPr>
             <w:rStyle w:val="Siuktni"/>
@@ -2272,7 +2272,7 @@
             <w:noProof/>
             <w:webHidden/>
           </w:rPr>
-          <w:instrText xml:space="preserve"> PAGEREF _Toc242000215 \h </w:instrText>
+          <w:instrText xml:space="preserve"> PAGEREF _Toc242000984 \h </w:instrText>
         </w:r>
         <w:r>
           <w:rPr>
@@ -2320,7 +2320,7 @@
           <w14:ligatures w14:val="standardContextual"/>
         </w:rPr>
       </w:pPr>
-      <w:hyperlink w:anchor="_Toc242000216" w:history="1">
+      <w:hyperlink w:anchor="_Toc242000985" w:history="1">
         <w:r>
           <w:rPr>
             <w:rStyle w:val="Siuktni"/>
@@ -2347,7 +2347,7 @@
             <w:noProof/>
             <w:webHidden/>
           </w:rPr>
-          <w:instrText xml:space="preserve"> PAGEREF _Toc242000216 \h </w:instrText>
+          <w:instrText xml:space="preserve"> PAGEREF _Toc242000985 \h </w:instrText>
         </w:r>
         <w:r>
           <w:rPr>
@@ -2395,7 +2395,7 @@
           <w14:ligatures w14:val="standardContextual"/>
         </w:rPr>
       </w:pPr>
-      <w:hyperlink w:anchor="_Toc242000217" w:history="1">
+      <w:hyperlink w:anchor="_Toc242000986" w:history="1">
         <w:r>
           <w:rPr>
             <w:rStyle w:val="Siuktni"/>
@@ -2422,7 +2422,7 @@
             <w:noProof/>
             <w:webHidden/>
           </w:rPr>
-          <w:instrText xml:space="preserve"> PAGEREF _Toc242000217 \h </w:instrText>
+          <w:instrText xml:space="preserve"> PAGEREF _Toc242000986 \h </w:instrText>
         </w:r>
         <w:r>
           <w:rPr>
@@ -2470,7 +2470,7 @@
           <w14:ligatures w14:val="standardContextual"/>
         </w:rPr>
       </w:pPr>
-      <w:hyperlink w:anchor="_Toc242000218" w:history="1">
+      <w:hyperlink w:anchor="_Toc242000987" w:history="1">
         <w:r>
           <w:rPr>
             <w:rStyle w:val="Siuktni"/>
@@ -2497,7 +2497,7 @@
             <w:noProof/>
             <w:webHidden/>
           </w:rPr>
-          <w:instrText xml:space="preserve"> PAGEREF _Toc242000218 \h </w:instrText>
+          <w:instrText xml:space="preserve"> PAGEREF _Toc242000987 \h </w:instrText>
         </w:r>
         <w:r>
           <w:rPr>
@@ -2545,7 +2545,7 @@
           <w14:ligatures w14:val="standardContextual"/>
         </w:rPr>
       </w:pPr>
-      <w:hyperlink w:anchor="_Toc242000219" w:history="1">
+      <w:hyperlink w:anchor="_Toc242000988" w:history="1">
         <w:r>
           <w:rPr>
             <w:rStyle w:val="Siuktni"/>
@@ -2572,7 +2572,7 @@
             <w:noProof/>
             <w:webHidden/>
           </w:rPr>
-          <w:instrText xml:space="preserve"> PAGEREF _Toc242000219 \h </w:instrText>
+          <w:instrText xml:space="preserve"> PAGEREF _Toc242000988 \h </w:instrText>
         </w:r>
         <w:r>
           <w:rPr>
@@ -2620,7 +2620,7 @@
           <w14:ligatures w14:val="standardContextual"/>
         </w:rPr>
       </w:pPr>
-      <w:hyperlink w:anchor="_Toc242000220" w:history="1">
+      <w:hyperlink w:anchor="_Toc242000989" w:history="1">
         <w:r>
           <w:rPr>
             <w:rStyle w:val="Siuktni"/>
@@ -2647,7 +2647,7 @@
             <w:noProof/>
             <w:webHidden/>
           </w:rPr>
-          <w:instrText xml:space="preserve"> PAGEREF _Toc242000220 \h </w:instrText>
+          <w:instrText xml:space="preserve"> PAGEREF _Toc242000989 \h </w:instrText>
         </w:r>
         <w:r>
           <w:rPr>
@@ -2695,7 +2695,7 @@
           <w14:ligatures w14:val="standardContextual"/>
         </w:rPr>
       </w:pPr>
-      <w:hyperlink w:anchor="_Toc242000221" w:history="1">
+      <w:hyperlink w:anchor="_Toc242000990" w:history="1">
         <w:r>
           <w:rPr>
             <w:rStyle w:val="Siuktni"/>
@@ -2722,7 +2722,7 @@
             <w:noProof/>
             <w:webHidden/>
           </w:rPr>
-          <w:instrText xml:space="preserve"> PAGEREF _Toc242000221 \h </w:instrText>
+          <w:instrText xml:space="preserve"> PAGEREF _Toc242000990 \h </w:instrText>
         </w:r>
         <w:r>
           <w:rPr>
@@ -2770,7 +2770,7 @@
           <w14:ligatures w14:val="standardContextual"/>
         </w:rPr>
       </w:pPr>
-      <w:hyperlink w:anchor="_Toc242000222" w:history="1">
+      <w:hyperlink w:anchor="_Toc242000991" w:history="1">
         <w:r>
           <w:rPr>
             <w:rStyle w:val="Siuktni"/>
@@ -2797,7 +2797,7 @@
             <w:noProof/>
             <w:webHidden/>
           </w:rPr>
-          <w:instrText xml:space="preserve"> PAGEREF _Toc242000222 \h </w:instrText>
+          <w:instrText xml:space="preserve"> PAGEREF _Toc242000991 \h </w:instrText>
         </w:r>
         <w:r>
           <w:rPr>
@@ -2845,7 +2845,7 @@
           <w14:ligatures w14:val="standardContextual"/>
         </w:rPr>
       </w:pPr>
-      <w:hyperlink w:anchor="_Toc242000223" w:history="1">
+      <w:hyperlink w:anchor="_Toc242000992" w:history="1">
         <w:r>
           <w:rPr>
             <w:rStyle w:val="Siuktni"/>
@@ -2872,7 +2872,7 @@
             <w:noProof/>
             <w:webHidden/>
           </w:rPr>
-          <w:instrText xml:space="preserve"> PAGEREF _Toc242000223 \h </w:instrText>
+          <w:instrText xml:space="preserve"> PAGEREF _Toc242000992 \h </w:instrText>
         </w:r>
         <w:r>
           <w:rPr>
@@ -2920,7 +2920,7 @@
           <w14:ligatures w14:val="standardContextual"/>
         </w:rPr>
       </w:pPr>
-      <w:hyperlink w:anchor="_Toc242000224" w:history="1">
+      <w:hyperlink w:anchor="_Toc242000993" w:history="1">
         <w:r>
           <w:rPr>
             <w:rStyle w:val="Siuktni"/>
@@ -2947,7 +2947,7 @@
             <w:noProof/>
             <w:webHidden/>
           </w:rPr>
-          <w:instrText xml:space="preserve"> PAGEREF _Toc242000224 \h </w:instrText>
+          <w:instrText xml:space="preserve"> PAGEREF _Toc242000993 \h </w:instrText>
         </w:r>
         <w:r>
           <w:rPr>
@@ -2995,7 +2995,7 @@
           <w14:ligatures w14:val="standardContextual"/>
         </w:rPr>
       </w:pPr>
-      <w:hyperlink w:anchor="_Toc242000225" w:history="1">
+      <w:hyperlink w:anchor="_Toc242000994" w:history="1">
         <w:r>
           <w:rPr>
             <w:rStyle w:val="Siuktni"/>
@@ -3022,7 +3022,7 @@
             <w:noProof/>
             <w:webHidden/>
           </w:rPr>
-          <w:instrText xml:space="preserve"> PAGEREF _Toc242000225 \h </w:instrText>
+          <w:instrText xml:space="preserve"> PAGEREF _Toc242000994 \h </w:instrText>
         </w:r>
         <w:r>
           <w:rPr>
@@ -3070,7 +3070,7 @@
           <w14:ligatures w14:val="standardContextual"/>
         </w:rPr>
       </w:pPr>
-      <w:hyperlink w:anchor="_Toc242000226" w:history="1">
+      <w:hyperlink w:anchor="_Toc242000995" w:history="1">
         <w:r>
           <w:rPr>
             <w:rStyle w:val="Siuktni"/>
@@ -3097,7 +3097,7 @@
             <w:noProof/>
             <w:webHidden/>
           </w:rPr>
-          <w:instrText xml:space="preserve"> PAGEREF _Toc242000226 \h </w:instrText>
+          <w:instrText xml:space="preserve"> PAGEREF _Toc242000995 \h </w:instrText>
         </w:r>
         <w:r>
           <w:rPr>
@@ -3145,7 +3145,7 @@
           <w14:ligatures w14:val="standardContextual"/>
         </w:rPr>
       </w:pPr>
-      <w:hyperlink w:anchor="_Toc242000227" w:history="1">
+      <w:hyperlink w:anchor="_Toc242000996" w:history="1">
         <w:r>
           <w:rPr>
             <w:rStyle w:val="Siuktni"/>
@@ -3172,7 +3172,7 @@
             <w:noProof/>
             <w:webHidden/>
           </w:rPr>
-          <w:instrText xml:space="preserve"> PAGEREF _Toc242000227 \h </w:instrText>
+          <w:instrText xml:space="preserve"> PAGEREF _Toc242000996 \h </w:instrText>
         </w:r>
         <w:r>
           <w:rPr>
@@ -3220,7 +3220,7 @@
           <w14:ligatures w14:val="standardContextual"/>
         </w:rPr>
       </w:pPr>
-      <w:hyperlink w:anchor="_Toc242000228" w:history="1">
+      <w:hyperlink w:anchor="_Toc242000997" w:history="1">
         <w:r>
           <w:rPr>
             <w:rStyle w:val="Siuktni"/>
@@ -3247,7 +3247,7 @@
             <w:noProof/>
             <w:webHidden/>
           </w:rPr>
-          <w:instrText xml:space="preserve"> PAGEREF _Toc242000228 \h </w:instrText>
+          <w:instrText xml:space="preserve"> PAGEREF _Toc242000997 \h </w:instrText>
         </w:r>
         <w:r>
           <w:rPr>
@@ -3295,7 +3295,7 @@
           <w14:ligatures w14:val="standardContextual"/>
         </w:rPr>
       </w:pPr>
-      <w:hyperlink w:anchor="_Toc242000229" w:history="1">
+      <w:hyperlink w:anchor="_Toc242000998" w:history="1">
         <w:r>
           <w:rPr>
             <w:rStyle w:val="Siuktni"/>
@@ -3322,7 +3322,7 @@
             <w:noProof/>
             <w:webHidden/>
           </w:rPr>
-          <w:instrText xml:space="preserve"> PAGEREF _Toc242000229 \h </w:instrText>
+          <w:instrText xml:space="preserve"> PAGEREF _Toc242000998 \h </w:instrText>
         </w:r>
         <w:r>
           <w:rPr>
@@ -3370,7 +3370,7 @@
           <w14:ligatures w14:val="standardContextual"/>
         </w:rPr>
       </w:pPr>
-      <w:hyperlink w:anchor="_Toc242000230" w:history="1">
+      <w:hyperlink w:anchor="_Toc242000999" w:history="1">
         <w:r>
           <w:rPr>
             <w:rStyle w:val="Siuktni"/>
@@ -3397,7 +3397,7 @@
             <w:noProof/>
             <w:webHidden/>
           </w:rPr>
-          <w:instrText xml:space="preserve"> PAGEREF _Toc242000230 \h </w:instrText>
+          <w:instrText xml:space="preserve"> PAGEREF _Toc242000999 \h </w:instrText>
         </w:r>
         <w:r>
           <w:rPr>
@@ -3445,7 +3445,7 @@
           <w14:ligatures w14:val="standardContextual"/>
         </w:rPr>
       </w:pPr>
-      <w:hyperlink w:anchor="_Toc242000231" w:history="1">
+      <w:hyperlink w:anchor="_Toc242001000" w:history="1">
         <w:r>
           <w:rPr>
             <w:rStyle w:val="Siuktni"/>
@@ -3472,7 +3472,7 @@
             <w:noProof/>
             <w:webHidden/>
           </w:rPr>
-          <w:instrText xml:space="preserve"> PAGEREF _Toc242000231 \h </w:instrText>
+          <w:instrText xml:space="preserve"> PAGEREF _Toc242001000 \h </w:instrText>
         </w:r>
         <w:r>
           <w:rPr>
@@ -3520,7 +3520,7 @@
           <w14:ligatures w14:val="standardContextual"/>
         </w:rPr>
       </w:pPr>
-      <w:hyperlink w:anchor="_Toc242000232" w:history="1">
+      <w:hyperlink w:anchor="_Toc242001001" w:history="1">
         <w:r>
           <w:rPr>
             <w:rStyle w:val="Siuktni"/>
@@ -3547,7 +3547,7 @@
             <w:noProof/>
             <w:webHidden/>
           </w:rPr>
-          <w:instrText xml:space="preserve"> PAGEREF _Toc242000232 \h </w:instrText>
+          <w:instrText xml:space="preserve"> PAGEREF _Toc242001001 \h </w:instrText>
         </w:r>
         <w:r>
           <w:rPr>
@@ -3595,7 +3595,7 @@
           <w14:ligatures w14:val="standardContextual"/>
         </w:rPr>
       </w:pPr>
-      <w:hyperlink w:anchor="_Toc242000233" w:history="1">
+      <w:hyperlink w:anchor="_Toc242001002" w:history="1">
         <w:r>
           <w:rPr>
             <w:rStyle w:val="Siuktni"/>
@@ -3622,7 +3622,7 @@
             <w:noProof/>
             <w:webHidden/>
           </w:rPr>
-          <w:instrText xml:space="preserve"> PAGEREF _Toc242000233 \h </w:instrText>
+          <w:instrText xml:space="preserve"> PAGEREF _Toc242001002 \h </w:instrText>
         </w:r>
         <w:r>
           <w:rPr>
@@ -3670,7 +3670,7 @@
           <w14:ligatures w14:val="standardContextual"/>
         </w:rPr>
       </w:pPr>
-      <w:hyperlink w:anchor="_Toc242000234" w:history="1">
+      <w:hyperlink w:anchor="_Toc242001003" w:history="1">
         <w:r>
           <w:rPr>
             <w:rStyle w:val="Siuktni"/>
@@ -3697,7 +3697,7 @@
             <w:noProof/>
             <w:webHidden/>
           </w:rPr>
-          <w:instrText xml:space="preserve"> PAGEREF _Toc242000234 \h </w:instrText>
+          <w:instrText xml:space="preserve"> PAGEREF _Toc242001003 \h </w:instrText>
         </w:r>
         <w:r>
           <w:rPr>
@@ -3745,7 +3745,7 @@
           <w14:ligatures w14:val="standardContextual"/>
         </w:rPr>
       </w:pPr>
-      <w:hyperlink w:anchor="_Toc242000235" w:history="1">
+      <w:hyperlink w:anchor="_Toc242001004" w:history="1">
         <w:r>
           <w:rPr>
             <w:rStyle w:val="Siuktni"/>
@@ -3772,7 +3772,7 @@
             <w:noProof/>
             <w:webHidden/>
           </w:rPr>
-          <w:instrText xml:space="preserve"> PAGEREF _Toc242000235 \h </w:instrText>
+          <w:instrText xml:space="preserve"> PAGEREF _Toc242001004 \h </w:instrText>
         </w:r>
         <w:r>
           <w:rPr>
@@ -3820,7 +3820,7 @@
           <w14:ligatures w14:val="standardContextual"/>
         </w:rPr>
       </w:pPr>
-      <w:hyperlink w:anchor="_Toc242000236" w:history="1">
+      <w:hyperlink w:anchor="_Toc242001005" w:history="1">
         <w:r>
           <w:rPr>
             <w:rStyle w:val="Siuktni"/>
@@ -3847,7 +3847,7 @@
             <w:noProof/>
             <w:webHidden/>
           </w:rPr>
-          <w:instrText xml:space="preserve"> PAGEREF _Toc242000236 \h </w:instrText>
+          <w:instrText xml:space="preserve"> PAGEREF _Toc242001005 \h </w:instrText>
         </w:r>
         <w:r>
           <w:rPr>
@@ -3895,7 +3895,7 @@
           <w14:ligatures w14:val="standardContextual"/>
         </w:rPr>
       </w:pPr>
-      <w:hyperlink w:anchor="_Toc242000237" w:history="1">
+      <w:hyperlink w:anchor="_Toc242001006" w:history="1">
         <w:r>
           <w:rPr>
             <w:rStyle w:val="Siuktni"/>
@@ -3922,7 +3922,7 @@
             <w:noProof/>
             <w:webHidden/>
           </w:rPr>
-          <w:instrText xml:space="preserve"> PAGEREF _Toc242000237 \h </w:instrText>
+          <w:instrText xml:space="preserve"> PAGEREF _Toc242001006 \h </w:instrText>
         </w:r>
         <w:r>
           <w:rPr>
@@ -3970,7 +3970,7 @@
           <w14:ligatures w14:val="standardContextual"/>
         </w:rPr>
       </w:pPr>
-      <w:hyperlink w:anchor="_Toc242000238" w:history="1">
+      <w:hyperlink w:anchor="_Toc242001007" w:history="1">
         <w:r>
           <w:rPr>
             <w:rStyle w:val="Siuktni"/>
@@ -3997,7 +3997,7 @@
             <w:noProof/>
             <w:webHidden/>
           </w:rPr>
-          <w:instrText xml:space="preserve"> PAGEREF _Toc242000238 \h </w:instrText>
+          <w:instrText xml:space="preserve"> PAGEREF _Toc242001007 \h </w:instrText>
         </w:r>
         <w:r>
           <w:rPr>
@@ -4045,7 +4045,7 @@
           <w14:ligatures w14:val="standardContextual"/>
         </w:rPr>
       </w:pPr>
-      <w:hyperlink w:anchor="_Toc242000239" w:history="1">
+      <w:hyperlink w:anchor="_Toc242001008" w:history="1">
         <w:r>
           <w:rPr>
             <w:rStyle w:val="Siuktni"/>
@@ -4072,7 +4072,7 @@
             <w:noProof/>
             <w:webHidden/>
           </w:rPr>
-          <w:instrText xml:space="preserve"> PAGEREF _Toc242000239 \h </w:instrText>
+          <w:instrText xml:space="preserve"> PAGEREF _Toc242001008 \h </w:instrText>
         </w:r>
         <w:r>
           <w:rPr>
@@ -4120,7 +4120,7 @@
           <w14:ligatures w14:val="standardContextual"/>
         </w:rPr>
       </w:pPr>
-      <w:hyperlink w:anchor="_Toc242000240" w:history="1">
+      <w:hyperlink w:anchor="_Toc242001009" w:history="1">
         <w:r>
           <w:rPr>
             <w:rStyle w:val="Siuktni"/>
@@ -4147,7 +4147,7 @@
             <w:noProof/>
             <w:webHidden/>
           </w:rPr>
-          <w:instrText xml:space="preserve"> PAGEREF _Toc242000240 \h </w:instrText>
+          <w:instrText xml:space="preserve"> PAGEREF _Toc242001009 \h </w:instrText>
         </w:r>
         <w:r>
           <w:rPr>
@@ -4195,7 +4195,7 @@
           <w14:ligatures w14:val="standardContextual"/>
         </w:rPr>
       </w:pPr>
-      <w:hyperlink w:anchor="_Toc242000241" w:history="1">
+      <w:hyperlink w:anchor="_Toc242001010" w:history="1">
         <w:r>
           <w:rPr>
             <w:rStyle w:val="Siuktni"/>
@@ -4222,7 +4222,7 @@
             <w:noProof/>
             <w:webHidden/>
           </w:rPr>
-          <w:instrText xml:space="preserve"> PAGEREF _Toc242000241 \h </w:instrText>
+          <w:instrText xml:space="preserve"> PAGEREF _Toc242001010 \h </w:instrText>
         </w:r>
         <w:r>
           <w:rPr>
@@ -4270,7 +4270,7 @@
           <w14:ligatures w14:val="standardContextual"/>
         </w:rPr>
       </w:pPr>
-      <w:hyperlink w:anchor="_Toc242000242" w:history="1">
+      <w:hyperlink w:anchor="_Toc242001011" w:history="1">
         <w:r>
           <w:rPr>
             <w:rStyle w:val="Siuktni"/>
@@ -4297,7 +4297,7 @@
             <w:noProof/>
             <w:webHidden/>
           </w:rPr>
-          <w:instrText xml:space="preserve"> PAGEREF _Toc242000242 \h </w:instrText>
+          <w:instrText xml:space="preserve"> PAGEREF _Toc242001011 \h </w:instrText>
         </w:r>
         <w:r>
           <w:rPr>
@@ -4318,81 +4318,6 @@
             <w:webHidden/>
           </w:rPr>
           <w:t>39</w:t>
-        </w:r>
-        <w:r>
-          <w:rPr>
-            <w:noProof/>
-            <w:webHidden/>
-          </w:rPr>
-          <w:fldChar w:fldCharType="end"/>
-        </w:r>
-      </w:hyperlink>
-    </w:p>
-    <w:p>
-      <w:pPr>
-        <w:pStyle w:val="Mucluc1"/>
-        <w:tabs>
-          <w:tab w:val="right" w:leader="dot" w:pos="9537"/>
-        </w:tabs>
-        <w:rPr>
-          <w:rFonts w:asciiTheme="minorHAnsi" w:eastAsiaTheme="minorEastAsia" w:hAnsiTheme="minorHAnsi"/>
-          <w:noProof/>
-          <w:color w:val="auto"/>
-          <w:kern w:val="2"/>
-          <w:sz w:val="24"/>
-          <w:szCs w:val="24"/>
-          <w:lang w:val="vi-VN" w:eastAsia="vi-VN"/>
-          <w14:ligatures w14:val="standardContextual"/>
-        </w:rPr>
-      </w:pPr>
-      <w:hyperlink w:anchor="_Toc242000243" w:history="1">
-        <w:r>
-          <w:rPr>
-            <w:rStyle w:val="Siuktni"/>
-            <w:noProof/>
-          </w:rPr>
-          <w:t>PHỤ LỤC D. MANIFEST BẰNG CHỨNG</w:t>
-        </w:r>
-        <w:r>
-          <w:rPr>
-            <w:noProof/>
-            <w:webHidden/>
-          </w:rPr>
-          <w:tab/>
-        </w:r>
-        <w:r>
-          <w:rPr>
-            <w:noProof/>
-            <w:webHidden/>
-          </w:rPr>
-          <w:fldChar w:fldCharType="begin"/>
-        </w:r>
-        <w:r>
-          <w:rPr>
-            <w:noProof/>
-            <w:webHidden/>
-          </w:rPr>
-          <w:instrText xml:space="preserve"> PAGEREF _Toc242000243 \h </w:instrText>
-        </w:r>
-        <w:r>
-          <w:rPr>
-            <w:noProof/>
-            <w:webHidden/>
-          </w:rPr>
-        </w:r>
-        <w:r>
-          <w:rPr>
-            <w:noProof/>
-            <w:webHidden/>
-          </w:rPr>
-          <w:fldChar w:fldCharType="separate"/>
-        </w:r>
-        <w:r>
-          <w:rPr>
-            <w:noProof/>
-            <w:webHidden/>
-          </w:rPr>
-          <w:t>40</w:t>
         </w:r>
         <w:r>
           <w:rPr>
@@ -4420,13 +4345,13 @@
           <w14:ligatures w14:val="standardContextual"/>
         </w:rPr>
       </w:pPr>
-      <w:hyperlink w:anchor="_Toc242000244" w:history="1">
+      <w:hyperlink w:anchor="_Toc242001012" w:history="1">
         <w:r>
           <w:rPr>
             <w:rStyle w:val="Siuktni"/>
             <w:noProof/>
           </w:rPr>
-          <w:t>PHỤ LỤC E. QUY TRÌNH TÁI LẬP</w:t>
+          <w:t>PHỤ LỤC D. QUY TRÌNH TÁI LẬP</w:t>
         </w:r>
         <w:r>
           <w:rPr>
@@ -4447,7 +4372,7 @@
             <w:noProof/>
             <w:webHidden/>
           </w:rPr>
-          <w:instrText xml:space="preserve"> PAGEREF _Toc242000244 \h </w:instrText>
+          <w:instrText xml:space="preserve"> PAGEREF _Toc242001012 \h </w:instrText>
         </w:r>
         <w:r>
           <w:rPr>
@@ -4467,7 +4392,7 @@
             <w:noProof/>
             <w:webHidden/>
           </w:rPr>
-          <w:t>40</w:t>
+          <w:t>39</w:t>
         </w:r>
         <w:r>
           <w:rPr>
@@ -4495,7 +4420,7 @@
       <w:pPr>
         <w:pStyle w:val="u1"/>
       </w:pPr>
-      <w:bookmarkStart w:id="3" w:name="_Toc242000192"/>
+      <w:bookmarkStart w:id="3" w:name="_Toc242000961"/>
       <w:r>
         <w:lastRenderedPageBreak/>
         <w:t>DANH M</w:t>
@@ -5081,7 +5006,7 @@
       <w:pPr>
         <w:pStyle w:val="u1"/>
       </w:pPr>
-      <w:bookmarkStart w:id="4" w:name="_Toc242000193"/>
+      <w:bookmarkStart w:id="4" w:name="_Toc242000962"/>
       <w:r>
         <w:lastRenderedPageBreak/>
         <w:t>CHƯƠNG 1. GI</w:t>
@@ -5104,7 +5029,7 @@
       <w:pPr>
         <w:pStyle w:val="u2"/>
       </w:pPr>
-      <w:bookmarkStart w:id="5" w:name="_Toc242000194"/>
+      <w:bookmarkStart w:id="5" w:name="_Toc242000963"/>
       <w:r>
         <w:t>1.1. B</w:t>
       </w:r>
@@ -5148,7 +5073,7 @@
       <w:pPr>
         <w:pStyle w:val="u2"/>
       </w:pPr>
-      <w:bookmarkStart w:id="6" w:name="_Toc242000195"/>
+      <w:bookmarkStart w:id="6" w:name="_Toc242000964"/>
       <w:r>
         <w:t>1.2. M</w:t>
       </w:r>
@@ -5549,7 +5474,7 @@
       <w:pPr>
         <w:pStyle w:val="u2"/>
       </w:pPr>
-      <w:bookmarkStart w:id="7" w:name="_Toc242000196"/>
+      <w:bookmarkStart w:id="7" w:name="_Toc242000965"/>
       <w:r>
         <w:t>1.3. Đ</w:t>
       </w:r>
@@ -5632,7 +5557,7 @@
       <w:pPr>
         <w:pStyle w:val="u2"/>
       </w:pPr>
-      <w:bookmarkStart w:id="8" w:name="_Toc242000197"/>
+      <w:bookmarkStart w:id="8" w:name="_Toc242000966"/>
       <w:r>
         <w:t>1.4. Phương pháp và c</w:t>
       </w:r>
@@ -5659,7 +5584,7 @@
       <w:pPr>
         <w:pStyle w:val="u1"/>
       </w:pPr>
-      <w:bookmarkStart w:id="9" w:name="_Toc242000198"/>
+      <w:bookmarkStart w:id="9" w:name="_Toc242000967"/>
       <w:r>
         <w:lastRenderedPageBreak/>
         <w:t>CHƯƠNG 2. CƠ S</w:t>
@@ -5688,7 +5613,7 @@
       <w:pPr>
         <w:pStyle w:val="u2"/>
       </w:pPr>
-      <w:bookmarkStart w:id="10" w:name="_Toc242000199"/>
+      <w:bookmarkStart w:id="10" w:name="_Toc242000968"/>
       <w:r>
         <w:t>2.1. Ch</w:t>
       </w:r>
@@ -5744,7 +5669,7 @@
       <w:pPr>
         <w:pStyle w:val="u2"/>
       </w:pPr>
-      <w:bookmarkStart w:id="11" w:name="_Toc242000200"/>
+      <w:bookmarkStart w:id="11" w:name="_Toc242000969"/>
       <w:r>
         <w:t>2.2. Các t</w:t>
       </w:r>
@@ -6327,7 +6252,7 @@
       <w:pPr>
         <w:pStyle w:val="u2"/>
       </w:pPr>
-      <w:bookmarkStart w:id="12" w:name="_Toc242000201"/>
+      <w:bookmarkStart w:id="12" w:name="_Toc242000970"/>
       <w:r>
         <w:lastRenderedPageBreak/>
         <w:t>2.3. K</w:t>
@@ -6869,7 +6794,7 @@
       <w:pPr>
         <w:pStyle w:val="u2"/>
       </w:pPr>
-      <w:bookmarkStart w:id="13" w:name="_Toc242000202"/>
+      <w:bookmarkStart w:id="13" w:name="_Toc242000971"/>
       <w:r>
         <w:t>2.4. Coverage và mutation testing</w:t>
       </w:r>
@@ -6889,7 +6814,7 @@
       <w:pPr>
         <w:pStyle w:val="u2"/>
       </w:pPr>
-      <w:bookmarkStart w:id="14" w:name="_Toc242000203"/>
+      <w:bookmarkStart w:id="14" w:name="_Toc242000972"/>
       <w:r>
         <w:lastRenderedPageBreak/>
         <w:t>2.5. Security, performance và accessibility</w:t>
@@ -6910,7 +6835,7 @@
       <w:pPr>
         <w:pStyle w:val="u1"/>
       </w:pPr>
-      <w:bookmarkStart w:id="15" w:name="_Toc242000204"/>
+      <w:bookmarkStart w:id="15" w:name="_Toc242000973"/>
       <w:r>
         <w:lastRenderedPageBreak/>
         <w:t>CHƯƠNG 3. PHÂN TÍCH VÀ THI</w:t>
@@ -6933,7 +6858,7 @@
       <w:pPr>
         <w:pStyle w:val="u2"/>
       </w:pPr>
-      <w:bookmarkStart w:id="16" w:name="_Toc242000205"/>
+      <w:bookmarkStart w:id="16" w:name="_Toc242000974"/>
       <w:r>
         <w:t>3.1. Actor và use case</w:t>
       </w:r>
@@ -6941,7 +6866,7 @@
     </w:p>
     <w:p>
       <w:r>
-        <w:t>Hình 1 mô tả phạm vi chức năng theo ba actor. Guest chỉ truy cập các chức năng công khai. STUDENT là chủ sở hữu booking và bị giới hạn bởi ownership. ADMIN có quyền thay đổi dữ liệu vận hành, nhưng chính các thao tác này phải tạo AuditLog. Khối quy tắc bảo vệ không phải một actor mà là tập invariant áp dụng chéo use case.</w:t>
+        <w:t>Hình 1 mô tả phạm vi chức năng theo ba actor. Guest chỉ truy cập các chức năng công khai. STUDENT là chủ sở hữu booking và bị giới hạn bởi ownership. ADMIN có quyền thay đổi dữ liệu vận hành, nhưng chính các thao tác này phải tạo AuditLog. Các rule về thời gian, xung đột và transaction áp dụng chéo các use case, nên không được vẽ như một actor.</w:t>
       </w:r>
     </w:p>
     <w:p>
@@ -6953,8 +6878,8 @@
           <w:noProof/>
         </w:rPr>
         <w:drawing>
-          <wp:inline distT="0" distB="0" distL="0" distR="0" wp14:anchorId="6914C650" wp14:editId="5D08CB6C">
-            <wp:extent cx="5943600" cy="4233164"/>
+          <wp:inline distT="0" distB="0" distL="0" distR="0" wp14:anchorId="5BBA0299" wp14:editId="0A029069">
+            <wp:extent cx="5943600" cy="4730926"/>
             <wp:effectExtent l="0" t="0" r="0" b="0"/>
             <wp:docPr id="1" name="Picture 1"/>
             <wp:cNvGraphicFramePr>
@@ -6976,7 +6901,7 @@
                   <pic:spPr>
                     <a:xfrm>
                       <a:off x="0" y="0"/>
-                      <a:ext cx="5943600" cy="4233164"/>
+                      <a:ext cx="5943600" cy="4730926"/>
                     </a:xfrm>
                     <a:prstGeom prst="rect">
                       <a:avLst/>
@@ -7001,7 +6926,7 @@
           <w:i/>
           <w:sz w:val="22"/>
         </w:rPr>
-        <w:t>Hình 1. Sơ đồ use case do nhóm tổng hợp từ SRS hiện tại</w:t>
+        <w:t>Hình 1. Sơ đồ tác nhân và các use case chính của StudySpace</w:t>
       </w:r>
     </w:p>
     <w:p>
@@ -7233,6 +7158,7 @@
               <w:rPr>
                 <w:sz w:val="21"/>
               </w:rPr>
+              <w:lastRenderedPageBreak/>
               <w:t>UC-BOOK-01 Đặt chỗ</w:t>
             </w:r>
           </w:p>
@@ -7401,7 +7327,6 @@
               <w:rPr>
                 <w:sz w:val="21"/>
               </w:rPr>
-              <w:lastRenderedPageBreak/>
               <w:t>UC-BOOK-03 Check-in</w:t>
             </w:r>
           </w:p>
@@ -7564,7 +7489,7 @@
       <w:pPr>
         <w:pStyle w:val="u2"/>
       </w:pPr>
-      <w:bookmarkStart w:id="17" w:name="_Toc242000206"/>
+      <w:bookmarkStart w:id="17" w:name="_Toc242000975"/>
       <w:r>
         <w:t>3.2. Yêu c</w:t>
       </w:r>
@@ -8065,7 +7990,7 @@
       <w:pPr>
         <w:pStyle w:val="u2"/>
       </w:pPr>
-      <w:bookmarkStart w:id="18" w:name="_Toc242000207"/>
+      <w:bookmarkStart w:id="18" w:name="_Toc242000976"/>
       <w:r>
         <w:t>3.3. Quy t</w:t>
       </w:r>
@@ -8096,7 +8021,11 @@
     </w:p>
     <w:p>
       <w:r>
-        <w:t>Ngày đặt nằm trong đoạn đóng từ hôm nay đến ngày thứ 14. Có 14 slot bắt đầu 07:00 đến 20:00, mỗi slot kết thúc sau đúng 60 phút. Việc đặt slot đã qua trong hôm nay bị từ chối. Hủy hợp lệ nếu còn ít nhất 60 phút; check-in hợp lệ từ 15 phút trước đến 15 phút sau, bao gồm cả hai biên. Các rule này được tách thành hàm thuần để cố định now trong unit/PBT và tránh phụ thuộc đồng hồ CI.</w:t>
+        <w:t xml:space="preserve">Ngày đặt nằm trong đoạn đóng từ hôm nay đến ngày thứ 14. Có 14 slot bắt đầu 07:00 đến 20:00, mỗi slot kết thúc sau đúng 60 phút. Việc đặt slot đã qua trong hôm nay bị từ chối. Hủy hợp lệ nếu còn ít nhất 60 phút; check-in hợp lệ từ 15 phút trước đến 15 phút sau, </w:t>
+      </w:r>
+      <w:r>
+        <w:lastRenderedPageBreak/>
+        <w:t>bao gồm cả hai biên. Các rule này được tách thành hàm thuần để cố định now trong unit/PBT và tránh phụ thuộc đồng hồ CI.</w:t>
       </w:r>
     </w:p>
     <w:p>
@@ -8111,7 +8040,6 @@
           <w:i/>
           <w:sz w:val="22"/>
         </w:rPr>
-        <w:lastRenderedPageBreak/>
         <w:t>Bảng 7. Bảng chuyển trạng thái booking</w:t>
       </w:r>
     </w:p>
@@ -8572,7 +8500,7 @@
       <w:pPr>
         <w:pStyle w:val="u2"/>
       </w:pPr>
-      <w:bookmarkStart w:id="19" w:name="_Toc242000208"/>
+      <w:bookmarkStart w:id="19" w:name="_Toc242000977"/>
       <w:r>
         <w:t>3.4. Ki</w:t>
       </w:r>
@@ -8616,7 +8544,7 @@
           <w:noProof/>
         </w:rPr>
         <w:drawing>
-          <wp:inline distT="0" distB="0" distL="0" distR="0" wp14:anchorId="3570CF58" wp14:editId="43CF2608">
+          <wp:inline distT="0" distB="0" distL="0" distR="0" wp14:anchorId="1F6AC40B" wp14:editId="5DEFA0CD">
             <wp:extent cx="5943600" cy="1403350"/>
             <wp:effectExtent l="0" t="0" r="0" b="0"/>
             <wp:docPr id="2" name="Picture 2"/>
@@ -8676,8 +8604,9 @@
       <w:pPr>
         <w:pStyle w:val="u2"/>
       </w:pPr>
-      <w:bookmarkStart w:id="20" w:name="_Toc242000209"/>
-      <w:r>
+      <w:bookmarkStart w:id="20" w:name="_Toc242000978"/>
+      <w:r>
+        <w:lastRenderedPageBreak/>
         <w:t>3.5. Mô hình d</w:t>
       </w:r>
       <w:r>
@@ -8696,11 +8625,7 @@
     </w:p>
     <w:p>
       <w:r>
-        <w:t xml:space="preserve">Hình 3 cho thấy Booking là thực thể trung tâm nối User và Room. Hai active key chỉ có giá trị khi booking đang giữ slot; khi chuyển trạng thái cuối, khóa được giải phóng </w:t>
-      </w:r>
-      <w:r>
-        <w:lastRenderedPageBreak/>
-        <w:t>nhưng bản ghi lịch sử vẫn tồn tại. Room có booking lịch sử chuyển INACTIVE thay vì xóa cứng. RoomClosure có ràng buộc unique theo room và date để chặn lịch đóng trùng.</w:t>
+        <w:t>Hình 3 cho thấy các thực thể và quan hệ nghiệp vụ chính; các trường kỹ thuật không ảnh hưởng đến quan hệ được để trong Prisma schema thay vì đưa toàn bộ vào hình. Booking là thực thể trung tâm nối User và Room. Hai active key chỉ có giá trị khi booking đang giữ slot; khi chuyển trạng thái cuối, khóa được giải phóng nhưng bản ghi lịch sử vẫn tồn tại. Room có booking lịch sử chuyển INACTIVE thay vì xóa cứng. RoomClosure có ràng buộc unique theo room và date để chặn lịch đóng trùng.</w:t>
       </w:r>
     </w:p>
     <w:p>
@@ -8712,7 +8637,7 @@
           <w:noProof/>
         </w:rPr>
         <w:drawing>
-          <wp:inline distT="0" distB="0" distL="0" distR="0" wp14:anchorId="7CF2CA2F" wp14:editId="09435FA5">
+          <wp:inline distT="0" distB="0" distL="0" distR="0" wp14:anchorId="4CF8CB43" wp14:editId="7F9AADAA">
             <wp:extent cx="5943600" cy="3516630"/>
             <wp:effectExtent l="0" t="0" r="0" b="0"/>
             <wp:docPr id="3" name="Picture 3"/>
@@ -8760,7 +8685,7 @@
           <w:i/>
           <w:sz w:val="22"/>
         </w:rPr>
-        <w:t>Hình 3. ERD rút gọn từ Prisma schema hiện tại</w:t>
+        <w:t>Hình 3. ERD các thực thể và quan hệ nghiệp vụ chính</w:t>
       </w:r>
     </w:p>
     <w:p>
@@ -8772,7 +8697,7 @@
       <w:pPr>
         <w:pStyle w:val="u2"/>
       </w:pPr>
-      <w:bookmarkStart w:id="21" w:name="_Toc242000210"/>
+      <w:bookmarkStart w:id="21" w:name="_Toc242000979"/>
       <w:r>
         <w:t>3.6. Công th</w:t>
       </w:r>
@@ -8798,23 +8723,23 @@
     </w:p>
     <w:p>
       <w:r>
-        <w:t>Báo cáo tách mức độ được đặt và mức độ sử dụng thực tế. reservationRate = (BOOKED + CHECKED_IN + NO_SHOW) / tổng slot khả dụng. utilizationRate = CHECKED_IN / tổng slot khả dụng. CANCELLED không nằm trong tử số. Trường occupancyRate được giữ tạm làm alias của reservationRate để tương thích, nhưng được đánh dấu deprecated trong tài liệu và không dùng làm nhãn UI.</w:t>
+        <w:t xml:space="preserve">Báo cáo tách mức độ được đặt và mức độ sử dụng thực tế. reservationRate = (BOOKED + CHECKED_IN + NO_SHOW) / tổng slot khả dụng. utilizationRate = </w:t>
+      </w:r>
+      <w:r>
+        <w:lastRenderedPageBreak/>
+        <w:t>CHECKED_IN / tổng slot khả dụng. CANCELLED không nằm trong tử số. Trường occupancyRate được giữ tạm làm alias của reservationRate để tương thích, nhưng được đánh dấu deprecated trong tài liệu và không dùng làm nhãn UI.</w:t>
       </w:r>
     </w:p>
     <w:p>
       <w:r>
-        <w:t xml:space="preserve">Mẫu số là số slot khả dụng sau khi loại phòng INACTIVE và lịch đóng trong khoảng báo cáo. Khi mẫu số bằng 0, API trả 0 thay vì NaN hoặc phép chia lỗi. Decision table kiểm </w:t>
-      </w:r>
-      <w:r>
-        <w:lastRenderedPageBreak/>
-        <w:t>tra riêng BOOKED, CHECKED_IN, NO_SHOW, CANCELLED và zero denominator để tránh một test gộp che khuất lỗi công thức.</w:t>
+        <w:t>Mẫu số là số slot khả dụng sau khi loại phòng INACTIVE và lịch đóng trong khoảng báo cáo. Khi mẫu số bằng 0, API trả 0 thay vì NaN hoặc phép chia lỗi. Decision table kiểm tra riêng BOOKED, CHECKED_IN, NO_SHOW, CANCELLED và zero denominator để tránh một test gộp che khuất lỗi công thức.</w:t>
       </w:r>
     </w:p>
     <w:p>
       <w:pPr>
         <w:pStyle w:val="u1"/>
       </w:pPr>
-      <w:bookmarkStart w:id="22" w:name="_Toc242000211"/>
+      <w:bookmarkStart w:id="22" w:name="_Toc242000980"/>
       <w:r>
         <w:lastRenderedPageBreak/>
         <w:t>CHƯƠNG 4. PHƯƠNG PHÁP VÀ K</w:t>
@@ -8846,7 +8771,7 @@
       <w:pPr>
         <w:pStyle w:val="u2"/>
       </w:pPr>
-      <w:bookmarkStart w:id="23" w:name="_Toc242000212"/>
+      <w:bookmarkStart w:id="23" w:name="_Toc242000981"/>
       <w:r>
         <w:t>4.1. Chi</w:t>
       </w:r>
@@ -9526,7 +9451,7 @@
       <w:pPr>
         <w:pStyle w:val="u2"/>
       </w:pPr>
-      <w:bookmarkStart w:id="24" w:name="_Toc242000213"/>
+      <w:bookmarkStart w:id="24" w:name="_Toc242000982"/>
       <w:r>
         <w:t>4.2. Thi</w:t>
       </w:r>
@@ -10118,7 +10043,7 @@
       <w:pPr>
         <w:pStyle w:val="u3"/>
       </w:pPr>
-      <w:bookmarkStart w:id="25" w:name="_Toc242000214"/>
+      <w:bookmarkStart w:id="25" w:name="_Toc242000983"/>
       <w:r>
         <w:t>4.2.1. Ví d</w:t>
       </w:r>
@@ -10795,7 +10720,7 @@
       <w:pPr>
         <w:pStyle w:val="u2"/>
       </w:pPr>
-      <w:bookmarkStart w:id="26" w:name="_Toc242000215"/>
+      <w:bookmarkStart w:id="26" w:name="_Toc242000984"/>
       <w:r>
         <w:lastRenderedPageBreak/>
         <w:t>4.3. Môi trư</w:t>
@@ -11192,7 +11117,7 @@
       <w:pPr>
         <w:pStyle w:val="u2"/>
       </w:pPr>
-      <w:bookmarkStart w:id="27" w:name="_Toc242000216"/>
+      <w:bookmarkStart w:id="27" w:name="_Toc242000985"/>
       <w:r>
         <w:t>4.4. Entry, exit và workflow</w:t>
       </w:r>
@@ -11569,7 +11494,7 @@
       <w:pPr>
         <w:pStyle w:val="u2"/>
       </w:pPr>
-      <w:bookmarkStart w:id="28" w:name="_Toc242000217"/>
+      <w:bookmarkStart w:id="28" w:name="_Toc242000986"/>
       <w:r>
         <w:t>4.5. Truy v</w:t>
       </w:r>
@@ -11607,7 +11532,7 @@
       <w:pPr>
         <w:pStyle w:val="u2"/>
       </w:pPr>
-      <w:bookmarkStart w:id="29" w:name="_Toc242000218"/>
+      <w:bookmarkStart w:id="29" w:name="_Toc242000987"/>
       <w:r>
         <w:t>4.6. Tiêu chí đánh giá tính đ</w:t>
       </w:r>
@@ -11654,7 +11579,7 @@
       <w:pPr>
         <w:pStyle w:val="u1"/>
       </w:pPr>
-      <w:bookmarkStart w:id="30" w:name="_Toc242000219"/>
+      <w:bookmarkStart w:id="30" w:name="_Toc242000988"/>
       <w:r>
         <w:lastRenderedPageBreak/>
         <w:t>CHƯƠNG 5. TH</w:t>
@@ -11695,7 +11620,7 @@
       <w:pPr>
         <w:pStyle w:val="u2"/>
       </w:pPr>
-      <w:bookmarkStart w:id="31" w:name="_Toc242000220"/>
+      <w:bookmarkStart w:id="31" w:name="_Toc242000989"/>
       <w:r>
         <w:t>5.1. T</w:t>
       </w:r>
@@ -12611,7 +12536,7 @@
       <w:pPr>
         <w:pStyle w:val="u2"/>
       </w:pPr>
-      <w:bookmarkStart w:id="32" w:name="_Toc242000221"/>
+      <w:bookmarkStart w:id="32" w:name="_Toc242000990"/>
       <w:r>
         <w:t>5.2. Unit, BVA và property-based testing</w:t>
       </w:r>
@@ -12637,7 +12562,7 @@
       <w:pPr>
         <w:pStyle w:val="u2"/>
       </w:pPr>
-      <w:bookmarkStart w:id="33" w:name="_Toc242000222"/>
+      <w:bookmarkStart w:id="33" w:name="_Toc242000991"/>
       <w:r>
         <w:t>5.3. API, database và transaction</w:t>
       </w:r>
@@ -12657,7 +12582,7 @@
       <w:pPr>
         <w:pStyle w:val="u2"/>
       </w:pPr>
-      <w:bookmarkStart w:id="34" w:name="_Toc242000223"/>
+      <w:bookmarkStart w:id="34" w:name="_Toc242000992"/>
       <w:r>
         <w:t>5.4. E2E, responsive và accessibility</w:t>
       </w:r>
@@ -12683,7 +12608,7 @@
         </w:rPr>
         <w:lastRenderedPageBreak/>
         <w:drawing>
-          <wp:inline distT="0" distB="0" distL="0" distR="0" wp14:anchorId="78B8E613" wp14:editId="685F5C63">
+          <wp:inline distT="0" distB="0" distL="0" distR="0" wp14:anchorId="6C055B46" wp14:editId="248B8AD6">
             <wp:extent cx="5029200" cy="4306252"/>
             <wp:effectExtent l="0" t="0" r="0" b="0"/>
             <wp:docPr id="4" name="Picture 4"/>
@@ -12744,7 +12669,7 @@
         </w:rPr>
         <w:lastRenderedPageBreak/>
         <w:drawing>
-          <wp:inline distT="0" distB="0" distL="0" distR="0" wp14:anchorId="2D683AFA" wp14:editId="12AB49B6">
+          <wp:inline distT="0" distB="0" distL="0" distR="0" wp14:anchorId="1859F7B4" wp14:editId="4E808490">
             <wp:extent cx="5029200" cy="5930265"/>
             <wp:effectExtent l="0" t="0" r="0" b="0"/>
             <wp:docPr id="5" name="Picture 5"/>
@@ -12799,7 +12724,7 @@
       <w:pPr>
         <w:pStyle w:val="u2"/>
       </w:pPr>
-      <w:bookmarkStart w:id="35" w:name="_Toc242000224"/>
+      <w:bookmarkStart w:id="35" w:name="_Toc242000993"/>
       <w:r>
         <w:t>5.5. Coverage và mutation</w:t>
       </w:r>
@@ -12825,7 +12750,7 @@
         </w:rPr>
         <w:lastRenderedPageBreak/>
         <w:drawing>
-          <wp:inline distT="0" distB="0" distL="0" distR="0" wp14:anchorId="50378A22" wp14:editId="7DBB0AF9">
+          <wp:inline distT="0" distB="0" distL="0" distR="0" wp14:anchorId="336A6FCA" wp14:editId="154F6C4E">
             <wp:extent cx="5669280" cy="1653540"/>
             <wp:effectExtent l="0" t="0" r="0" b="0"/>
             <wp:docPr id="6" name="Picture 6"/>
@@ -12895,7 +12820,7 @@
           <w:noProof/>
         </w:rPr>
         <w:drawing>
-          <wp:inline distT="0" distB="0" distL="0" distR="0" wp14:anchorId="0BA0DD62" wp14:editId="3559B3DF">
+          <wp:inline distT="0" distB="0" distL="0" distR="0" wp14:anchorId="22FAB099" wp14:editId="0655A345">
             <wp:extent cx="5669280" cy="2440940"/>
             <wp:effectExtent l="0" t="0" r="0" b="0"/>
             <wp:docPr id="7" name="Picture 7"/>
@@ -13324,7 +13249,7 @@
       <w:pPr>
         <w:pStyle w:val="u2"/>
       </w:pPr>
-      <w:bookmarkStart w:id="36" w:name="_Toc242000225"/>
+      <w:bookmarkStart w:id="36" w:name="_Toc242000994"/>
       <w:r>
         <w:t>5.6. Hi</w:t>
       </w:r>
@@ -13355,7 +13280,7 @@
       <w:pPr>
         <w:pStyle w:val="u2"/>
       </w:pPr>
-      <w:bookmarkStart w:id="37" w:name="_Toc242000226"/>
+      <w:bookmarkStart w:id="37" w:name="_Toc242000995"/>
       <w:r>
         <w:t>5.7. Security testing</w:t>
       </w:r>
@@ -13810,7 +13735,7 @@
       <w:pPr>
         <w:pStyle w:val="u2"/>
       </w:pPr>
-      <w:bookmarkStart w:id="38" w:name="_Toc242000227"/>
+      <w:bookmarkStart w:id="38" w:name="_Toc242000996"/>
       <w:r>
         <w:t>5.8. Lighthouse, axe và tr</w:t>
       </w:r>
@@ -13842,7 +13767,7 @@
       <w:pPr>
         <w:pStyle w:val="u2"/>
       </w:pPr>
-      <w:bookmarkStart w:id="39" w:name="_Toc242000228"/>
+      <w:bookmarkStart w:id="39" w:name="_Toc242000997"/>
       <w:r>
         <w:t>5.9. Tính tái l</w:t>
       </w:r>
@@ -13887,7 +13812,7 @@
       <w:pPr>
         <w:pStyle w:val="u1"/>
       </w:pPr>
-      <w:bookmarkStart w:id="40" w:name="_Toc242000229"/>
+      <w:bookmarkStart w:id="40" w:name="_Toc242000998"/>
       <w:r>
         <w:lastRenderedPageBreak/>
         <w:t>CHƯƠNG 6. DEFECT, RETEST VÀ ĐÁNH GIÁ CH</w:t>
@@ -13910,7 +13835,7 @@
       <w:pPr>
         <w:pStyle w:val="u2"/>
       </w:pPr>
-      <w:bookmarkStart w:id="41" w:name="_Toc242000230"/>
+      <w:bookmarkStart w:id="41" w:name="_Toc242000999"/>
       <w:r>
         <w:t>6.1. Defect lifecycle</w:t>
       </w:r>
@@ -14648,7 +14573,7 @@
       <w:pPr>
         <w:pStyle w:val="u2"/>
       </w:pPr>
-      <w:bookmarkStart w:id="42" w:name="_Toc242000231"/>
+      <w:bookmarkStart w:id="42" w:name="_Toc242001000"/>
       <w:r>
         <w:t>6.2. Phân tích ba defect có tác đ</w:t>
       </w:r>
@@ -14686,7 +14611,7 @@
       <w:pPr>
         <w:pStyle w:val="u2"/>
       </w:pPr>
-      <w:bookmarkStart w:id="43" w:name="_Toc242000232"/>
+      <w:bookmarkStart w:id="43" w:name="_Toc242001001"/>
       <w:r>
         <w:t>6.3. Tr</w:t>
       </w:r>
@@ -14734,7 +14659,7 @@
       <w:pPr>
         <w:pStyle w:val="u2"/>
       </w:pPr>
-      <w:bookmarkStart w:id="44" w:name="_Toc242000233"/>
+      <w:bookmarkStart w:id="44" w:name="_Toc242001002"/>
       <w:r>
         <w:lastRenderedPageBreak/>
         <w:t>6.4. Đánh giá theo ISO/IEC 25010:2023</w:t>
@@ -15439,7 +15364,7 @@
       <w:pPr>
         <w:pStyle w:val="u2"/>
       </w:pPr>
-      <w:bookmarkStart w:id="45" w:name="_Toc242000234"/>
+      <w:bookmarkStart w:id="45" w:name="_Toc242001003"/>
       <w:r>
         <w:t>6.5. Gi</w:t>
       </w:r>
@@ -15927,7 +15852,7 @@
       <w:pPr>
         <w:pStyle w:val="u1"/>
       </w:pPr>
-      <w:bookmarkStart w:id="46" w:name="_Toc242000235"/>
+      <w:bookmarkStart w:id="46" w:name="_Toc242001004"/>
       <w:r>
         <w:lastRenderedPageBreak/>
         <w:t>CHƯƠNG 7. K</w:t>
@@ -15959,7 +15884,7 @@
       <w:pPr>
         <w:pStyle w:val="u2"/>
       </w:pPr>
-      <w:bookmarkStart w:id="47" w:name="_Toc242000236"/>
+      <w:bookmarkStart w:id="47" w:name="_Toc242001005"/>
       <w:r>
         <w:t>7.1. K</w:t>
       </w:r>
@@ -16003,7 +15928,7 @@
       <w:pPr>
         <w:pStyle w:val="u2"/>
       </w:pPr>
-      <w:bookmarkStart w:id="48" w:name="_Toc242000237"/>
+      <w:bookmarkStart w:id="48" w:name="_Toc242001006"/>
       <w:r>
         <w:t>7.2. H</w:t>
       </w:r>
@@ -16027,7 +15952,7 @@
       <w:pPr>
         <w:pStyle w:val="u2"/>
       </w:pPr>
-      <w:bookmarkStart w:id="49" w:name="_Toc242000238"/>
+      <w:bookmarkStart w:id="49" w:name="_Toc242001007"/>
       <w:r>
         <w:t>7.3. Hư</w:t>
       </w:r>
@@ -16065,7 +15990,7 @@
       <w:pPr>
         <w:pStyle w:val="u1"/>
       </w:pPr>
-      <w:bookmarkStart w:id="50" w:name="_Toc242000239"/>
+      <w:bookmarkStart w:id="50" w:name="_Toc242001008"/>
       <w:r>
         <w:lastRenderedPageBreak/>
         <w:t>TÀI LI</w:t>
@@ -16176,7 +16101,7 @@
       <w:pPr>
         <w:pStyle w:val="u1"/>
       </w:pPr>
-      <w:bookmarkStart w:id="51" w:name="_Toc242000240"/>
+      <w:bookmarkStart w:id="51" w:name="_Toc242001009"/>
       <w:r>
         <w:lastRenderedPageBreak/>
         <w:t>PH</w:t>
@@ -17204,7 +17129,7 @@
       <w:pPr>
         <w:pStyle w:val="u1"/>
       </w:pPr>
-      <w:bookmarkStart w:id="52" w:name="_Toc242000241"/>
+      <w:bookmarkStart w:id="52" w:name="_Toc242001010"/>
       <w:r>
         <w:lastRenderedPageBreak/>
         <w:t>PH</w:t>
@@ -17877,7 +17802,7 @@
       <w:pPr>
         <w:pStyle w:val="u1"/>
       </w:pPr>
-      <w:bookmarkStart w:id="53" w:name="_Toc242000242"/>
+      <w:bookmarkStart w:id="53" w:name="_Toc242001011"/>
       <w:r>
         <w:lastRenderedPageBreak/>
         <w:t>PH</w:t>
@@ -18605,678 +18530,9 @@
     </w:p>
     <w:p>
       <w:pPr>
-        <w:pStyle w:val="u1"/>
-      </w:pPr>
-      <w:bookmarkStart w:id="54" w:name="_Toc242000243"/>
-      <w:r>
-        <w:lastRenderedPageBreak/>
-        <w:t>PH</w:t>
-      </w:r>
-      <w:r>
-        <w:t>Ụ</w:t>
-      </w:r>
-      <w:r>
-        <w:t xml:space="preserve"> L</w:t>
-      </w:r>
-      <w:r>
-        <w:t>Ụ</w:t>
-      </w:r>
-      <w:r>
-        <w:t>C D. MANIFEST B</w:t>
-      </w:r>
-      <w:r>
-        <w:t>Ằ</w:t>
-      </w:r>
-      <w:r>
-        <w:t>NG CH</w:t>
-      </w:r>
-      <w:r>
-        <w:t>Ứ</w:t>
-      </w:r>
-      <w:r>
-        <w:t>NG</w:t>
-      </w:r>
-      <w:bookmarkEnd w:id="54"/>
-    </w:p>
-    <w:p>
-      <w:pPr>
-        <w:spacing w:after="80"/>
-        <w:ind w:firstLine="0"/>
-        <w:jc w:val="center"/>
-      </w:pPr>
-      <w:r>
-        <w:rPr>
-          <w:b/>
-          <w:i/>
-          <w:sz w:val="22"/>
-        </w:rPr>
-        <w:t>Bảng 22. Artifact cốt lõi và SHA-256</w:t>
-      </w:r>
-    </w:p>
-    <w:tbl>
-      <w:tblPr>
-        <w:tblW w:w="0" w:type="auto"/>
-        <w:jc w:val="center"/>
-        <w:tblBorders>
-          <w:top w:val="single" w:sz="4" w:space="0" w:color="B7B7B7"/>
-          <w:left w:val="single" w:sz="4" w:space="0" w:color="B7B7B7"/>
-          <w:bottom w:val="single" w:sz="4" w:space="0" w:color="B7B7B7"/>
-          <w:right w:val="single" w:sz="4" w:space="0" w:color="B7B7B7"/>
-          <w:insideH w:val="single" w:sz="4" w:space="0" w:color="B7B7B7"/>
-          <w:insideV w:val="single" w:sz="4" w:space="0" w:color="B7B7B7"/>
-        </w:tblBorders>
-        <w:tblLook w:val="04A0" w:firstRow="1" w:lastRow="0" w:firstColumn="1" w:lastColumn="0" w:noHBand="0" w:noVBand="1"/>
-      </w:tblPr>
-      <w:tblGrid>
-        <w:gridCol w:w="985"/>
-        <w:gridCol w:w="3051"/>
-        <w:gridCol w:w="5727"/>
-      </w:tblGrid>
-      <w:tr>
-        <w:trPr>
-          <w:cantSplit/>
-          <w:tblHeader/>
-          <w:jc w:val="center"/>
-        </w:trPr>
-        <w:tc>
-          <w:tcPr>
-            <w:tcW w:w="3182" w:type="dxa"/>
-            <w:shd w:val="clear" w:color="auto" w:fill="D9E2F3"/>
-            <w:vAlign w:val="center"/>
-          </w:tcPr>
-          <w:p>
-            <w:pPr>
-              <w:spacing w:after="0" w:line="252" w:lineRule="auto"/>
-              <w:ind w:firstLine="0"/>
-              <w:jc w:val="center"/>
-            </w:pPr>
-            <w:r>
-              <w:rPr>
-                <w:b/>
-                <w:sz w:val="21"/>
-              </w:rPr>
-              <w:t>Workflow</w:t>
-            </w:r>
-          </w:p>
-        </w:tc>
-        <w:tc>
-          <w:tcPr>
-            <w:tcW w:w="3182" w:type="dxa"/>
-            <w:shd w:val="clear" w:color="auto" w:fill="D9E2F3"/>
-            <w:vAlign w:val="center"/>
-          </w:tcPr>
-          <w:p>
-            <w:pPr>
-              <w:spacing w:after="0" w:line="252" w:lineRule="auto"/>
-              <w:ind w:firstLine="0"/>
-              <w:jc w:val="center"/>
-            </w:pPr>
-            <w:r>
-              <w:rPr>
-                <w:b/>
-                <w:sz w:val="21"/>
-              </w:rPr>
-              <w:t>Artifact</w:t>
-            </w:r>
-          </w:p>
-        </w:tc>
-        <w:tc>
-          <w:tcPr>
-            <w:tcW w:w="3182" w:type="dxa"/>
-            <w:shd w:val="clear" w:color="auto" w:fill="D9E2F3"/>
-            <w:vAlign w:val="center"/>
-          </w:tcPr>
-          <w:p>
-            <w:pPr>
-              <w:spacing w:after="0" w:line="252" w:lineRule="auto"/>
-              <w:ind w:firstLine="0"/>
-              <w:jc w:val="center"/>
-            </w:pPr>
-            <w:r>
-              <w:rPr>
-                <w:b/>
-                <w:sz w:val="21"/>
-              </w:rPr>
-              <w:t>SHA-256</w:t>
-            </w:r>
-          </w:p>
-        </w:tc>
-      </w:tr>
-      <w:tr>
-        <w:trPr>
-          <w:cantSplit/>
-          <w:jc w:val="center"/>
-        </w:trPr>
-        <w:tc>
-          <w:tcPr>
-            <w:tcW w:w="3182" w:type="dxa"/>
-            <w:vAlign w:val="center"/>
-          </w:tcPr>
-          <w:p>
-            <w:pPr>
-              <w:spacing w:after="0" w:line="252" w:lineRule="auto"/>
-              <w:ind w:firstLine="0"/>
-              <w:jc w:val="left"/>
-            </w:pPr>
-            <w:r>
-              <w:rPr>
-                <w:sz w:val="21"/>
-              </w:rPr>
-              <w:t>core</w:t>
-            </w:r>
-          </w:p>
-        </w:tc>
-        <w:tc>
-          <w:tcPr>
-            <w:tcW w:w="3182" w:type="dxa"/>
-            <w:vAlign w:val="center"/>
-          </w:tcPr>
-          <w:p>
-            <w:pPr>
-              <w:spacing w:after="0" w:line="252" w:lineRule="auto"/>
-              <w:ind w:firstLine="0"/>
-              <w:jc w:val="left"/>
-            </w:pPr>
-            <w:r>
-              <w:rPr>
-                <w:sz w:val="21"/>
-              </w:rPr>
-              <w:t>backend/coverage/coverage-summary.json</w:t>
-            </w:r>
-          </w:p>
-        </w:tc>
-        <w:tc>
-          <w:tcPr>
-            <w:tcW w:w="3182" w:type="dxa"/>
-            <w:vAlign w:val="center"/>
-          </w:tcPr>
-          <w:p>
-            <w:pPr>
-              <w:spacing w:after="0" w:line="252" w:lineRule="auto"/>
-              <w:ind w:firstLine="0"/>
-              <w:jc w:val="left"/>
-            </w:pPr>
-            <w:r>
-              <w:rPr>
-                <w:sz w:val="21"/>
-              </w:rPr>
-              <w:t>c28d242bd940de9c86146808c5e28aabc1ee73fc82366cc1683b4b8b576ba872</w:t>
-            </w:r>
-          </w:p>
-        </w:tc>
-      </w:tr>
-      <w:tr>
-        <w:trPr>
-          <w:cantSplit/>
-          <w:jc w:val="center"/>
-        </w:trPr>
-        <w:tc>
-          <w:tcPr>
-            <w:tcW w:w="3182" w:type="dxa"/>
-            <w:shd w:val="clear" w:color="auto" w:fill="F7F9FC"/>
-            <w:vAlign w:val="center"/>
-          </w:tcPr>
-          <w:p>
-            <w:pPr>
-              <w:spacing w:after="0" w:line="252" w:lineRule="auto"/>
-              <w:ind w:firstLine="0"/>
-              <w:jc w:val="left"/>
-            </w:pPr>
-            <w:r>
-              <w:rPr>
-                <w:sz w:val="21"/>
-              </w:rPr>
-              <w:t>core</w:t>
-            </w:r>
-          </w:p>
-        </w:tc>
-        <w:tc>
-          <w:tcPr>
-            <w:tcW w:w="3182" w:type="dxa"/>
-            <w:shd w:val="clear" w:color="auto" w:fill="F7F9FC"/>
-            <w:vAlign w:val="center"/>
-          </w:tcPr>
-          <w:p>
-            <w:pPr>
-              <w:spacing w:after="0" w:line="252" w:lineRule="auto"/>
-              <w:ind w:firstLine="0"/>
-              <w:jc w:val="left"/>
-            </w:pPr>
-            <w:r>
-              <w:rPr>
-                <w:sz w:val="21"/>
-              </w:rPr>
-              <w:t>reports/generated/stryker/mutation.json</w:t>
-            </w:r>
-          </w:p>
-        </w:tc>
-        <w:tc>
-          <w:tcPr>
-            <w:tcW w:w="3182" w:type="dxa"/>
-            <w:shd w:val="clear" w:color="auto" w:fill="F7F9FC"/>
-            <w:vAlign w:val="center"/>
-          </w:tcPr>
-          <w:p>
-            <w:pPr>
-              <w:spacing w:after="0" w:line="252" w:lineRule="auto"/>
-              <w:ind w:firstLine="0"/>
-              <w:jc w:val="left"/>
-            </w:pPr>
-            <w:r>
-              <w:rPr>
-                <w:sz w:val="21"/>
-              </w:rPr>
-              <w:t>c47ce22d5ed37896b65b000eb5274692f47935d3a9ccee8792f9e58f715c650d</w:t>
-            </w:r>
-          </w:p>
-        </w:tc>
-      </w:tr>
-      <w:tr>
-        <w:trPr>
-          <w:cantSplit/>
-          <w:jc w:val="center"/>
-        </w:trPr>
-        <w:tc>
-          <w:tcPr>
-            <w:tcW w:w="3182" w:type="dxa"/>
-            <w:vAlign w:val="center"/>
-          </w:tcPr>
-          <w:p>
-            <w:pPr>
-              <w:spacing w:after="0" w:line="252" w:lineRule="auto"/>
-              <w:ind w:firstLine="0"/>
-              <w:jc w:val="left"/>
-            </w:pPr>
-            <w:r>
-              <w:rPr>
-                <w:sz w:val="21"/>
-              </w:rPr>
-              <w:t>core</w:t>
-            </w:r>
-          </w:p>
-        </w:tc>
-        <w:tc>
-          <w:tcPr>
-            <w:tcW w:w="3182" w:type="dxa"/>
-            <w:vAlign w:val="center"/>
-          </w:tcPr>
-          <w:p>
-            <w:pPr>
-              <w:spacing w:after="0" w:line="252" w:lineRule="auto"/>
-              <w:ind w:firstLine="0"/>
-              <w:jc w:val="left"/>
-            </w:pPr>
-            <w:r>
-              <w:rPr>
-                <w:sz w:val="21"/>
-              </w:rPr>
-              <w:t>reports/generated/playwright-results.json</w:t>
-            </w:r>
-          </w:p>
-        </w:tc>
-        <w:tc>
-          <w:tcPr>
-            <w:tcW w:w="3182" w:type="dxa"/>
-            <w:vAlign w:val="center"/>
-          </w:tcPr>
-          <w:p>
-            <w:pPr>
-              <w:spacing w:after="0" w:line="252" w:lineRule="auto"/>
-              <w:ind w:firstLine="0"/>
-              <w:jc w:val="left"/>
-            </w:pPr>
-            <w:r>
-              <w:rPr>
-                <w:sz w:val="21"/>
-              </w:rPr>
-              <w:t>b30391321d22a00d08beef297fdbe38202e9667f8e3b0dc097897597a401a0ef</w:t>
-            </w:r>
-          </w:p>
-        </w:tc>
-      </w:tr>
-      <w:tr>
-        <w:trPr>
-          <w:cantSplit/>
-          <w:jc w:val="center"/>
-        </w:trPr>
-        <w:tc>
-          <w:tcPr>
-            <w:tcW w:w="3182" w:type="dxa"/>
-            <w:shd w:val="clear" w:color="auto" w:fill="F7F9FC"/>
-            <w:vAlign w:val="center"/>
-          </w:tcPr>
-          <w:p>
-            <w:pPr>
-              <w:spacing w:after="0" w:line="252" w:lineRule="auto"/>
-              <w:ind w:firstLine="0"/>
-              <w:jc w:val="left"/>
-            </w:pPr>
-            <w:r>
-              <w:rPr>
-                <w:sz w:val="21"/>
-              </w:rPr>
-              <w:t>evidence</w:t>
-            </w:r>
-          </w:p>
-        </w:tc>
-        <w:tc>
-          <w:tcPr>
-            <w:tcW w:w="3182" w:type="dxa"/>
-            <w:shd w:val="clear" w:color="auto" w:fill="F7F9FC"/>
-            <w:vAlign w:val="center"/>
-          </w:tcPr>
-          <w:p>
-            <w:pPr>
-              <w:spacing w:after="0" w:line="252" w:lineRule="auto"/>
-              <w:ind w:firstLine="0"/>
-              <w:jc w:val="left"/>
-            </w:pPr>
-            <w:r>
-              <w:rPr>
-                <w:sz w:val="21"/>
-              </w:rPr>
-              <w:t>reports/generated/k6/availability-summary.json</w:t>
-            </w:r>
-          </w:p>
-        </w:tc>
-        <w:tc>
-          <w:tcPr>
-            <w:tcW w:w="3182" w:type="dxa"/>
-            <w:shd w:val="clear" w:color="auto" w:fill="F7F9FC"/>
-            <w:vAlign w:val="center"/>
-          </w:tcPr>
-          <w:p>
-            <w:pPr>
-              <w:spacing w:after="0" w:line="252" w:lineRule="auto"/>
-              <w:ind w:firstLine="0"/>
-              <w:jc w:val="left"/>
-            </w:pPr>
-            <w:r>
-              <w:rPr>
-                <w:sz w:val="21"/>
-              </w:rPr>
-              <w:t>f1216fc9a4218c529585a92b8d0297161ef30c88e1b0195a1c3ad21ffad842cd</w:t>
-            </w:r>
-          </w:p>
-        </w:tc>
-      </w:tr>
-      <w:tr>
-        <w:trPr>
-          <w:cantSplit/>
-          <w:jc w:val="center"/>
-        </w:trPr>
-        <w:tc>
-          <w:tcPr>
-            <w:tcW w:w="3182" w:type="dxa"/>
-            <w:vAlign w:val="center"/>
-          </w:tcPr>
-          <w:p>
-            <w:pPr>
-              <w:spacing w:after="0" w:line="252" w:lineRule="auto"/>
-              <w:ind w:firstLine="0"/>
-              <w:jc w:val="left"/>
-            </w:pPr>
-            <w:r>
-              <w:rPr>
-                <w:sz w:val="21"/>
-              </w:rPr>
-              <w:t>evidence</w:t>
-            </w:r>
-          </w:p>
-        </w:tc>
-        <w:tc>
-          <w:tcPr>
-            <w:tcW w:w="3182" w:type="dxa"/>
-            <w:vAlign w:val="center"/>
-          </w:tcPr>
-          <w:p>
-            <w:pPr>
-              <w:spacing w:after="0" w:line="252" w:lineRule="auto"/>
-              <w:ind w:firstLine="0"/>
-              <w:jc w:val="left"/>
-            </w:pPr>
-            <w:r>
-              <w:rPr>
-                <w:sz w:val="21"/>
-              </w:rPr>
-              <w:t>reports/generated/k6/booking-race-summary.json</w:t>
-            </w:r>
-          </w:p>
-        </w:tc>
-        <w:tc>
-          <w:tcPr>
-            <w:tcW w:w="3182" w:type="dxa"/>
-            <w:vAlign w:val="center"/>
-          </w:tcPr>
-          <w:p>
-            <w:pPr>
-              <w:spacing w:after="0" w:line="252" w:lineRule="auto"/>
-              <w:ind w:firstLine="0"/>
-              <w:jc w:val="left"/>
-            </w:pPr>
-            <w:r>
-              <w:rPr>
-                <w:sz w:val="21"/>
-              </w:rPr>
-              <w:t>87eff69a83a1c1718bb39e90f7973823398055a1a06cfb8dddbe117e2797c496</w:t>
-            </w:r>
-          </w:p>
-        </w:tc>
-      </w:tr>
-      <w:tr>
-        <w:trPr>
-          <w:cantSplit/>
-          <w:jc w:val="center"/>
-        </w:trPr>
-        <w:tc>
-          <w:tcPr>
-            <w:tcW w:w="3182" w:type="dxa"/>
-            <w:shd w:val="clear" w:color="auto" w:fill="F7F9FC"/>
-            <w:vAlign w:val="center"/>
-          </w:tcPr>
-          <w:p>
-            <w:pPr>
-              <w:spacing w:after="0" w:line="252" w:lineRule="auto"/>
-              <w:ind w:firstLine="0"/>
-              <w:jc w:val="left"/>
-            </w:pPr>
-            <w:r>
-              <w:rPr>
-                <w:sz w:val="21"/>
-              </w:rPr>
-              <w:t>evidence</w:t>
-            </w:r>
-          </w:p>
-        </w:tc>
-        <w:tc>
-          <w:tcPr>
-            <w:tcW w:w="3182" w:type="dxa"/>
-            <w:shd w:val="clear" w:color="auto" w:fill="F7F9FC"/>
-            <w:vAlign w:val="center"/>
-          </w:tcPr>
-          <w:p>
-            <w:pPr>
-              <w:spacing w:after="0" w:line="252" w:lineRule="auto"/>
-              <w:ind w:firstLine="0"/>
-              <w:jc w:val="left"/>
-            </w:pPr>
-            <w:r>
-              <w:rPr>
-                <w:sz w:val="21"/>
-              </w:rPr>
-              <w:t>reports/generated/lighthouse/report.json</w:t>
-            </w:r>
-          </w:p>
-        </w:tc>
-        <w:tc>
-          <w:tcPr>
-            <w:tcW w:w="3182" w:type="dxa"/>
-            <w:shd w:val="clear" w:color="auto" w:fill="F7F9FC"/>
-            <w:vAlign w:val="center"/>
-          </w:tcPr>
-          <w:p>
-            <w:pPr>
-              <w:spacing w:after="0" w:line="252" w:lineRule="auto"/>
-              <w:ind w:firstLine="0"/>
-              <w:jc w:val="left"/>
-            </w:pPr>
-            <w:r>
-              <w:rPr>
-                <w:sz w:val="21"/>
-              </w:rPr>
-              <w:t>065766fabdcfccefa71da33567b8f1b6e7e6fa361f6d438b38888474e267cfb8</w:t>
-            </w:r>
-          </w:p>
-        </w:tc>
-      </w:tr>
-      <w:tr>
-        <w:trPr>
-          <w:cantSplit/>
-          <w:jc w:val="center"/>
-        </w:trPr>
-        <w:tc>
-          <w:tcPr>
-            <w:tcW w:w="3182" w:type="dxa"/>
-            <w:vAlign w:val="center"/>
-          </w:tcPr>
-          <w:p>
-            <w:pPr>
-              <w:spacing w:after="0" w:line="252" w:lineRule="auto"/>
-              <w:ind w:firstLine="0"/>
-              <w:jc w:val="left"/>
-            </w:pPr>
-            <w:r>
-              <w:rPr>
-                <w:sz w:val="21"/>
-              </w:rPr>
-              <w:t>evidence</w:t>
-            </w:r>
-          </w:p>
-        </w:tc>
-        <w:tc>
-          <w:tcPr>
-            <w:tcW w:w="3182" w:type="dxa"/>
-            <w:vAlign w:val="center"/>
-          </w:tcPr>
-          <w:p>
-            <w:pPr>
-              <w:spacing w:after="0" w:line="252" w:lineRule="auto"/>
-              <w:ind w:firstLine="0"/>
-              <w:jc w:val="left"/>
-            </w:pPr>
-            <w:r>
-              <w:rPr>
-                <w:sz w:val="21"/>
-              </w:rPr>
-              <w:t>reports/generated/zap/frontend.json</w:t>
-            </w:r>
-          </w:p>
-        </w:tc>
-        <w:tc>
-          <w:tcPr>
-            <w:tcW w:w="3182" w:type="dxa"/>
-            <w:vAlign w:val="center"/>
-          </w:tcPr>
-          <w:p>
-            <w:pPr>
-              <w:spacing w:after="0" w:line="252" w:lineRule="auto"/>
-              <w:ind w:firstLine="0"/>
-              <w:jc w:val="left"/>
-            </w:pPr>
-            <w:r>
-              <w:rPr>
-                <w:sz w:val="21"/>
-              </w:rPr>
-              <w:t>a2a01d98e43810040cbf5624e4ce11dc5959746993da55234208bfe75c34a615</w:t>
-            </w:r>
-          </w:p>
-        </w:tc>
-      </w:tr>
-      <w:tr>
-        <w:trPr>
-          <w:cantSplit/>
-          <w:jc w:val="center"/>
-        </w:trPr>
-        <w:tc>
-          <w:tcPr>
-            <w:tcW w:w="3182" w:type="dxa"/>
-            <w:shd w:val="clear" w:color="auto" w:fill="F7F9FC"/>
-            <w:vAlign w:val="center"/>
-          </w:tcPr>
-          <w:p>
-            <w:pPr>
-              <w:spacing w:after="0" w:line="252" w:lineRule="auto"/>
-              <w:ind w:firstLine="0"/>
-              <w:jc w:val="left"/>
-            </w:pPr>
-            <w:r>
-              <w:rPr>
-                <w:sz w:val="21"/>
-              </w:rPr>
-              <w:t>evidence</w:t>
-            </w:r>
-          </w:p>
-        </w:tc>
-        <w:tc>
-          <w:tcPr>
-            <w:tcW w:w="3182" w:type="dxa"/>
-            <w:shd w:val="clear" w:color="auto" w:fill="F7F9FC"/>
-            <w:vAlign w:val="center"/>
-          </w:tcPr>
-          <w:p>
-            <w:pPr>
-              <w:spacing w:after="0" w:line="252" w:lineRule="auto"/>
-              <w:ind w:firstLine="0"/>
-              <w:jc w:val="left"/>
-            </w:pPr>
-            <w:r>
-              <w:rPr>
-                <w:sz w:val="21"/>
-              </w:rPr>
-              <w:t>reports/generated/zap/api.json</w:t>
-            </w:r>
-          </w:p>
-        </w:tc>
-        <w:tc>
-          <w:tcPr>
-            <w:tcW w:w="3182" w:type="dxa"/>
-            <w:shd w:val="clear" w:color="auto" w:fill="F7F9FC"/>
-            <w:vAlign w:val="center"/>
-          </w:tcPr>
-          <w:p>
-            <w:pPr>
-              <w:spacing w:after="0" w:line="252" w:lineRule="auto"/>
-              <w:ind w:firstLine="0"/>
-              <w:jc w:val="left"/>
-            </w:pPr>
-            <w:r>
-              <w:rPr>
-                <w:sz w:val="21"/>
-              </w:rPr>
-              <w:t>e11a1f891556c1daf122366f3beb0df165dae71a97e25e06292e26537a80682d</w:t>
-            </w:r>
-          </w:p>
-        </w:tc>
-      </w:tr>
-    </w:tbl>
-    <w:p>
-      <w:pPr>
-        <w:spacing w:after="0"/>
-      </w:pPr>
-    </w:p>
-    <w:p>
-      <w:pPr>
-        <w:ind w:firstLine="0"/>
-      </w:pPr>
-      <w:r>
-        <w:t>Commit kiểm thử: 14cd9a346ae88dd9fc68e9a2fa74f30a06614777. Thời điểm xác minh: 2026-10-03T17:37:40Z. Repository: https://github.com/bachiep/studyspace-quality-assurance.</w:t>
-      </w:r>
-    </w:p>
-    <w:p>
-      <w:pPr>
         <w:pStyle w:val="u2"/>
       </w:pPr>
-      <w:bookmarkStart w:id="55" w:name="_Toc242000244"/>
+      <w:bookmarkStart w:id="54" w:name="_Toc242001012"/>
       <w:r>
         <w:t>PH</w:t>
       </w:r>
@@ -19290,7 +18546,7 @@
         <w:t>Ụ</w:t>
       </w:r>
       <w:r>
-        <w:t>C E. QUY TRÌNH TÁI L</w:t>
+        <w:t>C D. QUY TRÌNH TÁI L</w:t>
       </w:r>
       <w:r>
         <w:t>Ậ</w:t>
@@ -19298,7 +18554,7 @@
       <w:r>
         <w:t>P</w:t>
       </w:r>
-      <w:bookmarkEnd w:id="55"/>
+      <w:bookmarkEnd w:id="54"/>
     </w:p>
     <w:p>
       <w:r>
@@ -19584,31 +18840,31 @@
       </w:rPr>
     </w:lvl>
   </w:abstractNum>
-  <w:num w:numId="1" w16cid:durableId="1930652324">
+  <w:num w:numId="1" w16cid:durableId="1496259823">
     <w:abstractNumId w:val="8"/>
   </w:num>
-  <w:num w:numId="2" w16cid:durableId="1574391973">
+  <w:num w:numId="2" w16cid:durableId="1233156391">
     <w:abstractNumId w:val="6"/>
   </w:num>
-  <w:num w:numId="3" w16cid:durableId="13844818">
+  <w:num w:numId="3" w16cid:durableId="1137836365">
     <w:abstractNumId w:val="5"/>
   </w:num>
-  <w:num w:numId="4" w16cid:durableId="71201292">
+  <w:num w:numId="4" w16cid:durableId="500898570">
     <w:abstractNumId w:val="4"/>
   </w:num>
-  <w:num w:numId="5" w16cid:durableId="1359045878">
+  <w:num w:numId="5" w16cid:durableId="1946421257">
     <w:abstractNumId w:val="7"/>
   </w:num>
-  <w:num w:numId="6" w16cid:durableId="2076970657">
+  <w:num w:numId="6" w16cid:durableId="586353953">
     <w:abstractNumId w:val="3"/>
   </w:num>
-  <w:num w:numId="7" w16cid:durableId="1382247586">
+  <w:num w:numId="7" w16cid:durableId="372267388">
     <w:abstractNumId w:val="2"/>
   </w:num>
-  <w:num w:numId="8" w16cid:durableId="858783762">
+  <w:num w:numId="8" w16cid:durableId="1091315159">
     <w:abstractNumId w:val="1"/>
   </w:num>
-  <w:num w:numId="9" w16cid:durableId="695235761">
+  <w:num w:numId="9" w16cid:durableId="413823651">
     <w:abstractNumId w:val="0"/>
   </w:num>
 </w:numbering>
@@ -31003,7 +30259,7 @@
     <w:autoRedefine/>
     <w:uiPriority w:val="39"/>
     <w:unhideWhenUsed/>
-    <w:rsid w:val="00780172"/>
+    <w:rsid w:val="001B31E3"/>
     <w:pPr>
       <w:spacing w:after="100"/>
     </w:pPr>
@@ -31015,7 +30271,7 @@
     <w:autoRedefine/>
     <w:uiPriority w:val="39"/>
     <w:unhideWhenUsed/>
-    <w:rsid w:val="00780172"/>
+    <w:rsid w:val="001B31E3"/>
     <w:pPr>
       <w:spacing w:after="100"/>
       <w:ind w:left="260"/>
@@ -31028,7 +30284,7 @@
     <w:autoRedefine/>
     <w:uiPriority w:val="39"/>
     <w:unhideWhenUsed/>
-    <w:rsid w:val="00780172"/>
+    <w:rsid w:val="001B31E3"/>
     <w:pPr>
       <w:spacing w:after="100"/>
       <w:ind w:left="520"/>
@@ -31039,7 +30295,7 @@
     <w:basedOn w:val="Phngmcinhcuaoanvn"/>
     <w:uiPriority w:val="99"/>
     <w:unhideWhenUsed/>
-    <w:rsid w:val="00780172"/>
+    <w:rsid w:val="001B31E3"/>
     <w:rPr>
       <w:color w:val="0000FF" w:themeColor="hyperlink"/>
       <w:u w:val="single"/>

</xml_diff>

<commit_message>
docs: add verified project milestones to report
</commit_message>
<xml_diff>
--- a/output/docx/StudySpace-BaoCao-DanhGia-KiemDinh.docx
+++ b/output/docx/StudySpace-BaoCao-DanhGia-KiemDinh.docx
@@ -166,7 +166,7 @@
       <w:pPr>
         <w:pStyle w:val="u1"/>
       </w:pPr>
-      <w:bookmarkStart w:id="0" w:name="_Toc242000958"/>
+      <w:bookmarkStart w:id="0" w:name="_Toc242001659"/>
       <w:r>
         <w:lastRenderedPageBreak/>
         <w:t>L</w:t>
@@ -199,7 +199,7 @@
       <w:pPr>
         <w:pStyle w:val="u1"/>
       </w:pPr>
-      <w:bookmarkStart w:id="1" w:name="_Toc242000959"/>
+      <w:bookmarkStart w:id="1" w:name="_Toc242001660"/>
       <w:r>
         <w:lastRenderedPageBreak/>
         <w:t>TÓM T</w:t>
@@ -250,7 +250,7 @@
       <w:pPr>
         <w:pStyle w:val="u1"/>
       </w:pPr>
-      <w:bookmarkStart w:id="2" w:name="_Toc242000960"/>
+      <w:bookmarkStart w:id="2" w:name="_Toc242001661"/>
       <w:r>
         <w:lastRenderedPageBreak/>
         <w:t>M</w:t>
@@ -295,7 +295,7 @@
       <w:r>
         <w:fldChar w:fldCharType="separate"/>
       </w:r>
-      <w:hyperlink w:anchor="_Toc242000958" w:history="1">
+      <w:hyperlink w:anchor="_Toc242001659" w:history="1">
         <w:r>
           <w:rPr>
             <w:rStyle w:val="Siuktni"/>
@@ -322,7 +322,7 @@
             <w:noProof/>
             <w:webHidden/>
           </w:rPr>
-          <w:instrText xml:space="preserve"> PAGEREF _Toc242000958 \h </w:instrText>
+          <w:instrText xml:space="preserve"> PAGEREF _Toc242001659 \h </w:instrText>
         </w:r>
         <w:r>
           <w:rPr>
@@ -370,7 +370,7 @@
           <w14:ligatures w14:val="standardContextual"/>
         </w:rPr>
       </w:pPr>
-      <w:hyperlink w:anchor="_Toc242000959" w:history="1">
+      <w:hyperlink w:anchor="_Toc242001660" w:history="1">
         <w:r>
           <w:rPr>
             <w:rStyle w:val="Siuktni"/>
@@ -397,7 +397,7 @@
             <w:noProof/>
             <w:webHidden/>
           </w:rPr>
-          <w:instrText xml:space="preserve"> PAGEREF _Toc242000959 \h </w:instrText>
+          <w:instrText xml:space="preserve"> PAGEREF _Toc242001660 \h </w:instrText>
         </w:r>
         <w:r>
           <w:rPr>
@@ -445,7 +445,7 @@
           <w14:ligatures w14:val="standardContextual"/>
         </w:rPr>
       </w:pPr>
-      <w:hyperlink w:anchor="_Toc242000960" w:history="1">
+      <w:hyperlink w:anchor="_Toc242001661" w:history="1">
         <w:r>
           <w:rPr>
             <w:rStyle w:val="Siuktni"/>
@@ -472,7 +472,7 @@
             <w:noProof/>
             <w:webHidden/>
           </w:rPr>
-          <w:instrText xml:space="preserve"> PAGEREF _Toc242000960 \h </w:instrText>
+          <w:instrText xml:space="preserve"> PAGEREF _Toc242001661 \h </w:instrText>
         </w:r>
         <w:r>
           <w:rPr>
@@ -520,7 +520,7 @@
           <w14:ligatures w14:val="standardContextual"/>
         </w:rPr>
       </w:pPr>
-      <w:hyperlink w:anchor="_Toc242000961" w:history="1">
+      <w:hyperlink w:anchor="_Toc242001662" w:history="1">
         <w:r>
           <w:rPr>
             <w:rStyle w:val="Siuktni"/>
@@ -547,7 +547,7 @@
             <w:noProof/>
             <w:webHidden/>
           </w:rPr>
-          <w:instrText xml:space="preserve"> PAGEREF _Toc242000961 \h </w:instrText>
+          <w:instrText xml:space="preserve"> PAGEREF _Toc242001662 \h </w:instrText>
         </w:r>
         <w:r>
           <w:rPr>
@@ -595,7 +595,7 @@
           <w14:ligatures w14:val="standardContextual"/>
         </w:rPr>
       </w:pPr>
-      <w:hyperlink w:anchor="_Toc242000962" w:history="1">
+      <w:hyperlink w:anchor="_Toc242001663" w:history="1">
         <w:r>
           <w:rPr>
             <w:rStyle w:val="Siuktni"/>
@@ -622,7 +622,7 @@
             <w:noProof/>
             <w:webHidden/>
           </w:rPr>
-          <w:instrText xml:space="preserve"> PAGEREF _Toc242000962 \h </w:instrText>
+          <w:instrText xml:space="preserve"> PAGEREF _Toc242001663 \h </w:instrText>
         </w:r>
         <w:r>
           <w:rPr>
@@ -670,7 +670,7 @@
           <w14:ligatures w14:val="standardContextual"/>
         </w:rPr>
       </w:pPr>
-      <w:hyperlink w:anchor="_Toc242000963" w:history="1">
+      <w:hyperlink w:anchor="_Toc242001664" w:history="1">
         <w:r>
           <w:rPr>
             <w:rStyle w:val="Siuktni"/>
@@ -697,7 +697,7 @@
             <w:noProof/>
             <w:webHidden/>
           </w:rPr>
-          <w:instrText xml:space="preserve"> PAGEREF _Toc242000963 \h </w:instrText>
+          <w:instrText xml:space="preserve"> PAGEREF _Toc242001664 \h </w:instrText>
         </w:r>
         <w:r>
           <w:rPr>
@@ -745,7 +745,7 @@
           <w14:ligatures w14:val="standardContextual"/>
         </w:rPr>
       </w:pPr>
-      <w:hyperlink w:anchor="_Toc242000964" w:history="1">
+      <w:hyperlink w:anchor="_Toc242001665" w:history="1">
         <w:r>
           <w:rPr>
             <w:rStyle w:val="Siuktni"/>
@@ -772,7 +772,7 @@
             <w:noProof/>
             <w:webHidden/>
           </w:rPr>
-          <w:instrText xml:space="preserve"> PAGEREF _Toc242000964 \h </w:instrText>
+          <w:instrText xml:space="preserve"> PAGEREF _Toc242001665 \h </w:instrText>
         </w:r>
         <w:r>
           <w:rPr>
@@ -820,7 +820,7 @@
           <w14:ligatures w14:val="standardContextual"/>
         </w:rPr>
       </w:pPr>
-      <w:hyperlink w:anchor="_Toc242000965" w:history="1">
+      <w:hyperlink w:anchor="_Toc242001666" w:history="1">
         <w:r>
           <w:rPr>
             <w:rStyle w:val="Siuktni"/>
@@ -847,7 +847,7 @@
             <w:noProof/>
             <w:webHidden/>
           </w:rPr>
-          <w:instrText xml:space="preserve"> PAGEREF _Toc242000965 \h </w:instrText>
+          <w:instrText xml:space="preserve"> PAGEREF _Toc242001666 \h </w:instrText>
         </w:r>
         <w:r>
           <w:rPr>
@@ -895,7 +895,7 @@
           <w14:ligatures w14:val="standardContextual"/>
         </w:rPr>
       </w:pPr>
-      <w:hyperlink w:anchor="_Toc242000966" w:history="1">
+      <w:hyperlink w:anchor="_Toc242001667" w:history="1">
         <w:r>
           <w:rPr>
             <w:rStyle w:val="Siuktni"/>
@@ -922,7 +922,7 @@
             <w:noProof/>
             <w:webHidden/>
           </w:rPr>
-          <w:instrText xml:space="preserve"> PAGEREF _Toc242000966 \h </w:instrText>
+          <w:instrText xml:space="preserve"> PAGEREF _Toc242001667 \h </w:instrText>
         </w:r>
         <w:r>
           <w:rPr>
@@ -943,6 +943,81 @@
             <w:webHidden/>
           </w:rPr>
           <w:t>9</w:t>
+        </w:r>
+        <w:r>
+          <w:rPr>
+            <w:noProof/>
+            <w:webHidden/>
+          </w:rPr>
+          <w:fldChar w:fldCharType="end"/>
+        </w:r>
+      </w:hyperlink>
+    </w:p>
+    <w:p>
+      <w:pPr>
+        <w:pStyle w:val="Mucluc2"/>
+        <w:tabs>
+          <w:tab w:val="right" w:leader="dot" w:pos="9537"/>
+        </w:tabs>
+        <w:rPr>
+          <w:rFonts w:asciiTheme="minorHAnsi" w:eastAsiaTheme="minorEastAsia" w:hAnsiTheme="minorHAnsi"/>
+          <w:noProof/>
+          <w:color w:val="auto"/>
+          <w:kern w:val="2"/>
+          <w:sz w:val="24"/>
+          <w:szCs w:val="24"/>
+          <w:lang w:val="vi-VN" w:eastAsia="vi-VN"/>
+          <w14:ligatures w14:val="standardContextual"/>
+        </w:rPr>
+      </w:pPr>
+      <w:hyperlink w:anchor="_Toc242001668" w:history="1">
+        <w:r>
+          <w:rPr>
+            <w:rStyle w:val="Siuktni"/>
+            <w:noProof/>
+          </w:rPr>
+          <w:t>1.5. Mốc thực hiện và kiểm soát thay đổi</w:t>
+        </w:r>
+        <w:r>
+          <w:rPr>
+            <w:noProof/>
+            <w:webHidden/>
+          </w:rPr>
+          <w:tab/>
+        </w:r>
+        <w:r>
+          <w:rPr>
+            <w:noProof/>
+            <w:webHidden/>
+          </w:rPr>
+          <w:fldChar w:fldCharType="begin"/>
+        </w:r>
+        <w:r>
+          <w:rPr>
+            <w:noProof/>
+            <w:webHidden/>
+          </w:rPr>
+          <w:instrText xml:space="preserve"> PAGEREF _Toc242001668 \h </w:instrText>
+        </w:r>
+        <w:r>
+          <w:rPr>
+            <w:noProof/>
+            <w:webHidden/>
+          </w:rPr>
+        </w:r>
+        <w:r>
+          <w:rPr>
+            <w:noProof/>
+            <w:webHidden/>
+          </w:rPr>
+          <w:fldChar w:fldCharType="separate"/>
+        </w:r>
+        <w:r>
+          <w:rPr>
+            <w:noProof/>
+            <w:webHidden/>
+          </w:rPr>
+          <w:t>10</w:t>
         </w:r>
         <w:r>
           <w:rPr>
@@ -970,7 +1045,7 @@
           <w14:ligatures w14:val="standardContextual"/>
         </w:rPr>
       </w:pPr>
-      <w:hyperlink w:anchor="_Toc242000967" w:history="1">
+      <w:hyperlink w:anchor="_Toc242001669" w:history="1">
         <w:r>
           <w:rPr>
             <w:rStyle w:val="Siuktni"/>
@@ -997,7 +1072,7 @@
             <w:noProof/>
             <w:webHidden/>
           </w:rPr>
-          <w:instrText xml:space="preserve"> PAGEREF _Toc242000967 \h </w:instrText>
+          <w:instrText xml:space="preserve"> PAGEREF _Toc242001669 \h </w:instrText>
         </w:r>
         <w:r>
           <w:rPr>
@@ -1045,7 +1120,7 @@
           <w14:ligatures w14:val="standardContextual"/>
         </w:rPr>
       </w:pPr>
-      <w:hyperlink w:anchor="_Toc242000968" w:history="1">
+      <w:hyperlink w:anchor="_Toc242001670" w:history="1">
         <w:r>
           <w:rPr>
             <w:rStyle w:val="Siuktni"/>
@@ -1072,7 +1147,7 @@
             <w:noProof/>
             <w:webHidden/>
           </w:rPr>
-          <w:instrText xml:space="preserve"> PAGEREF _Toc242000968 \h </w:instrText>
+          <w:instrText xml:space="preserve"> PAGEREF _Toc242001670 \h </w:instrText>
         </w:r>
         <w:r>
           <w:rPr>
@@ -1120,7 +1195,7 @@
           <w14:ligatures w14:val="standardContextual"/>
         </w:rPr>
       </w:pPr>
-      <w:hyperlink w:anchor="_Toc242000969" w:history="1">
+      <w:hyperlink w:anchor="_Toc242001671" w:history="1">
         <w:r>
           <w:rPr>
             <w:rStyle w:val="Siuktni"/>
@@ -1147,7 +1222,7 @@
             <w:noProof/>
             <w:webHidden/>
           </w:rPr>
-          <w:instrText xml:space="preserve"> PAGEREF _Toc242000969 \h </w:instrText>
+          <w:instrText xml:space="preserve"> PAGEREF _Toc242001671 \h </w:instrText>
         </w:r>
         <w:r>
           <w:rPr>
@@ -1195,7 +1270,7 @@
           <w14:ligatures w14:val="standardContextual"/>
         </w:rPr>
       </w:pPr>
-      <w:hyperlink w:anchor="_Toc242000970" w:history="1">
+      <w:hyperlink w:anchor="_Toc242001672" w:history="1">
         <w:r>
           <w:rPr>
             <w:rStyle w:val="Siuktni"/>
@@ -1222,7 +1297,7 @@
             <w:noProof/>
             <w:webHidden/>
           </w:rPr>
-          <w:instrText xml:space="preserve"> PAGEREF _Toc242000970 \h </w:instrText>
+          <w:instrText xml:space="preserve"> PAGEREF _Toc242001672 \h </w:instrText>
         </w:r>
         <w:r>
           <w:rPr>
@@ -1270,7 +1345,7 @@
           <w14:ligatures w14:val="standardContextual"/>
         </w:rPr>
       </w:pPr>
-      <w:hyperlink w:anchor="_Toc242000971" w:history="1">
+      <w:hyperlink w:anchor="_Toc242001673" w:history="1">
         <w:r>
           <w:rPr>
             <w:rStyle w:val="Siuktni"/>
@@ -1297,7 +1372,7 @@
             <w:noProof/>
             <w:webHidden/>
           </w:rPr>
-          <w:instrText xml:space="preserve"> PAGEREF _Toc242000971 \h </w:instrText>
+          <w:instrText xml:space="preserve"> PAGEREF _Toc242001673 \h </w:instrText>
         </w:r>
         <w:r>
           <w:rPr>
@@ -1345,7 +1420,7 @@
           <w14:ligatures w14:val="standardContextual"/>
         </w:rPr>
       </w:pPr>
-      <w:hyperlink w:anchor="_Toc242000972" w:history="1">
+      <w:hyperlink w:anchor="_Toc242001674" w:history="1">
         <w:r>
           <w:rPr>
             <w:rStyle w:val="Siuktni"/>
@@ -1372,7 +1447,7 @@
             <w:noProof/>
             <w:webHidden/>
           </w:rPr>
-          <w:instrText xml:space="preserve"> PAGEREF _Toc242000972 \h </w:instrText>
+          <w:instrText xml:space="preserve"> PAGEREF _Toc242001674 \h </w:instrText>
         </w:r>
         <w:r>
           <w:rPr>
@@ -1420,7 +1495,7 @@
           <w14:ligatures w14:val="standardContextual"/>
         </w:rPr>
       </w:pPr>
-      <w:hyperlink w:anchor="_Toc242000973" w:history="1">
+      <w:hyperlink w:anchor="_Toc242001675" w:history="1">
         <w:r>
           <w:rPr>
             <w:rStyle w:val="Siuktni"/>
@@ -1447,7 +1522,7 @@
             <w:noProof/>
             <w:webHidden/>
           </w:rPr>
-          <w:instrText xml:space="preserve"> PAGEREF _Toc242000973 \h </w:instrText>
+          <w:instrText xml:space="preserve"> PAGEREF _Toc242001675 \h </w:instrText>
         </w:r>
         <w:r>
           <w:rPr>
@@ -1495,7 +1570,7 @@
           <w14:ligatures w14:val="standardContextual"/>
         </w:rPr>
       </w:pPr>
-      <w:hyperlink w:anchor="_Toc242000974" w:history="1">
+      <w:hyperlink w:anchor="_Toc242001676" w:history="1">
         <w:r>
           <w:rPr>
             <w:rStyle w:val="Siuktni"/>
@@ -1522,7 +1597,7 @@
             <w:noProof/>
             <w:webHidden/>
           </w:rPr>
-          <w:instrText xml:space="preserve"> PAGEREF _Toc242000974 \h </w:instrText>
+          <w:instrText xml:space="preserve"> PAGEREF _Toc242001676 \h </w:instrText>
         </w:r>
         <w:r>
           <w:rPr>
@@ -1570,7 +1645,7 @@
           <w14:ligatures w14:val="standardContextual"/>
         </w:rPr>
       </w:pPr>
-      <w:hyperlink w:anchor="_Toc242000975" w:history="1">
+      <w:hyperlink w:anchor="_Toc242001677" w:history="1">
         <w:r>
           <w:rPr>
             <w:rStyle w:val="Siuktni"/>
@@ -1597,7 +1672,7 @@
             <w:noProof/>
             <w:webHidden/>
           </w:rPr>
-          <w:instrText xml:space="preserve"> PAGEREF _Toc242000975 \h </w:instrText>
+          <w:instrText xml:space="preserve"> PAGEREF _Toc242001677 \h </w:instrText>
         </w:r>
         <w:r>
           <w:rPr>
@@ -1645,7 +1720,7 @@
           <w14:ligatures w14:val="standardContextual"/>
         </w:rPr>
       </w:pPr>
-      <w:hyperlink w:anchor="_Toc242000976" w:history="1">
+      <w:hyperlink w:anchor="_Toc242001678" w:history="1">
         <w:r>
           <w:rPr>
             <w:rStyle w:val="Siuktni"/>
@@ -1672,7 +1747,7 @@
             <w:noProof/>
             <w:webHidden/>
           </w:rPr>
-          <w:instrText xml:space="preserve"> PAGEREF _Toc242000976 \h </w:instrText>
+          <w:instrText xml:space="preserve"> PAGEREF _Toc242001678 \h </w:instrText>
         </w:r>
         <w:r>
           <w:rPr>
@@ -1720,7 +1795,7 @@
           <w14:ligatures w14:val="standardContextual"/>
         </w:rPr>
       </w:pPr>
-      <w:hyperlink w:anchor="_Toc242000977" w:history="1">
+      <w:hyperlink w:anchor="_Toc242001679" w:history="1">
         <w:r>
           <w:rPr>
             <w:rStyle w:val="Siuktni"/>
@@ -1747,7 +1822,7 @@
             <w:noProof/>
             <w:webHidden/>
           </w:rPr>
-          <w:instrText xml:space="preserve"> PAGEREF _Toc242000977 \h </w:instrText>
+          <w:instrText xml:space="preserve"> PAGEREF _Toc242001679 \h </w:instrText>
         </w:r>
         <w:r>
           <w:rPr>
@@ -1795,7 +1870,7 @@
           <w14:ligatures w14:val="standardContextual"/>
         </w:rPr>
       </w:pPr>
-      <w:hyperlink w:anchor="_Toc242000978" w:history="1">
+      <w:hyperlink w:anchor="_Toc242001680" w:history="1">
         <w:r>
           <w:rPr>
             <w:rStyle w:val="Siuktni"/>
@@ -1822,7 +1897,7 @@
             <w:noProof/>
             <w:webHidden/>
           </w:rPr>
-          <w:instrText xml:space="preserve"> PAGEREF _Toc242000978 \h </w:instrText>
+          <w:instrText xml:space="preserve"> PAGEREF _Toc242001680 \h </w:instrText>
         </w:r>
         <w:r>
           <w:rPr>
@@ -1870,7 +1945,7 @@
           <w14:ligatures w14:val="standardContextual"/>
         </w:rPr>
       </w:pPr>
-      <w:hyperlink w:anchor="_Toc242000979" w:history="1">
+      <w:hyperlink w:anchor="_Toc242001681" w:history="1">
         <w:r>
           <w:rPr>
             <w:rStyle w:val="Siuktni"/>
@@ -1897,7 +1972,7 @@
             <w:noProof/>
             <w:webHidden/>
           </w:rPr>
-          <w:instrText xml:space="preserve"> PAGEREF _Toc242000979 \h </w:instrText>
+          <w:instrText xml:space="preserve"> PAGEREF _Toc242001681 \h </w:instrText>
         </w:r>
         <w:r>
           <w:rPr>
@@ -1945,7 +2020,7 @@
           <w14:ligatures w14:val="standardContextual"/>
         </w:rPr>
       </w:pPr>
-      <w:hyperlink w:anchor="_Toc242000980" w:history="1">
+      <w:hyperlink w:anchor="_Toc242001682" w:history="1">
         <w:r>
           <w:rPr>
             <w:rStyle w:val="Siuktni"/>
@@ -1972,7 +2047,7 @@
             <w:noProof/>
             <w:webHidden/>
           </w:rPr>
-          <w:instrText xml:space="preserve"> PAGEREF _Toc242000980 \h </w:instrText>
+          <w:instrText xml:space="preserve"> PAGEREF _Toc242001682 \h </w:instrText>
         </w:r>
         <w:r>
           <w:rPr>
@@ -2020,7 +2095,7 @@
           <w14:ligatures w14:val="standardContextual"/>
         </w:rPr>
       </w:pPr>
-      <w:hyperlink w:anchor="_Toc242000981" w:history="1">
+      <w:hyperlink w:anchor="_Toc242001683" w:history="1">
         <w:r>
           <w:rPr>
             <w:rStyle w:val="Siuktni"/>
@@ -2047,7 +2122,7 @@
             <w:noProof/>
             <w:webHidden/>
           </w:rPr>
-          <w:instrText xml:space="preserve"> PAGEREF _Toc242000981 \h </w:instrText>
+          <w:instrText xml:space="preserve"> PAGEREF _Toc242001683 \h </w:instrText>
         </w:r>
         <w:r>
           <w:rPr>
@@ -2095,7 +2170,7 @@
           <w14:ligatures w14:val="standardContextual"/>
         </w:rPr>
       </w:pPr>
-      <w:hyperlink w:anchor="_Toc242000982" w:history="1">
+      <w:hyperlink w:anchor="_Toc242001684" w:history="1">
         <w:r>
           <w:rPr>
             <w:rStyle w:val="Siuktni"/>
@@ -2122,7 +2197,7 @@
             <w:noProof/>
             <w:webHidden/>
           </w:rPr>
-          <w:instrText xml:space="preserve"> PAGEREF _Toc242000982 \h </w:instrText>
+          <w:instrText xml:space="preserve"> PAGEREF _Toc242001684 \h </w:instrText>
         </w:r>
         <w:r>
           <w:rPr>
@@ -2170,7 +2245,7 @@
           <w14:ligatures w14:val="standardContextual"/>
         </w:rPr>
       </w:pPr>
-      <w:hyperlink w:anchor="_Toc242000983" w:history="1">
+      <w:hyperlink w:anchor="_Toc242001685" w:history="1">
         <w:r>
           <w:rPr>
             <w:rStyle w:val="Siuktni"/>
@@ -2197,7 +2272,7 @@
             <w:noProof/>
             <w:webHidden/>
           </w:rPr>
-          <w:instrText xml:space="preserve"> PAGEREF _Toc242000983 \h </w:instrText>
+          <w:instrText xml:space="preserve"> PAGEREF _Toc242001685 \h </w:instrText>
         </w:r>
         <w:r>
           <w:rPr>
@@ -2245,7 +2320,7 @@
           <w14:ligatures w14:val="standardContextual"/>
         </w:rPr>
       </w:pPr>
-      <w:hyperlink w:anchor="_Toc242000984" w:history="1">
+      <w:hyperlink w:anchor="_Toc242001686" w:history="1">
         <w:r>
           <w:rPr>
             <w:rStyle w:val="Siuktni"/>
@@ -2272,7 +2347,7 @@
             <w:noProof/>
             <w:webHidden/>
           </w:rPr>
-          <w:instrText xml:space="preserve"> PAGEREF _Toc242000984 \h </w:instrText>
+          <w:instrText xml:space="preserve"> PAGEREF _Toc242001686 \h </w:instrText>
         </w:r>
         <w:r>
           <w:rPr>
@@ -2320,7 +2395,7 @@
           <w14:ligatures w14:val="standardContextual"/>
         </w:rPr>
       </w:pPr>
-      <w:hyperlink w:anchor="_Toc242000985" w:history="1">
+      <w:hyperlink w:anchor="_Toc242001687" w:history="1">
         <w:r>
           <w:rPr>
             <w:rStyle w:val="Siuktni"/>
@@ -2347,7 +2422,7 @@
             <w:noProof/>
             <w:webHidden/>
           </w:rPr>
-          <w:instrText xml:space="preserve"> PAGEREF _Toc242000985 \h </w:instrText>
+          <w:instrText xml:space="preserve"> PAGEREF _Toc242001687 \h </w:instrText>
         </w:r>
         <w:r>
           <w:rPr>
@@ -2395,7 +2470,7 @@
           <w14:ligatures w14:val="standardContextual"/>
         </w:rPr>
       </w:pPr>
-      <w:hyperlink w:anchor="_Toc242000986" w:history="1">
+      <w:hyperlink w:anchor="_Toc242001688" w:history="1">
         <w:r>
           <w:rPr>
             <w:rStyle w:val="Siuktni"/>
@@ -2422,7 +2497,7 @@
             <w:noProof/>
             <w:webHidden/>
           </w:rPr>
-          <w:instrText xml:space="preserve"> PAGEREF _Toc242000986 \h </w:instrText>
+          <w:instrText xml:space="preserve"> PAGEREF _Toc242001688 \h </w:instrText>
         </w:r>
         <w:r>
           <w:rPr>
@@ -2470,7 +2545,7 @@
           <w14:ligatures w14:val="standardContextual"/>
         </w:rPr>
       </w:pPr>
-      <w:hyperlink w:anchor="_Toc242000987" w:history="1">
+      <w:hyperlink w:anchor="_Toc242001689" w:history="1">
         <w:r>
           <w:rPr>
             <w:rStyle w:val="Siuktni"/>
@@ -2497,7 +2572,7 @@
             <w:noProof/>
             <w:webHidden/>
           </w:rPr>
-          <w:instrText xml:space="preserve"> PAGEREF _Toc242000987 \h </w:instrText>
+          <w:instrText xml:space="preserve"> PAGEREF _Toc242001689 \h </w:instrText>
         </w:r>
         <w:r>
           <w:rPr>
@@ -2545,7 +2620,7 @@
           <w14:ligatures w14:val="standardContextual"/>
         </w:rPr>
       </w:pPr>
-      <w:hyperlink w:anchor="_Toc242000988" w:history="1">
+      <w:hyperlink w:anchor="_Toc242001690" w:history="1">
         <w:r>
           <w:rPr>
             <w:rStyle w:val="Siuktni"/>
@@ -2572,7 +2647,7 @@
             <w:noProof/>
             <w:webHidden/>
           </w:rPr>
-          <w:instrText xml:space="preserve"> PAGEREF _Toc242000988 \h </w:instrText>
+          <w:instrText xml:space="preserve"> PAGEREF _Toc242001690 \h </w:instrText>
         </w:r>
         <w:r>
           <w:rPr>
@@ -2620,7 +2695,7 @@
           <w14:ligatures w14:val="standardContextual"/>
         </w:rPr>
       </w:pPr>
-      <w:hyperlink w:anchor="_Toc242000989" w:history="1">
+      <w:hyperlink w:anchor="_Toc242001691" w:history="1">
         <w:r>
           <w:rPr>
             <w:rStyle w:val="Siuktni"/>
@@ -2647,7 +2722,7 @@
             <w:noProof/>
             <w:webHidden/>
           </w:rPr>
-          <w:instrText xml:space="preserve"> PAGEREF _Toc242000989 \h </w:instrText>
+          <w:instrText xml:space="preserve"> PAGEREF _Toc242001691 \h </w:instrText>
         </w:r>
         <w:r>
           <w:rPr>
@@ -2695,7 +2770,7 @@
           <w14:ligatures w14:val="standardContextual"/>
         </w:rPr>
       </w:pPr>
-      <w:hyperlink w:anchor="_Toc242000990" w:history="1">
+      <w:hyperlink w:anchor="_Toc242001692" w:history="1">
         <w:r>
           <w:rPr>
             <w:rStyle w:val="Siuktni"/>
@@ -2722,7 +2797,7 @@
             <w:noProof/>
             <w:webHidden/>
           </w:rPr>
-          <w:instrText xml:space="preserve"> PAGEREF _Toc242000990 \h </w:instrText>
+          <w:instrText xml:space="preserve"> PAGEREF _Toc242001692 \h </w:instrText>
         </w:r>
         <w:r>
           <w:rPr>
@@ -2770,7 +2845,7 @@
           <w14:ligatures w14:val="standardContextual"/>
         </w:rPr>
       </w:pPr>
-      <w:hyperlink w:anchor="_Toc242000991" w:history="1">
+      <w:hyperlink w:anchor="_Toc242001693" w:history="1">
         <w:r>
           <w:rPr>
             <w:rStyle w:val="Siuktni"/>
@@ -2797,7 +2872,7 @@
             <w:noProof/>
             <w:webHidden/>
           </w:rPr>
-          <w:instrText xml:space="preserve"> PAGEREF _Toc242000991 \h </w:instrText>
+          <w:instrText xml:space="preserve"> PAGEREF _Toc242001693 \h </w:instrText>
         </w:r>
         <w:r>
           <w:rPr>
@@ -2845,7 +2920,7 @@
           <w14:ligatures w14:val="standardContextual"/>
         </w:rPr>
       </w:pPr>
-      <w:hyperlink w:anchor="_Toc242000992" w:history="1">
+      <w:hyperlink w:anchor="_Toc242001694" w:history="1">
         <w:r>
           <w:rPr>
             <w:rStyle w:val="Siuktni"/>
@@ -2872,7 +2947,7 @@
             <w:noProof/>
             <w:webHidden/>
           </w:rPr>
-          <w:instrText xml:space="preserve"> PAGEREF _Toc242000992 \h </w:instrText>
+          <w:instrText xml:space="preserve"> PAGEREF _Toc242001694 \h </w:instrText>
         </w:r>
         <w:r>
           <w:rPr>
@@ -2920,7 +2995,7 @@
           <w14:ligatures w14:val="standardContextual"/>
         </w:rPr>
       </w:pPr>
-      <w:hyperlink w:anchor="_Toc242000993" w:history="1">
+      <w:hyperlink w:anchor="_Toc242001695" w:history="1">
         <w:r>
           <w:rPr>
             <w:rStyle w:val="Siuktni"/>
@@ -2947,7 +3022,7 @@
             <w:noProof/>
             <w:webHidden/>
           </w:rPr>
-          <w:instrText xml:space="preserve"> PAGEREF _Toc242000993 \h </w:instrText>
+          <w:instrText xml:space="preserve"> PAGEREF _Toc242001695 \h </w:instrText>
         </w:r>
         <w:r>
           <w:rPr>
@@ -2995,7 +3070,7 @@
           <w14:ligatures w14:val="standardContextual"/>
         </w:rPr>
       </w:pPr>
-      <w:hyperlink w:anchor="_Toc242000994" w:history="1">
+      <w:hyperlink w:anchor="_Toc242001696" w:history="1">
         <w:r>
           <w:rPr>
             <w:rStyle w:val="Siuktni"/>
@@ -3022,7 +3097,7 @@
             <w:noProof/>
             <w:webHidden/>
           </w:rPr>
-          <w:instrText xml:space="preserve"> PAGEREF _Toc242000994 \h </w:instrText>
+          <w:instrText xml:space="preserve"> PAGEREF _Toc242001696 \h </w:instrText>
         </w:r>
         <w:r>
           <w:rPr>
@@ -3070,7 +3145,7 @@
           <w14:ligatures w14:val="standardContextual"/>
         </w:rPr>
       </w:pPr>
-      <w:hyperlink w:anchor="_Toc242000995" w:history="1">
+      <w:hyperlink w:anchor="_Toc242001697" w:history="1">
         <w:r>
           <w:rPr>
             <w:rStyle w:val="Siuktni"/>
@@ -3097,7 +3172,7 @@
             <w:noProof/>
             <w:webHidden/>
           </w:rPr>
-          <w:instrText xml:space="preserve"> PAGEREF _Toc242000995 \h </w:instrText>
+          <w:instrText xml:space="preserve"> PAGEREF _Toc242001697 \h </w:instrText>
         </w:r>
         <w:r>
           <w:rPr>
@@ -3145,7 +3220,7 @@
           <w14:ligatures w14:val="standardContextual"/>
         </w:rPr>
       </w:pPr>
-      <w:hyperlink w:anchor="_Toc242000996" w:history="1">
+      <w:hyperlink w:anchor="_Toc242001698" w:history="1">
         <w:r>
           <w:rPr>
             <w:rStyle w:val="Siuktni"/>
@@ -3172,7 +3247,7 @@
             <w:noProof/>
             <w:webHidden/>
           </w:rPr>
-          <w:instrText xml:space="preserve"> PAGEREF _Toc242000996 \h </w:instrText>
+          <w:instrText xml:space="preserve"> PAGEREF _Toc242001698 \h </w:instrText>
         </w:r>
         <w:r>
           <w:rPr>
@@ -3220,7 +3295,7 @@
           <w14:ligatures w14:val="standardContextual"/>
         </w:rPr>
       </w:pPr>
-      <w:hyperlink w:anchor="_Toc242000997" w:history="1">
+      <w:hyperlink w:anchor="_Toc242001699" w:history="1">
         <w:r>
           <w:rPr>
             <w:rStyle w:val="Siuktni"/>
@@ -3247,7 +3322,7 @@
             <w:noProof/>
             <w:webHidden/>
           </w:rPr>
-          <w:instrText xml:space="preserve"> PAGEREF _Toc242000997 \h </w:instrText>
+          <w:instrText xml:space="preserve"> PAGEREF _Toc242001699 \h </w:instrText>
         </w:r>
         <w:r>
           <w:rPr>
@@ -3295,7 +3370,7 @@
           <w14:ligatures w14:val="standardContextual"/>
         </w:rPr>
       </w:pPr>
-      <w:hyperlink w:anchor="_Toc242000998" w:history="1">
+      <w:hyperlink w:anchor="_Toc242001700" w:history="1">
         <w:r>
           <w:rPr>
             <w:rStyle w:val="Siuktni"/>
@@ -3322,7 +3397,7 @@
             <w:noProof/>
             <w:webHidden/>
           </w:rPr>
-          <w:instrText xml:space="preserve"> PAGEREF _Toc242000998 \h </w:instrText>
+          <w:instrText xml:space="preserve"> PAGEREF _Toc242001700 \h </w:instrText>
         </w:r>
         <w:r>
           <w:rPr>
@@ -3370,7 +3445,7 @@
           <w14:ligatures w14:val="standardContextual"/>
         </w:rPr>
       </w:pPr>
-      <w:hyperlink w:anchor="_Toc242000999" w:history="1">
+      <w:hyperlink w:anchor="_Toc242001701" w:history="1">
         <w:r>
           <w:rPr>
             <w:rStyle w:val="Siuktni"/>
@@ -3397,7 +3472,7 @@
             <w:noProof/>
             <w:webHidden/>
           </w:rPr>
-          <w:instrText xml:space="preserve"> PAGEREF _Toc242000999 \h </w:instrText>
+          <w:instrText xml:space="preserve"> PAGEREF _Toc242001701 \h </w:instrText>
         </w:r>
         <w:r>
           <w:rPr>
@@ -3445,7 +3520,7 @@
           <w14:ligatures w14:val="standardContextual"/>
         </w:rPr>
       </w:pPr>
-      <w:hyperlink w:anchor="_Toc242001000" w:history="1">
+      <w:hyperlink w:anchor="_Toc242001702" w:history="1">
         <w:r>
           <w:rPr>
             <w:rStyle w:val="Siuktni"/>
@@ -3472,7 +3547,7 @@
             <w:noProof/>
             <w:webHidden/>
           </w:rPr>
-          <w:instrText xml:space="preserve"> PAGEREF _Toc242001000 \h </w:instrText>
+          <w:instrText xml:space="preserve"> PAGEREF _Toc242001702 \h </w:instrText>
         </w:r>
         <w:r>
           <w:rPr>
@@ -3520,7 +3595,7 @@
           <w14:ligatures w14:val="standardContextual"/>
         </w:rPr>
       </w:pPr>
-      <w:hyperlink w:anchor="_Toc242001001" w:history="1">
+      <w:hyperlink w:anchor="_Toc242001703" w:history="1">
         <w:r>
           <w:rPr>
             <w:rStyle w:val="Siuktni"/>
@@ -3547,7 +3622,7 @@
             <w:noProof/>
             <w:webHidden/>
           </w:rPr>
-          <w:instrText xml:space="preserve"> PAGEREF _Toc242001001 \h </w:instrText>
+          <w:instrText xml:space="preserve"> PAGEREF _Toc242001703 \h </w:instrText>
         </w:r>
         <w:r>
           <w:rPr>
@@ -3595,7 +3670,7 @@
           <w14:ligatures w14:val="standardContextual"/>
         </w:rPr>
       </w:pPr>
-      <w:hyperlink w:anchor="_Toc242001002" w:history="1">
+      <w:hyperlink w:anchor="_Toc242001704" w:history="1">
         <w:r>
           <w:rPr>
             <w:rStyle w:val="Siuktni"/>
@@ -3622,7 +3697,7 @@
             <w:noProof/>
             <w:webHidden/>
           </w:rPr>
-          <w:instrText xml:space="preserve"> PAGEREF _Toc242001002 \h </w:instrText>
+          <w:instrText xml:space="preserve"> PAGEREF _Toc242001704 \h </w:instrText>
         </w:r>
         <w:r>
           <w:rPr>
@@ -3670,7 +3745,7 @@
           <w14:ligatures w14:val="standardContextual"/>
         </w:rPr>
       </w:pPr>
-      <w:hyperlink w:anchor="_Toc242001003" w:history="1">
+      <w:hyperlink w:anchor="_Toc242001705" w:history="1">
         <w:r>
           <w:rPr>
             <w:rStyle w:val="Siuktni"/>
@@ -3697,7 +3772,7 @@
             <w:noProof/>
             <w:webHidden/>
           </w:rPr>
-          <w:instrText xml:space="preserve"> PAGEREF _Toc242001003 \h </w:instrText>
+          <w:instrText xml:space="preserve"> PAGEREF _Toc242001705 \h </w:instrText>
         </w:r>
         <w:r>
           <w:rPr>
@@ -3745,7 +3820,7 @@
           <w14:ligatures w14:val="standardContextual"/>
         </w:rPr>
       </w:pPr>
-      <w:hyperlink w:anchor="_Toc242001004" w:history="1">
+      <w:hyperlink w:anchor="_Toc242001706" w:history="1">
         <w:r>
           <w:rPr>
             <w:rStyle w:val="Siuktni"/>
@@ -3772,7 +3847,7 @@
             <w:noProof/>
             <w:webHidden/>
           </w:rPr>
-          <w:instrText xml:space="preserve"> PAGEREF _Toc242001004 \h </w:instrText>
+          <w:instrText xml:space="preserve"> PAGEREF _Toc242001706 \h </w:instrText>
         </w:r>
         <w:r>
           <w:rPr>
@@ -3820,7 +3895,7 @@
           <w14:ligatures w14:val="standardContextual"/>
         </w:rPr>
       </w:pPr>
-      <w:hyperlink w:anchor="_Toc242001005" w:history="1">
+      <w:hyperlink w:anchor="_Toc242001707" w:history="1">
         <w:r>
           <w:rPr>
             <w:rStyle w:val="Siuktni"/>
@@ -3847,7 +3922,7 @@
             <w:noProof/>
             <w:webHidden/>
           </w:rPr>
-          <w:instrText xml:space="preserve"> PAGEREF _Toc242001005 \h </w:instrText>
+          <w:instrText xml:space="preserve"> PAGEREF _Toc242001707 \h </w:instrText>
         </w:r>
         <w:r>
           <w:rPr>
@@ -3895,7 +3970,7 @@
           <w14:ligatures w14:val="standardContextual"/>
         </w:rPr>
       </w:pPr>
-      <w:hyperlink w:anchor="_Toc242001006" w:history="1">
+      <w:hyperlink w:anchor="_Toc242001708" w:history="1">
         <w:r>
           <w:rPr>
             <w:rStyle w:val="Siuktni"/>
@@ -3922,7 +3997,7 @@
             <w:noProof/>
             <w:webHidden/>
           </w:rPr>
-          <w:instrText xml:space="preserve"> PAGEREF _Toc242001006 \h </w:instrText>
+          <w:instrText xml:space="preserve"> PAGEREF _Toc242001708 \h </w:instrText>
         </w:r>
         <w:r>
           <w:rPr>
@@ -3970,7 +4045,7 @@
           <w14:ligatures w14:val="standardContextual"/>
         </w:rPr>
       </w:pPr>
-      <w:hyperlink w:anchor="_Toc242001007" w:history="1">
+      <w:hyperlink w:anchor="_Toc242001709" w:history="1">
         <w:r>
           <w:rPr>
             <w:rStyle w:val="Siuktni"/>
@@ -3997,7 +4072,7 @@
             <w:noProof/>
             <w:webHidden/>
           </w:rPr>
-          <w:instrText xml:space="preserve"> PAGEREF _Toc242001007 \h </w:instrText>
+          <w:instrText xml:space="preserve"> PAGEREF _Toc242001709 \h </w:instrText>
         </w:r>
         <w:r>
           <w:rPr>
@@ -4045,7 +4120,7 @@
           <w14:ligatures w14:val="standardContextual"/>
         </w:rPr>
       </w:pPr>
-      <w:hyperlink w:anchor="_Toc242001008" w:history="1">
+      <w:hyperlink w:anchor="_Toc242001710" w:history="1">
         <w:r>
           <w:rPr>
             <w:rStyle w:val="Siuktni"/>
@@ -4072,7 +4147,7 @@
             <w:noProof/>
             <w:webHidden/>
           </w:rPr>
-          <w:instrText xml:space="preserve"> PAGEREF _Toc242001008 \h </w:instrText>
+          <w:instrText xml:space="preserve"> PAGEREF _Toc242001710 \h </w:instrText>
         </w:r>
         <w:r>
           <w:rPr>
@@ -4120,7 +4195,7 @@
           <w14:ligatures w14:val="standardContextual"/>
         </w:rPr>
       </w:pPr>
-      <w:hyperlink w:anchor="_Toc242001009" w:history="1">
+      <w:hyperlink w:anchor="_Toc242001711" w:history="1">
         <w:r>
           <w:rPr>
             <w:rStyle w:val="Siuktni"/>
@@ -4147,7 +4222,7 @@
             <w:noProof/>
             <w:webHidden/>
           </w:rPr>
-          <w:instrText xml:space="preserve"> PAGEREF _Toc242001009 \h </w:instrText>
+          <w:instrText xml:space="preserve"> PAGEREF _Toc242001711 \h </w:instrText>
         </w:r>
         <w:r>
           <w:rPr>
@@ -4195,7 +4270,7 @@
           <w14:ligatures w14:val="standardContextual"/>
         </w:rPr>
       </w:pPr>
-      <w:hyperlink w:anchor="_Toc242001010" w:history="1">
+      <w:hyperlink w:anchor="_Toc242001712" w:history="1">
         <w:r>
           <w:rPr>
             <w:rStyle w:val="Siuktni"/>
@@ -4222,7 +4297,7 @@
             <w:noProof/>
             <w:webHidden/>
           </w:rPr>
-          <w:instrText xml:space="preserve"> PAGEREF _Toc242001010 \h </w:instrText>
+          <w:instrText xml:space="preserve"> PAGEREF _Toc242001712 \h </w:instrText>
         </w:r>
         <w:r>
           <w:rPr>
@@ -4270,7 +4345,7 @@
           <w14:ligatures w14:val="standardContextual"/>
         </w:rPr>
       </w:pPr>
-      <w:hyperlink w:anchor="_Toc242001011" w:history="1">
+      <w:hyperlink w:anchor="_Toc242001713" w:history="1">
         <w:r>
           <w:rPr>
             <w:rStyle w:val="Siuktni"/>
@@ -4297,7 +4372,7 @@
             <w:noProof/>
             <w:webHidden/>
           </w:rPr>
-          <w:instrText xml:space="preserve"> PAGEREF _Toc242001011 \h </w:instrText>
+          <w:instrText xml:space="preserve"> PAGEREF _Toc242001713 \h </w:instrText>
         </w:r>
         <w:r>
           <w:rPr>
@@ -4345,7 +4420,7 @@
           <w14:ligatures w14:val="standardContextual"/>
         </w:rPr>
       </w:pPr>
-      <w:hyperlink w:anchor="_Toc242001012" w:history="1">
+      <w:hyperlink w:anchor="_Toc242001714" w:history="1">
         <w:r>
           <w:rPr>
             <w:rStyle w:val="Siuktni"/>
@@ -4372,7 +4447,7 @@
             <w:noProof/>
             <w:webHidden/>
           </w:rPr>
-          <w:instrText xml:space="preserve"> PAGEREF _Toc242001012 \h </w:instrText>
+          <w:instrText xml:space="preserve"> PAGEREF _Toc242001714 \h </w:instrText>
         </w:r>
         <w:r>
           <w:rPr>
@@ -4420,7 +4495,7 @@
       <w:pPr>
         <w:pStyle w:val="u1"/>
       </w:pPr>
-      <w:bookmarkStart w:id="3" w:name="_Toc242000961"/>
+      <w:bookmarkStart w:id="3" w:name="_Toc242001662"/>
       <w:r>
         <w:lastRenderedPageBreak/>
         <w:t>DANH M</w:t>
@@ -5006,7 +5081,7 @@
       <w:pPr>
         <w:pStyle w:val="u1"/>
       </w:pPr>
-      <w:bookmarkStart w:id="4" w:name="_Toc242000962"/>
+      <w:bookmarkStart w:id="4" w:name="_Toc242001663"/>
       <w:r>
         <w:lastRenderedPageBreak/>
         <w:t>CHƯƠNG 1. GI</w:t>
@@ -5029,7 +5104,7 @@
       <w:pPr>
         <w:pStyle w:val="u2"/>
       </w:pPr>
-      <w:bookmarkStart w:id="5" w:name="_Toc242000963"/>
+      <w:bookmarkStart w:id="5" w:name="_Toc242001664"/>
       <w:r>
         <w:t>1.1. B</w:t>
       </w:r>
@@ -5073,7 +5148,7 @@
       <w:pPr>
         <w:pStyle w:val="u2"/>
       </w:pPr>
-      <w:bookmarkStart w:id="6" w:name="_Toc242000964"/>
+      <w:bookmarkStart w:id="6" w:name="_Toc242001665"/>
       <w:r>
         <w:t>1.2. M</w:t>
       </w:r>
@@ -5474,7 +5549,7 @@
       <w:pPr>
         <w:pStyle w:val="u2"/>
       </w:pPr>
-      <w:bookmarkStart w:id="7" w:name="_Toc242000965"/>
+      <w:bookmarkStart w:id="7" w:name="_Toc242001666"/>
       <w:r>
         <w:t>1.3. Đ</w:t>
       </w:r>
@@ -5557,7 +5632,7 @@
       <w:pPr>
         <w:pStyle w:val="u2"/>
       </w:pPr>
-      <w:bookmarkStart w:id="8" w:name="_Toc242000966"/>
+      <w:bookmarkStart w:id="8" w:name="_Toc242001667"/>
       <w:r>
         <w:t>1.4. Phương pháp và c</w:t>
       </w:r>
@@ -5579,119 +5654,51 @@
         <w:lastRenderedPageBreak/>
         <w:t>Chương 2 trình bày cơ sở chất lượng và kỹ thuật test. Chương 3 phân tích SUT. Chương 4 mô tả chiến lược và thiết kế kiểm thử. Chương 5 báo cáo kết quả cùng thảo luận. Chương 6 tổng hợp defect và đánh giá theo ISO/IEC 25010:2023. Chương 7 kết luận, giới hạn và hướng cải tiến. Phụ lục giữ chi tiết cần cho tái lập nhưng không thay thế lập luận ở phần thân.</w:t>
       </w:r>
-    </w:p>
-    <w:p>
-      <w:pPr>
-        <w:pStyle w:val="u1"/>
-      </w:pPr>
-      <w:bookmarkStart w:id="9" w:name="_Toc242000967"/>
-      <w:r>
-        <w:lastRenderedPageBreak/>
-        <w:t>CHƯƠNG 2. CƠ S</w:t>
-      </w:r>
-      <w:r>
-        <w:t>Ở</w:t>
-      </w:r>
-      <w:r>
-        <w:t xml:space="preserve"> ĐÁNH GIÁ VÀ KI</w:t>
-      </w:r>
-      <w:r>
-        <w:t>Ể</w:t>
-      </w:r>
-      <w:r>
-        <w:t>M Đ</w:t>
-      </w:r>
-      <w:r>
-        <w:t>Ị</w:t>
-      </w:r>
-      <w:r>
-        <w:t>NH</w:t>
-      </w:r>
-      <w:bookmarkEnd w:id="9"/>
     </w:p>
     <w:p>
       <w:pPr>
         <w:pStyle w:val="u2"/>
       </w:pPr>
-      <w:bookmarkStart w:id="10" w:name="_Toc242000968"/>
-      <w:r>
-        <w:t>2.1. Ch</w:t>
-      </w:r>
-      <w:r>
-        <w:t>ấ</w:t>
-      </w:r>
-      <w:r>
-        <w:t>t lư</w:t>
-      </w:r>
-      <w:r>
-        <w:t>ợ</w:t>
-      </w:r>
-      <w:r>
-        <w:t>ng s</w:t>
-      </w:r>
-      <w:r>
-        <w:t>ả</w:t>
-      </w:r>
-      <w:r>
-        <w:t>n ph</w:t>
-      </w:r>
-      <w:r>
-        <w:t>ẩ</w:t>
-      </w:r>
-      <w:r>
-        <w:t>m và b</w:t>
-      </w:r>
-      <w:r>
-        <w:t>ằ</w:t>
-      </w:r>
-      <w:r>
-        <w:t>ng ch</w:t>
-      </w:r>
-      <w:r>
-        <w:t>ứ</w:t>
-      </w:r>
-      <w:r>
-        <w:t>ng</w:t>
-      </w:r>
-      <w:bookmarkEnd w:id="10"/>
+      <w:bookmarkStart w:id="9" w:name="_Toc242001668"/>
+      <w:r>
+        <w:t>1.5. M</w:t>
+      </w:r>
+      <w:r>
+        <w:t>ố</w:t>
+      </w:r>
+      <w:r>
+        <w:t>c th</w:t>
+      </w:r>
+      <w:r>
+        <w:t>ự</w:t>
+      </w:r>
+      <w:r>
+        <w:t>c hi</w:t>
+      </w:r>
+      <w:r>
+        <w:t>ệ</w:t>
+      </w:r>
+      <w:r>
+        <w:t>n và ki</w:t>
+      </w:r>
+      <w:r>
+        <w:t>ể</w:t>
+      </w:r>
+      <w:r>
+        <w:t>m soát thay đ</w:t>
+      </w:r>
+      <w:r>
+        <w:t>ổ</w:t>
+      </w:r>
+      <w:r>
+        <w:t>i</w:t>
+      </w:r>
+      <w:bookmarkEnd w:id="9"/>
     </w:p>
     <w:p>
       <w:r>
-        <w:t>ISO/IEC 25010:2023 mô tả mô hình chất lượng sản phẩm gồm chín đặc tính: functional suitability, performance efficiency, compatibility, interaction capability, reliability, security, maintainability, flexibility và safety [1]. Phiên bản 2023 thay thế mô hình 2011; vì vậy báo cáo không trộn tên đặc tính cũ với mô hình mới. ISO/IEC 25023 được dùng làm định hướng chọn phép đo [2], không phải bộ ngưỡng bắt buộc cho mọi dự án.</w:t>
-      </w:r>
-    </w:p>
-    <w:p>
-      <w:r>
-        <w:t>Một metric chỉ có ý nghĩa khi gắn với câu hỏi và phạm vi. Ví dụ, p95 của k6 mô tả 95% request trong workload cụ thể, không dự báo thời gian phản hồi ở quy mô sản xuất. Mutation score 81,13% chỉ áp dụng cho booking-policy.ts, không đại diện toàn bộ repository. Báo cáo do đó ghi cùng lúc giá trị, ngưỡng, môi trường, artifact và giới hạn diễn giải.</w:t>
-      </w:r>
-    </w:p>
-    <w:p>
-      <w:pPr>
-        <w:pStyle w:val="u2"/>
-      </w:pPr>
-      <w:bookmarkStart w:id="11" w:name="_Toc242000969"/>
-      <w:r>
-        <w:t>2.2. Các t</w:t>
-      </w:r>
-      <w:r>
-        <w:t>ầ</w:t>
-      </w:r>
-      <w:r>
-        <w:t>ng ki</w:t>
-      </w:r>
-      <w:r>
-        <w:t>ể</w:t>
-      </w:r>
-      <w:r>
-        <w:t>m th</w:t>
-      </w:r>
-      <w:r>
-        <w:t>ử</w:t>
-      </w:r>
-      <w:r>
-        <w:t xml:space="preserve"> và vai trò</w:t>
-      </w:r>
-      <w:bookmarkEnd w:id="11"/>
+        <w:t>Bảng 3 tóm tắt các mốc có thể kiểm tra từ lịch sử commit của repository. Bảng này dùng để trình bày diễn biến kỹ thuật của đề tài, không thay thế bảng phân công thành viên; thông tin thành viên chỉ được điền khi nhóm cung cấp dữ liệu thật trên bìa báo cáo.</w:t>
+      </w:r>
     </w:p>
     <w:p>
       <w:pPr>
@@ -5705,7 +5712,493 @@
           <w:i/>
           <w:sz w:val="22"/>
         </w:rPr>
-        <w:t>Bảng 3. Vai trò của từng tầng trong chiến lược StudySpace</w:t>
+        <w:t>Bảng 3. Mốc thực hiện được đối chiếu từ lịch sử repository</w:t>
+      </w:r>
+    </w:p>
+    <w:tbl>
+      <w:tblPr>
+        <w:tblW w:w="0" w:type="auto"/>
+        <w:jc w:val="center"/>
+        <w:tblBorders>
+          <w:top w:val="single" w:sz="4" w:space="0" w:color="B7B7B7"/>
+          <w:left w:val="single" w:sz="4" w:space="0" w:color="B7B7B7"/>
+          <w:bottom w:val="single" w:sz="4" w:space="0" w:color="B7B7B7"/>
+          <w:right w:val="single" w:sz="4" w:space="0" w:color="B7B7B7"/>
+          <w:insideH w:val="single" w:sz="4" w:space="0" w:color="B7B7B7"/>
+          <w:insideV w:val="single" w:sz="4" w:space="0" w:color="B7B7B7"/>
+        </w:tblBorders>
+        <w:tblLook w:val="04A0" w:firstRow="1" w:lastRow="0" w:firstColumn="1" w:lastColumn="0" w:noHBand="0" w:noVBand="1"/>
+      </w:tblPr>
+      <w:tblGrid>
+        <w:gridCol w:w="3182"/>
+        <w:gridCol w:w="3182"/>
+        <w:gridCol w:w="3182"/>
+      </w:tblGrid>
+      <w:tr>
+        <w:trPr>
+          <w:cantSplit/>
+          <w:tblHeader/>
+          <w:jc w:val="center"/>
+        </w:trPr>
+        <w:tc>
+          <w:tcPr>
+            <w:tcW w:w="3182" w:type="dxa"/>
+            <w:shd w:val="clear" w:color="auto" w:fill="D9E2F3"/>
+            <w:vAlign w:val="center"/>
+          </w:tcPr>
+          <w:p>
+            <w:pPr>
+              <w:spacing w:after="0" w:line="252" w:lineRule="auto"/>
+              <w:ind w:firstLine="0"/>
+              <w:jc w:val="center"/>
+            </w:pPr>
+            <w:r>
+              <w:rPr>
+                <w:b/>
+                <w:sz w:val="21"/>
+              </w:rPr>
+              <w:t>Thời điểm</w:t>
+            </w:r>
+          </w:p>
+        </w:tc>
+        <w:tc>
+          <w:tcPr>
+            <w:tcW w:w="3182" w:type="dxa"/>
+            <w:shd w:val="clear" w:color="auto" w:fill="D9E2F3"/>
+            <w:vAlign w:val="center"/>
+          </w:tcPr>
+          <w:p>
+            <w:pPr>
+              <w:spacing w:after="0" w:line="252" w:lineRule="auto"/>
+              <w:ind w:firstLine="0"/>
+              <w:jc w:val="center"/>
+            </w:pPr>
+            <w:r>
+              <w:rPr>
+                <w:b/>
+                <w:sz w:val="21"/>
+              </w:rPr>
+              <w:t>Mốc kỹ thuật</w:t>
+            </w:r>
+          </w:p>
+        </w:tc>
+        <w:tc>
+          <w:tcPr>
+            <w:tcW w:w="3182" w:type="dxa"/>
+            <w:shd w:val="clear" w:color="auto" w:fill="D9E2F3"/>
+            <w:vAlign w:val="center"/>
+          </w:tcPr>
+          <w:p>
+            <w:pPr>
+              <w:spacing w:after="0" w:line="252" w:lineRule="auto"/>
+              <w:ind w:firstLine="0"/>
+              <w:jc w:val="center"/>
+            </w:pPr>
+            <w:r>
+              <w:rPr>
+                <w:b/>
+                <w:sz w:val="21"/>
+              </w:rPr>
+              <w:t>Kết quả được kiểm tra</w:t>
+            </w:r>
+          </w:p>
+        </w:tc>
+      </w:tr>
+      <w:tr>
+        <w:trPr>
+          <w:cantSplit/>
+          <w:jc w:val="center"/>
+        </w:trPr>
+        <w:tc>
+          <w:tcPr>
+            <w:tcW w:w="3182" w:type="dxa"/>
+            <w:vAlign w:val="center"/>
+          </w:tcPr>
+          <w:p>
+            <w:pPr>
+              <w:spacing w:after="0" w:line="252" w:lineRule="auto"/>
+              <w:ind w:firstLine="0"/>
+              <w:jc w:val="left"/>
+            </w:pPr>
+            <w:r>
+              <w:rPr>
+                <w:sz w:val="21"/>
+              </w:rPr>
+              <w:t>01-10-2026</w:t>
+            </w:r>
+          </w:p>
+        </w:tc>
+        <w:tc>
+          <w:tcPr>
+            <w:tcW w:w="3182" w:type="dxa"/>
+            <w:vAlign w:val="center"/>
+          </w:tcPr>
+          <w:p>
+            <w:pPr>
+              <w:spacing w:after="0" w:line="252" w:lineRule="auto"/>
+              <w:ind w:firstLine="0"/>
+              <w:jc w:val="left"/>
+            </w:pPr>
+            <w:r>
+              <w:rPr>
+                <w:sz w:val="21"/>
+              </w:rPr>
+              <w:t>Khởi tạo StudySpace và baseline kiểm thử</w:t>
+            </w:r>
+          </w:p>
+        </w:tc>
+        <w:tc>
+          <w:tcPr>
+            <w:tcW w:w="3182" w:type="dxa"/>
+            <w:vAlign w:val="center"/>
+          </w:tcPr>
+          <w:p>
+            <w:pPr>
+              <w:spacing w:after="0" w:line="252" w:lineRule="auto"/>
+              <w:ind w:firstLine="0"/>
+              <w:jc w:val="left"/>
+            </w:pPr>
+            <w:r>
+              <w:rPr>
+                <w:sz w:val="21"/>
+              </w:rPr>
+              <w:t>SUT bốn phân hệ, API/E2E cơ sở và CI ban đầu</w:t>
+            </w:r>
+          </w:p>
+        </w:tc>
+      </w:tr>
+      <w:tr>
+        <w:trPr>
+          <w:cantSplit/>
+          <w:jc w:val="center"/>
+        </w:trPr>
+        <w:tc>
+          <w:tcPr>
+            <w:tcW w:w="3182" w:type="dxa"/>
+            <w:shd w:val="clear" w:color="auto" w:fill="F7F9FC"/>
+            <w:vAlign w:val="center"/>
+          </w:tcPr>
+          <w:p>
+            <w:pPr>
+              <w:spacing w:after="0" w:line="252" w:lineRule="auto"/>
+              <w:ind w:firstLine="0"/>
+              <w:jc w:val="left"/>
+            </w:pPr>
+            <w:r>
+              <w:rPr>
+                <w:sz w:val="21"/>
+              </w:rPr>
+              <w:t>02-10-2026</w:t>
+            </w:r>
+          </w:p>
+        </w:tc>
+        <w:tc>
+          <w:tcPr>
+            <w:tcW w:w="3182" w:type="dxa"/>
+            <w:shd w:val="clear" w:color="auto" w:fill="F7F9FC"/>
+            <w:vAlign w:val="center"/>
+          </w:tcPr>
+          <w:p>
+            <w:pPr>
+              <w:spacing w:after="0" w:line="252" w:lineRule="auto"/>
+              <w:ind w:firstLine="0"/>
+              <w:jc w:val="left"/>
+            </w:pPr>
+            <w:r>
+              <w:rPr>
+                <w:sz w:val="21"/>
+              </w:rPr>
+              <w:t>Củng cố booking integrity và API contract</w:t>
+            </w:r>
+          </w:p>
+        </w:tc>
+        <w:tc>
+          <w:tcPr>
+            <w:tcW w:w="3182" w:type="dxa"/>
+            <w:shd w:val="clear" w:color="auto" w:fill="F7F9FC"/>
+            <w:vAlign w:val="center"/>
+          </w:tcPr>
+          <w:p>
+            <w:pPr>
+              <w:spacing w:after="0" w:line="252" w:lineRule="auto"/>
+              <w:ind w:firstLine="0"/>
+              <w:jc w:val="left"/>
+            </w:pPr>
+            <w:r>
+              <w:rPr>
+                <w:sz w:val="21"/>
+              </w:rPr>
+              <w:t>Active key, race handling, closure not-found, rate limit và test hồi quy</w:t>
+            </w:r>
+          </w:p>
+        </w:tc>
+      </w:tr>
+      <w:tr>
+        <w:trPr>
+          <w:cantSplit/>
+          <w:jc w:val="center"/>
+        </w:trPr>
+        <w:tc>
+          <w:tcPr>
+            <w:tcW w:w="3182" w:type="dxa"/>
+            <w:vAlign w:val="center"/>
+          </w:tcPr>
+          <w:p>
+            <w:pPr>
+              <w:spacing w:after="0" w:line="252" w:lineRule="auto"/>
+              <w:ind w:firstLine="0"/>
+              <w:jc w:val="left"/>
+            </w:pPr>
+            <w:r>
+              <w:rPr>
+                <w:sz w:val="21"/>
+              </w:rPr>
+              <w:t>03-10-2026</w:t>
+            </w:r>
+          </w:p>
+        </w:tc>
+        <w:tc>
+          <w:tcPr>
+            <w:tcW w:w="3182" w:type="dxa"/>
+            <w:vAlign w:val="center"/>
+          </w:tcPr>
+          <w:p>
+            <w:pPr>
+              <w:spacing w:after="0" w:line="252" w:lineRule="auto"/>
+              <w:ind w:firstLine="0"/>
+              <w:jc w:val="left"/>
+            </w:pPr>
+            <w:r>
+              <w:rPr>
+                <w:sz w:val="21"/>
+              </w:rPr>
+              <w:t>Tái lập môi trường và evidence</w:t>
+            </w:r>
+          </w:p>
+        </w:tc>
+        <w:tc>
+          <w:tcPr>
+            <w:tcW w:w="3182" w:type="dxa"/>
+            <w:vAlign w:val="center"/>
+          </w:tcPr>
+          <w:p>
+            <w:pPr>
+              <w:spacing w:after="0" w:line="252" w:lineRule="auto"/>
+              <w:ind w:firstLine="0"/>
+              <w:jc w:val="left"/>
+            </w:pPr>
+            <w:r>
+              <w:rPr>
+                <w:sz w:val="21"/>
+              </w:rPr>
+              <w:t>Migration versioned, PBT, traceability, k6, ZAP và Lighthouse workflow</w:t>
+            </w:r>
+          </w:p>
+        </w:tc>
+      </w:tr>
+      <w:tr>
+        <w:trPr>
+          <w:cantSplit/>
+          <w:jc w:val="center"/>
+        </w:trPr>
+        <w:tc>
+          <w:tcPr>
+            <w:tcW w:w="3182" w:type="dxa"/>
+            <w:shd w:val="clear" w:color="auto" w:fill="F7F9FC"/>
+            <w:vAlign w:val="center"/>
+          </w:tcPr>
+          <w:p>
+            <w:pPr>
+              <w:spacing w:after="0" w:line="252" w:lineRule="auto"/>
+              <w:ind w:firstLine="0"/>
+              <w:jc w:val="left"/>
+            </w:pPr>
+            <w:r>
+              <w:rPr>
+                <w:sz w:val="21"/>
+              </w:rPr>
+              <w:t>04-10-2026</w:t>
+            </w:r>
+          </w:p>
+        </w:tc>
+        <w:tc>
+          <w:tcPr>
+            <w:tcW w:w="3182" w:type="dxa"/>
+            <w:shd w:val="clear" w:color="auto" w:fill="F7F9FC"/>
+            <w:vAlign w:val="center"/>
+          </w:tcPr>
+          <w:p>
+            <w:pPr>
+              <w:spacing w:after="0" w:line="252" w:lineRule="auto"/>
+              <w:ind w:firstLine="0"/>
+              <w:jc w:val="left"/>
+            </w:pPr>
+            <w:r>
+              <w:rPr>
+                <w:sz w:val="21"/>
+              </w:rPr>
+              <w:t>Security retest và chuẩn hóa báo cáo</w:t>
+            </w:r>
+          </w:p>
+        </w:tc>
+        <w:tc>
+          <w:tcPr>
+            <w:tcW w:w="3182" w:type="dxa"/>
+            <w:shd w:val="clear" w:color="auto" w:fill="F7F9FC"/>
+            <w:vAlign w:val="center"/>
+          </w:tcPr>
+          <w:p>
+            <w:pPr>
+              <w:spacing w:after="0" w:line="252" w:lineRule="auto"/>
+              <w:ind w:firstLine="0"/>
+              <w:jc w:val="left"/>
+            </w:pPr>
+            <w:r>
+              <w:rPr>
+                <w:sz w:val="21"/>
+              </w:rPr>
+              <w:t>Security header retest, manifest final, báo cáo Word và kiểm tra render</w:t>
+            </w:r>
+          </w:p>
+        </w:tc>
+      </w:tr>
+    </w:tbl>
+    <w:p>
+      <w:pPr>
+        <w:spacing w:after="0"/>
+      </w:pPr>
+    </w:p>
+    <w:p>
+      <w:r>
+        <w:t>Các thay đổi được tách theo mục đích: fix cho sai lệch hành vi, test cho evidence mới, ci cho khả năng tái lập và docs cho hồ sơ nộp bài. Cách phân tách này giúp truy ngược một defect hoặc kết quả kiểm thử về commit liên quan, đồng thời tránh biến báo cáo thành nhật ký thao tác chi tiết.</w:t>
+      </w:r>
+    </w:p>
+    <w:p>
+      <w:pPr>
+        <w:pStyle w:val="u1"/>
+      </w:pPr>
+      <w:bookmarkStart w:id="10" w:name="_Toc242001669"/>
+      <w:r>
+        <w:lastRenderedPageBreak/>
+        <w:t>CHƯƠNG 2. CƠ S</w:t>
+      </w:r>
+      <w:r>
+        <w:t>Ở</w:t>
+      </w:r>
+      <w:r>
+        <w:t xml:space="preserve"> ĐÁNH GIÁ VÀ KI</w:t>
+      </w:r>
+      <w:r>
+        <w:t>Ể</w:t>
+      </w:r>
+      <w:r>
+        <w:t>M Đ</w:t>
+      </w:r>
+      <w:r>
+        <w:t>Ị</w:t>
+      </w:r>
+      <w:r>
+        <w:t>NH</w:t>
+      </w:r>
+      <w:bookmarkEnd w:id="10"/>
+    </w:p>
+    <w:p>
+      <w:pPr>
+        <w:pStyle w:val="u2"/>
+      </w:pPr>
+      <w:bookmarkStart w:id="11" w:name="_Toc242001670"/>
+      <w:r>
+        <w:t>2.1. Ch</w:t>
+      </w:r>
+      <w:r>
+        <w:t>ấ</w:t>
+      </w:r>
+      <w:r>
+        <w:t>t lư</w:t>
+      </w:r>
+      <w:r>
+        <w:t>ợ</w:t>
+      </w:r>
+      <w:r>
+        <w:t>ng s</w:t>
+      </w:r>
+      <w:r>
+        <w:t>ả</w:t>
+      </w:r>
+      <w:r>
+        <w:t>n ph</w:t>
+      </w:r>
+      <w:r>
+        <w:t>ẩ</w:t>
+      </w:r>
+      <w:r>
+        <w:t>m và b</w:t>
+      </w:r>
+      <w:r>
+        <w:t>ằ</w:t>
+      </w:r>
+      <w:r>
+        <w:t>ng ch</w:t>
+      </w:r>
+      <w:r>
+        <w:t>ứ</w:t>
+      </w:r>
+      <w:r>
+        <w:t>ng</w:t>
+      </w:r>
+      <w:bookmarkEnd w:id="11"/>
+    </w:p>
+    <w:p>
+      <w:r>
+        <w:t>ISO/IEC 25010:2023 mô tả mô hình chất lượng sản phẩm gồm chín đặc tính: functional suitability, performance efficiency, compatibility, interaction capability, reliability, security, maintainability, flexibility và safety [1]. Phiên bản 2023 thay thế mô hình 2011; vì vậy báo cáo không trộn tên đặc tính cũ với mô hình mới. ISO/IEC 25023 được dùng làm định hướng chọn phép đo [2], không phải bộ ngưỡng bắt buộc cho mọi dự án.</w:t>
+      </w:r>
+    </w:p>
+    <w:p>
+      <w:r>
+        <w:t>Một metric chỉ có ý nghĩa khi gắn với câu hỏi và phạm vi. Ví dụ, p95 của k6 mô tả 95% request trong workload cụ thể, không dự báo thời gian phản hồi ở quy mô sản xuất. Mutation score 81,13% chỉ áp dụng cho booking-policy.ts, không đại diện toàn bộ repository. Báo cáo do đó ghi cùng lúc giá trị, ngưỡng, môi trường, artifact và giới hạn diễn giải.</w:t>
+      </w:r>
+    </w:p>
+    <w:p>
+      <w:pPr>
+        <w:pStyle w:val="u2"/>
+      </w:pPr>
+      <w:bookmarkStart w:id="12" w:name="_Toc242001671"/>
+      <w:r>
+        <w:t>2.2. Các t</w:t>
+      </w:r>
+      <w:r>
+        <w:t>ầ</w:t>
+      </w:r>
+      <w:r>
+        <w:t>ng ki</w:t>
+      </w:r>
+      <w:r>
+        <w:t>ể</w:t>
+      </w:r>
+      <w:r>
+        <w:t>m th</w:t>
+      </w:r>
+      <w:r>
+        <w:t>ử</w:t>
+      </w:r>
+      <w:r>
+        <w:t xml:space="preserve"> và vai trò</w:t>
+      </w:r>
+      <w:bookmarkEnd w:id="12"/>
+    </w:p>
+    <w:p>
+      <w:pPr>
+        <w:spacing w:after="80"/>
+        <w:ind w:firstLine="0"/>
+        <w:jc w:val="center"/>
+      </w:pPr>
+      <w:r>
+        <w:rPr>
+          <w:b/>
+          <w:i/>
+          <w:sz w:val="22"/>
+        </w:rPr>
+        <w:t>Bảng 4. Vai trò của từng tầng trong chiến lược StudySpace</w:t>
       </w:r>
     </w:p>
     <w:tbl>
@@ -6252,7 +6745,7 @@
       <w:pPr>
         <w:pStyle w:val="u2"/>
       </w:pPr>
-      <w:bookmarkStart w:id="12" w:name="_Toc242000970"/>
+      <w:bookmarkStart w:id="13" w:name="_Toc242001672"/>
       <w:r>
         <w:lastRenderedPageBreak/>
         <w:t>2.3. K</w:t>
@@ -6281,7 +6774,7 @@
       <w:r>
         <w:t xml:space="preserve"> test</w:t>
       </w:r>
-      <w:bookmarkEnd w:id="12"/>
+      <w:bookmarkEnd w:id="13"/>
     </w:p>
     <w:p>
       <w:r>
@@ -6305,7 +6798,7 @@
           <w:i/>
           <w:sz w:val="22"/>
         </w:rPr>
-        <w:t>Bảng 4. Ánh xạ kỹ thuật với rủi ro</w:t>
+        <w:t>Bảng 5. Ánh xạ kỹ thuật với rủi ro</w:t>
       </w:r>
     </w:p>
     <w:tbl>
@@ -6794,11 +7287,11 @@
       <w:pPr>
         <w:pStyle w:val="u2"/>
       </w:pPr>
-      <w:bookmarkStart w:id="13" w:name="_Toc242000971"/>
+      <w:bookmarkStart w:id="14" w:name="_Toc242001673"/>
       <w:r>
         <w:t>2.4. Coverage và mutation testing</w:t>
       </w:r>
-      <w:bookmarkEnd w:id="13"/>
+      <w:bookmarkEnd w:id="14"/>
     </w:p>
     <w:p>
       <w:r>
@@ -6814,12 +7307,12 @@
       <w:pPr>
         <w:pStyle w:val="u2"/>
       </w:pPr>
-      <w:bookmarkStart w:id="14" w:name="_Toc242000972"/>
+      <w:bookmarkStart w:id="15" w:name="_Toc242001674"/>
       <w:r>
         <w:lastRenderedPageBreak/>
         <w:t>2.5. Security, performance và accessibility</w:t>
       </w:r>
-      <w:bookmarkEnd w:id="14"/>
+      <w:bookmarkEnd w:id="15"/>
     </w:p>
     <w:p>
       <w:r>
@@ -6835,7 +7328,7 @@
       <w:pPr>
         <w:pStyle w:val="u1"/>
       </w:pPr>
-      <w:bookmarkStart w:id="15" w:name="_Toc242000973"/>
+      <w:bookmarkStart w:id="16" w:name="_Toc242001675"/>
       <w:r>
         <w:lastRenderedPageBreak/>
         <w:t>CHƯƠNG 3. PHÂN TÍCH VÀ THI</w:t>
@@ -6852,17 +7345,17 @@
       <w:r>
         <w:t xml:space="preserve"> STUDYSPACE</w:t>
       </w:r>
-      <w:bookmarkEnd w:id="15"/>
+      <w:bookmarkEnd w:id="16"/>
     </w:p>
     <w:p>
       <w:pPr>
         <w:pStyle w:val="u2"/>
       </w:pPr>
-      <w:bookmarkStart w:id="16" w:name="_Toc242000974"/>
+      <w:bookmarkStart w:id="17" w:name="_Toc242001676"/>
       <w:r>
         <w:t>3.1. Actor và use case</w:t>
       </w:r>
-      <w:bookmarkEnd w:id="16"/>
+      <w:bookmarkEnd w:id="17"/>
     </w:p>
     <w:p>
       <w:r>
@@ -6878,7 +7371,7 @@
           <w:noProof/>
         </w:rPr>
         <w:drawing>
-          <wp:inline distT="0" distB="0" distL="0" distR="0" wp14:anchorId="5BBA0299" wp14:editId="0A029069">
+          <wp:inline distT="0" distB="0" distL="0" distR="0" wp14:anchorId="4E01EE83" wp14:editId="3B27E418">
             <wp:extent cx="5943600" cy="4730926"/>
             <wp:effectExtent l="0" t="0" r="0" b="0"/>
             <wp:docPr id="1" name="Picture 1"/>
@@ -6930,6 +7423,11 @@
       </w:r>
     </w:p>
     <w:p>
+      <w:r>
+        <w:br w:type="page"/>
+      </w:r>
+    </w:p>
+    <w:p>
       <w:pPr>
         <w:spacing w:after="80"/>
         <w:ind w:firstLine="0"/>
@@ -6941,7 +7439,8 @@
           <w:i/>
           <w:sz w:val="22"/>
         </w:rPr>
-        <w:t>Bảng 5. Use case cốt lõi và điều kiện</w:t>
+        <w:lastRenderedPageBreak/>
+        <w:t>Bảng 6. Use case cốt lõi và điều kiện</w:t>
       </w:r>
     </w:p>
     <w:tbl>
@@ -7158,7 +7657,6 @@
               <w:rPr>
                 <w:sz w:val="21"/>
               </w:rPr>
-              <w:lastRenderedPageBreak/>
               <w:t>UC-BOOK-01 Đặt chỗ</w:t>
             </w:r>
           </w:p>
@@ -7489,7 +7987,7 @@
       <w:pPr>
         <w:pStyle w:val="u2"/>
       </w:pPr>
-      <w:bookmarkStart w:id="17" w:name="_Toc242000975"/>
+      <w:bookmarkStart w:id="18" w:name="_Toc242001677"/>
       <w:r>
         <w:t>3.2. Yêu c</w:t>
       </w:r>
@@ -7511,7 +8009,7 @@
       <w:r>
         <w:t>n</w:t>
       </w:r>
-      <w:bookmarkEnd w:id="17"/>
+      <w:bookmarkEnd w:id="18"/>
     </w:p>
     <w:p>
       <w:pPr>
@@ -7525,7 +8023,7 @@
           <w:i/>
           <w:sz w:val="22"/>
         </w:rPr>
-        <w:t>Bảng 6. Nhóm yêu cầu và tiêu chí chấp nhận</w:t>
+        <w:t>Bảng 7. Nhóm yêu cầu và tiêu chí chấp nhận</w:t>
       </w:r>
     </w:p>
     <w:tbl>
@@ -7990,7 +8488,7 @@
       <w:pPr>
         <w:pStyle w:val="u2"/>
       </w:pPr>
-      <w:bookmarkStart w:id="18" w:name="_Toc242000976"/>
+      <w:bookmarkStart w:id="19" w:name="_Toc242001678"/>
       <w:r>
         <w:t>3.3. Quy t</w:t>
       </w:r>
@@ -8012,7 +8510,7 @@
       <w:r>
         <w:t>ng thái</w:t>
       </w:r>
-      <w:bookmarkEnd w:id="18"/>
+      <w:bookmarkEnd w:id="19"/>
     </w:p>
     <w:p>
       <w:r>
@@ -8021,11 +8519,8 @@
     </w:p>
     <w:p>
       <w:r>
-        <w:t xml:space="preserve">Ngày đặt nằm trong đoạn đóng từ hôm nay đến ngày thứ 14. Có 14 slot bắt đầu 07:00 đến 20:00, mỗi slot kết thúc sau đúng 60 phút. Việc đặt slot đã qua trong hôm nay bị từ chối. Hủy hợp lệ nếu còn ít nhất 60 phút; check-in hợp lệ từ 15 phút trước đến 15 phút sau, </w:t>
-      </w:r>
-      <w:r>
         <w:lastRenderedPageBreak/>
-        <w:t>bao gồm cả hai biên. Các rule này được tách thành hàm thuần để cố định now trong unit/PBT và tránh phụ thuộc đồng hồ CI.</w:t>
+        <w:t>Ngày đặt nằm trong đoạn đóng từ hôm nay đến ngày thứ 14. Có 14 slot bắt đầu 07:00 đến 20:00, mỗi slot kết thúc sau đúng 60 phút. Việc đặt slot đã qua trong hôm nay bị từ chối. Hủy hợp lệ nếu còn ít nhất 60 phút; check-in hợp lệ từ 15 phút trước đến 15 phút sau, bao gồm cả hai biên. Các rule này được tách thành hàm thuần để cố định now trong unit/PBT và tránh phụ thuộc đồng hồ CI.</w:t>
       </w:r>
     </w:p>
     <w:p>
@@ -8040,7 +8535,7 @@
           <w:i/>
           <w:sz w:val="22"/>
         </w:rPr>
-        <w:t>Bảng 7. Bảng chuyển trạng thái booking</w:t>
+        <w:t>Bảng 8. Bảng chuyển trạng thái booking</w:t>
       </w:r>
     </w:p>
     <w:tbl>
@@ -8500,7 +8995,7 @@
       <w:pPr>
         <w:pStyle w:val="u2"/>
       </w:pPr>
-      <w:bookmarkStart w:id="19" w:name="_Toc242000977"/>
+      <w:bookmarkStart w:id="20" w:name="_Toc242001679"/>
       <w:r>
         <w:t>3.4. Ki</w:t>
       </w:r>
@@ -8528,7 +9023,7 @@
       <w:r>
         <w:t>u</w:t>
       </w:r>
-      <w:bookmarkEnd w:id="19"/>
+      <w:bookmarkEnd w:id="20"/>
     </w:p>
     <w:p>
       <w:r>
@@ -8544,7 +9039,7 @@
           <w:noProof/>
         </w:rPr>
         <w:drawing>
-          <wp:inline distT="0" distB="0" distL="0" distR="0" wp14:anchorId="1F6AC40B" wp14:editId="5DEFA0CD">
+          <wp:inline distT="0" distB="0" distL="0" distR="0" wp14:anchorId="046631A8" wp14:editId="5F8BB1B4">
             <wp:extent cx="5943600" cy="1403350"/>
             <wp:effectExtent l="0" t="0" r="0" b="0"/>
             <wp:docPr id="2" name="Picture 2"/>
@@ -8604,7 +9099,7 @@
       <w:pPr>
         <w:pStyle w:val="u2"/>
       </w:pPr>
-      <w:bookmarkStart w:id="20" w:name="_Toc242000978"/>
+      <w:bookmarkStart w:id="21" w:name="_Toc242001680"/>
       <w:r>
         <w:lastRenderedPageBreak/>
         <w:t>3.5. Mô hình d</w:t>
@@ -8621,7 +9116,7 @@
       <w:r>
         <w:t>u, transaction và audit</w:t>
       </w:r>
-      <w:bookmarkEnd w:id="20"/>
+      <w:bookmarkEnd w:id="21"/>
     </w:p>
     <w:p>
       <w:r>
@@ -8637,7 +9132,7 @@
           <w:noProof/>
         </w:rPr>
         <w:drawing>
-          <wp:inline distT="0" distB="0" distL="0" distR="0" wp14:anchorId="4CF8CB43" wp14:editId="7F9AADAA">
+          <wp:inline distT="0" distB="0" distL="0" distR="0" wp14:anchorId="0D2D1EA9" wp14:editId="16FDEBD3">
             <wp:extent cx="5943600" cy="3516630"/>
             <wp:effectExtent l="0" t="0" r="0" b="0"/>
             <wp:docPr id="3" name="Picture 3"/>
@@ -8697,7 +9192,7 @@
       <w:pPr>
         <w:pStyle w:val="u2"/>
       </w:pPr>
-      <w:bookmarkStart w:id="21" w:name="_Toc242000979"/>
+      <w:bookmarkStart w:id="22" w:name="_Toc242001681"/>
       <w:r>
         <w:t>3.6. Công th</w:t>
       </w:r>
@@ -8719,7 +9214,7 @@
       <w:r>
         <w:t>ng</w:t>
       </w:r>
-      <w:bookmarkEnd w:id="21"/>
+      <w:bookmarkEnd w:id="22"/>
     </w:p>
     <w:p>
       <w:r>
@@ -8739,7 +9234,7 @@
       <w:pPr>
         <w:pStyle w:val="u1"/>
       </w:pPr>
-      <w:bookmarkStart w:id="22" w:name="_Toc242000980"/>
+      <w:bookmarkStart w:id="23" w:name="_Toc242001682"/>
       <w:r>
         <w:lastRenderedPageBreak/>
         <w:t>CHƯƠNG 4. PHƯƠNG PHÁP VÀ K</w:t>
@@ -8765,13 +9260,13 @@
       <w:r>
         <w:t>Ử</w:t>
       </w:r>
-      <w:bookmarkEnd w:id="22"/>
+      <w:bookmarkEnd w:id="23"/>
     </w:p>
     <w:p>
       <w:pPr>
         <w:pStyle w:val="u2"/>
       </w:pPr>
-      <w:bookmarkStart w:id="23" w:name="_Toc242000981"/>
+      <w:bookmarkStart w:id="24" w:name="_Toc242001683"/>
       <w:r>
         <w:t>4.1. Chi</w:t>
       </w:r>
@@ -8799,7 +9294,7 @@
       <w:r>
         <w:t>i ro</w:t>
       </w:r>
-      <w:bookmarkEnd w:id="23"/>
+      <w:bookmarkEnd w:id="24"/>
     </w:p>
     <w:p>
       <w:r>
@@ -8818,7 +9313,7 @@
           <w:i/>
           <w:sz w:val="22"/>
         </w:rPr>
-        <w:t>Bảng 8. Risk register và đối sách kiểm thử</w:t>
+        <w:t>Bảng 9. Risk register và đối sách kiểm thử</w:t>
       </w:r>
     </w:p>
     <w:tbl>
@@ -9451,7 +9946,7 @@
       <w:pPr>
         <w:pStyle w:val="u2"/>
       </w:pPr>
-      <w:bookmarkStart w:id="24" w:name="_Toc242000982"/>
+      <w:bookmarkStart w:id="25" w:name="_Toc242001684"/>
       <w:r>
         <w:t>4.2. Thi</w:t>
       </w:r>
@@ -9476,7 +9971,7 @@
       <w:r>
         <w:t>ử</w:t>
       </w:r>
-      <w:bookmarkEnd w:id="24"/>
+      <w:bookmarkEnd w:id="25"/>
     </w:p>
     <w:p>
       <w:r>
@@ -9495,7 +9990,7 @@
           <w:i/>
           <w:sz w:val="22"/>
         </w:rPr>
-        <w:t>Bảng 9. Mẫu thiết kế test từ requirement đến oracle</w:t>
+        <w:t>Bảng 10. Mẫu thiết kế test từ requirement đến oracle</w:t>
       </w:r>
     </w:p>
     <w:tbl>
@@ -10043,7 +10538,7 @@
       <w:pPr>
         <w:pStyle w:val="u3"/>
       </w:pPr>
-      <w:bookmarkStart w:id="25" w:name="_Toc242000983"/>
+      <w:bookmarkStart w:id="26" w:name="_Toc242001685"/>
       <w:r>
         <w:t>4.2.1. Ví d</w:t>
       </w:r>
@@ -10068,7 +10563,7 @@
       <w:r>
         <w:t>ỗ</w:t>
       </w:r>
-      <w:bookmarkEnd w:id="25"/>
+      <w:bookmarkEnd w:id="26"/>
     </w:p>
     <w:p>
       <w:r>
@@ -10087,7 +10582,7 @@
           <w:i/>
           <w:sz w:val="22"/>
         </w:rPr>
-        <w:t>Bảng 10. Bảng quyết định rút gọn cho POST /bookings</w:t>
+        <w:t>Bảng 11. Bảng quyết định rút gọn cho POST /bookings</w:t>
       </w:r>
     </w:p>
     <w:tbl>
@@ -10720,7 +11215,7 @@
       <w:pPr>
         <w:pStyle w:val="u2"/>
       </w:pPr>
-      <w:bookmarkStart w:id="26" w:name="_Toc242000984"/>
+      <w:bookmarkStart w:id="27" w:name="_Toc242001686"/>
       <w:r>
         <w:lastRenderedPageBreak/>
         <w:t>4.3. Môi trư</w:t>
@@ -10743,7 +11238,7 @@
       <w:r>
         <w:t>u</w:t>
       </w:r>
-      <w:bookmarkEnd w:id="26"/>
+      <w:bookmarkEnd w:id="27"/>
     </w:p>
     <w:p>
       <w:pPr>
@@ -10757,7 +11252,7 @@
           <w:i/>
           <w:sz w:val="22"/>
         </w:rPr>
-        <w:t>Bảng 11. Môi trường được ghi trong evidence manifest</w:t>
+        <w:t>Bảng 12. Môi trường được ghi trong evidence manifest</w:t>
       </w:r>
     </w:p>
     <w:tbl>
@@ -11117,11 +11612,11 @@
       <w:pPr>
         <w:pStyle w:val="u2"/>
       </w:pPr>
-      <w:bookmarkStart w:id="27" w:name="_Toc242000985"/>
+      <w:bookmarkStart w:id="28" w:name="_Toc242001687"/>
       <w:r>
         <w:t>4.4. Entry, exit và workflow</w:t>
       </w:r>
-      <w:bookmarkEnd w:id="27"/>
+      <w:bookmarkEnd w:id="28"/>
     </w:p>
     <w:p>
       <w:pPr>
@@ -11135,7 +11630,7 @@
           <w:i/>
           <w:sz w:val="22"/>
         </w:rPr>
-        <w:t>Bảng 12. Điều kiện bắt đầu và kết thúc</w:t>
+        <w:t>Bảng 13. Điều kiện bắt đầu và kết thúc</w:t>
       </w:r>
     </w:p>
     <w:tbl>
@@ -11494,7 +11989,7 @@
       <w:pPr>
         <w:pStyle w:val="u2"/>
       </w:pPr>
-      <w:bookmarkStart w:id="28" w:name="_Toc242000986"/>
+      <w:bookmarkStart w:id="29" w:name="_Toc242001688"/>
       <w:r>
         <w:t>4.5. Truy v</w:t>
       </w:r>
@@ -11516,7 +12011,7 @@
       <w:r>
         <w:t>c</w:t>
       </w:r>
-      <w:bookmarkEnd w:id="28"/>
+      <w:bookmarkEnd w:id="29"/>
     </w:p>
     <w:p>
       <w:r>
@@ -11532,7 +12027,7 @@
       <w:pPr>
         <w:pStyle w:val="u2"/>
       </w:pPr>
-      <w:bookmarkStart w:id="29" w:name="_Toc242000987"/>
+      <w:bookmarkStart w:id="30" w:name="_Toc242001689"/>
       <w:r>
         <w:t>4.6. Tiêu chí đánh giá tính đ</w:t>
       </w:r>
@@ -11560,7 +12055,7 @@
       <w:r>
         <w:t xml:space="preserve"> test</w:t>
       </w:r>
-      <w:bookmarkEnd w:id="29"/>
+      <w:bookmarkEnd w:id="30"/>
     </w:p>
     <w:p>
       <w:r>
@@ -11579,7 +12074,7 @@
       <w:pPr>
         <w:pStyle w:val="u1"/>
       </w:pPr>
-      <w:bookmarkStart w:id="30" w:name="_Toc242000988"/>
+      <w:bookmarkStart w:id="31" w:name="_Toc242001690"/>
       <w:r>
         <w:lastRenderedPageBreak/>
         <w:t>CHƯƠNG 5. TH</w:t>
@@ -11614,13 +12109,13 @@
       <w:r>
         <w:t>N</w:t>
       </w:r>
-      <w:bookmarkEnd w:id="30"/>
+      <w:bookmarkEnd w:id="31"/>
     </w:p>
     <w:p>
       <w:pPr>
         <w:pStyle w:val="u2"/>
       </w:pPr>
-      <w:bookmarkStart w:id="31" w:name="_Toc242000989"/>
+      <w:bookmarkStart w:id="32" w:name="_Toc242001691"/>
       <w:r>
         <w:t>5.1. T</w:t>
       </w:r>
@@ -11639,7 +12134,7 @@
       <w:r>
         <w:t>ả</w:t>
       </w:r>
-      <w:bookmarkEnd w:id="31"/>
+      <w:bookmarkEnd w:id="32"/>
     </w:p>
     <w:p>
       <w:pPr>
@@ -11653,7 +12148,7 @@
           <w:i/>
           <w:sz w:val="22"/>
         </w:rPr>
-        <w:t>Bảng 13. Kết quả định lượng gắn commit kiểm thử</w:t>
+        <w:t>Bảng 14. Kết quả định lượng gắn commit kiểm thử</w:t>
       </w:r>
     </w:p>
     <w:tbl>
@@ -12536,11 +13031,11 @@
       <w:pPr>
         <w:pStyle w:val="u2"/>
       </w:pPr>
-      <w:bookmarkStart w:id="32" w:name="_Toc242000990"/>
+      <w:bookmarkStart w:id="33" w:name="_Toc242001692"/>
       <w:r>
         <w:t>5.2. Unit, BVA và property-based testing</w:t>
       </w:r>
-      <w:bookmarkEnd w:id="32"/>
+      <w:bookmarkEnd w:id="33"/>
     </w:p>
     <w:p>
       <w:r>
@@ -12562,11 +13057,11 @@
       <w:pPr>
         <w:pStyle w:val="u2"/>
       </w:pPr>
-      <w:bookmarkStart w:id="33" w:name="_Toc242000991"/>
+      <w:bookmarkStart w:id="34" w:name="_Toc242001693"/>
       <w:r>
         <w:t>5.3. API, database và transaction</w:t>
       </w:r>
-      <w:bookmarkEnd w:id="33"/>
+      <w:bookmarkEnd w:id="34"/>
     </w:p>
     <w:p>
       <w:r>
@@ -12582,11 +13077,11 @@
       <w:pPr>
         <w:pStyle w:val="u2"/>
       </w:pPr>
-      <w:bookmarkStart w:id="34" w:name="_Toc242000992"/>
+      <w:bookmarkStart w:id="35" w:name="_Toc242001694"/>
       <w:r>
         <w:t>5.4. E2E, responsive và accessibility</w:t>
       </w:r>
-      <w:bookmarkEnd w:id="34"/>
+      <w:bookmarkEnd w:id="35"/>
     </w:p>
     <w:p>
       <w:r>
@@ -12608,7 +13103,7 @@
         </w:rPr>
         <w:lastRenderedPageBreak/>
         <w:drawing>
-          <wp:inline distT="0" distB="0" distL="0" distR="0" wp14:anchorId="6C055B46" wp14:editId="248B8AD6">
+          <wp:inline distT="0" distB="0" distL="0" distR="0" wp14:anchorId="264CBA7F" wp14:editId="689B607E">
             <wp:extent cx="5029200" cy="4306252"/>
             <wp:effectExtent l="0" t="0" r="0" b="0"/>
             <wp:docPr id="4" name="Picture 4"/>
@@ -12669,7 +13164,7 @@
         </w:rPr>
         <w:lastRenderedPageBreak/>
         <w:drawing>
-          <wp:inline distT="0" distB="0" distL="0" distR="0" wp14:anchorId="1859F7B4" wp14:editId="4E808490">
+          <wp:inline distT="0" distB="0" distL="0" distR="0" wp14:anchorId="2BD1B11E" wp14:editId="2684A298">
             <wp:extent cx="5029200" cy="5930265"/>
             <wp:effectExtent l="0" t="0" r="0" b="0"/>
             <wp:docPr id="5" name="Picture 5"/>
@@ -12724,11 +13219,11 @@
       <w:pPr>
         <w:pStyle w:val="u2"/>
       </w:pPr>
-      <w:bookmarkStart w:id="35" w:name="_Toc242000993"/>
+      <w:bookmarkStart w:id="36" w:name="_Toc242001695"/>
       <w:r>
         <w:t>5.5. Coverage và mutation</w:t>
       </w:r>
-      <w:bookmarkEnd w:id="35"/>
+      <w:bookmarkEnd w:id="36"/>
     </w:p>
     <w:p>
       <w:r>
@@ -12750,7 +13245,7 @@
         </w:rPr>
         <w:lastRenderedPageBreak/>
         <w:drawing>
-          <wp:inline distT="0" distB="0" distL="0" distR="0" wp14:anchorId="336A6FCA" wp14:editId="154F6C4E">
+          <wp:inline distT="0" distB="0" distL="0" distR="0" wp14:anchorId="495E5AC3" wp14:editId="43CCD7DC">
             <wp:extent cx="5669280" cy="1653540"/>
             <wp:effectExtent l="0" t="0" r="0" b="0"/>
             <wp:docPr id="6" name="Picture 6"/>
@@ -12820,7 +13315,7 @@
           <w:noProof/>
         </w:rPr>
         <w:drawing>
-          <wp:inline distT="0" distB="0" distL="0" distR="0" wp14:anchorId="22FAB099" wp14:editId="0655A345">
+          <wp:inline distT="0" distB="0" distL="0" distR="0" wp14:anchorId="2481F7C7" wp14:editId="290B5381">
             <wp:extent cx="5669280" cy="2440940"/>
             <wp:effectExtent l="0" t="0" r="0" b="0"/>
             <wp:docPr id="7" name="Picture 7"/>
@@ -12883,7 +13378,7 @@
           <w:i/>
           <w:sz w:val="22"/>
         </w:rPr>
-        <w:t>Bảng 14. Diễn giải mutation result</w:t>
+        <w:t>Bảng 15. Diễn giải mutation result</w:t>
       </w:r>
     </w:p>
     <w:tbl>
@@ -13249,7 +13744,7 @@
       <w:pPr>
         <w:pStyle w:val="u2"/>
       </w:pPr>
-      <w:bookmarkStart w:id="36" w:name="_Toc242000994"/>
+      <w:bookmarkStart w:id="37" w:name="_Toc242001696"/>
       <w:r>
         <w:t>5.6. Hi</w:t>
       </w:r>
@@ -13259,7 +13754,7 @@
       <w:r>
         <w:t>u năng và race condition</w:t>
       </w:r>
-      <w:bookmarkEnd w:id="36"/>
+      <w:bookmarkEnd w:id="37"/>
     </w:p>
     <w:p>
       <w:r>
@@ -13280,11 +13775,11 @@
       <w:pPr>
         <w:pStyle w:val="u2"/>
       </w:pPr>
-      <w:bookmarkStart w:id="37" w:name="_Toc242000995"/>
+      <w:bookmarkStart w:id="38" w:name="_Toc242001697"/>
       <w:r>
         <w:t>5.7. Security testing</w:t>
       </w:r>
-      <w:bookmarkEnd w:id="37"/>
+      <w:bookmarkEnd w:id="38"/>
     </w:p>
     <w:p>
       <w:r>
@@ -13312,7 +13807,7 @@
           <w:i/>
           <w:sz w:val="22"/>
         </w:rPr>
-        <w:t>Bảng 15. Phạm vi security và giới hạn</w:t>
+        <w:t>Bảng 16. Phạm vi security và giới hạn</w:t>
       </w:r>
     </w:p>
     <w:tbl>
@@ -13735,7 +14230,7 @@
       <w:pPr>
         <w:pStyle w:val="u2"/>
       </w:pPr>
-      <w:bookmarkStart w:id="38" w:name="_Toc242000996"/>
+      <w:bookmarkStart w:id="39" w:name="_Toc242001698"/>
       <w:r>
         <w:t>5.8. Lighthouse, axe và tr</w:t>
       </w:r>
@@ -13751,7 +14246,7 @@
       <w:r>
         <w:t>m</w:t>
       </w:r>
-      <w:bookmarkEnd w:id="38"/>
+      <w:bookmarkEnd w:id="39"/>
     </w:p>
     <w:p>
       <w:r>
@@ -13767,7 +14262,7 @@
       <w:pPr>
         <w:pStyle w:val="u2"/>
       </w:pPr>
-      <w:bookmarkStart w:id="39" w:name="_Toc242000997"/>
+      <w:bookmarkStart w:id="40" w:name="_Toc242001699"/>
       <w:r>
         <w:t>5.9. Tính tái l</w:t>
       </w:r>
@@ -13795,7 +14290,7 @@
       <w:r>
         <w:t>a evidence</w:t>
       </w:r>
-      <w:bookmarkEnd w:id="39"/>
+      <w:bookmarkEnd w:id="40"/>
     </w:p>
     <w:p>
       <w:r>
@@ -13812,7 +14307,7 @@
       <w:pPr>
         <w:pStyle w:val="u1"/>
       </w:pPr>
-      <w:bookmarkStart w:id="40" w:name="_Toc242000998"/>
+      <w:bookmarkStart w:id="41" w:name="_Toc242001700"/>
       <w:r>
         <w:lastRenderedPageBreak/>
         <w:t>CHƯƠNG 6. DEFECT, RETEST VÀ ĐÁNH GIÁ CH</w:t>
@@ -13829,17 +14324,17 @@
       <w:r>
         <w:t>NG</w:t>
       </w:r>
-      <w:bookmarkEnd w:id="40"/>
+      <w:bookmarkEnd w:id="41"/>
     </w:p>
     <w:p>
       <w:pPr>
         <w:pStyle w:val="u2"/>
       </w:pPr>
-      <w:bookmarkStart w:id="41" w:name="_Toc242000999"/>
+      <w:bookmarkStart w:id="42" w:name="_Toc242001701"/>
       <w:r>
         <w:t>6.1. Defect lifecycle</w:t>
       </w:r>
-      <w:bookmarkEnd w:id="41"/>
+      <w:bookmarkEnd w:id="42"/>
     </w:p>
     <w:p>
       <w:r>
@@ -13858,7 +14353,7 @@
           <w:i/>
           <w:sz w:val="22"/>
         </w:rPr>
-        <w:t>Bảng 16. Các nhóm defect đã xử lý</w:t>
+        <w:t>Bảng 17. Các nhóm defect đã xử lý</w:t>
       </w:r>
     </w:p>
     <w:tbl>
@@ -14573,7 +15068,7 @@
       <w:pPr>
         <w:pStyle w:val="u2"/>
       </w:pPr>
-      <w:bookmarkStart w:id="42" w:name="_Toc242001000"/>
+      <w:bookmarkStart w:id="43" w:name="_Toc242001702"/>
       <w:r>
         <w:t>6.2. Phân tích ba defect có tác đ</w:t>
       </w:r>
@@ -14583,7 +15078,7 @@
       <w:r>
         <w:t>ng cao</w:t>
       </w:r>
-      <w:bookmarkEnd w:id="42"/>
+      <w:bookmarkEnd w:id="43"/>
     </w:p>
     <w:p>
       <w:r>
@@ -14611,7 +15106,7 @@
       <w:pPr>
         <w:pStyle w:val="u2"/>
       </w:pPr>
-      <w:bookmarkStart w:id="43" w:name="_Toc242001001"/>
+      <w:bookmarkStart w:id="44" w:name="_Toc242001703"/>
       <w:r>
         <w:t>6.3. Tr</w:t>
       </w:r>
@@ -14633,7 +15128,7 @@
       <w:r>
         <w:t>i đánh giá</w:t>
       </w:r>
-      <w:bookmarkEnd w:id="43"/>
+      <w:bookmarkEnd w:id="44"/>
     </w:p>
     <w:p>
       <w:r>
@@ -14659,12 +15154,12 @@
       <w:pPr>
         <w:pStyle w:val="u2"/>
       </w:pPr>
-      <w:bookmarkStart w:id="44" w:name="_Toc242001002"/>
+      <w:bookmarkStart w:id="45" w:name="_Toc242001704"/>
       <w:r>
         <w:lastRenderedPageBreak/>
         <w:t>6.4. Đánh giá theo ISO/IEC 25010:2023</w:t>
       </w:r>
-      <w:bookmarkEnd w:id="44"/>
+      <w:bookmarkEnd w:id="45"/>
     </w:p>
     <w:p>
       <w:pPr>
@@ -14678,7 +15173,7 @@
           <w:i/>
           <w:sz w:val="22"/>
         </w:rPr>
-        <w:t>Bảng 17. Đánh giá chín đặc tính chất lượng</w:t>
+        <w:t>Bảng 18. Đánh giá chín đặc tính chất lượng</w:t>
       </w:r>
     </w:p>
     <w:tbl>
@@ -15364,7 +15859,7 @@
       <w:pPr>
         <w:pStyle w:val="u2"/>
       </w:pPr>
-      <w:bookmarkStart w:id="45" w:name="_Toc242001003"/>
+      <w:bookmarkStart w:id="46" w:name="_Toc242001705"/>
       <w:r>
         <w:t>6.5. Gi</w:t>
       </w:r>
@@ -15410,7 +15905,7 @@
       <w:r>
         <w:t>ch</w:t>
       </w:r>
-      <w:bookmarkEnd w:id="45"/>
+      <w:bookmarkEnd w:id="46"/>
     </w:p>
     <w:p>
       <w:pPr>
@@ -15424,7 +15919,7 @@
           <w:i/>
           <w:sz w:val="22"/>
         </w:rPr>
-        <w:t>Bảng 18. Các yếu tố có thể làm sai lệch kết quả</w:t>
+        <w:t>Bảng 19. Các yếu tố có thể làm sai lệch kết quả</w:t>
       </w:r>
     </w:p>
     <w:tbl>
@@ -15852,7 +16347,7 @@
       <w:pPr>
         <w:pStyle w:val="u1"/>
       </w:pPr>
-      <w:bookmarkStart w:id="46" w:name="_Toc242001004"/>
+      <w:bookmarkStart w:id="47" w:name="_Toc242001706"/>
       <w:r>
         <w:lastRenderedPageBreak/>
         <w:t>CHƯƠNG 7. K</w:t>
@@ -15878,13 +16373,13 @@
       <w:r>
         <w:t>Ị</w:t>
       </w:r>
-      <w:bookmarkEnd w:id="46"/>
+      <w:bookmarkEnd w:id="47"/>
     </w:p>
     <w:p>
       <w:pPr>
         <w:pStyle w:val="u2"/>
       </w:pPr>
-      <w:bookmarkStart w:id="47" w:name="_Toc242001005"/>
+      <w:bookmarkStart w:id="48" w:name="_Toc242001707"/>
       <w:r>
         <w:t>7.1. K</w:t>
       </w:r>
@@ -15912,7 +16407,7 @@
       <w:r>
         <w:t>c</w:t>
       </w:r>
-      <w:bookmarkEnd w:id="47"/>
+      <w:bookmarkEnd w:id="48"/>
     </w:p>
     <w:p>
       <w:r>
@@ -15928,7 +16423,7 @@
       <w:pPr>
         <w:pStyle w:val="u2"/>
       </w:pPr>
-      <w:bookmarkStart w:id="48" w:name="_Toc242001006"/>
+      <w:bookmarkStart w:id="49" w:name="_Toc242001708"/>
       <w:r>
         <w:t>7.2. H</w:t>
       </w:r>
@@ -15941,7 +16436,7 @@
       <w:r>
         <w:t>ế</w:t>
       </w:r>
-      <w:bookmarkEnd w:id="48"/>
+      <w:bookmarkEnd w:id="49"/>
     </w:p>
     <w:p>
       <w:r>
@@ -15952,7 +16447,7 @@
       <w:pPr>
         <w:pStyle w:val="u2"/>
       </w:pPr>
-      <w:bookmarkStart w:id="49" w:name="_Toc242001007"/>
+      <w:bookmarkStart w:id="50" w:name="_Toc242001709"/>
       <w:r>
         <w:t>7.3. Hư</w:t>
       </w:r>
@@ -15968,7 +16463,7 @@
       <w:r>
         <w:t>n</w:t>
       </w:r>
-      <w:bookmarkEnd w:id="49"/>
+      <w:bookmarkEnd w:id="50"/>
     </w:p>
     <w:p>
       <w:r>
@@ -15990,7 +16485,7 @@
       <w:pPr>
         <w:pStyle w:val="u1"/>
       </w:pPr>
-      <w:bookmarkStart w:id="50" w:name="_Toc242001008"/>
+      <w:bookmarkStart w:id="51" w:name="_Toc242001710"/>
       <w:r>
         <w:lastRenderedPageBreak/>
         <w:t>TÀI LI</w:t>
@@ -16007,7 +16502,7 @@
       <w:r>
         <w:t>O</w:t>
       </w:r>
-      <w:bookmarkEnd w:id="50"/>
+      <w:bookmarkEnd w:id="51"/>
     </w:p>
     <w:p>
       <w:pPr>
@@ -16101,7 +16596,7 @@
       <w:pPr>
         <w:pStyle w:val="u1"/>
       </w:pPr>
-      <w:bookmarkStart w:id="51" w:name="_Toc242001009"/>
+      <w:bookmarkStart w:id="52" w:name="_Toc242001711"/>
       <w:r>
         <w:lastRenderedPageBreak/>
         <w:t>PH</w:t>
@@ -16136,7 +16631,7 @@
       <w:r>
         <w:t>N</w:t>
       </w:r>
-      <w:bookmarkEnd w:id="51"/>
+      <w:bookmarkEnd w:id="52"/>
     </w:p>
     <w:p>
       <w:pPr>
@@ -16150,7 +16645,7 @@
           <w:i/>
           <w:sz w:val="22"/>
         </w:rPr>
-        <w:t>Bảng 19. Requirement → technique → test → defect → evidence</w:t>
+        <w:t>Bảng 20. Requirement → technique → test → defect → evidence</w:t>
       </w:r>
     </w:p>
     <w:tbl>
@@ -17129,7 +17624,7 @@
       <w:pPr>
         <w:pStyle w:val="u1"/>
       </w:pPr>
-      <w:bookmarkStart w:id="52" w:name="_Toc242001010"/>
+      <w:bookmarkStart w:id="53" w:name="_Toc242001712"/>
       <w:r>
         <w:lastRenderedPageBreak/>
         <w:t>PH</w:t>
@@ -17170,7 +17665,7 @@
       <w:r>
         <w:t>NG</w:t>
       </w:r>
-      <w:bookmarkEnd w:id="52"/>
+      <w:bookmarkEnd w:id="53"/>
     </w:p>
     <w:p>
       <w:pPr>
@@ -17184,7 +17679,7 @@
           <w:i/>
           <w:sz w:val="22"/>
         </w:rPr>
-        <w:t>Bảng 20. Các biên nghiệp vụ bắt buộc</w:t>
+        <w:t>Bảng 21. Các biên nghiệp vụ bắt buộc</w:t>
       </w:r>
     </w:p>
     <w:tbl>
@@ -17802,7 +18297,7 @@
       <w:pPr>
         <w:pStyle w:val="u1"/>
       </w:pPr>
-      <w:bookmarkStart w:id="53" w:name="_Toc242001011"/>
+      <w:bookmarkStart w:id="54" w:name="_Toc242001713"/>
       <w:r>
         <w:lastRenderedPageBreak/>
         <w:t>PH</w:t>
@@ -17837,7 +18332,7 @@
       <w:r>
         <w:t>N</w:t>
       </w:r>
-      <w:bookmarkEnd w:id="53"/>
+      <w:bookmarkEnd w:id="54"/>
     </w:p>
     <w:p>
       <w:pPr>
@@ -17851,7 +18346,7 @@
           <w:i/>
           <w:sz w:val="22"/>
         </w:rPr>
-        <w:t>Bảng 21. Endpoint nghiệp vụ và ca lỗi</w:t>
+        <w:t>Bảng 22. Endpoint nghiệp vụ và ca lỗi</w:t>
       </w:r>
     </w:p>
     <w:tbl>
@@ -18532,7 +19027,7 @@
       <w:pPr>
         <w:pStyle w:val="u2"/>
       </w:pPr>
-      <w:bookmarkStart w:id="54" w:name="_Toc242001012"/>
+      <w:bookmarkStart w:id="55" w:name="_Toc242001714"/>
       <w:r>
         <w:t>PH</w:t>
       </w:r>
@@ -18554,7 +19049,7 @@
       <w:r>
         <w:t>P</w:t>
       </w:r>
-      <w:bookmarkEnd w:id="54"/>
+      <w:bookmarkEnd w:id="55"/>
     </w:p>
     <w:p>
       <w:r>
@@ -18840,31 +19335,31 @@
       </w:rPr>
     </w:lvl>
   </w:abstractNum>
-  <w:num w:numId="1" w16cid:durableId="1496259823">
+  <w:num w:numId="1" w16cid:durableId="1165433568">
     <w:abstractNumId w:val="8"/>
   </w:num>
-  <w:num w:numId="2" w16cid:durableId="1233156391">
+  <w:num w:numId="2" w16cid:durableId="99956961">
     <w:abstractNumId w:val="6"/>
   </w:num>
-  <w:num w:numId="3" w16cid:durableId="1137836365">
+  <w:num w:numId="3" w16cid:durableId="723334420">
     <w:abstractNumId w:val="5"/>
   </w:num>
-  <w:num w:numId="4" w16cid:durableId="500898570">
+  <w:num w:numId="4" w16cid:durableId="657226608">
     <w:abstractNumId w:val="4"/>
   </w:num>
-  <w:num w:numId="5" w16cid:durableId="1946421257">
+  <w:num w:numId="5" w16cid:durableId="2017221280">
     <w:abstractNumId w:val="7"/>
   </w:num>
-  <w:num w:numId="6" w16cid:durableId="586353953">
+  <w:num w:numId="6" w16cid:durableId="424348132">
     <w:abstractNumId w:val="3"/>
   </w:num>
-  <w:num w:numId="7" w16cid:durableId="372267388">
+  <w:num w:numId="7" w16cid:durableId="380859411">
     <w:abstractNumId w:val="2"/>
   </w:num>
-  <w:num w:numId="8" w16cid:durableId="1091315159">
+  <w:num w:numId="8" w16cid:durableId="35350881">
     <w:abstractNumId w:val="1"/>
   </w:num>
-  <w:num w:numId="9" w16cid:durableId="413823651">
+  <w:num w:numId="9" w16cid:durableId="897672329">
     <w:abstractNumId w:val="0"/>
   </w:num>
 </w:numbering>
@@ -30259,7 +30754,7 @@
     <w:autoRedefine/>
     <w:uiPriority w:val="39"/>
     <w:unhideWhenUsed/>
-    <w:rsid w:val="001B31E3"/>
+    <w:rsid w:val="00061F16"/>
     <w:pPr>
       <w:spacing w:after="100"/>
     </w:pPr>
@@ -30271,7 +30766,7 @@
     <w:autoRedefine/>
     <w:uiPriority w:val="39"/>
     <w:unhideWhenUsed/>
-    <w:rsid w:val="001B31E3"/>
+    <w:rsid w:val="00061F16"/>
     <w:pPr>
       <w:spacing w:after="100"/>
       <w:ind w:left="260"/>
@@ -30284,7 +30779,7 @@
     <w:autoRedefine/>
     <w:uiPriority w:val="39"/>
     <w:unhideWhenUsed/>
-    <w:rsid w:val="001B31E3"/>
+    <w:rsid w:val="00061F16"/>
     <w:pPr>
       <w:spacing w:after="100"/>
       <w:ind w:left="520"/>
@@ -30295,7 +30790,7 @@
     <w:basedOn w:val="Phngmcinhcuaoanvn"/>
     <w:uiPriority w:val="99"/>
     <w:unhideWhenUsed/>
-    <w:rsid w:val="001B31E3"/>
+    <w:rsid w:val="00061F16"/>
     <w:rPr>
       <w:color w:val="0000FF" w:themeColor="hyperlink"/>
       <w:u w:val="single"/>

</xml_diff>

<commit_message>
docs: improve report diagram readability
</commit_message>
<xml_diff>
--- a/output/docx/StudySpace-BaoCao-DanhGia-KiemDinh.docx
+++ b/output/docx/StudySpace-BaoCao-DanhGia-KiemDinh.docx
@@ -166,7 +166,7 @@
       <w:pPr>
         <w:pStyle w:val="u1"/>
       </w:pPr>
-      <w:bookmarkStart w:id="0" w:name="_Toc242001659"/>
+      <w:bookmarkStart w:id="0" w:name="_Toc242002761"/>
       <w:r>
         <w:lastRenderedPageBreak/>
         <w:t>L</w:t>
@@ -199,7 +199,7 @@
       <w:pPr>
         <w:pStyle w:val="u1"/>
       </w:pPr>
-      <w:bookmarkStart w:id="1" w:name="_Toc242001660"/>
+      <w:bookmarkStart w:id="1" w:name="_Toc242002762"/>
       <w:r>
         <w:lastRenderedPageBreak/>
         <w:t>TÓM T</w:t>
@@ -250,7 +250,7 @@
       <w:pPr>
         <w:pStyle w:val="u1"/>
       </w:pPr>
-      <w:bookmarkStart w:id="2" w:name="_Toc242001661"/>
+      <w:bookmarkStart w:id="2" w:name="_Toc242002763"/>
       <w:r>
         <w:lastRenderedPageBreak/>
         <w:t>M</w:t>
@@ -295,7 +295,7 @@
       <w:r>
         <w:fldChar w:fldCharType="separate"/>
       </w:r>
-      <w:hyperlink w:anchor="_Toc242001659" w:history="1">
+      <w:hyperlink w:anchor="_Toc242002761" w:history="1">
         <w:r>
           <w:rPr>
             <w:rStyle w:val="Siuktni"/>
@@ -322,7 +322,7 @@
             <w:noProof/>
             <w:webHidden/>
           </w:rPr>
-          <w:instrText xml:space="preserve"> PAGEREF _Toc242001659 \h </w:instrText>
+          <w:instrText xml:space="preserve"> PAGEREF _Toc242002761 \h </w:instrText>
         </w:r>
         <w:r>
           <w:rPr>
@@ -370,7 +370,7 @@
           <w14:ligatures w14:val="standardContextual"/>
         </w:rPr>
       </w:pPr>
-      <w:hyperlink w:anchor="_Toc242001660" w:history="1">
+      <w:hyperlink w:anchor="_Toc242002762" w:history="1">
         <w:r>
           <w:rPr>
             <w:rStyle w:val="Siuktni"/>
@@ -397,7 +397,7 @@
             <w:noProof/>
             <w:webHidden/>
           </w:rPr>
-          <w:instrText xml:space="preserve"> PAGEREF _Toc242001660 \h </w:instrText>
+          <w:instrText xml:space="preserve"> PAGEREF _Toc242002762 \h </w:instrText>
         </w:r>
         <w:r>
           <w:rPr>
@@ -445,7 +445,7 @@
           <w14:ligatures w14:val="standardContextual"/>
         </w:rPr>
       </w:pPr>
-      <w:hyperlink w:anchor="_Toc242001661" w:history="1">
+      <w:hyperlink w:anchor="_Toc242002763" w:history="1">
         <w:r>
           <w:rPr>
             <w:rStyle w:val="Siuktni"/>
@@ -472,7 +472,7 @@
             <w:noProof/>
             <w:webHidden/>
           </w:rPr>
-          <w:instrText xml:space="preserve"> PAGEREF _Toc242001661 \h </w:instrText>
+          <w:instrText xml:space="preserve"> PAGEREF _Toc242002763 \h </w:instrText>
         </w:r>
         <w:r>
           <w:rPr>
@@ -520,7 +520,7 @@
           <w14:ligatures w14:val="standardContextual"/>
         </w:rPr>
       </w:pPr>
-      <w:hyperlink w:anchor="_Toc242001662" w:history="1">
+      <w:hyperlink w:anchor="_Toc242002764" w:history="1">
         <w:r>
           <w:rPr>
             <w:rStyle w:val="Siuktni"/>
@@ -547,7 +547,7 @@
             <w:noProof/>
             <w:webHidden/>
           </w:rPr>
-          <w:instrText xml:space="preserve"> PAGEREF _Toc242001662 \h </w:instrText>
+          <w:instrText xml:space="preserve"> PAGEREF _Toc242002764 \h </w:instrText>
         </w:r>
         <w:r>
           <w:rPr>
@@ -595,7 +595,7 @@
           <w14:ligatures w14:val="standardContextual"/>
         </w:rPr>
       </w:pPr>
-      <w:hyperlink w:anchor="_Toc242001663" w:history="1">
+      <w:hyperlink w:anchor="_Toc242002765" w:history="1">
         <w:r>
           <w:rPr>
             <w:rStyle w:val="Siuktni"/>
@@ -622,7 +622,7 @@
             <w:noProof/>
             <w:webHidden/>
           </w:rPr>
-          <w:instrText xml:space="preserve"> PAGEREF _Toc242001663 \h </w:instrText>
+          <w:instrText xml:space="preserve"> PAGEREF _Toc242002765 \h </w:instrText>
         </w:r>
         <w:r>
           <w:rPr>
@@ -670,7 +670,7 @@
           <w14:ligatures w14:val="standardContextual"/>
         </w:rPr>
       </w:pPr>
-      <w:hyperlink w:anchor="_Toc242001664" w:history="1">
+      <w:hyperlink w:anchor="_Toc242002766" w:history="1">
         <w:r>
           <w:rPr>
             <w:rStyle w:val="Siuktni"/>
@@ -697,7 +697,7 @@
             <w:noProof/>
             <w:webHidden/>
           </w:rPr>
-          <w:instrText xml:space="preserve"> PAGEREF _Toc242001664 \h </w:instrText>
+          <w:instrText xml:space="preserve"> PAGEREF _Toc242002766 \h </w:instrText>
         </w:r>
         <w:r>
           <w:rPr>
@@ -745,7 +745,7 @@
           <w14:ligatures w14:val="standardContextual"/>
         </w:rPr>
       </w:pPr>
-      <w:hyperlink w:anchor="_Toc242001665" w:history="1">
+      <w:hyperlink w:anchor="_Toc242002767" w:history="1">
         <w:r>
           <w:rPr>
             <w:rStyle w:val="Siuktni"/>
@@ -772,7 +772,7 @@
             <w:noProof/>
             <w:webHidden/>
           </w:rPr>
-          <w:instrText xml:space="preserve"> PAGEREF _Toc242001665 \h </w:instrText>
+          <w:instrText xml:space="preserve"> PAGEREF _Toc242002767 \h </w:instrText>
         </w:r>
         <w:r>
           <w:rPr>
@@ -820,7 +820,7 @@
           <w14:ligatures w14:val="standardContextual"/>
         </w:rPr>
       </w:pPr>
-      <w:hyperlink w:anchor="_Toc242001666" w:history="1">
+      <w:hyperlink w:anchor="_Toc242002768" w:history="1">
         <w:r>
           <w:rPr>
             <w:rStyle w:val="Siuktni"/>
@@ -847,7 +847,7 @@
             <w:noProof/>
             <w:webHidden/>
           </w:rPr>
-          <w:instrText xml:space="preserve"> PAGEREF _Toc242001666 \h </w:instrText>
+          <w:instrText xml:space="preserve"> PAGEREF _Toc242002768 \h </w:instrText>
         </w:r>
         <w:r>
           <w:rPr>
@@ -895,7 +895,7 @@
           <w14:ligatures w14:val="standardContextual"/>
         </w:rPr>
       </w:pPr>
-      <w:hyperlink w:anchor="_Toc242001667" w:history="1">
+      <w:hyperlink w:anchor="_Toc242002769" w:history="1">
         <w:r>
           <w:rPr>
             <w:rStyle w:val="Siuktni"/>
@@ -922,7 +922,7 @@
             <w:noProof/>
             <w:webHidden/>
           </w:rPr>
-          <w:instrText xml:space="preserve"> PAGEREF _Toc242001667 \h </w:instrText>
+          <w:instrText xml:space="preserve"> PAGEREF _Toc242002769 \h </w:instrText>
         </w:r>
         <w:r>
           <w:rPr>
@@ -970,7 +970,7 @@
           <w14:ligatures w14:val="standardContextual"/>
         </w:rPr>
       </w:pPr>
-      <w:hyperlink w:anchor="_Toc242001668" w:history="1">
+      <w:hyperlink w:anchor="_Toc242002770" w:history="1">
         <w:r>
           <w:rPr>
             <w:rStyle w:val="Siuktni"/>
@@ -997,7 +997,7 @@
             <w:noProof/>
             <w:webHidden/>
           </w:rPr>
-          <w:instrText xml:space="preserve"> PAGEREF _Toc242001668 \h </w:instrText>
+          <w:instrText xml:space="preserve"> PAGEREF _Toc242002770 \h </w:instrText>
         </w:r>
         <w:r>
           <w:rPr>
@@ -1045,7 +1045,7 @@
           <w14:ligatures w14:val="standardContextual"/>
         </w:rPr>
       </w:pPr>
-      <w:hyperlink w:anchor="_Toc242001669" w:history="1">
+      <w:hyperlink w:anchor="_Toc242002771" w:history="1">
         <w:r>
           <w:rPr>
             <w:rStyle w:val="Siuktni"/>
@@ -1072,7 +1072,7 @@
             <w:noProof/>
             <w:webHidden/>
           </w:rPr>
-          <w:instrText xml:space="preserve"> PAGEREF _Toc242001669 \h </w:instrText>
+          <w:instrText xml:space="preserve"> PAGEREF _Toc242002771 \h </w:instrText>
         </w:r>
         <w:r>
           <w:rPr>
@@ -1120,7 +1120,7 @@
           <w14:ligatures w14:val="standardContextual"/>
         </w:rPr>
       </w:pPr>
-      <w:hyperlink w:anchor="_Toc242001670" w:history="1">
+      <w:hyperlink w:anchor="_Toc242002772" w:history="1">
         <w:r>
           <w:rPr>
             <w:rStyle w:val="Siuktni"/>
@@ -1147,7 +1147,7 @@
             <w:noProof/>
             <w:webHidden/>
           </w:rPr>
-          <w:instrText xml:space="preserve"> PAGEREF _Toc242001670 \h </w:instrText>
+          <w:instrText xml:space="preserve"> PAGEREF _Toc242002772 \h </w:instrText>
         </w:r>
         <w:r>
           <w:rPr>
@@ -1195,7 +1195,7 @@
           <w14:ligatures w14:val="standardContextual"/>
         </w:rPr>
       </w:pPr>
-      <w:hyperlink w:anchor="_Toc242001671" w:history="1">
+      <w:hyperlink w:anchor="_Toc242002773" w:history="1">
         <w:r>
           <w:rPr>
             <w:rStyle w:val="Siuktni"/>
@@ -1222,7 +1222,7 @@
             <w:noProof/>
             <w:webHidden/>
           </w:rPr>
-          <w:instrText xml:space="preserve"> PAGEREF _Toc242001671 \h </w:instrText>
+          <w:instrText xml:space="preserve"> PAGEREF _Toc242002773 \h </w:instrText>
         </w:r>
         <w:r>
           <w:rPr>
@@ -1270,7 +1270,7 @@
           <w14:ligatures w14:val="standardContextual"/>
         </w:rPr>
       </w:pPr>
-      <w:hyperlink w:anchor="_Toc242001672" w:history="1">
+      <w:hyperlink w:anchor="_Toc242002774" w:history="1">
         <w:r>
           <w:rPr>
             <w:rStyle w:val="Siuktni"/>
@@ -1297,7 +1297,7 @@
             <w:noProof/>
             <w:webHidden/>
           </w:rPr>
-          <w:instrText xml:space="preserve"> PAGEREF _Toc242001672 \h </w:instrText>
+          <w:instrText xml:space="preserve"> PAGEREF _Toc242002774 \h </w:instrText>
         </w:r>
         <w:r>
           <w:rPr>
@@ -1345,7 +1345,7 @@
           <w14:ligatures w14:val="standardContextual"/>
         </w:rPr>
       </w:pPr>
-      <w:hyperlink w:anchor="_Toc242001673" w:history="1">
+      <w:hyperlink w:anchor="_Toc242002775" w:history="1">
         <w:r>
           <w:rPr>
             <w:rStyle w:val="Siuktni"/>
@@ -1372,7 +1372,7 @@
             <w:noProof/>
             <w:webHidden/>
           </w:rPr>
-          <w:instrText xml:space="preserve"> PAGEREF _Toc242001673 \h </w:instrText>
+          <w:instrText xml:space="preserve"> PAGEREF _Toc242002775 \h </w:instrText>
         </w:r>
         <w:r>
           <w:rPr>
@@ -1420,7 +1420,7 @@
           <w14:ligatures w14:val="standardContextual"/>
         </w:rPr>
       </w:pPr>
-      <w:hyperlink w:anchor="_Toc242001674" w:history="1">
+      <w:hyperlink w:anchor="_Toc242002776" w:history="1">
         <w:r>
           <w:rPr>
             <w:rStyle w:val="Siuktni"/>
@@ -1447,7 +1447,7 @@
             <w:noProof/>
             <w:webHidden/>
           </w:rPr>
-          <w:instrText xml:space="preserve"> PAGEREF _Toc242001674 \h </w:instrText>
+          <w:instrText xml:space="preserve"> PAGEREF _Toc242002776 \h </w:instrText>
         </w:r>
         <w:r>
           <w:rPr>
@@ -1495,7 +1495,7 @@
           <w14:ligatures w14:val="standardContextual"/>
         </w:rPr>
       </w:pPr>
-      <w:hyperlink w:anchor="_Toc242001675" w:history="1">
+      <w:hyperlink w:anchor="_Toc242002777" w:history="1">
         <w:r>
           <w:rPr>
             <w:rStyle w:val="Siuktni"/>
@@ -1522,7 +1522,7 @@
             <w:noProof/>
             <w:webHidden/>
           </w:rPr>
-          <w:instrText xml:space="preserve"> PAGEREF _Toc242001675 \h </w:instrText>
+          <w:instrText xml:space="preserve"> PAGEREF _Toc242002777 \h </w:instrText>
         </w:r>
         <w:r>
           <w:rPr>
@@ -1570,7 +1570,7 @@
           <w14:ligatures w14:val="standardContextual"/>
         </w:rPr>
       </w:pPr>
-      <w:hyperlink w:anchor="_Toc242001676" w:history="1">
+      <w:hyperlink w:anchor="_Toc242002778" w:history="1">
         <w:r>
           <w:rPr>
             <w:rStyle w:val="Siuktni"/>
@@ -1597,7 +1597,7 @@
             <w:noProof/>
             <w:webHidden/>
           </w:rPr>
-          <w:instrText xml:space="preserve"> PAGEREF _Toc242001676 \h </w:instrText>
+          <w:instrText xml:space="preserve"> PAGEREF _Toc242002778 \h </w:instrText>
         </w:r>
         <w:r>
           <w:rPr>
@@ -1645,7 +1645,7 @@
           <w14:ligatures w14:val="standardContextual"/>
         </w:rPr>
       </w:pPr>
-      <w:hyperlink w:anchor="_Toc242001677" w:history="1">
+      <w:hyperlink w:anchor="_Toc242002779" w:history="1">
         <w:r>
           <w:rPr>
             <w:rStyle w:val="Siuktni"/>
@@ -1672,7 +1672,7 @@
             <w:noProof/>
             <w:webHidden/>
           </w:rPr>
-          <w:instrText xml:space="preserve"> PAGEREF _Toc242001677 \h </w:instrText>
+          <w:instrText xml:space="preserve"> PAGEREF _Toc242002779 \h </w:instrText>
         </w:r>
         <w:r>
           <w:rPr>
@@ -1720,7 +1720,7 @@
           <w14:ligatures w14:val="standardContextual"/>
         </w:rPr>
       </w:pPr>
-      <w:hyperlink w:anchor="_Toc242001678" w:history="1">
+      <w:hyperlink w:anchor="_Toc242002780" w:history="1">
         <w:r>
           <w:rPr>
             <w:rStyle w:val="Siuktni"/>
@@ -1747,7 +1747,7 @@
             <w:noProof/>
             <w:webHidden/>
           </w:rPr>
-          <w:instrText xml:space="preserve"> PAGEREF _Toc242001678 \h </w:instrText>
+          <w:instrText xml:space="preserve"> PAGEREF _Toc242002780 \h </w:instrText>
         </w:r>
         <w:r>
           <w:rPr>
@@ -1795,7 +1795,7 @@
           <w14:ligatures w14:val="standardContextual"/>
         </w:rPr>
       </w:pPr>
-      <w:hyperlink w:anchor="_Toc242001679" w:history="1">
+      <w:hyperlink w:anchor="_Toc242002781" w:history="1">
         <w:r>
           <w:rPr>
             <w:rStyle w:val="Siuktni"/>
@@ -1822,7 +1822,7 @@
             <w:noProof/>
             <w:webHidden/>
           </w:rPr>
-          <w:instrText xml:space="preserve"> PAGEREF _Toc242001679 \h </w:instrText>
+          <w:instrText xml:space="preserve"> PAGEREF _Toc242002781 \h </w:instrText>
         </w:r>
         <w:r>
           <w:rPr>
@@ -1870,7 +1870,7 @@
           <w14:ligatures w14:val="standardContextual"/>
         </w:rPr>
       </w:pPr>
-      <w:hyperlink w:anchor="_Toc242001680" w:history="1">
+      <w:hyperlink w:anchor="_Toc242002782" w:history="1">
         <w:r>
           <w:rPr>
             <w:rStyle w:val="Siuktni"/>
@@ -1897,7 +1897,7 @@
             <w:noProof/>
             <w:webHidden/>
           </w:rPr>
-          <w:instrText xml:space="preserve"> PAGEREF _Toc242001680 \h </w:instrText>
+          <w:instrText xml:space="preserve"> PAGEREF _Toc242002782 \h </w:instrText>
         </w:r>
         <w:r>
           <w:rPr>
@@ -1945,7 +1945,7 @@
           <w14:ligatures w14:val="standardContextual"/>
         </w:rPr>
       </w:pPr>
-      <w:hyperlink w:anchor="_Toc242001681" w:history="1">
+      <w:hyperlink w:anchor="_Toc242002783" w:history="1">
         <w:r>
           <w:rPr>
             <w:rStyle w:val="Siuktni"/>
@@ -1972,7 +1972,7 @@
             <w:noProof/>
             <w:webHidden/>
           </w:rPr>
-          <w:instrText xml:space="preserve"> PAGEREF _Toc242001681 \h </w:instrText>
+          <w:instrText xml:space="preserve"> PAGEREF _Toc242002783 \h </w:instrText>
         </w:r>
         <w:r>
           <w:rPr>
@@ -1992,7 +1992,7 @@
             <w:noProof/>
             <w:webHidden/>
           </w:rPr>
-          <w:t>17</w:t>
+          <w:t>18</w:t>
         </w:r>
         <w:r>
           <w:rPr>
@@ -2020,7 +2020,7 @@
           <w14:ligatures w14:val="standardContextual"/>
         </w:rPr>
       </w:pPr>
-      <w:hyperlink w:anchor="_Toc242001682" w:history="1">
+      <w:hyperlink w:anchor="_Toc242002784" w:history="1">
         <w:r>
           <w:rPr>
             <w:rStyle w:val="Siuktni"/>
@@ -2047,7 +2047,7 @@
             <w:noProof/>
             <w:webHidden/>
           </w:rPr>
-          <w:instrText xml:space="preserve"> PAGEREF _Toc242001682 \h </w:instrText>
+          <w:instrText xml:space="preserve"> PAGEREF _Toc242002784 \h </w:instrText>
         </w:r>
         <w:r>
           <w:rPr>
@@ -2095,7 +2095,7 @@
           <w14:ligatures w14:val="standardContextual"/>
         </w:rPr>
       </w:pPr>
-      <w:hyperlink w:anchor="_Toc242001683" w:history="1">
+      <w:hyperlink w:anchor="_Toc242002785" w:history="1">
         <w:r>
           <w:rPr>
             <w:rStyle w:val="Siuktni"/>
@@ -2122,7 +2122,7 @@
             <w:noProof/>
             <w:webHidden/>
           </w:rPr>
-          <w:instrText xml:space="preserve"> PAGEREF _Toc242001683 \h </w:instrText>
+          <w:instrText xml:space="preserve"> PAGEREF _Toc242002785 \h </w:instrText>
         </w:r>
         <w:r>
           <w:rPr>
@@ -2170,7 +2170,7 @@
           <w14:ligatures w14:val="standardContextual"/>
         </w:rPr>
       </w:pPr>
-      <w:hyperlink w:anchor="_Toc242001684" w:history="1">
+      <w:hyperlink w:anchor="_Toc242002786" w:history="1">
         <w:r>
           <w:rPr>
             <w:rStyle w:val="Siuktni"/>
@@ -2197,7 +2197,7 @@
             <w:noProof/>
             <w:webHidden/>
           </w:rPr>
-          <w:instrText xml:space="preserve"> PAGEREF _Toc242001684 \h </w:instrText>
+          <w:instrText xml:space="preserve"> PAGEREF _Toc242002786 \h </w:instrText>
         </w:r>
         <w:r>
           <w:rPr>
@@ -2245,7 +2245,7 @@
           <w14:ligatures w14:val="standardContextual"/>
         </w:rPr>
       </w:pPr>
-      <w:hyperlink w:anchor="_Toc242001685" w:history="1">
+      <w:hyperlink w:anchor="_Toc242002787" w:history="1">
         <w:r>
           <w:rPr>
             <w:rStyle w:val="Siuktni"/>
@@ -2272,7 +2272,7 @@
             <w:noProof/>
             <w:webHidden/>
           </w:rPr>
-          <w:instrText xml:space="preserve"> PAGEREF _Toc242001685 \h </w:instrText>
+          <w:instrText xml:space="preserve"> PAGEREF _Toc242002787 \h </w:instrText>
         </w:r>
         <w:r>
           <w:rPr>
@@ -2320,7 +2320,7 @@
           <w14:ligatures w14:val="standardContextual"/>
         </w:rPr>
       </w:pPr>
-      <w:hyperlink w:anchor="_Toc242001686" w:history="1">
+      <w:hyperlink w:anchor="_Toc242002788" w:history="1">
         <w:r>
           <w:rPr>
             <w:rStyle w:val="Siuktni"/>
@@ -2347,7 +2347,7 @@
             <w:noProof/>
             <w:webHidden/>
           </w:rPr>
-          <w:instrText xml:space="preserve"> PAGEREF _Toc242001686 \h </w:instrText>
+          <w:instrText xml:space="preserve"> PAGEREF _Toc242002788 \h </w:instrText>
         </w:r>
         <w:r>
           <w:rPr>
@@ -2395,7 +2395,7 @@
           <w14:ligatures w14:val="standardContextual"/>
         </w:rPr>
       </w:pPr>
-      <w:hyperlink w:anchor="_Toc242001687" w:history="1">
+      <w:hyperlink w:anchor="_Toc242002789" w:history="1">
         <w:r>
           <w:rPr>
             <w:rStyle w:val="Siuktni"/>
@@ -2422,7 +2422,7 @@
             <w:noProof/>
             <w:webHidden/>
           </w:rPr>
-          <w:instrText xml:space="preserve"> PAGEREF _Toc242001687 \h </w:instrText>
+          <w:instrText xml:space="preserve"> PAGEREF _Toc242002789 \h </w:instrText>
         </w:r>
         <w:r>
           <w:rPr>
@@ -2470,7 +2470,7 @@
           <w14:ligatures w14:val="standardContextual"/>
         </w:rPr>
       </w:pPr>
-      <w:hyperlink w:anchor="_Toc242001688" w:history="1">
+      <w:hyperlink w:anchor="_Toc242002790" w:history="1">
         <w:r>
           <w:rPr>
             <w:rStyle w:val="Siuktni"/>
@@ -2497,7 +2497,7 @@
             <w:noProof/>
             <w:webHidden/>
           </w:rPr>
-          <w:instrText xml:space="preserve"> PAGEREF _Toc242001688 \h </w:instrText>
+          <w:instrText xml:space="preserve"> PAGEREF _Toc242002790 \h </w:instrText>
         </w:r>
         <w:r>
           <w:rPr>
@@ -2545,7 +2545,7 @@
           <w14:ligatures w14:val="standardContextual"/>
         </w:rPr>
       </w:pPr>
-      <w:hyperlink w:anchor="_Toc242001689" w:history="1">
+      <w:hyperlink w:anchor="_Toc242002791" w:history="1">
         <w:r>
           <w:rPr>
             <w:rStyle w:val="Siuktni"/>
@@ -2572,7 +2572,7 @@
             <w:noProof/>
             <w:webHidden/>
           </w:rPr>
-          <w:instrText xml:space="preserve"> PAGEREF _Toc242001689 \h </w:instrText>
+          <w:instrText xml:space="preserve"> PAGEREF _Toc242002791 \h </w:instrText>
         </w:r>
         <w:r>
           <w:rPr>
@@ -2620,7 +2620,7 @@
           <w14:ligatures w14:val="standardContextual"/>
         </w:rPr>
       </w:pPr>
-      <w:hyperlink w:anchor="_Toc242001690" w:history="1">
+      <w:hyperlink w:anchor="_Toc242002792" w:history="1">
         <w:r>
           <w:rPr>
             <w:rStyle w:val="Siuktni"/>
@@ -2647,7 +2647,7 @@
             <w:noProof/>
             <w:webHidden/>
           </w:rPr>
-          <w:instrText xml:space="preserve"> PAGEREF _Toc242001690 \h </w:instrText>
+          <w:instrText xml:space="preserve"> PAGEREF _Toc242002792 \h </w:instrText>
         </w:r>
         <w:r>
           <w:rPr>
@@ -2695,7 +2695,7 @@
           <w14:ligatures w14:val="standardContextual"/>
         </w:rPr>
       </w:pPr>
-      <w:hyperlink w:anchor="_Toc242001691" w:history="1">
+      <w:hyperlink w:anchor="_Toc242002793" w:history="1">
         <w:r>
           <w:rPr>
             <w:rStyle w:val="Siuktni"/>
@@ -2722,7 +2722,7 @@
             <w:noProof/>
             <w:webHidden/>
           </w:rPr>
-          <w:instrText xml:space="preserve"> PAGEREF _Toc242001691 \h </w:instrText>
+          <w:instrText xml:space="preserve"> PAGEREF _Toc242002793 \h </w:instrText>
         </w:r>
         <w:r>
           <w:rPr>
@@ -2770,7 +2770,7 @@
           <w14:ligatures w14:val="standardContextual"/>
         </w:rPr>
       </w:pPr>
-      <w:hyperlink w:anchor="_Toc242001692" w:history="1">
+      <w:hyperlink w:anchor="_Toc242002794" w:history="1">
         <w:r>
           <w:rPr>
             <w:rStyle w:val="Siuktni"/>
@@ -2797,7 +2797,7 @@
             <w:noProof/>
             <w:webHidden/>
           </w:rPr>
-          <w:instrText xml:space="preserve"> PAGEREF _Toc242001692 \h </w:instrText>
+          <w:instrText xml:space="preserve"> PAGEREF _Toc242002794 \h </w:instrText>
         </w:r>
         <w:r>
           <w:rPr>
@@ -2845,7 +2845,7 @@
           <w14:ligatures w14:val="standardContextual"/>
         </w:rPr>
       </w:pPr>
-      <w:hyperlink w:anchor="_Toc242001693" w:history="1">
+      <w:hyperlink w:anchor="_Toc242002795" w:history="1">
         <w:r>
           <w:rPr>
             <w:rStyle w:val="Siuktni"/>
@@ -2872,7 +2872,7 @@
             <w:noProof/>
             <w:webHidden/>
           </w:rPr>
-          <w:instrText xml:space="preserve"> PAGEREF _Toc242001693 \h </w:instrText>
+          <w:instrText xml:space="preserve"> PAGEREF _Toc242002795 \h </w:instrText>
         </w:r>
         <w:r>
           <w:rPr>
@@ -2920,7 +2920,7 @@
           <w14:ligatures w14:val="standardContextual"/>
         </w:rPr>
       </w:pPr>
-      <w:hyperlink w:anchor="_Toc242001694" w:history="1">
+      <w:hyperlink w:anchor="_Toc242002796" w:history="1">
         <w:r>
           <w:rPr>
             <w:rStyle w:val="Siuktni"/>
@@ -2947,7 +2947,7 @@
             <w:noProof/>
             <w:webHidden/>
           </w:rPr>
-          <w:instrText xml:space="preserve"> PAGEREF _Toc242001694 \h </w:instrText>
+          <w:instrText xml:space="preserve"> PAGEREF _Toc242002796 \h </w:instrText>
         </w:r>
         <w:r>
           <w:rPr>
@@ -2995,7 +2995,7 @@
           <w14:ligatures w14:val="standardContextual"/>
         </w:rPr>
       </w:pPr>
-      <w:hyperlink w:anchor="_Toc242001695" w:history="1">
+      <w:hyperlink w:anchor="_Toc242002797" w:history="1">
         <w:r>
           <w:rPr>
             <w:rStyle w:val="Siuktni"/>
@@ -3022,7 +3022,7 @@
             <w:noProof/>
             <w:webHidden/>
           </w:rPr>
-          <w:instrText xml:space="preserve"> PAGEREF _Toc242001695 \h </w:instrText>
+          <w:instrText xml:space="preserve"> PAGEREF _Toc242002797 \h </w:instrText>
         </w:r>
         <w:r>
           <w:rPr>
@@ -3070,7 +3070,7 @@
           <w14:ligatures w14:val="standardContextual"/>
         </w:rPr>
       </w:pPr>
-      <w:hyperlink w:anchor="_Toc242001696" w:history="1">
+      <w:hyperlink w:anchor="_Toc242002798" w:history="1">
         <w:r>
           <w:rPr>
             <w:rStyle w:val="Siuktni"/>
@@ -3097,7 +3097,7 @@
             <w:noProof/>
             <w:webHidden/>
           </w:rPr>
-          <w:instrText xml:space="preserve"> PAGEREF _Toc242001696 \h </w:instrText>
+          <w:instrText xml:space="preserve"> PAGEREF _Toc242002798 \h </w:instrText>
         </w:r>
         <w:r>
           <w:rPr>
@@ -3145,7 +3145,7 @@
           <w14:ligatures w14:val="standardContextual"/>
         </w:rPr>
       </w:pPr>
-      <w:hyperlink w:anchor="_Toc242001697" w:history="1">
+      <w:hyperlink w:anchor="_Toc242002799" w:history="1">
         <w:r>
           <w:rPr>
             <w:rStyle w:val="Siuktni"/>
@@ -3172,7 +3172,7 @@
             <w:noProof/>
             <w:webHidden/>
           </w:rPr>
-          <w:instrText xml:space="preserve"> PAGEREF _Toc242001697 \h </w:instrText>
+          <w:instrText xml:space="preserve"> PAGEREF _Toc242002799 \h </w:instrText>
         </w:r>
         <w:r>
           <w:rPr>
@@ -3220,7 +3220,7 @@
           <w14:ligatures w14:val="standardContextual"/>
         </w:rPr>
       </w:pPr>
-      <w:hyperlink w:anchor="_Toc242001698" w:history="1">
+      <w:hyperlink w:anchor="_Toc242002800" w:history="1">
         <w:r>
           <w:rPr>
             <w:rStyle w:val="Siuktni"/>
@@ -3247,7 +3247,7 @@
             <w:noProof/>
             <w:webHidden/>
           </w:rPr>
-          <w:instrText xml:space="preserve"> PAGEREF _Toc242001698 \h </w:instrText>
+          <w:instrText xml:space="preserve"> PAGEREF _Toc242002800 \h </w:instrText>
         </w:r>
         <w:r>
           <w:rPr>
@@ -3295,7 +3295,7 @@
           <w14:ligatures w14:val="standardContextual"/>
         </w:rPr>
       </w:pPr>
-      <w:hyperlink w:anchor="_Toc242001699" w:history="1">
+      <w:hyperlink w:anchor="_Toc242002801" w:history="1">
         <w:r>
           <w:rPr>
             <w:rStyle w:val="Siuktni"/>
@@ -3322,7 +3322,7 @@
             <w:noProof/>
             <w:webHidden/>
           </w:rPr>
-          <w:instrText xml:space="preserve"> PAGEREF _Toc242001699 \h </w:instrText>
+          <w:instrText xml:space="preserve"> PAGEREF _Toc242002801 \h </w:instrText>
         </w:r>
         <w:r>
           <w:rPr>
@@ -3370,7 +3370,7 @@
           <w14:ligatures w14:val="standardContextual"/>
         </w:rPr>
       </w:pPr>
-      <w:hyperlink w:anchor="_Toc242001700" w:history="1">
+      <w:hyperlink w:anchor="_Toc242002802" w:history="1">
         <w:r>
           <w:rPr>
             <w:rStyle w:val="Siuktni"/>
@@ -3397,7 +3397,7 @@
             <w:noProof/>
             <w:webHidden/>
           </w:rPr>
-          <w:instrText xml:space="preserve"> PAGEREF _Toc242001700 \h </w:instrText>
+          <w:instrText xml:space="preserve"> PAGEREF _Toc242002802 \h </w:instrText>
         </w:r>
         <w:r>
           <w:rPr>
@@ -3445,7 +3445,7 @@
           <w14:ligatures w14:val="standardContextual"/>
         </w:rPr>
       </w:pPr>
-      <w:hyperlink w:anchor="_Toc242001701" w:history="1">
+      <w:hyperlink w:anchor="_Toc242002803" w:history="1">
         <w:r>
           <w:rPr>
             <w:rStyle w:val="Siuktni"/>
@@ -3472,7 +3472,7 @@
             <w:noProof/>
             <w:webHidden/>
           </w:rPr>
-          <w:instrText xml:space="preserve"> PAGEREF _Toc242001701 \h </w:instrText>
+          <w:instrText xml:space="preserve"> PAGEREF _Toc242002803 \h </w:instrText>
         </w:r>
         <w:r>
           <w:rPr>
@@ -3520,7 +3520,7 @@
           <w14:ligatures w14:val="standardContextual"/>
         </w:rPr>
       </w:pPr>
-      <w:hyperlink w:anchor="_Toc242001702" w:history="1">
+      <w:hyperlink w:anchor="_Toc242002804" w:history="1">
         <w:r>
           <w:rPr>
             <w:rStyle w:val="Siuktni"/>
@@ -3547,7 +3547,7 @@
             <w:noProof/>
             <w:webHidden/>
           </w:rPr>
-          <w:instrText xml:space="preserve"> PAGEREF _Toc242001702 \h </w:instrText>
+          <w:instrText xml:space="preserve"> PAGEREF _Toc242002804 \h </w:instrText>
         </w:r>
         <w:r>
           <w:rPr>
@@ -3595,7 +3595,7 @@
           <w14:ligatures w14:val="standardContextual"/>
         </w:rPr>
       </w:pPr>
-      <w:hyperlink w:anchor="_Toc242001703" w:history="1">
+      <w:hyperlink w:anchor="_Toc242002805" w:history="1">
         <w:r>
           <w:rPr>
             <w:rStyle w:val="Siuktni"/>
@@ -3622,7 +3622,7 @@
             <w:noProof/>
             <w:webHidden/>
           </w:rPr>
-          <w:instrText xml:space="preserve"> PAGEREF _Toc242001703 \h </w:instrText>
+          <w:instrText xml:space="preserve"> PAGEREF _Toc242002805 \h </w:instrText>
         </w:r>
         <w:r>
           <w:rPr>
@@ -3670,7 +3670,7 @@
           <w14:ligatures w14:val="standardContextual"/>
         </w:rPr>
       </w:pPr>
-      <w:hyperlink w:anchor="_Toc242001704" w:history="1">
+      <w:hyperlink w:anchor="_Toc242002806" w:history="1">
         <w:r>
           <w:rPr>
             <w:rStyle w:val="Siuktni"/>
@@ -3697,7 +3697,7 @@
             <w:noProof/>
             <w:webHidden/>
           </w:rPr>
-          <w:instrText xml:space="preserve"> PAGEREF _Toc242001704 \h </w:instrText>
+          <w:instrText xml:space="preserve"> PAGEREF _Toc242002806 \h </w:instrText>
         </w:r>
         <w:r>
           <w:rPr>
@@ -3745,7 +3745,7 @@
           <w14:ligatures w14:val="standardContextual"/>
         </w:rPr>
       </w:pPr>
-      <w:hyperlink w:anchor="_Toc242001705" w:history="1">
+      <w:hyperlink w:anchor="_Toc242002807" w:history="1">
         <w:r>
           <w:rPr>
             <w:rStyle w:val="Siuktni"/>
@@ -3772,7 +3772,7 @@
             <w:noProof/>
             <w:webHidden/>
           </w:rPr>
-          <w:instrText xml:space="preserve"> PAGEREF _Toc242001705 \h </w:instrText>
+          <w:instrText xml:space="preserve"> PAGEREF _Toc242002807 \h </w:instrText>
         </w:r>
         <w:r>
           <w:rPr>
@@ -3820,7 +3820,7 @@
           <w14:ligatures w14:val="standardContextual"/>
         </w:rPr>
       </w:pPr>
-      <w:hyperlink w:anchor="_Toc242001706" w:history="1">
+      <w:hyperlink w:anchor="_Toc242002808" w:history="1">
         <w:r>
           <w:rPr>
             <w:rStyle w:val="Siuktni"/>
@@ -3847,7 +3847,7 @@
             <w:noProof/>
             <w:webHidden/>
           </w:rPr>
-          <w:instrText xml:space="preserve"> PAGEREF _Toc242001706 \h </w:instrText>
+          <w:instrText xml:space="preserve"> PAGEREF _Toc242002808 \h </w:instrText>
         </w:r>
         <w:r>
           <w:rPr>
@@ -3895,7 +3895,7 @@
           <w14:ligatures w14:val="standardContextual"/>
         </w:rPr>
       </w:pPr>
-      <w:hyperlink w:anchor="_Toc242001707" w:history="1">
+      <w:hyperlink w:anchor="_Toc242002809" w:history="1">
         <w:r>
           <w:rPr>
             <w:rStyle w:val="Siuktni"/>
@@ -3922,7 +3922,7 @@
             <w:noProof/>
             <w:webHidden/>
           </w:rPr>
-          <w:instrText xml:space="preserve"> PAGEREF _Toc242001707 \h </w:instrText>
+          <w:instrText xml:space="preserve"> PAGEREF _Toc242002809 \h </w:instrText>
         </w:r>
         <w:r>
           <w:rPr>
@@ -3970,7 +3970,7 @@
           <w14:ligatures w14:val="standardContextual"/>
         </w:rPr>
       </w:pPr>
-      <w:hyperlink w:anchor="_Toc242001708" w:history="1">
+      <w:hyperlink w:anchor="_Toc242002810" w:history="1">
         <w:r>
           <w:rPr>
             <w:rStyle w:val="Siuktni"/>
@@ -3997,7 +3997,7 @@
             <w:noProof/>
             <w:webHidden/>
           </w:rPr>
-          <w:instrText xml:space="preserve"> PAGEREF _Toc242001708 \h </w:instrText>
+          <w:instrText xml:space="preserve"> PAGEREF _Toc242002810 \h </w:instrText>
         </w:r>
         <w:r>
           <w:rPr>
@@ -4045,7 +4045,7 @@
           <w14:ligatures w14:val="standardContextual"/>
         </w:rPr>
       </w:pPr>
-      <w:hyperlink w:anchor="_Toc242001709" w:history="1">
+      <w:hyperlink w:anchor="_Toc242002811" w:history="1">
         <w:r>
           <w:rPr>
             <w:rStyle w:val="Siuktni"/>
@@ -4072,7 +4072,7 @@
             <w:noProof/>
             <w:webHidden/>
           </w:rPr>
-          <w:instrText xml:space="preserve"> PAGEREF _Toc242001709 \h </w:instrText>
+          <w:instrText xml:space="preserve"> PAGEREF _Toc242002811 \h </w:instrText>
         </w:r>
         <w:r>
           <w:rPr>
@@ -4120,7 +4120,7 @@
           <w14:ligatures w14:val="standardContextual"/>
         </w:rPr>
       </w:pPr>
-      <w:hyperlink w:anchor="_Toc242001710" w:history="1">
+      <w:hyperlink w:anchor="_Toc242002812" w:history="1">
         <w:r>
           <w:rPr>
             <w:rStyle w:val="Siuktni"/>
@@ -4147,7 +4147,7 @@
             <w:noProof/>
             <w:webHidden/>
           </w:rPr>
-          <w:instrText xml:space="preserve"> PAGEREF _Toc242001710 \h </w:instrText>
+          <w:instrText xml:space="preserve"> PAGEREF _Toc242002812 \h </w:instrText>
         </w:r>
         <w:r>
           <w:rPr>
@@ -4195,7 +4195,7 @@
           <w14:ligatures w14:val="standardContextual"/>
         </w:rPr>
       </w:pPr>
-      <w:hyperlink w:anchor="_Toc242001711" w:history="1">
+      <w:hyperlink w:anchor="_Toc242002813" w:history="1">
         <w:r>
           <w:rPr>
             <w:rStyle w:val="Siuktni"/>
@@ -4222,7 +4222,7 @@
             <w:noProof/>
             <w:webHidden/>
           </w:rPr>
-          <w:instrText xml:space="preserve"> PAGEREF _Toc242001711 \h </w:instrText>
+          <w:instrText xml:space="preserve"> PAGEREF _Toc242002813 \h </w:instrText>
         </w:r>
         <w:r>
           <w:rPr>
@@ -4270,7 +4270,7 @@
           <w14:ligatures w14:val="standardContextual"/>
         </w:rPr>
       </w:pPr>
-      <w:hyperlink w:anchor="_Toc242001712" w:history="1">
+      <w:hyperlink w:anchor="_Toc242002814" w:history="1">
         <w:r>
           <w:rPr>
             <w:rStyle w:val="Siuktni"/>
@@ -4297,7 +4297,7 @@
             <w:noProof/>
             <w:webHidden/>
           </w:rPr>
-          <w:instrText xml:space="preserve"> PAGEREF _Toc242001712 \h </w:instrText>
+          <w:instrText xml:space="preserve"> PAGEREF _Toc242002814 \h </w:instrText>
         </w:r>
         <w:r>
           <w:rPr>
@@ -4345,7 +4345,7 @@
           <w14:ligatures w14:val="standardContextual"/>
         </w:rPr>
       </w:pPr>
-      <w:hyperlink w:anchor="_Toc242001713" w:history="1">
+      <w:hyperlink w:anchor="_Toc242002815" w:history="1">
         <w:r>
           <w:rPr>
             <w:rStyle w:val="Siuktni"/>
@@ -4372,7 +4372,7 @@
             <w:noProof/>
             <w:webHidden/>
           </w:rPr>
-          <w:instrText xml:space="preserve"> PAGEREF _Toc242001713 \h </w:instrText>
+          <w:instrText xml:space="preserve"> PAGEREF _Toc242002815 \h </w:instrText>
         </w:r>
         <w:r>
           <w:rPr>
@@ -4420,7 +4420,7 @@
           <w14:ligatures w14:val="standardContextual"/>
         </w:rPr>
       </w:pPr>
-      <w:hyperlink w:anchor="_Toc242001714" w:history="1">
+      <w:hyperlink w:anchor="_Toc242002816" w:history="1">
         <w:r>
           <w:rPr>
             <w:rStyle w:val="Siuktni"/>
@@ -4447,7 +4447,7 @@
             <w:noProof/>
             <w:webHidden/>
           </w:rPr>
-          <w:instrText xml:space="preserve"> PAGEREF _Toc242001714 \h </w:instrText>
+          <w:instrText xml:space="preserve"> PAGEREF _Toc242002816 \h </w:instrText>
         </w:r>
         <w:r>
           <w:rPr>
@@ -4495,7 +4495,7 @@
       <w:pPr>
         <w:pStyle w:val="u1"/>
       </w:pPr>
-      <w:bookmarkStart w:id="3" w:name="_Toc242001662"/>
+      <w:bookmarkStart w:id="3" w:name="_Toc242002764"/>
       <w:r>
         <w:lastRenderedPageBreak/>
         <w:t>DANH M</w:t>
@@ -5081,7 +5081,7 @@
       <w:pPr>
         <w:pStyle w:val="u1"/>
       </w:pPr>
-      <w:bookmarkStart w:id="4" w:name="_Toc242001663"/>
+      <w:bookmarkStart w:id="4" w:name="_Toc242002765"/>
       <w:r>
         <w:lastRenderedPageBreak/>
         <w:t>CHƯƠNG 1. GI</w:t>
@@ -5104,7 +5104,7 @@
       <w:pPr>
         <w:pStyle w:val="u2"/>
       </w:pPr>
-      <w:bookmarkStart w:id="5" w:name="_Toc242001664"/>
+      <w:bookmarkStart w:id="5" w:name="_Toc242002766"/>
       <w:r>
         <w:t>1.1. B</w:t>
       </w:r>
@@ -5148,7 +5148,7 @@
       <w:pPr>
         <w:pStyle w:val="u2"/>
       </w:pPr>
-      <w:bookmarkStart w:id="6" w:name="_Toc242001665"/>
+      <w:bookmarkStart w:id="6" w:name="_Toc242002767"/>
       <w:r>
         <w:t>1.2. M</w:t>
       </w:r>
@@ -5549,7 +5549,7 @@
       <w:pPr>
         <w:pStyle w:val="u2"/>
       </w:pPr>
-      <w:bookmarkStart w:id="7" w:name="_Toc242001666"/>
+      <w:bookmarkStart w:id="7" w:name="_Toc242002768"/>
       <w:r>
         <w:t>1.3. Đ</w:t>
       </w:r>
@@ -5632,7 +5632,7 @@
       <w:pPr>
         <w:pStyle w:val="u2"/>
       </w:pPr>
-      <w:bookmarkStart w:id="8" w:name="_Toc242001667"/>
+      <w:bookmarkStart w:id="8" w:name="_Toc242002769"/>
       <w:r>
         <w:t>1.4. Phương pháp và c</w:t>
       </w:r>
@@ -5659,7 +5659,7 @@
       <w:pPr>
         <w:pStyle w:val="u2"/>
       </w:pPr>
-      <w:bookmarkStart w:id="9" w:name="_Toc242001668"/>
+      <w:bookmarkStart w:id="9" w:name="_Toc242002770"/>
       <w:r>
         <w:t>1.5. M</w:t>
       </w:r>
@@ -6077,7 +6077,7 @@
       <w:pPr>
         <w:pStyle w:val="u1"/>
       </w:pPr>
-      <w:bookmarkStart w:id="10" w:name="_Toc242001669"/>
+      <w:bookmarkStart w:id="10" w:name="_Toc242002771"/>
       <w:r>
         <w:lastRenderedPageBreak/>
         <w:t>CHƯƠNG 2. CƠ S</w:t>
@@ -6106,7 +6106,7 @@
       <w:pPr>
         <w:pStyle w:val="u2"/>
       </w:pPr>
-      <w:bookmarkStart w:id="11" w:name="_Toc242001670"/>
+      <w:bookmarkStart w:id="11" w:name="_Toc242002772"/>
       <w:r>
         <w:t>2.1. Ch</w:t>
       </w:r>
@@ -6162,7 +6162,7 @@
       <w:pPr>
         <w:pStyle w:val="u2"/>
       </w:pPr>
-      <w:bookmarkStart w:id="12" w:name="_Toc242001671"/>
+      <w:bookmarkStart w:id="12" w:name="_Toc242002773"/>
       <w:r>
         <w:t>2.2. Các t</w:t>
       </w:r>
@@ -6745,7 +6745,7 @@
       <w:pPr>
         <w:pStyle w:val="u2"/>
       </w:pPr>
-      <w:bookmarkStart w:id="13" w:name="_Toc242001672"/>
+      <w:bookmarkStart w:id="13" w:name="_Toc242002774"/>
       <w:r>
         <w:lastRenderedPageBreak/>
         <w:t>2.3. K</w:t>
@@ -7287,7 +7287,7 @@
       <w:pPr>
         <w:pStyle w:val="u2"/>
       </w:pPr>
-      <w:bookmarkStart w:id="14" w:name="_Toc242001673"/>
+      <w:bookmarkStart w:id="14" w:name="_Toc242002775"/>
       <w:r>
         <w:t>2.4. Coverage và mutation testing</w:t>
       </w:r>
@@ -7307,7 +7307,7 @@
       <w:pPr>
         <w:pStyle w:val="u2"/>
       </w:pPr>
-      <w:bookmarkStart w:id="15" w:name="_Toc242001674"/>
+      <w:bookmarkStart w:id="15" w:name="_Toc242002776"/>
       <w:r>
         <w:lastRenderedPageBreak/>
         <w:t>2.5. Security, performance và accessibility</w:t>
@@ -7328,7 +7328,7 @@
       <w:pPr>
         <w:pStyle w:val="u1"/>
       </w:pPr>
-      <w:bookmarkStart w:id="16" w:name="_Toc242001675"/>
+      <w:bookmarkStart w:id="16" w:name="_Toc242002777"/>
       <w:r>
         <w:lastRenderedPageBreak/>
         <w:t>CHƯƠNG 3. PHÂN TÍCH VÀ THI</w:t>
@@ -7351,7 +7351,7 @@
       <w:pPr>
         <w:pStyle w:val="u2"/>
       </w:pPr>
-      <w:bookmarkStart w:id="17" w:name="_Toc242001676"/>
+      <w:bookmarkStart w:id="17" w:name="_Toc242002778"/>
       <w:r>
         <w:t>3.1. Actor và use case</w:t>
       </w:r>
@@ -7371,7 +7371,7 @@
           <w:noProof/>
         </w:rPr>
         <w:drawing>
-          <wp:inline distT="0" distB="0" distL="0" distR="0" wp14:anchorId="4E01EE83" wp14:editId="3B27E418">
+          <wp:inline distT="0" distB="0" distL="0" distR="0" wp14:anchorId="1E9A9CA7" wp14:editId="2C787847">
             <wp:extent cx="5943600" cy="4730926"/>
             <wp:effectExtent l="0" t="0" r="0" b="0"/>
             <wp:docPr id="1" name="Picture 1"/>
@@ -7987,7 +7987,7 @@
       <w:pPr>
         <w:pStyle w:val="u2"/>
       </w:pPr>
-      <w:bookmarkStart w:id="18" w:name="_Toc242001677"/>
+      <w:bookmarkStart w:id="18" w:name="_Toc242002779"/>
       <w:r>
         <w:t>3.2. Yêu c</w:t>
       </w:r>
@@ -8488,7 +8488,7 @@
       <w:pPr>
         <w:pStyle w:val="u2"/>
       </w:pPr>
-      <w:bookmarkStart w:id="19" w:name="_Toc242001678"/>
+      <w:bookmarkStart w:id="19" w:name="_Toc242002780"/>
       <w:r>
         <w:t>3.3. Quy t</w:t>
       </w:r>
@@ -8995,7 +8995,7 @@
       <w:pPr>
         <w:pStyle w:val="u2"/>
       </w:pPr>
-      <w:bookmarkStart w:id="20" w:name="_Toc242001679"/>
+      <w:bookmarkStart w:id="20" w:name="_Toc242002781"/>
       <w:r>
         <w:t>3.4. Ki</w:t>
       </w:r>
@@ -9039,8 +9039,8 @@
           <w:noProof/>
         </w:rPr>
         <w:drawing>
-          <wp:inline distT="0" distB="0" distL="0" distR="0" wp14:anchorId="046631A8" wp14:editId="5F8BB1B4">
-            <wp:extent cx="5943600" cy="1403350"/>
+          <wp:inline distT="0" distB="0" distL="0" distR="0" wp14:anchorId="24AB0BD2" wp14:editId="50F12A77">
+            <wp:extent cx="5943600" cy="2600325"/>
             <wp:effectExtent l="0" t="0" r="0" b="0"/>
             <wp:docPr id="2" name="Picture 2"/>
             <wp:cNvGraphicFramePr>
@@ -9062,7 +9062,7 @@
                   <pic:spPr>
                     <a:xfrm>
                       <a:off x="0" y="0"/>
-                      <a:ext cx="5943600" cy="1403350"/>
+                      <a:ext cx="5943600" cy="2600325"/>
                     </a:xfrm>
                     <a:prstGeom prst="rect">
                       <a:avLst/>
@@ -9092,6 +9092,7 @@
     </w:p>
     <w:p>
       <w:r>
+        <w:lastRenderedPageBreak/>
         <w:t>Luồng booking bắt đầu bằng request đã xác thực. Backend kiểm tra ngày, slot, room ACTIVE, closure, capacity và thiết bị. Sau đó mutation được thực hiện trong transaction. Unique constraint bảo vệ room-date-slot và user-date-slot; lỗi cạnh tranh được ánh xạ thành HTTP 409. Trong phạm vi SQLite single-instance, write queue làm giảm lock contention nhưng không thay thế invariant database.</w:t>
       </w:r>
     </w:p>
@@ -9099,9 +9100,8 @@
       <w:pPr>
         <w:pStyle w:val="u2"/>
       </w:pPr>
-      <w:bookmarkStart w:id="21" w:name="_Toc242001680"/>
-      <w:r>
-        <w:lastRenderedPageBreak/>
+      <w:bookmarkStart w:id="21" w:name="_Toc242002782"/>
+      <w:r>
         <w:t>3.5. Mô hình d</w:t>
       </w:r>
       <w:r>
@@ -9132,7 +9132,7 @@
           <w:noProof/>
         </w:rPr>
         <w:drawing>
-          <wp:inline distT="0" distB="0" distL="0" distR="0" wp14:anchorId="0D2D1EA9" wp14:editId="16FDEBD3">
+          <wp:inline distT="0" distB="0" distL="0" distR="0" wp14:anchorId="4EF6F364" wp14:editId="72E42D33">
             <wp:extent cx="5943600" cy="3516630"/>
             <wp:effectExtent l="0" t="0" r="0" b="0"/>
             <wp:docPr id="3" name="Picture 3"/>
@@ -9185,14 +9185,18 @@
     </w:p>
     <w:p>
       <w:r>
-        <w:t>AuditLog lưu actor, action, entity và metadata. Mutation hồ sơ, vai trò, phòng, thiết bị, closure và booking quan trọng phải ghi audit trong cùng Prisma transaction. Test rollback cố tình làm bước audit thất bại và xác nhận dữ liệu nghiệp vụ không commit. Đây là bằng chứng về atomicity cho các mutation đã được test; không suy rộng cho mọi thao tác chưa có ca tương ứng.</w:t>
+        <w:t xml:space="preserve">AuditLog lưu actor, action, entity và metadata. Mutation hồ sơ, vai trò, phòng, thiết bị, closure và booking quan trọng phải ghi audit trong cùng Prisma transaction. Test rollback cố tình làm bước audit thất bại và xác nhận dữ liệu nghiệp vụ không commit. Đây là bằng </w:t>
+      </w:r>
+      <w:r>
+        <w:lastRenderedPageBreak/>
+        <w:t>chứng về atomicity cho các mutation đã được test; không suy rộng cho mọi thao tác chưa có ca tương ứng.</w:t>
       </w:r>
     </w:p>
     <w:p>
       <w:pPr>
         <w:pStyle w:val="u2"/>
       </w:pPr>
-      <w:bookmarkStart w:id="22" w:name="_Toc242001681"/>
+      <w:bookmarkStart w:id="22" w:name="_Toc242002783"/>
       <w:r>
         <w:t>3.6. Công th</w:t>
       </w:r>
@@ -9218,11 +9222,7 @@
     </w:p>
     <w:p>
       <w:r>
-        <w:t xml:space="preserve">Báo cáo tách mức độ được đặt và mức độ sử dụng thực tế. reservationRate = (BOOKED + CHECKED_IN + NO_SHOW) / tổng slot khả dụng. utilizationRate = </w:t>
-      </w:r>
-      <w:r>
-        <w:lastRenderedPageBreak/>
-        <w:t>CHECKED_IN / tổng slot khả dụng. CANCELLED không nằm trong tử số. Trường occupancyRate được giữ tạm làm alias của reservationRate để tương thích, nhưng được đánh dấu deprecated trong tài liệu và không dùng làm nhãn UI.</w:t>
+        <w:t>Báo cáo tách mức độ được đặt và mức độ sử dụng thực tế. reservationRate = (BOOKED + CHECKED_IN + NO_SHOW) / tổng slot khả dụng. utilizationRate = CHECKED_IN / tổng slot khả dụng. CANCELLED không nằm trong tử số. Trường occupancyRate được giữ tạm làm alias của reservationRate để tương thích, nhưng được đánh dấu deprecated trong tài liệu và không dùng làm nhãn UI.</w:t>
       </w:r>
     </w:p>
     <w:p>
@@ -9234,7 +9234,7 @@
       <w:pPr>
         <w:pStyle w:val="u1"/>
       </w:pPr>
-      <w:bookmarkStart w:id="23" w:name="_Toc242001682"/>
+      <w:bookmarkStart w:id="23" w:name="_Toc242002784"/>
       <w:r>
         <w:lastRenderedPageBreak/>
         <w:t>CHƯƠNG 4. PHƯƠNG PHÁP VÀ K</w:t>
@@ -9266,7 +9266,7 @@
       <w:pPr>
         <w:pStyle w:val="u2"/>
       </w:pPr>
-      <w:bookmarkStart w:id="24" w:name="_Toc242001683"/>
+      <w:bookmarkStart w:id="24" w:name="_Toc242002785"/>
       <w:r>
         <w:t>4.1. Chi</w:t>
       </w:r>
@@ -9946,7 +9946,7 @@
       <w:pPr>
         <w:pStyle w:val="u2"/>
       </w:pPr>
-      <w:bookmarkStart w:id="25" w:name="_Toc242001684"/>
+      <w:bookmarkStart w:id="25" w:name="_Toc242002786"/>
       <w:r>
         <w:t>4.2. Thi</w:t>
       </w:r>
@@ -10538,7 +10538,7 @@
       <w:pPr>
         <w:pStyle w:val="u3"/>
       </w:pPr>
-      <w:bookmarkStart w:id="26" w:name="_Toc242001685"/>
+      <w:bookmarkStart w:id="26" w:name="_Toc242002787"/>
       <w:r>
         <w:t>4.2.1. Ví d</w:t>
       </w:r>
@@ -11215,7 +11215,7 @@
       <w:pPr>
         <w:pStyle w:val="u2"/>
       </w:pPr>
-      <w:bookmarkStart w:id="27" w:name="_Toc242001686"/>
+      <w:bookmarkStart w:id="27" w:name="_Toc242002788"/>
       <w:r>
         <w:lastRenderedPageBreak/>
         <w:t>4.3. Môi trư</w:t>
@@ -11612,7 +11612,7 @@
       <w:pPr>
         <w:pStyle w:val="u2"/>
       </w:pPr>
-      <w:bookmarkStart w:id="28" w:name="_Toc242001687"/>
+      <w:bookmarkStart w:id="28" w:name="_Toc242002789"/>
       <w:r>
         <w:t>4.4. Entry, exit và workflow</w:t>
       </w:r>
@@ -11989,7 +11989,7 @@
       <w:pPr>
         <w:pStyle w:val="u2"/>
       </w:pPr>
-      <w:bookmarkStart w:id="29" w:name="_Toc242001688"/>
+      <w:bookmarkStart w:id="29" w:name="_Toc242002790"/>
       <w:r>
         <w:t>4.5. Truy v</w:t>
       </w:r>
@@ -12027,7 +12027,7 @@
       <w:pPr>
         <w:pStyle w:val="u2"/>
       </w:pPr>
-      <w:bookmarkStart w:id="30" w:name="_Toc242001689"/>
+      <w:bookmarkStart w:id="30" w:name="_Toc242002791"/>
       <w:r>
         <w:t>4.6. Tiêu chí đánh giá tính đ</w:t>
       </w:r>
@@ -12074,7 +12074,7 @@
       <w:pPr>
         <w:pStyle w:val="u1"/>
       </w:pPr>
-      <w:bookmarkStart w:id="31" w:name="_Toc242001690"/>
+      <w:bookmarkStart w:id="31" w:name="_Toc242002792"/>
       <w:r>
         <w:lastRenderedPageBreak/>
         <w:t>CHƯƠNG 5. TH</w:t>
@@ -12115,7 +12115,7 @@
       <w:pPr>
         <w:pStyle w:val="u2"/>
       </w:pPr>
-      <w:bookmarkStart w:id="32" w:name="_Toc242001691"/>
+      <w:bookmarkStart w:id="32" w:name="_Toc242002793"/>
       <w:r>
         <w:t>5.1. T</w:t>
       </w:r>
@@ -13031,7 +13031,7 @@
       <w:pPr>
         <w:pStyle w:val="u2"/>
       </w:pPr>
-      <w:bookmarkStart w:id="33" w:name="_Toc242001692"/>
+      <w:bookmarkStart w:id="33" w:name="_Toc242002794"/>
       <w:r>
         <w:t>5.2. Unit, BVA và property-based testing</w:t>
       </w:r>
@@ -13057,7 +13057,7 @@
       <w:pPr>
         <w:pStyle w:val="u2"/>
       </w:pPr>
-      <w:bookmarkStart w:id="34" w:name="_Toc242001693"/>
+      <w:bookmarkStart w:id="34" w:name="_Toc242002795"/>
       <w:r>
         <w:t>5.3. API, database và transaction</w:t>
       </w:r>
@@ -13077,7 +13077,7 @@
       <w:pPr>
         <w:pStyle w:val="u2"/>
       </w:pPr>
-      <w:bookmarkStart w:id="35" w:name="_Toc242001694"/>
+      <w:bookmarkStart w:id="35" w:name="_Toc242002796"/>
       <w:r>
         <w:t>5.4. E2E, responsive và accessibility</w:t>
       </w:r>
@@ -13103,7 +13103,7 @@
         </w:rPr>
         <w:lastRenderedPageBreak/>
         <w:drawing>
-          <wp:inline distT="0" distB="0" distL="0" distR="0" wp14:anchorId="264CBA7F" wp14:editId="689B607E">
+          <wp:inline distT="0" distB="0" distL="0" distR="0" wp14:anchorId="36A6F09E" wp14:editId="3D69B73D">
             <wp:extent cx="5029200" cy="4306252"/>
             <wp:effectExtent l="0" t="0" r="0" b="0"/>
             <wp:docPr id="4" name="Picture 4"/>
@@ -13164,7 +13164,7 @@
         </w:rPr>
         <w:lastRenderedPageBreak/>
         <w:drawing>
-          <wp:inline distT="0" distB="0" distL="0" distR="0" wp14:anchorId="2BD1B11E" wp14:editId="2684A298">
+          <wp:inline distT="0" distB="0" distL="0" distR="0" wp14:anchorId="1BA770D6" wp14:editId="01A074C6">
             <wp:extent cx="5029200" cy="5930265"/>
             <wp:effectExtent l="0" t="0" r="0" b="0"/>
             <wp:docPr id="5" name="Picture 5"/>
@@ -13219,7 +13219,7 @@
       <w:pPr>
         <w:pStyle w:val="u2"/>
       </w:pPr>
-      <w:bookmarkStart w:id="36" w:name="_Toc242001695"/>
+      <w:bookmarkStart w:id="36" w:name="_Toc242002797"/>
       <w:r>
         <w:t>5.5. Coverage và mutation</w:t>
       </w:r>
@@ -13245,7 +13245,7 @@
         </w:rPr>
         <w:lastRenderedPageBreak/>
         <w:drawing>
-          <wp:inline distT="0" distB="0" distL="0" distR="0" wp14:anchorId="495E5AC3" wp14:editId="43CCD7DC">
+          <wp:inline distT="0" distB="0" distL="0" distR="0" wp14:anchorId="03AC77CC" wp14:editId="0A7C7281">
             <wp:extent cx="5669280" cy="1653540"/>
             <wp:effectExtent l="0" t="0" r="0" b="0"/>
             <wp:docPr id="6" name="Picture 6"/>
@@ -13315,7 +13315,7 @@
           <w:noProof/>
         </w:rPr>
         <w:drawing>
-          <wp:inline distT="0" distB="0" distL="0" distR="0" wp14:anchorId="2481F7C7" wp14:editId="290B5381">
+          <wp:inline distT="0" distB="0" distL="0" distR="0" wp14:anchorId="63416FF9" wp14:editId="60718B5D">
             <wp:extent cx="5669280" cy="2440940"/>
             <wp:effectExtent l="0" t="0" r="0" b="0"/>
             <wp:docPr id="7" name="Picture 7"/>
@@ -13744,7 +13744,7 @@
       <w:pPr>
         <w:pStyle w:val="u2"/>
       </w:pPr>
-      <w:bookmarkStart w:id="37" w:name="_Toc242001696"/>
+      <w:bookmarkStart w:id="37" w:name="_Toc242002798"/>
       <w:r>
         <w:t>5.6. Hi</w:t>
       </w:r>
@@ -13775,7 +13775,7 @@
       <w:pPr>
         <w:pStyle w:val="u2"/>
       </w:pPr>
-      <w:bookmarkStart w:id="38" w:name="_Toc242001697"/>
+      <w:bookmarkStart w:id="38" w:name="_Toc242002799"/>
       <w:r>
         <w:t>5.7. Security testing</w:t>
       </w:r>
@@ -14230,7 +14230,7 @@
       <w:pPr>
         <w:pStyle w:val="u2"/>
       </w:pPr>
-      <w:bookmarkStart w:id="39" w:name="_Toc242001698"/>
+      <w:bookmarkStart w:id="39" w:name="_Toc242002800"/>
       <w:r>
         <w:t>5.8. Lighthouse, axe và tr</w:t>
       </w:r>
@@ -14262,7 +14262,7 @@
       <w:pPr>
         <w:pStyle w:val="u2"/>
       </w:pPr>
-      <w:bookmarkStart w:id="40" w:name="_Toc242001699"/>
+      <w:bookmarkStart w:id="40" w:name="_Toc242002801"/>
       <w:r>
         <w:t>5.9. Tính tái l</w:t>
       </w:r>
@@ -14307,7 +14307,7 @@
       <w:pPr>
         <w:pStyle w:val="u1"/>
       </w:pPr>
-      <w:bookmarkStart w:id="41" w:name="_Toc242001700"/>
+      <w:bookmarkStart w:id="41" w:name="_Toc242002802"/>
       <w:r>
         <w:lastRenderedPageBreak/>
         <w:t>CHƯƠNG 6. DEFECT, RETEST VÀ ĐÁNH GIÁ CH</w:t>
@@ -14330,7 +14330,7 @@
       <w:pPr>
         <w:pStyle w:val="u2"/>
       </w:pPr>
-      <w:bookmarkStart w:id="42" w:name="_Toc242001701"/>
+      <w:bookmarkStart w:id="42" w:name="_Toc242002803"/>
       <w:r>
         <w:t>6.1. Defect lifecycle</w:t>
       </w:r>
@@ -15068,7 +15068,7 @@
       <w:pPr>
         <w:pStyle w:val="u2"/>
       </w:pPr>
-      <w:bookmarkStart w:id="43" w:name="_Toc242001702"/>
+      <w:bookmarkStart w:id="43" w:name="_Toc242002804"/>
       <w:r>
         <w:t>6.2. Phân tích ba defect có tác đ</w:t>
       </w:r>
@@ -15106,7 +15106,7 @@
       <w:pPr>
         <w:pStyle w:val="u2"/>
       </w:pPr>
-      <w:bookmarkStart w:id="44" w:name="_Toc242001703"/>
+      <w:bookmarkStart w:id="44" w:name="_Toc242002805"/>
       <w:r>
         <w:t>6.3. Tr</w:t>
       </w:r>
@@ -15154,7 +15154,7 @@
       <w:pPr>
         <w:pStyle w:val="u2"/>
       </w:pPr>
-      <w:bookmarkStart w:id="45" w:name="_Toc242001704"/>
+      <w:bookmarkStart w:id="45" w:name="_Toc242002806"/>
       <w:r>
         <w:lastRenderedPageBreak/>
         <w:t>6.4. Đánh giá theo ISO/IEC 25010:2023</w:t>
@@ -15859,7 +15859,7 @@
       <w:pPr>
         <w:pStyle w:val="u2"/>
       </w:pPr>
-      <w:bookmarkStart w:id="46" w:name="_Toc242001705"/>
+      <w:bookmarkStart w:id="46" w:name="_Toc242002807"/>
       <w:r>
         <w:t>6.5. Gi</w:t>
       </w:r>
@@ -16347,7 +16347,7 @@
       <w:pPr>
         <w:pStyle w:val="u1"/>
       </w:pPr>
-      <w:bookmarkStart w:id="47" w:name="_Toc242001706"/>
+      <w:bookmarkStart w:id="47" w:name="_Toc242002808"/>
       <w:r>
         <w:lastRenderedPageBreak/>
         <w:t>CHƯƠNG 7. K</w:t>
@@ -16379,7 +16379,7 @@
       <w:pPr>
         <w:pStyle w:val="u2"/>
       </w:pPr>
-      <w:bookmarkStart w:id="48" w:name="_Toc242001707"/>
+      <w:bookmarkStart w:id="48" w:name="_Toc242002809"/>
       <w:r>
         <w:t>7.1. K</w:t>
       </w:r>
@@ -16423,7 +16423,7 @@
       <w:pPr>
         <w:pStyle w:val="u2"/>
       </w:pPr>
-      <w:bookmarkStart w:id="49" w:name="_Toc242001708"/>
+      <w:bookmarkStart w:id="49" w:name="_Toc242002810"/>
       <w:r>
         <w:t>7.2. H</w:t>
       </w:r>
@@ -16447,7 +16447,7 @@
       <w:pPr>
         <w:pStyle w:val="u2"/>
       </w:pPr>
-      <w:bookmarkStart w:id="50" w:name="_Toc242001709"/>
+      <w:bookmarkStart w:id="50" w:name="_Toc242002811"/>
       <w:r>
         <w:t>7.3. Hư</w:t>
       </w:r>
@@ -16485,7 +16485,7 @@
       <w:pPr>
         <w:pStyle w:val="u1"/>
       </w:pPr>
-      <w:bookmarkStart w:id="51" w:name="_Toc242001710"/>
+      <w:bookmarkStart w:id="51" w:name="_Toc242002812"/>
       <w:r>
         <w:lastRenderedPageBreak/>
         <w:t>TÀI LI</w:t>
@@ -16596,7 +16596,7 @@
       <w:pPr>
         <w:pStyle w:val="u1"/>
       </w:pPr>
-      <w:bookmarkStart w:id="52" w:name="_Toc242001711"/>
+      <w:bookmarkStart w:id="52" w:name="_Toc242002813"/>
       <w:r>
         <w:lastRenderedPageBreak/>
         <w:t>PH</w:t>
@@ -17624,7 +17624,7 @@
       <w:pPr>
         <w:pStyle w:val="u1"/>
       </w:pPr>
-      <w:bookmarkStart w:id="53" w:name="_Toc242001712"/>
+      <w:bookmarkStart w:id="53" w:name="_Toc242002814"/>
       <w:r>
         <w:lastRenderedPageBreak/>
         <w:t>PH</w:t>
@@ -18297,7 +18297,7 @@
       <w:pPr>
         <w:pStyle w:val="u1"/>
       </w:pPr>
-      <w:bookmarkStart w:id="54" w:name="_Toc242001713"/>
+      <w:bookmarkStart w:id="54" w:name="_Toc242002815"/>
       <w:r>
         <w:lastRenderedPageBreak/>
         <w:t>PH</w:t>
@@ -19027,7 +19027,7 @@
       <w:pPr>
         <w:pStyle w:val="u2"/>
       </w:pPr>
-      <w:bookmarkStart w:id="55" w:name="_Toc242001714"/>
+      <w:bookmarkStart w:id="55" w:name="_Toc242002816"/>
       <w:r>
         <w:t>PH</w:t>
       </w:r>
@@ -19335,31 +19335,31 @@
       </w:rPr>
     </w:lvl>
   </w:abstractNum>
-  <w:num w:numId="1" w16cid:durableId="1165433568">
+  <w:num w:numId="1" w16cid:durableId="321085026">
     <w:abstractNumId w:val="8"/>
   </w:num>
-  <w:num w:numId="2" w16cid:durableId="99956961">
+  <w:num w:numId="2" w16cid:durableId="1239754258">
     <w:abstractNumId w:val="6"/>
   </w:num>
-  <w:num w:numId="3" w16cid:durableId="723334420">
+  <w:num w:numId="3" w16cid:durableId="286356868">
     <w:abstractNumId w:val="5"/>
   </w:num>
-  <w:num w:numId="4" w16cid:durableId="657226608">
+  <w:num w:numId="4" w16cid:durableId="2138638829">
     <w:abstractNumId w:val="4"/>
   </w:num>
-  <w:num w:numId="5" w16cid:durableId="2017221280">
+  <w:num w:numId="5" w16cid:durableId="1251154959">
     <w:abstractNumId w:val="7"/>
   </w:num>
-  <w:num w:numId="6" w16cid:durableId="424348132">
+  <w:num w:numId="6" w16cid:durableId="820847281">
     <w:abstractNumId w:val="3"/>
   </w:num>
-  <w:num w:numId="7" w16cid:durableId="380859411">
+  <w:num w:numId="7" w16cid:durableId="49961945">
     <w:abstractNumId w:val="2"/>
   </w:num>
-  <w:num w:numId="8" w16cid:durableId="35350881">
+  <w:num w:numId="8" w16cid:durableId="2117403360">
     <w:abstractNumId w:val="1"/>
   </w:num>
-  <w:num w:numId="9" w16cid:durableId="897672329">
+  <w:num w:numId="9" w16cid:durableId="979530959">
     <w:abstractNumId w:val="0"/>
   </w:num>
 </w:numbering>
@@ -30754,7 +30754,7 @@
     <w:autoRedefine/>
     <w:uiPriority w:val="39"/>
     <w:unhideWhenUsed/>
-    <w:rsid w:val="00061F16"/>
+    <w:rsid w:val="00800DEC"/>
     <w:pPr>
       <w:spacing w:after="100"/>
     </w:pPr>
@@ -30766,7 +30766,7 @@
     <w:autoRedefine/>
     <w:uiPriority w:val="39"/>
     <w:unhideWhenUsed/>
-    <w:rsid w:val="00061F16"/>
+    <w:rsid w:val="00800DEC"/>
     <w:pPr>
       <w:spacing w:after="100"/>
       <w:ind w:left="260"/>
@@ -30779,7 +30779,7 @@
     <w:autoRedefine/>
     <w:uiPriority w:val="39"/>
     <w:unhideWhenUsed/>
-    <w:rsid w:val="00061F16"/>
+    <w:rsid w:val="00800DEC"/>
     <w:pPr>
       <w:spacing w:after="100"/>
       <w:ind w:left="520"/>
@@ -30790,7 +30790,7 @@
     <w:basedOn w:val="Phngmcinhcuaoanvn"/>
     <w:uiPriority w:val="99"/>
     <w:unhideWhenUsed/>
-    <w:rsid w:val="00061F16"/>
+    <w:rsid w:val="00800DEC"/>
     <w:rPr>
       <w:color w:val="0000FF" w:themeColor="hyperlink"/>
       <w:u w:val="single"/>

</xml_diff>

<commit_message>
docs: synchronize final quality evidence
</commit_message>
<xml_diff>
--- a/output/docx/StudySpace-BaoCao-DanhGia-KiemDinh.docx
+++ b/output/docx/StudySpace-BaoCao-DanhGia-KiemDinh.docx
@@ -166,7 +166,7 @@
       <w:pPr>
         <w:pStyle w:val="u1"/>
       </w:pPr>
-      <w:bookmarkStart w:id="0" w:name="_Toc242002761"/>
+      <w:bookmarkStart w:id="0" w:name="_Toc242004406"/>
       <w:r>
         <w:lastRenderedPageBreak/>
         <w:t>L</w:t>
@@ -199,7 +199,7 @@
       <w:pPr>
         <w:pStyle w:val="u1"/>
       </w:pPr>
-      <w:bookmarkStart w:id="1" w:name="_Toc242002762"/>
+      <w:bookmarkStart w:id="1" w:name="_Toc242004407"/>
       <w:r>
         <w:lastRenderedPageBreak/>
         <w:t>TÓM T</w:t>
@@ -224,10 +224,10 @@
     </w:p>
     <w:p>
       <w:r>
-        <w:t xml:space="preserve">Trên commit kiểm thử 14cd9a3, 47/47 ca Vitest và 24/24 ca Playwright đạt. Coverage đạt 98,35% line, 94,02% branch và 100% function; mutation score theo công thức killed/(killed+survived) đạt 81,13%. Kịch bản booking đồng thời tạo đúng một phản hồi 201 và mười chín phản hồi 409. Lighthouse đạt 100/100/96; ZAP không ghi nhận High, nhưng frontend còn chín cảnh báo Low và phạm vi quét chỉ là baseline chưa xác thực. Kết quả cho thấy các quality gate định nghĩa trước đã đạt trong môi trường đã ghi, đồng thời vẫn </w:t>
-      </w:r>
-      <w:r>
-        <w:t>còn giới hạn về trình duyệt, tải sản xuất, pentest xác thực và nghiên cứu usability với người dùng thật.</w:t>
+        <w:t>Trên commit kiểm thử 73f1ed4, 47/47 ca Vitest và 24/24 ca Playwright đạt. Coverage đạt 98,35% line, 94,02% branch và 100% function; mutation score theo công thức killed/(killed+survived) đạt 81,13%. Kịch bản booking đồng thời tạo đúng một phản hồi 201 và mười chín phản hồi 409. Lighthouse đạt 99/100/96; ZAP không ghi nhận High, nhưng frontend còn chín cảnh báo Low và phạm vi quét chỉ là baseline chưa xác thực. Kết quả cho thấy các quality gate định nghĩa trước đã đạt trong môi trường đã ghi, đồng thời vẫn c</w:t>
+      </w:r>
+      <w:r>
+        <w:t>òn giới hạn về trình duyệt, tải sản xuất, pentest xác thực và nghiên cứu usability với người dùng thật.</w:t>
       </w:r>
     </w:p>
     <w:p>
@@ -250,7 +250,7 @@
       <w:pPr>
         <w:pStyle w:val="u1"/>
       </w:pPr>
-      <w:bookmarkStart w:id="2" w:name="_Toc242002763"/>
+      <w:bookmarkStart w:id="2" w:name="_Toc242004408"/>
       <w:r>
         <w:lastRenderedPageBreak/>
         <w:t>M</w:t>
@@ -295,7 +295,7 @@
       <w:r>
         <w:fldChar w:fldCharType="separate"/>
       </w:r>
-      <w:hyperlink w:anchor="_Toc242002761" w:history="1">
+      <w:hyperlink w:anchor="_Toc242004406" w:history="1">
         <w:r>
           <w:rPr>
             <w:rStyle w:val="Siuktni"/>
@@ -322,7 +322,7 @@
             <w:noProof/>
             <w:webHidden/>
           </w:rPr>
-          <w:instrText xml:space="preserve"> PAGEREF _Toc242002761 \h </w:instrText>
+          <w:instrText xml:space="preserve"> PAGEREF _Toc242004406 \h </w:instrText>
         </w:r>
         <w:r>
           <w:rPr>
@@ -370,7 +370,7 @@
           <w14:ligatures w14:val="standardContextual"/>
         </w:rPr>
       </w:pPr>
-      <w:hyperlink w:anchor="_Toc242002762" w:history="1">
+      <w:hyperlink w:anchor="_Toc242004407" w:history="1">
         <w:r>
           <w:rPr>
             <w:rStyle w:val="Siuktni"/>
@@ -397,7 +397,7 @@
             <w:noProof/>
             <w:webHidden/>
           </w:rPr>
-          <w:instrText xml:space="preserve"> PAGEREF _Toc242002762 \h </w:instrText>
+          <w:instrText xml:space="preserve"> PAGEREF _Toc242004407 \h </w:instrText>
         </w:r>
         <w:r>
           <w:rPr>
@@ -445,7 +445,7 @@
           <w14:ligatures w14:val="standardContextual"/>
         </w:rPr>
       </w:pPr>
-      <w:hyperlink w:anchor="_Toc242002763" w:history="1">
+      <w:hyperlink w:anchor="_Toc242004408" w:history="1">
         <w:r>
           <w:rPr>
             <w:rStyle w:val="Siuktni"/>
@@ -472,7 +472,7 @@
             <w:noProof/>
             <w:webHidden/>
           </w:rPr>
-          <w:instrText xml:space="preserve"> PAGEREF _Toc242002763 \h </w:instrText>
+          <w:instrText xml:space="preserve"> PAGEREF _Toc242004408 \h </w:instrText>
         </w:r>
         <w:r>
           <w:rPr>
@@ -520,7 +520,7 @@
           <w14:ligatures w14:val="standardContextual"/>
         </w:rPr>
       </w:pPr>
-      <w:hyperlink w:anchor="_Toc242002764" w:history="1">
+      <w:hyperlink w:anchor="_Toc242004409" w:history="1">
         <w:r>
           <w:rPr>
             <w:rStyle w:val="Siuktni"/>
@@ -547,7 +547,7 @@
             <w:noProof/>
             <w:webHidden/>
           </w:rPr>
-          <w:instrText xml:space="preserve"> PAGEREF _Toc242002764 \h </w:instrText>
+          <w:instrText xml:space="preserve"> PAGEREF _Toc242004409 \h </w:instrText>
         </w:r>
         <w:r>
           <w:rPr>
@@ -595,7 +595,7 @@
           <w14:ligatures w14:val="standardContextual"/>
         </w:rPr>
       </w:pPr>
-      <w:hyperlink w:anchor="_Toc242002765" w:history="1">
+      <w:hyperlink w:anchor="_Toc242004410" w:history="1">
         <w:r>
           <w:rPr>
             <w:rStyle w:val="Siuktni"/>
@@ -622,7 +622,7 @@
             <w:noProof/>
             <w:webHidden/>
           </w:rPr>
-          <w:instrText xml:space="preserve"> PAGEREF _Toc242002765 \h </w:instrText>
+          <w:instrText xml:space="preserve"> PAGEREF _Toc242004410 \h </w:instrText>
         </w:r>
         <w:r>
           <w:rPr>
@@ -670,7 +670,7 @@
           <w14:ligatures w14:val="standardContextual"/>
         </w:rPr>
       </w:pPr>
-      <w:hyperlink w:anchor="_Toc242002766" w:history="1">
+      <w:hyperlink w:anchor="_Toc242004411" w:history="1">
         <w:r>
           <w:rPr>
             <w:rStyle w:val="Siuktni"/>
@@ -697,7 +697,7 @@
             <w:noProof/>
             <w:webHidden/>
           </w:rPr>
-          <w:instrText xml:space="preserve"> PAGEREF _Toc242002766 \h </w:instrText>
+          <w:instrText xml:space="preserve"> PAGEREF _Toc242004411 \h </w:instrText>
         </w:r>
         <w:r>
           <w:rPr>
@@ -745,7 +745,7 @@
           <w14:ligatures w14:val="standardContextual"/>
         </w:rPr>
       </w:pPr>
-      <w:hyperlink w:anchor="_Toc242002767" w:history="1">
+      <w:hyperlink w:anchor="_Toc242004412" w:history="1">
         <w:r>
           <w:rPr>
             <w:rStyle w:val="Siuktni"/>
@@ -772,7 +772,7 @@
             <w:noProof/>
             <w:webHidden/>
           </w:rPr>
-          <w:instrText xml:space="preserve"> PAGEREF _Toc242002767 \h </w:instrText>
+          <w:instrText xml:space="preserve"> PAGEREF _Toc242004412 \h </w:instrText>
         </w:r>
         <w:r>
           <w:rPr>
@@ -820,7 +820,7 @@
           <w14:ligatures w14:val="standardContextual"/>
         </w:rPr>
       </w:pPr>
-      <w:hyperlink w:anchor="_Toc242002768" w:history="1">
+      <w:hyperlink w:anchor="_Toc242004413" w:history="1">
         <w:r>
           <w:rPr>
             <w:rStyle w:val="Siuktni"/>
@@ -847,7 +847,7 @@
             <w:noProof/>
             <w:webHidden/>
           </w:rPr>
-          <w:instrText xml:space="preserve"> PAGEREF _Toc242002768 \h </w:instrText>
+          <w:instrText xml:space="preserve"> PAGEREF _Toc242004413 \h </w:instrText>
         </w:r>
         <w:r>
           <w:rPr>
@@ -895,7 +895,7 @@
           <w14:ligatures w14:val="standardContextual"/>
         </w:rPr>
       </w:pPr>
-      <w:hyperlink w:anchor="_Toc242002769" w:history="1">
+      <w:hyperlink w:anchor="_Toc242004414" w:history="1">
         <w:r>
           <w:rPr>
             <w:rStyle w:val="Siuktni"/>
@@ -922,7 +922,7 @@
             <w:noProof/>
             <w:webHidden/>
           </w:rPr>
-          <w:instrText xml:space="preserve"> PAGEREF _Toc242002769 \h </w:instrText>
+          <w:instrText xml:space="preserve"> PAGEREF _Toc242004414 \h </w:instrText>
         </w:r>
         <w:r>
           <w:rPr>
@@ -970,7 +970,7 @@
           <w14:ligatures w14:val="standardContextual"/>
         </w:rPr>
       </w:pPr>
-      <w:hyperlink w:anchor="_Toc242002770" w:history="1">
+      <w:hyperlink w:anchor="_Toc242004415" w:history="1">
         <w:r>
           <w:rPr>
             <w:rStyle w:val="Siuktni"/>
@@ -997,7 +997,7 @@
             <w:noProof/>
             <w:webHidden/>
           </w:rPr>
-          <w:instrText xml:space="preserve"> PAGEREF _Toc242002770 \h </w:instrText>
+          <w:instrText xml:space="preserve"> PAGEREF _Toc242004415 \h </w:instrText>
         </w:r>
         <w:r>
           <w:rPr>
@@ -1045,7 +1045,7 @@
           <w14:ligatures w14:val="standardContextual"/>
         </w:rPr>
       </w:pPr>
-      <w:hyperlink w:anchor="_Toc242002771" w:history="1">
+      <w:hyperlink w:anchor="_Toc242004416" w:history="1">
         <w:r>
           <w:rPr>
             <w:rStyle w:val="Siuktni"/>
@@ -1072,7 +1072,7 @@
             <w:noProof/>
             <w:webHidden/>
           </w:rPr>
-          <w:instrText xml:space="preserve"> PAGEREF _Toc242002771 \h </w:instrText>
+          <w:instrText xml:space="preserve"> PAGEREF _Toc242004416 \h </w:instrText>
         </w:r>
         <w:r>
           <w:rPr>
@@ -1120,7 +1120,7 @@
           <w14:ligatures w14:val="standardContextual"/>
         </w:rPr>
       </w:pPr>
-      <w:hyperlink w:anchor="_Toc242002772" w:history="1">
+      <w:hyperlink w:anchor="_Toc242004417" w:history="1">
         <w:r>
           <w:rPr>
             <w:rStyle w:val="Siuktni"/>
@@ -1147,7 +1147,7 @@
             <w:noProof/>
             <w:webHidden/>
           </w:rPr>
-          <w:instrText xml:space="preserve"> PAGEREF _Toc242002772 \h </w:instrText>
+          <w:instrText xml:space="preserve"> PAGEREF _Toc242004417 \h </w:instrText>
         </w:r>
         <w:r>
           <w:rPr>
@@ -1195,7 +1195,7 @@
           <w14:ligatures w14:val="standardContextual"/>
         </w:rPr>
       </w:pPr>
-      <w:hyperlink w:anchor="_Toc242002773" w:history="1">
+      <w:hyperlink w:anchor="_Toc242004418" w:history="1">
         <w:r>
           <w:rPr>
             <w:rStyle w:val="Siuktni"/>
@@ -1222,7 +1222,7 @@
             <w:noProof/>
             <w:webHidden/>
           </w:rPr>
-          <w:instrText xml:space="preserve"> PAGEREF _Toc242002773 \h </w:instrText>
+          <w:instrText xml:space="preserve"> PAGEREF _Toc242004418 \h </w:instrText>
         </w:r>
         <w:r>
           <w:rPr>
@@ -1270,7 +1270,7 @@
           <w14:ligatures w14:val="standardContextual"/>
         </w:rPr>
       </w:pPr>
-      <w:hyperlink w:anchor="_Toc242002774" w:history="1">
+      <w:hyperlink w:anchor="_Toc242004419" w:history="1">
         <w:r>
           <w:rPr>
             <w:rStyle w:val="Siuktni"/>
@@ -1297,7 +1297,7 @@
             <w:noProof/>
             <w:webHidden/>
           </w:rPr>
-          <w:instrText xml:space="preserve"> PAGEREF _Toc242002774 \h </w:instrText>
+          <w:instrText xml:space="preserve"> PAGEREF _Toc242004419 \h </w:instrText>
         </w:r>
         <w:r>
           <w:rPr>
@@ -1345,7 +1345,7 @@
           <w14:ligatures w14:val="standardContextual"/>
         </w:rPr>
       </w:pPr>
-      <w:hyperlink w:anchor="_Toc242002775" w:history="1">
+      <w:hyperlink w:anchor="_Toc242004420" w:history="1">
         <w:r>
           <w:rPr>
             <w:rStyle w:val="Siuktni"/>
@@ -1372,7 +1372,7 @@
             <w:noProof/>
             <w:webHidden/>
           </w:rPr>
-          <w:instrText xml:space="preserve"> PAGEREF _Toc242002775 \h </w:instrText>
+          <w:instrText xml:space="preserve"> PAGEREF _Toc242004420 \h </w:instrText>
         </w:r>
         <w:r>
           <w:rPr>
@@ -1420,7 +1420,7 @@
           <w14:ligatures w14:val="standardContextual"/>
         </w:rPr>
       </w:pPr>
-      <w:hyperlink w:anchor="_Toc242002776" w:history="1">
+      <w:hyperlink w:anchor="_Toc242004421" w:history="1">
         <w:r>
           <w:rPr>
             <w:rStyle w:val="Siuktni"/>
@@ -1447,7 +1447,7 @@
             <w:noProof/>
             <w:webHidden/>
           </w:rPr>
-          <w:instrText xml:space="preserve"> PAGEREF _Toc242002776 \h </w:instrText>
+          <w:instrText xml:space="preserve"> PAGEREF _Toc242004421 \h </w:instrText>
         </w:r>
         <w:r>
           <w:rPr>
@@ -1495,7 +1495,7 @@
           <w14:ligatures w14:val="standardContextual"/>
         </w:rPr>
       </w:pPr>
-      <w:hyperlink w:anchor="_Toc242002777" w:history="1">
+      <w:hyperlink w:anchor="_Toc242004422" w:history="1">
         <w:r>
           <w:rPr>
             <w:rStyle w:val="Siuktni"/>
@@ -1522,7 +1522,7 @@
             <w:noProof/>
             <w:webHidden/>
           </w:rPr>
-          <w:instrText xml:space="preserve"> PAGEREF _Toc242002777 \h </w:instrText>
+          <w:instrText xml:space="preserve"> PAGEREF _Toc242004422 \h </w:instrText>
         </w:r>
         <w:r>
           <w:rPr>
@@ -1570,7 +1570,7 @@
           <w14:ligatures w14:val="standardContextual"/>
         </w:rPr>
       </w:pPr>
-      <w:hyperlink w:anchor="_Toc242002778" w:history="1">
+      <w:hyperlink w:anchor="_Toc242004423" w:history="1">
         <w:r>
           <w:rPr>
             <w:rStyle w:val="Siuktni"/>
@@ -1597,7 +1597,7 @@
             <w:noProof/>
             <w:webHidden/>
           </w:rPr>
-          <w:instrText xml:space="preserve"> PAGEREF _Toc242002778 \h </w:instrText>
+          <w:instrText xml:space="preserve"> PAGEREF _Toc242004423 \h </w:instrText>
         </w:r>
         <w:r>
           <w:rPr>
@@ -1645,7 +1645,7 @@
           <w14:ligatures w14:val="standardContextual"/>
         </w:rPr>
       </w:pPr>
-      <w:hyperlink w:anchor="_Toc242002779" w:history="1">
+      <w:hyperlink w:anchor="_Toc242004424" w:history="1">
         <w:r>
           <w:rPr>
             <w:rStyle w:val="Siuktni"/>
@@ -1672,7 +1672,7 @@
             <w:noProof/>
             <w:webHidden/>
           </w:rPr>
-          <w:instrText xml:space="preserve"> PAGEREF _Toc242002779 \h </w:instrText>
+          <w:instrText xml:space="preserve"> PAGEREF _Toc242004424 \h </w:instrText>
         </w:r>
         <w:r>
           <w:rPr>
@@ -1720,7 +1720,7 @@
           <w14:ligatures w14:val="standardContextual"/>
         </w:rPr>
       </w:pPr>
-      <w:hyperlink w:anchor="_Toc242002780" w:history="1">
+      <w:hyperlink w:anchor="_Toc242004425" w:history="1">
         <w:r>
           <w:rPr>
             <w:rStyle w:val="Siuktni"/>
@@ -1747,7 +1747,7 @@
             <w:noProof/>
             <w:webHidden/>
           </w:rPr>
-          <w:instrText xml:space="preserve"> PAGEREF _Toc242002780 \h </w:instrText>
+          <w:instrText xml:space="preserve"> PAGEREF _Toc242004425 \h </w:instrText>
         </w:r>
         <w:r>
           <w:rPr>
@@ -1795,7 +1795,7 @@
           <w14:ligatures w14:val="standardContextual"/>
         </w:rPr>
       </w:pPr>
-      <w:hyperlink w:anchor="_Toc242002781" w:history="1">
+      <w:hyperlink w:anchor="_Toc242004426" w:history="1">
         <w:r>
           <w:rPr>
             <w:rStyle w:val="Siuktni"/>
@@ -1822,7 +1822,7 @@
             <w:noProof/>
             <w:webHidden/>
           </w:rPr>
-          <w:instrText xml:space="preserve"> PAGEREF _Toc242002781 \h </w:instrText>
+          <w:instrText xml:space="preserve"> PAGEREF _Toc242004426 \h </w:instrText>
         </w:r>
         <w:r>
           <w:rPr>
@@ -1870,7 +1870,7 @@
           <w14:ligatures w14:val="standardContextual"/>
         </w:rPr>
       </w:pPr>
-      <w:hyperlink w:anchor="_Toc242002782" w:history="1">
+      <w:hyperlink w:anchor="_Toc242004427" w:history="1">
         <w:r>
           <w:rPr>
             <w:rStyle w:val="Siuktni"/>
@@ -1897,7 +1897,7 @@
             <w:noProof/>
             <w:webHidden/>
           </w:rPr>
-          <w:instrText xml:space="preserve"> PAGEREF _Toc242002782 \h </w:instrText>
+          <w:instrText xml:space="preserve"> PAGEREF _Toc242004427 \h </w:instrText>
         </w:r>
         <w:r>
           <w:rPr>
@@ -1945,7 +1945,7 @@
           <w14:ligatures w14:val="standardContextual"/>
         </w:rPr>
       </w:pPr>
-      <w:hyperlink w:anchor="_Toc242002783" w:history="1">
+      <w:hyperlink w:anchor="_Toc242004428" w:history="1">
         <w:r>
           <w:rPr>
             <w:rStyle w:val="Siuktni"/>
@@ -1972,7 +1972,7 @@
             <w:noProof/>
             <w:webHidden/>
           </w:rPr>
-          <w:instrText xml:space="preserve"> PAGEREF _Toc242002783 \h </w:instrText>
+          <w:instrText xml:space="preserve"> PAGEREF _Toc242004428 \h </w:instrText>
         </w:r>
         <w:r>
           <w:rPr>
@@ -2020,7 +2020,7 @@
           <w14:ligatures w14:val="standardContextual"/>
         </w:rPr>
       </w:pPr>
-      <w:hyperlink w:anchor="_Toc242002784" w:history="1">
+      <w:hyperlink w:anchor="_Toc242004429" w:history="1">
         <w:r>
           <w:rPr>
             <w:rStyle w:val="Siuktni"/>
@@ -2047,7 +2047,7 @@
             <w:noProof/>
             <w:webHidden/>
           </w:rPr>
-          <w:instrText xml:space="preserve"> PAGEREF _Toc242002784 \h </w:instrText>
+          <w:instrText xml:space="preserve"> PAGEREF _Toc242004429 \h </w:instrText>
         </w:r>
         <w:r>
           <w:rPr>
@@ -2095,7 +2095,7 @@
           <w14:ligatures w14:val="standardContextual"/>
         </w:rPr>
       </w:pPr>
-      <w:hyperlink w:anchor="_Toc242002785" w:history="1">
+      <w:hyperlink w:anchor="_Toc242004430" w:history="1">
         <w:r>
           <w:rPr>
             <w:rStyle w:val="Siuktni"/>
@@ -2122,7 +2122,7 @@
             <w:noProof/>
             <w:webHidden/>
           </w:rPr>
-          <w:instrText xml:space="preserve"> PAGEREF _Toc242002785 \h </w:instrText>
+          <w:instrText xml:space="preserve"> PAGEREF _Toc242004430 \h </w:instrText>
         </w:r>
         <w:r>
           <w:rPr>
@@ -2170,7 +2170,7 @@
           <w14:ligatures w14:val="standardContextual"/>
         </w:rPr>
       </w:pPr>
-      <w:hyperlink w:anchor="_Toc242002786" w:history="1">
+      <w:hyperlink w:anchor="_Toc242004431" w:history="1">
         <w:r>
           <w:rPr>
             <w:rStyle w:val="Siuktni"/>
@@ -2197,7 +2197,7 @@
             <w:noProof/>
             <w:webHidden/>
           </w:rPr>
-          <w:instrText xml:space="preserve"> PAGEREF _Toc242002786 \h </w:instrText>
+          <w:instrText xml:space="preserve"> PAGEREF _Toc242004431 \h </w:instrText>
         </w:r>
         <w:r>
           <w:rPr>
@@ -2245,7 +2245,7 @@
           <w14:ligatures w14:val="standardContextual"/>
         </w:rPr>
       </w:pPr>
-      <w:hyperlink w:anchor="_Toc242002787" w:history="1">
+      <w:hyperlink w:anchor="_Toc242004432" w:history="1">
         <w:r>
           <w:rPr>
             <w:rStyle w:val="Siuktni"/>
@@ -2272,7 +2272,7 @@
             <w:noProof/>
             <w:webHidden/>
           </w:rPr>
-          <w:instrText xml:space="preserve"> PAGEREF _Toc242002787 \h </w:instrText>
+          <w:instrText xml:space="preserve"> PAGEREF _Toc242004432 \h </w:instrText>
         </w:r>
         <w:r>
           <w:rPr>
@@ -2320,7 +2320,7 @@
           <w14:ligatures w14:val="standardContextual"/>
         </w:rPr>
       </w:pPr>
-      <w:hyperlink w:anchor="_Toc242002788" w:history="1">
+      <w:hyperlink w:anchor="_Toc242004433" w:history="1">
         <w:r>
           <w:rPr>
             <w:rStyle w:val="Siuktni"/>
@@ -2347,7 +2347,7 @@
             <w:noProof/>
             <w:webHidden/>
           </w:rPr>
-          <w:instrText xml:space="preserve"> PAGEREF _Toc242002788 \h </w:instrText>
+          <w:instrText xml:space="preserve"> PAGEREF _Toc242004433 \h </w:instrText>
         </w:r>
         <w:r>
           <w:rPr>
@@ -2395,7 +2395,7 @@
           <w14:ligatures w14:val="standardContextual"/>
         </w:rPr>
       </w:pPr>
-      <w:hyperlink w:anchor="_Toc242002789" w:history="1">
+      <w:hyperlink w:anchor="_Toc242004434" w:history="1">
         <w:r>
           <w:rPr>
             <w:rStyle w:val="Siuktni"/>
@@ -2422,7 +2422,7 @@
             <w:noProof/>
             <w:webHidden/>
           </w:rPr>
-          <w:instrText xml:space="preserve"> PAGEREF _Toc242002789 \h </w:instrText>
+          <w:instrText xml:space="preserve"> PAGEREF _Toc242004434 \h </w:instrText>
         </w:r>
         <w:r>
           <w:rPr>
@@ -2470,7 +2470,7 @@
           <w14:ligatures w14:val="standardContextual"/>
         </w:rPr>
       </w:pPr>
-      <w:hyperlink w:anchor="_Toc242002790" w:history="1">
+      <w:hyperlink w:anchor="_Toc242004435" w:history="1">
         <w:r>
           <w:rPr>
             <w:rStyle w:val="Siuktni"/>
@@ -2497,7 +2497,7 @@
             <w:noProof/>
             <w:webHidden/>
           </w:rPr>
-          <w:instrText xml:space="preserve"> PAGEREF _Toc242002790 \h </w:instrText>
+          <w:instrText xml:space="preserve"> PAGEREF _Toc242004435 \h </w:instrText>
         </w:r>
         <w:r>
           <w:rPr>
@@ -2545,7 +2545,7 @@
           <w14:ligatures w14:val="standardContextual"/>
         </w:rPr>
       </w:pPr>
-      <w:hyperlink w:anchor="_Toc242002791" w:history="1">
+      <w:hyperlink w:anchor="_Toc242004436" w:history="1">
         <w:r>
           <w:rPr>
             <w:rStyle w:val="Siuktni"/>
@@ -2572,7 +2572,7 @@
             <w:noProof/>
             <w:webHidden/>
           </w:rPr>
-          <w:instrText xml:space="preserve"> PAGEREF _Toc242002791 \h </w:instrText>
+          <w:instrText xml:space="preserve"> PAGEREF _Toc242004436 \h </w:instrText>
         </w:r>
         <w:r>
           <w:rPr>
@@ -2620,7 +2620,7 @@
           <w14:ligatures w14:val="standardContextual"/>
         </w:rPr>
       </w:pPr>
-      <w:hyperlink w:anchor="_Toc242002792" w:history="1">
+      <w:hyperlink w:anchor="_Toc242004437" w:history="1">
         <w:r>
           <w:rPr>
             <w:rStyle w:val="Siuktni"/>
@@ -2647,7 +2647,7 @@
             <w:noProof/>
             <w:webHidden/>
           </w:rPr>
-          <w:instrText xml:space="preserve"> PAGEREF _Toc242002792 \h </w:instrText>
+          <w:instrText xml:space="preserve"> PAGEREF _Toc242004437 \h </w:instrText>
         </w:r>
         <w:r>
           <w:rPr>
@@ -2695,7 +2695,7 @@
           <w14:ligatures w14:val="standardContextual"/>
         </w:rPr>
       </w:pPr>
-      <w:hyperlink w:anchor="_Toc242002793" w:history="1">
+      <w:hyperlink w:anchor="_Toc242004438" w:history="1">
         <w:r>
           <w:rPr>
             <w:rStyle w:val="Siuktni"/>
@@ -2722,7 +2722,7 @@
             <w:noProof/>
             <w:webHidden/>
           </w:rPr>
-          <w:instrText xml:space="preserve"> PAGEREF _Toc242002793 \h </w:instrText>
+          <w:instrText xml:space="preserve"> PAGEREF _Toc242004438 \h </w:instrText>
         </w:r>
         <w:r>
           <w:rPr>
@@ -2770,7 +2770,7 @@
           <w14:ligatures w14:val="standardContextual"/>
         </w:rPr>
       </w:pPr>
-      <w:hyperlink w:anchor="_Toc242002794" w:history="1">
+      <w:hyperlink w:anchor="_Toc242004439" w:history="1">
         <w:r>
           <w:rPr>
             <w:rStyle w:val="Siuktni"/>
@@ -2797,7 +2797,7 @@
             <w:noProof/>
             <w:webHidden/>
           </w:rPr>
-          <w:instrText xml:space="preserve"> PAGEREF _Toc242002794 \h </w:instrText>
+          <w:instrText xml:space="preserve"> PAGEREF _Toc242004439 \h </w:instrText>
         </w:r>
         <w:r>
           <w:rPr>
@@ -2845,7 +2845,7 @@
           <w14:ligatures w14:val="standardContextual"/>
         </w:rPr>
       </w:pPr>
-      <w:hyperlink w:anchor="_Toc242002795" w:history="1">
+      <w:hyperlink w:anchor="_Toc242004440" w:history="1">
         <w:r>
           <w:rPr>
             <w:rStyle w:val="Siuktni"/>
@@ -2872,7 +2872,7 @@
             <w:noProof/>
             <w:webHidden/>
           </w:rPr>
-          <w:instrText xml:space="preserve"> PAGEREF _Toc242002795 \h </w:instrText>
+          <w:instrText xml:space="preserve"> PAGEREF _Toc242004440 \h </w:instrText>
         </w:r>
         <w:r>
           <w:rPr>
@@ -2920,7 +2920,7 @@
           <w14:ligatures w14:val="standardContextual"/>
         </w:rPr>
       </w:pPr>
-      <w:hyperlink w:anchor="_Toc242002796" w:history="1">
+      <w:hyperlink w:anchor="_Toc242004441" w:history="1">
         <w:r>
           <w:rPr>
             <w:rStyle w:val="Siuktni"/>
@@ -2947,7 +2947,7 @@
             <w:noProof/>
             <w:webHidden/>
           </w:rPr>
-          <w:instrText xml:space="preserve"> PAGEREF _Toc242002796 \h </w:instrText>
+          <w:instrText xml:space="preserve"> PAGEREF _Toc242004441 \h </w:instrText>
         </w:r>
         <w:r>
           <w:rPr>
@@ -2995,7 +2995,7 @@
           <w14:ligatures w14:val="standardContextual"/>
         </w:rPr>
       </w:pPr>
-      <w:hyperlink w:anchor="_Toc242002797" w:history="1">
+      <w:hyperlink w:anchor="_Toc242004442" w:history="1">
         <w:r>
           <w:rPr>
             <w:rStyle w:val="Siuktni"/>
@@ -3022,7 +3022,7 @@
             <w:noProof/>
             <w:webHidden/>
           </w:rPr>
-          <w:instrText xml:space="preserve"> PAGEREF _Toc242002797 \h </w:instrText>
+          <w:instrText xml:space="preserve"> PAGEREF _Toc242004442 \h </w:instrText>
         </w:r>
         <w:r>
           <w:rPr>
@@ -3070,7 +3070,7 @@
           <w14:ligatures w14:val="standardContextual"/>
         </w:rPr>
       </w:pPr>
-      <w:hyperlink w:anchor="_Toc242002798" w:history="1">
+      <w:hyperlink w:anchor="_Toc242004443" w:history="1">
         <w:r>
           <w:rPr>
             <w:rStyle w:val="Siuktni"/>
@@ -3097,7 +3097,7 @@
             <w:noProof/>
             <w:webHidden/>
           </w:rPr>
-          <w:instrText xml:space="preserve"> PAGEREF _Toc242002798 \h </w:instrText>
+          <w:instrText xml:space="preserve"> PAGEREF _Toc242004443 \h </w:instrText>
         </w:r>
         <w:r>
           <w:rPr>
@@ -3145,7 +3145,7 @@
           <w14:ligatures w14:val="standardContextual"/>
         </w:rPr>
       </w:pPr>
-      <w:hyperlink w:anchor="_Toc242002799" w:history="1">
+      <w:hyperlink w:anchor="_Toc242004444" w:history="1">
         <w:r>
           <w:rPr>
             <w:rStyle w:val="Siuktni"/>
@@ -3172,7 +3172,7 @@
             <w:noProof/>
             <w:webHidden/>
           </w:rPr>
-          <w:instrText xml:space="preserve"> PAGEREF _Toc242002799 \h </w:instrText>
+          <w:instrText xml:space="preserve"> PAGEREF _Toc242004444 \h </w:instrText>
         </w:r>
         <w:r>
           <w:rPr>
@@ -3220,7 +3220,7 @@
           <w14:ligatures w14:val="standardContextual"/>
         </w:rPr>
       </w:pPr>
-      <w:hyperlink w:anchor="_Toc242002800" w:history="1">
+      <w:hyperlink w:anchor="_Toc242004445" w:history="1">
         <w:r>
           <w:rPr>
             <w:rStyle w:val="Siuktni"/>
@@ -3247,7 +3247,7 @@
             <w:noProof/>
             <w:webHidden/>
           </w:rPr>
-          <w:instrText xml:space="preserve"> PAGEREF _Toc242002800 \h </w:instrText>
+          <w:instrText xml:space="preserve"> PAGEREF _Toc242004445 \h </w:instrText>
         </w:r>
         <w:r>
           <w:rPr>
@@ -3295,7 +3295,7 @@
           <w14:ligatures w14:val="standardContextual"/>
         </w:rPr>
       </w:pPr>
-      <w:hyperlink w:anchor="_Toc242002801" w:history="1">
+      <w:hyperlink w:anchor="_Toc242004446" w:history="1">
         <w:r>
           <w:rPr>
             <w:rStyle w:val="Siuktni"/>
@@ -3322,7 +3322,7 @@
             <w:noProof/>
             <w:webHidden/>
           </w:rPr>
-          <w:instrText xml:space="preserve"> PAGEREF _Toc242002801 \h </w:instrText>
+          <w:instrText xml:space="preserve"> PAGEREF _Toc242004446 \h </w:instrText>
         </w:r>
         <w:r>
           <w:rPr>
@@ -3370,7 +3370,7 @@
           <w14:ligatures w14:val="standardContextual"/>
         </w:rPr>
       </w:pPr>
-      <w:hyperlink w:anchor="_Toc242002802" w:history="1">
+      <w:hyperlink w:anchor="_Toc242004447" w:history="1">
         <w:r>
           <w:rPr>
             <w:rStyle w:val="Siuktni"/>
@@ -3397,7 +3397,7 @@
             <w:noProof/>
             <w:webHidden/>
           </w:rPr>
-          <w:instrText xml:space="preserve"> PAGEREF _Toc242002802 \h </w:instrText>
+          <w:instrText xml:space="preserve"> PAGEREF _Toc242004447 \h </w:instrText>
         </w:r>
         <w:r>
           <w:rPr>
@@ -3445,7 +3445,7 @@
           <w14:ligatures w14:val="standardContextual"/>
         </w:rPr>
       </w:pPr>
-      <w:hyperlink w:anchor="_Toc242002803" w:history="1">
+      <w:hyperlink w:anchor="_Toc242004448" w:history="1">
         <w:r>
           <w:rPr>
             <w:rStyle w:val="Siuktni"/>
@@ -3472,7 +3472,7 @@
             <w:noProof/>
             <w:webHidden/>
           </w:rPr>
-          <w:instrText xml:space="preserve"> PAGEREF _Toc242002803 \h </w:instrText>
+          <w:instrText xml:space="preserve"> PAGEREF _Toc242004448 \h </w:instrText>
         </w:r>
         <w:r>
           <w:rPr>
@@ -3520,7 +3520,7 @@
           <w14:ligatures w14:val="standardContextual"/>
         </w:rPr>
       </w:pPr>
-      <w:hyperlink w:anchor="_Toc242002804" w:history="1">
+      <w:hyperlink w:anchor="_Toc242004449" w:history="1">
         <w:r>
           <w:rPr>
             <w:rStyle w:val="Siuktni"/>
@@ -3547,7 +3547,7 @@
             <w:noProof/>
             <w:webHidden/>
           </w:rPr>
-          <w:instrText xml:space="preserve"> PAGEREF _Toc242002804 \h </w:instrText>
+          <w:instrText xml:space="preserve"> PAGEREF _Toc242004449 \h </w:instrText>
         </w:r>
         <w:r>
           <w:rPr>
@@ -3595,7 +3595,7 @@
           <w14:ligatures w14:val="standardContextual"/>
         </w:rPr>
       </w:pPr>
-      <w:hyperlink w:anchor="_Toc242002805" w:history="1">
+      <w:hyperlink w:anchor="_Toc242004450" w:history="1">
         <w:r>
           <w:rPr>
             <w:rStyle w:val="Siuktni"/>
@@ -3622,7 +3622,7 @@
             <w:noProof/>
             <w:webHidden/>
           </w:rPr>
-          <w:instrText xml:space="preserve"> PAGEREF _Toc242002805 \h </w:instrText>
+          <w:instrText xml:space="preserve"> PAGEREF _Toc242004450 \h </w:instrText>
         </w:r>
         <w:r>
           <w:rPr>
@@ -3670,7 +3670,7 @@
           <w14:ligatures w14:val="standardContextual"/>
         </w:rPr>
       </w:pPr>
-      <w:hyperlink w:anchor="_Toc242002806" w:history="1">
+      <w:hyperlink w:anchor="_Toc242004451" w:history="1">
         <w:r>
           <w:rPr>
             <w:rStyle w:val="Siuktni"/>
@@ -3697,7 +3697,7 @@
             <w:noProof/>
             <w:webHidden/>
           </w:rPr>
-          <w:instrText xml:space="preserve"> PAGEREF _Toc242002806 \h </w:instrText>
+          <w:instrText xml:space="preserve"> PAGEREF _Toc242004451 \h </w:instrText>
         </w:r>
         <w:r>
           <w:rPr>
@@ -3745,7 +3745,7 @@
           <w14:ligatures w14:val="standardContextual"/>
         </w:rPr>
       </w:pPr>
-      <w:hyperlink w:anchor="_Toc242002807" w:history="1">
+      <w:hyperlink w:anchor="_Toc242004452" w:history="1">
         <w:r>
           <w:rPr>
             <w:rStyle w:val="Siuktni"/>
@@ -3772,7 +3772,7 @@
             <w:noProof/>
             <w:webHidden/>
           </w:rPr>
-          <w:instrText xml:space="preserve"> PAGEREF _Toc242002807 \h </w:instrText>
+          <w:instrText xml:space="preserve"> PAGEREF _Toc242004452 \h </w:instrText>
         </w:r>
         <w:r>
           <w:rPr>
@@ -3820,7 +3820,7 @@
           <w14:ligatures w14:val="standardContextual"/>
         </w:rPr>
       </w:pPr>
-      <w:hyperlink w:anchor="_Toc242002808" w:history="1">
+      <w:hyperlink w:anchor="_Toc242004453" w:history="1">
         <w:r>
           <w:rPr>
             <w:rStyle w:val="Siuktni"/>
@@ -3847,7 +3847,7 @@
             <w:noProof/>
             <w:webHidden/>
           </w:rPr>
-          <w:instrText xml:space="preserve"> PAGEREF _Toc242002808 \h </w:instrText>
+          <w:instrText xml:space="preserve"> PAGEREF _Toc242004453 \h </w:instrText>
         </w:r>
         <w:r>
           <w:rPr>
@@ -3895,7 +3895,7 @@
           <w14:ligatures w14:val="standardContextual"/>
         </w:rPr>
       </w:pPr>
-      <w:hyperlink w:anchor="_Toc242002809" w:history="1">
+      <w:hyperlink w:anchor="_Toc242004454" w:history="1">
         <w:r>
           <w:rPr>
             <w:rStyle w:val="Siuktni"/>
@@ -3922,7 +3922,7 @@
             <w:noProof/>
             <w:webHidden/>
           </w:rPr>
-          <w:instrText xml:space="preserve"> PAGEREF _Toc242002809 \h </w:instrText>
+          <w:instrText xml:space="preserve"> PAGEREF _Toc242004454 \h </w:instrText>
         </w:r>
         <w:r>
           <w:rPr>
@@ -3970,7 +3970,7 @@
           <w14:ligatures w14:val="standardContextual"/>
         </w:rPr>
       </w:pPr>
-      <w:hyperlink w:anchor="_Toc242002810" w:history="1">
+      <w:hyperlink w:anchor="_Toc242004455" w:history="1">
         <w:r>
           <w:rPr>
             <w:rStyle w:val="Siuktni"/>
@@ -3997,7 +3997,7 @@
             <w:noProof/>
             <w:webHidden/>
           </w:rPr>
-          <w:instrText xml:space="preserve"> PAGEREF _Toc242002810 \h </w:instrText>
+          <w:instrText xml:space="preserve"> PAGEREF _Toc242004455 \h </w:instrText>
         </w:r>
         <w:r>
           <w:rPr>
@@ -4045,7 +4045,7 @@
           <w14:ligatures w14:val="standardContextual"/>
         </w:rPr>
       </w:pPr>
-      <w:hyperlink w:anchor="_Toc242002811" w:history="1">
+      <w:hyperlink w:anchor="_Toc242004456" w:history="1">
         <w:r>
           <w:rPr>
             <w:rStyle w:val="Siuktni"/>
@@ -4072,7 +4072,7 @@
             <w:noProof/>
             <w:webHidden/>
           </w:rPr>
-          <w:instrText xml:space="preserve"> PAGEREF _Toc242002811 \h </w:instrText>
+          <w:instrText xml:space="preserve"> PAGEREF _Toc242004456 \h </w:instrText>
         </w:r>
         <w:r>
           <w:rPr>
@@ -4120,7 +4120,7 @@
           <w14:ligatures w14:val="standardContextual"/>
         </w:rPr>
       </w:pPr>
-      <w:hyperlink w:anchor="_Toc242002812" w:history="1">
+      <w:hyperlink w:anchor="_Toc242004457" w:history="1">
         <w:r>
           <w:rPr>
             <w:rStyle w:val="Siuktni"/>
@@ -4147,7 +4147,7 @@
             <w:noProof/>
             <w:webHidden/>
           </w:rPr>
-          <w:instrText xml:space="preserve"> PAGEREF _Toc242002812 \h </w:instrText>
+          <w:instrText xml:space="preserve"> PAGEREF _Toc242004457 \h </w:instrText>
         </w:r>
         <w:r>
           <w:rPr>
@@ -4195,7 +4195,7 @@
           <w14:ligatures w14:val="standardContextual"/>
         </w:rPr>
       </w:pPr>
-      <w:hyperlink w:anchor="_Toc242002813" w:history="1">
+      <w:hyperlink w:anchor="_Toc242004458" w:history="1">
         <w:r>
           <w:rPr>
             <w:rStyle w:val="Siuktni"/>
@@ -4222,7 +4222,7 @@
             <w:noProof/>
             <w:webHidden/>
           </w:rPr>
-          <w:instrText xml:space="preserve"> PAGEREF _Toc242002813 \h </w:instrText>
+          <w:instrText xml:space="preserve"> PAGEREF _Toc242004458 \h </w:instrText>
         </w:r>
         <w:r>
           <w:rPr>
@@ -4270,7 +4270,7 @@
           <w14:ligatures w14:val="standardContextual"/>
         </w:rPr>
       </w:pPr>
-      <w:hyperlink w:anchor="_Toc242002814" w:history="1">
+      <w:hyperlink w:anchor="_Toc242004459" w:history="1">
         <w:r>
           <w:rPr>
             <w:rStyle w:val="Siuktni"/>
@@ -4297,7 +4297,7 @@
             <w:noProof/>
             <w:webHidden/>
           </w:rPr>
-          <w:instrText xml:space="preserve"> PAGEREF _Toc242002814 \h </w:instrText>
+          <w:instrText xml:space="preserve"> PAGEREF _Toc242004459 \h </w:instrText>
         </w:r>
         <w:r>
           <w:rPr>
@@ -4345,7 +4345,7 @@
           <w14:ligatures w14:val="standardContextual"/>
         </w:rPr>
       </w:pPr>
-      <w:hyperlink w:anchor="_Toc242002815" w:history="1">
+      <w:hyperlink w:anchor="_Toc242004460" w:history="1">
         <w:r>
           <w:rPr>
             <w:rStyle w:val="Siuktni"/>
@@ -4372,7 +4372,7 @@
             <w:noProof/>
             <w:webHidden/>
           </w:rPr>
-          <w:instrText xml:space="preserve"> PAGEREF _Toc242002815 \h </w:instrText>
+          <w:instrText xml:space="preserve"> PAGEREF _Toc242004460 \h </w:instrText>
         </w:r>
         <w:r>
           <w:rPr>
@@ -4420,7 +4420,7 @@
           <w14:ligatures w14:val="standardContextual"/>
         </w:rPr>
       </w:pPr>
-      <w:hyperlink w:anchor="_Toc242002816" w:history="1">
+      <w:hyperlink w:anchor="_Toc242004461" w:history="1">
         <w:r>
           <w:rPr>
             <w:rStyle w:val="Siuktni"/>
@@ -4447,7 +4447,7 @@
             <w:noProof/>
             <w:webHidden/>
           </w:rPr>
-          <w:instrText xml:space="preserve"> PAGEREF _Toc242002816 \h </w:instrText>
+          <w:instrText xml:space="preserve"> PAGEREF _Toc242004461 \h </w:instrText>
         </w:r>
         <w:r>
           <w:rPr>
@@ -4495,7 +4495,7 @@
       <w:pPr>
         <w:pStyle w:val="u1"/>
       </w:pPr>
-      <w:bookmarkStart w:id="3" w:name="_Toc242002764"/>
+      <w:bookmarkStart w:id="3" w:name="_Toc242004409"/>
       <w:r>
         <w:lastRenderedPageBreak/>
         <w:t>DANH M</w:t>
@@ -5081,7 +5081,7 @@
       <w:pPr>
         <w:pStyle w:val="u1"/>
       </w:pPr>
-      <w:bookmarkStart w:id="4" w:name="_Toc242002765"/>
+      <w:bookmarkStart w:id="4" w:name="_Toc242004410"/>
       <w:r>
         <w:lastRenderedPageBreak/>
         <w:t>CHƯƠNG 1. GI</w:t>
@@ -5104,7 +5104,7 @@
       <w:pPr>
         <w:pStyle w:val="u2"/>
       </w:pPr>
-      <w:bookmarkStart w:id="5" w:name="_Toc242002766"/>
+      <w:bookmarkStart w:id="5" w:name="_Toc242004411"/>
       <w:r>
         <w:t>1.1. B</w:t>
       </w:r>
@@ -5148,7 +5148,7 @@
       <w:pPr>
         <w:pStyle w:val="u2"/>
       </w:pPr>
-      <w:bookmarkStart w:id="6" w:name="_Toc242002767"/>
+      <w:bookmarkStart w:id="6" w:name="_Toc242004412"/>
       <w:r>
         <w:t>1.2. M</w:t>
       </w:r>
@@ -5549,7 +5549,7 @@
       <w:pPr>
         <w:pStyle w:val="u2"/>
       </w:pPr>
-      <w:bookmarkStart w:id="7" w:name="_Toc242002768"/>
+      <w:bookmarkStart w:id="7" w:name="_Toc242004413"/>
       <w:r>
         <w:t>1.3. Đ</w:t>
       </w:r>
@@ -5632,7 +5632,7 @@
       <w:pPr>
         <w:pStyle w:val="u2"/>
       </w:pPr>
-      <w:bookmarkStart w:id="8" w:name="_Toc242002769"/>
+      <w:bookmarkStart w:id="8" w:name="_Toc242004414"/>
       <w:r>
         <w:t>1.4. Phương pháp và c</w:t>
       </w:r>
@@ -5659,7 +5659,7 @@
       <w:pPr>
         <w:pStyle w:val="u2"/>
       </w:pPr>
-      <w:bookmarkStart w:id="9" w:name="_Toc242002770"/>
+      <w:bookmarkStart w:id="9" w:name="_Toc242004415"/>
       <w:r>
         <w:t>1.5. M</w:t>
       </w:r>
@@ -6077,7 +6077,7 @@
       <w:pPr>
         <w:pStyle w:val="u1"/>
       </w:pPr>
-      <w:bookmarkStart w:id="10" w:name="_Toc242002771"/>
+      <w:bookmarkStart w:id="10" w:name="_Toc242004416"/>
       <w:r>
         <w:lastRenderedPageBreak/>
         <w:t>CHƯƠNG 2. CƠ S</w:t>
@@ -6106,7 +6106,7 @@
       <w:pPr>
         <w:pStyle w:val="u2"/>
       </w:pPr>
-      <w:bookmarkStart w:id="11" w:name="_Toc242002772"/>
+      <w:bookmarkStart w:id="11" w:name="_Toc242004417"/>
       <w:r>
         <w:t>2.1. Ch</w:t>
       </w:r>
@@ -6162,7 +6162,7 @@
       <w:pPr>
         <w:pStyle w:val="u2"/>
       </w:pPr>
-      <w:bookmarkStart w:id="12" w:name="_Toc242002773"/>
+      <w:bookmarkStart w:id="12" w:name="_Toc242004418"/>
       <w:r>
         <w:t>2.2. Các t</w:t>
       </w:r>
@@ -6745,7 +6745,7 @@
       <w:pPr>
         <w:pStyle w:val="u2"/>
       </w:pPr>
-      <w:bookmarkStart w:id="13" w:name="_Toc242002774"/>
+      <w:bookmarkStart w:id="13" w:name="_Toc242004419"/>
       <w:r>
         <w:lastRenderedPageBreak/>
         <w:t>2.3. K</w:t>
@@ -7287,7 +7287,7 @@
       <w:pPr>
         <w:pStyle w:val="u2"/>
       </w:pPr>
-      <w:bookmarkStart w:id="14" w:name="_Toc242002775"/>
+      <w:bookmarkStart w:id="14" w:name="_Toc242004420"/>
       <w:r>
         <w:t>2.4. Coverage và mutation testing</w:t>
       </w:r>
@@ -7307,7 +7307,7 @@
       <w:pPr>
         <w:pStyle w:val="u2"/>
       </w:pPr>
-      <w:bookmarkStart w:id="15" w:name="_Toc242002776"/>
+      <w:bookmarkStart w:id="15" w:name="_Toc242004421"/>
       <w:r>
         <w:lastRenderedPageBreak/>
         <w:t>2.5. Security, performance và accessibility</w:t>
@@ -7328,7 +7328,7 @@
       <w:pPr>
         <w:pStyle w:val="u1"/>
       </w:pPr>
-      <w:bookmarkStart w:id="16" w:name="_Toc242002777"/>
+      <w:bookmarkStart w:id="16" w:name="_Toc242004422"/>
       <w:r>
         <w:lastRenderedPageBreak/>
         <w:t>CHƯƠNG 3. PHÂN TÍCH VÀ THI</w:t>
@@ -7351,7 +7351,7 @@
       <w:pPr>
         <w:pStyle w:val="u2"/>
       </w:pPr>
-      <w:bookmarkStart w:id="17" w:name="_Toc242002778"/>
+      <w:bookmarkStart w:id="17" w:name="_Toc242004423"/>
       <w:r>
         <w:t>3.1. Actor và use case</w:t>
       </w:r>
@@ -7371,7 +7371,7 @@
           <w:noProof/>
         </w:rPr>
         <w:drawing>
-          <wp:inline distT="0" distB="0" distL="0" distR="0" wp14:anchorId="1E9A9CA7" wp14:editId="2C787847">
+          <wp:inline distT="0" distB="0" distL="0" distR="0" wp14:anchorId="343F8E09" wp14:editId="0538B914">
             <wp:extent cx="5943600" cy="4730926"/>
             <wp:effectExtent l="0" t="0" r="0" b="0"/>
             <wp:docPr id="1" name="Picture 1"/>
@@ -7987,7 +7987,7 @@
       <w:pPr>
         <w:pStyle w:val="u2"/>
       </w:pPr>
-      <w:bookmarkStart w:id="18" w:name="_Toc242002779"/>
+      <w:bookmarkStart w:id="18" w:name="_Toc242004424"/>
       <w:r>
         <w:t>3.2. Yêu c</w:t>
       </w:r>
@@ -8488,7 +8488,7 @@
       <w:pPr>
         <w:pStyle w:val="u2"/>
       </w:pPr>
-      <w:bookmarkStart w:id="19" w:name="_Toc242002780"/>
+      <w:bookmarkStart w:id="19" w:name="_Toc242004425"/>
       <w:r>
         <w:t>3.3. Quy t</w:t>
       </w:r>
@@ -8995,7 +8995,7 @@
       <w:pPr>
         <w:pStyle w:val="u2"/>
       </w:pPr>
-      <w:bookmarkStart w:id="20" w:name="_Toc242002781"/>
+      <w:bookmarkStart w:id="20" w:name="_Toc242004426"/>
       <w:r>
         <w:t>3.4. Ki</w:t>
       </w:r>
@@ -9039,7 +9039,7 @@
           <w:noProof/>
         </w:rPr>
         <w:drawing>
-          <wp:inline distT="0" distB="0" distL="0" distR="0" wp14:anchorId="24AB0BD2" wp14:editId="50F12A77">
+          <wp:inline distT="0" distB="0" distL="0" distR="0" wp14:anchorId="6C20E484" wp14:editId="44EB9B42">
             <wp:extent cx="5943600" cy="2600325"/>
             <wp:effectExtent l="0" t="0" r="0" b="0"/>
             <wp:docPr id="2" name="Picture 2"/>
@@ -9100,7 +9100,7 @@
       <w:pPr>
         <w:pStyle w:val="u2"/>
       </w:pPr>
-      <w:bookmarkStart w:id="21" w:name="_Toc242002782"/>
+      <w:bookmarkStart w:id="21" w:name="_Toc242004427"/>
       <w:r>
         <w:t>3.5. Mô hình d</w:t>
       </w:r>
@@ -9132,7 +9132,7 @@
           <w:noProof/>
         </w:rPr>
         <w:drawing>
-          <wp:inline distT="0" distB="0" distL="0" distR="0" wp14:anchorId="4EF6F364" wp14:editId="72E42D33">
+          <wp:inline distT="0" distB="0" distL="0" distR="0" wp14:anchorId="1DAFFDD5" wp14:editId="03A99978">
             <wp:extent cx="5943600" cy="3516630"/>
             <wp:effectExtent l="0" t="0" r="0" b="0"/>
             <wp:docPr id="3" name="Picture 3"/>
@@ -9196,7 +9196,7 @@
       <w:pPr>
         <w:pStyle w:val="u2"/>
       </w:pPr>
-      <w:bookmarkStart w:id="22" w:name="_Toc242002783"/>
+      <w:bookmarkStart w:id="22" w:name="_Toc242004428"/>
       <w:r>
         <w:t>3.6. Công th</w:t>
       </w:r>
@@ -9234,7 +9234,7 @@
       <w:pPr>
         <w:pStyle w:val="u1"/>
       </w:pPr>
-      <w:bookmarkStart w:id="23" w:name="_Toc242002784"/>
+      <w:bookmarkStart w:id="23" w:name="_Toc242004429"/>
       <w:r>
         <w:lastRenderedPageBreak/>
         <w:t>CHƯƠNG 4. PHƯƠNG PHÁP VÀ K</w:t>
@@ -9266,7 +9266,7 @@
       <w:pPr>
         <w:pStyle w:val="u2"/>
       </w:pPr>
-      <w:bookmarkStart w:id="24" w:name="_Toc242002785"/>
+      <w:bookmarkStart w:id="24" w:name="_Toc242004430"/>
       <w:r>
         <w:t>4.1. Chi</w:t>
       </w:r>
@@ -9946,7 +9946,7 @@
       <w:pPr>
         <w:pStyle w:val="u2"/>
       </w:pPr>
-      <w:bookmarkStart w:id="25" w:name="_Toc242002786"/>
+      <w:bookmarkStart w:id="25" w:name="_Toc242004431"/>
       <w:r>
         <w:t>4.2. Thi</w:t>
       </w:r>
@@ -10538,7 +10538,7 @@
       <w:pPr>
         <w:pStyle w:val="u3"/>
       </w:pPr>
-      <w:bookmarkStart w:id="26" w:name="_Toc242002787"/>
+      <w:bookmarkStart w:id="26" w:name="_Toc242004432"/>
       <w:r>
         <w:t>4.2.1. Ví d</w:t>
       </w:r>
@@ -11215,7 +11215,7 @@
       <w:pPr>
         <w:pStyle w:val="u2"/>
       </w:pPr>
-      <w:bookmarkStart w:id="27" w:name="_Toc242002788"/>
+      <w:bookmarkStart w:id="27" w:name="_Toc242004433"/>
       <w:r>
         <w:lastRenderedPageBreak/>
         <w:t>4.3. Môi trư</w:t>
@@ -11361,7 +11361,7 @@
               <w:rPr>
                 <w:sz w:val="21"/>
               </w:rPr>
-              <w:t>14cd9a346ae88dd9fc68e9a2fa74f30a06614777</w:t>
+              <w:t>73f1ed4d3a7d64a3d64ac1ef2b48f4295e2bd2f2</w:t>
             </w:r>
           </w:p>
         </w:tc>
@@ -11612,7 +11612,7 @@
       <w:pPr>
         <w:pStyle w:val="u2"/>
       </w:pPr>
-      <w:bookmarkStart w:id="28" w:name="_Toc242002789"/>
+      <w:bookmarkStart w:id="28" w:name="_Toc242004434"/>
       <w:r>
         <w:t>4.4. Entry, exit và workflow</w:t>
       </w:r>
@@ -11989,7 +11989,7 @@
       <w:pPr>
         <w:pStyle w:val="u2"/>
       </w:pPr>
-      <w:bookmarkStart w:id="29" w:name="_Toc242002790"/>
+      <w:bookmarkStart w:id="29" w:name="_Toc242004435"/>
       <w:r>
         <w:t>4.5. Truy v</w:t>
       </w:r>
@@ -12027,7 +12027,7 @@
       <w:pPr>
         <w:pStyle w:val="u2"/>
       </w:pPr>
-      <w:bookmarkStart w:id="30" w:name="_Toc242002791"/>
+      <w:bookmarkStart w:id="30" w:name="_Toc242004436"/>
       <w:r>
         <w:t>4.6. Tiêu chí đánh giá tính đ</w:t>
       </w:r>
@@ -12074,7 +12074,7 @@
       <w:pPr>
         <w:pStyle w:val="u1"/>
       </w:pPr>
-      <w:bookmarkStart w:id="31" w:name="_Toc242002792"/>
+      <w:bookmarkStart w:id="31" w:name="_Toc242004437"/>
       <w:r>
         <w:lastRenderedPageBreak/>
         <w:t>CHƯƠNG 5. TH</w:t>
@@ -12115,7 +12115,7 @@
       <w:pPr>
         <w:pStyle w:val="u2"/>
       </w:pPr>
-      <w:bookmarkStart w:id="32" w:name="_Toc242002793"/>
+      <w:bookmarkStart w:id="32" w:name="_Toc242004438"/>
       <w:r>
         <w:t>5.1. T</w:t>
       </w:r>
@@ -12721,7 +12721,7 @@
               <w:rPr>
                 <w:sz w:val="21"/>
               </w:rPr>
-              <w:t>2.400 request; p95 4,63 ms; checks 100%</w:t>
+              <w:t>2.400 request; p95 5,65 ms; checks 100%</w:t>
             </w:r>
           </w:p>
         </w:tc>
@@ -12805,7 +12805,7 @@
               <w:rPr>
                 <w:sz w:val="21"/>
               </w:rPr>
-              <w:t>1×201; 19×409; p95 41,19 ms</w:t>
+              <w:t>1×201; 19×409; p95 67,55 ms</w:t>
             </w:r>
           </w:p>
         </w:tc>
@@ -12889,7 +12889,7 @@
               <w:rPr>
                 <w:sz w:val="21"/>
               </w:rPr>
-              <w:t>Performance 100; Accessibility 100; Best Practices 96</w:t>
+              <w:t>Performance 99; Accessibility 100; Best Practices 96</w:t>
             </w:r>
           </w:p>
         </w:tc>
@@ -13024,14 +13024,14 @@
     </w:p>
     <w:p>
       <w:r>
-        <w:t>Bảng 12 trả lời ở mức tổng hợp, còn các mục sau diễn giải ý nghĩa. Việc tất cả gate đạt không đồng nghĩa hệ thống hoàn thiện tuyệt đối. Kết luận chỉ có giá trị tại commit 14cd9a3, workflow 37140913623 và 37140920740, với phạm vi test đã nêu.</w:t>
+        <w:t>Bảng 12 trả lời ở mức tổng hợp, còn các mục sau diễn giải ý nghĩa. Việc tất cả gate đạt không đồng nghĩa hệ thống hoàn thiện tuyệt đối. Kết luận chỉ có giá trị tại commit 73f1ed4, workflow 37175430222 và 37175436810, với phạm vi test đã nêu.</w:t>
       </w:r>
     </w:p>
     <w:p>
       <w:pPr>
         <w:pStyle w:val="u2"/>
       </w:pPr>
-      <w:bookmarkStart w:id="33" w:name="_Toc242002794"/>
+      <w:bookmarkStart w:id="33" w:name="_Toc242004439"/>
       <w:r>
         <w:t>5.2. Unit, BVA và property-based testing</w:t>
       </w:r>
@@ -13057,7 +13057,7 @@
       <w:pPr>
         <w:pStyle w:val="u2"/>
       </w:pPr>
-      <w:bookmarkStart w:id="34" w:name="_Toc242002795"/>
+      <w:bookmarkStart w:id="34" w:name="_Toc242004440"/>
       <w:r>
         <w:t>5.3. API, database và transaction</w:t>
       </w:r>
@@ -13077,7 +13077,7 @@
       <w:pPr>
         <w:pStyle w:val="u2"/>
       </w:pPr>
-      <w:bookmarkStart w:id="35" w:name="_Toc242002796"/>
+      <w:bookmarkStart w:id="35" w:name="_Toc242004441"/>
       <w:r>
         <w:t>5.4. E2E, responsive và accessibility</w:t>
       </w:r>
@@ -13103,7 +13103,7 @@
         </w:rPr>
         <w:lastRenderedPageBreak/>
         <w:drawing>
-          <wp:inline distT="0" distB="0" distL="0" distR="0" wp14:anchorId="36A6F09E" wp14:editId="3D69B73D">
+          <wp:inline distT="0" distB="0" distL="0" distR="0" wp14:anchorId="1C712FD7" wp14:editId="3D451B21">
             <wp:extent cx="5029200" cy="4306252"/>
             <wp:effectExtent l="0" t="0" r="0" b="0"/>
             <wp:docPr id="4" name="Picture 4"/>
@@ -13164,7 +13164,7 @@
         </w:rPr>
         <w:lastRenderedPageBreak/>
         <w:drawing>
-          <wp:inline distT="0" distB="0" distL="0" distR="0" wp14:anchorId="1BA770D6" wp14:editId="01A074C6">
+          <wp:inline distT="0" distB="0" distL="0" distR="0" wp14:anchorId="1F2E9A88" wp14:editId="59EB0934">
             <wp:extent cx="5029200" cy="5930265"/>
             <wp:effectExtent l="0" t="0" r="0" b="0"/>
             <wp:docPr id="5" name="Picture 5"/>
@@ -13219,7 +13219,7 @@
       <w:pPr>
         <w:pStyle w:val="u2"/>
       </w:pPr>
-      <w:bookmarkStart w:id="36" w:name="_Toc242002797"/>
+      <w:bookmarkStart w:id="36" w:name="_Toc242004442"/>
       <w:r>
         <w:t>5.5. Coverage và mutation</w:t>
       </w:r>
@@ -13245,7 +13245,7 @@
         </w:rPr>
         <w:lastRenderedPageBreak/>
         <w:drawing>
-          <wp:inline distT="0" distB="0" distL="0" distR="0" wp14:anchorId="03AC77CC" wp14:editId="0A7C7281">
+          <wp:inline distT="0" distB="0" distL="0" distR="0" wp14:anchorId="28CCF9C4" wp14:editId="5A96A0EE">
             <wp:extent cx="5669280" cy="1653540"/>
             <wp:effectExtent l="0" t="0" r="0" b="0"/>
             <wp:docPr id="6" name="Picture 6"/>
@@ -13315,7 +13315,7 @@
           <w:noProof/>
         </w:rPr>
         <w:drawing>
-          <wp:inline distT="0" distB="0" distL="0" distR="0" wp14:anchorId="63416FF9" wp14:editId="60718B5D">
+          <wp:inline distT="0" distB="0" distL="0" distR="0" wp14:anchorId="5FA8A44C" wp14:editId="63B3EFA5">
             <wp:extent cx="5669280" cy="2440940"/>
             <wp:effectExtent l="0" t="0" r="0" b="0"/>
             <wp:docPr id="7" name="Picture 7"/>
@@ -13744,7 +13744,7 @@
       <w:pPr>
         <w:pStyle w:val="u2"/>
       </w:pPr>
-      <w:bookmarkStart w:id="37" w:name="_Toc242002798"/>
+      <w:bookmarkStart w:id="37" w:name="_Toc242004443"/>
       <w:r>
         <w:t>5.6. Hi</w:t>
       </w:r>
@@ -13758,7 +13758,7 @@
     </w:p>
     <w:p>
       <w:r>
-        <w:t>Kịch bản availability dùng 20 virtual users trong 2 phút, tạo 2.400 request. checksRate đạt 100%, request failure 0% và p95 4,63 ms, thấp hơn ngưỡng 500 ms. Kịch bản race tạo 20 request cạnh tranh đến cùng room-date-slot; raw summary ghi đúng một 201 và mười chín 409, p95 41,19 ms. Tổng requests trong summary là 22 vì gồm các request chuẩn bị/đăng nhập ngoài nhóm cạnh tranh.</w:t>
+        <w:t>Kịch bản availability dùng 20 virtual users trong 2 phút, tạo 2.400 request. checksRate đạt 100%, request failure 0% và p95 5,65 ms, thấp hơn ngưỡng 500 ms. Kịch bản race tạo 20 request cạnh tranh đến cùng room-date-slot; raw summary ghi đúng một 201 và mười chín 409, p95 67,55 ms. Tổng requests trong summary là 22 vì gồm các request chuẩn bị/đăng nhập ngoài nhóm cạnh tranh.</w:t>
       </w:r>
     </w:p>
     <w:p>
@@ -13775,7 +13775,7 @@
       <w:pPr>
         <w:pStyle w:val="u2"/>
       </w:pPr>
-      <w:bookmarkStart w:id="38" w:name="_Toc242002799"/>
+      <w:bookmarkStart w:id="38" w:name="_Toc242004444"/>
       <w:r>
         <w:t>5.7. Security testing</w:t>
       </w:r>
@@ -13788,7 +13788,7 @@
     </w:p>
     <w:p>
       <w:r>
-        <w:t xml:space="preserve">ZAP baseline frontend ghi 0 High, 0 Medium, 9 Low và 7 Informational; API ghi 0 High, 0 Medium, 0 Low và 3 Informational. Chín Low frontend liên quan </w:t>
+        <w:t xml:space="preserve">ZAP baseline frontend ghi 0 High, 0 Medium, 9 Low và 5 Informational; API ghi 0 High, 0 Medium, 0 Low và 4 Informational. Chín Low frontend liên quan </w:t>
       </w:r>
       <w:r>
         <w:lastRenderedPageBreak/>
@@ -14230,7 +14230,7 @@
       <w:pPr>
         <w:pStyle w:val="u2"/>
       </w:pPr>
-      <w:bookmarkStart w:id="39" w:name="_Toc242002800"/>
+      <w:bookmarkStart w:id="39" w:name="_Toc242004445"/>
       <w:r>
         <w:t>5.8. Lighthouse, axe và tr</w:t>
       </w:r>
@@ -14250,7 +14250,7 @@
     </w:p>
     <w:p>
       <w:r>
-        <w:t>Lighthouse trên production preview đạt Performance 100, Accessibility 100 và Best Practices 96, vượt ngưỡng 80/90/90. axe không phát hiện vi phạm serious trong các trang login, student portal và admin console thuộc scenario đã chạy. Các kết quả này cho thấy cấu trúc và cấu hình tự động ở mức tốt trong URL/viewport thử nghiệm.</w:t>
+        <w:t>Lighthouse trên production preview đạt Performance 99, Accessibility 100 và Best Practices 96, vượt ngưỡng 80/90/90. axe không phát hiện vi phạm serious trong các trang login, student portal và admin console thuộc scenario đã chạy. Các kết quả này cho thấy cấu trúc và cấu hình tự động ở mức tốt trong URL/viewport thử nghiệm.</w:t>
       </w:r>
     </w:p>
     <w:p>
@@ -14262,7 +14262,7 @@
       <w:pPr>
         <w:pStyle w:val="u2"/>
       </w:pPr>
-      <w:bookmarkStart w:id="40" w:name="_Toc242002801"/>
+      <w:bookmarkStart w:id="40" w:name="_Toc242004446"/>
       <w:r>
         <w:t>5.9. Tính tái l</w:t>
       </w:r>
@@ -14294,7 +14294,7 @@
     </w:p>
     <w:p>
       <w:r>
-        <w:t>Core workflow URL là https://github.com/bachiep/studyspace-quality-assurance/actions/runs/37140913623; quality-evidence là https://github.com/bachiep/studyspace-quality-assurance/actions/runs/37140920740. Manifest verifiedAt 2026-10-03T17:37:40Z ghi phiên bản công cụ, threshold, đường dẫn artifact và SHA-256 của tám file cốt lõi. Các file report sinh tự động không được đưa toàn bộ vào Git để tránh phình repository.</w:t>
+        <w:t>Core workflow URL là https://github.com/bachiep/studyspace-quality-assurance/actions/runs/37175430222; quality-evidence là https://github.com/bachiep/studyspace-quality-assurance/actions/runs/37175436810. Manifest verifiedAt 2026-10-04T03:59:48Z ghi phiên bản công cụ, threshold, đường dẫn artifact và SHA-256 của tám file cốt lõi. Các file report sinh tự động không được đưa toàn bộ vào Git để tránh phình repository.</w:t>
       </w:r>
     </w:p>
     <w:p>
@@ -14307,7 +14307,7 @@
       <w:pPr>
         <w:pStyle w:val="u1"/>
       </w:pPr>
-      <w:bookmarkStart w:id="41" w:name="_Toc242002802"/>
+      <w:bookmarkStart w:id="41" w:name="_Toc242004447"/>
       <w:r>
         <w:lastRenderedPageBreak/>
         <w:t>CHƯƠNG 6. DEFECT, RETEST VÀ ĐÁNH GIÁ CH</w:t>
@@ -14330,7 +14330,7 @@
       <w:pPr>
         <w:pStyle w:val="u2"/>
       </w:pPr>
-      <w:bookmarkStart w:id="42" w:name="_Toc242002803"/>
+      <w:bookmarkStart w:id="42" w:name="_Toc242004448"/>
       <w:r>
         <w:t>6.1. Defect lifecycle</w:t>
       </w:r>
@@ -15068,7 +15068,7 @@
       <w:pPr>
         <w:pStyle w:val="u2"/>
       </w:pPr>
-      <w:bookmarkStart w:id="43" w:name="_Toc242002804"/>
+      <w:bookmarkStart w:id="43" w:name="_Toc242004449"/>
       <w:r>
         <w:t>6.2. Phân tích ba defect có tác đ</w:t>
       </w:r>
@@ -15106,7 +15106,7 @@
       <w:pPr>
         <w:pStyle w:val="u2"/>
       </w:pPr>
-      <w:bookmarkStart w:id="44" w:name="_Toc242002805"/>
+      <w:bookmarkStart w:id="44" w:name="_Toc242004450"/>
       <w:r>
         <w:t>6.3. Tr</w:t>
       </w:r>
@@ -15154,7 +15154,7 @@
       <w:pPr>
         <w:pStyle w:val="u2"/>
       </w:pPr>
-      <w:bookmarkStart w:id="45" w:name="_Toc242002806"/>
+      <w:bookmarkStart w:id="45" w:name="_Toc242004451"/>
       <w:r>
         <w:lastRenderedPageBreak/>
         <w:t>6.4. Đánh giá theo ISO/IEC 25010:2023</w:t>
@@ -15859,7 +15859,7 @@
       <w:pPr>
         <w:pStyle w:val="u2"/>
       </w:pPr>
-      <w:bookmarkStart w:id="46" w:name="_Toc242002807"/>
+      <w:bookmarkStart w:id="46" w:name="_Toc242004452"/>
       <w:r>
         <w:t>6.5. Gi</w:t>
       </w:r>
@@ -16347,7 +16347,7 @@
       <w:pPr>
         <w:pStyle w:val="u1"/>
       </w:pPr>
-      <w:bookmarkStart w:id="47" w:name="_Toc242002808"/>
+      <w:bookmarkStart w:id="47" w:name="_Toc242004453"/>
       <w:r>
         <w:lastRenderedPageBreak/>
         <w:t>CHƯƠNG 7. K</w:t>
@@ -16379,7 +16379,7 @@
       <w:pPr>
         <w:pStyle w:val="u2"/>
       </w:pPr>
-      <w:bookmarkStart w:id="48" w:name="_Toc242002809"/>
+      <w:bookmarkStart w:id="48" w:name="_Toc242004454"/>
       <w:r>
         <w:t>7.1. K</w:t>
       </w:r>
@@ -16423,7 +16423,7 @@
       <w:pPr>
         <w:pStyle w:val="u2"/>
       </w:pPr>
-      <w:bookmarkStart w:id="49" w:name="_Toc242002810"/>
+      <w:bookmarkStart w:id="49" w:name="_Toc242004455"/>
       <w:r>
         <w:t>7.2. H</w:t>
       </w:r>
@@ -16447,7 +16447,7 @@
       <w:pPr>
         <w:pStyle w:val="u2"/>
       </w:pPr>
-      <w:bookmarkStart w:id="50" w:name="_Toc242002811"/>
+      <w:bookmarkStart w:id="50" w:name="_Toc242004456"/>
       <w:r>
         <w:t>7.3. Hư</w:t>
       </w:r>
@@ -16485,7 +16485,7 @@
       <w:pPr>
         <w:pStyle w:val="u1"/>
       </w:pPr>
-      <w:bookmarkStart w:id="51" w:name="_Toc242002812"/>
+      <w:bookmarkStart w:id="51" w:name="_Toc242004457"/>
       <w:r>
         <w:lastRenderedPageBreak/>
         <w:t>TÀI LI</w:t>
@@ -16596,7 +16596,7 @@
       <w:pPr>
         <w:pStyle w:val="u1"/>
       </w:pPr>
-      <w:bookmarkStart w:id="52" w:name="_Toc242002813"/>
+      <w:bookmarkStart w:id="52" w:name="_Toc242004458"/>
       <w:r>
         <w:lastRenderedPageBreak/>
         <w:t>PH</w:t>
@@ -17624,7 +17624,7 @@
       <w:pPr>
         <w:pStyle w:val="u1"/>
       </w:pPr>
-      <w:bookmarkStart w:id="53" w:name="_Toc242002814"/>
+      <w:bookmarkStart w:id="53" w:name="_Toc242004459"/>
       <w:r>
         <w:lastRenderedPageBreak/>
         <w:t>PH</w:t>
@@ -18297,7 +18297,7 @@
       <w:pPr>
         <w:pStyle w:val="u1"/>
       </w:pPr>
-      <w:bookmarkStart w:id="54" w:name="_Toc242002815"/>
+      <w:bookmarkStart w:id="54" w:name="_Toc242004460"/>
       <w:r>
         <w:lastRenderedPageBreak/>
         <w:t>PH</w:t>
@@ -19027,7 +19027,7 @@
       <w:pPr>
         <w:pStyle w:val="u2"/>
       </w:pPr>
-      <w:bookmarkStart w:id="55" w:name="_Toc242002816"/>
+      <w:bookmarkStart w:id="55" w:name="_Toc242004461"/>
       <w:r>
         <w:t>PH</w:t>
       </w:r>
@@ -19335,31 +19335,31 @@
       </w:rPr>
     </w:lvl>
   </w:abstractNum>
-  <w:num w:numId="1" w16cid:durableId="321085026">
+  <w:num w:numId="1" w16cid:durableId="1158619392">
     <w:abstractNumId w:val="8"/>
   </w:num>
-  <w:num w:numId="2" w16cid:durableId="1239754258">
+  <w:num w:numId="2" w16cid:durableId="347754366">
     <w:abstractNumId w:val="6"/>
   </w:num>
-  <w:num w:numId="3" w16cid:durableId="286356868">
+  <w:num w:numId="3" w16cid:durableId="1929994375">
     <w:abstractNumId w:val="5"/>
   </w:num>
-  <w:num w:numId="4" w16cid:durableId="2138638829">
+  <w:num w:numId="4" w16cid:durableId="438795498">
     <w:abstractNumId w:val="4"/>
   </w:num>
-  <w:num w:numId="5" w16cid:durableId="1251154959">
+  <w:num w:numId="5" w16cid:durableId="1244876631">
     <w:abstractNumId w:val="7"/>
   </w:num>
-  <w:num w:numId="6" w16cid:durableId="820847281">
+  <w:num w:numId="6" w16cid:durableId="39943154">
     <w:abstractNumId w:val="3"/>
   </w:num>
-  <w:num w:numId="7" w16cid:durableId="49961945">
+  <w:num w:numId="7" w16cid:durableId="1858691064">
     <w:abstractNumId w:val="2"/>
   </w:num>
-  <w:num w:numId="8" w16cid:durableId="2117403360">
+  <w:num w:numId="8" w16cid:durableId="1201436536">
     <w:abstractNumId w:val="1"/>
   </w:num>
-  <w:num w:numId="9" w16cid:durableId="979530959">
+  <w:num w:numId="9" w16cid:durableId="277296212">
     <w:abstractNumId w:val="0"/>
   </w:num>
 </w:numbering>
@@ -30754,7 +30754,7 @@
     <w:autoRedefine/>
     <w:uiPriority w:val="39"/>
     <w:unhideWhenUsed/>
-    <w:rsid w:val="00800DEC"/>
+    <w:rsid w:val="008267B1"/>
     <w:pPr>
       <w:spacing w:after="100"/>
     </w:pPr>
@@ -30766,7 +30766,7 @@
     <w:autoRedefine/>
     <w:uiPriority w:val="39"/>
     <w:unhideWhenUsed/>
-    <w:rsid w:val="00800DEC"/>
+    <w:rsid w:val="008267B1"/>
     <w:pPr>
       <w:spacing w:after="100"/>
       <w:ind w:left="260"/>
@@ -30779,7 +30779,7 @@
     <w:autoRedefine/>
     <w:uiPriority w:val="39"/>
     <w:unhideWhenUsed/>
-    <w:rsid w:val="00800DEC"/>
+    <w:rsid w:val="008267B1"/>
     <w:pPr>
       <w:spacing w:after="100"/>
       <w:ind w:left="520"/>
@@ -30790,7 +30790,7 @@
     <w:basedOn w:val="Phngmcinhcuaoanvn"/>
     <w:uiPriority w:val="99"/>
     <w:unhideWhenUsed/>
-    <w:rsid w:val="00800DEC"/>
+    <w:rsid w:val="008267B1"/>
     <w:rPr>
       <w:color w:val="0000FF" w:themeColor="hyperlink"/>
       <w:u w:val="single"/>

</xml_diff>

<commit_message>
docs: refresh student report layout and conclusions
</commit_message>
<xml_diff>
--- a/output/docx/StudySpace-BaoCao-DanhGia-KiemDinh.docx
+++ b/output/docx/StudySpace-BaoCao-DanhGia-KiemDinh.docx
@@ -166,7 +166,7 @@
       <w:pPr>
         <w:pStyle w:val="u1"/>
       </w:pPr>
-      <w:bookmarkStart w:id="0" w:name="_Toc242004406"/>
+      <w:bookmarkStart w:id="0" w:name="_Toc242127606"/>
       <w:r>
         <w:lastRenderedPageBreak/>
         <w:t>L</w:t>
@@ -199,7 +199,7 @@
       <w:pPr>
         <w:pStyle w:val="u1"/>
       </w:pPr>
-      <w:bookmarkStart w:id="1" w:name="_Toc242004407"/>
+      <w:bookmarkStart w:id="1" w:name="_Toc242127607"/>
       <w:r>
         <w:lastRenderedPageBreak/>
         <w:t>TÓM T</w:t>
@@ -250,7 +250,7 @@
       <w:pPr>
         <w:pStyle w:val="u1"/>
       </w:pPr>
-      <w:bookmarkStart w:id="2" w:name="_Toc242004408"/>
+      <w:bookmarkStart w:id="2" w:name="_Toc242127608"/>
       <w:r>
         <w:lastRenderedPageBreak/>
         <w:t>M</w:t>
@@ -295,7 +295,7 @@
       <w:r>
         <w:fldChar w:fldCharType="separate"/>
       </w:r>
-      <w:hyperlink w:anchor="_Toc242004406" w:history="1">
+      <w:hyperlink w:anchor="_Toc242127606" w:history="1">
         <w:r>
           <w:rPr>
             <w:rStyle w:val="Siuktni"/>
@@ -322,7 +322,7 @@
             <w:noProof/>
             <w:webHidden/>
           </w:rPr>
-          <w:instrText xml:space="preserve"> PAGEREF _Toc242004406 \h </w:instrText>
+          <w:instrText xml:space="preserve"> PAGEREF _Toc242127606 \h </w:instrText>
         </w:r>
         <w:r>
           <w:rPr>
@@ -370,7 +370,7 @@
           <w14:ligatures w14:val="standardContextual"/>
         </w:rPr>
       </w:pPr>
-      <w:hyperlink w:anchor="_Toc242004407" w:history="1">
+      <w:hyperlink w:anchor="_Toc242127607" w:history="1">
         <w:r>
           <w:rPr>
             <w:rStyle w:val="Siuktni"/>
@@ -397,7 +397,7 @@
             <w:noProof/>
             <w:webHidden/>
           </w:rPr>
-          <w:instrText xml:space="preserve"> PAGEREF _Toc242004407 \h </w:instrText>
+          <w:instrText xml:space="preserve"> PAGEREF _Toc242127607 \h </w:instrText>
         </w:r>
         <w:r>
           <w:rPr>
@@ -445,7 +445,7 @@
           <w14:ligatures w14:val="standardContextual"/>
         </w:rPr>
       </w:pPr>
-      <w:hyperlink w:anchor="_Toc242004408" w:history="1">
+      <w:hyperlink w:anchor="_Toc242127608" w:history="1">
         <w:r>
           <w:rPr>
             <w:rStyle w:val="Siuktni"/>
@@ -472,7 +472,7 @@
             <w:noProof/>
             <w:webHidden/>
           </w:rPr>
-          <w:instrText xml:space="preserve"> PAGEREF _Toc242004408 \h </w:instrText>
+          <w:instrText xml:space="preserve"> PAGEREF _Toc242127608 \h </w:instrText>
         </w:r>
         <w:r>
           <w:rPr>
@@ -520,7 +520,7 @@
           <w14:ligatures w14:val="standardContextual"/>
         </w:rPr>
       </w:pPr>
-      <w:hyperlink w:anchor="_Toc242004409" w:history="1">
+      <w:hyperlink w:anchor="_Toc242127609" w:history="1">
         <w:r>
           <w:rPr>
             <w:rStyle w:val="Siuktni"/>
@@ -547,7 +547,7 @@
             <w:noProof/>
             <w:webHidden/>
           </w:rPr>
-          <w:instrText xml:space="preserve"> PAGEREF _Toc242004409 \h </w:instrText>
+          <w:instrText xml:space="preserve"> PAGEREF _Toc242127609 \h </w:instrText>
         </w:r>
         <w:r>
           <w:rPr>
@@ -595,7 +595,7 @@
           <w14:ligatures w14:val="standardContextual"/>
         </w:rPr>
       </w:pPr>
-      <w:hyperlink w:anchor="_Toc242004410" w:history="1">
+      <w:hyperlink w:anchor="_Toc242127610" w:history="1">
         <w:r>
           <w:rPr>
             <w:rStyle w:val="Siuktni"/>
@@ -622,7 +622,7 @@
             <w:noProof/>
             <w:webHidden/>
           </w:rPr>
-          <w:instrText xml:space="preserve"> PAGEREF _Toc242004410 \h </w:instrText>
+          <w:instrText xml:space="preserve"> PAGEREF _Toc242127610 \h </w:instrText>
         </w:r>
         <w:r>
           <w:rPr>
@@ -670,7 +670,7 @@
           <w14:ligatures w14:val="standardContextual"/>
         </w:rPr>
       </w:pPr>
-      <w:hyperlink w:anchor="_Toc242004411" w:history="1">
+      <w:hyperlink w:anchor="_Toc242127611" w:history="1">
         <w:r>
           <w:rPr>
             <w:rStyle w:val="Siuktni"/>
@@ -697,7 +697,7 @@
             <w:noProof/>
             <w:webHidden/>
           </w:rPr>
-          <w:instrText xml:space="preserve"> PAGEREF _Toc242004411 \h </w:instrText>
+          <w:instrText xml:space="preserve"> PAGEREF _Toc242127611 \h </w:instrText>
         </w:r>
         <w:r>
           <w:rPr>
@@ -745,7 +745,7 @@
           <w14:ligatures w14:val="standardContextual"/>
         </w:rPr>
       </w:pPr>
-      <w:hyperlink w:anchor="_Toc242004412" w:history="1">
+      <w:hyperlink w:anchor="_Toc242127612" w:history="1">
         <w:r>
           <w:rPr>
             <w:rStyle w:val="Siuktni"/>
@@ -772,7 +772,7 @@
             <w:noProof/>
             <w:webHidden/>
           </w:rPr>
-          <w:instrText xml:space="preserve"> PAGEREF _Toc242004412 \h </w:instrText>
+          <w:instrText xml:space="preserve"> PAGEREF _Toc242127612 \h </w:instrText>
         </w:r>
         <w:r>
           <w:rPr>
@@ -820,7 +820,7 @@
           <w14:ligatures w14:val="standardContextual"/>
         </w:rPr>
       </w:pPr>
-      <w:hyperlink w:anchor="_Toc242004413" w:history="1">
+      <w:hyperlink w:anchor="_Toc242127613" w:history="1">
         <w:r>
           <w:rPr>
             <w:rStyle w:val="Siuktni"/>
@@ -847,7 +847,7 @@
             <w:noProof/>
             <w:webHidden/>
           </w:rPr>
-          <w:instrText xml:space="preserve"> PAGEREF _Toc242004413 \h </w:instrText>
+          <w:instrText xml:space="preserve"> PAGEREF _Toc242127613 \h </w:instrText>
         </w:r>
         <w:r>
           <w:rPr>
@@ -895,7 +895,7 @@
           <w14:ligatures w14:val="standardContextual"/>
         </w:rPr>
       </w:pPr>
-      <w:hyperlink w:anchor="_Toc242004414" w:history="1">
+      <w:hyperlink w:anchor="_Toc242127614" w:history="1">
         <w:r>
           <w:rPr>
             <w:rStyle w:val="Siuktni"/>
@@ -922,7 +922,7 @@
             <w:noProof/>
             <w:webHidden/>
           </w:rPr>
-          <w:instrText xml:space="preserve"> PAGEREF _Toc242004414 \h </w:instrText>
+          <w:instrText xml:space="preserve"> PAGEREF _Toc242127614 \h </w:instrText>
         </w:r>
         <w:r>
           <w:rPr>
@@ -970,7 +970,7 @@
           <w14:ligatures w14:val="standardContextual"/>
         </w:rPr>
       </w:pPr>
-      <w:hyperlink w:anchor="_Toc242004415" w:history="1">
+      <w:hyperlink w:anchor="_Toc242127615" w:history="1">
         <w:r>
           <w:rPr>
             <w:rStyle w:val="Siuktni"/>
@@ -997,7 +997,7 @@
             <w:noProof/>
             <w:webHidden/>
           </w:rPr>
-          <w:instrText xml:space="preserve"> PAGEREF _Toc242004415 \h </w:instrText>
+          <w:instrText xml:space="preserve"> PAGEREF _Toc242127615 \h </w:instrText>
         </w:r>
         <w:r>
           <w:rPr>
@@ -1045,7 +1045,7 @@
           <w14:ligatures w14:val="standardContextual"/>
         </w:rPr>
       </w:pPr>
-      <w:hyperlink w:anchor="_Toc242004416" w:history="1">
+      <w:hyperlink w:anchor="_Toc242127616" w:history="1">
         <w:r>
           <w:rPr>
             <w:rStyle w:val="Siuktni"/>
@@ -1072,7 +1072,7 @@
             <w:noProof/>
             <w:webHidden/>
           </w:rPr>
-          <w:instrText xml:space="preserve"> PAGEREF _Toc242004416 \h </w:instrText>
+          <w:instrText xml:space="preserve"> PAGEREF _Toc242127616 \h </w:instrText>
         </w:r>
         <w:r>
           <w:rPr>
@@ -1120,7 +1120,7 @@
           <w14:ligatures w14:val="standardContextual"/>
         </w:rPr>
       </w:pPr>
-      <w:hyperlink w:anchor="_Toc242004417" w:history="1">
+      <w:hyperlink w:anchor="_Toc242127617" w:history="1">
         <w:r>
           <w:rPr>
             <w:rStyle w:val="Siuktni"/>
@@ -1147,7 +1147,7 @@
             <w:noProof/>
             <w:webHidden/>
           </w:rPr>
-          <w:instrText xml:space="preserve"> PAGEREF _Toc242004417 \h </w:instrText>
+          <w:instrText xml:space="preserve"> PAGEREF _Toc242127617 \h </w:instrText>
         </w:r>
         <w:r>
           <w:rPr>
@@ -1195,7 +1195,7 @@
           <w14:ligatures w14:val="standardContextual"/>
         </w:rPr>
       </w:pPr>
-      <w:hyperlink w:anchor="_Toc242004418" w:history="1">
+      <w:hyperlink w:anchor="_Toc242127618" w:history="1">
         <w:r>
           <w:rPr>
             <w:rStyle w:val="Siuktni"/>
@@ -1222,7 +1222,7 @@
             <w:noProof/>
             <w:webHidden/>
           </w:rPr>
-          <w:instrText xml:space="preserve"> PAGEREF _Toc242004418 \h </w:instrText>
+          <w:instrText xml:space="preserve"> PAGEREF _Toc242127618 \h </w:instrText>
         </w:r>
         <w:r>
           <w:rPr>
@@ -1270,7 +1270,7 @@
           <w14:ligatures w14:val="standardContextual"/>
         </w:rPr>
       </w:pPr>
-      <w:hyperlink w:anchor="_Toc242004419" w:history="1">
+      <w:hyperlink w:anchor="_Toc242127619" w:history="1">
         <w:r>
           <w:rPr>
             <w:rStyle w:val="Siuktni"/>
@@ -1297,7 +1297,7 @@
             <w:noProof/>
             <w:webHidden/>
           </w:rPr>
-          <w:instrText xml:space="preserve"> PAGEREF _Toc242004419 \h </w:instrText>
+          <w:instrText xml:space="preserve"> PAGEREF _Toc242127619 \h </w:instrText>
         </w:r>
         <w:r>
           <w:rPr>
@@ -1345,7 +1345,7 @@
           <w14:ligatures w14:val="standardContextual"/>
         </w:rPr>
       </w:pPr>
-      <w:hyperlink w:anchor="_Toc242004420" w:history="1">
+      <w:hyperlink w:anchor="_Toc242127620" w:history="1">
         <w:r>
           <w:rPr>
             <w:rStyle w:val="Siuktni"/>
@@ -1372,7 +1372,7 @@
             <w:noProof/>
             <w:webHidden/>
           </w:rPr>
-          <w:instrText xml:space="preserve"> PAGEREF _Toc242004420 \h </w:instrText>
+          <w:instrText xml:space="preserve"> PAGEREF _Toc242127620 \h </w:instrText>
         </w:r>
         <w:r>
           <w:rPr>
@@ -1420,7 +1420,7 @@
           <w14:ligatures w14:val="standardContextual"/>
         </w:rPr>
       </w:pPr>
-      <w:hyperlink w:anchor="_Toc242004421" w:history="1">
+      <w:hyperlink w:anchor="_Toc242127621" w:history="1">
         <w:r>
           <w:rPr>
             <w:rStyle w:val="Siuktni"/>
@@ -1447,7 +1447,7 @@
             <w:noProof/>
             <w:webHidden/>
           </w:rPr>
-          <w:instrText xml:space="preserve"> PAGEREF _Toc242004421 \h </w:instrText>
+          <w:instrText xml:space="preserve"> PAGEREF _Toc242127621 \h </w:instrText>
         </w:r>
         <w:r>
           <w:rPr>
@@ -1495,7 +1495,7 @@
           <w14:ligatures w14:val="standardContextual"/>
         </w:rPr>
       </w:pPr>
-      <w:hyperlink w:anchor="_Toc242004422" w:history="1">
+      <w:hyperlink w:anchor="_Toc242127622" w:history="1">
         <w:r>
           <w:rPr>
             <w:rStyle w:val="Siuktni"/>
@@ -1522,7 +1522,7 @@
             <w:noProof/>
             <w:webHidden/>
           </w:rPr>
-          <w:instrText xml:space="preserve"> PAGEREF _Toc242004422 \h </w:instrText>
+          <w:instrText xml:space="preserve"> PAGEREF _Toc242127622 \h </w:instrText>
         </w:r>
         <w:r>
           <w:rPr>
@@ -1570,7 +1570,7 @@
           <w14:ligatures w14:val="standardContextual"/>
         </w:rPr>
       </w:pPr>
-      <w:hyperlink w:anchor="_Toc242004423" w:history="1">
+      <w:hyperlink w:anchor="_Toc242127623" w:history="1">
         <w:r>
           <w:rPr>
             <w:rStyle w:val="Siuktni"/>
@@ -1597,7 +1597,7 @@
             <w:noProof/>
             <w:webHidden/>
           </w:rPr>
-          <w:instrText xml:space="preserve"> PAGEREF _Toc242004423 \h </w:instrText>
+          <w:instrText xml:space="preserve"> PAGEREF _Toc242127623 \h </w:instrText>
         </w:r>
         <w:r>
           <w:rPr>
@@ -1645,7 +1645,7 @@
           <w14:ligatures w14:val="standardContextual"/>
         </w:rPr>
       </w:pPr>
-      <w:hyperlink w:anchor="_Toc242004424" w:history="1">
+      <w:hyperlink w:anchor="_Toc242127624" w:history="1">
         <w:r>
           <w:rPr>
             <w:rStyle w:val="Siuktni"/>
@@ -1672,7 +1672,7 @@
             <w:noProof/>
             <w:webHidden/>
           </w:rPr>
-          <w:instrText xml:space="preserve"> PAGEREF _Toc242004424 \h </w:instrText>
+          <w:instrText xml:space="preserve"> PAGEREF _Toc242127624 \h </w:instrText>
         </w:r>
         <w:r>
           <w:rPr>
@@ -1720,7 +1720,7 @@
           <w14:ligatures w14:val="standardContextual"/>
         </w:rPr>
       </w:pPr>
-      <w:hyperlink w:anchor="_Toc242004425" w:history="1">
+      <w:hyperlink w:anchor="_Toc242127625" w:history="1">
         <w:r>
           <w:rPr>
             <w:rStyle w:val="Siuktni"/>
@@ -1747,7 +1747,7 @@
             <w:noProof/>
             <w:webHidden/>
           </w:rPr>
-          <w:instrText xml:space="preserve"> PAGEREF _Toc242004425 \h </w:instrText>
+          <w:instrText xml:space="preserve"> PAGEREF _Toc242127625 \h </w:instrText>
         </w:r>
         <w:r>
           <w:rPr>
@@ -1795,7 +1795,7 @@
           <w14:ligatures w14:val="standardContextual"/>
         </w:rPr>
       </w:pPr>
-      <w:hyperlink w:anchor="_Toc242004426" w:history="1">
+      <w:hyperlink w:anchor="_Toc242127626" w:history="1">
         <w:r>
           <w:rPr>
             <w:rStyle w:val="Siuktni"/>
@@ -1822,7 +1822,7 @@
             <w:noProof/>
             <w:webHidden/>
           </w:rPr>
-          <w:instrText xml:space="preserve"> PAGEREF _Toc242004426 \h </w:instrText>
+          <w:instrText xml:space="preserve"> PAGEREF _Toc242127626 \h </w:instrText>
         </w:r>
         <w:r>
           <w:rPr>
@@ -1870,7 +1870,7 @@
           <w14:ligatures w14:val="standardContextual"/>
         </w:rPr>
       </w:pPr>
-      <w:hyperlink w:anchor="_Toc242004427" w:history="1">
+      <w:hyperlink w:anchor="_Toc242127627" w:history="1">
         <w:r>
           <w:rPr>
             <w:rStyle w:val="Siuktni"/>
@@ -1897,7 +1897,7 @@
             <w:noProof/>
             <w:webHidden/>
           </w:rPr>
-          <w:instrText xml:space="preserve"> PAGEREF _Toc242004427 \h </w:instrText>
+          <w:instrText xml:space="preserve"> PAGEREF _Toc242127627 \h </w:instrText>
         </w:r>
         <w:r>
           <w:rPr>
@@ -1945,7 +1945,7 @@
           <w14:ligatures w14:val="standardContextual"/>
         </w:rPr>
       </w:pPr>
-      <w:hyperlink w:anchor="_Toc242004428" w:history="1">
+      <w:hyperlink w:anchor="_Toc242127628" w:history="1">
         <w:r>
           <w:rPr>
             <w:rStyle w:val="Siuktni"/>
@@ -1972,7 +1972,7 @@
             <w:noProof/>
             <w:webHidden/>
           </w:rPr>
-          <w:instrText xml:space="preserve"> PAGEREF _Toc242004428 \h </w:instrText>
+          <w:instrText xml:space="preserve"> PAGEREF _Toc242127628 \h </w:instrText>
         </w:r>
         <w:r>
           <w:rPr>
@@ -2020,7 +2020,7 @@
           <w14:ligatures w14:val="standardContextual"/>
         </w:rPr>
       </w:pPr>
-      <w:hyperlink w:anchor="_Toc242004429" w:history="1">
+      <w:hyperlink w:anchor="_Toc242127629" w:history="1">
         <w:r>
           <w:rPr>
             <w:rStyle w:val="Siuktni"/>
@@ -2047,7 +2047,7 @@
             <w:noProof/>
             <w:webHidden/>
           </w:rPr>
-          <w:instrText xml:space="preserve"> PAGEREF _Toc242004429 \h </w:instrText>
+          <w:instrText xml:space="preserve"> PAGEREF _Toc242127629 \h </w:instrText>
         </w:r>
         <w:r>
           <w:rPr>
@@ -2095,7 +2095,7 @@
           <w14:ligatures w14:val="standardContextual"/>
         </w:rPr>
       </w:pPr>
-      <w:hyperlink w:anchor="_Toc242004430" w:history="1">
+      <w:hyperlink w:anchor="_Toc242127630" w:history="1">
         <w:r>
           <w:rPr>
             <w:rStyle w:val="Siuktni"/>
@@ -2122,7 +2122,7 @@
             <w:noProof/>
             <w:webHidden/>
           </w:rPr>
-          <w:instrText xml:space="preserve"> PAGEREF _Toc242004430 \h </w:instrText>
+          <w:instrText xml:space="preserve"> PAGEREF _Toc242127630 \h </w:instrText>
         </w:r>
         <w:r>
           <w:rPr>
@@ -2170,7 +2170,7 @@
           <w14:ligatures w14:val="standardContextual"/>
         </w:rPr>
       </w:pPr>
-      <w:hyperlink w:anchor="_Toc242004431" w:history="1">
+      <w:hyperlink w:anchor="_Toc242127631" w:history="1">
         <w:r>
           <w:rPr>
             <w:rStyle w:val="Siuktni"/>
@@ -2197,7 +2197,7 @@
             <w:noProof/>
             <w:webHidden/>
           </w:rPr>
-          <w:instrText xml:space="preserve"> PAGEREF _Toc242004431 \h </w:instrText>
+          <w:instrText xml:space="preserve"> PAGEREF _Toc242127631 \h </w:instrText>
         </w:r>
         <w:r>
           <w:rPr>
@@ -2245,7 +2245,7 @@
           <w14:ligatures w14:val="standardContextual"/>
         </w:rPr>
       </w:pPr>
-      <w:hyperlink w:anchor="_Toc242004432" w:history="1">
+      <w:hyperlink w:anchor="_Toc242127632" w:history="1">
         <w:r>
           <w:rPr>
             <w:rStyle w:val="Siuktni"/>
@@ -2272,7 +2272,7 @@
             <w:noProof/>
             <w:webHidden/>
           </w:rPr>
-          <w:instrText xml:space="preserve"> PAGEREF _Toc242004432 \h </w:instrText>
+          <w:instrText xml:space="preserve"> PAGEREF _Toc242127632 \h </w:instrText>
         </w:r>
         <w:r>
           <w:rPr>
@@ -2320,7 +2320,7 @@
           <w14:ligatures w14:val="standardContextual"/>
         </w:rPr>
       </w:pPr>
-      <w:hyperlink w:anchor="_Toc242004433" w:history="1">
+      <w:hyperlink w:anchor="_Toc242127633" w:history="1">
         <w:r>
           <w:rPr>
             <w:rStyle w:val="Siuktni"/>
@@ -2347,7 +2347,7 @@
             <w:noProof/>
             <w:webHidden/>
           </w:rPr>
-          <w:instrText xml:space="preserve"> PAGEREF _Toc242004433 \h </w:instrText>
+          <w:instrText xml:space="preserve"> PAGEREF _Toc242127633 \h </w:instrText>
         </w:r>
         <w:r>
           <w:rPr>
@@ -2395,7 +2395,7 @@
           <w14:ligatures w14:val="standardContextual"/>
         </w:rPr>
       </w:pPr>
-      <w:hyperlink w:anchor="_Toc242004434" w:history="1">
+      <w:hyperlink w:anchor="_Toc242127634" w:history="1">
         <w:r>
           <w:rPr>
             <w:rStyle w:val="Siuktni"/>
@@ -2422,7 +2422,7 @@
             <w:noProof/>
             <w:webHidden/>
           </w:rPr>
-          <w:instrText xml:space="preserve"> PAGEREF _Toc242004434 \h </w:instrText>
+          <w:instrText xml:space="preserve"> PAGEREF _Toc242127634 \h </w:instrText>
         </w:r>
         <w:r>
           <w:rPr>
@@ -2470,7 +2470,7 @@
           <w14:ligatures w14:val="standardContextual"/>
         </w:rPr>
       </w:pPr>
-      <w:hyperlink w:anchor="_Toc242004435" w:history="1">
+      <w:hyperlink w:anchor="_Toc242127635" w:history="1">
         <w:r>
           <w:rPr>
             <w:rStyle w:val="Siuktni"/>
@@ -2497,7 +2497,7 @@
             <w:noProof/>
             <w:webHidden/>
           </w:rPr>
-          <w:instrText xml:space="preserve"> PAGEREF _Toc242004435 \h </w:instrText>
+          <w:instrText xml:space="preserve"> PAGEREF _Toc242127635 \h </w:instrText>
         </w:r>
         <w:r>
           <w:rPr>
@@ -2545,7 +2545,7 @@
           <w14:ligatures w14:val="standardContextual"/>
         </w:rPr>
       </w:pPr>
-      <w:hyperlink w:anchor="_Toc242004436" w:history="1">
+      <w:hyperlink w:anchor="_Toc242127636" w:history="1">
         <w:r>
           <w:rPr>
             <w:rStyle w:val="Siuktni"/>
@@ -2572,7 +2572,7 @@
             <w:noProof/>
             <w:webHidden/>
           </w:rPr>
-          <w:instrText xml:space="preserve"> PAGEREF _Toc242004436 \h </w:instrText>
+          <w:instrText xml:space="preserve"> PAGEREF _Toc242127636 \h </w:instrText>
         </w:r>
         <w:r>
           <w:rPr>
@@ -2620,7 +2620,7 @@
           <w14:ligatures w14:val="standardContextual"/>
         </w:rPr>
       </w:pPr>
-      <w:hyperlink w:anchor="_Toc242004437" w:history="1">
+      <w:hyperlink w:anchor="_Toc242127637" w:history="1">
         <w:r>
           <w:rPr>
             <w:rStyle w:val="Siuktni"/>
@@ -2647,7 +2647,7 @@
             <w:noProof/>
             <w:webHidden/>
           </w:rPr>
-          <w:instrText xml:space="preserve"> PAGEREF _Toc242004437 \h </w:instrText>
+          <w:instrText xml:space="preserve"> PAGEREF _Toc242127637 \h </w:instrText>
         </w:r>
         <w:r>
           <w:rPr>
@@ -2695,7 +2695,7 @@
           <w14:ligatures w14:val="standardContextual"/>
         </w:rPr>
       </w:pPr>
-      <w:hyperlink w:anchor="_Toc242004438" w:history="1">
+      <w:hyperlink w:anchor="_Toc242127638" w:history="1">
         <w:r>
           <w:rPr>
             <w:rStyle w:val="Siuktni"/>
@@ -2722,7 +2722,7 @@
             <w:noProof/>
             <w:webHidden/>
           </w:rPr>
-          <w:instrText xml:space="preserve"> PAGEREF _Toc242004438 \h </w:instrText>
+          <w:instrText xml:space="preserve"> PAGEREF _Toc242127638 \h </w:instrText>
         </w:r>
         <w:r>
           <w:rPr>
@@ -2770,7 +2770,7 @@
           <w14:ligatures w14:val="standardContextual"/>
         </w:rPr>
       </w:pPr>
-      <w:hyperlink w:anchor="_Toc242004439" w:history="1">
+      <w:hyperlink w:anchor="_Toc242127639" w:history="1">
         <w:r>
           <w:rPr>
             <w:rStyle w:val="Siuktni"/>
@@ -2797,7 +2797,7 @@
             <w:noProof/>
             <w:webHidden/>
           </w:rPr>
-          <w:instrText xml:space="preserve"> PAGEREF _Toc242004439 \h </w:instrText>
+          <w:instrText xml:space="preserve"> PAGEREF _Toc242127639 \h </w:instrText>
         </w:r>
         <w:r>
           <w:rPr>
@@ -2845,7 +2845,7 @@
           <w14:ligatures w14:val="standardContextual"/>
         </w:rPr>
       </w:pPr>
-      <w:hyperlink w:anchor="_Toc242004440" w:history="1">
+      <w:hyperlink w:anchor="_Toc242127640" w:history="1">
         <w:r>
           <w:rPr>
             <w:rStyle w:val="Siuktni"/>
@@ -2872,7 +2872,7 @@
             <w:noProof/>
             <w:webHidden/>
           </w:rPr>
-          <w:instrText xml:space="preserve"> PAGEREF _Toc242004440 \h </w:instrText>
+          <w:instrText xml:space="preserve"> PAGEREF _Toc242127640 \h </w:instrText>
         </w:r>
         <w:r>
           <w:rPr>
@@ -2920,7 +2920,7 @@
           <w14:ligatures w14:val="standardContextual"/>
         </w:rPr>
       </w:pPr>
-      <w:hyperlink w:anchor="_Toc242004441" w:history="1">
+      <w:hyperlink w:anchor="_Toc242127641" w:history="1">
         <w:r>
           <w:rPr>
             <w:rStyle w:val="Siuktni"/>
@@ -2947,7 +2947,7 @@
             <w:noProof/>
             <w:webHidden/>
           </w:rPr>
-          <w:instrText xml:space="preserve"> PAGEREF _Toc242004441 \h </w:instrText>
+          <w:instrText xml:space="preserve"> PAGEREF _Toc242127641 \h </w:instrText>
         </w:r>
         <w:r>
           <w:rPr>
@@ -2995,7 +2995,7 @@
           <w14:ligatures w14:val="standardContextual"/>
         </w:rPr>
       </w:pPr>
-      <w:hyperlink w:anchor="_Toc242004442" w:history="1">
+      <w:hyperlink w:anchor="_Toc242127642" w:history="1">
         <w:r>
           <w:rPr>
             <w:rStyle w:val="Siuktni"/>
@@ -3022,7 +3022,7 @@
             <w:noProof/>
             <w:webHidden/>
           </w:rPr>
-          <w:instrText xml:space="preserve"> PAGEREF _Toc242004442 \h </w:instrText>
+          <w:instrText xml:space="preserve"> PAGEREF _Toc242127642 \h </w:instrText>
         </w:r>
         <w:r>
           <w:rPr>
@@ -3070,7 +3070,7 @@
           <w14:ligatures w14:val="standardContextual"/>
         </w:rPr>
       </w:pPr>
-      <w:hyperlink w:anchor="_Toc242004443" w:history="1">
+      <w:hyperlink w:anchor="_Toc242127643" w:history="1">
         <w:r>
           <w:rPr>
             <w:rStyle w:val="Siuktni"/>
@@ -3097,7 +3097,7 @@
             <w:noProof/>
             <w:webHidden/>
           </w:rPr>
-          <w:instrText xml:space="preserve"> PAGEREF _Toc242004443 \h </w:instrText>
+          <w:instrText xml:space="preserve"> PAGEREF _Toc242127643 \h </w:instrText>
         </w:r>
         <w:r>
           <w:rPr>
@@ -3145,7 +3145,7 @@
           <w14:ligatures w14:val="standardContextual"/>
         </w:rPr>
       </w:pPr>
-      <w:hyperlink w:anchor="_Toc242004444" w:history="1">
+      <w:hyperlink w:anchor="_Toc242127644" w:history="1">
         <w:r>
           <w:rPr>
             <w:rStyle w:val="Siuktni"/>
@@ -3172,7 +3172,7 @@
             <w:noProof/>
             <w:webHidden/>
           </w:rPr>
-          <w:instrText xml:space="preserve"> PAGEREF _Toc242004444 \h </w:instrText>
+          <w:instrText xml:space="preserve"> PAGEREF _Toc242127644 \h </w:instrText>
         </w:r>
         <w:r>
           <w:rPr>
@@ -3220,7 +3220,7 @@
           <w14:ligatures w14:val="standardContextual"/>
         </w:rPr>
       </w:pPr>
-      <w:hyperlink w:anchor="_Toc242004445" w:history="1">
+      <w:hyperlink w:anchor="_Toc242127645" w:history="1">
         <w:r>
           <w:rPr>
             <w:rStyle w:val="Siuktni"/>
@@ -3247,7 +3247,7 @@
             <w:noProof/>
             <w:webHidden/>
           </w:rPr>
-          <w:instrText xml:space="preserve"> PAGEREF _Toc242004445 \h </w:instrText>
+          <w:instrText xml:space="preserve"> PAGEREF _Toc242127645 \h </w:instrText>
         </w:r>
         <w:r>
           <w:rPr>
@@ -3295,7 +3295,7 @@
           <w14:ligatures w14:val="standardContextual"/>
         </w:rPr>
       </w:pPr>
-      <w:hyperlink w:anchor="_Toc242004446" w:history="1">
+      <w:hyperlink w:anchor="_Toc242127646" w:history="1">
         <w:r>
           <w:rPr>
             <w:rStyle w:val="Siuktni"/>
@@ -3322,7 +3322,7 @@
             <w:noProof/>
             <w:webHidden/>
           </w:rPr>
-          <w:instrText xml:space="preserve"> PAGEREF _Toc242004446 \h </w:instrText>
+          <w:instrText xml:space="preserve"> PAGEREF _Toc242127646 \h </w:instrText>
         </w:r>
         <w:r>
           <w:rPr>
@@ -3370,7 +3370,7 @@
           <w14:ligatures w14:val="standardContextual"/>
         </w:rPr>
       </w:pPr>
-      <w:hyperlink w:anchor="_Toc242004447" w:history="1">
+      <w:hyperlink w:anchor="_Toc242127647" w:history="1">
         <w:r>
           <w:rPr>
             <w:rStyle w:val="Siuktni"/>
@@ -3397,7 +3397,7 @@
             <w:noProof/>
             <w:webHidden/>
           </w:rPr>
-          <w:instrText xml:space="preserve"> PAGEREF _Toc242004447 \h </w:instrText>
+          <w:instrText xml:space="preserve"> PAGEREF _Toc242127647 \h </w:instrText>
         </w:r>
         <w:r>
           <w:rPr>
@@ -3445,7 +3445,7 @@
           <w14:ligatures w14:val="standardContextual"/>
         </w:rPr>
       </w:pPr>
-      <w:hyperlink w:anchor="_Toc242004448" w:history="1">
+      <w:hyperlink w:anchor="_Toc242127648" w:history="1">
         <w:r>
           <w:rPr>
             <w:rStyle w:val="Siuktni"/>
@@ -3472,7 +3472,7 @@
             <w:noProof/>
             <w:webHidden/>
           </w:rPr>
-          <w:instrText xml:space="preserve"> PAGEREF _Toc242004448 \h </w:instrText>
+          <w:instrText xml:space="preserve"> PAGEREF _Toc242127648 \h </w:instrText>
         </w:r>
         <w:r>
           <w:rPr>
@@ -3520,7 +3520,7 @@
           <w14:ligatures w14:val="standardContextual"/>
         </w:rPr>
       </w:pPr>
-      <w:hyperlink w:anchor="_Toc242004449" w:history="1">
+      <w:hyperlink w:anchor="_Toc242127649" w:history="1">
         <w:r>
           <w:rPr>
             <w:rStyle w:val="Siuktni"/>
@@ -3547,7 +3547,7 @@
             <w:noProof/>
             <w:webHidden/>
           </w:rPr>
-          <w:instrText xml:space="preserve"> PAGEREF _Toc242004449 \h </w:instrText>
+          <w:instrText xml:space="preserve"> PAGEREF _Toc242127649 \h </w:instrText>
         </w:r>
         <w:r>
           <w:rPr>
@@ -3595,7 +3595,7 @@
           <w14:ligatures w14:val="standardContextual"/>
         </w:rPr>
       </w:pPr>
-      <w:hyperlink w:anchor="_Toc242004450" w:history="1">
+      <w:hyperlink w:anchor="_Toc242127650" w:history="1">
         <w:r>
           <w:rPr>
             <w:rStyle w:val="Siuktni"/>
@@ -3622,7 +3622,7 @@
             <w:noProof/>
             <w:webHidden/>
           </w:rPr>
-          <w:instrText xml:space="preserve"> PAGEREF _Toc242004450 \h </w:instrText>
+          <w:instrText xml:space="preserve"> PAGEREF _Toc242127650 \h </w:instrText>
         </w:r>
         <w:r>
           <w:rPr>
@@ -3670,7 +3670,7 @@
           <w14:ligatures w14:val="standardContextual"/>
         </w:rPr>
       </w:pPr>
-      <w:hyperlink w:anchor="_Toc242004451" w:history="1">
+      <w:hyperlink w:anchor="_Toc242127651" w:history="1">
         <w:r>
           <w:rPr>
             <w:rStyle w:val="Siuktni"/>
@@ -3697,7 +3697,7 @@
             <w:noProof/>
             <w:webHidden/>
           </w:rPr>
-          <w:instrText xml:space="preserve"> PAGEREF _Toc242004451 \h </w:instrText>
+          <w:instrText xml:space="preserve"> PAGEREF _Toc242127651 \h </w:instrText>
         </w:r>
         <w:r>
           <w:rPr>
@@ -3745,7 +3745,7 @@
           <w14:ligatures w14:val="standardContextual"/>
         </w:rPr>
       </w:pPr>
-      <w:hyperlink w:anchor="_Toc242004452" w:history="1">
+      <w:hyperlink w:anchor="_Toc242127652" w:history="1">
         <w:r>
           <w:rPr>
             <w:rStyle w:val="Siuktni"/>
@@ -3772,7 +3772,7 @@
             <w:noProof/>
             <w:webHidden/>
           </w:rPr>
-          <w:instrText xml:space="preserve"> PAGEREF _Toc242004452 \h </w:instrText>
+          <w:instrText xml:space="preserve"> PAGEREF _Toc242127652 \h </w:instrText>
         </w:r>
         <w:r>
           <w:rPr>
@@ -3820,7 +3820,7 @@
           <w14:ligatures w14:val="standardContextual"/>
         </w:rPr>
       </w:pPr>
-      <w:hyperlink w:anchor="_Toc242004453" w:history="1">
+      <w:hyperlink w:anchor="_Toc242127653" w:history="1">
         <w:r>
           <w:rPr>
             <w:rStyle w:val="Siuktni"/>
@@ -3847,7 +3847,7 @@
             <w:noProof/>
             <w:webHidden/>
           </w:rPr>
-          <w:instrText xml:space="preserve"> PAGEREF _Toc242004453 \h </w:instrText>
+          <w:instrText xml:space="preserve"> PAGEREF _Toc242127653 \h </w:instrText>
         </w:r>
         <w:r>
           <w:rPr>
@@ -3895,7 +3895,7 @@
           <w14:ligatures w14:val="standardContextual"/>
         </w:rPr>
       </w:pPr>
-      <w:hyperlink w:anchor="_Toc242004454" w:history="1">
+      <w:hyperlink w:anchor="_Toc242127654" w:history="1">
         <w:r>
           <w:rPr>
             <w:rStyle w:val="Siuktni"/>
@@ -3922,7 +3922,7 @@
             <w:noProof/>
             <w:webHidden/>
           </w:rPr>
-          <w:instrText xml:space="preserve"> PAGEREF _Toc242004454 \h </w:instrText>
+          <w:instrText xml:space="preserve"> PAGEREF _Toc242127654 \h </w:instrText>
         </w:r>
         <w:r>
           <w:rPr>
@@ -3970,7 +3970,7 @@
           <w14:ligatures w14:val="standardContextual"/>
         </w:rPr>
       </w:pPr>
-      <w:hyperlink w:anchor="_Toc242004455" w:history="1">
+      <w:hyperlink w:anchor="_Toc242127655" w:history="1">
         <w:r>
           <w:rPr>
             <w:rStyle w:val="Siuktni"/>
@@ -3997,7 +3997,7 @@
             <w:noProof/>
             <w:webHidden/>
           </w:rPr>
-          <w:instrText xml:space="preserve"> PAGEREF _Toc242004455 \h </w:instrText>
+          <w:instrText xml:space="preserve"> PAGEREF _Toc242127655 \h </w:instrText>
         </w:r>
         <w:r>
           <w:rPr>
@@ -4045,13 +4045,13 @@
           <w14:ligatures w14:val="standardContextual"/>
         </w:rPr>
       </w:pPr>
-      <w:hyperlink w:anchor="_Toc242004456" w:history="1">
+      <w:hyperlink w:anchor="_Toc242127656" w:history="1">
         <w:r>
           <w:rPr>
             <w:rStyle w:val="Siuktni"/>
             <w:noProof/>
           </w:rPr>
-          <w:t>7.3. Hướng phát triển</w:t>
+          <w:t>7.3. Giới hạn và kiến nghị</w:t>
         </w:r>
         <w:r>
           <w:rPr>
@@ -4072,7 +4072,7 @@
             <w:noProof/>
             <w:webHidden/>
           </w:rPr>
-          <w:instrText xml:space="preserve"> PAGEREF _Toc242004456 \h </w:instrText>
+          <w:instrText xml:space="preserve"> PAGEREF _Toc242127656 \h </w:instrText>
         </w:r>
         <w:r>
           <w:rPr>
@@ -4120,7 +4120,7 @@
           <w14:ligatures w14:val="standardContextual"/>
         </w:rPr>
       </w:pPr>
-      <w:hyperlink w:anchor="_Toc242004457" w:history="1">
+      <w:hyperlink w:anchor="_Toc242127657" w:history="1">
         <w:r>
           <w:rPr>
             <w:rStyle w:val="Siuktni"/>
@@ -4147,7 +4147,7 @@
             <w:noProof/>
             <w:webHidden/>
           </w:rPr>
-          <w:instrText xml:space="preserve"> PAGEREF _Toc242004457 \h </w:instrText>
+          <w:instrText xml:space="preserve"> PAGEREF _Toc242127657 \h </w:instrText>
         </w:r>
         <w:r>
           <w:rPr>
@@ -4195,7 +4195,7 @@
           <w14:ligatures w14:val="standardContextual"/>
         </w:rPr>
       </w:pPr>
-      <w:hyperlink w:anchor="_Toc242004458" w:history="1">
+      <w:hyperlink w:anchor="_Toc242127658" w:history="1">
         <w:r>
           <w:rPr>
             <w:rStyle w:val="Siuktni"/>
@@ -4222,7 +4222,7 @@
             <w:noProof/>
             <w:webHidden/>
           </w:rPr>
-          <w:instrText xml:space="preserve"> PAGEREF _Toc242004458 \h </w:instrText>
+          <w:instrText xml:space="preserve"> PAGEREF _Toc242127658 \h </w:instrText>
         </w:r>
         <w:r>
           <w:rPr>
@@ -4270,7 +4270,7 @@
           <w14:ligatures w14:val="standardContextual"/>
         </w:rPr>
       </w:pPr>
-      <w:hyperlink w:anchor="_Toc242004459" w:history="1">
+      <w:hyperlink w:anchor="_Toc242127659" w:history="1">
         <w:r>
           <w:rPr>
             <w:rStyle w:val="Siuktni"/>
@@ -4297,7 +4297,7 @@
             <w:noProof/>
             <w:webHidden/>
           </w:rPr>
-          <w:instrText xml:space="preserve"> PAGEREF _Toc242004459 \h </w:instrText>
+          <w:instrText xml:space="preserve"> PAGEREF _Toc242127659 \h </w:instrText>
         </w:r>
         <w:r>
           <w:rPr>
@@ -4345,7 +4345,7 @@
           <w14:ligatures w14:val="standardContextual"/>
         </w:rPr>
       </w:pPr>
-      <w:hyperlink w:anchor="_Toc242004460" w:history="1">
+      <w:hyperlink w:anchor="_Toc242127660" w:history="1">
         <w:r>
           <w:rPr>
             <w:rStyle w:val="Siuktni"/>
@@ -4372,7 +4372,7 @@
             <w:noProof/>
             <w:webHidden/>
           </w:rPr>
-          <w:instrText xml:space="preserve"> PAGEREF _Toc242004460 \h </w:instrText>
+          <w:instrText xml:space="preserve"> PAGEREF _Toc242127660 \h </w:instrText>
         </w:r>
         <w:r>
           <w:rPr>
@@ -4420,7 +4420,7 @@
           <w14:ligatures w14:val="standardContextual"/>
         </w:rPr>
       </w:pPr>
-      <w:hyperlink w:anchor="_Toc242004461" w:history="1">
+      <w:hyperlink w:anchor="_Toc242127661" w:history="1">
         <w:r>
           <w:rPr>
             <w:rStyle w:val="Siuktni"/>
@@ -4447,7 +4447,7 @@
             <w:noProof/>
             <w:webHidden/>
           </w:rPr>
-          <w:instrText xml:space="preserve"> PAGEREF _Toc242004461 \h </w:instrText>
+          <w:instrText xml:space="preserve"> PAGEREF _Toc242127661 \h </w:instrText>
         </w:r>
         <w:r>
           <w:rPr>
@@ -4495,7 +4495,7 @@
       <w:pPr>
         <w:pStyle w:val="u1"/>
       </w:pPr>
-      <w:bookmarkStart w:id="3" w:name="_Toc242004409"/>
+      <w:bookmarkStart w:id="3" w:name="_Toc242127609"/>
       <w:r>
         <w:lastRenderedPageBreak/>
         <w:t>DANH M</w:t>
@@ -5081,7 +5081,7 @@
       <w:pPr>
         <w:pStyle w:val="u1"/>
       </w:pPr>
-      <w:bookmarkStart w:id="4" w:name="_Toc242004410"/>
+      <w:bookmarkStart w:id="4" w:name="_Toc242127610"/>
       <w:r>
         <w:lastRenderedPageBreak/>
         <w:t>CHƯƠNG 1. GI</w:t>
@@ -5104,7 +5104,7 @@
       <w:pPr>
         <w:pStyle w:val="u2"/>
       </w:pPr>
-      <w:bookmarkStart w:id="5" w:name="_Toc242004411"/>
+      <w:bookmarkStart w:id="5" w:name="_Toc242127611"/>
       <w:r>
         <w:t>1.1. B</w:t>
       </w:r>
@@ -5148,7 +5148,7 @@
       <w:pPr>
         <w:pStyle w:val="u2"/>
       </w:pPr>
-      <w:bookmarkStart w:id="6" w:name="_Toc242004412"/>
+      <w:bookmarkStart w:id="6" w:name="_Toc242127612"/>
       <w:r>
         <w:t>1.2. M</w:t>
       </w:r>
@@ -5549,7 +5549,7 @@
       <w:pPr>
         <w:pStyle w:val="u2"/>
       </w:pPr>
-      <w:bookmarkStart w:id="7" w:name="_Toc242004413"/>
+      <w:bookmarkStart w:id="7" w:name="_Toc242127613"/>
       <w:r>
         <w:t>1.3. Đ</w:t>
       </w:r>
@@ -5632,7 +5632,7 @@
       <w:pPr>
         <w:pStyle w:val="u2"/>
       </w:pPr>
-      <w:bookmarkStart w:id="8" w:name="_Toc242004414"/>
+      <w:bookmarkStart w:id="8" w:name="_Toc242127614"/>
       <w:r>
         <w:t>1.4. Phương pháp và c</w:t>
       </w:r>
@@ -5659,7 +5659,7 @@
       <w:pPr>
         <w:pStyle w:val="u2"/>
       </w:pPr>
-      <w:bookmarkStart w:id="9" w:name="_Toc242004415"/>
+      <w:bookmarkStart w:id="9" w:name="_Toc242127615"/>
       <w:r>
         <w:t>1.5. M</w:t>
       </w:r>
@@ -6077,7 +6077,7 @@
       <w:pPr>
         <w:pStyle w:val="u1"/>
       </w:pPr>
-      <w:bookmarkStart w:id="10" w:name="_Toc242004416"/>
+      <w:bookmarkStart w:id="10" w:name="_Toc242127616"/>
       <w:r>
         <w:lastRenderedPageBreak/>
         <w:t>CHƯƠNG 2. CƠ S</w:t>
@@ -6106,7 +6106,7 @@
       <w:pPr>
         <w:pStyle w:val="u2"/>
       </w:pPr>
-      <w:bookmarkStart w:id="11" w:name="_Toc242004417"/>
+      <w:bookmarkStart w:id="11" w:name="_Toc242127617"/>
       <w:r>
         <w:t>2.1. Ch</w:t>
       </w:r>
@@ -6162,7 +6162,7 @@
       <w:pPr>
         <w:pStyle w:val="u2"/>
       </w:pPr>
-      <w:bookmarkStart w:id="12" w:name="_Toc242004418"/>
+      <w:bookmarkStart w:id="12" w:name="_Toc242127618"/>
       <w:r>
         <w:t>2.2. Các t</w:t>
       </w:r>
@@ -6745,7 +6745,7 @@
       <w:pPr>
         <w:pStyle w:val="u2"/>
       </w:pPr>
-      <w:bookmarkStart w:id="13" w:name="_Toc242004419"/>
+      <w:bookmarkStart w:id="13" w:name="_Toc242127619"/>
       <w:r>
         <w:lastRenderedPageBreak/>
         <w:t>2.3. K</w:t>
@@ -7287,7 +7287,7 @@
       <w:pPr>
         <w:pStyle w:val="u2"/>
       </w:pPr>
-      <w:bookmarkStart w:id="14" w:name="_Toc242004420"/>
+      <w:bookmarkStart w:id="14" w:name="_Toc242127620"/>
       <w:r>
         <w:t>2.4. Coverage và mutation testing</w:t>
       </w:r>
@@ -7307,7 +7307,7 @@
       <w:pPr>
         <w:pStyle w:val="u2"/>
       </w:pPr>
-      <w:bookmarkStart w:id="15" w:name="_Toc242004421"/>
+      <w:bookmarkStart w:id="15" w:name="_Toc242127621"/>
       <w:r>
         <w:lastRenderedPageBreak/>
         <w:t>2.5. Security, performance và accessibility</w:t>
@@ -7328,7 +7328,7 @@
       <w:pPr>
         <w:pStyle w:val="u1"/>
       </w:pPr>
-      <w:bookmarkStart w:id="16" w:name="_Toc242004422"/>
+      <w:bookmarkStart w:id="16" w:name="_Toc242127622"/>
       <w:r>
         <w:lastRenderedPageBreak/>
         <w:t>CHƯƠNG 3. PHÂN TÍCH VÀ THI</w:t>
@@ -7351,7 +7351,7 @@
       <w:pPr>
         <w:pStyle w:val="u2"/>
       </w:pPr>
-      <w:bookmarkStart w:id="17" w:name="_Toc242004423"/>
+      <w:bookmarkStart w:id="17" w:name="_Toc242127623"/>
       <w:r>
         <w:t>3.1. Actor và use case</w:t>
       </w:r>
@@ -7371,7 +7371,7 @@
           <w:noProof/>
         </w:rPr>
         <w:drawing>
-          <wp:inline distT="0" distB="0" distL="0" distR="0" wp14:anchorId="343F8E09" wp14:editId="0538B914">
+          <wp:inline distT="0" distB="0" distL="0" distR="0" wp14:anchorId="4C17F4BE" wp14:editId="4E14F60A">
             <wp:extent cx="5943600" cy="4730926"/>
             <wp:effectExtent l="0" t="0" r="0" b="0"/>
             <wp:docPr id="1" name="Picture 1"/>
@@ -7987,7 +7987,7 @@
       <w:pPr>
         <w:pStyle w:val="u2"/>
       </w:pPr>
-      <w:bookmarkStart w:id="18" w:name="_Toc242004424"/>
+      <w:bookmarkStart w:id="18" w:name="_Toc242127624"/>
       <w:r>
         <w:t>3.2. Yêu c</w:t>
       </w:r>
@@ -8488,7 +8488,7 @@
       <w:pPr>
         <w:pStyle w:val="u2"/>
       </w:pPr>
-      <w:bookmarkStart w:id="19" w:name="_Toc242004425"/>
+      <w:bookmarkStart w:id="19" w:name="_Toc242127625"/>
       <w:r>
         <w:t>3.3. Quy t</w:t>
       </w:r>
@@ -8995,7 +8995,7 @@
       <w:pPr>
         <w:pStyle w:val="u2"/>
       </w:pPr>
-      <w:bookmarkStart w:id="20" w:name="_Toc242004426"/>
+      <w:bookmarkStart w:id="20" w:name="_Toc242127626"/>
       <w:r>
         <w:t>3.4. Ki</w:t>
       </w:r>
@@ -9039,7 +9039,7 @@
           <w:noProof/>
         </w:rPr>
         <w:drawing>
-          <wp:inline distT="0" distB="0" distL="0" distR="0" wp14:anchorId="6C20E484" wp14:editId="44EB9B42">
+          <wp:inline distT="0" distB="0" distL="0" distR="0" wp14:anchorId="152FAF62" wp14:editId="6167FC98">
             <wp:extent cx="5943600" cy="2600325"/>
             <wp:effectExtent l="0" t="0" r="0" b="0"/>
             <wp:docPr id="2" name="Picture 2"/>
@@ -9100,7 +9100,7 @@
       <w:pPr>
         <w:pStyle w:val="u2"/>
       </w:pPr>
-      <w:bookmarkStart w:id="21" w:name="_Toc242004427"/>
+      <w:bookmarkStart w:id="21" w:name="_Toc242127627"/>
       <w:r>
         <w:t>3.5. Mô hình d</w:t>
       </w:r>
@@ -9132,7 +9132,7 @@
           <w:noProof/>
         </w:rPr>
         <w:drawing>
-          <wp:inline distT="0" distB="0" distL="0" distR="0" wp14:anchorId="1DAFFDD5" wp14:editId="03A99978">
+          <wp:inline distT="0" distB="0" distL="0" distR="0" wp14:anchorId="6D5243AF" wp14:editId="07FB8312">
             <wp:extent cx="5943600" cy="3516630"/>
             <wp:effectExtent l="0" t="0" r="0" b="0"/>
             <wp:docPr id="3" name="Picture 3"/>
@@ -9196,7 +9196,7 @@
       <w:pPr>
         <w:pStyle w:val="u2"/>
       </w:pPr>
-      <w:bookmarkStart w:id="22" w:name="_Toc242004428"/>
+      <w:bookmarkStart w:id="22" w:name="_Toc242127628"/>
       <w:r>
         <w:t>3.6. Công th</w:t>
       </w:r>
@@ -9234,7 +9234,7 @@
       <w:pPr>
         <w:pStyle w:val="u1"/>
       </w:pPr>
-      <w:bookmarkStart w:id="23" w:name="_Toc242004429"/>
+      <w:bookmarkStart w:id="23" w:name="_Toc242127629"/>
       <w:r>
         <w:lastRenderedPageBreak/>
         <w:t>CHƯƠNG 4. PHƯƠNG PHÁP VÀ K</w:t>
@@ -9266,7 +9266,7 @@
       <w:pPr>
         <w:pStyle w:val="u2"/>
       </w:pPr>
-      <w:bookmarkStart w:id="24" w:name="_Toc242004430"/>
+      <w:bookmarkStart w:id="24" w:name="_Toc242127630"/>
       <w:r>
         <w:t>4.1. Chi</w:t>
       </w:r>
@@ -9946,7 +9946,7 @@
       <w:pPr>
         <w:pStyle w:val="u2"/>
       </w:pPr>
-      <w:bookmarkStart w:id="25" w:name="_Toc242004431"/>
+      <w:bookmarkStart w:id="25" w:name="_Toc242127631"/>
       <w:r>
         <w:t>4.2. Thi</w:t>
       </w:r>
@@ -10538,7 +10538,7 @@
       <w:pPr>
         <w:pStyle w:val="u3"/>
       </w:pPr>
-      <w:bookmarkStart w:id="26" w:name="_Toc242004432"/>
+      <w:bookmarkStart w:id="26" w:name="_Toc242127632"/>
       <w:r>
         <w:t>4.2.1. Ví d</w:t>
       </w:r>
@@ -11215,7 +11215,7 @@
       <w:pPr>
         <w:pStyle w:val="u2"/>
       </w:pPr>
-      <w:bookmarkStart w:id="27" w:name="_Toc242004433"/>
+      <w:bookmarkStart w:id="27" w:name="_Toc242127633"/>
       <w:r>
         <w:lastRenderedPageBreak/>
         <w:t>4.3. Môi trư</w:t>
@@ -11612,7 +11612,7 @@
       <w:pPr>
         <w:pStyle w:val="u2"/>
       </w:pPr>
-      <w:bookmarkStart w:id="28" w:name="_Toc242004434"/>
+      <w:bookmarkStart w:id="28" w:name="_Toc242127634"/>
       <w:r>
         <w:t>4.4. Entry, exit và workflow</w:t>
       </w:r>
@@ -11989,7 +11989,7 @@
       <w:pPr>
         <w:pStyle w:val="u2"/>
       </w:pPr>
-      <w:bookmarkStart w:id="29" w:name="_Toc242004435"/>
+      <w:bookmarkStart w:id="29" w:name="_Toc242127635"/>
       <w:r>
         <w:t>4.5. Truy v</w:t>
       </w:r>
@@ -12027,7 +12027,7 @@
       <w:pPr>
         <w:pStyle w:val="u2"/>
       </w:pPr>
-      <w:bookmarkStart w:id="30" w:name="_Toc242004436"/>
+      <w:bookmarkStart w:id="30" w:name="_Toc242127636"/>
       <w:r>
         <w:t>4.6. Tiêu chí đánh giá tính đ</w:t>
       </w:r>
@@ -12074,7 +12074,7 @@
       <w:pPr>
         <w:pStyle w:val="u1"/>
       </w:pPr>
-      <w:bookmarkStart w:id="31" w:name="_Toc242004437"/>
+      <w:bookmarkStart w:id="31" w:name="_Toc242127637"/>
       <w:r>
         <w:lastRenderedPageBreak/>
         <w:t>CHƯƠNG 5. TH</w:t>
@@ -12115,7 +12115,7 @@
       <w:pPr>
         <w:pStyle w:val="u2"/>
       </w:pPr>
-      <w:bookmarkStart w:id="32" w:name="_Toc242004438"/>
+      <w:bookmarkStart w:id="32" w:name="_Toc242127638"/>
       <w:r>
         <w:t>5.1. T</w:t>
       </w:r>
@@ -13031,7 +13031,7 @@
       <w:pPr>
         <w:pStyle w:val="u2"/>
       </w:pPr>
-      <w:bookmarkStart w:id="33" w:name="_Toc242004439"/>
+      <w:bookmarkStart w:id="33" w:name="_Toc242127639"/>
       <w:r>
         <w:t>5.2. Unit, BVA và property-based testing</w:t>
       </w:r>
@@ -13057,7 +13057,7 @@
       <w:pPr>
         <w:pStyle w:val="u2"/>
       </w:pPr>
-      <w:bookmarkStart w:id="34" w:name="_Toc242004440"/>
+      <w:bookmarkStart w:id="34" w:name="_Toc242127640"/>
       <w:r>
         <w:t>5.3. API, database và transaction</w:t>
       </w:r>
@@ -13077,7 +13077,7 @@
       <w:pPr>
         <w:pStyle w:val="u2"/>
       </w:pPr>
-      <w:bookmarkStart w:id="35" w:name="_Toc242004441"/>
+      <w:bookmarkStart w:id="35" w:name="_Toc242127641"/>
       <w:r>
         <w:t>5.4. E2E, responsive và accessibility</w:t>
       </w:r>
@@ -13103,7 +13103,7 @@
         </w:rPr>
         <w:lastRenderedPageBreak/>
         <w:drawing>
-          <wp:inline distT="0" distB="0" distL="0" distR="0" wp14:anchorId="1C712FD7" wp14:editId="3D451B21">
+          <wp:inline distT="0" distB="0" distL="0" distR="0" wp14:anchorId="56DFEBA1" wp14:editId="675F7220">
             <wp:extent cx="5029200" cy="4306252"/>
             <wp:effectExtent l="0" t="0" r="0" b="0"/>
             <wp:docPr id="4" name="Picture 4"/>
@@ -13164,7 +13164,7 @@
         </w:rPr>
         <w:lastRenderedPageBreak/>
         <w:drawing>
-          <wp:inline distT="0" distB="0" distL="0" distR="0" wp14:anchorId="1F2E9A88" wp14:editId="59EB0934">
+          <wp:inline distT="0" distB="0" distL="0" distR="0" wp14:anchorId="53AA3261" wp14:editId="435B9DA3">
             <wp:extent cx="5029200" cy="5930265"/>
             <wp:effectExtent l="0" t="0" r="0" b="0"/>
             <wp:docPr id="5" name="Picture 5"/>
@@ -13219,7 +13219,7 @@
       <w:pPr>
         <w:pStyle w:val="u2"/>
       </w:pPr>
-      <w:bookmarkStart w:id="36" w:name="_Toc242004442"/>
+      <w:bookmarkStart w:id="36" w:name="_Toc242127642"/>
       <w:r>
         <w:t>5.5. Coverage và mutation</w:t>
       </w:r>
@@ -13245,7 +13245,7 @@
         </w:rPr>
         <w:lastRenderedPageBreak/>
         <w:drawing>
-          <wp:inline distT="0" distB="0" distL="0" distR="0" wp14:anchorId="28CCF9C4" wp14:editId="5A96A0EE">
+          <wp:inline distT="0" distB="0" distL="0" distR="0" wp14:anchorId="2CBB4D5C" wp14:editId="28937F6A">
             <wp:extent cx="5669280" cy="1653540"/>
             <wp:effectExtent l="0" t="0" r="0" b="0"/>
             <wp:docPr id="6" name="Picture 6"/>
@@ -13315,7 +13315,7 @@
           <w:noProof/>
         </w:rPr>
         <w:drawing>
-          <wp:inline distT="0" distB="0" distL="0" distR="0" wp14:anchorId="5FA8A44C" wp14:editId="63B3EFA5">
+          <wp:inline distT="0" distB="0" distL="0" distR="0" wp14:anchorId="3D8BD9CD" wp14:editId="392F7493">
             <wp:extent cx="5669280" cy="2440940"/>
             <wp:effectExtent l="0" t="0" r="0" b="0"/>
             <wp:docPr id="7" name="Picture 7"/>
@@ -13744,7 +13744,7 @@
       <w:pPr>
         <w:pStyle w:val="u2"/>
       </w:pPr>
-      <w:bookmarkStart w:id="37" w:name="_Toc242004443"/>
+      <w:bookmarkStart w:id="37" w:name="_Toc242127643"/>
       <w:r>
         <w:t>5.6. Hi</w:t>
       </w:r>
@@ -13775,7 +13775,7 @@
       <w:pPr>
         <w:pStyle w:val="u2"/>
       </w:pPr>
-      <w:bookmarkStart w:id="38" w:name="_Toc242004444"/>
+      <w:bookmarkStart w:id="38" w:name="_Toc242127644"/>
       <w:r>
         <w:t>5.7. Security testing</w:t>
       </w:r>
@@ -14230,7 +14230,7 @@
       <w:pPr>
         <w:pStyle w:val="u2"/>
       </w:pPr>
-      <w:bookmarkStart w:id="39" w:name="_Toc242004445"/>
+      <w:bookmarkStart w:id="39" w:name="_Toc242127645"/>
       <w:r>
         <w:t>5.8. Lighthouse, axe và tr</w:t>
       </w:r>
@@ -14262,7 +14262,7 @@
       <w:pPr>
         <w:pStyle w:val="u2"/>
       </w:pPr>
-      <w:bookmarkStart w:id="40" w:name="_Toc242004446"/>
+      <w:bookmarkStart w:id="40" w:name="_Toc242127646"/>
       <w:r>
         <w:t>5.9. Tính tái l</w:t>
       </w:r>
@@ -14307,7 +14307,7 @@
       <w:pPr>
         <w:pStyle w:val="u1"/>
       </w:pPr>
-      <w:bookmarkStart w:id="41" w:name="_Toc242004447"/>
+      <w:bookmarkStart w:id="41" w:name="_Toc242127647"/>
       <w:r>
         <w:lastRenderedPageBreak/>
         <w:t>CHƯƠNG 6. DEFECT, RETEST VÀ ĐÁNH GIÁ CH</w:t>
@@ -14330,7 +14330,7 @@
       <w:pPr>
         <w:pStyle w:val="u2"/>
       </w:pPr>
-      <w:bookmarkStart w:id="42" w:name="_Toc242004448"/>
+      <w:bookmarkStart w:id="42" w:name="_Toc242127648"/>
       <w:r>
         <w:t>6.1. Defect lifecycle</w:t>
       </w:r>
@@ -15068,7 +15068,7 @@
       <w:pPr>
         <w:pStyle w:val="u2"/>
       </w:pPr>
-      <w:bookmarkStart w:id="43" w:name="_Toc242004449"/>
+      <w:bookmarkStart w:id="43" w:name="_Toc242127649"/>
       <w:r>
         <w:t>6.2. Phân tích ba defect có tác đ</w:t>
       </w:r>
@@ -15106,7 +15106,7 @@
       <w:pPr>
         <w:pStyle w:val="u2"/>
       </w:pPr>
-      <w:bookmarkStart w:id="44" w:name="_Toc242004450"/>
+      <w:bookmarkStart w:id="44" w:name="_Toc242127650"/>
       <w:r>
         <w:t>6.3. Tr</w:t>
       </w:r>
@@ -15154,7 +15154,7 @@
       <w:pPr>
         <w:pStyle w:val="u2"/>
       </w:pPr>
-      <w:bookmarkStart w:id="45" w:name="_Toc242004451"/>
+      <w:bookmarkStart w:id="45" w:name="_Toc242127651"/>
       <w:r>
         <w:lastRenderedPageBreak/>
         <w:t>6.4. Đánh giá theo ISO/IEC 25010:2023</w:t>
@@ -15859,7 +15859,7 @@
       <w:pPr>
         <w:pStyle w:val="u2"/>
       </w:pPr>
-      <w:bookmarkStart w:id="46" w:name="_Toc242004452"/>
+      <w:bookmarkStart w:id="46" w:name="_Toc242127652"/>
       <w:r>
         <w:t>6.5. Gi</w:t>
       </w:r>
@@ -16347,7 +16347,7 @@
       <w:pPr>
         <w:pStyle w:val="u1"/>
       </w:pPr>
-      <w:bookmarkStart w:id="47" w:name="_Toc242004453"/>
+      <w:bookmarkStart w:id="47" w:name="_Toc242127653"/>
       <w:r>
         <w:lastRenderedPageBreak/>
         <w:t>CHƯƠNG 7. K</w:t>
@@ -16379,7 +16379,7 @@
       <w:pPr>
         <w:pStyle w:val="u2"/>
       </w:pPr>
-      <w:bookmarkStart w:id="48" w:name="_Toc242004454"/>
+      <w:bookmarkStart w:id="48" w:name="_Toc242127654"/>
       <w:r>
         <w:t>7.1. K</w:t>
       </w:r>
@@ -16423,7 +16423,7 @@
       <w:pPr>
         <w:pStyle w:val="u2"/>
       </w:pPr>
-      <w:bookmarkStart w:id="49" w:name="_Toc242004455"/>
+      <w:bookmarkStart w:id="49" w:name="_Toc242127655"/>
       <w:r>
         <w:t>7.2. H</w:t>
       </w:r>
@@ -16447,45 +16447,54 @@
       <w:pPr>
         <w:pStyle w:val="u2"/>
       </w:pPr>
-      <w:bookmarkStart w:id="50" w:name="_Toc242004456"/>
-      <w:r>
-        <w:t>7.3. Hư</w:t>
+      <w:bookmarkStart w:id="50" w:name="_Toc242127656"/>
+      <w:r>
+        <w:t>7.3. Gi</w:t>
       </w:r>
       <w:r>
         <w:t>ớ</w:t>
       </w:r>
       <w:r>
-        <w:t>ng phát tri</w:t>
-      </w:r>
-      <w:r>
-        <w:t>ể</w:t>
-      </w:r>
-      <w:r>
-        <w:t>n</w:t>
+        <w:t>i h</w:t>
+      </w:r>
+      <w:r>
+        <w:t>ạ</w:t>
+      </w:r>
+      <w:r>
+        <w:t>n và ki</w:t>
+      </w:r>
+      <w:r>
+        <w:t>ế</w:t>
+      </w:r>
+      <w:r>
+        <w:t>n ngh</w:t>
+      </w:r>
+      <w:r>
+        <w:t>ị</w:t>
       </w:r>
       <w:bookmarkEnd w:id="50"/>
     </w:p>
     <w:p>
       <w:r>
-        <w:t>Hướng phát triển nên tập trung vào những khoảng trống đã xuất hiện trong kết quả, thay vì mở rộng thêm chức năng sản phẩm. Trước hết, 20 mutant survived và hai mutant no-coverage cần được phân loại để xác định đâu là assertion còn thiếu và đâu là mutant tương đương. Sau đó, có thể mở rộng kiểm thử tương thích sang Firefox và WebKit, đồng thời lặp lại kịch bản race trên cấu hình nhiều instance hoặc DBMS dùng trong triển khai thực tế.</w:t>
+        <w:t>Bài tập được thực hiện trong phạm vi SRS và môi trường đã mô tả, vì vậy kết quả không đại diện cho mọi trình duyệt, cấu hình triển khai hoặc loại cơ sở dữ liệu. Mutation testing chỉ bao phủ booking-policy.ts; ZAP mới là baseline chưa xác thực; đánh giá khả năng tương tác chưa có nghiên cứu với người dùng thật. Những điểm này được giữ ở trạng thái chưa đánh giá thay vì suy diễn thành kết quả đạt.</w:t>
       </w:r>
     </w:p>
     <w:p>
       <w:r>
         <w:lastRenderedPageBreak/>
-        <w:t>Đối với bảo mật và khả năng tương tác, bước tiếp theo phù hợp là kiểm tra sau đăng nhập theo phạm vi được cho phép và thực hiện đánh giá usability với người dùng thật. Các hoạt động này cần có kế hoạch, dữ liệu và evidence riêng; khi chưa thực hiện, kết quả vẫn được giữ ở trạng thái chưa đánh giá.</w:t>
+        <w:t>Nếu StudySpace được đưa vào sử dụng thực tế, các phép đo nên được lặp lại trên hạ tầng đích và với dữ liệu vận hành phù hợp. Việc mở rộng này nằm ngoài phạm vi của bài tập hiện tại và không làm thay đổi kết luận về các ca kiểm thử đã có bằng chứng.</w:t>
       </w:r>
     </w:p>
     <w:p>
       <w:r>
-        <w:t>Với bằng chứng hiện có, kết luận thận trọng là StudySpace đạt các tiêu chí exit đã định nghĩa trong phạm vi SRS và môi trường ghi nhận. Tài liệu không khẳng định phần mềm không còn lỗi, không tuyên bố chứng nhận ISO và không thay thế đánh giá trên hạ tầng triển khai thực tế.</w:t>
+        <w:t>Với bằng chứng hiện có, StudySpace đạt các tiêu chí exit đã định nghĩa trong phạm vi SRS và môi trường ghi nhận. Tài liệu không khẳng định phần mềm không còn lỗi, không tuyên bố chứng nhận ISO và không thay thế đánh giá trên hạ tầng triển khai thực tế.</w:t>
       </w:r>
     </w:p>
     <w:p>
       <w:pPr>
         <w:pStyle w:val="u1"/>
       </w:pPr>
-      <w:bookmarkStart w:id="51" w:name="_Toc242004457"/>
+      <w:bookmarkStart w:id="51" w:name="_Toc242127657"/>
       <w:r>
         <w:lastRenderedPageBreak/>
         <w:t>TÀI LI</w:t>
@@ -16596,7 +16605,7 @@
       <w:pPr>
         <w:pStyle w:val="u1"/>
       </w:pPr>
-      <w:bookmarkStart w:id="52" w:name="_Toc242004458"/>
+      <w:bookmarkStart w:id="52" w:name="_Toc242127658"/>
       <w:r>
         <w:lastRenderedPageBreak/>
         <w:t>PH</w:t>
@@ -17624,7 +17633,7 @@
       <w:pPr>
         <w:pStyle w:val="u1"/>
       </w:pPr>
-      <w:bookmarkStart w:id="53" w:name="_Toc242004459"/>
+      <w:bookmarkStart w:id="53" w:name="_Toc242127659"/>
       <w:r>
         <w:lastRenderedPageBreak/>
         <w:t>PH</w:t>
@@ -18297,7 +18306,7 @@
       <w:pPr>
         <w:pStyle w:val="u1"/>
       </w:pPr>
-      <w:bookmarkStart w:id="54" w:name="_Toc242004460"/>
+      <w:bookmarkStart w:id="54" w:name="_Toc242127660"/>
       <w:r>
         <w:lastRenderedPageBreak/>
         <w:t>PH</w:t>
@@ -19027,7 +19036,7 @@
       <w:pPr>
         <w:pStyle w:val="u2"/>
       </w:pPr>
-      <w:bookmarkStart w:id="55" w:name="_Toc242004461"/>
+      <w:bookmarkStart w:id="55" w:name="_Toc242127661"/>
       <w:r>
         <w:t>PH</w:t>
       </w:r>
@@ -19335,31 +19344,31 @@
       </w:rPr>
     </w:lvl>
   </w:abstractNum>
-  <w:num w:numId="1" w16cid:durableId="1158619392">
+  <w:num w:numId="1" w16cid:durableId="1633708170">
     <w:abstractNumId w:val="8"/>
   </w:num>
-  <w:num w:numId="2" w16cid:durableId="347754366">
+  <w:num w:numId="2" w16cid:durableId="712653475">
     <w:abstractNumId w:val="6"/>
   </w:num>
-  <w:num w:numId="3" w16cid:durableId="1929994375">
+  <w:num w:numId="3" w16cid:durableId="1325546690">
     <w:abstractNumId w:val="5"/>
   </w:num>
-  <w:num w:numId="4" w16cid:durableId="438795498">
+  <w:num w:numId="4" w16cid:durableId="1466388985">
     <w:abstractNumId w:val="4"/>
   </w:num>
-  <w:num w:numId="5" w16cid:durableId="1244876631">
+  <w:num w:numId="5" w16cid:durableId="1615861242">
     <w:abstractNumId w:val="7"/>
   </w:num>
-  <w:num w:numId="6" w16cid:durableId="39943154">
+  <w:num w:numId="6" w16cid:durableId="539443513">
     <w:abstractNumId w:val="3"/>
   </w:num>
-  <w:num w:numId="7" w16cid:durableId="1858691064">
+  <w:num w:numId="7" w16cid:durableId="1142697749">
     <w:abstractNumId w:val="2"/>
   </w:num>
-  <w:num w:numId="8" w16cid:durableId="1201436536">
+  <w:num w:numId="8" w16cid:durableId="1749158329">
     <w:abstractNumId w:val="1"/>
   </w:num>
-  <w:num w:numId="9" w16cid:durableId="277296212">
+  <w:num w:numId="9" w16cid:durableId="332220357">
     <w:abstractNumId w:val="0"/>
   </w:num>
 </w:numbering>
@@ -30754,7 +30763,7 @@
     <w:autoRedefine/>
     <w:uiPriority w:val="39"/>
     <w:unhideWhenUsed/>
-    <w:rsid w:val="008267B1"/>
+    <w:rsid w:val="00676A35"/>
     <w:pPr>
       <w:spacing w:after="100"/>
     </w:pPr>
@@ -30766,7 +30775,7 @@
     <w:autoRedefine/>
     <w:uiPriority w:val="39"/>
     <w:unhideWhenUsed/>
-    <w:rsid w:val="008267B1"/>
+    <w:rsid w:val="00676A35"/>
     <w:pPr>
       <w:spacing w:after="100"/>
       <w:ind w:left="260"/>
@@ -30779,7 +30788,7 @@
     <w:autoRedefine/>
     <w:uiPriority w:val="39"/>
     <w:unhideWhenUsed/>
-    <w:rsid w:val="008267B1"/>
+    <w:rsid w:val="00676A35"/>
     <w:pPr>
       <w:spacing w:after="100"/>
       <w:ind w:left="520"/>
@@ -30790,7 +30799,7 @@
     <w:basedOn w:val="Phngmcinhcuaoanvn"/>
     <w:uiPriority w:val="99"/>
     <w:unhideWhenUsed/>
-    <w:rsid w:val="008267B1"/>
+    <w:rsid w:val="00676A35"/>
     <w:rPr>
       <w:color w:val="0000FF" w:themeColor="hyperlink"/>
       <w:u w:val="single"/>

</xml_diff>

<commit_message>
docs: refresh final evidence snapshot and report
</commit_message>
<xml_diff>
--- a/output/docx/StudySpace-BaoCao-DanhGia-KiemDinh.docx
+++ b/output/docx/StudySpace-BaoCao-DanhGia-KiemDinh.docx
@@ -166,7 +166,7 @@
       <w:pPr>
         <w:pStyle w:val="u1"/>
       </w:pPr>
-      <w:bookmarkStart w:id="0" w:name="_Toc242127606"/>
+      <w:bookmarkStart w:id="0" w:name="_Toc242130183"/>
       <w:r>
         <w:lastRenderedPageBreak/>
         <w:t>L</w:t>
@@ -199,7 +199,7 @@
       <w:pPr>
         <w:pStyle w:val="u1"/>
       </w:pPr>
-      <w:bookmarkStart w:id="1" w:name="_Toc242127607"/>
+      <w:bookmarkStart w:id="1" w:name="_Toc242130184"/>
       <w:r>
         <w:lastRenderedPageBreak/>
         <w:t>TÓM T</w:t>
@@ -224,7 +224,7 @@
     </w:p>
     <w:p>
       <w:r>
-        <w:t>Trên commit kiểm thử 73f1ed4, 47/47 ca Vitest và 24/24 ca Playwright đạt. Coverage đạt 98,35% line, 94,02% branch và 100% function; mutation score theo công thức killed/(killed+survived) đạt 81,13%. Kịch bản booking đồng thời tạo đúng một phản hồi 201 và mười chín phản hồi 409. Lighthouse đạt 99/100/96; ZAP không ghi nhận High, nhưng frontend còn chín cảnh báo Low và phạm vi quét chỉ là baseline chưa xác thực. Kết quả cho thấy các quality gate định nghĩa trước đã đạt trong môi trường đã ghi, đồng thời vẫn c</w:t>
+        <w:t>Trên commit kiểm thử 9f10447, 47/47 ca Vitest và 24/24 ca Playwright đạt. Coverage đạt 98,35% line, 94,02% branch và 100% function; mutation score theo công thức killed/(killed+survived) đạt 81,13%. Kịch bản booking đồng thời tạo đúng một phản hồi 201 và mười chín phản hồi 409. Lighthouse đạt 98/100/96; ZAP không ghi nhận High, nhưng frontend còn chín cảnh báo Low và phạm vi quét chỉ là baseline chưa xác thực. Kết quả cho thấy các quality gate định nghĩa trước đã đạt trong môi trường đã ghi, đồng thời vẫn c</w:t>
       </w:r>
       <w:r>
         <w:t>òn giới hạn về trình duyệt, tải sản xuất, pentest xác thực và nghiên cứu usability với người dùng thật.</w:t>
@@ -250,7 +250,7 @@
       <w:pPr>
         <w:pStyle w:val="u1"/>
       </w:pPr>
-      <w:bookmarkStart w:id="2" w:name="_Toc242127608"/>
+      <w:bookmarkStart w:id="2" w:name="_Toc242130185"/>
       <w:r>
         <w:lastRenderedPageBreak/>
         <w:t>M</w:t>
@@ -276,14 +276,7 @@
           <w:tab w:val="right" w:leader="dot" w:pos="9537"/>
         </w:tabs>
         <w:rPr>
-          <w:rFonts w:asciiTheme="minorHAnsi" w:eastAsiaTheme="minorEastAsia" w:hAnsiTheme="minorHAnsi"/>
           <w:noProof/>
-          <w:color w:val="auto"/>
-          <w:kern w:val="2"/>
-          <w:sz w:val="24"/>
-          <w:szCs w:val="24"/>
-          <w:lang w:val="vi-VN" w:eastAsia="vi-VN"/>
-          <w14:ligatures w14:val="standardContextual"/>
         </w:rPr>
       </w:pPr>
       <w:r>
@@ -295,7 +288,7 @@
       <w:r>
         <w:fldChar w:fldCharType="separate"/>
       </w:r>
-      <w:hyperlink w:anchor="_Toc242127606" w:history="1">
+      <w:hyperlink w:anchor="_Toc242130183" w:history="1">
         <w:r>
           <w:rPr>
             <w:rStyle w:val="Siuktni"/>
@@ -322,7 +315,7 @@
             <w:noProof/>
             <w:webHidden/>
           </w:rPr>
-          <w:instrText xml:space="preserve"> PAGEREF _Toc242127606 \h </w:instrText>
+          <w:instrText xml:space="preserve"> PAGEREF _Toc242130183 \h </w:instrText>
         </w:r>
         <w:r>
           <w:rPr>
@@ -360,17 +353,10 @@
           <w:tab w:val="right" w:leader="dot" w:pos="9537"/>
         </w:tabs>
         <w:rPr>
-          <w:rFonts w:asciiTheme="minorHAnsi" w:eastAsiaTheme="minorEastAsia" w:hAnsiTheme="minorHAnsi"/>
           <w:noProof/>
-          <w:color w:val="auto"/>
-          <w:kern w:val="2"/>
-          <w:sz w:val="24"/>
-          <w:szCs w:val="24"/>
-          <w:lang w:val="vi-VN" w:eastAsia="vi-VN"/>
-          <w14:ligatures w14:val="standardContextual"/>
         </w:rPr>
       </w:pPr>
-      <w:hyperlink w:anchor="_Toc242127607" w:history="1">
+      <w:hyperlink w:anchor="_Toc242130184" w:history="1">
         <w:r>
           <w:rPr>
             <w:rStyle w:val="Siuktni"/>
@@ -397,7 +383,7 @@
             <w:noProof/>
             <w:webHidden/>
           </w:rPr>
-          <w:instrText xml:space="preserve"> PAGEREF _Toc242127607 \h </w:instrText>
+          <w:instrText xml:space="preserve"> PAGEREF _Toc242130184 \h </w:instrText>
         </w:r>
         <w:r>
           <w:rPr>
@@ -435,17 +421,10 @@
           <w:tab w:val="right" w:leader="dot" w:pos="9537"/>
         </w:tabs>
         <w:rPr>
-          <w:rFonts w:asciiTheme="minorHAnsi" w:eastAsiaTheme="minorEastAsia" w:hAnsiTheme="minorHAnsi"/>
           <w:noProof/>
-          <w:color w:val="auto"/>
-          <w:kern w:val="2"/>
-          <w:sz w:val="24"/>
-          <w:szCs w:val="24"/>
-          <w:lang w:val="vi-VN" w:eastAsia="vi-VN"/>
-          <w14:ligatures w14:val="standardContextual"/>
         </w:rPr>
       </w:pPr>
-      <w:hyperlink w:anchor="_Toc242127608" w:history="1">
+      <w:hyperlink w:anchor="_Toc242130185" w:history="1">
         <w:r>
           <w:rPr>
             <w:rStyle w:val="Siuktni"/>
@@ -472,7 +451,7 @@
             <w:noProof/>
             <w:webHidden/>
           </w:rPr>
-          <w:instrText xml:space="preserve"> PAGEREF _Toc242127608 \h </w:instrText>
+          <w:instrText xml:space="preserve"> PAGEREF _Toc242130185 \h </w:instrText>
         </w:r>
         <w:r>
           <w:rPr>
@@ -510,17 +489,10 @@
           <w:tab w:val="right" w:leader="dot" w:pos="9537"/>
         </w:tabs>
         <w:rPr>
-          <w:rFonts w:asciiTheme="minorHAnsi" w:eastAsiaTheme="minorEastAsia" w:hAnsiTheme="minorHAnsi"/>
           <w:noProof/>
-          <w:color w:val="auto"/>
-          <w:kern w:val="2"/>
-          <w:sz w:val="24"/>
-          <w:szCs w:val="24"/>
-          <w:lang w:val="vi-VN" w:eastAsia="vi-VN"/>
-          <w14:ligatures w14:val="standardContextual"/>
         </w:rPr>
       </w:pPr>
-      <w:hyperlink w:anchor="_Toc242127609" w:history="1">
+      <w:hyperlink w:anchor="_Toc242130186" w:history="1">
         <w:r>
           <w:rPr>
             <w:rStyle w:val="Siuktni"/>
@@ -547,7 +519,7 @@
             <w:noProof/>
             <w:webHidden/>
           </w:rPr>
-          <w:instrText xml:space="preserve"> PAGEREF _Toc242127609 \h </w:instrText>
+          <w:instrText xml:space="preserve"> PAGEREF _Toc242130186 \h </w:instrText>
         </w:r>
         <w:r>
           <w:rPr>
@@ -585,17 +557,10 @@
           <w:tab w:val="right" w:leader="dot" w:pos="9537"/>
         </w:tabs>
         <w:rPr>
-          <w:rFonts w:asciiTheme="minorHAnsi" w:eastAsiaTheme="minorEastAsia" w:hAnsiTheme="minorHAnsi"/>
           <w:noProof/>
-          <w:color w:val="auto"/>
-          <w:kern w:val="2"/>
-          <w:sz w:val="24"/>
-          <w:szCs w:val="24"/>
-          <w:lang w:val="vi-VN" w:eastAsia="vi-VN"/>
-          <w14:ligatures w14:val="standardContextual"/>
         </w:rPr>
       </w:pPr>
-      <w:hyperlink w:anchor="_Toc242127610" w:history="1">
+      <w:hyperlink w:anchor="_Toc242130187" w:history="1">
         <w:r>
           <w:rPr>
             <w:rStyle w:val="Siuktni"/>
@@ -622,7 +587,7 @@
             <w:noProof/>
             <w:webHidden/>
           </w:rPr>
-          <w:instrText xml:space="preserve"> PAGEREF _Toc242127610 \h </w:instrText>
+          <w:instrText xml:space="preserve"> PAGEREF _Toc242130187 \h </w:instrText>
         </w:r>
         <w:r>
           <w:rPr>
@@ -660,17 +625,10 @@
           <w:tab w:val="right" w:leader="dot" w:pos="9537"/>
         </w:tabs>
         <w:rPr>
-          <w:rFonts w:asciiTheme="minorHAnsi" w:eastAsiaTheme="minorEastAsia" w:hAnsiTheme="minorHAnsi"/>
           <w:noProof/>
-          <w:color w:val="auto"/>
-          <w:kern w:val="2"/>
-          <w:sz w:val="24"/>
-          <w:szCs w:val="24"/>
-          <w:lang w:val="vi-VN" w:eastAsia="vi-VN"/>
-          <w14:ligatures w14:val="standardContextual"/>
         </w:rPr>
       </w:pPr>
-      <w:hyperlink w:anchor="_Toc242127611" w:history="1">
+      <w:hyperlink w:anchor="_Toc242130188" w:history="1">
         <w:r>
           <w:rPr>
             <w:rStyle w:val="Siuktni"/>
@@ -697,7 +655,7 @@
             <w:noProof/>
             <w:webHidden/>
           </w:rPr>
-          <w:instrText xml:space="preserve"> PAGEREF _Toc242127611 \h </w:instrText>
+          <w:instrText xml:space="preserve"> PAGEREF _Toc242130188 \h </w:instrText>
         </w:r>
         <w:r>
           <w:rPr>
@@ -735,17 +693,10 @@
           <w:tab w:val="right" w:leader="dot" w:pos="9537"/>
         </w:tabs>
         <w:rPr>
-          <w:rFonts w:asciiTheme="minorHAnsi" w:eastAsiaTheme="minorEastAsia" w:hAnsiTheme="minorHAnsi"/>
           <w:noProof/>
-          <w:color w:val="auto"/>
-          <w:kern w:val="2"/>
-          <w:sz w:val="24"/>
-          <w:szCs w:val="24"/>
-          <w:lang w:val="vi-VN" w:eastAsia="vi-VN"/>
-          <w14:ligatures w14:val="standardContextual"/>
         </w:rPr>
       </w:pPr>
-      <w:hyperlink w:anchor="_Toc242127612" w:history="1">
+      <w:hyperlink w:anchor="_Toc242130189" w:history="1">
         <w:r>
           <w:rPr>
             <w:rStyle w:val="Siuktni"/>
@@ -772,7 +723,7 @@
             <w:noProof/>
             <w:webHidden/>
           </w:rPr>
-          <w:instrText xml:space="preserve"> PAGEREF _Toc242127612 \h </w:instrText>
+          <w:instrText xml:space="preserve"> PAGEREF _Toc242130189 \h </w:instrText>
         </w:r>
         <w:r>
           <w:rPr>
@@ -810,17 +761,10 @@
           <w:tab w:val="right" w:leader="dot" w:pos="9537"/>
         </w:tabs>
         <w:rPr>
-          <w:rFonts w:asciiTheme="minorHAnsi" w:eastAsiaTheme="minorEastAsia" w:hAnsiTheme="minorHAnsi"/>
           <w:noProof/>
-          <w:color w:val="auto"/>
-          <w:kern w:val="2"/>
-          <w:sz w:val="24"/>
-          <w:szCs w:val="24"/>
-          <w:lang w:val="vi-VN" w:eastAsia="vi-VN"/>
-          <w14:ligatures w14:val="standardContextual"/>
         </w:rPr>
       </w:pPr>
-      <w:hyperlink w:anchor="_Toc242127613" w:history="1">
+      <w:hyperlink w:anchor="_Toc242130190" w:history="1">
         <w:r>
           <w:rPr>
             <w:rStyle w:val="Siuktni"/>
@@ -847,7 +791,7 @@
             <w:noProof/>
             <w:webHidden/>
           </w:rPr>
-          <w:instrText xml:space="preserve"> PAGEREF _Toc242127613 \h </w:instrText>
+          <w:instrText xml:space="preserve"> PAGEREF _Toc242130190 \h </w:instrText>
         </w:r>
         <w:r>
           <w:rPr>
@@ -885,17 +829,10 @@
           <w:tab w:val="right" w:leader="dot" w:pos="9537"/>
         </w:tabs>
         <w:rPr>
-          <w:rFonts w:asciiTheme="minorHAnsi" w:eastAsiaTheme="minorEastAsia" w:hAnsiTheme="minorHAnsi"/>
           <w:noProof/>
-          <w:color w:val="auto"/>
-          <w:kern w:val="2"/>
-          <w:sz w:val="24"/>
-          <w:szCs w:val="24"/>
-          <w:lang w:val="vi-VN" w:eastAsia="vi-VN"/>
-          <w14:ligatures w14:val="standardContextual"/>
         </w:rPr>
       </w:pPr>
-      <w:hyperlink w:anchor="_Toc242127614" w:history="1">
+      <w:hyperlink w:anchor="_Toc242130191" w:history="1">
         <w:r>
           <w:rPr>
             <w:rStyle w:val="Siuktni"/>
@@ -922,7 +859,7 @@
             <w:noProof/>
             <w:webHidden/>
           </w:rPr>
-          <w:instrText xml:space="preserve"> PAGEREF _Toc242127614 \h </w:instrText>
+          <w:instrText xml:space="preserve"> PAGEREF _Toc242130191 \h </w:instrText>
         </w:r>
         <w:r>
           <w:rPr>
@@ -960,17 +897,10 @@
           <w:tab w:val="right" w:leader="dot" w:pos="9537"/>
         </w:tabs>
         <w:rPr>
-          <w:rFonts w:asciiTheme="minorHAnsi" w:eastAsiaTheme="minorEastAsia" w:hAnsiTheme="minorHAnsi"/>
           <w:noProof/>
-          <w:color w:val="auto"/>
-          <w:kern w:val="2"/>
-          <w:sz w:val="24"/>
-          <w:szCs w:val="24"/>
-          <w:lang w:val="vi-VN" w:eastAsia="vi-VN"/>
-          <w14:ligatures w14:val="standardContextual"/>
         </w:rPr>
       </w:pPr>
-      <w:hyperlink w:anchor="_Toc242127615" w:history="1">
+      <w:hyperlink w:anchor="_Toc242130192" w:history="1">
         <w:r>
           <w:rPr>
             <w:rStyle w:val="Siuktni"/>
@@ -997,7 +927,7 @@
             <w:noProof/>
             <w:webHidden/>
           </w:rPr>
-          <w:instrText xml:space="preserve"> PAGEREF _Toc242127615 \h </w:instrText>
+          <w:instrText xml:space="preserve"> PAGEREF _Toc242130192 \h </w:instrText>
         </w:r>
         <w:r>
           <w:rPr>
@@ -1035,17 +965,10 @@
           <w:tab w:val="right" w:leader="dot" w:pos="9537"/>
         </w:tabs>
         <w:rPr>
-          <w:rFonts w:asciiTheme="minorHAnsi" w:eastAsiaTheme="minorEastAsia" w:hAnsiTheme="minorHAnsi"/>
           <w:noProof/>
-          <w:color w:val="auto"/>
-          <w:kern w:val="2"/>
-          <w:sz w:val="24"/>
-          <w:szCs w:val="24"/>
-          <w:lang w:val="vi-VN" w:eastAsia="vi-VN"/>
-          <w14:ligatures w14:val="standardContextual"/>
         </w:rPr>
       </w:pPr>
-      <w:hyperlink w:anchor="_Toc242127616" w:history="1">
+      <w:hyperlink w:anchor="_Toc242130193" w:history="1">
         <w:r>
           <w:rPr>
             <w:rStyle w:val="Siuktni"/>
@@ -1072,7 +995,7 @@
             <w:noProof/>
             <w:webHidden/>
           </w:rPr>
-          <w:instrText xml:space="preserve"> PAGEREF _Toc242127616 \h </w:instrText>
+          <w:instrText xml:space="preserve"> PAGEREF _Toc242130193 \h </w:instrText>
         </w:r>
         <w:r>
           <w:rPr>
@@ -1110,17 +1033,10 @@
           <w:tab w:val="right" w:leader="dot" w:pos="9537"/>
         </w:tabs>
         <w:rPr>
-          <w:rFonts w:asciiTheme="minorHAnsi" w:eastAsiaTheme="minorEastAsia" w:hAnsiTheme="minorHAnsi"/>
           <w:noProof/>
-          <w:color w:val="auto"/>
-          <w:kern w:val="2"/>
-          <w:sz w:val="24"/>
-          <w:szCs w:val="24"/>
-          <w:lang w:val="vi-VN" w:eastAsia="vi-VN"/>
-          <w14:ligatures w14:val="standardContextual"/>
         </w:rPr>
       </w:pPr>
-      <w:hyperlink w:anchor="_Toc242127617" w:history="1">
+      <w:hyperlink w:anchor="_Toc242130194" w:history="1">
         <w:r>
           <w:rPr>
             <w:rStyle w:val="Siuktni"/>
@@ -1147,7 +1063,7 @@
             <w:noProof/>
             <w:webHidden/>
           </w:rPr>
-          <w:instrText xml:space="preserve"> PAGEREF _Toc242127617 \h </w:instrText>
+          <w:instrText xml:space="preserve"> PAGEREF _Toc242130194 \h </w:instrText>
         </w:r>
         <w:r>
           <w:rPr>
@@ -1185,17 +1101,10 @@
           <w:tab w:val="right" w:leader="dot" w:pos="9537"/>
         </w:tabs>
         <w:rPr>
-          <w:rFonts w:asciiTheme="minorHAnsi" w:eastAsiaTheme="minorEastAsia" w:hAnsiTheme="minorHAnsi"/>
           <w:noProof/>
-          <w:color w:val="auto"/>
-          <w:kern w:val="2"/>
-          <w:sz w:val="24"/>
-          <w:szCs w:val="24"/>
-          <w:lang w:val="vi-VN" w:eastAsia="vi-VN"/>
-          <w14:ligatures w14:val="standardContextual"/>
         </w:rPr>
       </w:pPr>
-      <w:hyperlink w:anchor="_Toc242127618" w:history="1">
+      <w:hyperlink w:anchor="_Toc242130195" w:history="1">
         <w:r>
           <w:rPr>
             <w:rStyle w:val="Siuktni"/>
@@ -1222,7 +1131,7 @@
             <w:noProof/>
             <w:webHidden/>
           </w:rPr>
-          <w:instrText xml:space="preserve"> PAGEREF _Toc242127618 \h </w:instrText>
+          <w:instrText xml:space="preserve"> PAGEREF _Toc242130195 \h </w:instrText>
         </w:r>
         <w:r>
           <w:rPr>
@@ -1260,17 +1169,10 @@
           <w:tab w:val="right" w:leader="dot" w:pos="9537"/>
         </w:tabs>
         <w:rPr>
-          <w:rFonts w:asciiTheme="minorHAnsi" w:eastAsiaTheme="minorEastAsia" w:hAnsiTheme="minorHAnsi"/>
           <w:noProof/>
-          <w:color w:val="auto"/>
-          <w:kern w:val="2"/>
-          <w:sz w:val="24"/>
-          <w:szCs w:val="24"/>
-          <w:lang w:val="vi-VN" w:eastAsia="vi-VN"/>
-          <w14:ligatures w14:val="standardContextual"/>
         </w:rPr>
       </w:pPr>
-      <w:hyperlink w:anchor="_Toc242127619" w:history="1">
+      <w:hyperlink w:anchor="_Toc242130196" w:history="1">
         <w:r>
           <w:rPr>
             <w:rStyle w:val="Siuktni"/>
@@ -1297,7 +1199,7 @@
             <w:noProof/>
             <w:webHidden/>
           </w:rPr>
-          <w:instrText xml:space="preserve"> PAGEREF _Toc242127619 \h </w:instrText>
+          <w:instrText xml:space="preserve"> PAGEREF _Toc242130196 \h </w:instrText>
         </w:r>
         <w:r>
           <w:rPr>
@@ -1335,17 +1237,10 @@
           <w:tab w:val="right" w:leader="dot" w:pos="9537"/>
         </w:tabs>
         <w:rPr>
-          <w:rFonts w:asciiTheme="minorHAnsi" w:eastAsiaTheme="minorEastAsia" w:hAnsiTheme="minorHAnsi"/>
           <w:noProof/>
-          <w:color w:val="auto"/>
-          <w:kern w:val="2"/>
-          <w:sz w:val="24"/>
-          <w:szCs w:val="24"/>
-          <w:lang w:val="vi-VN" w:eastAsia="vi-VN"/>
-          <w14:ligatures w14:val="standardContextual"/>
         </w:rPr>
       </w:pPr>
-      <w:hyperlink w:anchor="_Toc242127620" w:history="1">
+      <w:hyperlink w:anchor="_Toc242130197" w:history="1">
         <w:r>
           <w:rPr>
             <w:rStyle w:val="Siuktni"/>
@@ -1372,7 +1267,7 @@
             <w:noProof/>
             <w:webHidden/>
           </w:rPr>
-          <w:instrText xml:space="preserve"> PAGEREF _Toc242127620 \h </w:instrText>
+          <w:instrText xml:space="preserve"> PAGEREF _Toc242130197 \h </w:instrText>
         </w:r>
         <w:r>
           <w:rPr>
@@ -1410,17 +1305,10 @@
           <w:tab w:val="right" w:leader="dot" w:pos="9537"/>
         </w:tabs>
         <w:rPr>
-          <w:rFonts w:asciiTheme="minorHAnsi" w:eastAsiaTheme="minorEastAsia" w:hAnsiTheme="minorHAnsi"/>
           <w:noProof/>
-          <w:color w:val="auto"/>
-          <w:kern w:val="2"/>
-          <w:sz w:val="24"/>
-          <w:szCs w:val="24"/>
-          <w:lang w:val="vi-VN" w:eastAsia="vi-VN"/>
-          <w14:ligatures w14:val="standardContextual"/>
         </w:rPr>
       </w:pPr>
-      <w:hyperlink w:anchor="_Toc242127621" w:history="1">
+      <w:hyperlink w:anchor="_Toc242130198" w:history="1">
         <w:r>
           <w:rPr>
             <w:rStyle w:val="Siuktni"/>
@@ -1447,7 +1335,7 @@
             <w:noProof/>
             <w:webHidden/>
           </w:rPr>
-          <w:instrText xml:space="preserve"> PAGEREF _Toc242127621 \h </w:instrText>
+          <w:instrText xml:space="preserve"> PAGEREF _Toc242130198 \h </w:instrText>
         </w:r>
         <w:r>
           <w:rPr>
@@ -1485,17 +1373,10 @@
           <w:tab w:val="right" w:leader="dot" w:pos="9537"/>
         </w:tabs>
         <w:rPr>
-          <w:rFonts w:asciiTheme="minorHAnsi" w:eastAsiaTheme="minorEastAsia" w:hAnsiTheme="minorHAnsi"/>
           <w:noProof/>
-          <w:color w:val="auto"/>
-          <w:kern w:val="2"/>
-          <w:sz w:val="24"/>
-          <w:szCs w:val="24"/>
-          <w:lang w:val="vi-VN" w:eastAsia="vi-VN"/>
-          <w14:ligatures w14:val="standardContextual"/>
         </w:rPr>
       </w:pPr>
-      <w:hyperlink w:anchor="_Toc242127622" w:history="1">
+      <w:hyperlink w:anchor="_Toc242130199" w:history="1">
         <w:r>
           <w:rPr>
             <w:rStyle w:val="Siuktni"/>
@@ -1522,7 +1403,7 @@
             <w:noProof/>
             <w:webHidden/>
           </w:rPr>
-          <w:instrText xml:space="preserve"> PAGEREF _Toc242127622 \h </w:instrText>
+          <w:instrText xml:space="preserve"> PAGEREF _Toc242130199 \h </w:instrText>
         </w:r>
         <w:r>
           <w:rPr>
@@ -1560,17 +1441,10 @@
           <w:tab w:val="right" w:leader="dot" w:pos="9537"/>
         </w:tabs>
         <w:rPr>
-          <w:rFonts w:asciiTheme="minorHAnsi" w:eastAsiaTheme="minorEastAsia" w:hAnsiTheme="minorHAnsi"/>
           <w:noProof/>
-          <w:color w:val="auto"/>
-          <w:kern w:val="2"/>
-          <w:sz w:val="24"/>
-          <w:szCs w:val="24"/>
-          <w:lang w:val="vi-VN" w:eastAsia="vi-VN"/>
-          <w14:ligatures w14:val="standardContextual"/>
         </w:rPr>
       </w:pPr>
-      <w:hyperlink w:anchor="_Toc242127623" w:history="1">
+      <w:hyperlink w:anchor="_Toc242130200" w:history="1">
         <w:r>
           <w:rPr>
             <w:rStyle w:val="Siuktni"/>
@@ -1597,7 +1471,7 @@
             <w:noProof/>
             <w:webHidden/>
           </w:rPr>
-          <w:instrText xml:space="preserve"> PAGEREF _Toc242127623 \h </w:instrText>
+          <w:instrText xml:space="preserve"> PAGEREF _Toc242130200 \h </w:instrText>
         </w:r>
         <w:r>
           <w:rPr>
@@ -1635,17 +1509,10 @@
           <w:tab w:val="right" w:leader="dot" w:pos="9537"/>
         </w:tabs>
         <w:rPr>
-          <w:rFonts w:asciiTheme="minorHAnsi" w:eastAsiaTheme="minorEastAsia" w:hAnsiTheme="minorHAnsi"/>
           <w:noProof/>
-          <w:color w:val="auto"/>
-          <w:kern w:val="2"/>
-          <w:sz w:val="24"/>
-          <w:szCs w:val="24"/>
-          <w:lang w:val="vi-VN" w:eastAsia="vi-VN"/>
-          <w14:ligatures w14:val="standardContextual"/>
         </w:rPr>
       </w:pPr>
-      <w:hyperlink w:anchor="_Toc242127624" w:history="1">
+      <w:hyperlink w:anchor="_Toc242130201" w:history="1">
         <w:r>
           <w:rPr>
             <w:rStyle w:val="Siuktni"/>
@@ -1672,7 +1539,7 @@
             <w:noProof/>
             <w:webHidden/>
           </w:rPr>
-          <w:instrText xml:space="preserve"> PAGEREF _Toc242127624 \h </w:instrText>
+          <w:instrText xml:space="preserve"> PAGEREF _Toc242130201 \h </w:instrText>
         </w:r>
         <w:r>
           <w:rPr>
@@ -1710,17 +1577,10 @@
           <w:tab w:val="right" w:leader="dot" w:pos="9537"/>
         </w:tabs>
         <w:rPr>
-          <w:rFonts w:asciiTheme="minorHAnsi" w:eastAsiaTheme="minorEastAsia" w:hAnsiTheme="minorHAnsi"/>
           <w:noProof/>
-          <w:color w:val="auto"/>
-          <w:kern w:val="2"/>
-          <w:sz w:val="24"/>
-          <w:szCs w:val="24"/>
-          <w:lang w:val="vi-VN" w:eastAsia="vi-VN"/>
-          <w14:ligatures w14:val="standardContextual"/>
         </w:rPr>
       </w:pPr>
-      <w:hyperlink w:anchor="_Toc242127625" w:history="1">
+      <w:hyperlink w:anchor="_Toc242130202" w:history="1">
         <w:r>
           <w:rPr>
             <w:rStyle w:val="Siuktni"/>
@@ -1747,7 +1607,7 @@
             <w:noProof/>
             <w:webHidden/>
           </w:rPr>
-          <w:instrText xml:space="preserve"> PAGEREF _Toc242127625 \h </w:instrText>
+          <w:instrText xml:space="preserve"> PAGEREF _Toc242130202 \h </w:instrText>
         </w:r>
         <w:r>
           <w:rPr>
@@ -1785,17 +1645,10 @@
           <w:tab w:val="right" w:leader="dot" w:pos="9537"/>
         </w:tabs>
         <w:rPr>
-          <w:rFonts w:asciiTheme="minorHAnsi" w:eastAsiaTheme="minorEastAsia" w:hAnsiTheme="minorHAnsi"/>
           <w:noProof/>
-          <w:color w:val="auto"/>
-          <w:kern w:val="2"/>
-          <w:sz w:val="24"/>
-          <w:szCs w:val="24"/>
-          <w:lang w:val="vi-VN" w:eastAsia="vi-VN"/>
-          <w14:ligatures w14:val="standardContextual"/>
         </w:rPr>
       </w:pPr>
-      <w:hyperlink w:anchor="_Toc242127626" w:history="1">
+      <w:hyperlink w:anchor="_Toc242130203" w:history="1">
         <w:r>
           <w:rPr>
             <w:rStyle w:val="Siuktni"/>
@@ -1822,7 +1675,7 @@
             <w:noProof/>
             <w:webHidden/>
           </w:rPr>
-          <w:instrText xml:space="preserve"> PAGEREF _Toc242127626 \h </w:instrText>
+          <w:instrText xml:space="preserve"> PAGEREF _Toc242130203 \h </w:instrText>
         </w:r>
         <w:r>
           <w:rPr>
@@ -1860,17 +1713,10 @@
           <w:tab w:val="right" w:leader="dot" w:pos="9537"/>
         </w:tabs>
         <w:rPr>
-          <w:rFonts w:asciiTheme="minorHAnsi" w:eastAsiaTheme="minorEastAsia" w:hAnsiTheme="minorHAnsi"/>
           <w:noProof/>
-          <w:color w:val="auto"/>
-          <w:kern w:val="2"/>
-          <w:sz w:val="24"/>
-          <w:szCs w:val="24"/>
-          <w:lang w:val="vi-VN" w:eastAsia="vi-VN"/>
-          <w14:ligatures w14:val="standardContextual"/>
         </w:rPr>
       </w:pPr>
-      <w:hyperlink w:anchor="_Toc242127627" w:history="1">
+      <w:hyperlink w:anchor="_Toc242130204" w:history="1">
         <w:r>
           <w:rPr>
             <w:rStyle w:val="Siuktni"/>
@@ -1897,7 +1743,7 @@
             <w:noProof/>
             <w:webHidden/>
           </w:rPr>
-          <w:instrText xml:space="preserve"> PAGEREF _Toc242127627 \h </w:instrText>
+          <w:instrText xml:space="preserve"> PAGEREF _Toc242130204 \h </w:instrText>
         </w:r>
         <w:r>
           <w:rPr>
@@ -1935,17 +1781,10 @@
           <w:tab w:val="right" w:leader="dot" w:pos="9537"/>
         </w:tabs>
         <w:rPr>
-          <w:rFonts w:asciiTheme="minorHAnsi" w:eastAsiaTheme="minorEastAsia" w:hAnsiTheme="minorHAnsi"/>
           <w:noProof/>
-          <w:color w:val="auto"/>
-          <w:kern w:val="2"/>
-          <w:sz w:val="24"/>
-          <w:szCs w:val="24"/>
-          <w:lang w:val="vi-VN" w:eastAsia="vi-VN"/>
-          <w14:ligatures w14:val="standardContextual"/>
         </w:rPr>
       </w:pPr>
-      <w:hyperlink w:anchor="_Toc242127628" w:history="1">
+      <w:hyperlink w:anchor="_Toc242130205" w:history="1">
         <w:r>
           <w:rPr>
             <w:rStyle w:val="Siuktni"/>
@@ -1972,7 +1811,7 @@
             <w:noProof/>
             <w:webHidden/>
           </w:rPr>
-          <w:instrText xml:space="preserve"> PAGEREF _Toc242127628 \h </w:instrText>
+          <w:instrText xml:space="preserve"> PAGEREF _Toc242130205 \h </w:instrText>
         </w:r>
         <w:r>
           <w:rPr>
@@ -2010,17 +1849,10 @@
           <w:tab w:val="right" w:leader="dot" w:pos="9537"/>
         </w:tabs>
         <w:rPr>
-          <w:rFonts w:asciiTheme="minorHAnsi" w:eastAsiaTheme="minorEastAsia" w:hAnsiTheme="minorHAnsi"/>
           <w:noProof/>
-          <w:color w:val="auto"/>
-          <w:kern w:val="2"/>
-          <w:sz w:val="24"/>
-          <w:szCs w:val="24"/>
-          <w:lang w:val="vi-VN" w:eastAsia="vi-VN"/>
-          <w14:ligatures w14:val="standardContextual"/>
         </w:rPr>
       </w:pPr>
-      <w:hyperlink w:anchor="_Toc242127629" w:history="1">
+      <w:hyperlink w:anchor="_Toc242130206" w:history="1">
         <w:r>
           <w:rPr>
             <w:rStyle w:val="Siuktni"/>
@@ -2047,7 +1879,7 @@
             <w:noProof/>
             <w:webHidden/>
           </w:rPr>
-          <w:instrText xml:space="preserve"> PAGEREF _Toc242127629 \h </w:instrText>
+          <w:instrText xml:space="preserve"> PAGEREF _Toc242130206 \h </w:instrText>
         </w:r>
         <w:r>
           <w:rPr>
@@ -2085,17 +1917,10 @@
           <w:tab w:val="right" w:leader="dot" w:pos="9537"/>
         </w:tabs>
         <w:rPr>
-          <w:rFonts w:asciiTheme="minorHAnsi" w:eastAsiaTheme="minorEastAsia" w:hAnsiTheme="minorHAnsi"/>
           <w:noProof/>
-          <w:color w:val="auto"/>
-          <w:kern w:val="2"/>
-          <w:sz w:val="24"/>
-          <w:szCs w:val="24"/>
-          <w:lang w:val="vi-VN" w:eastAsia="vi-VN"/>
-          <w14:ligatures w14:val="standardContextual"/>
         </w:rPr>
       </w:pPr>
-      <w:hyperlink w:anchor="_Toc242127630" w:history="1">
+      <w:hyperlink w:anchor="_Toc242130207" w:history="1">
         <w:r>
           <w:rPr>
             <w:rStyle w:val="Siuktni"/>
@@ -2122,7 +1947,7 @@
             <w:noProof/>
             <w:webHidden/>
           </w:rPr>
-          <w:instrText xml:space="preserve"> PAGEREF _Toc242127630 \h </w:instrText>
+          <w:instrText xml:space="preserve"> PAGEREF _Toc242130207 \h </w:instrText>
         </w:r>
         <w:r>
           <w:rPr>
@@ -2160,17 +1985,10 @@
           <w:tab w:val="right" w:leader="dot" w:pos="9537"/>
         </w:tabs>
         <w:rPr>
-          <w:rFonts w:asciiTheme="minorHAnsi" w:eastAsiaTheme="minorEastAsia" w:hAnsiTheme="minorHAnsi"/>
           <w:noProof/>
-          <w:color w:val="auto"/>
-          <w:kern w:val="2"/>
-          <w:sz w:val="24"/>
-          <w:szCs w:val="24"/>
-          <w:lang w:val="vi-VN" w:eastAsia="vi-VN"/>
-          <w14:ligatures w14:val="standardContextual"/>
         </w:rPr>
       </w:pPr>
-      <w:hyperlink w:anchor="_Toc242127631" w:history="1">
+      <w:hyperlink w:anchor="_Toc242130208" w:history="1">
         <w:r>
           <w:rPr>
             <w:rStyle w:val="Siuktni"/>
@@ -2197,7 +2015,7 @@
             <w:noProof/>
             <w:webHidden/>
           </w:rPr>
-          <w:instrText xml:space="preserve"> PAGEREF _Toc242127631 \h </w:instrText>
+          <w:instrText xml:space="preserve"> PAGEREF _Toc242130208 \h </w:instrText>
         </w:r>
         <w:r>
           <w:rPr>
@@ -2235,17 +2053,10 @@
           <w:tab w:val="right" w:leader="dot" w:pos="9537"/>
         </w:tabs>
         <w:rPr>
-          <w:rFonts w:asciiTheme="minorHAnsi" w:eastAsiaTheme="minorEastAsia" w:hAnsiTheme="minorHAnsi"/>
           <w:noProof/>
-          <w:color w:val="auto"/>
-          <w:kern w:val="2"/>
-          <w:sz w:val="24"/>
-          <w:szCs w:val="24"/>
-          <w:lang w:val="vi-VN" w:eastAsia="vi-VN"/>
-          <w14:ligatures w14:val="standardContextual"/>
         </w:rPr>
       </w:pPr>
-      <w:hyperlink w:anchor="_Toc242127632" w:history="1">
+      <w:hyperlink w:anchor="_Toc242130209" w:history="1">
         <w:r>
           <w:rPr>
             <w:rStyle w:val="Siuktni"/>
@@ -2272,7 +2083,7 @@
             <w:noProof/>
             <w:webHidden/>
           </w:rPr>
-          <w:instrText xml:space="preserve"> PAGEREF _Toc242127632 \h </w:instrText>
+          <w:instrText xml:space="preserve"> PAGEREF _Toc242130209 \h </w:instrText>
         </w:r>
         <w:r>
           <w:rPr>
@@ -2310,17 +2121,10 @@
           <w:tab w:val="right" w:leader="dot" w:pos="9537"/>
         </w:tabs>
         <w:rPr>
-          <w:rFonts w:asciiTheme="minorHAnsi" w:eastAsiaTheme="minorEastAsia" w:hAnsiTheme="minorHAnsi"/>
           <w:noProof/>
-          <w:color w:val="auto"/>
-          <w:kern w:val="2"/>
-          <w:sz w:val="24"/>
-          <w:szCs w:val="24"/>
-          <w:lang w:val="vi-VN" w:eastAsia="vi-VN"/>
-          <w14:ligatures w14:val="standardContextual"/>
         </w:rPr>
       </w:pPr>
-      <w:hyperlink w:anchor="_Toc242127633" w:history="1">
+      <w:hyperlink w:anchor="_Toc242130210" w:history="1">
         <w:r>
           <w:rPr>
             <w:rStyle w:val="Siuktni"/>
@@ -2347,7 +2151,7 @@
             <w:noProof/>
             <w:webHidden/>
           </w:rPr>
-          <w:instrText xml:space="preserve"> PAGEREF _Toc242127633 \h </w:instrText>
+          <w:instrText xml:space="preserve"> PAGEREF _Toc242130210 \h </w:instrText>
         </w:r>
         <w:r>
           <w:rPr>
@@ -2385,17 +2189,10 @@
           <w:tab w:val="right" w:leader="dot" w:pos="9537"/>
         </w:tabs>
         <w:rPr>
-          <w:rFonts w:asciiTheme="minorHAnsi" w:eastAsiaTheme="minorEastAsia" w:hAnsiTheme="minorHAnsi"/>
           <w:noProof/>
-          <w:color w:val="auto"/>
-          <w:kern w:val="2"/>
-          <w:sz w:val="24"/>
-          <w:szCs w:val="24"/>
-          <w:lang w:val="vi-VN" w:eastAsia="vi-VN"/>
-          <w14:ligatures w14:val="standardContextual"/>
         </w:rPr>
       </w:pPr>
-      <w:hyperlink w:anchor="_Toc242127634" w:history="1">
+      <w:hyperlink w:anchor="_Toc242130211" w:history="1">
         <w:r>
           <w:rPr>
             <w:rStyle w:val="Siuktni"/>
@@ -2422,7 +2219,7 @@
             <w:noProof/>
             <w:webHidden/>
           </w:rPr>
-          <w:instrText xml:space="preserve"> PAGEREF _Toc242127634 \h </w:instrText>
+          <w:instrText xml:space="preserve"> PAGEREF _Toc242130211 \h </w:instrText>
         </w:r>
         <w:r>
           <w:rPr>
@@ -2460,17 +2257,10 @@
           <w:tab w:val="right" w:leader="dot" w:pos="9537"/>
         </w:tabs>
         <w:rPr>
-          <w:rFonts w:asciiTheme="minorHAnsi" w:eastAsiaTheme="minorEastAsia" w:hAnsiTheme="minorHAnsi"/>
           <w:noProof/>
-          <w:color w:val="auto"/>
-          <w:kern w:val="2"/>
-          <w:sz w:val="24"/>
-          <w:szCs w:val="24"/>
-          <w:lang w:val="vi-VN" w:eastAsia="vi-VN"/>
-          <w14:ligatures w14:val="standardContextual"/>
         </w:rPr>
       </w:pPr>
-      <w:hyperlink w:anchor="_Toc242127635" w:history="1">
+      <w:hyperlink w:anchor="_Toc242130212" w:history="1">
         <w:r>
           <w:rPr>
             <w:rStyle w:val="Siuktni"/>
@@ -2497,7 +2287,7 @@
             <w:noProof/>
             <w:webHidden/>
           </w:rPr>
-          <w:instrText xml:space="preserve"> PAGEREF _Toc242127635 \h </w:instrText>
+          <w:instrText xml:space="preserve"> PAGEREF _Toc242130212 \h </w:instrText>
         </w:r>
         <w:r>
           <w:rPr>
@@ -2535,17 +2325,10 @@
           <w:tab w:val="right" w:leader="dot" w:pos="9537"/>
         </w:tabs>
         <w:rPr>
-          <w:rFonts w:asciiTheme="minorHAnsi" w:eastAsiaTheme="minorEastAsia" w:hAnsiTheme="minorHAnsi"/>
           <w:noProof/>
-          <w:color w:val="auto"/>
-          <w:kern w:val="2"/>
-          <w:sz w:val="24"/>
-          <w:szCs w:val="24"/>
-          <w:lang w:val="vi-VN" w:eastAsia="vi-VN"/>
-          <w14:ligatures w14:val="standardContextual"/>
         </w:rPr>
       </w:pPr>
-      <w:hyperlink w:anchor="_Toc242127636" w:history="1">
+      <w:hyperlink w:anchor="_Toc242130213" w:history="1">
         <w:r>
           <w:rPr>
             <w:rStyle w:val="Siuktni"/>
@@ -2572,7 +2355,7 @@
             <w:noProof/>
             <w:webHidden/>
           </w:rPr>
-          <w:instrText xml:space="preserve"> PAGEREF _Toc242127636 \h </w:instrText>
+          <w:instrText xml:space="preserve"> PAGEREF _Toc242130213 \h </w:instrText>
         </w:r>
         <w:r>
           <w:rPr>
@@ -2610,17 +2393,10 @@
           <w:tab w:val="right" w:leader="dot" w:pos="9537"/>
         </w:tabs>
         <w:rPr>
-          <w:rFonts w:asciiTheme="minorHAnsi" w:eastAsiaTheme="minorEastAsia" w:hAnsiTheme="minorHAnsi"/>
           <w:noProof/>
-          <w:color w:val="auto"/>
-          <w:kern w:val="2"/>
-          <w:sz w:val="24"/>
-          <w:szCs w:val="24"/>
-          <w:lang w:val="vi-VN" w:eastAsia="vi-VN"/>
-          <w14:ligatures w14:val="standardContextual"/>
         </w:rPr>
       </w:pPr>
-      <w:hyperlink w:anchor="_Toc242127637" w:history="1">
+      <w:hyperlink w:anchor="_Toc242130214" w:history="1">
         <w:r>
           <w:rPr>
             <w:rStyle w:val="Siuktni"/>
@@ -2647,7 +2423,7 @@
             <w:noProof/>
             <w:webHidden/>
           </w:rPr>
-          <w:instrText xml:space="preserve"> PAGEREF _Toc242127637 \h </w:instrText>
+          <w:instrText xml:space="preserve"> PAGEREF _Toc242130214 \h </w:instrText>
         </w:r>
         <w:r>
           <w:rPr>
@@ -2685,17 +2461,10 @@
           <w:tab w:val="right" w:leader="dot" w:pos="9537"/>
         </w:tabs>
         <w:rPr>
-          <w:rFonts w:asciiTheme="minorHAnsi" w:eastAsiaTheme="minorEastAsia" w:hAnsiTheme="minorHAnsi"/>
           <w:noProof/>
-          <w:color w:val="auto"/>
-          <w:kern w:val="2"/>
-          <w:sz w:val="24"/>
-          <w:szCs w:val="24"/>
-          <w:lang w:val="vi-VN" w:eastAsia="vi-VN"/>
-          <w14:ligatures w14:val="standardContextual"/>
         </w:rPr>
       </w:pPr>
-      <w:hyperlink w:anchor="_Toc242127638" w:history="1">
+      <w:hyperlink w:anchor="_Toc242130215" w:history="1">
         <w:r>
           <w:rPr>
             <w:rStyle w:val="Siuktni"/>
@@ -2722,7 +2491,7 @@
             <w:noProof/>
             <w:webHidden/>
           </w:rPr>
-          <w:instrText xml:space="preserve"> PAGEREF _Toc242127638 \h </w:instrText>
+          <w:instrText xml:space="preserve"> PAGEREF _Toc242130215 \h </w:instrText>
         </w:r>
         <w:r>
           <w:rPr>
@@ -2760,17 +2529,10 @@
           <w:tab w:val="right" w:leader="dot" w:pos="9537"/>
         </w:tabs>
         <w:rPr>
-          <w:rFonts w:asciiTheme="minorHAnsi" w:eastAsiaTheme="minorEastAsia" w:hAnsiTheme="minorHAnsi"/>
           <w:noProof/>
-          <w:color w:val="auto"/>
-          <w:kern w:val="2"/>
-          <w:sz w:val="24"/>
-          <w:szCs w:val="24"/>
-          <w:lang w:val="vi-VN" w:eastAsia="vi-VN"/>
-          <w14:ligatures w14:val="standardContextual"/>
         </w:rPr>
       </w:pPr>
-      <w:hyperlink w:anchor="_Toc242127639" w:history="1">
+      <w:hyperlink w:anchor="_Toc242130216" w:history="1">
         <w:r>
           <w:rPr>
             <w:rStyle w:val="Siuktni"/>
@@ -2797,7 +2559,7 @@
             <w:noProof/>
             <w:webHidden/>
           </w:rPr>
-          <w:instrText xml:space="preserve"> PAGEREF _Toc242127639 \h </w:instrText>
+          <w:instrText xml:space="preserve"> PAGEREF _Toc242130216 \h </w:instrText>
         </w:r>
         <w:r>
           <w:rPr>
@@ -2835,17 +2597,10 @@
           <w:tab w:val="right" w:leader="dot" w:pos="9537"/>
         </w:tabs>
         <w:rPr>
-          <w:rFonts w:asciiTheme="minorHAnsi" w:eastAsiaTheme="minorEastAsia" w:hAnsiTheme="minorHAnsi"/>
           <w:noProof/>
-          <w:color w:val="auto"/>
-          <w:kern w:val="2"/>
-          <w:sz w:val="24"/>
-          <w:szCs w:val="24"/>
-          <w:lang w:val="vi-VN" w:eastAsia="vi-VN"/>
-          <w14:ligatures w14:val="standardContextual"/>
         </w:rPr>
       </w:pPr>
-      <w:hyperlink w:anchor="_Toc242127640" w:history="1">
+      <w:hyperlink w:anchor="_Toc242130217" w:history="1">
         <w:r>
           <w:rPr>
             <w:rStyle w:val="Siuktni"/>
@@ -2872,7 +2627,7 @@
             <w:noProof/>
             <w:webHidden/>
           </w:rPr>
-          <w:instrText xml:space="preserve"> PAGEREF _Toc242127640 \h </w:instrText>
+          <w:instrText xml:space="preserve"> PAGEREF _Toc242130217 \h </w:instrText>
         </w:r>
         <w:r>
           <w:rPr>
@@ -2910,17 +2665,10 @@
           <w:tab w:val="right" w:leader="dot" w:pos="9537"/>
         </w:tabs>
         <w:rPr>
-          <w:rFonts w:asciiTheme="minorHAnsi" w:eastAsiaTheme="minorEastAsia" w:hAnsiTheme="minorHAnsi"/>
           <w:noProof/>
-          <w:color w:val="auto"/>
-          <w:kern w:val="2"/>
-          <w:sz w:val="24"/>
-          <w:szCs w:val="24"/>
-          <w:lang w:val="vi-VN" w:eastAsia="vi-VN"/>
-          <w14:ligatures w14:val="standardContextual"/>
         </w:rPr>
       </w:pPr>
-      <w:hyperlink w:anchor="_Toc242127641" w:history="1">
+      <w:hyperlink w:anchor="_Toc242130218" w:history="1">
         <w:r>
           <w:rPr>
             <w:rStyle w:val="Siuktni"/>
@@ -2947,7 +2695,7 @@
             <w:noProof/>
             <w:webHidden/>
           </w:rPr>
-          <w:instrText xml:space="preserve"> PAGEREF _Toc242127641 \h </w:instrText>
+          <w:instrText xml:space="preserve"> PAGEREF _Toc242130218 \h </w:instrText>
         </w:r>
         <w:r>
           <w:rPr>
@@ -2985,17 +2733,10 @@
           <w:tab w:val="right" w:leader="dot" w:pos="9537"/>
         </w:tabs>
         <w:rPr>
-          <w:rFonts w:asciiTheme="minorHAnsi" w:eastAsiaTheme="minorEastAsia" w:hAnsiTheme="minorHAnsi"/>
           <w:noProof/>
-          <w:color w:val="auto"/>
-          <w:kern w:val="2"/>
-          <w:sz w:val="24"/>
-          <w:szCs w:val="24"/>
-          <w:lang w:val="vi-VN" w:eastAsia="vi-VN"/>
-          <w14:ligatures w14:val="standardContextual"/>
         </w:rPr>
       </w:pPr>
-      <w:hyperlink w:anchor="_Toc242127642" w:history="1">
+      <w:hyperlink w:anchor="_Toc242130219" w:history="1">
         <w:r>
           <w:rPr>
             <w:rStyle w:val="Siuktni"/>
@@ -3022,7 +2763,7 @@
             <w:noProof/>
             <w:webHidden/>
           </w:rPr>
-          <w:instrText xml:space="preserve"> PAGEREF _Toc242127642 \h </w:instrText>
+          <w:instrText xml:space="preserve"> PAGEREF _Toc242130219 \h </w:instrText>
         </w:r>
         <w:r>
           <w:rPr>
@@ -3060,17 +2801,10 @@
           <w:tab w:val="right" w:leader="dot" w:pos="9537"/>
         </w:tabs>
         <w:rPr>
-          <w:rFonts w:asciiTheme="minorHAnsi" w:eastAsiaTheme="minorEastAsia" w:hAnsiTheme="minorHAnsi"/>
           <w:noProof/>
-          <w:color w:val="auto"/>
-          <w:kern w:val="2"/>
-          <w:sz w:val="24"/>
-          <w:szCs w:val="24"/>
-          <w:lang w:val="vi-VN" w:eastAsia="vi-VN"/>
-          <w14:ligatures w14:val="standardContextual"/>
         </w:rPr>
       </w:pPr>
-      <w:hyperlink w:anchor="_Toc242127643" w:history="1">
+      <w:hyperlink w:anchor="_Toc242130220" w:history="1">
         <w:r>
           <w:rPr>
             <w:rStyle w:val="Siuktni"/>
@@ -3097,7 +2831,7 @@
             <w:noProof/>
             <w:webHidden/>
           </w:rPr>
-          <w:instrText xml:space="preserve"> PAGEREF _Toc242127643 \h </w:instrText>
+          <w:instrText xml:space="preserve"> PAGEREF _Toc242130220 \h </w:instrText>
         </w:r>
         <w:r>
           <w:rPr>
@@ -3135,17 +2869,10 @@
           <w:tab w:val="right" w:leader="dot" w:pos="9537"/>
         </w:tabs>
         <w:rPr>
-          <w:rFonts w:asciiTheme="minorHAnsi" w:eastAsiaTheme="minorEastAsia" w:hAnsiTheme="minorHAnsi"/>
           <w:noProof/>
-          <w:color w:val="auto"/>
-          <w:kern w:val="2"/>
-          <w:sz w:val="24"/>
-          <w:szCs w:val="24"/>
-          <w:lang w:val="vi-VN" w:eastAsia="vi-VN"/>
-          <w14:ligatures w14:val="standardContextual"/>
         </w:rPr>
       </w:pPr>
-      <w:hyperlink w:anchor="_Toc242127644" w:history="1">
+      <w:hyperlink w:anchor="_Toc242130221" w:history="1">
         <w:r>
           <w:rPr>
             <w:rStyle w:val="Siuktni"/>
@@ -3172,7 +2899,7 @@
             <w:noProof/>
             <w:webHidden/>
           </w:rPr>
-          <w:instrText xml:space="preserve"> PAGEREF _Toc242127644 \h </w:instrText>
+          <w:instrText xml:space="preserve"> PAGEREF _Toc242130221 \h </w:instrText>
         </w:r>
         <w:r>
           <w:rPr>
@@ -3210,17 +2937,10 @@
           <w:tab w:val="right" w:leader="dot" w:pos="9537"/>
         </w:tabs>
         <w:rPr>
-          <w:rFonts w:asciiTheme="minorHAnsi" w:eastAsiaTheme="minorEastAsia" w:hAnsiTheme="minorHAnsi"/>
           <w:noProof/>
-          <w:color w:val="auto"/>
-          <w:kern w:val="2"/>
-          <w:sz w:val="24"/>
-          <w:szCs w:val="24"/>
-          <w:lang w:val="vi-VN" w:eastAsia="vi-VN"/>
-          <w14:ligatures w14:val="standardContextual"/>
         </w:rPr>
       </w:pPr>
-      <w:hyperlink w:anchor="_Toc242127645" w:history="1">
+      <w:hyperlink w:anchor="_Toc242130222" w:history="1">
         <w:r>
           <w:rPr>
             <w:rStyle w:val="Siuktni"/>
@@ -3247,7 +2967,7 @@
             <w:noProof/>
             <w:webHidden/>
           </w:rPr>
-          <w:instrText xml:space="preserve"> PAGEREF _Toc242127645 \h </w:instrText>
+          <w:instrText xml:space="preserve"> PAGEREF _Toc242130222 \h </w:instrText>
         </w:r>
         <w:r>
           <w:rPr>
@@ -3285,17 +3005,10 @@
           <w:tab w:val="right" w:leader="dot" w:pos="9537"/>
         </w:tabs>
         <w:rPr>
-          <w:rFonts w:asciiTheme="minorHAnsi" w:eastAsiaTheme="minorEastAsia" w:hAnsiTheme="minorHAnsi"/>
           <w:noProof/>
-          <w:color w:val="auto"/>
-          <w:kern w:val="2"/>
-          <w:sz w:val="24"/>
-          <w:szCs w:val="24"/>
-          <w:lang w:val="vi-VN" w:eastAsia="vi-VN"/>
-          <w14:ligatures w14:val="standardContextual"/>
         </w:rPr>
       </w:pPr>
-      <w:hyperlink w:anchor="_Toc242127646" w:history="1">
+      <w:hyperlink w:anchor="_Toc242130223" w:history="1">
         <w:r>
           <w:rPr>
             <w:rStyle w:val="Siuktni"/>
@@ -3322,7 +3035,7 @@
             <w:noProof/>
             <w:webHidden/>
           </w:rPr>
-          <w:instrText xml:space="preserve"> PAGEREF _Toc242127646 \h </w:instrText>
+          <w:instrText xml:space="preserve"> PAGEREF _Toc242130223 \h </w:instrText>
         </w:r>
         <w:r>
           <w:rPr>
@@ -3360,17 +3073,10 @@
           <w:tab w:val="right" w:leader="dot" w:pos="9537"/>
         </w:tabs>
         <w:rPr>
-          <w:rFonts w:asciiTheme="minorHAnsi" w:eastAsiaTheme="minorEastAsia" w:hAnsiTheme="minorHAnsi"/>
           <w:noProof/>
-          <w:color w:val="auto"/>
-          <w:kern w:val="2"/>
-          <w:sz w:val="24"/>
-          <w:szCs w:val="24"/>
-          <w:lang w:val="vi-VN" w:eastAsia="vi-VN"/>
-          <w14:ligatures w14:val="standardContextual"/>
         </w:rPr>
       </w:pPr>
-      <w:hyperlink w:anchor="_Toc242127647" w:history="1">
+      <w:hyperlink w:anchor="_Toc242130224" w:history="1">
         <w:r>
           <w:rPr>
             <w:rStyle w:val="Siuktni"/>
@@ -3397,7 +3103,7 @@
             <w:noProof/>
             <w:webHidden/>
           </w:rPr>
-          <w:instrText xml:space="preserve"> PAGEREF _Toc242127647 \h </w:instrText>
+          <w:instrText xml:space="preserve"> PAGEREF _Toc242130224 \h </w:instrText>
         </w:r>
         <w:r>
           <w:rPr>
@@ -3435,17 +3141,10 @@
           <w:tab w:val="right" w:leader="dot" w:pos="9537"/>
         </w:tabs>
         <w:rPr>
-          <w:rFonts w:asciiTheme="minorHAnsi" w:eastAsiaTheme="minorEastAsia" w:hAnsiTheme="minorHAnsi"/>
           <w:noProof/>
-          <w:color w:val="auto"/>
-          <w:kern w:val="2"/>
-          <w:sz w:val="24"/>
-          <w:szCs w:val="24"/>
-          <w:lang w:val="vi-VN" w:eastAsia="vi-VN"/>
-          <w14:ligatures w14:val="standardContextual"/>
         </w:rPr>
       </w:pPr>
-      <w:hyperlink w:anchor="_Toc242127648" w:history="1">
+      <w:hyperlink w:anchor="_Toc242130225" w:history="1">
         <w:r>
           <w:rPr>
             <w:rStyle w:val="Siuktni"/>
@@ -3472,7 +3171,7 @@
             <w:noProof/>
             <w:webHidden/>
           </w:rPr>
-          <w:instrText xml:space="preserve"> PAGEREF _Toc242127648 \h </w:instrText>
+          <w:instrText xml:space="preserve"> PAGEREF _Toc242130225 \h </w:instrText>
         </w:r>
         <w:r>
           <w:rPr>
@@ -3510,17 +3209,10 @@
           <w:tab w:val="right" w:leader="dot" w:pos="9537"/>
         </w:tabs>
         <w:rPr>
-          <w:rFonts w:asciiTheme="minorHAnsi" w:eastAsiaTheme="minorEastAsia" w:hAnsiTheme="minorHAnsi"/>
           <w:noProof/>
-          <w:color w:val="auto"/>
-          <w:kern w:val="2"/>
-          <w:sz w:val="24"/>
-          <w:szCs w:val="24"/>
-          <w:lang w:val="vi-VN" w:eastAsia="vi-VN"/>
-          <w14:ligatures w14:val="standardContextual"/>
         </w:rPr>
       </w:pPr>
-      <w:hyperlink w:anchor="_Toc242127649" w:history="1">
+      <w:hyperlink w:anchor="_Toc242130226" w:history="1">
         <w:r>
           <w:rPr>
             <w:rStyle w:val="Siuktni"/>
@@ -3547,7 +3239,7 @@
             <w:noProof/>
             <w:webHidden/>
           </w:rPr>
-          <w:instrText xml:space="preserve"> PAGEREF _Toc242127649 \h </w:instrText>
+          <w:instrText xml:space="preserve"> PAGEREF _Toc242130226 \h </w:instrText>
         </w:r>
         <w:r>
           <w:rPr>
@@ -3585,17 +3277,10 @@
           <w:tab w:val="right" w:leader="dot" w:pos="9537"/>
         </w:tabs>
         <w:rPr>
-          <w:rFonts w:asciiTheme="minorHAnsi" w:eastAsiaTheme="minorEastAsia" w:hAnsiTheme="minorHAnsi"/>
           <w:noProof/>
-          <w:color w:val="auto"/>
-          <w:kern w:val="2"/>
-          <w:sz w:val="24"/>
-          <w:szCs w:val="24"/>
-          <w:lang w:val="vi-VN" w:eastAsia="vi-VN"/>
-          <w14:ligatures w14:val="standardContextual"/>
         </w:rPr>
       </w:pPr>
-      <w:hyperlink w:anchor="_Toc242127650" w:history="1">
+      <w:hyperlink w:anchor="_Toc242130227" w:history="1">
         <w:r>
           <w:rPr>
             <w:rStyle w:val="Siuktni"/>
@@ -3622,7 +3307,7 @@
             <w:noProof/>
             <w:webHidden/>
           </w:rPr>
-          <w:instrText xml:space="preserve"> PAGEREF _Toc242127650 \h </w:instrText>
+          <w:instrText xml:space="preserve"> PAGEREF _Toc242130227 \h </w:instrText>
         </w:r>
         <w:r>
           <w:rPr>
@@ -3660,17 +3345,10 @@
           <w:tab w:val="right" w:leader="dot" w:pos="9537"/>
         </w:tabs>
         <w:rPr>
-          <w:rFonts w:asciiTheme="minorHAnsi" w:eastAsiaTheme="minorEastAsia" w:hAnsiTheme="minorHAnsi"/>
           <w:noProof/>
-          <w:color w:val="auto"/>
-          <w:kern w:val="2"/>
-          <w:sz w:val="24"/>
-          <w:szCs w:val="24"/>
-          <w:lang w:val="vi-VN" w:eastAsia="vi-VN"/>
-          <w14:ligatures w14:val="standardContextual"/>
         </w:rPr>
       </w:pPr>
-      <w:hyperlink w:anchor="_Toc242127651" w:history="1">
+      <w:hyperlink w:anchor="_Toc242130228" w:history="1">
         <w:r>
           <w:rPr>
             <w:rStyle w:val="Siuktni"/>
@@ -3697,7 +3375,7 @@
             <w:noProof/>
             <w:webHidden/>
           </w:rPr>
-          <w:instrText xml:space="preserve"> PAGEREF _Toc242127651 \h </w:instrText>
+          <w:instrText xml:space="preserve"> PAGEREF _Toc242130228 \h </w:instrText>
         </w:r>
         <w:r>
           <w:rPr>
@@ -3735,17 +3413,10 @@
           <w:tab w:val="right" w:leader="dot" w:pos="9537"/>
         </w:tabs>
         <w:rPr>
-          <w:rFonts w:asciiTheme="minorHAnsi" w:eastAsiaTheme="minorEastAsia" w:hAnsiTheme="minorHAnsi"/>
           <w:noProof/>
-          <w:color w:val="auto"/>
-          <w:kern w:val="2"/>
-          <w:sz w:val="24"/>
-          <w:szCs w:val="24"/>
-          <w:lang w:val="vi-VN" w:eastAsia="vi-VN"/>
-          <w14:ligatures w14:val="standardContextual"/>
         </w:rPr>
       </w:pPr>
-      <w:hyperlink w:anchor="_Toc242127652" w:history="1">
+      <w:hyperlink w:anchor="_Toc242130229" w:history="1">
         <w:r>
           <w:rPr>
             <w:rStyle w:val="Siuktni"/>
@@ -3772,7 +3443,7 @@
             <w:noProof/>
             <w:webHidden/>
           </w:rPr>
-          <w:instrText xml:space="preserve"> PAGEREF _Toc242127652 \h </w:instrText>
+          <w:instrText xml:space="preserve"> PAGEREF _Toc242130229 \h </w:instrText>
         </w:r>
         <w:r>
           <w:rPr>
@@ -3810,17 +3481,10 @@
           <w:tab w:val="right" w:leader="dot" w:pos="9537"/>
         </w:tabs>
         <w:rPr>
-          <w:rFonts w:asciiTheme="minorHAnsi" w:eastAsiaTheme="minorEastAsia" w:hAnsiTheme="minorHAnsi"/>
           <w:noProof/>
-          <w:color w:val="auto"/>
-          <w:kern w:val="2"/>
-          <w:sz w:val="24"/>
-          <w:szCs w:val="24"/>
-          <w:lang w:val="vi-VN" w:eastAsia="vi-VN"/>
-          <w14:ligatures w14:val="standardContextual"/>
         </w:rPr>
       </w:pPr>
-      <w:hyperlink w:anchor="_Toc242127653" w:history="1">
+      <w:hyperlink w:anchor="_Toc242130230" w:history="1">
         <w:r>
           <w:rPr>
             <w:rStyle w:val="Siuktni"/>
@@ -3847,7 +3511,7 @@
             <w:noProof/>
             <w:webHidden/>
           </w:rPr>
-          <w:instrText xml:space="preserve"> PAGEREF _Toc242127653 \h </w:instrText>
+          <w:instrText xml:space="preserve"> PAGEREF _Toc242130230 \h </w:instrText>
         </w:r>
         <w:r>
           <w:rPr>
@@ -3885,17 +3549,10 @@
           <w:tab w:val="right" w:leader="dot" w:pos="9537"/>
         </w:tabs>
         <w:rPr>
-          <w:rFonts w:asciiTheme="minorHAnsi" w:eastAsiaTheme="minorEastAsia" w:hAnsiTheme="minorHAnsi"/>
           <w:noProof/>
-          <w:color w:val="auto"/>
-          <w:kern w:val="2"/>
-          <w:sz w:val="24"/>
-          <w:szCs w:val="24"/>
-          <w:lang w:val="vi-VN" w:eastAsia="vi-VN"/>
-          <w14:ligatures w14:val="standardContextual"/>
         </w:rPr>
       </w:pPr>
-      <w:hyperlink w:anchor="_Toc242127654" w:history="1">
+      <w:hyperlink w:anchor="_Toc242130231" w:history="1">
         <w:r>
           <w:rPr>
             <w:rStyle w:val="Siuktni"/>
@@ -3922,7 +3579,7 @@
             <w:noProof/>
             <w:webHidden/>
           </w:rPr>
-          <w:instrText xml:space="preserve"> PAGEREF _Toc242127654 \h </w:instrText>
+          <w:instrText xml:space="preserve"> PAGEREF _Toc242130231 \h </w:instrText>
         </w:r>
         <w:r>
           <w:rPr>
@@ -3960,17 +3617,10 @@
           <w:tab w:val="right" w:leader="dot" w:pos="9537"/>
         </w:tabs>
         <w:rPr>
-          <w:rFonts w:asciiTheme="minorHAnsi" w:eastAsiaTheme="minorEastAsia" w:hAnsiTheme="minorHAnsi"/>
           <w:noProof/>
-          <w:color w:val="auto"/>
-          <w:kern w:val="2"/>
-          <w:sz w:val="24"/>
-          <w:szCs w:val="24"/>
-          <w:lang w:val="vi-VN" w:eastAsia="vi-VN"/>
-          <w14:ligatures w14:val="standardContextual"/>
         </w:rPr>
       </w:pPr>
-      <w:hyperlink w:anchor="_Toc242127655" w:history="1">
+      <w:hyperlink w:anchor="_Toc242130232" w:history="1">
         <w:r>
           <w:rPr>
             <w:rStyle w:val="Siuktni"/>
@@ -3997,7 +3647,7 @@
             <w:noProof/>
             <w:webHidden/>
           </w:rPr>
-          <w:instrText xml:space="preserve"> PAGEREF _Toc242127655 \h </w:instrText>
+          <w:instrText xml:space="preserve"> PAGEREF _Toc242130232 \h </w:instrText>
         </w:r>
         <w:r>
           <w:rPr>
@@ -4035,17 +3685,10 @@
           <w:tab w:val="right" w:leader="dot" w:pos="9537"/>
         </w:tabs>
         <w:rPr>
-          <w:rFonts w:asciiTheme="minorHAnsi" w:eastAsiaTheme="minorEastAsia" w:hAnsiTheme="minorHAnsi"/>
           <w:noProof/>
-          <w:color w:val="auto"/>
-          <w:kern w:val="2"/>
-          <w:sz w:val="24"/>
-          <w:szCs w:val="24"/>
-          <w:lang w:val="vi-VN" w:eastAsia="vi-VN"/>
-          <w14:ligatures w14:val="standardContextual"/>
         </w:rPr>
       </w:pPr>
-      <w:hyperlink w:anchor="_Toc242127656" w:history="1">
+      <w:hyperlink w:anchor="_Toc242130233" w:history="1">
         <w:r>
           <w:rPr>
             <w:rStyle w:val="Siuktni"/>
@@ -4072,7 +3715,7 @@
             <w:noProof/>
             <w:webHidden/>
           </w:rPr>
-          <w:instrText xml:space="preserve"> PAGEREF _Toc242127656 \h </w:instrText>
+          <w:instrText xml:space="preserve"> PAGEREF _Toc242130233 \h </w:instrText>
         </w:r>
         <w:r>
           <w:rPr>
@@ -4110,17 +3753,10 @@
           <w:tab w:val="right" w:leader="dot" w:pos="9537"/>
         </w:tabs>
         <w:rPr>
-          <w:rFonts w:asciiTheme="minorHAnsi" w:eastAsiaTheme="minorEastAsia" w:hAnsiTheme="minorHAnsi"/>
           <w:noProof/>
-          <w:color w:val="auto"/>
-          <w:kern w:val="2"/>
-          <w:sz w:val="24"/>
-          <w:szCs w:val="24"/>
-          <w:lang w:val="vi-VN" w:eastAsia="vi-VN"/>
-          <w14:ligatures w14:val="standardContextual"/>
         </w:rPr>
       </w:pPr>
-      <w:hyperlink w:anchor="_Toc242127657" w:history="1">
+      <w:hyperlink w:anchor="_Toc242130234" w:history="1">
         <w:r>
           <w:rPr>
             <w:rStyle w:val="Siuktni"/>
@@ -4147,7 +3783,7 @@
             <w:noProof/>
             <w:webHidden/>
           </w:rPr>
-          <w:instrText xml:space="preserve"> PAGEREF _Toc242127657 \h </w:instrText>
+          <w:instrText xml:space="preserve"> PAGEREF _Toc242130234 \h </w:instrText>
         </w:r>
         <w:r>
           <w:rPr>
@@ -4185,17 +3821,10 @@
           <w:tab w:val="right" w:leader="dot" w:pos="9537"/>
         </w:tabs>
         <w:rPr>
-          <w:rFonts w:asciiTheme="minorHAnsi" w:eastAsiaTheme="minorEastAsia" w:hAnsiTheme="minorHAnsi"/>
           <w:noProof/>
-          <w:color w:val="auto"/>
-          <w:kern w:val="2"/>
-          <w:sz w:val="24"/>
-          <w:szCs w:val="24"/>
-          <w:lang w:val="vi-VN" w:eastAsia="vi-VN"/>
-          <w14:ligatures w14:val="standardContextual"/>
         </w:rPr>
       </w:pPr>
-      <w:hyperlink w:anchor="_Toc242127658" w:history="1">
+      <w:hyperlink w:anchor="_Toc242130235" w:history="1">
         <w:r>
           <w:rPr>
             <w:rStyle w:val="Siuktni"/>
@@ -4222,7 +3851,7 @@
             <w:noProof/>
             <w:webHidden/>
           </w:rPr>
-          <w:instrText xml:space="preserve"> PAGEREF _Toc242127658 \h </w:instrText>
+          <w:instrText xml:space="preserve"> PAGEREF _Toc242130235 \h </w:instrText>
         </w:r>
         <w:r>
           <w:rPr>
@@ -4260,17 +3889,10 @@
           <w:tab w:val="right" w:leader="dot" w:pos="9537"/>
         </w:tabs>
         <w:rPr>
-          <w:rFonts w:asciiTheme="minorHAnsi" w:eastAsiaTheme="minorEastAsia" w:hAnsiTheme="minorHAnsi"/>
           <w:noProof/>
-          <w:color w:val="auto"/>
-          <w:kern w:val="2"/>
-          <w:sz w:val="24"/>
-          <w:szCs w:val="24"/>
-          <w:lang w:val="vi-VN" w:eastAsia="vi-VN"/>
-          <w14:ligatures w14:val="standardContextual"/>
         </w:rPr>
       </w:pPr>
-      <w:hyperlink w:anchor="_Toc242127659" w:history="1">
+      <w:hyperlink w:anchor="_Toc242130236" w:history="1">
         <w:r>
           <w:rPr>
             <w:rStyle w:val="Siuktni"/>
@@ -4297,7 +3919,7 @@
             <w:noProof/>
             <w:webHidden/>
           </w:rPr>
-          <w:instrText xml:space="preserve"> PAGEREF _Toc242127659 \h </w:instrText>
+          <w:instrText xml:space="preserve"> PAGEREF _Toc242130236 \h </w:instrText>
         </w:r>
         <w:r>
           <w:rPr>
@@ -4335,17 +3957,10 @@
           <w:tab w:val="right" w:leader="dot" w:pos="9537"/>
         </w:tabs>
         <w:rPr>
-          <w:rFonts w:asciiTheme="minorHAnsi" w:eastAsiaTheme="minorEastAsia" w:hAnsiTheme="minorHAnsi"/>
           <w:noProof/>
-          <w:color w:val="auto"/>
-          <w:kern w:val="2"/>
-          <w:sz w:val="24"/>
-          <w:szCs w:val="24"/>
-          <w:lang w:val="vi-VN" w:eastAsia="vi-VN"/>
-          <w14:ligatures w14:val="standardContextual"/>
         </w:rPr>
       </w:pPr>
-      <w:hyperlink w:anchor="_Toc242127660" w:history="1">
+      <w:hyperlink w:anchor="_Toc242130237" w:history="1">
         <w:r>
           <w:rPr>
             <w:rStyle w:val="Siuktni"/>
@@ -4372,7 +3987,7 @@
             <w:noProof/>
             <w:webHidden/>
           </w:rPr>
-          <w:instrText xml:space="preserve"> PAGEREF _Toc242127660 \h </w:instrText>
+          <w:instrText xml:space="preserve"> PAGEREF _Toc242130237 \h </w:instrText>
         </w:r>
         <w:r>
           <w:rPr>
@@ -4410,17 +4025,10 @@
           <w:tab w:val="right" w:leader="dot" w:pos="9537"/>
         </w:tabs>
         <w:rPr>
-          <w:rFonts w:asciiTheme="minorHAnsi" w:eastAsiaTheme="minorEastAsia" w:hAnsiTheme="minorHAnsi"/>
           <w:noProof/>
-          <w:color w:val="auto"/>
-          <w:kern w:val="2"/>
-          <w:sz w:val="24"/>
-          <w:szCs w:val="24"/>
-          <w:lang w:val="vi-VN" w:eastAsia="vi-VN"/>
-          <w14:ligatures w14:val="standardContextual"/>
         </w:rPr>
       </w:pPr>
-      <w:hyperlink w:anchor="_Toc242127661" w:history="1">
+      <w:hyperlink w:anchor="_Toc242130238" w:history="1">
         <w:r>
           <w:rPr>
             <w:rStyle w:val="Siuktni"/>
@@ -4447,7 +4055,7 @@
             <w:noProof/>
             <w:webHidden/>
           </w:rPr>
-          <w:instrText xml:space="preserve"> PAGEREF _Toc242127661 \h </w:instrText>
+          <w:instrText xml:space="preserve"> PAGEREF _Toc242130238 \h </w:instrText>
         </w:r>
         <w:r>
           <w:rPr>
@@ -4495,7 +4103,7 @@
       <w:pPr>
         <w:pStyle w:val="u1"/>
       </w:pPr>
-      <w:bookmarkStart w:id="3" w:name="_Toc242127609"/>
+      <w:bookmarkStart w:id="3" w:name="_Toc242130186"/>
       <w:r>
         <w:lastRenderedPageBreak/>
         <w:t>DANH M</w:t>
@@ -5081,7 +4689,7 @@
       <w:pPr>
         <w:pStyle w:val="u1"/>
       </w:pPr>
-      <w:bookmarkStart w:id="4" w:name="_Toc242127610"/>
+      <w:bookmarkStart w:id="4" w:name="_Toc242130187"/>
       <w:r>
         <w:lastRenderedPageBreak/>
         <w:t>CHƯƠNG 1. GI</w:t>
@@ -5104,7 +4712,7 @@
       <w:pPr>
         <w:pStyle w:val="u2"/>
       </w:pPr>
-      <w:bookmarkStart w:id="5" w:name="_Toc242127611"/>
+      <w:bookmarkStart w:id="5" w:name="_Toc242130188"/>
       <w:r>
         <w:t>1.1. B</w:t>
       </w:r>
@@ -5148,7 +4756,7 @@
       <w:pPr>
         <w:pStyle w:val="u2"/>
       </w:pPr>
-      <w:bookmarkStart w:id="6" w:name="_Toc242127612"/>
+      <w:bookmarkStart w:id="6" w:name="_Toc242130189"/>
       <w:r>
         <w:t>1.2. M</w:t>
       </w:r>
@@ -5549,7 +5157,7 @@
       <w:pPr>
         <w:pStyle w:val="u2"/>
       </w:pPr>
-      <w:bookmarkStart w:id="7" w:name="_Toc242127613"/>
+      <w:bookmarkStart w:id="7" w:name="_Toc242130190"/>
       <w:r>
         <w:t>1.3. Đ</w:t>
       </w:r>
@@ -5632,7 +5240,7 @@
       <w:pPr>
         <w:pStyle w:val="u2"/>
       </w:pPr>
-      <w:bookmarkStart w:id="8" w:name="_Toc242127614"/>
+      <w:bookmarkStart w:id="8" w:name="_Toc242130191"/>
       <w:r>
         <w:t>1.4. Phương pháp và c</w:t>
       </w:r>
@@ -5659,7 +5267,7 @@
       <w:pPr>
         <w:pStyle w:val="u2"/>
       </w:pPr>
-      <w:bookmarkStart w:id="9" w:name="_Toc242127615"/>
+      <w:bookmarkStart w:id="9" w:name="_Toc242130192"/>
       <w:r>
         <w:t>1.5. M</w:t>
       </w:r>
@@ -6077,7 +5685,7 @@
       <w:pPr>
         <w:pStyle w:val="u1"/>
       </w:pPr>
-      <w:bookmarkStart w:id="10" w:name="_Toc242127616"/>
+      <w:bookmarkStart w:id="10" w:name="_Toc242130193"/>
       <w:r>
         <w:lastRenderedPageBreak/>
         <w:t>CHƯƠNG 2. CƠ S</w:t>
@@ -6106,7 +5714,7 @@
       <w:pPr>
         <w:pStyle w:val="u2"/>
       </w:pPr>
-      <w:bookmarkStart w:id="11" w:name="_Toc242127617"/>
+      <w:bookmarkStart w:id="11" w:name="_Toc242130194"/>
       <w:r>
         <w:t>2.1. Ch</w:t>
       </w:r>
@@ -6162,7 +5770,7 @@
       <w:pPr>
         <w:pStyle w:val="u2"/>
       </w:pPr>
-      <w:bookmarkStart w:id="12" w:name="_Toc242127618"/>
+      <w:bookmarkStart w:id="12" w:name="_Toc242130195"/>
       <w:r>
         <w:t>2.2. Các t</w:t>
       </w:r>
@@ -6745,7 +6353,7 @@
       <w:pPr>
         <w:pStyle w:val="u2"/>
       </w:pPr>
-      <w:bookmarkStart w:id="13" w:name="_Toc242127619"/>
+      <w:bookmarkStart w:id="13" w:name="_Toc242130196"/>
       <w:r>
         <w:lastRenderedPageBreak/>
         <w:t>2.3. K</w:t>
@@ -7287,7 +6895,7 @@
       <w:pPr>
         <w:pStyle w:val="u2"/>
       </w:pPr>
-      <w:bookmarkStart w:id="14" w:name="_Toc242127620"/>
+      <w:bookmarkStart w:id="14" w:name="_Toc242130197"/>
       <w:r>
         <w:t>2.4. Coverage và mutation testing</w:t>
       </w:r>
@@ -7307,7 +6915,7 @@
       <w:pPr>
         <w:pStyle w:val="u2"/>
       </w:pPr>
-      <w:bookmarkStart w:id="15" w:name="_Toc242127621"/>
+      <w:bookmarkStart w:id="15" w:name="_Toc242130198"/>
       <w:r>
         <w:lastRenderedPageBreak/>
         <w:t>2.5. Security, performance và accessibility</w:t>
@@ -7328,7 +6936,7 @@
       <w:pPr>
         <w:pStyle w:val="u1"/>
       </w:pPr>
-      <w:bookmarkStart w:id="16" w:name="_Toc242127622"/>
+      <w:bookmarkStart w:id="16" w:name="_Toc242130199"/>
       <w:r>
         <w:lastRenderedPageBreak/>
         <w:t>CHƯƠNG 3. PHÂN TÍCH VÀ THI</w:t>
@@ -7351,7 +6959,7 @@
       <w:pPr>
         <w:pStyle w:val="u2"/>
       </w:pPr>
-      <w:bookmarkStart w:id="17" w:name="_Toc242127623"/>
+      <w:bookmarkStart w:id="17" w:name="_Toc242130200"/>
       <w:r>
         <w:t>3.1. Actor và use case</w:t>
       </w:r>
@@ -7371,7 +6979,7 @@
           <w:noProof/>
         </w:rPr>
         <w:drawing>
-          <wp:inline distT="0" distB="0" distL="0" distR="0" wp14:anchorId="4C17F4BE" wp14:editId="4E14F60A">
+          <wp:inline distT="0" distB="0" distL="0" distR="0" wp14:anchorId="1D04FB9C" wp14:editId="63355B93">
             <wp:extent cx="5943600" cy="4730926"/>
             <wp:effectExtent l="0" t="0" r="0" b="0"/>
             <wp:docPr id="1" name="Picture 1"/>
@@ -7987,7 +7595,7 @@
       <w:pPr>
         <w:pStyle w:val="u2"/>
       </w:pPr>
-      <w:bookmarkStart w:id="18" w:name="_Toc242127624"/>
+      <w:bookmarkStart w:id="18" w:name="_Toc242130201"/>
       <w:r>
         <w:t>3.2. Yêu c</w:t>
       </w:r>
@@ -8488,7 +8096,7 @@
       <w:pPr>
         <w:pStyle w:val="u2"/>
       </w:pPr>
-      <w:bookmarkStart w:id="19" w:name="_Toc242127625"/>
+      <w:bookmarkStart w:id="19" w:name="_Toc242130202"/>
       <w:r>
         <w:t>3.3. Quy t</w:t>
       </w:r>
@@ -8995,7 +8603,7 @@
       <w:pPr>
         <w:pStyle w:val="u2"/>
       </w:pPr>
-      <w:bookmarkStart w:id="20" w:name="_Toc242127626"/>
+      <w:bookmarkStart w:id="20" w:name="_Toc242130203"/>
       <w:r>
         <w:t>3.4. Ki</w:t>
       </w:r>
@@ -9039,7 +8647,7 @@
           <w:noProof/>
         </w:rPr>
         <w:drawing>
-          <wp:inline distT="0" distB="0" distL="0" distR="0" wp14:anchorId="152FAF62" wp14:editId="6167FC98">
+          <wp:inline distT="0" distB="0" distL="0" distR="0" wp14:anchorId="1106F052" wp14:editId="523E2C11">
             <wp:extent cx="5943600" cy="2600325"/>
             <wp:effectExtent l="0" t="0" r="0" b="0"/>
             <wp:docPr id="2" name="Picture 2"/>
@@ -9100,7 +8708,7 @@
       <w:pPr>
         <w:pStyle w:val="u2"/>
       </w:pPr>
-      <w:bookmarkStart w:id="21" w:name="_Toc242127627"/>
+      <w:bookmarkStart w:id="21" w:name="_Toc242130204"/>
       <w:r>
         <w:t>3.5. Mô hình d</w:t>
       </w:r>
@@ -9132,7 +8740,7 @@
           <w:noProof/>
         </w:rPr>
         <w:drawing>
-          <wp:inline distT="0" distB="0" distL="0" distR="0" wp14:anchorId="6D5243AF" wp14:editId="07FB8312">
+          <wp:inline distT="0" distB="0" distL="0" distR="0" wp14:anchorId="362D5D72" wp14:editId="0566AD05">
             <wp:extent cx="5943600" cy="3516630"/>
             <wp:effectExtent l="0" t="0" r="0" b="0"/>
             <wp:docPr id="3" name="Picture 3"/>
@@ -9196,7 +8804,7 @@
       <w:pPr>
         <w:pStyle w:val="u2"/>
       </w:pPr>
-      <w:bookmarkStart w:id="22" w:name="_Toc242127628"/>
+      <w:bookmarkStart w:id="22" w:name="_Toc242130205"/>
       <w:r>
         <w:t>3.6. Công th</w:t>
       </w:r>
@@ -9234,7 +8842,7 @@
       <w:pPr>
         <w:pStyle w:val="u1"/>
       </w:pPr>
-      <w:bookmarkStart w:id="23" w:name="_Toc242127629"/>
+      <w:bookmarkStart w:id="23" w:name="_Toc242130206"/>
       <w:r>
         <w:lastRenderedPageBreak/>
         <w:t>CHƯƠNG 4. PHƯƠNG PHÁP VÀ K</w:t>
@@ -9266,7 +8874,7 @@
       <w:pPr>
         <w:pStyle w:val="u2"/>
       </w:pPr>
-      <w:bookmarkStart w:id="24" w:name="_Toc242127630"/>
+      <w:bookmarkStart w:id="24" w:name="_Toc242130207"/>
       <w:r>
         <w:t>4.1. Chi</w:t>
       </w:r>
@@ -9946,7 +9554,7 @@
       <w:pPr>
         <w:pStyle w:val="u2"/>
       </w:pPr>
-      <w:bookmarkStart w:id="25" w:name="_Toc242127631"/>
+      <w:bookmarkStart w:id="25" w:name="_Toc242130208"/>
       <w:r>
         <w:t>4.2. Thi</w:t>
       </w:r>
@@ -10538,7 +10146,7 @@
       <w:pPr>
         <w:pStyle w:val="u3"/>
       </w:pPr>
-      <w:bookmarkStart w:id="26" w:name="_Toc242127632"/>
+      <w:bookmarkStart w:id="26" w:name="_Toc242130209"/>
       <w:r>
         <w:t>4.2.1. Ví d</w:t>
       </w:r>
@@ -11215,7 +10823,7 @@
       <w:pPr>
         <w:pStyle w:val="u2"/>
       </w:pPr>
-      <w:bookmarkStart w:id="27" w:name="_Toc242127633"/>
+      <w:bookmarkStart w:id="27" w:name="_Toc242130210"/>
       <w:r>
         <w:lastRenderedPageBreak/>
         <w:t>4.3. Môi trư</w:t>
@@ -11361,7 +10969,7 @@
               <w:rPr>
                 <w:sz w:val="21"/>
               </w:rPr>
-              <w:t>73f1ed4d3a7d64a3d64ac1ef2b48f4295e2bd2f2</w:t>
+              <w:t>9f1044709f27c3fb6e729823688cb68dff02f5ad</w:t>
             </w:r>
           </w:p>
         </w:tc>
@@ -11612,7 +11220,7 @@
       <w:pPr>
         <w:pStyle w:val="u2"/>
       </w:pPr>
-      <w:bookmarkStart w:id="28" w:name="_Toc242127634"/>
+      <w:bookmarkStart w:id="28" w:name="_Toc242130211"/>
       <w:r>
         <w:t>4.4. Entry, exit và workflow</w:t>
       </w:r>
@@ -11989,7 +11597,7 @@
       <w:pPr>
         <w:pStyle w:val="u2"/>
       </w:pPr>
-      <w:bookmarkStart w:id="29" w:name="_Toc242127635"/>
+      <w:bookmarkStart w:id="29" w:name="_Toc242130212"/>
       <w:r>
         <w:t>4.5. Truy v</w:t>
       </w:r>
@@ -12027,7 +11635,7 @@
       <w:pPr>
         <w:pStyle w:val="u2"/>
       </w:pPr>
-      <w:bookmarkStart w:id="30" w:name="_Toc242127636"/>
+      <w:bookmarkStart w:id="30" w:name="_Toc242130213"/>
       <w:r>
         <w:t>4.6. Tiêu chí đánh giá tính đ</w:t>
       </w:r>
@@ -12074,7 +11682,7 @@
       <w:pPr>
         <w:pStyle w:val="u1"/>
       </w:pPr>
-      <w:bookmarkStart w:id="31" w:name="_Toc242127637"/>
+      <w:bookmarkStart w:id="31" w:name="_Toc242130214"/>
       <w:r>
         <w:lastRenderedPageBreak/>
         <w:t>CHƯƠNG 5. TH</w:t>
@@ -12115,7 +11723,7 @@
       <w:pPr>
         <w:pStyle w:val="u2"/>
       </w:pPr>
-      <w:bookmarkStart w:id="32" w:name="_Toc242127638"/>
+      <w:bookmarkStart w:id="32" w:name="_Toc242130215"/>
       <w:r>
         <w:t>5.1. T</w:t>
       </w:r>
@@ -12721,7 +12329,7 @@
               <w:rPr>
                 <w:sz w:val="21"/>
               </w:rPr>
-              <w:t>2.400 request; p95 5,65 ms; checks 100%</w:t>
+              <w:t>2.400 request; p95 5,91 ms; checks 100%</w:t>
             </w:r>
           </w:p>
         </w:tc>
@@ -12805,7 +12413,7 @@
               <w:rPr>
                 <w:sz w:val="21"/>
               </w:rPr>
-              <w:t>1×201; 19×409; p95 67,55 ms</w:t>
+              <w:t>1×201; 19×409; p95 43,16 ms</w:t>
             </w:r>
           </w:p>
         </w:tc>
@@ -12889,7 +12497,7 @@
               <w:rPr>
                 <w:sz w:val="21"/>
               </w:rPr>
-              <w:t>Performance 99; Accessibility 100; Best Practices 96</w:t>
+              <w:t>Performance 98; Accessibility 100; Best Practices 96</w:t>
             </w:r>
           </w:p>
         </w:tc>
@@ -13024,14 +12632,14 @@
     </w:p>
     <w:p>
       <w:r>
-        <w:t>Bảng 12 trả lời ở mức tổng hợp, còn các mục sau diễn giải ý nghĩa. Việc tất cả gate đạt không đồng nghĩa hệ thống hoàn thiện tuyệt đối. Kết luận chỉ có giá trị tại commit 73f1ed4, workflow 37175430222 và 37175436810, với phạm vi test đã nêu.</w:t>
+        <w:t>Bảng 12 trả lời ở mức tổng hợp, còn các mục sau diễn giải ý nghĩa. Việc tất cả gate đạt không đồng nghĩa hệ thống hoàn thiện tuyệt đối. Kết luận chỉ có giá trị tại commit 9f10447, workflow 37327262982 và 37328055551, với phạm vi test đã nêu.</w:t>
       </w:r>
     </w:p>
     <w:p>
       <w:pPr>
         <w:pStyle w:val="u2"/>
       </w:pPr>
-      <w:bookmarkStart w:id="33" w:name="_Toc242127639"/>
+      <w:bookmarkStart w:id="33" w:name="_Toc242130216"/>
       <w:r>
         <w:t>5.2. Unit, BVA và property-based testing</w:t>
       </w:r>
@@ -13057,7 +12665,7 @@
       <w:pPr>
         <w:pStyle w:val="u2"/>
       </w:pPr>
-      <w:bookmarkStart w:id="34" w:name="_Toc242127640"/>
+      <w:bookmarkStart w:id="34" w:name="_Toc242130217"/>
       <w:r>
         <w:t>5.3. API, database và transaction</w:t>
       </w:r>
@@ -13077,7 +12685,7 @@
       <w:pPr>
         <w:pStyle w:val="u2"/>
       </w:pPr>
-      <w:bookmarkStart w:id="35" w:name="_Toc242127641"/>
+      <w:bookmarkStart w:id="35" w:name="_Toc242130218"/>
       <w:r>
         <w:t>5.4. E2E, responsive và accessibility</w:t>
       </w:r>
@@ -13103,7 +12711,7 @@
         </w:rPr>
         <w:lastRenderedPageBreak/>
         <w:drawing>
-          <wp:inline distT="0" distB="0" distL="0" distR="0" wp14:anchorId="56DFEBA1" wp14:editId="675F7220">
+          <wp:inline distT="0" distB="0" distL="0" distR="0" wp14:anchorId="4F083AAF" wp14:editId="09C02950">
             <wp:extent cx="5029200" cy="4306252"/>
             <wp:effectExtent l="0" t="0" r="0" b="0"/>
             <wp:docPr id="4" name="Picture 4"/>
@@ -13164,7 +12772,7 @@
         </w:rPr>
         <w:lastRenderedPageBreak/>
         <w:drawing>
-          <wp:inline distT="0" distB="0" distL="0" distR="0" wp14:anchorId="53AA3261" wp14:editId="435B9DA3">
+          <wp:inline distT="0" distB="0" distL="0" distR="0" wp14:anchorId="2BFD9E75" wp14:editId="3BB4B16A">
             <wp:extent cx="5029200" cy="5930265"/>
             <wp:effectExtent l="0" t="0" r="0" b="0"/>
             <wp:docPr id="5" name="Picture 5"/>
@@ -13219,7 +12827,7 @@
       <w:pPr>
         <w:pStyle w:val="u2"/>
       </w:pPr>
-      <w:bookmarkStart w:id="36" w:name="_Toc242127642"/>
+      <w:bookmarkStart w:id="36" w:name="_Toc242130219"/>
       <w:r>
         <w:t>5.5. Coverage và mutation</w:t>
       </w:r>
@@ -13245,7 +12853,7 @@
         </w:rPr>
         <w:lastRenderedPageBreak/>
         <w:drawing>
-          <wp:inline distT="0" distB="0" distL="0" distR="0" wp14:anchorId="2CBB4D5C" wp14:editId="28937F6A">
+          <wp:inline distT="0" distB="0" distL="0" distR="0" wp14:anchorId="1E071137" wp14:editId="102C3F6E">
             <wp:extent cx="5669280" cy="1653540"/>
             <wp:effectExtent l="0" t="0" r="0" b="0"/>
             <wp:docPr id="6" name="Picture 6"/>
@@ -13315,7 +12923,7 @@
           <w:noProof/>
         </w:rPr>
         <w:drawing>
-          <wp:inline distT="0" distB="0" distL="0" distR="0" wp14:anchorId="3D8BD9CD" wp14:editId="392F7493">
+          <wp:inline distT="0" distB="0" distL="0" distR="0" wp14:anchorId="0C8A0747" wp14:editId="2645D7A1">
             <wp:extent cx="5669280" cy="2440940"/>
             <wp:effectExtent l="0" t="0" r="0" b="0"/>
             <wp:docPr id="7" name="Picture 7"/>
@@ -13744,7 +13352,7 @@
       <w:pPr>
         <w:pStyle w:val="u2"/>
       </w:pPr>
-      <w:bookmarkStart w:id="37" w:name="_Toc242127643"/>
+      <w:bookmarkStart w:id="37" w:name="_Toc242130220"/>
       <w:r>
         <w:t>5.6. Hi</w:t>
       </w:r>
@@ -13758,7 +13366,7 @@
     </w:p>
     <w:p>
       <w:r>
-        <w:t>Kịch bản availability dùng 20 virtual users trong 2 phút, tạo 2.400 request. checksRate đạt 100%, request failure 0% và p95 5,65 ms, thấp hơn ngưỡng 500 ms. Kịch bản race tạo 20 request cạnh tranh đến cùng room-date-slot; raw summary ghi đúng một 201 và mười chín 409, p95 67,55 ms. Tổng requests trong summary là 22 vì gồm các request chuẩn bị/đăng nhập ngoài nhóm cạnh tranh.</w:t>
+        <w:t>Kịch bản availability dùng 20 virtual users trong 2 phút, tạo 2.400 request. checksRate đạt 100%, request failure 0% và p95 5,91 ms, thấp hơn ngưỡng 500 ms. Kịch bản race tạo 20 request cạnh tranh đến cùng room-date-slot; raw summary ghi đúng một 201 và mười chín 409, p95 43,16 ms. Tổng requests trong summary là 22 vì gồm các request chuẩn bị/đăng nhập ngoài nhóm cạnh tranh.</w:t>
       </w:r>
     </w:p>
     <w:p>
@@ -13775,7 +13383,7 @@
       <w:pPr>
         <w:pStyle w:val="u2"/>
       </w:pPr>
-      <w:bookmarkStart w:id="38" w:name="_Toc242127644"/>
+      <w:bookmarkStart w:id="38" w:name="_Toc242130221"/>
       <w:r>
         <w:t>5.7. Security testing</w:t>
       </w:r>
@@ -13788,7 +13396,7 @@
     </w:p>
     <w:p>
       <w:r>
-        <w:t xml:space="preserve">ZAP baseline frontend ghi 0 High, 0 Medium, 9 Low và 5 Informational; API ghi 0 High, 0 Medium, 0 Low và 4 Informational. Chín Low frontend liên quan </w:t>
+        <w:t xml:space="preserve">ZAP baseline frontend ghi 0 High, 0 Medium, 9 Low và 5 Informational; API ghi 0 High, 0 Medium, 0 Low và 2 Informational. Chín Low frontend liên quan </w:t>
       </w:r>
       <w:r>
         <w:lastRenderedPageBreak/>
@@ -14230,7 +13838,7 @@
       <w:pPr>
         <w:pStyle w:val="u2"/>
       </w:pPr>
-      <w:bookmarkStart w:id="39" w:name="_Toc242127645"/>
+      <w:bookmarkStart w:id="39" w:name="_Toc242130222"/>
       <w:r>
         <w:t>5.8. Lighthouse, axe và tr</w:t>
       </w:r>
@@ -14250,7 +13858,7 @@
     </w:p>
     <w:p>
       <w:r>
-        <w:t>Lighthouse trên production preview đạt Performance 99, Accessibility 100 và Best Practices 96, vượt ngưỡng 80/90/90. axe không phát hiện vi phạm serious trong các trang login, student portal và admin console thuộc scenario đã chạy. Các kết quả này cho thấy cấu trúc và cấu hình tự động ở mức tốt trong URL/viewport thử nghiệm.</w:t>
+        <w:t>Lighthouse trên production preview đạt Performance 98, Accessibility 100 và Best Practices 96, vượt ngưỡng 80/90/90. axe không phát hiện vi phạm serious trong các trang login, student portal và admin console thuộc scenario đã chạy. Các kết quả này cho thấy cấu trúc và cấu hình tự động ở mức tốt trong URL/viewport thử nghiệm.</w:t>
       </w:r>
     </w:p>
     <w:p>
@@ -14262,7 +13870,7 @@
       <w:pPr>
         <w:pStyle w:val="u2"/>
       </w:pPr>
-      <w:bookmarkStart w:id="40" w:name="_Toc242127646"/>
+      <w:bookmarkStart w:id="40" w:name="_Toc242130223"/>
       <w:r>
         <w:t>5.9. Tính tái l</w:t>
       </w:r>
@@ -14294,7 +13902,7 @@
     </w:p>
     <w:p>
       <w:r>
-        <w:t>Core workflow URL là https://github.com/bachiep/studyspace-quality-assurance/actions/runs/37175430222; quality-evidence là https://github.com/bachiep/studyspace-quality-assurance/actions/runs/37175436810. Manifest verifiedAt 2026-10-04T03:59:48Z ghi phiên bản công cụ, threshold, đường dẫn artifact và SHA-256 của tám file cốt lõi. Các file report sinh tự động không được đưa toàn bộ vào Git để tránh phình repository.</w:t>
+        <w:t>Core workflow URL là https://github.com/bachiep/studyspace-quality-assurance/actions/runs/37327262982; quality-evidence là https://github.com/bachiep/studyspace-quality-assurance/actions/runs/37328055551. Manifest verifiedAt 2026-10-05T14:55:52Z ghi phiên bản công cụ, threshold, đường dẫn artifact và SHA-256 của tám file cốt lõi. Các file report sinh tự động không được đưa toàn bộ vào Git để tránh phình repository.</w:t>
       </w:r>
     </w:p>
     <w:p>
@@ -14307,7 +13915,7 @@
       <w:pPr>
         <w:pStyle w:val="u1"/>
       </w:pPr>
-      <w:bookmarkStart w:id="41" w:name="_Toc242127647"/>
+      <w:bookmarkStart w:id="41" w:name="_Toc242130224"/>
       <w:r>
         <w:lastRenderedPageBreak/>
         <w:t>CHƯƠNG 6. DEFECT, RETEST VÀ ĐÁNH GIÁ CH</w:t>
@@ -14330,7 +13938,7 @@
       <w:pPr>
         <w:pStyle w:val="u2"/>
       </w:pPr>
-      <w:bookmarkStart w:id="42" w:name="_Toc242127648"/>
+      <w:bookmarkStart w:id="42" w:name="_Toc242130225"/>
       <w:r>
         <w:t>6.1. Defect lifecycle</w:t>
       </w:r>
@@ -15068,7 +14676,7 @@
       <w:pPr>
         <w:pStyle w:val="u2"/>
       </w:pPr>
-      <w:bookmarkStart w:id="43" w:name="_Toc242127649"/>
+      <w:bookmarkStart w:id="43" w:name="_Toc242130226"/>
       <w:r>
         <w:t>6.2. Phân tích ba defect có tác đ</w:t>
       </w:r>
@@ -15106,7 +14714,7 @@
       <w:pPr>
         <w:pStyle w:val="u2"/>
       </w:pPr>
-      <w:bookmarkStart w:id="44" w:name="_Toc242127650"/>
+      <w:bookmarkStart w:id="44" w:name="_Toc242130227"/>
       <w:r>
         <w:t>6.3. Tr</w:t>
       </w:r>
@@ -15154,7 +14762,7 @@
       <w:pPr>
         <w:pStyle w:val="u2"/>
       </w:pPr>
-      <w:bookmarkStart w:id="45" w:name="_Toc242127651"/>
+      <w:bookmarkStart w:id="45" w:name="_Toc242130228"/>
       <w:r>
         <w:lastRenderedPageBreak/>
         <w:t>6.4. Đánh giá theo ISO/IEC 25010:2023</w:t>
@@ -15859,7 +15467,7 @@
       <w:pPr>
         <w:pStyle w:val="u2"/>
       </w:pPr>
-      <w:bookmarkStart w:id="46" w:name="_Toc242127652"/>
+      <w:bookmarkStart w:id="46" w:name="_Toc242130229"/>
       <w:r>
         <w:t>6.5. Gi</w:t>
       </w:r>
@@ -16347,7 +15955,7 @@
       <w:pPr>
         <w:pStyle w:val="u1"/>
       </w:pPr>
-      <w:bookmarkStart w:id="47" w:name="_Toc242127653"/>
+      <w:bookmarkStart w:id="47" w:name="_Toc242130230"/>
       <w:r>
         <w:lastRenderedPageBreak/>
         <w:t>CHƯƠNG 7. K</w:t>
@@ -16379,7 +15987,7 @@
       <w:pPr>
         <w:pStyle w:val="u2"/>
       </w:pPr>
-      <w:bookmarkStart w:id="48" w:name="_Toc242127654"/>
+      <w:bookmarkStart w:id="48" w:name="_Toc242130231"/>
       <w:r>
         <w:t>7.1. K</w:t>
       </w:r>
@@ -16423,7 +16031,7 @@
       <w:pPr>
         <w:pStyle w:val="u2"/>
       </w:pPr>
-      <w:bookmarkStart w:id="49" w:name="_Toc242127655"/>
+      <w:bookmarkStart w:id="49" w:name="_Toc242130232"/>
       <w:r>
         <w:t>7.2. H</w:t>
       </w:r>
@@ -16447,7 +16055,7 @@
       <w:pPr>
         <w:pStyle w:val="u2"/>
       </w:pPr>
-      <w:bookmarkStart w:id="50" w:name="_Toc242127656"/>
+      <w:bookmarkStart w:id="50" w:name="_Toc242130233"/>
       <w:r>
         <w:t>7.3. Gi</w:t>
       </w:r>
@@ -16494,7 +16102,7 @@
       <w:pPr>
         <w:pStyle w:val="u1"/>
       </w:pPr>
-      <w:bookmarkStart w:id="51" w:name="_Toc242127657"/>
+      <w:bookmarkStart w:id="51" w:name="_Toc242130234"/>
       <w:r>
         <w:lastRenderedPageBreak/>
         <w:t>TÀI LI</w:t>
@@ -16605,7 +16213,7 @@
       <w:pPr>
         <w:pStyle w:val="u1"/>
       </w:pPr>
-      <w:bookmarkStart w:id="52" w:name="_Toc242127658"/>
+      <w:bookmarkStart w:id="52" w:name="_Toc242130235"/>
       <w:r>
         <w:lastRenderedPageBreak/>
         <w:t>PH</w:t>
@@ -17633,7 +17241,7 @@
       <w:pPr>
         <w:pStyle w:val="u1"/>
       </w:pPr>
-      <w:bookmarkStart w:id="53" w:name="_Toc242127659"/>
+      <w:bookmarkStart w:id="53" w:name="_Toc242130236"/>
       <w:r>
         <w:lastRenderedPageBreak/>
         <w:t>PH</w:t>
@@ -18306,7 +17914,7 @@
       <w:pPr>
         <w:pStyle w:val="u1"/>
       </w:pPr>
-      <w:bookmarkStart w:id="54" w:name="_Toc242127660"/>
+      <w:bookmarkStart w:id="54" w:name="_Toc242130237"/>
       <w:r>
         <w:lastRenderedPageBreak/>
         <w:t>PH</w:t>
@@ -19036,7 +18644,7 @@
       <w:pPr>
         <w:pStyle w:val="u2"/>
       </w:pPr>
-      <w:bookmarkStart w:id="55" w:name="_Toc242127661"/>
+      <w:bookmarkStart w:id="55" w:name="_Toc242130238"/>
       <w:r>
         <w:t>PH</w:t>
       </w:r>
@@ -19344,31 +18952,31 @@
       </w:rPr>
     </w:lvl>
   </w:abstractNum>
-  <w:num w:numId="1" w16cid:durableId="1633708170">
+  <w:num w:numId="1" w16cid:durableId="1220242423">
     <w:abstractNumId w:val="8"/>
   </w:num>
-  <w:num w:numId="2" w16cid:durableId="712653475">
+  <w:num w:numId="2" w16cid:durableId="244724476">
     <w:abstractNumId w:val="6"/>
   </w:num>
-  <w:num w:numId="3" w16cid:durableId="1325546690">
+  <w:num w:numId="3" w16cid:durableId="12192028">
     <w:abstractNumId w:val="5"/>
   </w:num>
-  <w:num w:numId="4" w16cid:durableId="1466388985">
+  <w:num w:numId="4" w16cid:durableId="2126266181">
     <w:abstractNumId w:val="4"/>
   </w:num>
-  <w:num w:numId="5" w16cid:durableId="1615861242">
+  <w:num w:numId="5" w16cid:durableId="178466667">
     <w:abstractNumId w:val="7"/>
   </w:num>
-  <w:num w:numId="6" w16cid:durableId="539443513">
+  <w:num w:numId="6" w16cid:durableId="1109549588">
     <w:abstractNumId w:val="3"/>
   </w:num>
-  <w:num w:numId="7" w16cid:durableId="1142697749">
+  <w:num w:numId="7" w16cid:durableId="420875686">
     <w:abstractNumId w:val="2"/>
   </w:num>
-  <w:num w:numId="8" w16cid:durableId="1749158329">
+  <w:num w:numId="8" w16cid:durableId="705449326">
     <w:abstractNumId w:val="1"/>
   </w:num>
-  <w:num w:numId="9" w16cid:durableId="332220357">
+  <w:num w:numId="9" w16cid:durableId="841817742">
     <w:abstractNumId w:val="0"/>
   </w:num>
 </w:numbering>
@@ -30763,7 +30371,7 @@
     <w:autoRedefine/>
     <w:uiPriority w:val="39"/>
     <w:unhideWhenUsed/>
-    <w:rsid w:val="00676A35"/>
+    <w:rsid w:val="00452CDD"/>
     <w:pPr>
       <w:spacing w:after="100"/>
     </w:pPr>
@@ -30775,7 +30383,7 @@
     <w:autoRedefine/>
     <w:uiPriority w:val="39"/>
     <w:unhideWhenUsed/>
-    <w:rsid w:val="00676A35"/>
+    <w:rsid w:val="00452CDD"/>
     <w:pPr>
       <w:spacing w:after="100"/>
       <w:ind w:left="260"/>
@@ -30788,7 +30396,7 @@
     <w:autoRedefine/>
     <w:uiPriority w:val="39"/>
     <w:unhideWhenUsed/>
-    <w:rsid w:val="00676A35"/>
+    <w:rsid w:val="00452CDD"/>
     <w:pPr>
       <w:spacing w:after="100"/>
       <w:ind w:left="520"/>
@@ -30799,7 +30407,7 @@
     <w:basedOn w:val="Phngmcinhcuaoanvn"/>
     <w:uiPriority w:val="99"/>
     <w:unhideWhenUsed/>
-    <w:rsid w:val="00676A35"/>
+    <w:rsid w:val="00452CDD"/>
     <w:rPr>
       <w:color w:val="0000FF" w:themeColor="hyperlink"/>
       <w:u w:val="single"/>

</xml_diff>

<commit_message>
docs: sync report with verified evidence snapshot
</commit_message>
<xml_diff>
--- a/output/docx/StudySpace-BaoCao-DanhGia-KiemDinh.docx
+++ b/output/docx/StudySpace-BaoCao-DanhGia-KiemDinh.docx
@@ -297,7 +297,7 @@
         <w:rPr>
           <w:i w:val="0"/>
         </w:rPr>
-        <w:t>Trên commit kiểm thử 9f10447, 47/47 ca Vitest và 24/24 ca Playwright đạt. Coverage đạt 98,35% line, 94,02% branch và 100% function; mutation score theo công thức killed/(killed+survived) đạt 81,13%. Kịch bản booking đồng thời tạo đúng một phản hồi 201 và mười chín phản hồi 409. Lighthouse đạt 98/100/96; ZAP không ghi nhận High, nhưng frontend còn chín cảnh báo Low và phạm vi quét chỉ là baseline chưa xác thực. Kết quả cho thấy các quality gate định nghĩa trước đã đạt trong môi trường đã ghi, đồng thời vẫn còn giới hạn về trình duyệt, tải sản xuất, pentest xác thực và nghiên cứu usability với người dùng thật.</w:t>
+        <w:t>Trên commit kiểm thử e89bfd1, 47/47 ca Vitest và 24/24 ca Playwright đạt. Coverage đạt 98,35% line, 94,02% branch và 100% function; mutation score theo công thức killed/(killed+survived) đạt 81,13%. Kịch bản booking đồng thời tạo đúng một phản hồi 201 và mười chín phản hồi 409. Lighthouse đạt 100/100/96; ZAP không ghi nhận High, nhưng frontend còn chín cảnh báo Low và bảy Informational; phạm vi quét chỉ là baseline chưa xác thực. Kết quả cho thấy các quality gate định nghĩa trước đã đạt trong môi trường đã ghi, đồng thời vẫn còn giới hạn về trình duyệt, tải sản xuất, pentest xác thực và nghiên cứu usability với người dùng thật.</w:t>
       </w:r>
     </w:p>
     <w:p>
@@ -8506,7 +8506,7 @@
                 <w:b w:val="0"/>
                 <w:sz w:val="21"/>
               </w:rPr>
-              <w:t>9f1044709f27c3fb6e729823688cb68dff02f5ad</w:t>
+              <w:t>e89bfd1d0fcd16ee9b8a7f6d884eddbc2bff1eeb</w:t>
             </w:r>
           </w:p>
         </w:tc>
@@ -9206,7 +9206,7 @@
         <w:rPr>
           <w:i w:val="0"/>
         </w:rPr>
-        <w:t>Chuỗi truy vết của đề tài là Requirement → Technique → Test case → Raw result → Defect/Fix → Retest. Script qa:trace phát hiện requirement không có test, test ID thiếu/trùng/không tồn tại, bug/evidence mồ côi và liên kết RTM sai. Trên evidence cuối, script ghi nhận 15 requirement, 61 test case và 7 defect, trạng thái pass.</w:t>
+        <w:t>Chuỗi truy vết của đề tài là Requirement → Technique → Test case → Raw result → Defect/Fix → Retest. Script qa:trace phát hiện requirement không có test, test ID thiếu/trùng/không tồn tại, bug/evidence mồ côi và liên kết RTM sai. Trên evidence cuối, script ghi nhận 15 requirement, 61 test case và 8 defect, trạng thái pass.</w:t>
       </w:r>
     </w:p>
     <w:p>
@@ -10074,7 +10074,7 @@
                 <w:b w:val="0"/>
                 <w:sz w:val="21"/>
               </w:rPr>
-              <w:t>15 requirement; 61 test; 7 defect</w:t>
+              <w:t>15 requirement; 61 test; 8 defect</w:t>
             </w:r>
           </w:p>
         </w:tc>
@@ -10549,7 +10549,7 @@
                 <w:b w:val="0"/>
                 <w:sz w:val="21"/>
               </w:rPr>
-              <w:t>2.400 request; p95 5,91 ms; checks 100%</w:t>
+              <w:t>2.400 request; p95 5,78 ms; checks 100%</w:t>
             </w:r>
           </w:p>
         </w:tc>
@@ -10644,7 +10644,7 @@
                 <w:b w:val="0"/>
                 <w:sz w:val="21"/>
               </w:rPr>
-              <w:t>1×201; 19×409; p95 43,16 ms</w:t>
+              <w:t>1×201; 19×409; p95 68,22 ms</w:t>
             </w:r>
           </w:p>
         </w:tc>
@@ -10739,7 +10739,7 @@
                 <w:b w:val="0"/>
                 <w:sz w:val="21"/>
               </w:rPr>
-              <w:t>Performance 98; Accessibility 100; Best Practices 96</w:t>
+              <w:t>Performance 100; Accessibility 100; Best Practices 96</w:t>
             </w:r>
           </w:p>
         </w:tc>
@@ -10834,7 +10834,7 @@
                 <w:b w:val="0"/>
                 <w:sz w:val="21"/>
               </w:rPr>
-              <w:t>Frontend 0H/0M/9L/5I; API 0H/0M/0L/2I</w:t>
+              <w:t>Frontend 0H/0M/9L/7I; API 0H/0M/0L/3I</w:t>
             </w:r>
           </w:p>
         </w:tc>
@@ -10894,7 +10894,7 @@
         <w:rPr>
           <w:i w:val="0"/>
         </w:rPr>
-        <w:t>Bảng 12 trả lời ở mức tổng hợp, còn các mục sau diễn giải ý nghĩa. Việc tất cả gate đạt không đồng nghĩa hệ thống hoàn thiện tuyệt đối. Kết luận chỉ có giá trị tại commit 9f10447, workflow 37327262982 và 37328055551, với phạm vi test đã nêu.</w:t>
+        <w:t>Bảng 12 trả lời ở mức tổng hợp, còn các mục sau diễn giải ý nghĩa. Việc tất cả gate đạt không đồng nghĩa hệ thống hoàn thiện tuyệt đối. Kết luận chỉ có giá trị tại commit e89bfd1, workflow 37343853893 và 37344566560, với phạm vi test đã nêu.</w:t>
       </w:r>
     </w:p>
     <w:p>
@@ -11665,7 +11665,7 @@
         <w:rPr>
           <w:i w:val="0"/>
         </w:rPr>
-        <w:t>Kịch bản availability dùng 20 virtual users trong 2 phút, tạo 2.400 request. checksRate đạt 100%, request failure 0% và p95 5,91 ms, thấp hơn ngưỡng 500 ms. Kịch bản race tạo 20 request cạnh tranh đến cùng room-date-slot; raw summary ghi đúng một 201 và mười chín 409, p95 43,16 ms. Tổng requests trong summary là 22 vì gồm các request chuẩn bị/đăng nhập ngoài nhóm cạnh tranh.</w:t>
+        <w:t>Kịch bản availability dùng 20 virtual users trong 2 phút, tạo 2.400 request. checksRate đạt 100%, request failure 0% và p95 5,78 ms, thấp hơn ngưỡng 500 ms. Kịch bản race tạo 20 request cạnh tranh đến cùng room-date-slot; raw summary ghi đúng một 201 và mười chín 409, p95 68,22 ms. Tổng requests trong summary là 22 vì gồm các request chuẩn bị/đăng nhập ngoài nhóm cạnh tranh.</w:t>
       </w:r>
     </w:p>
     <w:p>
@@ -11705,7 +11705,7 @@
         <w:rPr>
           <w:i w:val="0"/>
         </w:rPr>
-        <w:t>ZAP baseline frontend ghi 0 High, 0 Medium, 9 Low và 5 Informational; API ghi 0 High, 0 Medium, 0 Low và 2 Informational. Chín Low frontend liên quan COEP/COOP/CORP cần được đánh giá khi có mô hình triển khai thực; không bị xóa khỏi báo cáo. Phạm vi là unauthenticated frontend preview và public API baseline. Do đó, kết quả không phải pentest, không bao phủ tấn công sau đăng nhập và không chứng minh hệ thống “an toàn tuyệt đối”.</w:t>
+        <w:t>ZAP baseline frontend ghi 0 High, 0 Medium, 9 Low và 7 Informational; API ghi 0 High, 0 Medium, 0 Low và 3 Informational. Chín Low frontend liên quan COEP/COOP/CORP cần được đánh giá khi có mô hình triển khai thực; không bị xóa khỏi báo cáo. Phạm vi là unauthenticated frontend preview và public API baseline. Do đó, kết quả không phải pentest, không bao phủ tấn công sau đăng nhập và không chứng minh hệ thống “an toàn tuyệt đối”.</w:t>
       </w:r>
     </w:p>
     <w:p>
@@ -12199,7 +12199,7 @@
         <w:rPr>
           <w:i w:val="0"/>
         </w:rPr>
-        <w:t>Lighthouse trên production preview đạt Performance 98, Accessibility 100 và Best Practices 96, vượt ngưỡng 80/90/90. axe không phát hiện vi phạm serious trong các trang login, student portal và admin console thuộc scenario đã chạy. Các kết quả này cho thấy cấu trúc và cấu hình tự động ở mức tốt trong URL/viewport thử nghiệm.</w:t>
+        <w:t>Lighthouse trên production preview đạt Performance 100, Accessibility 100 và Best Practices 96, vượt ngưỡng 80/90/90. axe không phát hiện vi phạm serious trong các trang login, student portal và admin console thuộc scenario đã chạy. Các kết quả này cho thấy cấu trúc và cấu hình tự động ở mức tốt trong URL/viewport thử nghiệm.</w:t>
       </w:r>
     </w:p>
     <w:p>
@@ -12223,7 +12223,7 @@
         <w:rPr>
           <w:i w:val="0"/>
         </w:rPr>
-        <w:t>Core workflow URL là https://github.com/bachiep/studyspace-quality-assurance/actions/runs/37327262982; quality-evidence là https://github.com/bachiep/studyspace-quality-assurance/actions/runs/37328055551. Manifest verifiedAt 2026-10-05T14:55:52Z ghi phiên bản công cụ, threshold, đường dẫn artifact và SHA-256 của tám file cốt lõi. Các file report sinh tự động không được đưa toàn bộ vào Git để tránh phình repository.</w:t>
+        <w:t>Core workflow URL là https://github.com/bachiep/studyspace-quality-assurance/actions/runs/37343853893; quality-evidence là https://github.com/bachiep/studyspace-quality-assurance/actions/runs/37344566560. Manifest verifiedAt 2026-10-05T17:00:44Z ghi phiên bản công cụ, threshold, đường dẫn artifact và SHA-256 của tám file cốt lõi. Các file report sinh tự động không được đưa toàn bộ vào Git để tránh phình repository.</w:t>
       </w:r>
     </w:p>
     <w:p>
@@ -12255,7 +12255,7 @@
         <w:rPr>
           <w:i w:val="0"/>
         </w:rPr>
-        <w:t>Defect được phân biệt với task cải tiến. Một defect cần có sai lệch so với requirement hoặc hành vi kỳ vọng, bước tái hiện, severity, expected/actual, evidence, commit sửa và retest. Task như cải thiện workflow hoặc bổ sung tài liệu được theo dõi riêng để không làm sai defect statistics. Trong defect log còn có BUG-002 thuộc hạ tầng kiểm thử và BUG-007 thuộc độ đầy đủ test; hai mục này được giữ để bảo toàn lịch sử kiểm định, không được diễn giải là lỗi chức năng của SUT.</w:t>
+        <w:t>Defect được phân biệt với task cải tiến. Một defect cần có sai lệch so với requirement hoặc hành vi kỳ vọng, bước tái hiện, severity, expected/actual, evidence, commit sửa và retest. Task như cải thiện workflow hoặc bổ sung tài liệu được theo dõi riêng để không làm sai defect statistics. Trong defect log còn có BUG-002 thuộc hạ tầng kiểm thử, BUG-007 thuộc độ đầy đủ test và BUG-008 thuộc accessibility; các mục này được giữ để bảo toàn lịch sử kiểm định, không được diễn giải rộng hơn bằng chứng đã có.</w:t>
       </w:r>
     </w:p>
     <w:p>
@@ -13052,6 +13052,103 @@
                 <w:sz w:val="21"/>
               </w:rPr>
               <w:t>TC-API-36: 200, CHECKED_IN, audit</w:t>
+            </w:r>
+          </w:p>
+        </w:tc>
+      </w:tr>
+      <w:tr>
+        <w:trPr>
+          <w:cantSplit/>
+        </w:trPr>
+        <w:tc>
+          <w:tcPr>
+            <w:tcW w:type="dxa" w:w="2387"/>
+            <w:vAlign w:val="center"/>
+            <w:shd w:fill="F7F9FC"/>
+          </w:tcPr>
+          <w:p>
+            <w:pPr>
+              <w:spacing w:line="252" w:lineRule="auto" w:after="0"/>
+              <w:ind w:firstLine="0"/>
+              <w:jc w:val="left"/>
+            </w:pPr>
+            <w:r/>
+            <w:r>
+              <w:rPr>
+                <w:rFonts w:ascii="Times New Roman" w:hAnsi="Times New Roman" w:eastAsia="Times New Roman"/>
+                <w:b w:val="0"/>
+                <w:sz w:val="21"/>
+              </w:rPr>
+              <w:t>BUG-008</w:t>
+            </w:r>
+          </w:p>
+        </w:tc>
+        <w:tc>
+          <w:tcPr>
+            <w:tcW w:type="dxa" w:w="2387"/>
+            <w:vAlign w:val="center"/>
+            <w:shd w:fill="F7F9FC"/>
+          </w:tcPr>
+          <w:p>
+            <w:pPr>
+              <w:spacing w:line="252" w:lineRule="auto" w:after="0"/>
+              <w:ind w:firstLine="0"/>
+              <w:jc w:val="left"/>
+            </w:pPr>
+            <w:r/>
+            <w:r>
+              <w:rPr>
+                <w:rFonts w:ascii="Times New Roman" w:hAnsi="Times New Roman" w:eastAsia="Times New Roman"/>
+                <w:b w:val="0"/>
+                <w:sz w:val="21"/>
+              </w:rPr>
+              <w:t>Medium</w:t>
+            </w:r>
+          </w:p>
+        </w:tc>
+        <w:tc>
+          <w:tcPr>
+            <w:tcW w:type="dxa" w:w="2387"/>
+            <w:vAlign w:val="center"/>
+            <w:shd w:fill="F7F9FC"/>
+          </w:tcPr>
+          <w:p>
+            <w:pPr>
+              <w:spacing w:line="252" w:lineRule="auto" w:after="0"/>
+              <w:ind w:firstLine="0"/>
+              <w:jc w:val="left"/>
+            </w:pPr>
+            <w:r/>
+            <w:r>
+              <w:rPr>
+                <w:rFonts w:ascii="Times New Roman" w:hAnsi="Times New Roman" w:eastAsia="Times New Roman"/>
+                <w:b w:val="0"/>
+                <w:sz w:val="21"/>
+              </w:rPr>
+              <w:t>Nút disabled trong Admin không đủ tương phản</w:t>
+            </w:r>
+          </w:p>
+        </w:tc>
+        <w:tc>
+          <w:tcPr>
+            <w:tcW w:type="dxa" w:w="2387"/>
+            <w:vAlign w:val="center"/>
+            <w:shd w:fill="F7F9FC"/>
+          </w:tcPr>
+          <w:p>
+            <w:pPr>
+              <w:spacing w:line="252" w:lineRule="auto" w:after="0"/>
+              <w:ind w:firstLine="0"/>
+              <w:jc w:val="left"/>
+            </w:pPr>
+            <w:r/>
+            <w:r>
+              <w:rPr>
+                <w:rFonts w:ascii="Times New Roman" w:hAnsi="Times New Roman" w:eastAsia="Times New Roman"/>
+                <w:b w:val="0"/>
+                <w:sz w:val="21"/>
+              </w:rPr>
+              <w:t>Bỏ opacity làm giảm contrast; TC-E2E-12</w:t>
             </w:r>
           </w:p>
         </w:tc>
@@ -15215,7 +15312,7 @@
                 <w:b w:val="0"/>
                 <w:sz w:val="21"/>
               </w:rPr>
-              <w:t>TC-API-06/11/16/23/25/26/34</w:t>
+              <w:t>TC-API-06/11/16/23/25/26/34; TC-E2E-07/12</w:t>
             </w:r>
           </w:p>
         </w:tc>
@@ -15238,7 +15335,7 @@
                 <w:b w:val="0"/>
                 <w:sz w:val="21"/>
               </w:rPr>
-              <w:t>BUG-005</w:t>
+              <w:t>BUG-005/008</w:t>
             </w:r>
           </w:p>
         </w:tc>
@@ -15261,7 +15358,7 @@
                 <w:b w:val="0"/>
                 <w:sz w:val="21"/>
               </w:rPr>
-              <w:t>API/E2E</w:t>
+              <w:t>API/E2E/accessibility</w:t>
             </w:r>
           </w:p>
         </w:tc>
@@ -15662,7 +15759,7 @@
                 <w:b w:val="0"/>
                 <w:sz w:val="21"/>
               </w:rPr>
-              <w:t>Decision table</w:t>
+              <w:t>Decision table/accessibility</w:t>
             </w:r>
           </w:p>
         </w:tc>
@@ -15685,7 +15782,7 @@
                 <w:b w:val="0"/>
                 <w:sz w:val="21"/>
               </w:rPr>
-              <w:t>TC-API-08/19/32</w:t>
+              <w:t>TC-API-08/19/32; TC-E2E-12</w:t>
             </w:r>
           </w:p>
         </w:tc>
@@ -15708,7 +15805,7 @@
                 <w:b w:val="0"/>
                 <w:sz w:val="21"/>
               </w:rPr>
-              <w:t>—</w:t>
+              <w:t>BUG-008</w:t>
             </w:r>
           </w:p>
         </w:tc>
@@ -15731,7 +15828,7 @@
                 <w:b w:val="0"/>
                 <w:sz w:val="21"/>
               </w:rPr>
-              <w:t>API/report</w:t>
+              <w:t>API/report/E2E</w:t>
             </w:r>
           </w:p>
         </w:tc>
@@ -15747,7 +15844,7 @@
         <w:rPr>
           <w:i w:val="0"/>
         </w:rPr>
-        <w:t>Ma trận đầy đủ nằm tại docs/03-rtm.csv. qa:trace dùng catalog và tên test trong source để xác minh liên kết thay vì chỉ tin bảng Word.</w:t>
+        <w:t>Ma trận đầy đủ nằm tại docs/03-rtm.csv; hợp đồng endpoint và ca lỗi nằm tại docs/04-test-cases.csv. qa:trace dùng catalog và tên test trong source để xác minh liên kết thay vì chỉ tin bảng Word.</w:t>
       </w:r>
     </w:p>
     <w:p>
@@ -16454,814 +16551,6 @@
       <w:pPr>
         <w:spacing w:after="0"/>
       </w:pPr>
-    </w:p>
-    <w:p>
-      <w:pPr>
-        <w:pStyle w:val="Heading1"/>
-      </w:pPr>
-      <w:r>
-        <w:t>PHỤ LỤC C. HỢP ĐỒNG API RÚT GỌN</w:t>
-      </w:r>
-    </w:p>
-    <w:p>
-      <w:pPr>
-        <w:spacing w:after="80"/>
-        <w:ind w:firstLine="0"/>
-        <w:jc w:val="center"/>
-      </w:pPr>
-      <w:r>
-        <w:rPr>
-          <w:rFonts w:ascii="Times New Roman" w:hAnsi="Times New Roman"/>
-          <w:b/>
-          <w:i/>
-          <w:sz w:val="22"/>
-        </w:rPr>
-        <w:t>Bảng 25. Endpoint nghiệp vụ và ca lỗi</w:t>
-      </w:r>
-    </w:p>
-    <w:tbl>
-      <w:tblPr>
-        <w:tblW w:type="auto" w:w="0"/>
-        <w:jc w:val="center"/>
-        <w:tblLayout w:type="autofit"/>
-        <w:tblLook w:firstColumn="1" w:firstRow="1" w:lastColumn="0" w:lastRow="0" w:noHBand="0" w:noVBand="1" w:val="04A0"/>
-        <w:tblBorders>
-          <w:top w:val="single" w:sz="4" w:color="B7B7B7"/>
-          <w:left w:val="single" w:sz="4" w:color="B7B7B7"/>
-          <w:bottom w:val="single" w:sz="4" w:color="B7B7B7"/>
-          <w:right w:val="single" w:sz="4" w:color="B7B7B7"/>
-          <w:insideH w:val="single" w:sz="4" w:color="B7B7B7"/>
-          <w:insideV w:val="single" w:sz="4" w:color="B7B7B7"/>
-        </w:tblBorders>
-      </w:tblPr>
-      <w:tblGrid>
-        <w:gridCol w:w="3182"/>
-        <w:gridCol w:w="3182"/>
-        <w:gridCol w:w="3182"/>
-      </w:tblGrid>
-      <w:tr>
-        <w:trPr>
-          <w:cantSplit/>
-          <w:tblHeader w:val="true"/>
-        </w:trPr>
-        <w:tc>
-          <w:tcPr>
-            <w:tcW w:type="dxa" w:w="3182"/>
-            <w:vAlign w:val="center"/>
-            <w:shd w:fill="D9E2F3"/>
-          </w:tcPr>
-          <w:p>
-            <w:pPr>
-              <w:spacing w:line="252" w:lineRule="auto" w:after="0"/>
-              <w:ind w:firstLine="0"/>
-              <w:jc w:val="center"/>
-            </w:pPr>
-            <w:r/>
-            <w:r>
-              <w:rPr>
-                <w:rFonts w:ascii="Times New Roman" w:hAnsi="Times New Roman" w:eastAsia="Times New Roman"/>
-                <w:b/>
-                <w:sz w:val="21"/>
-              </w:rPr>
-              <w:t>Endpoint</w:t>
-            </w:r>
-          </w:p>
-        </w:tc>
-        <w:tc>
-          <w:tcPr>
-            <w:tcW w:type="dxa" w:w="3182"/>
-            <w:vAlign w:val="center"/>
-            <w:shd w:fill="D9E2F3"/>
-          </w:tcPr>
-          <w:p>
-            <w:pPr>
-              <w:spacing w:line="252" w:lineRule="auto" w:after="0"/>
-              <w:ind w:firstLine="0"/>
-              <w:jc w:val="center"/>
-            </w:pPr>
-            <w:r/>
-            <w:r>
-              <w:rPr>
-                <w:rFonts w:ascii="Times New Roman" w:hAnsi="Times New Roman" w:eastAsia="Times New Roman"/>
-                <w:b/>
-                <w:sz w:val="21"/>
-              </w:rPr>
-              <w:t>Thành công</w:t>
-            </w:r>
-          </w:p>
-        </w:tc>
-        <w:tc>
-          <w:tcPr>
-            <w:tcW w:type="dxa" w:w="3182"/>
-            <w:vAlign w:val="center"/>
-            <w:shd w:fill="D9E2F3"/>
-          </w:tcPr>
-          <w:p>
-            <w:pPr>
-              <w:spacing w:line="252" w:lineRule="auto" w:after="0"/>
-              <w:ind w:firstLine="0"/>
-              <w:jc w:val="center"/>
-            </w:pPr>
-            <w:r/>
-            <w:r>
-              <w:rPr>
-                <w:rFonts w:ascii="Times New Roman" w:hAnsi="Times New Roman" w:eastAsia="Times New Roman"/>
-                <w:b/>
-                <w:sz w:val="21"/>
-              </w:rPr>
-              <w:t>Ca lỗi/biên</w:t>
-            </w:r>
-          </w:p>
-        </w:tc>
-      </w:tr>
-      <w:tr>
-        <w:trPr>
-          <w:cantSplit/>
-        </w:trPr>
-        <w:tc>
-          <w:tcPr>
-            <w:tcW w:type="dxa" w:w="3182"/>
-            <w:vAlign w:val="center"/>
-          </w:tcPr>
-          <w:p>
-            <w:pPr>
-              <w:spacing w:line="252" w:lineRule="auto" w:after="0"/>
-              <w:ind w:firstLine="0"/>
-              <w:jc w:val="left"/>
-            </w:pPr>
-            <w:r/>
-            <w:r>
-              <w:rPr>
-                <w:rFonts w:ascii="Times New Roman" w:hAnsi="Times New Roman" w:eastAsia="Times New Roman"/>
-                <w:b w:val="0"/>
-                <w:sz w:val="21"/>
-              </w:rPr>
-              <w:t>POST /auth/register</w:t>
-            </w:r>
-          </w:p>
-        </w:tc>
-        <w:tc>
-          <w:tcPr>
-            <w:tcW w:type="dxa" w:w="3182"/>
-            <w:vAlign w:val="center"/>
-          </w:tcPr>
-          <w:p>
-            <w:pPr>
-              <w:spacing w:line="252" w:lineRule="auto" w:after="0"/>
-              <w:ind w:firstLine="0"/>
-              <w:jc w:val="left"/>
-            </w:pPr>
-            <w:r/>
-            <w:r>
-              <w:rPr>
-                <w:rFonts w:ascii="Times New Roman" w:hAnsi="Times New Roman" w:eastAsia="Times New Roman"/>
-                <w:b w:val="0"/>
-                <w:sz w:val="21"/>
-              </w:rPr>
-              <w:t>201 token/user</w:t>
-            </w:r>
-          </w:p>
-        </w:tc>
-        <w:tc>
-          <w:tcPr>
-            <w:tcW w:type="dxa" w:w="3182"/>
-            <w:vAlign w:val="center"/>
-          </w:tcPr>
-          <w:p>
-            <w:pPr>
-              <w:spacing w:line="252" w:lineRule="auto" w:after="0"/>
-              <w:ind w:firstLine="0"/>
-              <w:jc w:val="left"/>
-            </w:pPr>
-            <w:r/>
-            <w:r>
-              <w:rPr>
-                <w:rFonts w:ascii="Times New Roman" w:hAnsi="Times New Roman" w:eastAsia="Times New Roman"/>
-                <w:b w:val="0"/>
-                <w:sz w:val="21"/>
-              </w:rPr>
-              <w:t>422 schema; 409 duplicate email</w:t>
-            </w:r>
-          </w:p>
-        </w:tc>
-      </w:tr>
-      <w:tr>
-        <w:trPr>
-          <w:cantSplit/>
-        </w:trPr>
-        <w:tc>
-          <w:tcPr>
-            <w:tcW w:type="dxa" w:w="3182"/>
-            <w:vAlign w:val="center"/>
-            <w:shd w:fill="F7F9FC"/>
-          </w:tcPr>
-          <w:p>
-            <w:pPr>
-              <w:spacing w:line="252" w:lineRule="auto" w:after="0"/>
-              <w:ind w:firstLine="0"/>
-              <w:jc w:val="left"/>
-            </w:pPr>
-            <w:r/>
-            <w:r>
-              <w:rPr>
-                <w:rFonts w:ascii="Times New Roman" w:hAnsi="Times New Roman" w:eastAsia="Times New Roman"/>
-                <w:b w:val="0"/>
-                <w:sz w:val="21"/>
-              </w:rPr>
-              <w:t>POST /auth/login</w:t>
-            </w:r>
-          </w:p>
-        </w:tc>
-        <w:tc>
-          <w:tcPr>
-            <w:tcW w:type="dxa" w:w="3182"/>
-            <w:vAlign w:val="center"/>
-            <w:shd w:fill="F7F9FC"/>
-          </w:tcPr>
-          <w:p>
-            <w:pPr>
-              <w:spacing w:line="252" w:lineRule="auto" w:after="0"/>
-              <w:ind w:firstLine="0"/>
-              <w:jc w:val="left"/>
-            </w:pPr>
-            <w:r/>
-            <w:r>
-              <w:rPr>
-                <w:rFonts w:ascii="Times New Roman" w:hAnsi="Times New Roman" w:eastAsia="Times New Roman"/>
-                <w:b w:val="0"/>
-                <w:sz w:val="21"/>
-              </w:rPr>
-              <w:t>200 token/user</w:t>
-            </w:r>
-          </w:p>
-        </w:tc>
-        <w:tc>
-          <w:tcPr>
-            <w:tcW w:type="dxa" w:w="3182"/>
-            <w:vAlign w:val="center"/>
-            <w:shd w:fill="F7F9FC"/>
-          </w:tcPr>
-          <w:p>
-            <w:pPr>
-              <w:spacing w:line="252" w:lineRule="auto" w:after="0"/>
-              <w:ind w:firstLine="0"/>
-              <w:jc w:val="left"/>
-            </w:pPr>
-            <w:r/>
-            <w:r>
-              <w:rPr>
-                <w:rFonts w:ascii="Times New Roman" w:hAnsi="Times New Roman" w:eastAsia="Times New Roman"/>
-                <w:b w:val="0"/>
-                <w:sz w:val="21"/>
-              </w:rPr>
-              <w:t>401 credential; 429 rate limit</w:t>
-            </w:r>
-          </w:p>
-        </w:tc>
-      </w:tr>
-      <w:tr>
-        <w:trPr>
-          <w:cantSplit/>
-        </w:trPr>
-        <w:tc>
-          <w:tcPr>
-            <w:tcW w:type="dxa" w:w="3182"/>
-            <w:vAlign w:val="center"/>
-          </w:tcPr>
-          <w:p>
-            <w:pPr>
-              <w:spacing w:line="252" w:lineRule="auto" w:after="0"/>
-              <w:ind w:firstLine="0"/>
-              <w:jc w:val="left"/>
-            </w:pPr>
-            <w:r/>
-            <w:r>
-              <w:rPr>
-                <w:rFonts w:ascii="Times New Roman" w:hAnsi="Times New Roman" w:eastAsia="Times New Roman"/>
-                <w:b w:val="0"/>
-                <w:sz w:val="21"/>
-              </w:rPr>
-              <w:t>PATCH /auth/me</w:t>
-            </w:r>
-          </w:p>
-        </w:tc>
-        <w:tc>
-          <w:tcPr>
-            <w:tcW w:type="dxa" w:w="3182"/>
-            <w:vAlign w:val="center"/>
-          </w:tcPr>
-          <w:p>
-            <w:pPr>
-              <w:spacing w:line="252" w:lineRule="auto" w:after="0"/>
-              <w:ind w:firstLine="0"/>
-              <w:jc w:val="left"/>
-            </w:pPr>
-            <w:r/>
-            <w:r>
-              <w:rPr>
-                <w:rFonts w:ascii="Times New Roman" w:hAnsi="Times New Roman" w:eastAsia="Times New Roman"/>
-                <w:b w:val="0"/>
-                <w:sz w:val="21"/>
-              </w:rPr>
-              <w:t>200 + audit</w:t>
-            </w:r>
-          </w:p>
-        </w:tc>
-        <w:tc>
-          <w:tcPr>
-            <w:tcW w:type="dxa" w:w="3182"/>
-            <w:vAlign w:val="center"/>
-          </w:tcPr>
-          <w:p>
-            <w:pPr>
-              <w:spacing w:line="252" w:lineRule="auto" w:after="0"/>
-              <w:ind w:firstLine="0"/>
-              <w:jc w:val="left"/>
-            </w:pPr>
-            <w:r/>
-            <w:r>
-              <w:rPr>
-                <w:rFonts w:ascii="Times New Roman" w:hAnsi="Times New Roman" w:eastAsia="Times New Roman"/>
-                <w:b w:val="0"/>
-                <w:sz w:val="21"/>
-              </w:rPr>
-              <w:t>409 email; rollback khi audit lỗi</w:t>
-            </w:r>
-          </w:p>
-        </w:tc>
-      </w:tr>
-      <w:tr>
-        <w:trPr>
-          <w:cantSplit/>
-        </w:trPr>
-        <w:tc>
-          <w:tcPr>
-            <w:tcW w:type="dxa" w:w="3182"/>
-            <w:vAlign w:val="center"/>
-            <w:shd w:fill="F7F9FC"/>
-          </w:tcPr>
-          <w:p>
-            <w:pPr>
-              <w:spacing w:line="252" w:lineRule="auto" w:after="0"/>
-              <w:ind w:firstLine="0"/>
-              <w:jc w:val="left"/>
-            </w:pPr>
-            <w:r/>
-            <w:r>
-              <w:rPr>
-                <w:rFonts w:ascii="Times New Roman" w:hAnsi="Times New Roman" w:eastAsia="Times New Roman"/>
-                <w:b w:val="0"/>
-                <w:sz w:val="21"/>
-              </w:rPr>
-              <w:t>GET /rooms/availability</w:t>
-            </w:r>
-          </w:p>
-        </w:tc>
-        <w:tc>
-          <w:tcPr>
-            <w:tcW w:type="dxa" w:w="3182"/>
-            <w:vAlign w:val="center"/>
-            <w:shd w:fill="F7F9FC"/>
-          </w:tcPr>
-          <w:p>
-            <w:pPr>
-              <w:spacing w:line="252" w:lineRule="auto" w:after="0"/>
-              <w:ind w:firstLine="0"/>
-              <w:jc w:val="left"/>
-            </w:pPr>
-            <w:r/>
-            <w:r>
-              <w:rPr>
-                <w:rFonts w:ascii="Times New Roman" w:hAnsi="Times New Roman" w:eastAsia="Times New Roman"/>
-                <w:b w:val="0"/>
-                <w:sz w:val="21"/>
-              </w:rPr>
-              <w:t>200 rooms/occupiedSlots</w:t>
-            </w:r>
-          </w:p>
-        </w:tc>
-        <w:tc>
-          <w:tcPr>
-            <w:tcW w:type="dxa" w:w="3182"/>
-            <w:vAlign w:val="center"/>
-            <w:shd w:fill="F7F9FC"/>
-          </w:tcPr>
-          <w:p>
-            <w:pPr>
-              <w:spacing w:line="252" w:lineRule="auto" w:after="0"/>
-              <w:ind w:firstLine="0"/>
-              <w:jc w:val="left"/>
-            </w:pPr>
-            <w:r/>
-            <w:r>
-              <w:rPr>
-                <w:rFonts w:ascii="Times New Roman" w:hAnsi="Times New Roman" w:eastAsia="Times New Roman"/>
-                <w:b w:val="0"/>
-                <w:sz w:val="21"/>
-              </w:rPr>
-              <w:t>422 date/capacity/equipment</w:t>
-            </w:r>
-          </w:p>
-        </w:tc>
-      </w:tr>
-      <w:tr>
-        <w:trPr>
-          <w:cantSplit/>
-        </w:trPr>
-        <w:tc>
-          <w:tcPr>
-            <w:tcW w:type="dxa" w:w="3182"/>
-            <w:vAlign w:val="center"/>
-          </w:tcPr>
-          <w:p>
-            <w:pPr>
-              <w:spacing w:line="252" w:lineRule="auto" w:after="0"/>
-              <w:ind w:firstLine="0"/>
-              <w:jc w:val="left"/>
-            </w:pPr>
-            <w:r/>
-            <w:r>
-              <w:rPr>
-                <w:rFonts w:ascii="Times New Roman" w:hAnsi="Times New Roman" w:eastAsia="Times New Roman"/>
-                <w:b w:val="0"/>
-                <w:sz w:val="21"/>
-              </w:rPr>
-              <w:t>POST /bookings</w:t>
-            </w:r>
-          </w:p>
-        </w:tc>
-        <w:tc>
-          <w:tcPr>
-            <w:tcW w:type="dxa" w:w="3182"/>
-            <w:vAlign w:val="center"/>
-          </w:tcPr>
-          <w:p>
-            <w:pPr>
-              <w:spacing w:line="252" w:lineRule="auto" w:after="0"/>
-              <w:ind w:firstLine="0"/>
-              <w:jc w:val="left"/>
-            </w:pPr>
-            <w:r/>
-            <w:r>
-              <w:rPr>
-                <w:rFonts w:ascii="Times New Roman" w:hAnsi="Times New Roman" w:eastAsia="Times New Roman"/>
-                <w:b w:val="0"/>
-                <w:sz w:val="21"/>
-              </w:rPr>
-              <w:t>201 + audit</w:t>
-            </w:r>
-          </w:p>
-        </w:tc>
-        <w:tc>
-          <w:tcPr>
-            <w:tcW w:type="dxa" w:w="3182"/>
-            <w:vAlign w:val="center"/>
-          </w:tcPr>
-          <w:p>
-            <w:pPr>
-              <w:spacing w:line="252" w:lineRule="auto" w:after="0"/>
-              <w:ind w:firstLine="0"/>
-              <w:jc w:val="left"/>
-            </w:pPr>
-            <w:r/>
-            <w:r>
-              <w:rPr>
-                <w:rFonts w:ascii="Times New Roman" w:hAnsi="Times New Roman" w:eastAsia="Times New Roman"/>
-                <w:b w:val="0"/>
-                <w:sz w:val="21"/>
-              </w:rPr>
-              <w:t>409 room/user conflict; 422 rule</w:t>
-            </w:r>
-          </w:p>
-        </w:tc>
-      </w:tr>
-      <w:tr>
-        <w:trPr>
-          <w:cantSplit/>
-        </w:trPr>
-        <w:tc>
-          <w:tcPr>
-            <w:tcW w:type="dxa" w:w="3182"/>
-            <w:vAlign w:val="center"/>
-            <w:shd w:fill="F7F9FC"/>
-          </w:tcPr>
-          <w:p>
-            <w:pPr>
-              <w:spacing w:line="252" w:lineRule="auto" w:after="0"/>
-              <w:ind w:firstLine="0"/>
-              <w:jc w:val="left"/>
-            </w:pPr>
-            <w:r/>
-            <w:r>
-              <w:rPr>
-                <w:rFonts w:ascii="Times New Roman" w:hAnsi="Times New Roman" w:eastAsia="Times New Roman"/>
-                <w:b w:val="0"/>
-                <w:sz w:val="21"/>
-              </w:rPr>
-              <w:t>PATCH /bookings/:id/cancel</w:t>
-            </w:r>
-          </w:p>
-        </w:tc>
-        <w:tc>
-          <w:tcPr>
-            <w:tcW w:type="dxa" w:w="3182"/>
-            <w:vAlign w:val="center"/>
-            <w:shd w:fill="F7F9FC"/>
-          </w:tcPr>
-          <w:p>
-            <w:pPr>
-              <w:spacing w:line="252" w:lineRule="auto" w:after="0"/>
-              <w:ind w:firstLine="0"/>
-              <w:jc w:val="left"/>
-            </w:pPr>
-            <w:r/>
-            <w:r>
-              <w:rPr>
-                <w:rFonts w:ascii="Times New Roman" w:hAnsi="Times New Roman" w:eastAsia="Times New Roman"/>
-                <w:b w:val="0"/>
-                <w:sz w:val="21"/>
-              </w:rPr>
-              <w:t>200 CANCELLED</w:t>
-            </w:r>
-          </w:p>
-        </w:tc>
-        <w:tc>
-          <w:tcPr>
-            <w:tcW w:type="dxa" w:w="3182"/>
-            <w:vAlign w:val="center"/>
-            <w:shd w:fill="F7F9FC"/>
-          </w:tcPr>
-          <w:p>
-            <w:pPr>
-              <w:spacing w:line="252" w:lineRule="auto" w:after="0"/>
-              <w:ind w:firstLine="0"/>
-              <w:jc w:val="left"/>
-            </w:pPr>
-            <w:r/>
-            <w:r>
-              <w:rPr>
-                <w:rFonts w:ascii="Times New Roman" w:hAnsi="Times New Roman" w:eastAsia="Times New Roman"/>
-                <w:b w:val="0"/>
-                <w:sz w:val="21"/>
-              </w:rPr>
-              <w:t>403 ownership; 422 boundary/state</w:t>
-            </w:r>
-          </w:p>
-        </w:tc>
-      </w:tr>
-      <w:tr>
-        <w:trPr>
-          <w:cantSplit/>
-        </w:trPr>
-        <w:tc>
-          <w:tcPr>
-            <w:tcW w:type="dxa" w:w="3182"/>
-            <w:vAlign w:val="center"/>
-          </w:tcPr>
-          <w:p>
-            <w:pPr>
-              <w:spacing w:line="252" w:lineRule="auto" w:after="0"/>
-              <w:ind w:firstLine="0"/>
-              <w:jc w:val="left"/>
-            </w:pPr>
-            <w:r/>
-            <w:r>
-              <w:rPr>
-                <w:rFonts w:ascii="Times New Roman" w:hAnsi="Times New Roman" w:eastAsia="Times New Roman"/>
-                <w:b w:val="0"/>
-                <w:sz w:val="21"/>
-              </w:rPr>
-              <w:t>PATCH /bookings/:id/check-in</w:t>
-            </w:r>
-          </w:p>
-        </w:tc>
-        <w:tc>
-          <w:tcPr>
-            <w:tcW w:type="dxa" w:w="3182"/>
-            <w:vAlign w:val="center"/>
-          </w:tcPr>
-          <w:p>
-            <w:pPr>
-              <w:spacing w:line="252" w:lineRule="auto" w:after="0"/>
-              <w:ind w:firstLine="0"/>
-              <w:jc w:val="left"/>
-            </w:pPr>
-            <w:r/>
-            <w:r>
-              <w:rPr>
-                <w:rFonts w:ascii="Times New Roman" w:hAnsi="Times New Roman" w:eastAsia="Times New Roman"/>
-                <w:b w:val="0"/>
-                <w:sz w:val="21"/>
-              </w:rPr>
-              <w:t>200 CHECKED_IN</w:t>
-            </w:r>
-          </w:p>
-        </w:tc>
-        <w:tc>
-          <w:tcPr>
-            <w:tcW w:type="dxa" w:w="3182"/>
-            <w:vAlign w:val="center"/>
-          </w:tcPr>
-          <w:p>
-            <w:pPr>
-              <w:spacing w:line="252" w:lineRule="auto" w:after="0"/>
-              <w:ind w:firstLine="0"/>
-              <w:jc w:val="left"/>
-            </w:pPr>
-            <w:r/>
-            <w:r>
-              <w:rPr>
-                <w:rFonts w:ascii="Times New Roman" w:hAnsi="Times New Roman" w:eastAsia="Times New Roman"/>
-                <w:b w:val="0"/>
-                <w:sz w:val="21"/>
-              </w:rPr>
-              <w:t>403 ownership; 422 window/state</w:t>
-            </w:r>
-          </w:p>
-        </w:tc>
-      </w:tr>
-      <w:tr>
-        <w:trPr>
-          <w:cantSplit/>
-        </w:trPr>
-        <w:tc>
-          <w:tcPr>
-            <w:tcW w:type="dxa" w:w="3182"/>
-            <w:vAlign w:val="center"/>
-            <w:shd w:fill="F7F9FC"/>
-          </w:tcPr>
-          <w:p>
-            <w:pPr>
-              <w:spacing w:line="252" w:lineRule="auto" w:after="0"/>
-              <w:ind w:firstLine="0"/>
-              <w:jc w:val="left"/>
-            </w:pPr>
-            <w:r/>
-            <w:r>
-              <w:rPr>
-                <w:rFonts w:ascii="Times New Roman" w:hAnsi="Times New Roman" w:eastAsia="Times New Roman"/>
-                <w:b w:val="0"/>
-                <w:sz w:val="21"/>
-              </w:rPr>
-              <w:t>POST /admin/rooms/:id/closures</w:t>
-            </w:r>
-          </w:p>
-        </w:tc>
-        <w:tc>
-          <w:tcPr>
-            <w:tcW w:type="dxa" w:w="3182"/>
-            <w:vAlign w:val="center"/>
-            <w:shd w:fill="F7F9FC"/>
-          </w:tcPr>
-          <w:p>
-            <w:pPr>
-              <w:spacing w:line="252" w:lineRule="auto" w:after="0"/>
-              <w:ind w:firstLine="0"/>
-              <w:jc w:val="left"/>
-            </w:pPr>
-            <w:r/>
-            <w:r>
-              <w:rPr>
-                <w:rFonts w:ascii="Times New Roman" w:hAnsi="Times New Roman" w:eastAsia="Times New Roman"/>
-                <w:b w:val="0"/>
-                <w:sz w:val="21"/>
-              </w:rPr>
-              <w:t>201 closure</w:t>
-            </w:r>
-          </w:p>
-        </w:tc>
-        <w:tc>
-          <w:tcPr>
-            <w:tcW w:type="dxa" w:w="3182"/>
-            <w:vAlign w:val="center"/>
-            <w:shd w:fill="F7F9FC"/>
-          </w:tcPr>
-          <w:p>
-            <w:pPr>
-              <w:spacing w:line="252" w:lineRule="auto" w:after="0"/>
-              <w:ind w:firstLine="0"/>
-              <w:jc w:val="left"/>
-            </w:pPr>
-            <w:r/>
-            <w:r>
-              <w:rPr>
-                <w:rFonts w:ascii="Times New Roman" w:hAnsi="Times New Roman" w:eastAsia="Times New Roman"/>
-                <w:b w:val="0"/>
-                <w:sz w:val="21"/>
-              </w:rPr>
-              <w:t>403 role; 404 room; 422 duplicate/date</w:t>
-            </w:r>
-          </w:p>
-        </w:tc>
-      </w:tr>
-      <w:tr>
-        <w:trPr>
-          <w:cantSplit/>
-        </w:trPr>
-        <w:tc>
-          <w:tcPr>
-            <w:tcW w:type="dxa" w:w="3182"/>
-            <w:vAlign w:val="center"/>
-          </w:tcPr>
-          <w:p>
-            <w:pPr>
-              <w:spacing w:line="252" w:lineRule="auto" w:after="0"/>
-              <w:ind w:firstLine="0"/>
-              <w:jc w:val="left"/>
-            </w:pPr>
-            <w:r/>
-            <w:r>
-              <w:rPr>
-                <w:rFonts w:ascii="Times New Roman" w:hAnsi="Times New Roman" w:eastAsia="Times New Roman"/>
-                <w:b w:val="0"/>
-                <w:sz w:val="21"/>
-              </w:rPr>
-              <w:t>GET /admin/reports/usage</w:t>
-            </w:r>
-          </w:p>
-        </w:tc>
-        <w:tc>
-          <w:tcPr>
-            <w:tcW w:type="dxa" w:w="3182"/>
-            <w:vAlign w:val="center"/>
-          </w:tcPr>
-          <w:p>
-            <w:pPr>
-              <w:spacing w:line="252" w:lineRule="auto" w:after="0"/>
-              <w:ind w:firstLine="0"/>
-              <w:jc w:val="left"/>
-            </w:pPr>
-            <w:r/>
-            <w:r>
-              <w:rPr>
-                <w:rFonts w:ascii="Times New Roman" w:hAnsi="Times New Roman" w:eastAsia="Times New Roman"/>
-                <w:b w:val="0"/>
-                <w:sz w:val="21"/>
-              </w:rPr>
-              <w:t>200 rates/totals</w:t>
-            </w:r>
-          </w:p>
-        </w:tc>
-        <w:tc>
-          <w:tcPr>
-            <w:tcW w:type="dxa" w:w="3182"/>
-            <w:vAlign w:val="center"/>
-          </w:tcPr>
-          <w:p>
-            <w:pPr>
-              <w:spacing w:line="252" w:lineRule="auto" w:after="0"/>
-              <w:ind w:firstLine="0"/>
-              <w:jc w:val="left"/>
-            </w:pPr>
-            <w:r/>
-            <w:r>
-              <w:rPr>
-                <w:rFonts w:ascii="Times New Roman" w:hAnsi="Times New Roman" w:eastAsia="Times New Roman"/>
-                <w:b w:val="0"/>
-                <w:sz w:val="21"/>
-              </w:rPr>
-              <w:t>403 role; 422 range; zero denominator</w:t>
-            </w:r>
-          </w:p>
-        </w:tc>
-      </w:tr>
-    </w:tbl>
-    <w:p>
-      <w:pPr>
-        <w:spacing w:after="0"/>
-      </w:pPr>
-    </w:p>
-    <w:p>
-      <w:pPr>
-        <w:pStyle w:val="Heading2"/>
-      </w:pPr>
-      <w:r>
-        <w:t>PHỤ LỤC D. QUY TRÌNH TÁI LẬP</w:t>
-      </w:r>
-    </w:p>
-    <w:p>
-      <w:r>
-        <w:rPr>
-          <w:i w:val="0"/>
-        </w:rPr>
-        <w:t>Chuẩn bị môi trường bằng Node 22, .env.example và npm ci. Với database mới chạy npm run db:setup; npm run db:reset chỉ dùng trên database demo/test đã xác định do có thao tác xóa dữ liệu. Secret và database cục bộ không được đưa vào repository.</w:t>
-      </w:r>
-    </w:p>
-    <w:p>
-      <w:r>
-        <w:rPr>
-          <w:i w:val="0"/>
-        </w:rPr>
-        <w:t>Core quality gồm npm run qa:trace, npm test, npm run test:mutation, npm run build và npm run e2e; lưu raw JSON/HTML report. Quality evidence dùng production build trên database sạch để chạy k6 availability/race, Lighthouse và ZAP, sau đó tạo manifest có commit SHA và hash.</w:t>
-      </w:r>
-    </w:p>
-    <w:p>
-      <w:r>
-        <w:rPr>
-          <w:i w:val="0"/>
-        </w:rPr>
-        <w:t>Khi quality gate không đạt, kết quả được giữ là Fail hoặc Blocked. Issue phải có reproduce, expected/actual; bản sửa được tách commit, retest và chỉ đóng khi có artifact mới.</w:t>
-      </w:r>
     </w:p>
     <w:sectPr>
       <w:footerReference w:type="default" r:id="rId9"/>

</xml_diff>

<commit_message>
docs: record final evidence and refresh academic report
</commit_message>
<xml_diff>
--- a/output/docx/StudySpace-BaoCao-DanhGia-KiemDinh.docx
+++ b/output/docx/StudySpace-BaoCao-DanhGia-KiemDinh.docx
@@ -297,7 +297,7 @@
         <w:rPr>
           <w:i w:val="0"/>
         </w:rPr>
-        <w:t>Trên commit kiểm thử e89bfd1, 47/47 ca Vitest và 24/24 ca Playwright đạt. Coverage đạt 98,35% line, 94,02% branch và 100% function; mutation score theo công thức killed/(killed+survived) đạt 81,13%. Kịch bản booking đồng thời tạo đúng một phản hồi 201 và mười chín phản hồi 409. Lighthouse đạt 100/100/96; ZAP không ghi nhận High, nhưng frontend còn chín cảnh báo Low và bảy Informational; phạm vi quét chỉ là baseline chưa xác thực. Kết quả cho thấy các quality gate định nghĩa trước đã đạt trong môi trường đã ghi, đồng thời vẫn còn giới hạn về trình duyệt, tải sản xuất, pentest xác thực và nghiên cứu usability với người dùng thật.</w:t>
+        <w:t>Trên commit kiểm thử 364f3b9, 47/47 ca Vitest và 24/24 ca Playwright đạt. Coverage đạt 98,35% line, 94,02% branch và 100% function; mutation score theo công thức killed/(killed+survived) đạt 81,13%. Kịch bản booking đồng thời tạo đúng một phản hồi 201 và mười chín phản hồi 409. Lighthouse đạt 98/100/96; ZAP không ghi nhận High, nhưng frontend còn chín cảnh báo Low và tám Informational; phạm vi quét chỉ là baseline chưa xác thực. Kết quả cho thấy các quality gate định nghĩa trước đã đạt trong môi trường đã ghi, đồng thời vẫn còn giới hạn về trình duyệt, tải sản xuất, pentest xác thực và nghiên cứu usability với người dùng thật.</w:t>
       </w:r>
     </w:p>
     <w:p>
@@ -8506,7 +8506,7 @@
                 <w:b w:val="0"/>
                 <w:sz w:val="21"/>
               </w:rPr>
-              <w:t>e89bfd1d0fcd16ee9b8a7f6d884eddbc2bff1eeb</w:t>
+              <w:t>364f3b99870d2fb15ed7c8b28eef90251198a628</w:t>
             </w:r>
           </w:p>
         </w:tc>
@@ -10549,7 +10549,7 @@
                 <w:b w:val="0"/>
                 <w:sz w:val="21"/>
               </w:rPr>
-              <w:t>2.400 request; p95 5,78 ms; checks 100%</w:t>
+              <w:t>2.400 request; p95 6,17 ms; checks 100%</w:t>
             </w:r>
           </w:p>
         </w:tc>
@@ -10644,7 +10644,7 @@
                 <w:b w:val="0"/>
                 <w:sz w:val="21"/>
               </w:rPr>
-              <w:t>1×201; 19×409; p95 68,22 ms</w:t>
+              <w:t>1×201; 19×409; p95 62,06 ms</w:t>
             </w:r>
           </w:p>
         </w:tc>
@@ -10739,7 +10739,7 @@
                 <w:b w:val="0"/>
                 <w:sz w:val="21"/>
               </w:rPr>
-              <w:t>Performance 100; Accessibility 100; Best Practices 96</w:t>
+              <w:t>Performance 98; Accessibility 100; Best Practices 96</w:t>
             </w:r>
           </w:p>
         </w:tc>
@@ -10834,7 +10834,7 @@
                 <w:b w:val="0"/>
                 <w:sz w:val="21"/>
               </w:rPr>
-              <w:t>Frontend 0H/0M/9L/7I; API 0H/0M/0L/3I</w:t>
+              <w:t>Frontend 0H/0M/9L/8I; API 0H/0M/0L/2I</w:t>
             </w:r>
           </w:p>
         </w:tc>
@@ -10894,7 +10894,7 @@
         <w:rPr>
           <w:i w:val="0"/>
         </w:rPr>
-        <w:t>Bảng 12 trả lời ở mức tổng hợp, còn các mục sau diễn giải ý nghĩa. Việc tất cả gate đạt không đồng nghĩa hệ thống hoàn thiện tuyệt đối. Kết luận chỉ có giá trị tại commit e89bfd1, workflow 37343853893 và 37344566560, với phạm vi test đã nêu.</w:t>
+        <w:t>Bảng 12 trả lời ở mức tổng hợp, còn các mục sau diễn giải ý nghĩa. Việc tất cả gate đạt không đồng nghĩa hệ thống hoàn thiện tuyệt đối. Kết luận chỉ có giá trị tại commit 364f3b9, workflow 37348312215 và 37348951730, với phạm vi test đã nêu.</w:t>
       </w:r>
     </w:p>
     <w:p>
@@ -11665,7 +11665,7 @@
         <w:rPr>
           <w:i w:val="0"/>
         </w:rPr>
-        <w:t>Kịch bản availability dùng 20 virtual users trong 2 phút, tạo 2.400 request. checksRate đạt 100%, request failure 0% và p95 5,78 ms, thấp hơn ngưỡng 500 ms. Kịch bản race tạo 20 request cạnh tranh đến cùng room-date-slot; raw summary ghi đúng một 201 và mười chín 409, p95 68,22 ms. Tổng requests trong summary là 22 vì gồm các request chuẩn bị/đăng nhập ngoài nhóm cạnh tranh.</w:t>
+        <w:t>Kịch bản availability dùng 20 virtual users trong 2 phút, tạo 2.400 request. checksRate đạt 100%, request failure 0% và p95 6,17 ms, thấp hơn ngưỡng 500 ms. Kịch bản race tạo 20 request cạnh tranh đến cùng room-date-slot; raw summary ghi đúng một 201 và mười chín 409, p95 62,06 ms. Tổng requests trong summary là 22 vì gồm các request chuẩn bị/đăng nhập ngoài nhóm cạnh tranh.</w:t>
       </w:r>
     </w:p>
     <w:p>
@@ -11705,7 +11705,7 @@
         <w:rPr>
           <w:i w:val="0"/>
         </w:rPr>
-        <w:t>ZAP baseline frontend ghi 0 High, 0 Medium, 9 Low và 7 Informational; API ghi 0 High, 0 Medium, 0 Low và 3 Informational. Chín Low frontend liên quan COEP/COOP/CORP cần được đánh giá khi có mô hình triển khai thực; không bị xóa khỏi báo cáo. Phạm vi là unauthenticated frontend preview và public API baseline. Do đó, kết quả không phải pentest, không bao phủ tấn công sau đăng nhập và không chứng minh hệ thống “an toàn tuyệt đối”.</w:t>
+        <w:t>ZAP baseline frontend ghi 0 High, 0 Medium, 9 Low và 8 Informational; API ghi 0 High, 0 Medium, 0 Low và 2 Informational. Chín Low frontend liên quan COEP/COOP/CORP cần được đánh giá khi có mô hình triển khai thực; không bị xóa khỏi báo cáo. Phạm vi là unauthenticated frontend preview và public API baseline. Do đó, kết quả không phải pentest, không bao phủ tấn công sau đăng nhập và không chứng minh hệ thống “an toàn tuyệt đối”.</w:t>
       </w:r>
     </w:p>
     <w:p>
@@ -12199,7 +12199,7 @@
         <w:rPr>
           <w:i w:val="0"/>
         </w:rPr>
-        <w:t>Lighthouse trên production preview đạt Performance 100, Accessibility 100 và Best Practices 96, vượt ngưỡng 80/90/90. axe không phát hiện vi phạm serious trong các trang login, student portal và admin console thuộc scenario đã chạy. Các kết quả này cho thấy cấu trúc và cấu hình tự động ở mức tốt trong URL/viewport thử nghiệm.</w:t>
+        <w:t>Lighthouse trên production preview đạt Performance 98, Accessibility 100 và Best Practices 96, vượt ngưỡng 80/90/90. axe không phát hiện vi phạm serious trong các trang login, student portal và admin console thuộc scenario đã chạy. Các kết quả này cho thấy cấu trúc và cấu hình tự động ở mức tốt trong URL/viewport thử nghiệm.</w:t>
       </w:r>
     </w:p>
     <w:p>
@@ -12223,7 +12223,7 @@
         <w:rPr>
           <w:i w:val="0"/>
         </w:rPr>
-        <w:t>Core workflow URL là https://github.com/bachiep/studyspace-quality-assurance/actions/runs/37343853893; quality-evidence là https://github.com/bachiep/studyspace-quality-assurance/actions/runs/37344566560. Manifest verifiedAt 2026-10-05T17:00:44Z ghi phiên bản công cụ, threshold, đường dẫn artifact và SHA-256 của tám file cốt lõi. Các file report sinh tự động không được đưa toàn bộ vào Git để tránh phình repository.</w:t>
+        <w:t>Core workflow URL là https://github.com/bachiep/studyspace-quality-assurance/actions/runs/37348312215; quality-evidence là https://github.com/bachiep/studyspace-quality-assurance/actions/runs/37348951730. Manifest verifiedAt 2026-10-05T17:35:29Z ghi phiên bản công cụ, threshold, đường dẫn artifact và SHA-256 của tám file cốt lõi. Các file report sinh tự động không được đưa toàn bộ vào Git để tránh phình repository.</w:t>
       </w:r>
     </w:p>
     <w:p>

</xml_diff>

<commit_message>
docs: align report with final quality run
</commit_message>
<xml_diff>
--- a/output/docx/StudySpace-BaoCao-DanhGia-KiemDinh.docx
+++ b/output/docx/StudySpace-BaoCao-DanhGia-KiemDinh.docx
@@ -297,7 +297,7 @@
         <w:rPr>
           <w:i w:val="0"/>
         </w:rPr>
-        <w:t>Trên commit kiểm thử 364f3b9, 47/47 ca Vitest và 24/24 ca Playwright đạt. Coverage đạt 98,35% line, 94,02% branch và 100% function; mutation score theo công thức killed/(killed+survived) đạt 81,13%. Kịch bản booking đồng thời tạo đúng một phản hồi 201 và mười chín phản hồi 409. Lighthouse đạt 98/100/96; ZAP không ghi nhận High, nhưng frontend còn chín cảnh báo Low và tám Informational; phạm vi quét chỉ là baseline chưa xác thực. Kết quả cho thấy các quality gate định nghĩa trước đã đạt trong môi trường đã ghi, đồng thời vẫn còn giới hạn về trình duyệt, tải sản xuất, pentest xác thực và nghiên cứu usability với người dùng thật.</w:t>
+        <w:t>Trên commit kiểm thử 47559ed, 47/47 ca Vitest và 24/24 ca Playwright đạt. Coverage đạt 98,35% line, 94,02% branch và 100% function; mutation score theo công thức killed/(killed+survived) đạt 81,13%. Kịch bản booking đồng thời tạo đúng một phản hồi 201 và mười chín phản hồi 409. Lighthouse đạt 100/100/96; ZAP không ghi nhận High, nhưng frontend còn chín cảnh báo Low và năm Informational; phạm vi quét chỉ là baseline chưa xác thực. Kết quả cho thấy các quality gate định nghĩa trước đã đạt trong môi trường đã ghi, đồng thời vẫn còn giới hạn về trình duyệt, tải sản xuất, pentest xác thực và nghiên cứu usability với người dùng thật.</w:t>
       </w:r>
     </w:p>
     <w:p>
@@ -8506,7 +8506,7 @@
                 <w:b w:val="0"/>
                 <w:sz w:val="21"/>
               </w:rPr>
-              <w:t>364f3b99870d2fb15ed7c8b28eef90251198a628</w:t>
+              <w:t>47559ed8316476054282dda005b76aefb25af1f2</w:t>
             </w:r>
           </w:p>
         </w:tc>
@@ -10549,7 +10549,7 @@
                 <w:b w:val="0"/>
                 <w:sz w:val="21"/>
               </w:rPr>
-              <w:t>2.400 request; p95 6,17 ms; checks 100%</w:t>
+              <w:t>2.400 request; p95 5,92 ms; checks 100%</w:t>
             </w:r>
           </w:p>
         </w:tc>
@@ -10644,7 +10644,7 @@
                 <w:b w:val="0"/>
                 <w:sz w:val="21"/>
               </w:rPr>
-              <w:t>1×201; 19×409; p95 62,06 ms</w:t>
+              <w:t>1×201; 19×409; p95 64,43 ms</w:t>
             </w:r>
           </w:p>
         </w:tc>
@@ -10739,7 +10739,7 @@
                 <w:b w:val="0"/>
                 <w:sz w:val="21"/>
               </w:rPr>
-              <w:t>Performance 98; Accessibility 100; Best Practices 96</w:t>
+              <w:t>Performance 100; Accessibility 100; Best Practices 96</w:t>
             </w:r>
           </w:p>
         </w:tc>
@@ -10834,7 +10834,7 @@
                 <w:b w:val="0"/>
                 <w:sz w:val="21"/>
               </w:rPr>
-              <w:t>Frontend 0H/0M/9L/8I; API 0H/0M/0L/2I</w:t>
+              <w:t>Frontend 0H/0M/9L/5I; API 0H/0M/0L/2I</w:t>
             </w:r>
           </w:p>
         </w:tc>
@@ -10894,7 +10894,7 @@
         <w:rPr>
           <w:i w:val="0"/>
         </w:rPr>
-        <w:t>Bảng 12 trả lời ở mức tổng hợp, còn các mục sau diễn giải ý nghĩa. Việc tất cả gate đạt không đồng nghĩa hệ thống hoàn thiện tuyệt đối. Kết luận chỉ có giá trị tại commit 364f3b9, workflow 37348312215 và 37348951730, với phạm vi test đã nêu.</w:t>
+        <w:t>Bảng 12 trả lời ở mức tổng hợp, còn các mục sau diễn giải ý nghĩa. Việc tất cả gate đạt không đồng nghĩa hệ thống hoàn thiện tuyệt đối. Kết luận chỉ có giá trị tại commit 47559ed, workflow 37350847374 và 37351470090, với phạm vi test đã nêu.</w:t>
       </w:r>
     </w:p>
     <w:p>
@@ -11665,7 +11665,7 @@
         <w:rPr>
           <w:i w:val="0"/>
         </w:rPr>
-        <w:t>Kịch bản availability dùng 20 virtual users trong 2 phút, tạo 2.400 request. checksRate đạt 100%, request failure 0% và p95 6,17 ms, thấp hơn ngưỡng 500 ms. Kịch bản race tạo 20 request cạnh tranh đến cùng room-date-slot; raw summary ghi đúng một 201 và mười chín 409, p95 62,06 ms. Tổng requests trong summary là 22 vì gồm các request chuẩn bị/đăng nhập ngoài nhóm cạnh tranh.</w:t>
+        <w:t>Kịch bản availability dùng 20 virtual users trong 2 phút, tạo 2.400 request. checksRate đạt 100%, request failure 0% và p95 5,92 ms, thấp hơn ngưỡng 500 ms. Kịch bản race tạo 20 request cạnh tranh đến cùng room-date-slot; raw summary ghi đúng một 201 và mười chín 409, p95 64,43 ms. Tổng requests trong summary là 22 vì gồm các request chuẩn bị/đăng nhập ngoài nhóm cạnh tranh.</w:t>
       </w:r>
     </w:p>
     <w:p>
@@ -11705,7 +11705,7 @@
         <w:rPr>
           <w:i w:val="0"/>
         </w:rPr>
-        <w:t>ZAP baseline frontend ghi 0 High, 0 Medium, 9 Low và 8 Informational; API ghi 0 High, 0 Medium, 0 Low và 2 Informational. Chín Low frontend liên quan COEP/COOP/CORP cần được đánh giá khi có mô hình triển khai thực; không bị xóa khỏi báo cáo. Phạm vi là unauthenticated frontend preview và public API baseline. Do đó, kết quả không phải pentest, không bao phủ tấn công sau đăng nhập và không chứng minh hệ thống “an toàn tuyệt đối”.</w:t>
+        <w:t>ZAP baseline frontend ghi 0 High, 0 Medium, 9 Low và 5 Informational; API ghi 0 High, 0 Medium, 0 Low và 2 Informational. Chín Low frontend liên quan COEP/COOP/CORP cần được đánh giá khi có mô hình triển khai thực; không bị xóa khỏi báo cáo. Phạm vi là unauthenticated frontend preview và public API baseline. Do đó, kết quả không phải pentest, không bao phủ tấn công sau đăng nhập và không chứng minh hệ thống “an toàn tuyệt đối”.</w:t>
       </w:r>
     </w:p>
     <w:p>
@@ -12199,7 +12199,7 @@
         <w:rPr>
           <w:i w:val="0"/>
         </w:rPr>
-        <w:t>Lighthouse trên production preview đạt Performance 98, Accessibility 100 và Best Practices 96, vượt ngưỡng 80/90/90. axe không phát hiện vi phạm serious trong các trang login, student portal và admin console thuộc scenario đã chạy. Các kết quả này cho thấy cấu trúc và cấu hình tự động ở mức tốt trong URL/viewport thử nghiệm.</w:t>
+        <w:t>Lighthouse trên production preview đạt Performance 100, Accessibility 100 và Best Practices 96, vượt ngưỡng 80/90/90. axe không phát hiện vi phạm serious trong các trang login, student portal và admin console thuộc scenario đã chạy. Các kết quả này cho thấy cấu trúc và cấu hình tự động ở mức tốt trong URL/viewport thử nghiệm.</w:t>
       </w:r>
     </w:p>
     <w:p>
@@ -12223,7 +12223,7 @@
         <w:rPr>
           <w:i w:val="0"/>
         </w:rPr>
-        <w:t>Core workflow URL là https://github.com/bachiep/studyspace-quality-assurance/actions/runs/37348312215; quality-evidence là https://github.com/bachiep/studyspace-quality-assurance/actions/runs/37348951730. Manifest verifiedAt 2026-10-05T17:35:29Z ghi phiên bản công cụ, threshold, đường dẫn artifact và SHA-256 của tám file cốt lõi. Các file report sinh tự động không được đưa toàn bộ vào Git để tránh phình repository.</w:t>
+        <w:t>Core workflow URL là https://github.com/bachiep/studyspace-quality-assurance/actions/runs/37350847374; quality-evidence là https://github.com/bachiep/studyspace-quality-assurance/actions/runs/37351470090. Manifest verifiedAt 2026-10-05T17:55:34Z ghi phiên bản công cụ, threshold, đường dẫn artifact và SHA-256 của tám file cốt lõi. Các file report sinh tự động không được đưa toàn bộ vào Git để tránh phình repository.</w:t>
       </w:r>
     </w:p>
     <w:p>

</xml_diff>

<commit_message>
docs: refine academic report layout and evidence provenance
</commit_message>
<xml_diff>
--- a/output/docx/StudySpace-BaoCao-DanhGia-KiemDinh.docx
+++ b/output/docx/StudySpace-BaoCao-DanhGia-KiemDinh.docx
@@ -5533,7 +5533,7 @@
       <w:r>
         <w:drawing>
           <wp:inline xmlns:a="http://schemas.openxmlformats.org/drawingml/2006/main" xmlns:pic="http://schemas.openxmlformats.org/drawingml/2006/picture">
-            <wp:extent cx="5943600" cy="3516630"/>
+            <wp:extent cx="5212080" cy="3083814"/>
             <wp:docPr id="3" name="Picture 3"/>
             <wp:cNvGraphicFramePr>
               <a:graphicFrameLocks noChangeAspect="1"/>
@@ -5554,7 +5554,7 @@
                   <pic:spPr>
                     <a:xfrm>
                       <a:off x="0" y="0"/>
-                      <a:ext cx="5943600" cy="3516630"/>
+                      <a:ext cx="5212080" cy="3083814"/>
                     </a:xfrm>
                     <a:prstGeom prst="rect"/>
                   </pic:spPr>
@@ -5586,7 +5586,7 @@
         <w:rPr>
           <w:i w:val="0"/>
         </w:rPr>
-        <w:t>AuditLog lưu actor, action, entity và metadata. Mutation hồ sơ, vai trò, phòng, thiết bị, closure và booking quan trọng phải ghi audit trong cùng Prisma transaction. Test rollback cố tình làm bước audit thất bại và xác nhận dữ liệu nghiệp vụ không commit. Đây là bằng chứng về atomicity cho các mutation đã được test; không suy rộng cho mọi thao tác chưa có ca tương ứng.</w:t>
+        <w:t>AuditLog lưu actor, action, entity và metadata. Hồ sơ, vai trò, phòng, thiết bị, closure và booking quan trọng ghi audit trong cùng Prisma transaction; test ép audit lỗi và xác nhận mutation rollback. Kết luận atomicity chỉ áp dụng cho mutation đã test, không suy rộng cho thao tác chưa có ca tương ứng.</w:t>
       </w:r>
     </w:p>
     <w:p>
@@ -6248,7 +6248,7 @@
         <w:rPr>
           <w:i w:val="0"/>
         </w:rPr>
-        <w:t>Bảng này cũng giải thích vì sao một số kiểm thử được đặt ở database thay vì chỉ ở controller. Nếu chỉ kiểm tra route, hai request song song có thể cùng vượt qua điều kiện đọc trước khi ghi. Nếu chỉ kiểm tra giao diện, lỗi múi giờ hoặc audit rollback có thể bị che khuất. Thiết kế có chủ đích giúp kết quả kiểm thử có giá trị giải thích chứ không chỉ là danh sách pass/fail.</w:t>
+        <w:t>Việc đặt invariant ở database giúp bắt race mà controller hoặc giao diện có thể bỏ sót; mỗi quyết định vẫn có oracle và giới hạn riêng. Vì vậy kết quả kiểm thử có giá trị giải thích, không chỉ là danh sách pass/fail.</w:t>
       </w:r>
     </w:p>
     <w:p>
@@ -12223,15 +12223,7 @@
         <w:rPr>
           <w:i w:val="0"/>
         </w:rPr>
-        <w:t>Core workflow URL là https://github.com/bachiep/studyspace-quality-assurance/actions/runs/37350847374; quality-evidence là https://github.com/bachiep/studyspace-quality-assurance/actions/runs/37351470090. Manifest verifiedAt 2026-10-05T17:55:34Z ghi phiên bản công cụ, threshold, đường dẫn artifact và SHA-256 của tám file cốt lõi. Commit 052e95b chỉ đồng bộ tài liệu sau lần đo, không thay đổi SUT hay bộ test. Các file report sinh tự động không được đưa toàn bộ vào Git để tránh phình repository.</w:t>
-      </w:r>
-    </w:p>
-    <w:p>
-      <w:r>
-        <w:rPr>
-          <w:i w:val="0"/>
-        </w:rPr>
-        <w:t>Cơ chế này cho phép người đọc tải artifact, tính lại hash và đối chiếu commit. Một báo cáo cũ hoặc run khác SHA không được dùng để thay thế. Mặt hạn chế là artifact GitHub Actions có chính sách lưu giữ; vì vậy evidence cần được lưu ở nơi có thời hạn phù hợp với mục đích đối chiếu.</w:t>
+        <w:t>Manifest ghi Core CI run 37350847374 và quality-evidence run 37351470090, cùng thời điểm, phiên bản công cụ, threshold, đường dẫn artifact và SHA-256 của tám file cốt lõi. Các commit sau lần đo được ghi nhận trong hồ sơ này chỉ đồng bộ hoặc làm rõ tài liệu, không thay đổi SUT hay bộ test. SHA-256 cho phép đối chiếu artifact với commit; artifact có thời hạn lưu giữ nên cần được lưu bổ sung khi cần. Các file report sinh tự động không được đưa toàn bộ vào Git để tránh phình repository.</w:t>
       </w:r>
     </w:p>
     <w:p>

</xml_diff>